<commit_message>
Partie 2: Comparaison des techniques de prompt: Test de la technique du zero-shot
</commit_message>
<xml_diff>
--- a/ai-business_assistant/correction_atelier_prompt-engineering.docx
+++ b/ai-business_assistant/correction_atelier_prompt-engineering.docx
@@ -87,13 +87,23 @@
         </w:rPr>
         <w:t xml:space="preserve"> </w:t>
       </w:r>
-      <w:r>
-        <w:rPr>
-          <w:rFonts w:ascii="Times New Roman" w:hAnsi="Times New Roman" w:cs="Times New Roman"/>
-          <w:sz w:val="24"/>
-          <w:szCs w:val="24"/>
-        </w:rPr>
-        <w:t>learning et produire des résultats structurés.</w:t>
+      <w:proofErr w:type="spellStart"/>
+      <w:r>
+        <w:rPr>
+          <w:rFonts w:ascii="Times New Roman" w:hAnsi="Times New Roman" w:cs="Times New Roman"/>
+          <w:sz w:val="24"/>
+          <w:szCs w:val="24"/>
+        </w:rPr>
+        <w:t>learning</w:t>
+      </w:r>
+      <w:proofErr w:type="spellEnd"/>
+      <w:r>
+        <w:rPr>
+          <w:rFonts w:ascii="Times New Roman" w:hAnsi="Times New Roman" w:cs="Times New Roman"/>
+          <w:sz w:val="24"/>
+          <w:szCs w:val="24"/>
+        </w:rPr>
+        <w:t xml:space="preserve"> et produire des résultats structurés.</w:t>
       </w:r>
     </w:p>
     <w:p>
@@ -146,8 +156,8 @@
           <w:rFonts w:ascii="Times New Roman" w:hAnsi="Times New Roman" w:cs="Times New Roman"/>
           <w:b/>
           <w:bCs/>
-          <w:sz w:val="24"/>
-          <w:szCs w:val="24"/>
+          <w:sz w:val="28"/>
+          <w:szCs w:val="28"/>
         </w:rPr>
         <w:t>Partie 1 – Anatomie d'un prompt</w:t>
       </w:r>
@@ -156,10 +166,20 @@
           <w:rFonts w:ascii="Times New Roman" w:hAnsi="Times New Roman" w:cs="Times New Roman"/>
           <w:b/>
           <w:bCs/>
-          <w:sz w:val="24"/>
-          <w:szCs w:val="24"/>
-        </w:rPr>
-        <w:t xml:space="preserve"> : </w:t>
+          <w:sz w:val="28"/>
+          <w:szCs w:val="28"/>
+        </w:rPr>
+        <w:t> :</w:t>
+      </w:r>
+      <w:r>
+        <w:rPr>
+          <w:rFonts w:ascii="Times New Roman" w:hAnsi="Times New Roman" w:cs="Times New Roman"/>
+          <w:b/>
+          <w:bCs/>
+          <w:sz w:val="24"/>
+          <w:szCs w:val="24"/>
+        </w:rPr>
+        <w:t xml:space="preserve"> </w:t>
       </w:r>
       <w:r>
         <w:rPr>
@@ -884,17 +904,21 @@
         <w:jc w:val="both"/>
         <w:rPr>
           <w:rFonts w:ascii="Times New Roman" w:hAnsi="Times New Roman" w:cs="Times New Roman"/>
-          <w:sz w:val="24"/>
-          <w:szCs w:val="24"/>
-        </w:rPr>
-      </w:pPr>
-      <w:r>
-        <w:rPr>
-          <w:rFonts w:ascii="Times New Roman" w:hAnsi="Times New Roman" w:cs="Times New Roman"/>
-          <w:sz w:val="24"/>
-          <w:szCs w:val="24"/>
-        </w:rPr>
-        <w:t xml:space="preserve">Réponse fournie par Claude : </w:t>
+          <w:b/>
+          <w:bCs/>
+          <w:sz w:val="24"/>
+          <w:szCs w:val="24"/>
+        </w:rPr>
+      </w:pPr>
+      <w:r>
+        <w:rPr>
+          <w:rFonts w:ascii="Times New Roman" w:hAnsi="Times New Roman" w:cs="Times New Roman"/>
+          <w:b/>
+          <w:bCs/>
+          <w:sz w:val="24"/>
+          <w:szCs w:val="24"/>
+        </w:rPr>
+        <w:t>Réponse fournie par Claude </w:t>
       </w:r>
     </w:p>
     <w:p>
@@ -1002,6 +1026,274 @@
           </wp:inline>
         </w:drawing>
       </w:r>
+    </w:p>
+    <w:p>
+      <w:pPr>
+        <w:spacing w:line="360" w:lineRule="auto"/>
+        <w:jc w:val="both"/>
+        <w:rPr>
+          <w:rFonts w:ascii="Times New Roman" w:hAnsi="Times New Roman" w:cs="Times New Roman"/>
+          <w:sz w:val="24"/>
+          <w:szCs w:val="24"/>
+        </w:rPr>
+      </w:pPr>
+      <w:r>
+        <w:rPr>
+          <w:rFonts w:ascii="Times New Roman" w:hAnsi="Times New Roman" w:cs="Times New Roman"/>
+          <w:b/>
+          <w:bCs/>
+          <w:sz w:val="28"/>
+          <w:szCs w:val="28"/>
+        </w:rPr>
+        <w:t xml:space="preserve">Partie 2 - Comparer les techniques de </w:t>
+      </w:r>
+      <w:proofErr w:type="spellStart"/>
+      <w:r>
+        <w:rPr>
+          <w:rFonts w:ascii="Times New Roman" w:hAnsi="Times New Roman" w:cs="Times New Roman"/>
+          <w:b/>
+          <w:bCs/>
+          <w:sz w:val="28"/>
+          <w:szCs w:val="28"/>
+        </w:rPr>
+        <w:t>prompting</w:t>
+      </w:r>
+      <w:proofErr w:type="spellEnd"/>
+      <w:r>
+        <w:rPr>
+          <w:rFonts w:ascii="Times New Roman" w:hAnsi="Times New Roman" w:cs="Times New Roman"/>
+          <w:sz w:val="24"/>
+          <w:szCs w:val="24"/>
+        </w:rPr>
+        <w:t xml:space="preserve"> </w:t>
+      </w:r>
+    </w:p>
+    <w:p>
+      <w:pPr>
+        <w:spacing w:line="360" w:lineRule="auto"/>
+        <w:jc w:val="both"/>
+        <w:rPr>
+          <w:rFonts w:ascii="Times New Roman" w:hAnsi="Times New Roman" w:cs="Times New Roman"/>
+          <w:sz w:val="24"/>
+          <w:szCs w:val="24"/>
+        </w:rPr>
+      </w:pPr>
+      <w:r>
+        <w:rPr>
+          <w:rFonts w:ascii="Times New Roman" w:hAnsi="Times New Roman" w:cs="Times New Roman"/>
+          <w:sz w:val="24"/>
+          <w:szCs w:val="24"/>
+        </w:rPr>
+        <w:t xml:space="preserve">Tester puis évaluer les résultats obtenus avec les techniques </w:t>
+      </w:r>
+      <w:proofErr w:type="spellStart"/>
+      <w:r>
+        <w:rPr>
+          <w:rFonts w:ascii="Times New Roman" w:hAnsi="Times New Roman" w:cs="Times New Roman"/>
+          <w:sz w:val="24"/>
+          <w:szCs w:val="24"/>
+        </w:rPr>
+        <w:t>zero</w:t>
+      </w:r>
+      <w:proofErr w:type="spellEnd"/>
+      <w:r>
+        <w:rPr>
+          <w:rFonts w:ascii="Times New Roman" w:hAnsi="Times New Roman" w:cs="Times New Roman"/>
+          <w:sz w:val="24"/>
+          <w:szCs w:val="24"/>
+        </w:rPr>
+        <w:t>-shot, one-shot, few-shot et un prompt structuré sur une demande du genre : « Classer le commentaire suivant : "Le service est rapide mais l'application plante régulièrement." Classes possibles : positif, négatif, neutre. »</w:t>
+      </w:r>
+    </w:p>
+    <w:p>
+      <w:pPr>
+        <w:spacing w:line="360" w:lineRule="auto"/>
+        <w:jc w:val="both"/>
+        <w:rPr>
+          <w:rFonts w:ascii="Times New Roman" w:hAnsi="Times New Roman" w:cs="Times New Roman"/>
+          <w:b/>
+          <w:bCs/>
+          <w:sz w:val="24"/>
+          <w:szCs w:val="24"/>
+        </w:rPr>
+      </w:pPr>
+      <w:r>
+        <w:rPr>
+          <w:rFonts w:ascii="Times New Roman" w:hAnsi="Times New Roman" w:cs="Times New Roman"/>
+          <w:b/>
+          <w:bCs/>
+          <w:sz w:val="24"/>
+          <w:szCs w:val="24"/>
+        </w:rPr>
+        <w:t>Test avec la technique du zéro shot</w:t>
+      </w:r>
+    </w:p>
+    <w:p>
+      <w:pPr>
+        <w:spacing w:line="360" w:lineRule="auto"/>
+        <w:jc w:val="both"/>
+        <w:rPr>
+          <w:rFonts w:ascii="Times New Roman" w:hAnsi="Times New Roman" w:cs="Times New Roman"/>
+          <w:b/>
+          <w:bCs/>
+          <w:sz w:val="24"/>
+          <w:szCs w:val="24"/>
+        </w:rPr>
+      </w:pPr>
+      <w:r>
+        <w:rPr>
+          <w:rFonts w:ascii="Times New Roman" w:hAnsi="Times New Roman" w:cs="Times New Roman"/>
+          <w:b/>
+          <w:bCs/>
+          <w:sz w:val="24"/>
+          <w:szCs w:val="24"/>
+        </w:rPr>
+        <w:t>Prompt proposé </w:t>
+      </w:r>
+    </w:p>
+    <w:p>
+      <w:pPr>
+        <w:spacing w:line="360" w:lineRule="auto"/>
+        <w:jc w:val="both"/>
+        <w:rPr>
+          <w:rFonts w:ascii="Times New Roman" w:hAnsi="Times New Roman" w:cs="Times New Roman"/>
+          <w:sz w:val="24"/>
+          <w:szCs w:val="24"/>
+        </w:rPr>
+      </w:pPr>
+      <w:r>
+        <w:rPr>
+          <w:rFonts w:ascii="Times New Roman" w:hAnsi="Times New Roman" w:cs="Times New Roman"/>
+          <w:sz w:val="24"/>
+          <w:szCs w:val="24"/>
+        </w:rPr>
+        <w:t>Classe le commentaire suivant :</w:t>
+      </w:r>
+    </w:p>
+    <w:p>
+      <w:pPr>
+        <w:spacing w:line="360" w:lineRule="auto"/>
+        <w:jc w:val="both"/>
+        <w:rPr>
+          <w:rFonts w:ascii="Times New Roman" w:hAnsi="Times New Roman" w:cs="Times New Roman"/>
+          <w:sz w:val="24"/>
+          <w:szCs w:val="24"/>
+        </w:rPr>
+      </w:pPr>
+      <w:r>
+        <w:rPr>
+          <w:rFonts w:ascii="Times New Roman" w:hAnsi="Times New Roman" w:cs="Times New Roman"/>
+          <w:sz w:val="24"/>
+          <w:szCs w:val="24"/>
+        </w:rPr>
+        <w:t>"Le service est rapide mais l'application plante régulièrement."</w:t>
+      </w:r>
+    </w:p>
+    <w:p>
+      <w:pPr>
+        <w:spacing w:line="360" w:lineRule="auto"/>
+        <w:jc w:val="both"/>
+        <w:rPr>
+          <w:rFonts w:ascii="Times New Roman" w:hAnsi="Times New Roman" w:cs="Times New Roman"/>
+          <w:sz w:val="24"/>
+          <w:szCs w:val="24"/>
+        </w:rPr>
+      </w:pPr>
+      <w:r>
+        <w:rPr>
+          <w:rFonts w:ascii="Times New Roman" w:hAnsi="Times New Roman" w:cs="Times New Roman"/>
+          <w:sz w:val="24"/>
+          <w:szCs w:val="24"/>
+        </w:rPr>
+        <w:t>Classes possibles : positif, négatif, neutre.</w:t>
+      </w:r>
+    </w:p>
+    <w:p>
+      <w:pPr>
+        <w:spacing w:line="360" w:lineRule="auto"/>
+        <w:jc w:val="both"/>
+        <w:rPr>
+          <w:rFonts w:ascii="Times New Roman" w:hAnsi="Times New Roman" w:cs="Times New Roman"/>
+          <w:b/>
+          <w:bCs/>
+          <w:sz w:val="24"/>
+          <w:szCs w:val="24"/>
+        </w:rPr>
+      </w:pPr>
+      <w:r>
+        <w:rPr>
+          <w:rFonts w:ascii="Times New Roman" w:hAnsi="Times New Roman" w:cs="Times New Roman"/>
+          <w:b/>
+          <w:bCs/>
+          <w:sz w:val="24"/>
+          <w:szCs w:val="24"/>
+        </w:rPr>
+        <w:t>Réponse de Claude</w:t>
+      </w:r>
+    </w:p>
+    <w:p>
+      <w:pPr>
+        <w:spacing w:line="360" w:lineRule="auto"/>
+        <w:jc w:val="both"/>
+        <w:rPr>
+          <w:rFonts w:ascii="Times New Roman" w:hAnsi="Times New Roman" w:cs="Times New Roman"/>
+          <w:sz w:val="24"/>
+          <w:szCs w:val="24"/>
+        </w:rPr>
+      </w:pPr>
+      <w:r>
+        <w:rPr>
+          <w:rFonts w:ascii="Times New Roman" w:hAnsi="Times New Roman" w:cs="Times New Roman"/>
+          <w:sz w:val="24"/>
+          <w:szCs w:val="24"/>
+        </w:rPr>
+        <w:drawing>
+          <wp:inline distT="0" distB="0" distL="0" distR="0" wp14:anchorId="361B75C6" wp14:editId="3A51DAF8">
+            <wp:extent cx="5760720" cy="2031365"/>
+            <wp:effectExtent l="0" t="0" r="0" b="6985"/>
+            <wp:docPr id="1216816932" name="Image 1"/>
+            <wp:cNvGraphicFramePr>
+              <a:graphicFrameLocks xmlns:a="http://schemas.openxmlformats.org/drawingml/2006/main" noChangeAspect="1"/>
+            </wp:cNvGraphicFramePr>
+            <a:graphic xmlns:a="http://schemas.openxmlformats.org/drawingml/2006/main">
+              <a:graphicData uri="http://schemas.openxmlformats.org/drawingml/2006/picture">
+                <pic:pic xmlns:pic="http://schemas.openxmlformats.org/drawingml/2006/picture">
+                  <pic:nvPicPr>
+                    <pic:cNvPr id="1216816932" name=""/>
+                    <pic:cNvPicPr/>
+                  </pic:nvPicPr>
+                  <pic:blipFill>
+                    <a:blip r:embed="rId7"/>
+                    <a:stretch>
+                      <a:fillRect/>
+                    </a:stretch>
+                  </pic:blipFill>
+                  <pic:spPr>
+                    <a:xfrm>
+                      <a:off x="0" y="0"/>
+                      <a:ext cx="5760720" cy="2031365"/>
+                    </a:xfrm>
+                    <a:prstGeom prst="rect">
+                      <a:avLst/>
+                    </a:prstGeom>
+                  </pic:spPr>
+                </pic:pic>
+              </a:graphicData>
+            </a:graphic>
+          </wp:inline>
+        </w:drawing>
+      </w:r>
+    </w:p>
+    <w:p>
+      <w:pPr>
+        <w:spacing w:line="360" w:lineRule="auto"/>
+        <w:jc w:val="both"/>
+        <w:rPr>
+          <w:rFonts w:ascii="Times New Roman" w:hAnsi="Times New Roman" w:cs="Times New Roman"/>
+          <w:sz w:val="24"/>
+          <w:szCs w:val="24"/>
+        </w:rPr>
+      </w:pPr>
     </w:p>
     <w:sectPr>
       <w:pgSz w:w="11906" w:h="16838"/>

</xml_diff>

<commit_message>
Partie 2: Comparaison des techniques de prompt: Test de la technique du one-shot
</commit_message>
<xml_diff>
--- a/ai-business_assistant/correction_atelier_prompt-engineering.docx
+++ b/ai-business_assistant/correction_atelier_prompt-engineering.docx
@@ -1283,6 +1283,282 @@
           </wp:inline>
         </w:drawing>
       </w:r>
+    </w:p>
+    <w:p>
+      <w:pPr>
+        <w:spacing w:line="360" w:lineRule="auto"/>
+        <w:jc w:val="both"/>
+        <w:rPr>
+          <w:rFonts w:ascii="Times New Roman" w:hAnsi="Times New Roman" w:cs="Times New Roman"/>
+          <w:b/>
+          <w:bCs/>
+          <w:sz w:val="24"/>
+          <w:szCs w:val="24"/>
+        </w:rPr>
+      </w:pPr>
+      <w:r>
+        <w:rPr>
+          <w:rFonts w:ascii="Times New Roman" w:hAnsi="Times New Roman" w:cs="Times New Roman"/>
+          <w:b/>
+          <w:bCs/>
+          <w:sz w:val="24"/>
+          <w:szCs w:val="24"/>
+        </w:rPr>
+        <w:t>Test de la technique du One-shot </w:t>
+      </w:r>
+    </w:p>
+    <w:p>
+      <w:pPr>
+        <w:spacing w:line="360" w:lineRule="auto"/>
+        <w:jc w:val="both"/>
+        <w:rPr>
+          <w:rFonts w:ascii="Times New Roman" w:hAnsi="Times New Roman" w:cs="Times New Roman"/>
+          <w:b/>
+          <w:bCs/>
+          <w:sz w:val="24"/>
+          <w:szCs w:val="24"/>
+        </w:rPr>
+      </w:pPr>
+      <w:r>
+        <w:rPr>
+          <w:rFonts w:ascii="Times New Roman" w:hAnsi="Times New Roman" w:cs="Times New Roman"/>
+          <w:b/>
+          <w:bCs/>
+          <w:sz w:val="24"/>
+          <w:szCs w:val="24"/>
+        </w:rPr>
+        <w:t>Prompt proposé :</w:t>
+      </w:r>
+    </w:p>
+    <w:p>
+      <w:pPr>
+        <w:spacing w:line="360" w:lineRule="auto"/>
+        <w:jc w:val="both"/>
+        <w:rPr>
+          <w:rFonts w:ascii="Times New Roman" w:hAnsi="Times New Roman" w:cs="Times New Roman"/>
+          <w:sz w:val="24"/>
+          <w:szCs w:val="24"/>
+        </w:rPr>
+      </w:pPr>
+      <w:r>
+        <w:rPr>
+          <w:rFonts w:ascii="Times New Roman" w:hAnsi="Times New Roman" w:cs="Times New Roman"/>
+          <w:sz w:val="24"/>
+          <w:szCs w:val="24"/>
+        </w:rPr>
+        <w:t>Voici un exemple de classification de commentaire :</w:t>
+      </w:r>
+    </w:p>
+    <w:p>
+      <w:pPr>
+        <w:spacing w:line="360" w:lineRule="auto"/>
+        <w:jc w:val="both"/>
+        <w:rPr>
+          <w:rFonts w:ascii="Times New Roman" w:hAnsi="Times New Roman" w:cs="Times New Roman"/>
+          <w:sz w:val="24"/>
+          <w:szCs w:val="24"/>
+        </w:rPr>
+      </w:pPr>
+      <w:r>
+        <w:rPr>
+          <w:rFonts w:ascii="Times New Roman" w:hAnsi="Times New Roman" w:cs="Times New Roman"/>
+          <w:sz w:val="24"/>
+          <w:szCs w:val="24"/>
+        </w:rPr>
+        <w:t>Commentaire : "Le produit est arrivé cassé, très déçu."</w:t>
+      </w:r>
+    </w:p>
+    <w:p>
+      <w:pPr>
+        <w:spacing w:line="360" w:lineRule="auto"/>
+        <w:jc w:val="both"/>
+        <w:rPr>
+          <w:rFonts w:ascii="Times New Roman" w:hAnsi="Times New Roman" w:cs="Times New Roman"/>
+          <w:sz w:val="24"/>
+          <w:szCs w:val="24"/>
+        </w:rPr>
+      </w:pPr>
+      <w:r>
+        <w:rPr>
+          <w:rFonts w:ascii="Times New Roman" w:hAnsi="Times New Roman" w:cs="Times New Roman"/>
+          <w:sz w:val="24"/>
+          <w:szCs w:val="24"/>
+        </w:rPr>
+        <w:t>Classe : négatif</w:t>
+      </w:r>
+    </w:p>
+    <w:p>
+      <w:pPr>
+        <w:spacing w:line="360" w:lineRule="auto"/>
+        <w:jc w:val="both"/>
+        <w:rPr>
+          <w:rFonts w:ascii="Times New Roman" w:hAnsi="Times New Roman" w:cs="Times New Roman"/>
+          <w:sz w:val="24"/>
+          <w:szCs w:val="24"/>
+        </w:rPr>
+      </w:pPr>
+      <w:r>
+        <w:rPr>
+          <w:rFonts w:ascii="Times New Roman" w:hAnsi="Times New Roman" w:cs="Times New Roman"/>
+          <w:sz w:val="24"/>
+          <w:szCs w:val="24"/>
+        </w:rPr>
+        <w:t>Classe maintenant ce commentaire, selon le même format :</w:t>
+      </w:r>
+    </w:p>
+    <w:p>
+      <w:pPr>
+        <w:spacing w:line="360" w:lineRule="auto"/>
+        <w:jc w:val="both"/>
+        <w:rPr>
+          <w:rFonts w:ascii="Times New Roman" w:hAnsi="Times New Roman" w:cs="Times New Roman"/>
+          <w:sz w:val="24"/>
+          <w:szCs w:val="24"/>
+        </w:rPr>
+      </w:pPr>
+      <w:r>
+        <w:rPr>
+          <w:rFonts w:ascii="Times New Roman" w:hAnsi="Times New Roman" w:cs="Times New Roman"/>
+          <w:sz w:val="24"/>
+          <w:szCs w:val="24"/>
+        </w:rPr>
+        <w:t>Commentaire : "Le service est rapide mais l'application plante régulièrement."</w:t>
+      </w:r>
+    </w:p>
+    <w:p>
+      <w:pPr>
+        <w:spacing w:line="360" w:lineRule="auto"/>
+        <w:jc w:val="both"/>
+        <w:rPr>
+          <w:rFonts w:ascii="Times New Roman" w:hAnsi="Times New Roman" w:cs="Times New Roman"/>
+          <w:sz w:val="24"/>
+          <w:szCs w:val="24"/>
+        </w:rPr>
+      </w:pPr>
+      <w:r>
+        <w:rPr>
+          <w:rFonts w:ascii="Times New Roman" w:hAnsi="Times New Roman" w:cs="Times New Roman"/>
+          <w:sz w:val="24"/>
+          <w:szCs w:val="24"/>
+        </w:rPr>
+        <w:t>Classe</w:t>
+      </w:r>
+      <w:r>
+        <w:rPr>
+          <w:rFonts w:ascii="Times New Roman" w:hAnsi="Times New Roman" w:cs="Times New Roman"/>
+          <w:sz w:val="24"/>
+          <w:szCs w:val="24"/>
+        </w:rPr>
+        <w:t>s</w:t>
+      </w:r>
+      <w:r>
+        <w:rPr>
+          <w:rFonts w:ascii="Times New Roman" w:hAnsi="Times New Roman" w:cs="Times New Roman"/>
+          <w:sz w:val="24"/>
+          <w:szCs w:val="24"/>
+        </w:rPr>
+        <w:t xml:space="preserve"> possibles : positif, négatif, neutre.</w:t>
+      </w:r>
+    </w:p>
+    <w:p>
+      <w:pPr>
+        <w:spacing w:line="360" w:lineRule="auto"/>
+        <w:jc w:val="both"/>
+        <w:rPr>
+          <w:rFonts w:ascii="Times New Roman" w:hAnsi="Times New Roman" w:cs="Times New Roman"/>
+          <w:b/>
+          <w:bCs/>
+          <w:sz w:val="24"/>
+          <w:szCs w:val="24"/>
+        </w:rPr>
+      </w:pPr>
+      <w:r>
+        <w:rPr>
+          <w:rFonts w:ascii="Times New Roman" w:hAnsi="Times New Roman" w:cs="Times New Roman"/>
+          <w:b/>
+          <w:bCs/>
+          <w:sz w:val="24"/>
+          <w:szCs w:val="24"/>
+        </w:rPr>
+        <w:t>Réponse de Claude :</w:t>
+      </w:r>
+    </w:p>
+    <w:p>
+      <w:pPr>
+        <w:spacing w:line="360" w:lineRule="auto"/>
+        <w:jc w:val="both"/>
+        <w:rPr>
+          <w:rFonts w:ascii="Times New Roman" w:hAnsi="Times New Roman" w:cs="Times New Roman"/>
+          <w:sz w:val="24"/>
+          <w:szCs w:val="24"/>
+        </w:rPr>
+      </w:pPr>
+      <w:r>
+        <w:rPr>
+          <w:rFonts w:ascii="Times New Roman" w:hAnsi="Times New Roman" w:cs="Times New Roman"/>
+          <w:sz w:val="24"/>
+          <w:szCs w:val="24"/>
+        </w:rPr>
+        <w:drawing>
+          <wp:inline distT="0" distB="0" distL="0" distR="0" wp14:anchorId="1605C9D7" wp14:editId="4EA98368">
+            <wp:extent cx="5760720" cy="1371600"/>
+            <wp:effectExtent l="0" t="0" r="0" b="0"/>
+            <wp:docPr id="1805041769" name="Image 1"/>
+            <wp:cNvGraphicFramePr>
+              <a:graphicFrameLocks xmlns:a="http://schemas.openxmlformats.org/drawingml/2006/main" noChangeAspect="1"/>
+            </wp:cNvGraphicFramePr>
+            <a:graphic xmlns:a="http://schemas.openxmlformats.org/drawingml/2006/main">
+              <a:graphicData uri="http://schemas.openxmlformats.org/drawingml/2006/picture">
+                <pic:pic xmlns:pic="http://schemas.openxmlformats.org/drawingml/2006/picture">
+                  <pic:nvPicPr>
+                    <pic:cNvPr id="1805041769" name=""/>
+                    <pic:cNvPicPr/>
+                  </pic:nvPicPr>
+                  <pic:blipFill>
+                    <a:blip r:embed="rId8"/>
+                    <a:stretch>
+                      <a:fillRect/>
+                    </a:stretch>
+                  </pic:blipFill>
+                  <pic:spPr>
+                    <a:xfrm>
+                      <a:off x="0" y="0"/>
+                      <a:ext cx="5760720" cy="1371600"/>
+                    </a:xfrm>
+                    <a:prstGeom prst="rect">
+                      <a:avLst/>
+                    </a:prstGeom>
+                  </pic:spPr>
+                </pic:pic>
+              </a:graphicData>
+            </a:graphic>
+          </wp:inline>
+        </w:drawing>
+      </w:r>
+    </w:p>
+    <w:p>
+      <w:pPr>
+        <w:spacing w:line="360" w:lineRule="auto"/>
+        <w:jc w:val="both"/>
+        <w:rPr>
+          <w:rFonts w:ascii="Times New Roman" w:hAnsi="Times New Roman" w:cs="Times New Roman"/>
+          <w:b/>
+          <w:bCs/>
+          <w:sz w:val="24"/>
+          <w:szCs w:val="24"/>
+        </w:rPr>
+      </w:pPr>
+    </w:p>
+    <w:p>
+      <w:pPr>
+        <w:spacing w:line="360" w:lineRule="auto"/>
+        <w:jc w:val="both"/>
+        <w:rPr>
+          <w:rFonts w:ascii="Times New Roman" w:hAnsi="Times New Roman" w:cs="Times New Roman"/>
+          <w:sz w:val="24"/>
+          <w:szCs w:val="24"/>
+        </w:rPr>
+      </w:pPr>
     </w:p>
     <w:p>
       <w:pPr>

</xml_diff>

<commit_message>
Partie 2: Comparaison des techniques de prompt: Test de la technique du few-shot
</commit_message>
<xml_diff>
--- a/ai-business_assistant/correction_atelier_prompt-engineering.docx
+++ b/ai-business_assistant/correction_atelier_prompt-engineering.docx
@@ -1332,7 +1332,7 @@
     </w:p>
     <w:p>
       <w:pPr>
-        <w:spacing w:line="360" w:lineRule="auto"/>
+        <w:spacing w:line="276" w:lineRule="auto"/>
         <w:jc w:val="both"/>
         <w:rPr>
           <w:rFonts w:ascii="Times New Roman" w:hAnsi="Times New Roman" w:cs="Times New Roman"/>
@@ -1351,7 +1351,7 @@
     </w:p>
     <w:p>
       <w:pPr>
-        <w:spacing w:line="360" w:lineRule="auto"/>
+        <w:spacing w:line="276" w:lineRule="auto"/>
         <w:jc w:val="both"/>
         <w:rPr>
           <w:rFonts w:ascii="Times New Roman" w:hAnsi="Times New Roman" w:cs="Times New Roman"/>
@@ -1370,7 +1370,7 @@
     </w:p>
     <w:p>
       <w:pPr>
-        <w:spacing w:line="360" w:lineRule="auto"/>
+        <w:spacing w:line="276" w:lineRule="auto"/>
         <w:jc w:val="both"/>
         <w:rPr>
           <w:rFonts w:ascii="Times New Roman" w:hAnsi="Times New Roman" w:cs="Times New Roman"/>
@@ -1389,7 +1389,7 @@
     </w:p>
     <w:p>
       <w:pPr>
-        <w:spacing w:line="360" w:lineRule="auto"/>
+        <w:spacing w:line="276" w:lineRule="auto"/>
         <w:jc w:val="both"/>
         <w:rPr>
           <w:rFonts w:ascii="Times New Roman" w:hAnsi="Times New Roman" w:cs="Times New Roman"/>
@@ -1408,7 +1408,7 @@
     </w:p>
     <w:p>
       <w:pPr>
-        <w:spacing w:line="360" w:lineRule="auto"/>
+        <w:spacing w:line="276" w:lineRule="auto"/>
         <w:jc w:val="both"/>
         <w:rPr>
           <w:rFonts w:ascii="Times New Roman" w:hAnsi="Times New Roman" w:cs="Times New Roman"/>
@@ -1427,7 +1427,7 @@
     </w:p>
     <w:p>
       <w:pPr>
-        <w:spacing w:line="360" w:lineRule="auto"/>
+        <w:spacing w:line="276" w:lineRule="auto"/>
         <w:jc w:val="both"/>
         <w:rPr>
           <w:rFonts w:ascii="Times New Roman" w:hAnsi="Times New Roman" w:cs="Times New Roman"/>
@@ -1548,6 +1548,367 @@
           <w:szCs w:val="24"/>
         </w:rPr>
       </w:pPr>
+      <w:r>
+        <w:rPr>
+          <w:rFonts w:ascii="Times New Roman" w:hAnsi="Times New Roman" w:cs="Times New Roman"/>
+          <w:b/>
+          <w:bCs/>
+          <w:sz w:val="24"/>
+          <w:szCs w:val="24"/>
+        </w:rPr>
+        <w:t>Test de la technique du few-shot </w:t>
+      </w:r>
+    </w:p>
+    <w:p>
+      <w:pPr>
+        <w:spacing w:line="360" w:lineRule="auto"/>
+        <w:jc w:val="both"/>
+        <w:rPr>
+          <w:rFonts w:ascii="Times New Roman" w:hAnsi="Times New Roman" w:cs="Times New Roman"/>
+          <w:b/>
+          <w:bCs/>
+          <w:sz w:val="24"/>
+          <w:szCs w:val="24"/>
+        </w:rPr>
+      </w:pPr>
+      <w:r>
+        <w:rPr>
+          <w:rFonts w:ascii="Times New Roman" w:hAnsi="Times New Roman" w:cs="Times New Roman"/>
+          <w:b/>
+          <w:bCs/>
+          <w:sz w:val="24"/>
+          <w:szCs w:val="24"/>
+        </w:rPr>
+        <w:t xml:space="preserve">Prompt proposé : </w:t>
+      </w:r>
+    </w:p>
+    <w:p>
+      <w:pPr>
+        <w:spacing w:line="276" w:lineRule="auto"/>
+        <w:jc w:val="both"/>
+        <w:rPr>
+          <w:rFonts w:ascii="Times New Roman" w:hAnsi="Times New Roman" w:cs="Times New Roman"/>
+          <w:sz w:val="24"/>
+          <w:szCs w:val="24"/>
+        </w:rPr>
+      </w:pPr>
+      <w:r>
+        <w:rPr>
+          <w:rFonts w:ascii="Times New Roman" w:hAnsi="Times New Roman" w:cs="Times New Roman"/>
+          <w:sz w:val="24"/>
+          <w:szCs w:val="24"/>
+        </w:rPr>
+        <w:t>Voici plusieurs exemples de classification de commentaires :</w:t>
+      </w:r>
+    </w:p>
+    <w:p>
+      <w:pPr>
+        <w:spacing w:line="276" w:lineRule="auto"/>
+        <w:jc w:val="both"/>
+        <w:rPr>
+          <w:rFonts w:ascii="Times New Roman" w:hAnsi="Times New Roman" w:cs="Times New Roman"/>
+          <w:sz w:val="24"/>
+          <w:szCs w:val="24"/>
+        </w:rPr>
+      </w:pPr>
+      <w:r>
+        <w:rPr>
+          <w:rFonts w:ascii="Times New Roman" w:hAnsi="Times New Roman" w:cs="Times New Roman"/>
+          <w:sz w:val="24"/>
+          <w:szCs w:val="24"/>
+        </w:rPr>
+        <w:t>Commentaire : "Le produit est arrivé cassé, très déçu."</w:t>
+      </w:r>
+    </w:p>
+    <w:p>
+      <w:pPr>
+        <w:spacing w:line="276" w:lineRule="auto"/>
+        <w:jc w:val="both"/>
+        <w:rPr>
+          <w:rFonts w:ascii="Times New Roman" w:hAnsi="Times New Roman" w:cs="Times New Roman"/>
+          <w:sz w:val="24"/>
+          <w:szCs w:val="24"/>
+        </w:rPr>
+      </w:pPr>
+      <w:r>
+        <w:rPr>
+          <w:rFonts w:ascii="Times New Roman" w:hAnsi="Times New Roman" w:cs="Times New Roman"/>
+          <w:sz w:val="24"/>
+          <w:szCs w:val="24"/>
+        </w:rPr>
+        <w:t>Classe : négatif</w:t>
+      </w:r>
+    </w:p>
+    <w:p>
+      <w:pPr>
+        <w:spacing w:line="276" w:lineRule="auto"/>
+        <w:jc w:val="both"/>
+        <w:rPr>
+          <w:rFonts w:ascii="Times New Roman" w:hAnsi="Times New Roman" w:cs="Times New Roman"/>
+          <w:sz w:val="24"/>
+          <w:szCs w:val="24"/>
+        </w:rPr>
+      </w:pPr>
+      <w:r>
+        <w:rPr>
+          <w:rFonts w:ascii="Times New Roman" w:hAnsi="Times New Roman" w:cs="Times New Roman"/>
+          <w:sz w:val="24"/>
+          <w:szCs w:val="24"/>
+        </w:rPr>
+        <w:t>Commentaire : "Excellent produit, je recommande sans hésiter !"</w:t>
+      </w:r>
+    </w:p>
+    <w:p>
+      <w:pPr>
+        <w:spacing w:line="276" w:lineRule="auto"/>
+        <w:jc w:val="both"/>
+        <w:rPr>
+          <w:rFonts w:ascii="Times New Roman" w:hAnsi="Times New Roman" w:cs="Times New Roman"/>
+          <w:sz w:val="24"/>
+          <w:szCs w:val="24"/>
+        </w:rPr>
+      </w:pPr>
+      <w:r>
+        <w:rPr>
+          <w:rFonts w:ascii="Times New Roman" w:hAnsi="Times New Roman" w:cs="Times New Roman"/>
+          <w:sz w:val="24"/>
+          <w:szCs w:val="24"/>
+        </w:rPr>
+        <w:t>Classe : positif</w:t>
+      </w:r>
+    </w:p>
+    <w:p>
+      <w:pPr>
+        <w:spacing w:line="276" w:lineRule="auto"/>
+        <w:jc w:val="both"/>
+        <w:rPr>
+          <w:rFonts w:ascii="Times New Roman" w:hAnsi="Times New Roman" w:cs="Times New Roman"/>
+          <w:sz w:val="24"/>
+          <w:szCs w:val="24"/>
+        </w:rPr>
+      </w:pPr>
+      <w:r>
+        <w:rPr>
+          <w:rFonts w:ascii="Times New Roman" w:hAnsi="Times New Roman" w:cs="Times New Roman"/>
+          <w:sz w:val="24"/>
+          <w:szCs w:val="24"/>
+        </w:rPr>
+        <w:t>Commentaire : "La commande est arrivée dans les délais annoncés."</w:t>
+      </w:r>
+    </w:p>
+    <w:p>
+      <w:pPr>
+        <w:spacing w:line="276" w:lineRule="auto"/>
+        <w:jc w:val="both"/>
+        <w:rPr>
+          <w:rFonts w:ascii="Times New Roman" w:hAnsi="Times New Roman" w:cs="Times New Roman"/>
+          <w:sz w:val="24"/>
+          <w:szCs w:val="24"/>
+        </w:rPr>
+      </w:pPr>
+      <w:r>
+        <w:rPr>
+          <w:rFonts w:ascii="Times New Roman" w:hAnsi="Times New Roman" w:cs="Times New Roman"/>
+          <w:sz w:val="24"/>
+          <w:szCs w:val="24"/>
+        </w:rPr>
+        <w:t xml:space="preserve">Classe : </w:t>
+      </w:r>
+      <w:r>
+        <w:rPr>
+          <w:rFonts w:ascii="Times New Roman" w:hAnsi="Times New Roman" w:cs="Times New Roman"/>
+          <w:sz w:val="24"/>
+          <w:szCs w:val="24"/>
+        </w:rPr>
+        <w:t>positif</w:t>
+      </w:r>
+    </w:p>
+    <w:p>
+      <w:pPr>
+        <w:spacing w:line="276" w:lineRule="auto"/>
+        <w:jc w:val="both"/>
+        <w:rPr>
+          <w:rFonts w:ascii="Times New Roman" w:hAnsi="Times New Roman" w:cs="Times New Roman"/>
+          <w:sz w:val="24"/>
+          <w:szCs w:val="24"/>
+        </w:rPr>
+      </w:pPr>
+      <w:r>
+        <w:rPr>
+          <w:rFonts w:ascii="Times New Roman" w:hAnsi="Times New Roman" w:cs="Times New Roman"/>
+          <w:sz w:val="24"/>
+          <w:szCs w:val="24"/>
+        </w:rPr>
+        <w:t>Commentaire : "La qualité est top mais le prix est vraiment excessif."</w:t>
+      </w:r>
+    </w:p>
+    <w:p>
+      <w:pPr>
+        <w:spacing w:line="276" w:lineRule="auto"/>
+        <w:jc w:val="both"/>
+        <w:rPr>
+          <w:rFonts w:ascii="Times New Roman" w:hAnsi="Times New Roman" w:cs="Times New Roman"/>
+          <w:sz w:val="24"/>
+          <w:szCs w:val="24"/>
+        </w:rPr>
+      </w:pPr>
+      <w:r>
+        <w:rPr>
+          <w:rFonts w:ascii="Times New Roman" w:hAnsi="Times New Roman" w:cs="Times New Roman"/>
+          <w:sz w:val="24"/>
+          <w:szCs w:val="24"/>
+        </w:rPr>
+        <w:t>Classe : n</w:t>
+      </w:r>
+      <w:r>
+        <w:rPr>
+          <w:rFonts w:ascii="Times New Roman" w:hAnsi="Times New Roman" w:cs="Times New Roman"/>
+          <w:sz w:val="24"/>
+          <w:szCs w:val="24"/>
+        </w:rPr>
+        <w:t>eutre</w:t>
+      </w:r>
+    </w:p>
+    <w:p>
+      <w:pPr>
+        <w:spacing w:line="276" w:lineRule="auto"/>
+        <w:jc w:val="both"/>
+        <w:rPr>
+          <w:rFonts w:ascii="Times New Roman" w:hAnsi="Times New Roman" w:cs="Times New Roman"/>
+          <w:sz w:val="24"/>
+          <w:szCs w:val="24"/>
+        </w:rPr>
+      </w:pPr>
+      <w:r>
+        <w:rPr>
+          <w:rFonts w:ascii="Times New Roman" w:hAnsi="Times New Roman" w:cs="Times New Roman"/>
+          <w:sz w:val="24"/>
+          <w:szCs w:val="24"/>
+        </w:rPr>
+        <w:t>Classe maintenant ce commentaire, selon le même format :</w:t>
+      </w:r>
+    </w:p>
+    <w:p>
+      <w:pPr>
+        <w:spacing w:line="276" w:lineRule="auto"/>
+        <w:jc w:val="both"/>
+        <w:rPr>
+          <w:rFonts w:ascii="Times New Roman" w:hAnsi="Times New Roman" w:cs="Times New Roman"/>
+          <w:sz w:val="24"/>
+          <w:szCs w:val="24"/>
+        </w:rPr>
+      </w:pPr>
+      <w:r>
+        <w:rPr>
+          <w:rFonts w:ascii="Times New Roman" w:hAnsi="Times New Roman" w:cs="Times New Roman"/>
+          <w:sz w:val="24"/>
+          <w:szCs w:val="24"/>
+        </w:rPr>
+        <w:t>Commentaire : "Le service est rapide mais l'application plante régulièrement."</w:t>
+      </w:r>
+    </w:p>
+    <w:p>
+      <w:pPr>
+        <w:spacing w:line="360" w:lineRule="auto"/>
+        <w:jc w:val="both"/>
+        <w:rPr>
+          <w:rFonts w:ascii="Times New Roman" w:hAnsi="Times New Roman" w:cs="Times New Roman"/>
+          <w:b/>
+          <w:bCs/>
+          <w:sz w:val="24"/>
+          <w:szCs w:val="24"/>
+        </w:rPr>
+      </w:pPr>
+      <w:r>
+        <w:rPr>
+          <w:rFonts w:ascii="Times New Roman" w:hAnsi="Times New Roman" w:cs="Times New Roman"/>
+          <w:b/>
+          <w:bCs/>
+          <w:sz w:val="24"/>
+          <w:szCs w:val="24"/>
+        </w:rPr>
+        <w:t>Classes possibles : positif, négatif, neutre.</w:t>
+      </w:r>
+    </w:p>
+    <w:p>
+      <w:pPr>
+        <w:spacing w:line="360" w:lineRule="auto"/>
+        <w:jc w:val="both"/>
+        <w:rPr>
+          <w:rFonts w:ascii="Times New Roman" w:hAnsi="Times New Roman" w:cs="Times New Roman"/>
+          <w:b/>
+          <w:bCs/>
+          <w:sz w:val="24"/>
+          <w:szCs w:val="24"/>
+        </w:rPr>
+      </w:pPr>
+      <w:r>
+        <w:rPr>
+          <w:rFonts w:ascii="Times New Roman" w:hAnsi="Times New Roman" w:cs="Times New Roman"/>
+          <w:b/>
+          <w:bCs/>
+          <w:sz w:val="24"/>
+          <w:szCs w:val="24"/>
+        </w:rPr>
+        <w:t xml:space="preserve">Réponse de Claude : </w:t>
+      </w:r>
+    </w:p>
+    <w:p>
+      <w:pPr>
+        <w:spacing w:line="360" w:lineRule="auto"/>
+        <w:jc w:val="both"/>
+        <w:rPr>
+          <w:rFonts w:ascii="Times New Roman" w:hAnsi="Times New Roman" w:cs="Times New Roman"/>
+          <w:b/>
+          <w:bCs/>
+          <w:sz w:val="24"/>
+          <w:szCs w:val="24"/>
+        </w:rPr>
+      </w:pPr>
+      <w:r>
+        <w:rPr>
+          <w:rFonts w:ascii="Times New Roman" w:hAnsi="Times New Roman" w:cs="Times New Roman"/>
+          <w:b/>
+          <w:bCs/>
+          <w:sz w:val="24"/>
+          <w:szCs w:val="24"/>
+        </w:rPr>
+        <w:drawing>
+          <wp:inline distT="0" distB="0" distL="0" distR="0" wp14:anchorId="6E11FC21" wp14:editId="55DC7B7F">
+            <wp:extent cx="5760720" cy="808990"/>
+            <wp:effectExtent l="0" t="0" r="0" b="0"/>
+            <wp:docPr id="1560526200" name="Image 1"/>
+            <wp:cNvGraphicFramePr>
+              <a:graphicFrameLocks xmlns:a="http://schemas.openxmlformats.org/drawingml/2006/main" noChangeAspect="1"/>
+            </wp:cNvGraphicFramePr>
+            <a:graphic xmlns:a="http://schemas.openxmlformats.org/drawingml/2006/main">
+              <a:graphicData uri="http://schemas.openxmlformats.org/drawingml/2006/picture">
+                <pic:pic xmlns:pic="http://schemas.openxmlformats.org/drawingml/2006/picture">
+                  <pic:nvPicPr>
+                    <pic:cNvPr id="1560526200" name=""/>
+                    <pic:cNvPicPr/>
+                  </pic:nvPicPr>
+                  <pic:blipFill>
+                    <a:blip r:embed="rId9"/>
+                    <a:stretch>
+                      <a:fillRect/>
+                    </a:stretch>
+                  </pic:blipFill>
+                  <pic:spPr>
+                    <a:xfrm>
+                      <a:off x="0" y="0"/>
+                      <a:ext cx="5760720" cy="808990"/>
+                    </a:xfrm>
+                    <a:prstGeom prst="rect">
+                      <a:avLst/>
+                    </a:prstGeom>
+                  </pic:spPr>
+                </pic:pic>
+              </a:graphicData>
+            </a:graphic>
+          </wp:inline>
+        </w:drawing>
+      </w:r>
     </w:p>
     <w:p>
       <w:pPr>

</xml_diff>

<commit_message>
Partie 2: Comparaison des techniques de prompt: Test de la technique du structured prompt
</commit_message>
<xml_diff>
--- a/ai-business_assistant/correction_atelier_prompt-engineering.docx
+++ b/ai-business_assistant/correction_atelier_prompt-engineering.docx
@@ -87,23 +87,13 @@
         </w:rPr>
         <w:t xml:space="preserve"> </w:t>
       </w:r>
-      <w:proofErr w:type="spellStart"/>
-      <w:r>
-        <w:rPr>
-          <w:rFonts w:ascii="Times New Roman" w:hAnsi="Times New Roman" w:cs="Times New Roman"/>
-          <w:sz w:val="24"/>
-          <w:szCs w:val="24"/>
-        </w:rPr>
-        <w:t>learning</w:t>
-      </w:r>
-      <w:proofErr w:type="spellEnd"/>
-      <w:r>
-        <w:rPr>
-          <w:rFonts w:ascii="Times New Roman" w:hAnsi="Times New Roman" w:cs="Times New Roman"/>
-          <w:sz w:val="24"/>
-          <w:szCs w:val="24"/>
-        </w:rPr>
-        <w:t xml:space="preserve"> et produire des résultats structurés.</w:t>
+      <w:r>
+        <w:rPr>
+          <w:rFonts w:ascii="Times New Roman" w:hAnsi="Times New Roman" w:cs="Times New Roman"/>
+          <w:sz w:val="24"/>
+          <w:szCs w:val="24"/>
+        </w:rPr>
+        <w:t>learning et produire des résultats structurés.</w:t>
       </w:r>
     </w:p>
     <w:p>
@@ -198,7 +188,7 @@
           <w:numId w:val="1"/>
         </w:numPr>
         <w:spacing w:line="360" w:lineRule="auto"/>
-        <w:jc w:val="both"/>
+        <w:jc w:val="center"/>
         <w:rPr>
           <w:rFonts w:ascii="Times New Roman" w:hAnsi="Times New Roman" w:cs="Times New Roman"/>
           <w:b/>
@@ -900,25 +890,30 @@
     </w:p>
     <w:p>
       <w:pPr>
-        <w:spacing w:line="360" w:lineRule="auto"/>
-        <w:jc w:val="both"/>
-        <w:rPr>
-          <w:rFonts w:ascii="Times New Roman" w:hAnsi="Times New Roman" w:cs="Times New Roman"/>
-          <w:b/>
-          <w:bCs/>
-          <w:sz w:val="24"/>
-          <w:szCs w:val="24"/>
-        </w:rPr>
-      </w:pPr>
-      <w:r>
-        <w:rPr>
-          <w:rFonts w:ascii="Times New Roman" w:hAnsi="Times New Roman" w:cs="Times New Roman"/>
-          <w:b/>
-          <w:bCs/>
-          <w:sz w:val="24"/>
-          <w:szCs w:val="24"/>
-        </w:rPr>
-        <w:t>Réponse fournie par Claude </w:t>
+        <w:pStyle w:val="Paragraphedeliste"/>
+        <w:numPr>
+          <w:ilvl w:val="0"/>
+          <w:numId w:val="1"/>
+        </w:numPr>
+        <w:spacing w:line="360" w:lineRule="auto"/>
+        <w:jc w:val="center"/>
+        <w:rPr>
+          <w:rFonts w:ascii="Times New Roman" w:hAnsi="Times New Roman" w:cs="Times New Roman"/>
+          <w:b/>
+          <w:bCs/>
+          <w:sz w:val="24"/>
+          <w:szCs w:val="24"/>
+        </w:rPr>
+      </w:pPr>
+      <w:r>
+        <w:rPr>
+          <w:rFonts w:ascii="Times New Roman" w:hAnsi="Times New Roman" w:cs="Times New Roman"/>
+          <w:b/>
+          <w:bCs/>
+          <w:sz w:val="24"/>
+          <w:szCs w:val="24"/>
+        </w:rPr>
+        <w:t>Réponse fournie par Claude</w:t>
       </w:r>
     </w:p>
     <w:p>
@@ -1045,20 +1040,8 @@
           <w:sz w:val="28"/>
           <w:szCs w:val="28"/>
         </w:rPr>
-        <w:t xml:space="preserve">Partie 2 - Comparer les techniques de </w:t>
-      </w:r>
-      <w:proofErr w:type="spellStart"/>
-      <w:r>
-        <w:rPr>
-          <w:rFonts w:ascii="Times New Roman" w:hAnsi="Times New Roman" w:cs="Times New Roman"/>
-          <w:b/>
-          <w:bCs/>
-          <w:sz w:val="28"/>
-          <w:szCs w:val="28"/>
-        </w:rPr>
-        <w:t>prompting</w:t>
-      </w:r>
-      <w:proofErr w:type="spellEnd"/>
+        <w:t>Partie 2 - Comparer les techniques de prompting</w:t>
+      </w:r>
       <w:r>
         <w:rPr>
           <w:rFonts w:ascii="Times New Roman" w:hAnsi="Times New Roman" w:cs="Times New Roman"/>
@@ -1084,25 +1067,7 @@
           <w:sz w:val="24"/>
           <w:szCs w:val="24"/>
         </w:rPr>
-        <w:t xml:space="preserve">Tester puis évaluer les résultats obtenus avec les techniques </w:t>
-      </w:r>
-      <w:proofErr w:type="spellStart"/>
-      <w:r>
-        <w:rPr>
-          <w:rFonts w:ascii="Times New Roman" w:hAnsi="Times New Roman" w:cs="Times New Roman"/>
-          <w:sz w:val="24"/>
-          <w:szCs w:val="24"/>
-        </w:rPr>
-        <w:t>zero</w:t>
-      </w:r>
-      <w:proofErr w:type="spellEnd"/>
-      <w:r>
-        <w:rPr>
-          <w:rFonts w:ascii="Times New Roman" w:hAnsi="Times New Roman" w:cs="Times New Roman"/>
-          <w:sz w:val="24"/>
-          <w:szCs w:val="24"/>
-        </w:rPr>
-        <w:t>-shot, one-shot, few-shot et un prompt structuré sur une demande du genre : « Classer le commentaire suivant : "Le service est rapide mais l'application plante régulièrement." Classes possibles : positif, négatif, neutre. »</w:t>
+        <w:t>Tester puis évaluer les résultats obtenus avec les techniques zero-shot, one-shot, few-shot et un prompt structuré sur une demande du genre : « Classer le commentaire suivant : "Le service est rapide mais l'application plante régulièrement." Classes possibles : positif, négatif, neutre. »</w:t>
       </w:r>
     </w:p>
     <w:p>
@@ -1130,25 +1095,30 @@
     </w:p>
     <w:p>
       <w:pPr>
-        <w:spacing w:line="360" w:lineRule="auto"/>
-        <w:jc w:val="both"/>
-        <w:rPr>
-          <w:rFonts w:ascii="Times New Roman" w:hAnsi="Times New Roman" w:cs="Times New Roman"/>
-          <w:b/>
-          <w:bCs/>
-          <w:sz w:val="24"/>
-          <w:szCs w:val="24"/>
-        </w:rPr>
-      </w:pPr>
-      <w:r>
-        <w:rPr>
-          <w:rFonts w:ascii="Times New Roman" w:hAnsi="Times New Roman" w:cs="Times New Roman"/>
-          <w:b/>
-          <w:bCs/>
-          <w:sz w:val="24"/>
-          <w:szCs w:val="24"/>
-        </w:rPr>
-        <w:t>Prompt proposé </w:t>
+        <w:pStyle w:val="Paragraphedeliste"/>
+        <w:numPr>
+          <w:ilvl w:val="0"/>
+          <w:numId w:val="1"/>
+        </w:numPr>
+        <w:spacing w:line="360" w:lineRule="auto"/>
+        <w:jc w:val="center"/>
+        <w:rPr>
+          <w:rFonts w:ascii="Times New Roman" w:hAnsi="Times New Roman" w:cs="Times New Roman"/>
+          <w:b/>
+          <w:bCs/>
+          <w:sz w:val="24"/>
+          <w:szCs w:val="24"/>
+        </w:rPr>
+      </w:pPr>
+      <w:r>
+        <w:rPr>
+          <w:rFonts w:ascii="Times New Roman" w:hAnsi="Times New Roman" w:cs="Times New Roman"/>
+          <w:b/>
+          <w:bCs/>
+          <w:sz w:val="24"/>
+          <w:szCs w:val="24"/>
+        </w:rPr>
+        <w:t>Prompt proposé</w:t>
       </w:r>
     </w:p>
     <w:p>
@@ -1210,8 +1180,13 @@
     </w:p>
     <w:p>
       <w:pPr>
-        <w:spacing w:line="360" w:lineRule="auto"/>
-        <w:jc w:val="both"/>
+        <w:pStyle w:val="Paragraphedeliste"/>
+        <w:numPr>
+          <w:ilvl w:val="0"/>
+          <w:numId w:val="1"/>
+        </w:numPr>
+        <w:spacing w:line="360" w:lineRule="auto"/>
+        <w:jc w:val="center"/>
         <w:rPr>
           <w:rFonts w:ascii="Times New Roman" w:hAnsi="Times New Roman" w:cs="Times New Roman"/>
           <w:b/>
@@ -1309,25 +1284,30 @@
     </w:p>
     <w:p>
       <w:pPr>
-        <w:spacing w:line="360" w:lineRule="auto"/>
-        <w:jc w:val="both"/>
-        <w:rPr>
-          <w:rFonts w:ascii="Times New Roman" w:hAnsi="Times New Roman" w:cs="Times New Roman"/>
-          <w:b/>
-          <w:bCs/>
-          <w:sz w:val="24"/>
-          <w:szCs w:val="24"/>
-        </w:rPr>
-      </w:pPr>
-      <w:r>
-        <w:rPr>
-          <w:rFonts w:ascii="Times New Roman" w:hAnsi="Times New Roman" w:cs="Times New Roman"/>
-          <w:b/>
-          <w:bCs/>
-          <w:sz w:val="24"/>
-          <w:szCs w:val="24"/>
-        </w:rPr>
-        <w:t>Prompt proposé :</w:t>
+        <w:pStyle w:val="Paragraphedeliste"/>
+        <w:numPr>
+          <w:ilvl w:val="0"/>
+          <w:numId w:val="1"/>
+        </w:numPr>
+        <w:spacing w:line="360" w:lineRule="auto"/>
+        <w:jc w:val="center"/>
+        <w:rPr>
+          <w:rFonts w:ascii="Times New Roman" w:hAnsi="Times New Roman" w:cs="Times New Roman"/>
+          <w:b/>
+          <w:bCs/>
+          <w:sz w:val="24"/>
+          <w:szCs w:val="24"/>
+        </w:rPr>
+      </w:pPr>
+      <w:r>
+        <w:rPr>
+          <w:rFonts w:ascii="Times New Roman" w:hAnsi="Times New Roman" w:cs="Times New Roman"/>
+          <w:b/>
+          <w:bCs/>
+          <w:sz w:val="24"/>
+          <w:szCs w:val="24"/>
+        </w:rPr>
+        <w:t>Prompt proposé</w:t>
       </w:r>
     </w:p>
     <w:p>
@@ -1462,25 +1442,30 @@
     </w:p>
     <w:p>
       <w:pPr>
-        <w:spacing w:line="360" w:lineRule="auto"/>
-        <w:jc w:val="both"/>
-        <w:rPr>
-          <w:rFonts w:ascii="Times New Roman" w:hAnsi="Times New Roman" w:cs="Times New Roman"/>
-          <w:b/>
-          <w:bCs/>
-          <w:sz w:val="24"/>
-          <w:szCs w:val="24"/>
-        </w:rPr>
-      </w:pPr>
-      <w:r>
-        <w:rPr>
-          <w:rFonts w:ascii="Times New Roman" w:hAnsi="Times New Roman" w:cs="Times New Roman"/>
-          <w:b/>
-          <w:bCs/>
-          <w:sz w:val="24"/>
-          <w:szCs w:val="24"/>
-        </w:rPr>
-        <w:t>Réponse de Claude :</w:t>
+        <w:pStyle w:val="Paragraphedeliste"/>
+        <w:numPr>
+          <w:ilvl w:val="0"/>
+          <w:numId w:val="1"/>
+        </w:numPr>
+        <w:spacing w:line="360" w:lineRule="auto"/>
+        <w:jc w:val="center"/>
+        <w:rPr>
+          <w:rFonts w:ascii="Times New Roman" w:hAnsi="Times New Roman" w:cs="Times New Roman"/>
+          <w:b/>
+          <w:bCs/>
+          <w:sz w:val="24"/>
+          <w:szCs w:val="24"/>
+        </w:rPr>
+      </w:pPr>
+      <w:r>
+        <w:rPr>
+          <w:rFonts w:ascii="Times New Roman" w:hAnsi="Times New Roman" w:cs="Times New Roman"/>
+          <w:b/>
+          <w:bCs/>
+          <w:sz w:val="24"/>
+          <w:szCs w:val="24"/>
+        </w:rPr>
+        <w:t>Réponse de Claude</w:t>
       </w:r>
     </w:p>
     <w:p>
@@ -1561,25 +1546,30 @@
     </w:p>
     <w:p>
       <w:pPr>
-        <w:spacing w:line="360" w:lineRule="auto"/>
-        <w:jc w:val="both"/>
-        <w:rPr>
-          <w:rFonts w:ascii="Times New Roman" w:hAnsi="Times New Roman" w:cs="Times New Roman"/>
-          <w:b/>
-          <w:bCs/>
-          <w:sz w:val="24"/>
-          <w:szCs w:val="24"/>
-        </w:rPr>
-      </w:pPr>
-      <w:r>
-        <w:rPr>
-          <w:rFonts w:ascii="Times New Roman" w:hAnsi="Times New Roman" w:cs="Times New Roman"/>
-          <w:b/>
-          <w:bCs/>
-          <w:sz w:val="24"/>
-          <w:szCs w:val="24"/>
-        </w:rPr>
-        <w:t xml:space="preserve">Prompt proposé : </w:t>
+        <w:pStyle w:val="Paragraphedeliste"/>
+        <w:numPr>
+          <w:ilvl w:val="0"/>
+          <w:numId w:val="1"/>
+        </w:numPr>
+        <w:spacing w:line="360" w:lineRule="auto"/>
+        <w:jc w:val="center"/>
+        <w:rPr>
+          <w:rFonts w:ascii="Times New Roman" w:hAnsi="Times New Roman" w:cs="Times New Roman"/>
+          <w:b/>
+          <w:bCs/>
+          <w:sz w:val="24"/>
+          <w:szCs w:val="24"/>
+        </w:rPr>
+      </w:pPr>
+      <w:r>
+        <w:rPr>
+          <w:rFonts w:ascii="Times New Roman" w:hAnsi="Times New Roman" w:cs="Times New Roman"/>
+          <w:b/>
+          <w:bCs/>
+          <w:sz w:val="24"/>
+          <w:szCs w:val="24"/>
+        </w:rPr>
+        <w:t>Prompt proposé</w:t>
       </w:r>
     </w:p>
     <w:p>
@@ -1832,25 +1822,30 @@
     </w:p>
     <w:p>
       <w:pPr>
-        <w:spacing w:line="360" w:lineRule="auto"/>
-        <w:jc w:val="both"/>
-        <w:rPr>
-          <w:rFonts w:ascii="Times New Roman" w:hAnsi="Times New Roman" w:cs="Times New Roman"/>
-          <w:b/>
-          <w:bCs/>
-          <w:sz w:val="24"/>
-          <w:szCs w:val="24"/>
-        </w:rPr>
-      </w:pPr>
-      <w:r>
-        <w:rPr>
-          <w:rFonts w:ascii="Times New Roman" w:hAnsi="Times New Roman" w:cs="Times New Roman"/>
-          <w:b/>
-          <w:bCs/>
-          <w:sz w:val="24"/>
-          <w:szCs w:val="24"/>
-        </w:rPr>
-        <w:t xml:space="preserve">Réponse de Claude : </w:t>
+        <w:pStyle w:val="Paragraphedeliste"/>
+        <w:numPr>
+          <w:ilvl w:val="0"/>
+          <w:numId w:val="1"/>
+        </w:numPr>
+        <w:spacing w:line="360" w:lineRule="auto"/>
+        <w:jc w:val="center"/>
+        <w:rPr>
+          <w:rFonts w:ascii="Times New Roman" w:hAnsi="Times New Roman" w:cs="Times New Roman"/>
+          <w:b/>
+          <w:bCs/>
+          <w:sz w:val="24"/>
+          <w:szCs w:val="24"/>
+        </w:rPr>
+      </w:pPr>
+      <w:r>
+        <w:rPr>
+          <w:rFonts w:ascii="Times New Roman" w:hAnsi="Times New Roman" w:cs="Times New Roman"/>
+          <w:b/>
+          <w:bCs/>
+          <w:sz w:val="24"/>
+          <w:szCs w:val="24"/>
+        </w:rPr>
+        <w:t>Réponse de Claude</w:t>
       </w:r>
     </w:p>
     <w:p>
@@ -1916,6 +1911,470 @@
         <w:jc w:val="both"/>
         <w:rPr>
           <w:rFonts w:ascii="Times New Roman" w:hAnsi="Times New Roman" w:cs="Times New Roman"/>
+          <w:b/>
+          <w:bCs/>
+          <w:sz w:val="24"/>
+          <w:szCs w:val="24"/>
+        </w:rPr>
+      </w:pPr>
+      <w:r>
+        <w:rPr>
+          <w:rFonts w:ascii="Times New Roman" w:hAnsi="Times New Roman" w:cs="Times New Roman"/>
+          <w:b/>
+          <w:bCs/>
+          <w:sz w:val="24"/>
+          <w:szCs w:val="24"/>
+        </w:rPr>
+        <w:t>Test de la technique du structured prompt</w:t>
+      </w:r>
+    </w:p>
+    <w:p>
+      <w:pPr>
+        <w:pStyle w:val="Paragraphedeliste"/>
+        <w:numPr>
+          <w:ilvl w:val="0"/>
+          <w:numId w:val="1"/>
+        </w:numPr>
+        <w:spacing w:line="360" w:lineRule="auto"/>
+        <w:jc w:val="center"/>
+        <w:rPr>
+          <w:rFonts w:ascii="Times New Roman" w:hAnsi="Times New Roman" w:cs="Times New Roman"/>
+          <w:b/>
+          <w:bCs/>
+          <w:sz w:val="24"/>
+          <w:szCs w:val="24"/>
+        </w:rPr>
+      </w:pPr>
+      <w:r>
+        <w:rPr>
+          <w:rFonts w:ascii="Times New Roman" w:hAnsi="Times New Roman" w:cs="Times New Roman"/>
+          <w:b/>
+          <w:bCs/>
+          <w:sz w:val="24"/>
+          <w:szCs w:val="24"/>
+        </w:rPr>
+        <w:t>Prompt proposé</w:t>
+      </w:r>
+    </w:p>
+    <w:p>
+      <w:pPr>
+        <w:spacing w:line="360" w:lineRule="auto"/>
+        <w:jc w:val="both"/>
+        <w:rPr>
+          <w:rFonts w:ascii="Times New Roman" w:hAnsi="Times New Roman" w:cs="Times New Roman"/>
+          <w:sz w:val="24"/>
+          <w:szCs w:val="24"/>
+        </w:rPr>
+      </w:pPr>
+      <w:r>
+        <w:rPr>
+          <w:rFonts w:ascii="Times New Roman" w:hAnsi="Times New Roman" w:cs="Times New Roman"/>
+          <w:b/>
+          <w:bCs/>
+          <w:sz w:val="24"/>
+          <w:szCs w:val="24"/>
+        </w:rPr>
+        <w:t>Rôle :</w:t>
+      </w:r>
+      <w:r>
+        <w:rPr>
+          <w:rFonts w:ascii="Times New Roman" w:hAnsi="Times New Roman" w:cs="Times New Roman"/>
+          <w:sz w:val="24"/>
+          <w:szCs w:val="24"/>
+        </w:rPr>
+        <w:t xml:space="preserve"> </w:t>
+      </w:r>
+      <w:r>
+        <w:rPr>
+          <w:rFonts w:ascii="Times New Roman" w:hAnsi="Times New Roman" w:cs="Times New Roman"/>
+          <w:sz w:val="24"/>
+          <w:szCs w:val="24"/>
+        </w:rPr>
+        <w:t>Tu es un outil d'analyse de sentiment pour des commentaires clients</w:t>
+      </w:r>
+      <w:r>
+        <w:rPr>
+          <w:rFonts w:ascii="Times New Roman" w:hAnsi="Times New Roman" w:cs="Times New Roman"/>
+          <w:sz w:val="24"/>
+          <w:szCs w:val="24"/>
+        </w:rPr>
+        <w:t xml:space="preserve"> expérimenté dans l’analyse d’avis client.</w:t>
+      </w:r>
+    </w:p>
+    <w:p>
+      <w:pPr>
+        <w:spacing w:line="360" w:lineRule="auto"/>
+        <w:jc w:val="both"/>
+        <w:rPr>
+          <w:rFonts w:ascii="Times New Roman" w:hAnsi="Times New Roman" w:cs="Times New Roman"/>
+          <w:sz w:val="24"/>
+          <w:szCs w:val="24"/>
+        </w:rPr>
+      </w:pPr>
+      <w:r>
+        <w:rPr>
+          <w:rFonts w:ascii="Times New Roman" w:hAnsi="Times New Roman" w:cs="Times New Roman"/>
+          <w:b/>
+          <w:bCs/>
+          <w:sz w:val="24"/>
+          <w:szCs w:val="24"/>
+        </w:rPr>
+        <w:t>Tâche :</w:t>
+      </w:r>
+      <w:r>
+        <w:rPr>
+          <w:rFonts w:ascii="Times New Roman" w:hAnsi="Times New Roman" w:cs="Times New Roman"/>
+          <w:sz w:val="24"/>
+          <w:szCs w:val="24"/>
+        </w:rPr>
+        <w:t xml:space="preserve"> </w:t>
+      </w:r>
+      <w:r>
+        <w:rPr>
+          <w:rFonts w:ascii="Times New Roman" w:hAnsi="Times New Roman" w:cs="Times New Roman"/>
+          <w:sz w:val="24"/>
+          <w:szCs w:val="24"/>
+        </w:rPr>
+        <w:t>Classe le commentaire suivant selon sa tonalité globale.</w:t>
+      </w:r>
+    </w:p>
+    <w:p>
+      <w:pPr>
+        <w:spacing w:line="360" w:lineRule="auto"/>
+        <w:jc w:val="both"/>
+        <w:rPr>
+          <w:rFonts w:ascii="Times New Roman" w:hAnsi="Times New Roman" w:cs="Times New Roman"/>
+          <w:b/>
+          <w:bCs/>
+          <w:sz w:val="24"/>
+          <w:szCs w:val="24"/>
+        </w:rPr>
+      </w:pPr>
+      <w:r>
+        <w:rPr>
+          <w:rFonts w:ascii="Times New Roman" w:hAnsi="Times New Roman" w:cs="Times New Roman"/>
+          <w:b/>
+          <w:bCs/>
+          <w:sz w:val="24"/>
+          <w:szCs w:val="24"/>
+        </w:rPr>
+        <w:t>Règles de décision :</w:t>
+      </w:r>
+    </w:p>
+    <w:p>
+      <w:pPr>
+        <w:spacing w:line="360" w:lineRule="auto"/>
+        <w:jc w:val="both"/>
+        <w:rPr>
+          <w:rFonts w:ascii="Times New Roman" w:hAnsi="Times New Roman" w:cs="Times New Roman"/>
+          <w:sz w:val="24"/>
+          <w:szCs w:val="24"/>
+        </w:rPr>
+      </w:pPr>
+      <w:r>
+        <w:rPr>
+          <w:rFonts w:ascii="Times New Roman" w:hAnsi="Times New Roman" w:cs="Times New Roman"/>
+          <w:sz w:val="24"/>
+          <w:szCs w:val="24"/>
+        </w:rPr>
+        <w:t>- Si le commentaire contient uniquement des éléments positifs</w:t>
+      </w:r>
+      <w:r>
+        <w:rPr>
+          <w:rFonts w:ascii="Times New Roman" w:hAnsi="Times New Roman" w:cs="Times New Roman"/>
+          <w:sz w:val="24"/>
+          <w:szCs w:val="24"/>
+        </w:rPr>
+        <w:t xml:space="preserve"> : </w:t>
+      </w:r>
+      <w:r>
+        <w:rPr>
+          <w:rFonts w:ascii="Times New Roman" w:hAnsi="Times New Roman" w:cs="Times New Roman"/>
+          <w:sz w:val="24"/>
+          <w:szCs w:val="24"/>
+        </w:rPr>
+        <w:t>positif</w:t>
+      </w:r>
+    </w:p>
+    <w:p>
+      <w:pPr>
+        <w:spacing w:line="360" w:lineRule="auto"/>
+        <w:jc w:val="both"/>
+        <w:rPr>
+          <w:rFonts w:ascii="Times New Roman" w:hAnsi="Times New Roman" w:cs="Times New Roman"/>
+          <w:sz w:val="24"/>
+          <w:szCs w:val="24"/>
+        </w:rPr>
+      </w:pPr>
+      <w:r>
+        <w:rPr>
+          <w:rFonts w:ascii="Times New Roman" w:hAnsi="Times New Roman" w:cs="Times New Roman"/>
+          <w:sz w:val="24"/>
+          <w:szCs w:val="24"/>
+        </w:rPr>
+        <w:t>- Si le commentaire contient uniquement des éléments négatifs</w:t>
+      </w:r>
+      <w:r>
+        <w:rPr>
+          <w:rFonts w:ascii="Times New Roman" w:hAnsi="Times New Roman" w:cs="Times New Roman"/>
+          <w:sz w:val="24"/>
+          <w:szCs w:val="24"/>
+        </w:rPr>
+        <w:t xml:space="preserve"> : </w:t>
+      </w:r>
+      <w:r>
+        <w:rPr>
+          <w:rFonts w:ascii="Times New Roman" w:hAnsi="Times New Roman" w:cs="Times New Roman"/>
+          <w:sz w:val="24"/>
+          <w:szCs w:val="24"/>
+        </w:rPr>
+        <w:t>négatif</w:t>
+      </w:r>
+    </w:p>
+    <w:p>
+      <w:pPr>
+        <w:spacing w:line="360" w:lineRule="auto"/>
+        <w:jc w:val="both"/>
+        <w:rPr>
+          <w:rFonts w:ascii="Times New Roman" w:hAnsi="Times New Roman" w:cs="Times New Roman"/>
+          <w:sz w:val="24"/>
+          <w:szCs w:val="24"/>
+        </w:rPr>
+      </w:pPr>
+      <w:r>
+        <w:rPr>
+          <w:rFonts w:ascii="Times New Roman" w:hAnsi="Times New Roman" w:cs="Times New Roman"/>
+          <w:sz w:val="24"/>
+          <w:szCs w:val="24"/>
+        </w:rPr>
+        <w:t>- Si le commentaire est neutre ou factuel, sans opinion marquée</w:t>
+      </w:r>
+      <w:r>
+        <w:rPr>
+          <w:rFonts w:ascii="Times New Roman" w:hAnsi="Times New Roman" w:cs="Times New Roman"/>
+          <w:sz w:val="24"/>
+          <w:szCs w:val="24"/>
+        </w:rPr>
+        <w:t xml:space="preserve"> : </w:t>
+      </w:r>
+      <w:r>
+        <w:rPr>
+          <w:rFonts w:ascii="Times New Roman" w:hAnsi="Times New Roman" w:cs="Times New Roman"/>
+          <w:sz w:val="24"/>
+          <w:szCs w:val="24"/>
+        </w:rPr>
+        <w:t>neutre</w:t>
+      </w:r>
+    </w:p>
+    <w:p>
+      <w:pPr>
+        <w:spacing w:line="360" w:lineRule="auto"/>
+        <w:jc w:val="both"/>
+        <w:rPr>
+          <w:rFonts w:ascii="Times New Roman" w:hAnsi="Times New Roman" w:cs="Times New Roman"/>
+          <w:sz w:val="24"/>
+          <w:szCs w:val="24"/>
+        </w:rPr>
+      </w:pPr>
+      <w:r>
+        <w:rPr>
+          <w:rFonts w:ascii="Times New Roman" w:hAnsi="Times New Roman" w:cs="Times New Roman"/>
+          <w:sz w:val="24"/>
+          <w:szCs w:val="24"/>
+        </w:rPr>
+        <w:t>- Si le commentaire contient à la fois des éléments positifs et négatifs, détermine la tonalité dominante en te basant sur ce qui semble le plus impactant pour l'expérience client globale.</w:t>
+      </w:r>
+    </w:p>
+    <w:p>
+      <w:pPr>
+        <w:spacing w:line="360" w:lineRule="auto"/>
+        <w:jc w:val="both"/>
+        <w:rPr>
+          <w:rFonts w:ascii="Times New Roman" w:hAnsi="Times New Roman" w:cs="Times New Roman"/>
+          <w:b/>
+          <w:bCs/>
+          <w:sz w:val="24"/>
+          <w:szCs w:val="24"/>
+        </w:rPr>
+      </w:pPr>
+      <w:r>
+        <w:rPr>
+          <w:rFonts w:ascii="Times New Roman" w:hAnsi="Times New Roman" w:cs="Times New Roman"/>
+          <w:b/>
+          <w:bCs/>
+          <w:sz w:val="24"/>
+          <w:szCs w:val="24"/>
+        </w:rPr>
+        <w:t>Commentaire à classer :</w:t>
+      </w:r>
+    </w:p>
+    <w:p>
+      <w:pPr>
+        <w:spacing w:line="360" w:lineRule="auto"/>
+        <w:jc w:val="both"/>
+        <w:rPr>
+          <w:rFonts w:ascii="Times New Roman" w:hAnsi="Times New Roman" w:cs="Times New Roman"/>
+          <w:sz w:val="24"/>
+          <w:szCs w:val="24"/>
+        </w:rPr>
+      </w:pPr>
+      <w:r>
+        <w:rPr>
+          <w:rFonts w:ascii="Times New Roman" w:hAnsi="Times New Roman" w:cs="Times New Roman"/>
+          <w:sz w:val="24"/>
+          <w:szCs w:val="24"/>
+        </w:rPr>
+        <w:t>"Le service est rapide mais l'application plante régulièrement."</w:t>
+      </w:r>
+    </w:p>
+    <w:p>
+      <w:pPr>
+        <w:spacing w:line="360" w:lineRule="auto"/>
+        <w:jc w:val="both"/>
+        <w:rPr>
+          <w:rFonts w:ascii="Times New Roman" w:hAnsi="Times New Roman" w:cs="Times New Roman"/>
+          <w:sz w:val="24"/>
+          <w:szCs w:val="24"/>
+        </w:rPr>
+      </w:pPr>
+      <w:r>
+        <w:rPr>
+          <w:rFonts w:ascii="Times New Roman" w:hAnsi="Times New Roman" w:cs="Times New Roman"/>
+          <w:sz w:val="24"/>
+          <w:szCs w:val="24"/>
+        </w:rPr>
+        <w:t>Classes possibles : positif, négatif, neutre.</w:t>
+      </w:r>
+    </w:p>
+    <w:p>
+      <w:pPr>
+        <w:spacing w:line="360" w:lineRule="auto"/>
+        <w:jc w:val="both"/>
+        <w:rPr>
+          <w:rFonts w:ascii="Times New Roman" w:hAnsi="Times New Roman" w:cs="Times New Roman"/>
+          <w:b/>
+          <w:bCs/>
+          <w:sz w:val="24"/>
+          <w:szCs w:val="24"/>
+        </w:rPr>
+      </w:pPr>
+      <w:r>
+        <w:rPr>
+          <w:rFonts w:ascii="Times New Roman" w:hAnsi="Times New Roman" w:cs="Times New Roman"/>
+          <w:b/>
+          <w:bCs/>
+          <w:sz w:val="24"/>
+          <w:szCs w:val="24"/>
+        </w:rPr>
+        <w:t>Format de réponse attendu :</w:t>
+      </w:r>
+    </w:p>
+    <w:p>
+      <w:pPr>
+        <w:spacing w:line="360" w:lineRule="auto"/>
+        <w:jc w:val="both"/>
+        <w:rPr>
+          <w:rFonts w:ascii="Times New Roman" w:hAnsi="Times New Roman" w:cs="Times New Roman"/>
+          <w:sz w:val="24"/>
+          <w:szCs w:val="24"/>
+        </w:rPr>
+      </w:pPr>
+      <w:r>
+        <w:rPr>
+          <w:rFonts w:ascii="Times New Roman" w:hAnsi="Times New Roman" w:cs="Times New Roman"/>
+          <w:sz w:val="24"/>
+          <w:szCs w:val="24"/>
+        </w:rPr>
+        <w:t>Réponds uniquement avec le mot de la classe choisie, suivi d'une justification en une phrase.</w:t>
+      </w:r>
+    </w:p>
+    <w:p>
+      <w:pPr>
+        <w:pStyle w:val="Paragraphedeliste"/>
+        <w:numPr>
+          <w:ilvl w:val="0"/>
+          <w:numId w:val="1"/>
+        </w:numPr>
+        <w:spacing w:line="360" w:lineRule="auto"/>
+        <w:jc w:val="center"/>
+        <w:rPr>
+          <w:rFonts w:ascii="Times New Roman" w:hAnsi="Times New Roman" w:cs="Times New Roman"/>
+          <w:b/>
+          <w:bCs/>
+          <w:sz w:val="24"/>
+          <w:szCs w:val="24"/>
+        </w:rPr>
+      </w:pPr>
+      <w:r>
+        <w:rPr>
+          <w:rFonts w:ascii="Times New Roman" w:hAnsi="Times New Roman" w:cs="Times New Roman"/>
+          <w:b/>
+          <w:bCs/>
+          <w:sz w:val="24"/>
+          <w:szCs w:val="24"/>
+        </w:rPr>
+        <w:t>Réponse de Claude</w:t>
+      </w:r>
+    </w:p>
+    <w:p>
+      <w:pPr>
+        <w:spacing w:line="360" w:lineRule="auto"/>
+        <w:jc w:val="both"/>
+        <w:rPr>
+          <w:rFonts w:ascii="Times New Roman" w:hAnsi="Times New Roman" w:cs="Times New Roman"/>
+          <w:sz w:val="24"/>
+          <w:szCs w:val="24"/>
+        </w:rPr>
+      </w:pPr>
+      <w:r>
+        <w:rPr>
+          <w:rFonts w:ascii="Times New Roman" w:hAnsi="Times New Roman" w:cs="Times New Roman"/>
+          <w:sz w:val="24"/>
+          <w:szCs w:val="24"/>
+        </w:rPr>
+        <w:drawing>
+          <wp:inline distT="0" distB="0" distL="0" distR="0" wp14:anchorId="4E01CB2C" wp14:editId="7BFEE9D9">
+            <wp:extent cx="5760720" cy="586105"/>
+            <wp:effectExtent l="0" t="0" r="0" b="4445"/>
+            <wp:docPr id="77480940" name="Image 1"/>
+            <wp:cNvGraphicFramePr>
+              <a:graphicFrameLocks xmlns:a="http://schemas.openxmlformats.org/drawingml/2006/main" noChangeAspect="1"/>
+            </wp:cNvGraphicFramePr>
+            <a:graphic xmlns:a="http://schemas.openxmlformats.org/drawingml/2006/main">
+              <a:graphicData uri="http://schemas.openxmlformats.org/drawingml/2006/picture">
+                <pic:pic xmlns:pic="http://schemas.openxmlformats.org/drawingml/2006/picture">
+                  <pic:nvPicPr>
+                    <pic:cNvPr id="77480940" name=""/>
+                    <pic:cNvPicPr/>
+                  </pic:nvPicPr>
+                  <pic:blipFill>
+                    <a:blip r:embed="rId10"/>
+                    <a:stretch>
+                      <a:fillRect/>
+                    </a:stretch>
+                  </pic:blipFill>
+                  <pic:spPr>
+                    <a:xfrm>
+                      <a:off x="0" y="0"/>
+                      <a:ext cx="5760720" cy="586105"/>
+                    </a:xfrm>
+                    <a:prstGeom prst="rect">
+                      <a:avLst/>
+                    </a:prstGeom>
+                  </pic:spPr>
+                </pic:pic>
+              </a:graphicData>
+            </a:graphic>
+          </wp:inline>
+        </w:drawing>
+      </w:r>
+    </w:p>
+    <w:p>
+      <w:pPr>
+        <w:spacing w:line="360" w:lineRule="auto"/>
+        <w:jc w:val="both"/>
+        <w:rPr>
+          <w:rFonts w:ascii="Times New Roman" w:hAnsi="Times New Roman" w:cs="Times New Roman"/>
           <w:sz w:val="24"/>
           <w:szCs w:val="24"/>
         </w:rPr>
@@ -2234,7 +2693,7 @@
   <w:abstractNum w:abstractNumId="3" w15:restartNumberingAfterBreak="0">
     <w:nsid w:val="73BE1235"/>
     <w:multiLevelType w:val="hybridMultilevel"/>
-    <w:tmpl w:val="A1CCB8B8"/>
+    <w:tmpl w:val="4F5A9F0C"/>
     <w:lvl w:ilvl="0" w:tplc="040C0009">
       <w:start w:val="1"/>
       <w:numFmt w:val="bullet"/>

</xml_diff>

<commit_message>
Partie 2: Comparaison des techniques de prompt: Evaluation des techniques
</commit_message>
<xml_diff>
--- a/ai-business_assistant/correction_atelier_prompt-engineering.docx
+++ b/ai-business_assistant/correction_atelier_prompt-engineering.docx
@@ -2371,6 +2371,111 @@
     </w:p>
     <w:p>
       <w:pPr>
+        <w:pStyle w:val="Paragraphedeliste"/>
+        <w:numPr>
+          <w:ilvl w:val="0"/>
+          <w:numId w:val="1"/>
+        </w:numPr>
+        <w:spacing w:line="360" w:lineRule="auto"/>
+        <w:jc w:val="center"/>
+        <w:rPr>
+          <w:rFonts w:ascii="Times New Roman" w:hAnsi="Times New Roman" w:cs="Times New Roman"/>
+          <w:b/>
+          <w:bCs/>
+          <w:sz w:val="24"/>
+          <w:szCs w:val="24"/>
+        </w:rPr>
+      </w:pPr>
+      <w:r>
+        <w:rPr>
+          <w:rFonts w:ascii="Times New Roman" w:hAnsi="Times New Roman" w:cs="Times New Roman"/>
+          <w:b/>
+          <w:bCs/>
+          <w:sz w:val="24"/>
+          <w:szCs w:val="24"/>
+        </w:rPr>
+        <w:t>Evaluation des différentes techniques</w:t>
+      </w:r>
+    </w:p>
+    <w:p>
+      <w:pPr>
+        <w:spacing w:line="360" w:lineRule="auto"/>
+        <w:rPr>
+          <w:rFonts w:ascii="Times New Roman" w:hAnsi="Times New Roman" w:cs="Times New Roman"/>
+          <w:sz w:val="24"/>
+          <w:szCs w:val="24"/>
+        </w:rPr>
+      </w:pPr>
+      <w:r>
+        <w:rPr>
+          <w:rFonts w:ascii="Times New Roman" w:hAnsi="Times New Roman" w:cs="Times New Roman"/>
+          <w:sz w:val="24"/>
+          <w:szCs w:val="24"/>
+        </w:rPr>
+        <w:t xml:space="preserve">Après évaluation, on constate que </w:t>
+      </w:r>
+      <w:r>
+        <w:rPr>
+          <w:rFonts w:ascii="Times New Roman" w:hAnsi="Times New Roman" w:cs="Times New Roman"/>
+          <w:sz w:val="24"/>
+          <w:szCs w:val="24"/>
+        </w:rPr>
+        <w:t xml:space="preserve">la technique du </w:t>
+      </w:r>
+      <w:r>
+        <w:rPr>
+          <w:rFonts w:ascii="Times New Roman" w:hAnsi="Times New Roman" w:cs="Times New Roman"/>
+          <w:sz w:val="24"/>
+          <w:szCs w:val="24"/>
+        </w:rPr>
+        <w:t>zéro</w:t>
+      </w:r>
+      <w:r>
+        <w:rPr>
+          <w:rFonts w:ascii="Times New Roman" w:hAnsi="Times New Roman" w:cs="Times New Roman"/>
+          <w:sz w:val="24"/>
+          <w:szCs w:val="24"/>
+        </w:rPr>
+        <w:t xml:space="preserve"> shot est plus facile à écrire</w:t>
+      </w:r>
+      <w:r>
+        <w:rPr>
+          <w:rFonts w:ascii="Times New Roman" w:hAnsi="Times New Roman" w:cs="Times New Roman"/>
+          <w:sz w:val="24"/>
+          <w:szCs w:val="24"/>
+        </w:rPr>
+        <w:t xml:space="preserve"> et il nous permet de tester directement les capacités du LLM utilisé car les réponses qu’il nous fournit ne sont basés que sur ses connaissances lors de l’entrainement. Elle permet aussi de d’économiser des tokens mais elle présente l’inconvénient de fournir des réponses approximatives car ne disposant pas d’exemples pour régler le problème qui lui a été soumis. Ainsi, nous n’avons aucun contrôle sur le format de réponses. Le one shot à la différence permet de cadrer le format de réponse car il permet d’inclure un exemple dans le prompt mais avec moins d’efforts sur l’ambiguïté et la prise en compte des nuances voulante être relevé. La technique du few-shot vient régler ce problème car il permet de soumettre des exemples bien choisies au modèle. Il prend cependant plus de temps à préparer, nécessite plus de tokens</w:t>
+      </w:r>
+    </w:p>
+    <w:p>
+      <w:pPr>
+        <w:spacing w:line="360" w:lineRule="auto"/>
+        <w:jc w:val="both"/>
+        <w:rPr>
+          <w:rFonts w:ascii="Times New Roman" w:hAnsi="Times New Roman" w:cs="Times New Roman"/>
+          <w:sz w:val="24"/>
+          <w:szCs w:val="24"/>
+        </w:rPr>
+      </w:pPr>
+      <w:r>
+        <w:rPr>
+          <w:rFonts w:ascii="Times New Roman" w:hAnsi="Times New Roman" w:cs="Times New Roman"/>
+          <w:sz w:val="24"/>
+          <w:szCs w:val="24"/>
+        </w:rPr>
+        <w:t xml:space="preserve">Enfin, </w:t>
+      </w:r>
+      <w:r>
+        <w:rPr>
+          <w:rFonts w:ascii="Times New Roman" w:hAnsi="Times New Roman" w:cs="Times New Roman"/>
+          <w:sz w:val="24"/>
+          <w:szCs w:val="24"/>
+        </w:rPr>
+        <w:t>la technique du structured-prompt apporte l’avantage de préciser clairement la logique de raisonnement et peut être réutilisé. Il est plus facile à ajuster en cas d’itération requise pour affiner les réponses du LLM.</w:t>
+      </w:r>
+    </w:p>
+    <w:p>
+      <w:pPr>
         <w:spacing w:line="360" w:lineRule="auto"/>
         <w:jc w:val="both"/>
         <w:rPr>
@@ -2693,7 +2798,7 @@
   <w:abstractNum w:abstractNumId="3" w15:restartNumberingAfterBreak="0">
     <w:nsid w:val="73BE1235"/>
     <w:multiLevelType w:val="hybridMultilevel"/>
-    <w:tmpl w:val="4F5A9F0C"/>
+    <w:tmpl w:val="389E5A70"/>
     <w:lvl w:ilvl="0" w:tplc="040C0009">
       <w:start w:val="1"/>
       <w:numFmt w:val="bullet"/>

</xml_diff>

<commit_message>
Partie 3: Prompt Engineering et raisonnement: Décomposition de prompt
</commit_message>
<xml_diff>
--- a/ai-business_assistant/correction_atelier_prompt-engineering.docx
+++ b/ai-business_assistant/correction_atelier_prompt-engineering.docx
@@ -87,13 +87,23 @@
         </w:rPr>
         <w:t xml:space="preserve"> </w:t>
       </w:r>
-      <w:r>
-        <w:rPr>
-          <w:rFonts w:ascii="Times New Roman" w:hAnsi="Times New Roman" w:cs="Times New Roman"/>
-          <w:sz w:val="24"/>
-          <w:szCs w:val="24"/>
-        </w:rPr>
-        <w:t>learning et produire des résultats structurés.</w:t>
+      <w:proofErr w:type="spellStart"/>
+      <w:r>
+        <w:rPr>
+          <w:rFonts w:ascii="Times New Roman" w:hAnsi="Times New Roman" w:cs="Times New Roman"/>
+          <w:sz w:val="24"/>
+          <w:szCs w:val="24"/>
+        </w:rPr>
+        <w:t>learning</w:t>
+      </w:r>
+      <w:proofErr w:type="spellEnd"/>
+      <w:r>
+        <w:rPr>
+          <w:rFonts w:ascii="Times New Roman" w:hAnsi="Times New Roman" w:cs="Times New Roman"/>
+          <w:sz w:val="24"/>
+          <w:szCs w:val="24"/>
+        </w:rPr>
+        <w:t xml:space="preserve"> et produire des résultats structurés.</w:t>
       </w:r>
     </w:p>
     <w:p>
@@ -1040,8 +1050,20 @@
           <w:sz w:val="28"/>
           <w:szCs w:val="28"/>
         </w:rPr>
-        <w:t>Partie 2 - Comparer les techniques de prompting</w:t>
-      </w:r>
+        <w:t xml:space="preserve">Partie 2 - Comparer les techniques de </w:t>
+      </w:r>
+      <w:proofErr w:type="spellStart"/>
+      <w:r>
+        <w:rPr>
+          <w:rFonts w:ascii="Times New Roman" w:hAnsi="Times New Roman" w:cs="Times New Roman"/>
+          <w:b/>
+          <w:bCs/>
+          <w:sz w:val="28"/>
+          <w:szCs w:val="28"/>
+        </w:rPr>
+        <w:t>prompting</w:t>
+      </w:r>
+      <w:proofErr w:type="spellEnd"/>
       <w:r>
         <w:rPr>
           <w:rFonts w:ascii="Times New Roman" w:hAnsi="Times New Roman" w:cs="Times New Roman"/>
@@ -1067,7 +1089,25 @@
           <w:sz w:val="24"/>
           <w:szCs w:val="24"/>
         </w:rPr>
-        <w:t>Tester puis évaluer les résultats obtenus avec les techniques zero-shot, one-shot, few-shot et un prompt structuré sur une demande du genre : « Classer le commentaire suivant : "Le service est rapide mais l'application plante régulièrement." Classes possibles : positif, négatif, neutre. »</w:t>
+        <w:t xml:space="preserve">Tester puis évaluer les résultats obtenus avec les techniques </w:t>
+      </w:r>
+      <w:proofErr w:type="spellStart"/>
+      <w:r>
+        <w:rPr>
+          <w:rFonts w:ascii="Times New Roman" w:hAnsi="Times New Roman" w:cs="Times New Roman"/>
+          <w:sz w:val="24"/>
+          <w:szCs w:val="24"/>
+        </w:rPr>
+        <w:t>zero</w:t>
+      </w:r>
+      <w:proofErr w:type="spellEnd"/>
+      <w:r>
+        <w:rPr>
+          <w:rFonts w:ascii="Times New Roman" w:hAnsi="Times New Roman" w:cs="Times New Roman"/>
+          <w:sz w:val="24"/>
+          <w:szCs w:val="24"/>
+        </w:rPr>
+        <w:t>-shot, one-shot, few-shot et un prompt structuré sur une demande du genre : « Classer le commentaire suivant : "Le service est rapide mais l'application plante régulièrement." Classes possibles : positif, négatif, neutre. »</w:t>
       </w:r>
     </w:p>
     <w:p>
@@ -1607,7 +1647,25 @@
           <w:sz w:val="24"/>
           <w:szCs w:val="24"/>
         </w:rPr>
-        <w:t>Commentaire : "Le produit est arrivé cassé, très déçu."</w:t>
+        <w:t xml:space="preserve">Commentaire : "Le produit est arrivé </w:t>
+      </w:r>
+      <w:proofErr w:type="gramStart"/>
+      <w:r>
+        <w:rPr>
+          <w:rFonts w:ascii="Times New Roman" w:hAnsi="Times New Roman" w:cs="Times New Roman"/>
+          <w:sz w:val="24"/>
+          <w:szCs w:val="24"/>
+        </w:rPr>
+        <w:t>cassé</w:t>
+      </w:r>
+      <w:proofErr w:type="gramEnd"/>
+      <w:r>
+        <w:rPr>
+          <w:rFonts w:ascii="Times New Roman" w:hAnsi="Times New Roman" w:cs="Times New Roman"/>
+          <w:sz w:val="24"/>
+          <w:szCs w:val="24"/>
+        </w:rPr>
+        <w:t>, très déçu."</w:t>
       </w:r>
     </w:p>
     <w:p>
@@ -1925,7 +1983,29 @@
           <w:sz w:val="24"/>
           <w:szCs w:val="24"/>
         </w:rPr>
-        <w:t>Test de la technique du structured prompt</w:t>
+        <w:t xml:space="preserve">Test de la technique du </w:t>
+      </w:r>
+      <w:proofErr w:type="spellStart"/>
+      <w:r>
+        <w:rPr>
+          <w:rFonts w:ascii="Times New Roman" w:hAnsi="Times New Roman" w:cs="Times New Roman"/>
+          <w:b/>
+          <w:bCs/>
+          <w:sz w:val="24"/>
+          <w:szCs w:val="24"/>
+        </w:rPr>
+        <w:t>structured</w:t>
+      </w:r>
+      <w:proofErr w:type="spellEnd"/>
+      <w:r>
+        <w:rPr>
+          <w:rFonts w:ascii="Times New Roman" w:hAnsi="Times New Roman" w:cs="Times New Roman"/>
+          <w:b/>
+          <w:bCs/>
+          <w:sz w:val="24"/>
+          <w:szCs w:val="24"/>
+        </w:rPr>
+        <w:t xml:space="preserve"> prompt</w:t>
       </w:r>
     </w:p>
     <w:p>
@@ -2444,8 +2524,36 @@
           <w:sz w:val="24"/>
           <w:szCs w:val="24"/>
         </w:rPr>
-        <w:t xml:space="preserve"> et il nous permet de tester directement les capacités du LLM utilisé car les réponses qu’il nous fournit ne sont basés que sur ses connaissances lors de l’entrainement. Elle permet aussi de d’économiser des tokens mais elle présente l’inconvénient de fournir des réponses approximatives car ne disposant pas d’exemples pour régler le problème qui lui a été soumis. Ainsi, nous n’avons aucun contrôle sur le format de réponses. Le one shot à la différence permet de cadrer le format de réponse car il permet d’inclure un exemple dans le prompt mais avec moins d’efforts sur l’ambiguïté et la prise en compte des nuances voulante être relevé. La technique du few-shot vient régler ce problème car il permet de soumettre des exemples bien choisies au modèle. Il prend cependant plus de temps à préparer, nécessite plus de tokens</w:t>
-      </w:r>
+        <w:t xml:space="preserve"> et il nous permet de tester directement les capacités du LLM utilisé car les réponses qu’il nous fournit ne sont basés que sur ses connaissances lors de l’entrainement. Elle permet aussi de d’économiser des </w:t>
+      </w:r>
+      <w:proofErr w:type="spellStart"/>
+      <w:r>
+        <w:rPr>
+          <w:rFonts w:ascii="Times New Roman" w:hAnsi="Times New Roman" w:cs="Times New Roman"/>
+          <w:sz w:val="24"/>
+          <w:szCs w:val="24"/>
+        </w:rPr>
+        <w:t>tokens</w:t>
+      </w:r>
+      <w:proofErr w:type="spellEnd"/>
+      <w:r>
+        <w:rPr>
+          <w:rFonts w:ascii="Times New Roman" w:hAnsi="Times New Roman" w:cs="Times New Roman"/>
+          <w:sz w:val="24"/>
+          <w:szCs w:val="24"/>
+        </w:rPr>
+        <w:t xml:space="preserve"> mais elle présente l’inconvénient de fournir des réponses approximatives car ne disposant pas d’exemples pour régler le problème qui lui a été soumis. Ainsi, nous n’avons aucun contrôle sur le format de réponses. Le one shot à la différence permet de cadrer le format de réponse car il permet d’inclure un exemple dans le prompt mais avec moins d’efforts sur l’ambiguïté et la prise en compte des nuances voulante être relevé. La technique du few-shot vient régler ce problème car il permet de soumettre des exemples bien choisies au modèle. Il prend cependant plus de temps à préparer, nécessite plus de </w:t>
+      </w:r>
+      <w:proofErr w:type="spellStart"/>
+      <w:r>
+        <w:rPr>
+          <w:rFonts w:ascii="Times New Roman" w:hAnsi="Times New Roman" w:cs="Times New Roman"/>
+          <w:sz w:val="24"/>
+          <w:szCs w:val="24"/>
+        </w:rPr>
+        <w:t>tokens</w:t>
+      </w:r>
+      <w:proofErr w:type="spellEnd"/>
     </w:p>
     <w:p>
       <w:pPr>
@@ -2471,7 +2579,321 @@
           <w:sz w:val="24"/>
           <w:szCs w:val="24"/>
         </w:rPr>
-        <w:t>la technique du structured-prompt apporte l’avantage de préciser clairement la logique de raisonnement et peut être réutilisé. Il est plus facile à ajuster en cas d’itération requise pour affiner les réponses du LLM.</w:t>
+        <w:t xml:space="preserve">la technique du </w:t>
+      </w:r>
+      <w:proofErr w:type="spellStart"/>
+      <w:r>
+        <w:rPr>
+          <w:rFonts w:ascii="Times New Roman" w:hAnsi="Times New Roman" w:cs="Times New Roman"/>
+          <w:sz w:val="24"/>
+          <w:szCs w:val="24"/>
+        </w:rPr>
+        <w:t>structured</w:t>
+      </w:r>
+      <w:proofErr w:type="spellEnd"/>
+      <w:r>
+        <w:rPr>
+          <w:rFonts w:ascii="Times New Roman" w:hAnsi="Times New Roman" w:cs="Times New Roman"/>
+          <w:sz w:val="24"/>
+          <w:szCs w:val="24"/>
+        </w:rPr>
+        <w:t>-prompt apporte l’avantage de préciser clairement la logique de raisonnement et peut être réutilisé. Il est plus facile à ajuster en cas d’itération requise pour affiner les réponses du LLM.</w:t>
+      </w:r>
+    </w:p>
+    <w:p>
+      <w:pPr>
+        <w:spacing w:line="360" w:lineRule="auto"/>
+        <w:jc w:val="both"/>
+        <w:rPr>
+          <w:rFonts w:ascii="Times New Roman" w:hAnsi="Times New Roman" w:cs="Times New Roman"/>
+          <w:sz w:val="24"/>
+          <w:szCs w:val="24"/>
+        </w:rPr>
+      </w:pPr>
+      <w:r>
+        <w:rPr>
+          <w:rFonts w:ascii="Times New Roman" w:hAnsi="Times New Roman" w:cs="Times New Roman"/>
+          <w:b/>
+          <w:bCs/>
+          <w:sz w:val="28"/>
+          <w:szCs w:val="28"/>
+        </w:rPr>
+        <w:t>Partie 3 – Prompt Engineering et raisonnement</w:t>
+      </w:r>
+      <w:r>
+        <w:rPr>
+          <w:rFonts w:ascii="Times New Roman" w:hAnsi="Times New Roman" w:cs="Times New Roman"/>
+          <w:sz w:val="24"/>
+          <w:szCs w:val="24"/>
+        </w:rPr>
+        <w:t xml:space="preserve"> </w:t>
+      </w:r>
+    </w:p>
+    <w:p>
+      <w:pPr>
+        <w:pStyle w:val="Paragraphedeliste"/>
+        <w:numPr>
+          <w:ilvl w:val="0"/>
+          <w:numId w:val="7"/>
+        </w:numPr>
+        <w:spacing w:line="360" w:lineRule="auto"/>
+        <w:jc w:val="both"/>
+        <w:rPr>
+          <w:rFonts w:ascii="Times New Roman" w:hAnsi="Times New Roman" w:cs="Times New Roman"/>
+          <w:sz w:val="24"/>
+          <w:szCs w:val="24"/>
+        </w:rPr>
+      </w:pPr>
+      <w:r>
+        <w:rPr>
+          <w:rFonts w:ascii="Times New Roman" w:hAnsi="Times New Roman" w:cs="Times New Roman"/>
+          <w:sz w:val="24"/>
+          <w:szCs w:val="24"/>
+        </w:rPr>
+        <w:t xml:space="preserve">Décomposer le prompt suivant : « Analyse ces avis clients et donne-moi les problèmes les plus importants ainsi que les recommandations. » </w:t>
+      </w:r>
+    </w:p>
+    <w:p>
+      <w:pPr>
+        <w:pStyle w:val="Paragraphedeliste"/>
+        <w:numPr>
+          <w:ilvl w:val="0"/>
+          <w:numId w:val="1"/>
+        </w:numPr>
+        <w:spacing w:line="360" w:lineRule="auto"/>
+        <w:jc w:val="center"/>
+        <w:rPr>
+          <w:rFonts w:ascii="Times New Roman" w:hAnsi="Times New Roman" w:cs="Times New Roman"/>
+          <w:b/>
+          <w:bCs/>
+          <w:sz w:val="24"/>
+          <w:szCs w:val="24"/>
+        </w:rPr>
+      </w:pPr>
+      <w:r>
+        <w:rPr>
+          <w:rFonts w:ascii="Times New Roman" w:hAnsi="Times New Roman" w:cs="Times New Roman"/>
+          <w:b/>
+          <w:bCs/>
+          <w:sz w:val="24"/>
+          <w:szCs w:val="24"/>
+        </w:rPr>
+        <w:t>Décomposition proposée</w:t>
+      </w:r>
+    </w:p>
+    <w:p>
+      <w:pPr>
+        <w:spacing w:line="276" w:lineRule="auto"/>
+        <w:ind w:left="360"/>
+        <w:rPr>
+          <w:rFonts w:ascii="Times New Roman" w:hAnsi="Times New Roman" w:cs="Times New Roman"/>
+          <w:sz w:val="24"/>
+          <w:szCs w:val="24"/>
+        </w:rPr>
+      </w:pPr>
+      <w:r>
+        <w:rPr>
+          <w:rFonts w:ascii="Times New Roman" w:hAnsi="Times New Roman" w:cs="Times New Roman"/>
+          <w:sz w:val="24"/>
+          <w:szCs w:val="24"/>
+          <w:u w:val="single"/>
+        </w:rPr>
+        <w:t>Étape 1 :</w:t>
+      </w:r>
+      <w:r>
+        <w:rPr>
+          <w:rFonts w:ascii="Times New Roman" w:hAnsi="Times New Roman" w:cs="Times New Roman"/>
+          <w:sz w:val="24"/>
+          <w:szCs w:val="24"/>
+        </w:rPr>
+        <w:t xml:space="preserve"> Extraction</w:t>
+      </w:r>
+    </w:p>
+    <w:p>
+      <w:pPr>
+        <w:spacing w:line="276" w:lineRule="auto"/>
+        <w:ind w:left="360"/>
+        <w:rPr>
+          <w:rFonts w:ascii="Times New Roman" w:hAnsi="Times New Roman" w:cs="Times New Roman"/>
+          <w:sz w:val="24"/>
+          <w:szCs w:val="24"/>
+        </w:rPr>
+      </w:pPr>
+      <w:r>
+        <w:rPr>
+          <w:rFonts w:ascii="Times New Roman" w:hAnsi="Times New Roman" w:cs="Times New Roman"/>
+          <w:sz w:val="24"/>
+          <w:szCs w:val="24"/>
+        </w:rPr>
+        <w:t>→ Identifier, pour chaque avis, les éléments factuels mentionnés (ce qui est dit, sans interprétation).</w:t>
+      </w:r>
+    </w:p>
+    <w:p>
+      <w:pPr>
+        <w:spacing w:line="276" w:lineRule="auto"/>
+        <w:ind w:left="360"/>
+        <w:rPr>
+          <w:rFonts w:ascii="Times New Roman" w:hAnsi="Times New Roman" w:cs="Times New Roman"/>
+          <w:sz w:val="24"/>
+          <w:szCs w:val="24"/>
+        </w:rPr>
+      </w:pPr>
+      <w:r>
+        <w:rPr>
+          <w:rFonts w:ascii="Times New Roman" w:hAnsi="Times New Roman" w:cs="Times New Roman"/>
+          <w:sz w:val="24"/>
+          <w:szCs w:val="24"/>
+        </w:rPr>
+        <w:t>Étape 2 : Catégorisation</w:t>
+      </w:r>
+    </w:p>
+    <w:p>
+      <w:pPr>
+        <w:spacing w:line="276" w:lineRule="auto"/>
+        <w:ind w:left="360"/>
+        <w:rPr>
+          <w:rFonts w:ascii="Times New Roman" w:hAnsi="Times New Roman" w:cs="Times New Roman"/>
+          <w:sz w:val="24"/>
+          <w:szCs w:val="24"/>
+        </w:rPr>
+      </w:pPr>
+      <w:r>
+        <w:rPr>
+          <w:rFonts w:ascii="Times New Roman" w:hAnsi="Times New Roman" w:cs="Times New Roman"/>
+          <w:sz w:val="24"/>
+          <w:szCs w:val="24"/>
+        </w:rPr>
+        <w:t xml:space="preserve">→ Regrouper ces éléments par thème (ex : livraison, qualité produit, </w:t>
+      </w:r>
+      <w:r>
+        <w:rPr>
+          <w:rFonts w:ascii="Times New Roman" w:hAnsi="Times New Roman" w:cs="Times New Roman"/>
+          <w:sz w:val="24"/>
+          <w:szCs w:val="24"/>
+        </w:rPr>
+        <w:t>service client</w:t>
+      </w:r>
+      <w:r>
+        <w:rPr>
+          <w:rFonts w:ascii="Times New Roman" w:hAnsi="Times New Roman" w:cs="Times New Roman"/>
+          <w:sz w:val="24"/>
+          <w:szCs w:val="24"/>
+        </w:rPr>
+        <w:t>, prix...).</w:t>
+      </w:r>
+    </w:p>
+    <w:p>
+      <w:pPr>
+        <w:spacing w:line="276" w:lineRule="auto"/>
+        <w:ind w:left="360"/>
+        <w:rPr>
+          <w:rFonts w:ascii="Times New Roman" w:hAnsi="Times New Roman" w:cs="Times New Roman"/>
+          <w:sz w:val="24"/>
+          <w:szCs w:val="24"/>
+        </w:rPr>
+      </w:pPr>
+      <w:r>
+        <w:rPr>
+          <w:rFonts w:ascii="Times New Roman" w:hAnsi="Times New Roman" w:cs="Times New Roman"/>
+          <w:sz w:val="24"/>
+          <w:szCs w:val="24"/>
+        </w:rPr>
+        <w:t>Étape 3 : Priorisation</w:t>
+      </w:r>
+    </w:p>
+    <w:p>
+      <w:pPr>
+        <w:spacing w:line="276" w:lineRule="auto"/>
+        <w:ind w:left="360"/>
+        <w:rPr>
+          <w:rFonts w:ascii="Times New Roman" w:hAnsi="Times New Roman" w:cs="Times New Roman"/>
+          <w:sz w:val="24"/>
+          <w:szCs w:val="24"/>
+        </w:rPr>
+      </w:pPr>
+      <w:r>
+        <w:rPr>
+          <w:rFonts w:ascii="Times New Roman" w:hAnsi="Times New Roman" w:cs="Times New Roman"/>
+          <w:sz w:val="24"/>
+          <w:szCs w:val="24"/>
+        </w:rPr>
+        <w:t>→ Déterminer quels thèmes reviennent le plus fréquemment et/ou semblent avoir le plus d'impact sur la satisfaction client.</w:t>
+      </w:r>
+    </w:p>
+    <w:p>
+      <w:pPr>
+        <w:spacing w:line="276" w:lineRule="auto"/>
+        <w:ind w:left="360"/>
+        <w:rPr>
+          <w:rFonts w:ascii="Times New Roman" w:hAnsi="Times New Roman" w:cs="Times New Roman"/>
+          <w:sz w:val="24"/>
+          <w:szCs w:val="24"/>
+        </w:rPr>
+      </w:pPr>
+      <w:r>
+        <w:rPr>
+          <w:rFonts w:ascii="Times New Roman" w:hAnsi="Times New Roman" w:cs="Times New Roman"/>
+          <w:sz w:val="24"/>
+          <w:szCs w:val="24"/>
+        </w:rPr>
+        <w:t>Étape 4 : Formulation des problèmes</w:t>
+      </w:r>
+    </w:p>
+    <w:p>
+      <w:pPr>
+        <w:spacing w:line="276" w:lineRule="auto"/>
+        <w:ind w:left="360"/>
+        <w:rPr>
+          <w:rFonts w:ascii="Times New Roman" w:hAnsi="Times New Roman" w:cs="Times New Roman"/>
+          <w:sz w:val="24"/>
+          <w:szCs w:val="24"/>
+        </w:rPr>
+      </w:pPr>
+      <w:r>
+        <w:rPr>
+          <w:rFonts w:ascii="Times New Roman" w:hAnsi="Times New Roman" w:cs="Times New Roman"/>
+          <w:sz w:val="24"/>
+          <w:szCs w:val="24"/>
+        </w:rPr>
+        <w:t>→ Reformuler chaque thème prioritaire sous forme de "problème" clair et actionnable.</w:t>
+      </w:r>
+    </w:p>
+    <w:p>
+      <w:pPr>
+        <w:spacing w:line="276" w:lineRule="auto"/>
+        <w:ind w:left="360"/>
+        <w:rPr>
+          <w:rFonts w:ascii="Times New Roman" w:hAnsi="Times New Roman" w:cs="Times New Roman"/>
+          <w:sz w:val="24"/>
+          <w:szCs w:val="24"/>
+        </w:rPr>
+      </w:pPr>
+      <w:r>
+        <w:rPr>
+          <w:rFonts w:ascii="Times New Roman" w:hAnsi="Times New Roman" w:cs="Times New Roman"/>
+          <w:sz w:val="24"/>
+          <w:szCs w:val="24"/>
+        </w:rPr>
+        <w:t>Étape 5 : Recommandations</w:t>
+      </w:r>
+    </w:p>
+    <w:p>
+      <w:pPr>
+        <w:spacing w:line="276" w:lineRule="auto"/>
+        <w:ind w:left="360"/>
+        <w:rPr>
+          <w:rFonts w:ascii="Times New Roman" w:hAnsi="Times New Roman" w:cs="Times New Roman"/>
+          <w:sz w:val="24"/>
+          <w:szCs w:val="24"/>
+        </w:rPr>
+      </w:pPr>
+      <w:r>
+        <w:rPr>
+          <w:rFonts w:ascii="Times New Roman" w:hAnsi="Times New Roman" w:cs="Times New Roman"/>
+          <w:sz w:val="24"/>
+          <w:szCs w:val="24"/>
+        </w:rPr>
+        <w:t>→ Pour chaque problème identifié, proposer une action concrète et réaliste pour l'entreprise.</w:t>
       </w:r>
     </w:p>
     <w:p>
@@ -2509,6 +2931,95 @@
 <file path=word/numbering.xml><?xml version="1.0" encoding="utf-8"?>
 <w:numbering xmlns:wpc="http://schemas.microsoft.com/office/word/2010/wordprocessingCanvas" xmlns:cx="http://schemas.microsoft.com/office/drawing/2014/chartex" xmlns:cx1="http://schemas.microsoft.com/office/drawing/2015/9/8/chartex" xmlns:cx2="http://schemas.microsoft.com/office/drawing/2015/10/21/chartex" xmlns:cx3="http://schemas.microsoft.com/office/drawing/2016/5/9/chartex" xmlns:cx4="http://schemas.microsoft.com/office/drawing/2016/5/10/chartex" xmlns:cx5="http://schemas.microsoft.com/office/drawing/2016/5/11/chartex" xmlns:cx6="http://schemas.microsoft.com/office/drawing/2016/5/12/chartex" xmlns:cx7="http://schemas.microsoft.com/office/drawing/2016/5/13/chartex" xmlns:cx8="http://schemas.microsoft.com/office/drawing/2016/5/14/chartex" xmlns:mc="http://schemas.openxmlformats.org/markup-compatibility/2006" xmlns:aink="http://schemas.microsoft.com/office/drawing/2016/ink" xmlns:am3d="http://schemas.microsoft.com/office/drawing/2017/model3d" xmlns:o="urn:schemas-microsoft-com:office:office" xmlns:oel="http://schemas.microsoft.com/office/2019/extlst" xmlns:r="http://schemas.openxmlformats.org/officeDocument/2006/relationships" xmlns:m="http://schemas.openxmlformats.org/officeDocument/2006/math" xmlns:v="urn:schemas-microsoft-com:vml" xmlns:wp14="http://schemas.microsoft.com/office/word/2010/wordprocessingDrawing" xmlns:wp="http://schemas.openxmlformats.org/drawingml/2006/wordprocessingDrawing" xmlns:w10="urn:schemas-microsoft-com:office:word" xmlns:w="http://schemas.openxmlformats.org/wordprocessingml/2006/main" xmlns:w14="http://schemas.microsoft.com/office/word/2010/wordml" xmlns:w15="http://schemas.microsoft.com/office/word/2012/wordml" xmlns:w16cex="http://schemas.microsoft.com/office/word/2018/wordml/cex" xmlns:w16cid="http://schemas.microsoft.com/office/word/2016/wordml/cid" xmlns:w16="http://schemas.microsoft.com/office/word/2018/wordml" xmlns:w16du="http://schemas.microsoft.com/office/word/2023/wordml/word16du" xmlns:w16sdtdh="http://schemas.microsoft.com/office/word/2020/wordml/sdtdatahash" xmlns:w16sdtfl="http://schemas.microsoft.com/office/word/2024/wordml/sdtformatlock" xmlns:w16se="http://schemas.microsoft.com/office/word/2015/wordml/symex" xmlns:wpg="http://schemas.microsoft.com/office/word/2010/wordprocessingGroup" xmlns:wpi="http://schemas.microsoft.com/office/word/2010/wordprocessingInk" xmlns:wne="http://schemas.microsoft.com/office/word/2006/wordml" xmlns:wps="http://schemas.microsoft.com/office/word/2010/wordprocessingShape" mc:Ignorable="w14 w15 w16se w16cid w16 w16cex w16sdtdh w16sdtfl w16du wp14">
   <w:abstractNum w:abstractNumId="0" w15:restartNumberingAfterBreak="0">
+    <w:nsid w:val="036B4D12"/>
+    <w:multiLevelType w:val="hybridMultilevel"/>
+    <w:tmpl w:val="5C46682A"/>
+    <w:lvl w:ilvl="0" w:tplc="040C000F">
+      <w:start w:val="1"/>
+      <w:numFmt w:val="decimal"/>
+      <w:lvlText w:val="%1."/>
+      <w:lvlJc w:val="left"/>
+      <w:pPr>
+        <w:ind w:left="720" w:hanging="360"/>
+      </w:pPr>
+      <w:rPr>
+        <w:rFonts w:hint="default"/>
+      </w:rPr>
+    </w:lvl>
+    <w:lvl w:ilvl="1" w:tplc="040C0019" w:tentative="1">
+      <w:start w:val="1"/>
+      <w:numFmt w:val="lowerLetter"/>
+      <w:lvlText w:val="%2."/>
+      <w:lvlJc w:val="left"/>
+      <w:pPr>
+        <w:ind w:left="1440" w:hanging="360"/>
+      </w:pPr>
+    </w:lvl>
+    <w:lvl w:ilvl="2" w:tplc="040C001B" w:tentative="1">
+      <w:start w:val="1"/>
+      <w:numFmt w:val="lowerRoman"/>
+      <w:lvlText w:val="%3."/>
+      <w:lvlJc w:val="right"/>
+      <w:pPr>
+        <w:ind w:left="2160" w:hanging="180"/>
+      </w:pPr>
+    </w:lvl>
+    <w:lvl w:ilvl="3" w:tplc="040C000F" w:tentative="1">
+      <w:start w:val="1"/>
+      <w:numFmt w:val="decimal"/>
+      <w:lvlText w:val="%4."/>
+      <w:lvlJc w:val="left"/>
+      <w:pPr>
+        <w:ind w:left="2880" w:hanging="360"/>
+      </w:pPr>
+    </w:lvl>
+    <w:lvl w:ilvl="4" w:tplc="040C0019" w:tentative="1">
+      <w:start w:val="1"/>
+      <w:numFmt w:val="lowerLetter"/>
+      <w:lvlText w:val="%5."/>
+      <w:lvlJc w:val="left"/>
+      <w:pPr>
+        <w:ind w:left="3600" w:hanging="360"/>
+      </w:pPr>
+    </w:lvl>
+    <w:lvl w:ilvl="5" w:tplc="040C001B" w:tentative="1">
+      <w:start w:val="1"/>
+      <w:numFmt w:val="lowerRoman"/>
+      <w:lvlText w:val="%6."/>
+      <w:lvlJc w:val="right"/>
+      <w:pPr>
+        <w:ind w:left="4320" w:hanging="180"/>
+      </w:pPr>
+    </w:lvl>
+    <w:lvl w:ilvl="6" w:tplc="040C000F" w:tentative="1">
+      <w:start w:val="1"/>
+      <w:numFmt w:val="decimal"/>
+      <w:lvlText w:val="%7."/>
+      <w:lvlJc w:val="left"/>
+      <w:pPr>
+        <w:ind w:left="5040" w:hanging="360"/>
+      </w:pPr>
+    </w:lvl>
+    <w:lvl w:ilvl="7" w:tplc="040C0019" w:tentative="1">
+      <w:start w:val="1"/>
+      <w:numFmt w:val="lowerLetter"/>
+      <w:lvlText w:val="%8."/>
+      <w:lvlJc w:val="left"/>
+      <w:pPr>
+        <w:ind w:left="5760" w:hanging="360"/>
+      </w:pPr>
+    </w:lvl>
+    <w:lvl w:ilvl="8" w:tplc="040C001B" w:tentative="1">
+      <w:start w:val="1"/>
+      <w:numFmt w:val="lowerRoman"/>
+      <w:lvlText w:val="%9."/>
+      <w:lvlJc w:val="right"/>
+      <w:pPr>
+        <w:ind w:left="6480" w:hanging="180"/>
+      </w:pPr>
+    </w:lvl>
+  </w:abstractNum>
+  <w:abstractNum w:abstractNumId="1" w15:restartNumberingAfterBreak="0">
     <w:nsid w:val="52344C8A"/>
     <w:multiLevelType w:val="hybridMultilevel"/>
     <w:tmpl w:val="159A3A58"/>
@@ -2620,7 +3131,93 @@
       </w:rPr>
     </w:lvl>
   </w:abstractNum>
-  <w:abstractNum w:abstractNumId="1" w15:restartNumberingAfterBreak="0">
+  <w:abstractNum w:abstractNumId="2" w15:restartNumberingAfterBreak="0">
+    <w:nsid w:val="5D3211AD"/>
+    <w:multiLevelType w:val="hybridMultilevel"/>
+    <w:tmpl w:val="8DBABEC8"/>
+    <w:lvl w:ilvl="0" w:tplc="040C000F">
+      <w:start w:val="1"/>
+      <w:numFmt w:val="decimal"/>
+      <w:lvlText w:val="%1."/>
+      <w:lvlJc w:val="left"/>
+      <w:pPr>
+        <w:ind w:left="720" w:hanging="360"/>
+      </w:pPr>
+    </w:lvl>
+    <w:lvl w:ilvl="1" w:tplc="040C0019" w:tentative="1">
+      <w:start w:val="1"/>
+      <w:numFmt w:val="lowerLetter"/>
+      <w:lvlText w:val="%2."/>
+      <w:lvlJc w:val="left"/>
+      <w:pPr>
+        <w:ind w:left="1440" w:hanging="360"/>
+      </w:pPr>
+    </w:lvl>
+    <w:lvl w:ilvl="2" w:tplc="040C001B" w:tentative="1">
+      <w:start w:val="1"/>
+      <w:numFmt w:val="lowerRoman"/>
+      <w:lvlText w:val="%3."/>
+      <w:lvlJc w:val="right"/>
+      <w:pPr>
+        <w:ind w:left="2160" w:hanging="180"/>
+      </w:pPr>
+    </w:lvl>
+    <w:lvl w:ilvl="3" w:tplc="040C000F" w:tentative="1">
+      <w:start w:val="1"/>
+      <w:numFmt w:val="decimal"/>
+      <w:lvlText w:val="%4."/>
+      <w:lvlJc w:val="left"/>
+      <w:pPr>
+        <w:ind w:left="2880" w:hanging="360"/>
+      </w:pPr>
+    </w:lvl>
+    <w:lvl w:ilvl="4" w:tplc="040C0019" w:tentative="1">
+      <w:start w:val="1"/>
+      <w:numFmt w:val="lowerLetter"/>
+      <w:lvlText w:val="%5."/>
+      <w:lvlJc w:val="left"/>
+      <w:pPr>
+        <w:ind w:left="3600" w:hanging="360"/>
+      </w:pPr>
+    </w:lvl>
+    <w:lvl w:ilvl="5" w:tplc="040C001B" w:tentative="1">
+      <w:start w:val="1"/>
+      <w:numFmt w:val="lowerRoman"/>
+      <w:lvlText w:val="%6."/>
+      <w:lvlJc w:val="right"/>
+      <w:pPr>
+        <w:ind w:left="4320" w:hanging="180"/>
+      </w:pPr>
+    </w:lvl>
+    <w:lvl w:ilvl="6" w:tplc="040C000F" w:tentative="1">
+      <w:start w:val="1"/>
+      <w:numFmt w:val="decimal"/>
+      <w:lvlText w:val="%7."/>
+      <w:lvlJc w:val="left"/>
+      <w:pPr>
+        <w:ind w:left="5040" w:hanging="360"/>
+      </w:pPr>
+    </w:lvl>
+    <w:lvl w:ilvl="7" w:tplc="040C0019" w:tentative="1">
+      <w:start w:val="1"/>
+      <w:numFmt w:val="lowerLetter"/>
+      <w:lvlText w:val="%8."/>
+      <w:lvlJc w:val="left"/>
+      <w:pPr>
+        <w:ind w:left="5760" w:hanging="360"/>
+      </w:pPr>
+    </w:lvl>
+    <w:lvl w:ilvl="8" w:tplc="040C001B" w:tentative="1">
+      <w:start w:val="1"/>
+      <w:numFmt w:val="lowerRoman"/>
+      <w:lvlText w:val="%9."/>
+      <w:lvlJc w:val="right"/>
+      <w:pPr>
+        <w:ind w:left="6480" w:hanging="180"/>
+      </w:pPr>
+    </w:lvl>
+  </w:abstractNum>
+  <w:abstractNum w:abstractNumId="3" w15:restartNumberingAfterBreak="0">
     <w:nsid w:val="6C944ACB"/>
     <w:multiLevelType w:val="hybridMultilevel"/>
     <w:tmpl w:val="3E026470"/>
@@ -2706,10 +3303,10 @@
       </w:pPr>
     </w:lvl>
   </w:abstractNum>
-  <w:abstractNum w:abstractNumId="2" w15:restartNumberingAfterBreak="0">
+  <w:abstractNum w:abstractNumId="4" w15:restartNumberingAfterBreak="0">
     <w:nsid w:val="73583B76"/>
     <w:multiLevelType w:val="hybridMultilevel"/>
-    <w:tmpl w:val="A29CA2B8"/>
+    <w:tmpl w:val="783C0D26"/>
     <w:lvl w:ilvl="0" w:tplc="040C000F">
       <w:start w:val="1"/>
       <w:numFmt w:val="decimal"/>
@@ -2722,14 +3319,17 @@
         <w:rFonts w:hint="default"/>
       </w:rPr>
     </w:lvl>
-    <w:lvl w:ilvl="1" w:tplc="040C0019" w:tentative="1">
-      <w:start w:val="1"/>
-      <w:numFmt w:val="lowerLetter"/>
-      <w:lvlText w:val="%2."/>
+    <w:lvl w:ilvl="1" w:tplc="A8B48800">
+      <w:start w:val="1"/>
+      <w:numFmt w:val="decimal"/>
+      <w:lvlText w:val="%2)"/>
       <w:lvlJc w:val="left"/>
       <w:pPr>
         <w:ind w:left="1440" w:hanging="360"/>
       </w:pPr>
+      <w:rPr>
+        <w:rFonts w:hint="default"/>
+      </w:rPr>
     </w:lvl>
     <w:lvl w:ilvl="2" w:tplc="040C001B" w:tentative="1">
       <w:start w:val="1"/>
@@ -2795,10 +3395,10 @@
       </w:pPr>
     </w:lvl>
   </w:abstractNum>
-  <w:abstractNum w:abstractNumId="3" w15:restartNumberingAfterBreak="0">
+  <w:abstractNum w:abstractNumId="5" w15:restartNumberingAfterBreak="0">
     <w:nsid w:val="73BE1235"/>
     <w:multiLevelType w:val="hybridMultilevel"/>
-    <w:tmpl w:val="389E5A70"/>
+    <w:tmpl w:val="734231E2"/>
     <w:lvl w:ilvl="0" w:tplc="040C0009">
       <w:start w:val="1"/>
       <w:numFmt w:val="bullet"/>
@@ -2908,7 +3508,7 @@
       </w:rPr>
     </w:lvl>
   </w:abstractNum>
-  <w:abstractNum w:abstractNumId="4" w15:restartNumberingAfterBreak="0">
+  <w:abstractNum w:abstractNumId="6" w15:restartNumberingAfterBreak="0">
     <w:nsid w:val="7D1021B1"/>
     <w:multiLevelType w:val="hybridMultilevel"/>
     <w:tmpl w:val="D43A7524"/>
@@ -3021,19 +3621,25 @@
     </w:lvl>
   </w:abstractNum>
   <w:num w:numId="1" w16cid:durableId="841430555">
+    <w:abstractNumId w:val="5"/>
+  </w:num>
+  <w:num w:numId="2" w16cid:durableId="1977026907">
+    <w:abstractNumId w:val="6"/>
+  </w:num>
+  <w:num w:numId="3" w16cid:durableId="311643469">
+    <w:abstractNumId w:val="1"/>
+  </w:num>
+  <w:num w:numId="4" w16cid:durableId="687371080">
     <w:abstractNumId w:val="3"/>
   </w:num>
-  <w:num w:numId="2" w16cid:durableId="1977026907">
+  <w:num w:numId="5" w16cid:durableId="423110556">
     <w:abstractNumId w:val="4"/>
   </w:num>
-  <w:num w:numId="3" w16cid:durableId="311643469">
+  <w:num w:numId="6" w16cid:durableId="92433831">
+    <w:abstractNumId w:val="2"/>
+  </w:num>
+  <w:num w:numId="7" w16cid:durableId="1604923155">
     <w:abstractNumId w:val="0"/>
-  </w:num>
-  <w:num w:numId="4" w16cid:durableId="687371080">
-    <w:abstractNumId w:val="1"/>
-  </w:num>
-  <w:num w:numId="5" w16cid:durableId="423110556">
-    <w:abstractNumId w:val="2"/>
   </w:num>
 </w:numbering>
 </file>

</xml_diff>

<commit_message>
Partie 3: Prompt Engineering et raisonnement: Test du prompt d'analyse
</commit_message>
<xml_diff>
--- a/ai-business_assistant/correction_atelier_prompt-engineering.docx
+++ b/ai-business_assistant/correction_atelier_prompt-engineering.docx
@@ -2898,25 +2898,786 @@
     </w:p>
     <w:p>
       <w:pPr>
-        <w:spacing w:line="360" w:lineRule="auto"/>
-        <w:jc w:val="both"/>
-        <w:rPr>
-          <w:rFonts w:ascii="Times New Roman" w:hAnsi="Times New Roman" w:cs="Times New Roman"/>
-          <w:sz w:val="24"/>
-          <w:szCs w:val="24"/>
-        </w:rPr>
-      </w:pPr>
-    </w:p>
-    <w:p>
-      <w:pPr>
-        <w:spacing w:line="360" w:lineRule="auto"/>
-        <w:jc w:val="both"/>
-        <w:rPr>
-          <w:rFonts w:ascii="Times New Roman" w:hAnsi="Times New Roman" w:cs="Times New Roman"/>
-          <w:sz w:val="24"/>
-          <w:szCs w:val="24"/>
-        </w:rPr>
-      </w:pPr>
+        <w:pStyle w:val="Paragraphedeliste"/>
+        <w:numPr>
+          <w:ilvl w:val="0"/>
+          <w:numId w:val="7"/>
+        </w:numPr>
+        <w:spacing w:line="360" w:lineRule="auto"/>
+        <w:rPr>
+          <w:rFonts w:ascii="Times New Roman" w:hAnsi="Times New Roman" w:cs="Times New Roman"/>
+          <w:sz w:val="24"/>
+          <w:szCs w:val="24"/>
+        </w:rPr>
+      </w:pPr>
+      <w:r>
+        <w:rPr>
+          <w:rFonts w:ascii="Times New Roman" w:hAnsi="Times New Roman" w:cs="Times New Roman"/>
+          <w:sz w:val="24"/>
+          <w:szCs w:val="24"/>
+        </w:rPr>
+        <w:t>Proposer au modèle un texte à analyser avec des contraintes puis utiliser un second prompt lui demandant de vérifier sa réponse précédente et de contrôler les informations non justifiées, les contradictions, les informations absentes, les éventuelles hallucinations et le respect des contraintes.</w:t>
+      </w:r>
+    </w:p>
+    <w:p>
+      <w:pPr>
+        <w:pStyle w:val="Paragraphedeliste"/>
+        <w:numPr>
+          <w:ilvl w:val="0"/>
+          <w:numId w:val="1"/>
+        </w:numPr>
+        <w:spacing w:line="360" w:lineRule="auto"/>
+        <w:jc w:val="center"/>
+        <w:rPr>
+          <w:rFonts w:ascii="Times New Roman" w:hAnsi="Times New Roman" w:cs="Times New Roman"/>
+          <w:b/>
+          <w:bCs/>
+          <w:sz w:val="24"/>
+          <w:szCs w:val="24"/>
+        </w:rPr>
+      </w:pPr>
+      <w:proofErr w:type="gramStart"/>
+      <w:r>
+        <w:rPr>
+          <w:rFonts w:ascii="Times New Roman" w:hAnsi="Times New Roman" w:cs="Times New Roman"/>
+          <w:b/>
+          <w:bCs/>
+          <w:sz w:val="24"/>
+          <w:szCs w:val="24"/>
+        </w:rPr>
+        <w:t>Prompt analyse</w:t>
+      </w:r>
+      <w:proofErr w:type="gramEnd"/>
+    </w:p>
+    <w:p>
+      <w:pPr>
+        <w:spacing w:line="276" w:lineRule="auto"/>
+        <w:ind w:left="360"/>
+        <w:rPr>
+          <w:rFonts w:ascii="Times New Roman" w:hAnsi="Times New Roman" w:cs="Times New Roman"/>
+          <w:b/>
+          <w:bCs/>
+          <w:sz w:val="24"/>
+          <w:szCs w:val="24"/>
+        </w:rPr>
+      </w:pPr>
+      <w:r>
+        <w:rPr>
+          <w:rFonts w:ascii="Times New Roman" w:hAnsi="Times New Roman" w:cs="Times New Roman"/>
+          <w:b/>
+          <w:bCs/>
+          <w:sz w:val="24"/>
+          <w:szCs w:val="24"/>
+        </w:rPr>
+        <w:t>Rôle :</w:t>
+      </w:r>
+    </w:p>
+    <w:p>
+      <w:pPr>
+        <w:spacing w:line="276" w:lineRule="auto"/>
+        <w:ind w:left="360"/>
+        <w:jc w:val="both"/>
+        <w:rPr>
+          <w:rFonts w:ascii="Times New Roman" w:hAnsi="Times New Roman" w:cs="Times New Roman"/>
+          <w:sz w:val="24"/>
+          <w:szCs w:val="24"/>
+        </w:rPr>
+      </w:pPr>
+      <w:r>
+        <w:rPr>
+          <w:rFonts w:ascii="Times New Roman" w:hAnsi="Times New Roman" w:cs="Times New Roman"/>
+          <w:sz w:val="24"/>
+          <w:szCs w:val="24"/>
+        </w:rPr>
+        <w:t>Tu es un analyste spécialisé en satisfaction client.</w:t>
+      </w:r>
+    </w:p>
+    <w:p>
+      <w:pPr>
+        <w:spacing w:line="276" w:lineRule="auto"/>
+        <w:ind w:left="360"/>
+        <w:jc w:val="both"/>
+        <w:rPr>
+          <w:rFonts w:ascii="Times New Roman" w:hAnsi="Times New Roman" w:cs="Times New Roman"/>
+          <w:b/>
+          <w:bCs/>
+          <w:sz w:val="24"/>
+          <w:szCs w:val="24"/>
+        </w:rPr>
+      </w:pPr>
+      <w:r>
+        <w:rPr>
+          <w:rFonts w:ascii="Times New Roman" w:hAnsi="Times New Roman" w:cs="Times New Roman"/>
+          <w:b/>
+          <w:bCs/>
+          <w:sz w:val="24"/>
+          <w:szCs w:val="24"/>
+        </w:rPr>
+        <w:t>Contexte :</w:t>
+      </w:r>
+    </w:p>
+    <w:p>
+      <w:pPr>
+        <w:spacing w:line="276" w:lineRule="auto"/>
+        <w:ind w:left="360"/>
+        <w:jc w:val="both"/>
+        <w:rPr>
+          <w:rFonts w:ascii="Times New Roman" w:hAnsi="Times New Roman" w:cs="Times New Roman"/>
+          <w:sz w:val="24"/>
+          <w:szCs w:val="24"/>
+        </w:rPr>
+      </w:pPr>
+      <w:r>
+        <w:rPr>
+          <w:rFonts w:ascii="Times New Roman" w:hAnsi="Times New Roman" w:cs="Times New Roman"/>
+          <w:sz w:val="24"/>
+          <w:szCs w:val="24"/>
+        </w:rPr>
+        <w:t>Voici 5 avis clients concernant une entreprise :</w:t>
+      </w:r>
+    </w:p>
+    <w:p>
+      <w:pPr>
+        <w:spacing w:line="276" w:lineRule="auto"/>
+        <w:ind w:left="360"/>
+        <w:jc w:val="both"/>
+        <w:rPr>
+          <w:rFonts w:ascii="Times New Roman" w:hAnsi="Times New Roman" w:cs="Times New Roman"/>
+          <w:sz w:val="24"/>
+          <w:szCs w:val="24"/>
+        </w:rPr>
+      </w:pPr>
+      <w:r>
+        <w:rPr>
+          <w:rFonts w:ascii="Times New Roman" w:hAnsi="Times New Roman" w:cs="Times New Roman"/>
+          <w:b/>
+          <w:bCs/>
+          <w:sz w:val="24"/>
+          <w:szCs w:val="24"/>
+        </w:rPr>
+        <w:t>Avis 1 :</w:t>
+      </w:r>
+      <w:r>
+        <w:rPr>
+          <w:rFonts w:ascii="Times New Roman" w:hAnsi="Times New Roman" w:cs="Times New Roman"/>
+          <w:sz w:val="24"/>
+          <w:szCs w:val="24"/>
+        </w:rPr>
+        <w:t xml:space="preserve"> "Le produit est de très bonne qualité, exactement comme sur les photos. </w:t>
+      </w:r>
+    </w:p>
+    <w:p>
+      <w:pPr>
+        <w:spacing w:line="276" w:lineRule="auto"/>
+        <w:ind w:left="360"/>
+        <w:jc w:val="both"/>
+        <w:rPr>
+          <w:rFonts w:ascii="Times New Roman" w:hAnsi="Times New Roman" w:cs="Times New Roman"/>
+          <w:sz w:val="24"/>
+          <w:szCs w:val="24"/>
+        </w:rPr>
+      </w:pPr>
+      <w:r>
+        <w:rPr>
+          <w:rFonts w:ascii="Times New Roman" w:hAnsi="Times New Roman" w:cs="Times New Roman"/>
+          <w:sz w:val="24"/>
+          <w:szCs w:val="24"/>
+        </w:rPr>
+        <w:t>Par contre, la livraison a pris presque 10 jours alors que 3-5 jours étaient annoncés."</w:t>
+      </w:r>
+    </w:p>
+    <w:p>
+      <w:pPr>
+        <w:spacing w:line="276" w:lineRule="auto"/>
+        <w:ind w:left="360"/>
+        <w:jc w:val="both"/>
+        <w:rPr>
+          <w:rFonts w:ascii="Times New Roman" w:hAnsi="Times New Roman" w:cs="Times New Roman"/>
+          <w:sz w:val="24"/>
+          <w:szCs w:val="24"/>
+        </w:rPr>
+      </w:pPr>
+      <w:r>
+        <w:rPr>
+          <w:rFonts w:ascii="Times New Roman" w:hAnsi="Times New Roman" w:cs="Times New Roman"/>
+          <w:b/>
+          <w:bCs/>
+          <w:sz w:val="24"/>
+          <w:szCs w:val="24"/>
+        </w:rPr>
+        <w:t>Avis 2 :</w:t>
+      </w:r>
+      <w:r>
+        <w:rPr>
+          <w:rFonts w:ascii="Times New Roman" w:hAnsi="Times New Roman" w:cs="Times New Roman"/>
+          <w:sz w:val="24"/>
+          <w:szCs w:val="24"/>
+        </w:rPr>
+        <w:t xml:space="preserve"> "Service client injoignable, j'ai attendu 3 semaines pour une réponse à mon email. Le produit en lui-même est correct mais cette expérience m'a beaucoup déçu."</w:t>
+      </w:r>
+    </w:p>
+    <w:p>
+      <w:pPr>
+        <w:spacing w:line="276" w:lineRule="auto"/>
+        <w:ind w:left="360"/>
+        <w:jc w:val="both"/>
+        <w:rPr>
+          <w:rFonts w:ascii="Times New Roman" w:hAnsi="Times New Roman" w:cs="Times New Roman"/>
+          <w:sz w:val="24"/>
+          <w:szCs w:val="24"/>
+        </w:rPr>
+      </w:pPr>
+      <w:r>
+        <w:rPr>
+          <w:rFonts w:ascii="Times New Roman" w:hAnsi="Times New Roman" w:cs="Times New Roman"/>
+          <w:b/>
+          <w:bCs/>
+          <w:sz w:val="24"/>
+          <w:szCs w:val="24"/>
+        </w:rPr>
+        <w:t>Avis 3 :</w:t>
+      </w:r>
+      <w:r>
+        <w:rPr>
+          <w:rFonts w:ascii="Times New Roman" w:hAnsi="Times New Roman" w:cs="Times New Roman"/>
+          <w:sz w:val="24"/>
+          <w:szCs w:val="24"/>
+        </w:rPr>
+        <w:t xml:space="preserve"> "Je suis très satisfait de mon achat ! Le rapport qualité-prix est excellent et la livraison est arrivée en avance. Je recommande vivement."</w:t>
+      </w:r>
+    </w:p>
+    <w:p>
+      <w:pPr>
+        <w:spacing w:line="276" w:lineRule="auto"/>
+        <w:ind w:left="360"/>
+        <w:jc w:val="both"/>
+        <w:rPr>
+          <w:rFonts w:ascii="Times New Roman" w:hAnsi="Times New Roman" w:cs="Times New Roman"/>
+          <w:sz w:val="24"/>
+          <w:szCs w:val="24"/>
+        </w:rPr>
+      </w:pPr>
+      <w:r>
+        <w:rPr>
+          <w:rFonts w:ascii="Times New Roman" w:hAnsi="Times New Roman" w:cs="Times New Roman"/>
+          <w:b/>
+          <w:bCs/>
+          <w:sz w:val="24"/>
+          <w:szCs w:val="24"/>
+        </w:rPr>
+        <w:t>Avis 4 :</w:t>
+      </w:r>
+      <w:r>
+        <w:rPr>
+          <w:rFonts w:ascii="Times New Roman" w:hAnsi="Times New Roman" w:cs="Times New Roman"/>
+          <w:sz w:val="24"/>
+          <w:szCs w:val="24"/>
+        </w:rPr>
+        <w:t xml:space="preserve"> "Le prix est trop élevé par rapport à la concurrence pour une qualité équivalente. L'emballage était aussi abîmé à la réception.</w:t>
+      </w:r>
+    </w:p>
+    <w:p>
+      <w:pPr>
+        <w:spacing w:line="276" w:lineRule="auto"/>
+        <w:ind w:left="360"/>
+        <w:jc w:val="both"/>
+        <w:rPr>
+          <w:rFonts w:ascii="Times New Roman" w:hAnsi="Times New Roman" w:cs="Times New Roman"/>
+          <w:sz w:val="24"/>
+          <w:szCs w:val="24"/>
+        </w:rPr>
+      </w:pPr>
+      <w:r>
+        <w:rPr>
+          <w:rFonts w:ascii="Times New Roman" w:hAnsi="Times New Roman" w:cs="Times New Roman"/>
+          <w:b/>
+          <w:bCs/>
+          <w:sz w:val="24"/>
+          <w:szCs w:val="24"/>
+        </w:rPr>
+        <w:t>Avis 5 :</w:t>
+      </w:r>
+      <w:r>
+        <w:rPr>
+          <w:rFonts w:ascii="Times New Roman" w:hAnsi="Times New Roman" w:cs="Times New Roman"/>
+          <w:sz w:val="24"/>
+          <w:szCs w:val="24"/>
+        </w:rPr>
+        <w:t xml:space="preserve"> "Application mobile pratique, commande simple à passer. Cependant, le produit reçu ne correspondait pas exactement à la couleur commandée."</w:t>
+      </w:r>
+    </w:p>
+    <w:p>
+      <w:pPr>
+        <w:spacing w:line="360" w:lineRule="auto"/>
+        <w:ind w:left="360"/>
+        <w:rPr>
+          <w:rFonts w:ascii="Times New Roman" w:hAnsi="Times New Roman" w:cs="Times New Roman"/>
+          <w:b/>
+          <w:bCs/>
+          <w:sz w:val="24"/>
+          <w:szCs w:val="24"/>
+        </w:rPr>
+      </w:pPr>
+      <w:r>
+        <w:rPr>
+          <w:rFonts w:ascii="Times New Roman" w:hAnsi="Times New Roman" w:cs="Times New Roman"/>
+          <w:b/>
+          <w:bCs/>
+          <w:sz w:val="24"/>
+          <w:szCs w:val="24"/>
+        </w:rPr>
+        <w:t>Tâche :</w:t>
+      </w:r>
+    </w:p>
+    <w:p>
+      <w:pPr>
+        <w:spacing w:line="276" w:lineRule="auto"/>
+        <w:ind w:left="360"/>
+        <w:rPr>
+          <w:rFonts w:ascii="Times New Roman" w:hAnsi="Times New Roman" w:cs="Times New Roman"/>
+          <w:sz w:val="24"/>
+          <w:szCs w:val="24"/>
+        </w:rPr>
+      </w:pPr>
+      <w:r>
+        <w:rPr>
+          <w:rFonts w:ascii="Times New Roman" w:hAnsi="Times New Roman" w:cs="Times New Roman"/>
+          <w:sz w:val="24"/>
+          <w:szCs w:val="24"/>
+        </w:rPr>
+        <w:t>En suivant cette démarche :</w:t>
+      </w:r>
+    </w:p>
+    <w:p>
+      <w:pPr>
+        <w:spacing w:line="276" w:lineRule="auto"/>
+        <w:ind w:left="360"/>
+        <w:rPr>
+          <w:rFonts w:ascii="Times New Roman" w:hAnsi="Times New Roman" w:cs="Times New Roman"/>
+          <w:sz w:val="24"/>
+          <w:szCs w:val="24"/>
+        </w:rPr>
+      </w:pPr>
+      <w:r>
+        <w:rPr>
+          <w:rFonts w:ascii="Times New Roman" w:hAnsi="Times New Roman" w:cs="Times New Roman"/>
+          <w:sz w:val="24"/>
+          <w:szCs w:val="24"/>
+        </w:rPr>
+        <w:t>1. Extrais les éléments factuels de chaque avis.</w:t>
+      </w:r>
+    </w:p>
+    <w:p>
+      <w:pPr>
+        <w:spacing w:line="276" w:lineRule="auto"/>
+        <w:ind w:left="360"/>
+        <w:rPr>
+          <w:rFonts w:ascii="Times New Roman" w:hAnsi="Times New Roman" w:cs="Times New Roman"/>
+          <w:sz w:val="24"/>
+          <w:szCs w:val="24"/>
+        </w:rPr>
+      </w:pPr>
+      <w:r>
+        <w:rPr>
+          <w:rFonts w:ascii="Times New Roman" w:hAnsi="Times New Roman" w:cs="Times New Roman"/>
+          <w:sz w:val="24"/>
+          <w:szCs w:val="24"/>
+        </w:rPr>
+        <w:t>2. Regroupe-les par thème.</w:t>
+      </w:r>
+    </w:p>
+    <w:p>
+      <w:pPr>
+        <w:spacing w:line="276" w:lineRule="auto"/>
+        <w:ind w:left="360"/>
+        <w:rPr>
+          <w:rFonts w:ascii="Times New Roman" w:hAnsi="Times New Roman" w:cs="Times New Roman"/>
+          <w:sz w:val="24"/>
+          <w:szCs w:val="24"/>
+        </w:rPr>
+      </w:pPr>
+      <w:r>
+        <w:rPr>
+          <w:rFonts w:ascii="Times New Roman" w:hAnsi="Times New Roman" w:cs="Times New Roman"/>
+          <w:sz w:val="24"/>
+          <w:szCs w:val="24"/>
+        </w:rPr>
+        <w:t xml:space="preserve">3. Identifie les thèmes les plus fréquents ou </w:t>
+      </w:r>
+      <w:proofErr w:type="spellStart"/>
+      <w:r>
+        <w:rPr>
+          <w:rFonts w:ascii="Times New Roman" w:hAnsi="Times New Roman" w:cs="Times New Roman"/>
+          <w:sz w:val="24"/>
+          <w:szCs w:val="24"/>
+        </w:rPr>
+        <w:t>impactant</w:t>
+      </w:r>
+      <w:r>
+        <w:rPr>
+          <w:rFonts w:ascii="Times New Roman" w:hAnsi="Times New Roman" w:cs="Times New Roman"/>
+          <w:sz w:val="24"/>
+          <w:szCs w:val="24"/>
+        </w:rPr>
+        <w:t>s</w:t>
+      </w:r>
+      <w:proofErr w:type="spellEnd"/>
+      <w:r>
+        <w:rPr>
+          <w:rFonts w:ascii="Times New Roman" w:hAnsi="Times New Roman" w:cs="Times New Roman"/>
+          <w:sz w:val="24"/>
+          <w:szCs w:val="24"/>
+        </w:rPr>
+        <w:t>.</w:t>
+      </w:r>
+    </w:p>
+    <w:p>
+      <w:pPr>
+        <w:spacing w:line="276" w:lineRule="auto"/>
+        <w:ind w:left="360"/>
+        <w:rPr>
+          <w:rFonts w:ascii="Times New Roman" w:hAnsi="Times New Roman" w:cs="Times New Roman"/>
+          <w:sz w:val="24"/>
+          <w:szCs w:val="24"/>
+        </w:rPr>
+      </w:pPr>
+      <w:r>
+        <w:rPr>
+          <w:rFonts w:ascii="Times New Roman" w:hAnsi="Times New Roman" w:cs="Times New Roman"/>
+          <w:sz w:val="24"/>
+          <w:szCs w:val="24"/>
+        </w:rPr>
+        <w:t>4. Formule les 3 problèmes les plus importants.</w:t>
+      </w:r>
+    </w:p>
+    <w:p>
+      <w:pPr>
+        <w:spacing w:line="276" w:lineRule="auto"/>
+        <w:ind w:left="360"/>
+        <w:rPr>
+          <w:rFonts w:ascii="Times New Roman" w:hAnsi="Times New Roman" w:cs="Times New Roman"/>
+          <w:sz w:val="24"/>
+          <w:szCs w:val="24"/>
+        </w:rPr>
+      </w:pPr>
+      <w:r>
+        <w:rPr>
+          <w:rFonts w:ascii="Times New Roman" w:hAnsi="Times New Roman" w:cs="Times New Roman"/>
+          <w:sz w:val="24"/>
+          <w:szCs w:val="24"/>
+        </w:rPr>
+        <w:t>5. Propose une recommandation concrète pour chaque problème.</w:t>
+      </w:r>
+    </w:p>
+    <w:p>
+      <w:pPr>
+        <w:spacing w:line="360" w:lineRule="auto"/>
+        <w:ind w:left="360"/>
+        <w:rPr>
+          <w:rFonts w:ascii="Times New Roman" w:hAnsi="Times New Roman" w:cs="Times New Roman"/>
+          <w:b/>
+          <w:bCs/>
+          <w:sz w:val="24"/>
+          <w:szCs w:val="24"/>
+        </w:rPr>
+      </w:pPr>
+      <w:r>
+        <w:rPr>
+          <w:rFonts w:ascii="Times New Roman" w:hAnsi="Times New Roman" w:cs="Times New Roman"/>
+          <w:b/>
+          <w:bCs/>
+          <w:sz w:val="24"/>
+          <w:szCs w:val="24"/>
+        </w:rPr>
+        <w:t>Contraintes :</w:t>
+      </w:r>
+    </w:p>
+    <w:p>
+      <w:pPr>
+        <w:pStyle w:val="Paragraphedeliste"/>
+        <w:numPr>
+          <w:ilvl w:val="0"/>
+          <w:numId w:val="2"/>
+        </w:numPr>
+        <w:spacing w:line="360" w:lineRule="auto"/>
+        <w:rPr>
+          <w:rFonts w:ascii="Times New Roman" w:hAnsi="Times New Roman" w:cs="Times New Roman"/>
+          <w:sz w:val="24"/>
+          <w:szCs w:val="24"/>
+        </w:rPr>
+      </w:pPr>
+      <w:r>
+        <w:rPr>
+          <w:rFonts w:ascii="Times New Roman" w:hAnsi="Times New Roman" w:cs="Times New Roman"/>
+          <w:sz w:val="24"/>
+          <w:szCs w:val="24"/>
+        </w:rPr>
+        <w:t>Base-toi uniquement sur les avis fournis ci-dessus, sans ajouter d'information ou d'hypothèse non présente dans le texte.</w:t>
+      </w:r>
+    </w:p>
+    <w:p>
+      <w:pPr>
+        <w:pStyle w:val="Paragraphedeliste"/>
+        <w:numPr>
+          <w:ilvl w:val="0"/>
+          <w:numId w:val="2"/>
+        </w:numPr>
+        <w:spacing w:line="360" w:lineRule="auto"/>
+        <w:rPr>
+          <w:rFonts w:ascii="Times New Roman" w:hAnsi="Times New Roman" w:cs="Times New Roman"/>
+          <w:sz w:val="24"/>
+          <w:szCs w:val="24"/>
+        </w:rPr>
+      </w:pPr>
+      <w:r>
+        <w:rPr>
+          <w:rFonts w:ascii="Times New Roman" w:hAnsi="Times New Roman" w:cs="Times New Roman"/>
+          <w:sz w:val="24"/>
+          <w:szCs w:val="24"/>
+        </w:rPr>
+        <w:t>Chaque problème identifié doit être appuyé par au moins un avis cité précisément.</w:t>
+      </w:r>
+    </w:p>
+    <w:p>
+      <w:pPr>
+        <w:pStyle w:val="Paragraphedeliste"/>
+        <w:numPr>
+          <w:ilvl w:val="0"/>
+          <w:numId w:val="2"/>
+        </w:numPr>
+        <w:spacing w:line="360" w:lineRule="auto"/>
+        <w:rPr>
+          <w:rFonts w:ascii="Times New Roman" w:hAnsi="Times New Roman" w:cs="Times New Roman"/>
+          <w:sz w:val="24"/>
+          <w:szCs w:val="24"/>
+        </w:rPr>
+      </w:pPr>
+      <w:r>
+        <w:rPr>
+          <w:rFonts w:ascii="Times New Roman" w:hAnsi="Times New Roman" w:cs="Times New Roman"/>
+          <w:sz w:val="24"/>
+          <w:szCs w:val="24"/>
+        </w:rPr>
+        <w:t>Réponds en français, de façon claire et structurée.</w:t>
+      </w:r>
+    </w:p>
+    <w:p>
+      <w:pPr>
+        <w:spacing w:line="360" w:lineRule="auto"/>
+        <w:ind w:left="360"/>
+        <w:rPr>
+          <w:rFonts w:ascii="Times New Roman" w:hAnsi="Times New Roman" w:cs="Times New Roman"/>
+          <w:b/>
+          <w:bCs/>
+          <w:sz w:val="24"/>
+          <w:szCs w:val="24"/>
+        </w:rPr>
+      </w:pPr>
+    </w:p>
+    <w:p>
+      <w:pPr>
+        <w:spacing w:line="360" w:lineRule="auto"/>
+        <w:ind w:left="360"/>
+        <w:rPr>
+          <w:rFonts w:ascii="Times New Roman" w:hAnsi="Times New Roman" w:cs="Times New Roman"/>
+          <w:b/>
+          <w:bCs/>
+          <w:sz w:val="24"/>
+          <w:szCs w:val="24"/>
+        </w:rPr>
+      </w:pPr>
+      <w:r>
+        <w:rPr>
+          <w:rFonts w:ascii="Times New Roman" w:hAnsi="Times New Roman" w:cs="Times New Roman"/>
+          <w:b/>
+          <w:bCs/>
+          <w:sz w:val="24"/>
+          <w:szCs w:val="24"/>
+        </w:rPr>
+        <w:t>Format de sortie :</w:t>
+      </w:r>
+    </w:p>
+    <w:p>
+      <w:pPr>
+        <w:pStyle w:val="Paragraphedeliste"/>
+        <w:numPr>
+          <w:ilvl w:val="0"/>
+          <w:numId w:val="2"/>
+        </w:numPr>
+        <w:spacing w:line="360" w:lineRule="auto"/>
+        <w:rPr>
+          <w:rFonts w:ascii="Times New Roman" w:hAnsi="Times New Roman" w:cs="Times New Roman"/>
+          <w:sz w:val="24"/>
+          <w:szCs w:val="24"/>
+        </w:rPr>
+      </w:pPr>
+      <w:r>
+        <w:rPr>
+          <w:rFonts w:ascii="Times New Roman" w:hAnsi="Times New Roman" w:cs="Times New Roman"/>
+          <w:sz w:val="24"/>
+          <w:szCs w:val="24"/>
+        </w:rPr>
+        <w:t>Problèmes identifiés (avec l'avis correspondant entre parenthèses)</w:t>
+      </w:r>
+    </w:p>
+    <w:p>
+      <w:pPr>
+        <w:pStyle w:val="Paragraphedeliste"/>
+        <w:numPr>
+          <w:ilvl w:val="0"/>
+          <w:numId w:val="2"/>
+        </w:numPr>
+        <w:spacing w:line="360" w:lineRule="auto"/>
+        <w:rPr>
+          <w:rFonts w:ascii="Times New Roman" w:hAnsi="Times New Roman" w:cs="Times New Roman"/>
+          <w:sz w:val="24"/>
+          <w:szCs w:val="24"/>
+        </w:rPr>
+      </w:pPr>
+      <w:r>
+        <w:rPr>
+          <w:rFonts w:ascii="Times New Roman" w:hAnsi="Times New Roman" w:cs="Times New Roman"/>
+          <w:sz w:val="24"/>
+          <w:szCs w:val="24"/>
+        </w:rPr>
+        <w:t>Recommandations associées</w:t>
+      </w:r>
+    </w:p>
+    <w:p>
+      <w:pPr>
+        <w:pStyle w:val="Paragraphedeliste"/>
+        <w:numPr>
+          <w:ilvl w:val="0"/>
+          <w:numId w:val="10"/>
+        </w:numPr>
+        <w:spacing w:line="360" w:lineRule="auto"/>
+        <w:jc w:val="center"/>
+        <w:rPr>
+          <w:rFonts w:ascii="Times New Roman" w:hAnsi="Times New Roman" w:cs="Times New Roman"/>
+          <w:b/>
+          <w:bCs/>
+          <w:sz w:val="24"/>
+          <w:szCs w:val="24"/>
+        </w:rPr>
+      </w:pPr>
+      <w:r>
+        <w:rPr>
+          <w:rFonts w:ascii="Times New Roman" w:hAnsi="Times New Roman" w:cs="Times New Roman"/>
+          <w:b/>
+          <w:bCs/>
+          <w:sz w:val="24"/>
+          <w:szCs w:val="24"/>
+        </w:rPr>
+        <w:t>Réponse de Claude</w:t>
+      </w:r>
+    </w:p>
+    <w:p>
+      <w:pPr>
+        <w:spacing w:line="360" w:lineRule="auto"/>
+        <w:ind w:left="360"/>
+        <w:jc w:val="center"/>
+        <w:rPr>
+          <w:rFonts w:ascii="Times New Roman" w:hAnsi="Times New Roman" w:cs="Times New Roman"/>
+          <w:b/>
+          <w:bCs/>
+          <w:sz w:val="24"/>
+          <w:szCs w:val="24"/>
+        </w:rPr>
+      </w:pPr>
+      <w:r>
+        <w:drawing>
+          <wp:inline distT="0" distB="0" distL="0" distR="0" wp14:anchorId="7053E743" wp14:editId="7A58ADB1">
+            <wp:extent cx="5760720" cy="5187315"/>
+            <wp:effectExtent l="0" t="0" r="0" b="0"/>
+            <wp:docPr id="1397698048" name="Image 1"/>
+            <wp:cNvGraphicFramePr>
+              <a:graphicFrameLocks xmlns:a="http://schemas.openxmlformats.org/drawingml/2006/main" noChangeAspect="1"/>
+            </wp:cNvGraphicFramePr>
+            <a:graphic xmlns:a="http://schemas.openxmlformats.org/drawingml/2006/main">
+              <a:graphicData uri="http://schemas.openxmlformats.org/drawingml/2006/picture">
+                <pic:pic xmlns:pic="http://schemas.openxmlformats.org/drawingml/2006/picture">
+                  <pic:nvPicPr>
+                    <pic:cNvPr id="1397698048" name=""/>
+                    <pic:cNvPicPr/>
+                  </pic:nvPicPr>
+                  <pic:blipFill>
+                    <a:blip r:embed="rId11"/>
+                    <a:stretch>
+                      <a:fillRect/>
+                    </a:stretch>
+                  </pic:blipFill>
+                  <pic:spPr>
+                    <a:xfrm>
+                      <a:off x="0" y="0"/>
+                      <a:ext cx="5760720" cy="5187315"/>
+                    </a:xfrm>
+                    <a:prstGeom prst="rect">
+                      <a:avLst/>
+                    </a:prstGeom>
+                  </pic:spPr>
+                </pic:pic>
+              </a:graphicData>
+            </a:graphic>
+          </wp:inline>
+        </w:drawing>
+      </w:r>
+    </w:p>
+    <w:p>
+      <w:pPr>
+        <w:spacing w:line="360" w:lineRule="auto"/>
+        <w:ind w:left="360"/>
+        <w:rPr>
+          <w:rFonts w:ascii="Times New Roman" w:hAnsi="Times New Roman" w:cs="Times New Roman"/>
+          <w:b/>
+          <w:bCs/>
+          <w:sz w:val="24"/>
+          <w:szCs w:val="24"/>
+        </w:rPr>
+      </w:pPr>
+      <w:r>
+        <w:rPr>
+          <w:rFonts w:ascii="Times New Roman" w:hAnsi="Times New Roman" w:cs="Times New Roman"/>
+          <w:b/>
+          <w:bCs/>
+          <w:sz w:val="24"/>
+          <w:szCs w:val="24"/>
+        </w:rPr>
+        <w:drawing>
+          <wp:inline distT="0" distB="0" distL="0" distR="0" wp14:anchorId="2DC74EC1" wp14:editId="2C4212D6">
+            <wp:extent cx="5760720" cy="4962525"/>
+            <wp:effectExtent l="0" t="0" r="0" b="9525"/>
+            <wp:docPr id="52188413" name="Image 1"/>
+            <wp:cNvGraphicFramePr>
+              <a:graphicFrameLocks xmlns:a="http://schemas.openxmlformats.org/drawingml/2006/main" noChangeAspect="1"/>
+            </wp:cNvGraphicFramePr>
+            <a:graphic xmlns:a="http://schemas.openxmlformats.org/drawingml/2006/main">
+              <a:graphicData uri="http://schemas.openxmlformats.org/drawingml/2006/picture">
+                <pic:pic xmlns:pic="http://schemas.openxmlformats.org/drawingml/2006/picture">
+                  <pic:nvPicPr>
+                    <pic:cNvPr id="52188413" name=""/>
+                    <pic:cNvPicPr/>
+                  </pic:nvPicPr>
+                  <pic:blipFill>
+                    <a:blip r:embed="rId12"/>
+                    <a:stretch>
+                      <a:fillRect/>
+                    </a:stretch>
+                  </pic:blipFill>
+                  <pic:spPr>
+                    <a:xfrm>
+                      <a:off x="0" y="0"/>
+                      <a:ext cx="5760720" cy="4962525"/>
+                    </a:xfrm>
+                    <a:prstGeom prst="rect">
+                      <a:avLst/>
+                    </a:prstGeom>
+                  </pic:spPr>
+                </pic:pic>
+              </a:graphicData>
+            </a:graphic>
+          </wp:inline>
+        </w:drawing>
+      </w:r>
     </w:p>
     <w:sectPr>
       <w:pgSz w:w="11906" w:h="16838"/>
@@ -3020,6 +3781,343 @@
     </w:lvl>
   </w:abstractNum>
   <w:abstractNum w:abstractNumId="1" w15:restartNumberingAfterBreak="0">
+    <w:nsid w:val="165A331E"/>
+    <w:multiLevelType w:val="hybridMultilevel"/>
+    <w:tmpl w:val="9A24C640"/>
+    <w:lvl w:ilvl="0" w:tplc="286E57D4">
+      <w:numFmt w:val="bullet"/>
+      <w:lvlText w:val="-"/>
+      <w:lvlJc w:val="left"/>
+      <w:pPr>
+        <w:ind w:left="1080" w:hanging="360"/>
+      </w:pPr>
+      <w:rPr>
+        <w:rFonts w:ascii="Times New Roman" w:eastAsiaTheme="minorHAnsi" w:hAnsi="Times New Roman" w:cs="Times New Roman" w:hint="default"/>
+      </w:rPr>
+    </w:lvl>
+    <w:lvl w:ilvl="1" w:tplc="040C0003" w:tentative="1">
+      <w:start w:val="1"/>
+      <w:numFmt w:val="bullet"/>
+      <w:lvlText w:val="o"/>
+      <w:lvlJc w:val="left"/>
+      <w:pPr>
+        <w:ind w:left="1800" w:hanging="360"/>
+      </w:pPr>
+      <w:rPr>
+        <w:rFonts w:ascii="Courier New" w:hAnsi="Courier New" w:cs="Courier New" w:hint="default"/>
+      </w:rPr>
+    </w:lvl>
+    <w:lvl w:ilvl="2" w:tplc="040C0005" w:tentative="1">
+      <w:start w:val="1"/>
+      <w:numFmt w:val="bullet"/>
+      <w:lvlText w:val=""/>
+      <w:lvlJc w:val="left"/>
+      <w:pPr>
+        <w:ind w:left="2520" w:hanging="360"/>
+      </w:pPr>
+      <w:rPr>
+        <w:rFonts w:ascii="Wingdings" w:hAnsi="Wingdings" w:hint="default"/>
+      </w:rPr>
+    </w:lvl>
+    <w:lvl w:ilvl="3" w:tplc="040C0001" w:tentative="1">
+      <w:start w:val="1"/>
+      <w:numFmt w:val="bullet"/>
+      <w:lvlText w:val=""/>
+      <w:lvlJc w:val="left"/>
+      <w:pPr>
+        <w:ind w:left="3240" w:hanging="360"/>
+      </w:pPr>
+      <w:rPr>
+        <w:rFonts w:ascii="Symbol" w:hAnsi="Symbol" w:hint="default"/>
+      </w:rPr>
+    </w:lvl>
+    <w:lvl w:ilvl="4" w:tplc="040C0003" w:tentative="1">
+      <w:start w:val="1"/>
+      <w:numFmt w:val="bullet"/>
+      <w:lvlText w:val="o"/>
+      <w:lvlJc w:val="left"/>
+      <w:pPr>
+        <w:ind w:left="3960" w:hanging="360"/>
+      </w:pPr>
+      <w:rPr>
+        <w:rFonts w:ascii="Courier New" w:hAnsi="Courier New" w:cs="Courier New" w:hint="default"/>
+      </w:rPr>
+    </w:lvl>
+    <w:lvl w:ilvl="5" w:tplc="040C0005" w:tentative="1">
+      <w:start w:val="1"/>
+      <w:numFmt w:val="bullet"/>
+      <w:lvlText w:val=""/>
+      <w:lvlJc w:val="left"/>
+      <w:pPr>
+        <w:ind w:left="4680" w:hanging="360"/>
+      </w:pPr>
+      <w:rPr>
+        <w:rFonts w:ascii="Wingdings" w:hAnsi="Wingdings" w:hint="default"/>
+      </w:rPr>
+    </w:lvl>
+    <w:lvl w:ilvl="6" w:tplc="040C0001" w:tentative="1">
+      <w:start w:val="1"/>
+      <w:numFmt w:val="bullet"/>
+      <w:lvlText w:val=""/>
+      <w:lvlJc w:val="left"/>
+      <w:pPr>
+        <w:ind w:left="5400" w:hanging="360"/>
+      </w:pPr>
+      <w:rPr>
+        <w:rFonts w:ascii="Symbol" w:hAnsi="Symbol" w:hint="default"/>
+      </w:rPr>
+    </w:lvl>
+    <w:lvl w:ilvl="7" w:tplc="040C0003" w:tentative="1">
+      <w:start w:val="1"/>
+      <w:numFmt w:val="bullet"/>
+      <w:lvlText w:val="o"/>
+      <w:lvlJc w:val="left"/>
+      <w:pPr>
+        <w:ind w:left="6120" w:hanging="360"/>
+      </w:pPr>
+      <w:rPr>
+        <w:rFonts w:ascii="Courier New" w:hAnsi="Courier New" w:cs="Courier New" w:hint="default"/>
+      </w:rPr>
+    </w:lvl>
+    <w:lvl w:ilvl="8" w:tplc="040C0005" w:tentative="1">
+      <w:start w:val="1"/>
+      <w:numFmt w:val="bullet"/>
+      <w:lvlText w:val=""/>
+      <w:lvlJc w:val="left"/>
+      <w:pPr>
+        <w:ind w:left="6840" w:hanging="360"/>
+      </w:pPr>
+      <w:rPr>
+        <w:rFonts w:ascii="Wingdings" w:hAnsi="Wingdings" w:hint="default"/>
+      </w:rPr>
+    </w:lvl>
+  </w:abstractNum>
+  <w:abstractNum w:abstractNumId="2" w15:restartNumberingAfterBreak="0">
+    <w:nsid w:val="40234EF3"/>
+    <w:multiLevelType w:val="hybridMultilevel"/>
+    <w:tmpl w:val="AEE61C34"/>
+    <w:lvl w:ilvl="0" w:tplc="040C0009">
+      <w:start w:val="1"/>
+      <w:numFmt w:val="bullet"/>
+      <w:lvlText w:val=""/>
+      <w:lvlJc w:val="left"/>
+      <w:pPr>
+        <w:ind w:left="720" w:hanging="360"/>
+      </w:pPr>
+      <w:rPr>
+        <w:rFonts w:ascii="Wingdings" w:hAnsi="Wingdings" w:hint="default"/>
+      </w:rPr>
+    </w:lvl>
+    <w:lvl w:ilvl="1" w:tplc="040C0003" w:tentative="1">
+      <w:start w:val="1"/>
+      <w:numFmt w:val="bullet"/>
+      <w:lvlText w:val="o"/>
+      <w:lvlJc w:val="left"/>
+      <w:pPr>
+        <w:ind w:left="1440" w:hanging="360"/>
+      </w:pPr>
+      <w:rPr>
+        <w:rFonts w:ascii="Courier New" w:hAnsi="Courier New" w:cs="Courier New" w:hint="default"/>
+      </w:rPr>
+    </w:lvl>
+    <w:lvl w:ilvl="2" w:tplc="040C0005" w:tentative="1">
+      <w:start w:val="1"/>
+      <w:numFmt w:val="bullet"/>
+      <w:lvlText w:val=""/>
+      <w:lvlJc w:val="left"/>
+      <w:pPr>
+        <w:ind w:left="2160" w:hanging="360"/>
+      </w:pPr>
+      <w:rPr>
+        <w:rFonts w:ascii="Wingdings" w:hAnsi="Wingdings" w:hint="default"/>
+      </w:rPr>
+    </w:lvl>
+    <w:lvl w:ilvl="3" w:tplc="040C0001" w:tentative="1">
+      <w:start w:val="1"/>
+      <w:numFmt w:val="bullet"/>
+      <w:lvlText w:val=""/>
+      <w:lvlJc w:val="left"/>
+      <w:pPr>
+        <w:ind w:left="2880" w:hanging="360"/>
+      </w:pPr>
+      <w:rPr>
+        <w:rFonts w:ascii="Symbol" w:hAnsi="Symbol" w:hint="default"/>
+      </w:rPr>
+    </w:lvl>
+    <w:lvl w:ilvl="4" w:tplc="040C0003" w:tentative="1">
+      <w:start w:val="1"/>
+      <w:numFmt w:val="bullet"/>
+      <w:lvlText w:val="o"/>
+      <w:lvlJc w:val="left"/>
+      <w:pPr>
+        <w:ind w:left="3600" w:hanging="360"/>
+      </w:pPr>
+      <w:rPr>
+        <w:rFonts w:ascii="Courier New" w:hAnsi="Courier New" w:cs="Courier New" w:hint="default"/>
+      </w:rPr>
+    </w:lvl>
+    <w:lvl w:ilvl="5" w:tplc="040C0005" w:tentative="1">
+      <w:start w:val="1"/>
+      <w:numFmt w:val="bullet"/>
+      <w:lvlText w:val=""/>
+      <w:lvlJc w:val="left"/>
+      <w:pPr>
+        <w:ind w:left="4320" w:hanging="360"/>
+      </w:pPr>
+      <w:rPr>
+        <w:rFonts w:ascii="Wingdings" w:hAnsi="Wingdings" w:hint="default"/>
+      </w:rPr>
+    </w:lvl>
+    <w:lvl w:ilvl="6" w:tplc="040C0001" w:tentative="1">
+      <w:start w:val="1"/>
+      <w:numFmt w:val="bullet"/>
+      <w:lvlText w:val=""/>
+      <w:lvlJc w:val="left"/>
+      <w:pPr>
+        <w:ind w:left="5040" w:hanging="360"/>
+      </w:pPr>
+      <w:rPr>
+        <w:rFonts w:ascii="Symbol" w:hAnsi="Symbol" w:hint="default"/>
+      </w:rPr>
+    </w:lvl>
+    <w:lvl w:ilvl="7" w:tplc="040C0003" w:tentative="1">
+      <w:start w:val="1"/>
+      <w:numFmt w:val="bullet"/>
+      <w:lvlText w:val="o"/>
+      <w:lvlJc w:val="left"/>
+      <w:pPr>
+        <w:ind w:left="5760" w:hanging="360"/>
+      </w:pPr>
+      <w:rPr>
+        <w:rFonts w:ascii="Courier New" w:hAnsi="Courier New" w:cs="Courier New" w:hint="default"/>
+      </w:rPr>
+    </w:lvl>
+    <w:lvl w:ilvl="8" w:tplc="040C0005" w:tentative="1">
+      <w:start w:val="1"/>
+      <w:numFmt w:val="bullet"/>
+      <w:lvlText w:val=""/>
+      <w:lvlJc w:val="left"/>
+      <w:pPr>
+        <w:ind w:left="6480" w:hanging="360"/>
+      </w:pPr>
+      <w:rPr>
+        <w:rFonts w:ascii="Wingdings" w:hAnsi="Wingdings" w:hint="default"/>
+      </w:rPr>
+    </w:lvl>
+  </w:abstractNum>
+  <w:abstractNum w:abstractNumId="3" w15:restartNumberingAfterBreak="0">
+    <w:nsid w:val="4E6D6647"/>
+    <w:multiLevelType w:val="hybridMultilevel"/>
+    <w:tmpl w:val="0BC2673C"/>
+    <w:lvl w:ilvl="0" w:tplc="286E57D4">
+      <w:numFmt w:val="bullet"/>
+      <w:lvlText w:val="-"/>
+      <w:lvlJc w:val="left"/>
+      <w:pPr>
+        <w:ind w:left="1080" w:hanging="360"/>
+      </w:pPr>
+      <w:rPr>
+        <w:rFonts w:ascii="Times New Roman" w:eastAsiaTheme="minorHAnsi" w:hAnsi="Times New Roman" w:cs="Times New Roman" w:hint="default"/>
+      </w:rPr>
+    </w:lvl>
+    <w:lvl w:ilvl="1" w:tplc="040C0003" w:tentative="1">
+      <w:start w:val="1"/>
+      <w:numFmt w:val="bullet"/>
+      <w:lvlText w:val="o"/>
+      <w:lvlJc w:val="left"/>
+      <w:pPr>
+        <w:ind w:left="1800" w:hanging="360"/>
+      </w:pPr>
+      <w:rPr>
+        <w:rFonts w:ascii="Courier New" w:hAnsi="Courier New" w:cs="Courier New" w:hint="default"/>
+      </w:rPr>
+    </w:lvl>
+    <w:lvl w:ilvl="2" w:tplc="040C0005" w:tentative="1">
+      <w:start w:val="1"/>
+      <w:numFmt w:val="bullet"/>
+      <w:lvlText w:val=""/>
+      <w:lvlJc w:val="left"/>
+      <w:pPr>
+        <w:ind w:left="2520" w:hanging="360"/>
+      </w:pPr>
+      <w:rPr>
+        <w:rFonts w:ascii="Wingdings" w:hAnsi="Wingdings" w:hint="default"/>
+      </w:rPr>
+    </w:lvl>
+    <w:lvl w:ilvl="3" w:tplc="040C0001" w:tentative="1">
+      <w:start w:val="1"/>
+      <w:numFmt w:val="bullet"/>
+      <w:lvlText w:val=""/>
+      <w:lvlJc w:val="left"/>
+      <w:pPr>
+        <w:ind w:left="3240" w:hanging="360"/>
+      </w:pPr>
+      <w:rPr>
+        <w:rFonts w:ascii="Symbol" w:hAnsi="Symbol" w:hint="default"/>
+      </w:rPr>
+    </w:lvl>
+    <w:lvl w:ilvl="4" w:tplc="040C0003" w:tentative="1">
+      <w:start w:val="1"/>
+      <w:numFmt w:val="bullet"/>
+      <w:lvlText w:val="o"/>
+      <w:lvlJc w:val="left"/>
+      <w:pPr>
+        <w:ind w:left="3960" w:hanging="360"/>
+      </w:pPr>
+      <w:rPr>
+        <w:rFonts w:ascii="Courier New" w:hAnsi="Courier New" w:cs="Courier New" w:hint="default"/>
+      </w:rPr>
+    </w:lvl>
+    <w:lvl w:ilvl="5" w:tplc="040C0005" w:tentative="1">
+      <w:start w:val="1"/>
+      <w:numFmt w:val="bullet"/>
+      <w:lvlText w:val=""/>
+      <w:lvlJc w:val="left"/>
+      <w:pPr>
+        <w:ind w:left="4680" w:hanging="360"/>
+      </w:pPr>
+      <w:rPr>
+        <w:rFonts w:ascii="Wingdings" w:hAnsi="Wingdings" w:hint="default"/>
+      </w:rPr>
+    </w:lvl>
+    <w:lvl w:ilvl="6" w:tplc="040C0001" w:tentative="1">
+      <w:start w:val="1"/>
+      <w:numFmt w:val="bullet"/>
+      <w:lvlText w:val=""/>
+      <w:lvlJc w:val="left"/>
+      <w:pPr>
+        <w:ind w:left="5400" w:hanging="360"/>
+      </w:pPr>
+      <w:rPr>
+        <w:rFonts w:ascii="Symbol" w:hAnsi="Symbol" w:hint="default"/>
+      </w:rPr>
+    </w:lvl>
+    <w:lvl w:ilvl="7" w:tplc="040C0003" w:tentative="1">
+      <w:start w:val="1"/>
+      <w:numFmt w:val="bullet"/>
+      <w:lvlText w:val="o"/>
+      <w:lvlJc w:val="left"/>
+      <w:pPr>
+        <w:ind w:left="6120" w:hanging="360"/>
+      </w:pPr>
+      <w:rPr>
+        <w:rFonts w:ascii="Courier New" w:hAnsi="Courier New" w:cs="Courier New" w:hint="default"/>
+      </w:rPr>
+    </w:lvl>
+    <w:lvl w:ilvl="8" w:tplc="040C0005" w:tentative="1">
+      <w:start w:val="1"/>
+      <w:numFmt w:val="bullet"/>
+      <w:lvlText w:val=""/>
+      <w:lvlJc w:val="left"/>
+      <w:pPr>
+        <w:ind w:left="6840" w:hanging="360"/>
+      </w:pPr>
+      <w:rPr>
+        <w:rFonts w:ascii="Wingdings" w:hAnsi="Wingdings" w:hint="default"/>
+      </w:rPr>
+    </w:lvl>
+  </w:abstractNum>
+  <w:abstractNum w:abstractNumId="4" w15:restartNumberingAfterBreak="0">
     <w:nsid w:val="52344C8A"/>
     <w:multiLevelType w:val="hybridMultilevel"/>
     <w:tmpl w:val="159A3A58"/>
@@ -3131,7 +4229,7 @@
       </w:rPr>
     </w:lvl>
   </w:abstractNum>
-  <w:abstractNum w:abstractNumId="2" w15:restartNumberingAfterBreak="0">
+  <w:abstractNum w:abstractNumId="5" w15:restartNumberingAfterBreak="0">
     <w:nsid w:val="5D3211AD"/>
     <w:multiLevelType w:val="hybridMultilevel"/>
     <w:tmpl w:val="8DBABEC8"/>
@@ -3217,7 +4315,7 @@
       </w:pPr>
     </w:lvl>
   </w:abstractNum>
-  <w:abstractNum w:abstractNumId="3" w15:restartNumberingAfterBreak="0">
+  <w:abstractNum w:abstractNumId="6" w15:restartNumberingAfterBreak="0">
     <w:nsid w:val="6C944ACB"/>
     <w:multiLevelType w:val="hybridMultilevel"/>
     <w:tmpl w:val="3E026470"/>
@@ -3303,7 +4401,7 @@
       </w:pPr>
     </w:lvl>
   </w:abstractNum>
-  <w:abstractNum w:abstractNumId="4" w15:restartNumberingAfterBreak="0">
+  <w:abstractNum w:abstractNumId="7" w15:restartNumberingAfterBreak="0">
     <w:nsid w:val="73583B76"/>
     <w:multiLevelType w:val="hybridMultilevel"/>
     <w:tmpl w:val="783C0D26"/>
@@ -3395,10 +4493,10 @@
       </w:pPr>
     </w:lvl>
   </w:abstractNum>
-  <w:abstractNum w:abstractNumId="5" w15:restartNumberingAfterBreak="0">
+  <w:abstractNum w:abstractNumId="8" w15:restartNumberingAfterBreak="0">
     <w:nsid w:val="73BE1235"/>
     <w:multiLevelType w:val="hybridMultilevel"/>
-    <w:tmpl w:val="734231E2"/>
+    <w:tmpl w:val="708ADF02"/>
     <w:lvl w:ilvl="0" w:tplc="040C0009">
       <w:start w:val="1"/>
       <w:numFmt w:val="bullet"/>
@@ -3508,10 +4606,10 @@
       </w:rPr>
     </w:lvl>
   </w:abstractNum>
-  <w:abstractNum w:abstractNumId="6" w15:restartNumberingAfterBreak="0">
+  <w:abstractNum w:abstractNumId="9" w15:restartNumberingAfterBreak="0">
     <w:nsid w:val="7D1021B1"/>
     <w:multiLevelType w:val="hybridMultilevel"/>
-    <w:tmpl w:val="D43A7524"/>
+    <w:tmpl w:val="B7B664D6"/>
     <w:lvl w:ilvl="0" w:tplc="286E57D4">
       <w:numFmt w:val="bullet"/>
       <w:lvlText w:val="-"/>
@@ -3621,25 +4719,34 @@
     </w:lvl>
   </w:abstractNum>
   <w:num w:numId="1" w16cid:durableId="841430555">
-    <w:abstractNumId w:val="5"/>
+    <w:abstractNumId w:val="8"/>
   </w:num>
   <w:num w:numId="2" w16cid:durableId="1977026907">
+    <w:abstractNumId w:val="9"/>
+  </w:num>
+  <w:num w:numId="3" w16cid:durableId="311643469">
+    <w:abstractNumId w:val="4"/>
+  </w:num>
+  <w:num w:numId="4" w16cid:durableId="687371080">
     <w:abstractNumId w:val="6"/>
   </w:num>
-  <w:num w:numId="3" w16cid:durableId="311643469">
-    <w:abstractNumId w:val="1"/>
-  </w:num>
-  <w:num w:numId="4" w16cid:durableId="687371080">
-    <w:abstractNumId w:val="3"/>
-  </w:num>
   <w:num w:numId="5" w16cid:durableId="423110556">
-    <w:abstractNumId w:val="4"/>
+    <w:abstractNumId w:val="7"/>
   </w:num>
   <w:num w:numId="6" w16cid:durableId="92433831">
-    <w:abstractNumId w:val="2"/>
+    <w:abstractNumId w:val="5"/>
   </w:num>
   <w:num w:numId="7" w16cid:durableId="1604923155">
     <w:abstractNumId w:val="0"/>
+  </w:num>
+  <w:num w:numId="8" w16cid:durableId="1075855144">
+    <w:abstractNumId w:val="1"/>
+  </w:num>
+  <w:num w:numId="9" w16cid:durableId="22638674">
+    <w:abstractNumId w:val="3"/>
+  </w:num>
+  <w:num w:numId="10" w16cid:durableId="296423199">
+    <w:abstractNumId w:val="2"/>
   </w:num>
 </w:numbering>
 </file>

</xml_diff>

<commit_message>
Partie 3: Prompt Engineering et raisonnement: Test de l'auto-évaluation après analyse
</commit_message>
<xml_diff>
--- a/ai-business_assistant/correction_atelier_prompt-engineering.docx
+++ b/ai-business_assistant/correction_atelier_prompt-engineering.docx
@@ -87,23 +87,13 @@
         </w:rPr>
         <w:t xml:space="preserve"> </w:t>
       </w:r>
-      <w:proofErr w:type="spellStart"/>
-      <w:r>
-        <w:rPr>
-          <w:rFonts w:ascii="Times New Roman" w:hAnsi="Times New Roman" w:cs="Times New Roman"/>
-          <w:sz w:val="24"/>
-          <w:szCs w:val="24"/>
-        </w:rPr>
-        <w:t>learning</w:t>
-      </w:r>
-      <w:proofErr w:type="spellEnd"/>
-      <w:r>
-        <w:rPr>
-          <w:rFonts w:ascii="Times New Roman" w:hAnsi="Times New Roman" w:cs="Times New Roman"/>
-          <w:sz w:val="24"/>
-          <w:szCs w:val="24"/>
-        </w:rPr>
-        <w:t xml:space="preserve"> et produire des résultats structurés.</w:t>
+      <w:r>
+        <w:rPr>
+          <w:rFonts w:ascii="Times New Roman" w:hAnsi="Times New Roman" w:cs="Times New Roman"/>
+          <w:sz w:val="24"/>
+          <w:szCs w:val="24"/>
+        </w:rPr>
+        <w:t>learning et produire des résultats structurés.</w:t>
       </w:r>
     </w:p>
     <w:p>
@@ -1050,20 +1040,8 @@
           <w:sz w:val="28"/>
           <w:szCs w:val="28"/>
         </w:rPr>
-        <w:t xml:space="preserve">Partie 2 - Comparer les techniques de </w:t>
-      </w:r>
-      <w:proofErr w:type="spellStart"/>
-      <w:r>
-        <w:rPr>
-          <w:rFonts w:ascii="Times New Roman" w:hAnsi="Times New Roman" w:cs="Times New Roman"/>
-          <w:b/>
-          <w:bCs/>
-          <w:sz w:val="28"/>
-          <w:szCs w:val="28"/>
-        </w:rPr>
-        <w:t>prompting</w:t>
-      </w:r>
-      <w:proofErr w:type="spellEnd"/>
+        <w:t>Partie 2 - Comparer les techniques de prompting</w:t>
+      </w:r>
       <w:r>
         <w:rPr>
           <w:rFonts w:ascii="Times New Roman" w:hAnsi="Times New Roman" w:cs="Times New Roman"/>
@@ -1089,25 +1067,7 @@
           <w:sz w:val="24"/>
           <w:szCs w:val="24"/>
         </w:rPr>
-        <w:t xml:space="preserve">Tester puis évaluer les résultats obtenus avec les techniques </w:t>
-      </w:r>
-      <w:proofErr w:type="spellStart"/>
-      <w:r>
-        <w:rPr>
-          <w:rFonts w:ascii="Times New Roman" w:hAnsi="Times New Roman" w:cs="Times New Roman"/>
-          <w:sz w:val="24"/>
-          <w:szCs w:val="24"/>
-        </w:rPr>
-        <w:t>zero</w:t>
-      </w:r>
-      <w:proofErr w:type="spellEnd"/>
-      <w:r>
-        <w:rPr>
-          <w:rFonts w:ascii="Times New Roman" w:hAnsi="Times New Roman" w:cs="Times New Roman"/>
-          <w:sz w:val="24"/>
-          <w:szCs w:val="24"/>
-        </w:rPr>
-        <w:t>-shot, one-shot, few-shot et un prompt structuré sur une demande du genre : « Classer le commentaire suivant : "Le service est rapide mais l'application plante régulièrement." Classes possibles : positif, négatif, neutre. »</w:t>
+        <w:t>Tester puis évaluer les résultats obtenus avec les techniques zero-shot, one-shot, few-shot et un prompt structuré sur une demande du genre : « Classer le commentaire suivant : "Le service est rapide mais l'application plante régulièrement." Classes possibles : positif, négatif, neutre. »</w:t>
       </w:r>
     </w:p>
     <w:p>
@@ -1647,25 +1607,7 @@
           <w:sz w:val="24"/>
           <w:szCs w:val="24"/>
         </w:rPr>
-        <w:t xml:space="preserve">Commentaire : "Le produit est arrivé </w:t>
-      </w:r>
-      <w:proofErr w:type="gramStart"/>
-      <w:r>
-        <w:rPr>
-          <w:rFonts w:ascii="Times New Roman" w:hAnsi="Times New Roman" w:cs="Times New Roman"/>
-          <w:sz w:val="24"/>
-          <w:szCs w:val="24"/>
-        </w:rPr>
-        <w:t>cassé</w:t>
-      </w:r>
-      <w:proofErr w:type="gramEnd"/>
-      <w:r>
-        <w:rPr>
-          <w:rFonts w:ascii="Times New Roman" w:hAnsi="Times New Roman" w:cs="Times New Roman"/>
-          <w:sz w:val="24"/>
-          <w:szCs w:val="24"/>
-        </w:rPr>
-        <w:t>, très déçu."</w:t>
+        <w:t>Commentaire : "Le produit est arrivé cassé, très déçu."</w:t>
       </w:r>
     </w:p>
     <w:p>
@@ -1983,29 +1925,7 @@
           <w:sz w:val="24"/>
           <w:szCs w:val="24"/>
         </w:rPr>
-        <w:t xml:space="preserve">Test de la technique du </w:t>
-      </w:r>
-      <w:proofErr w:type="spellStart"/>
-      <w:r>
-        <w:rPr>
-          <w:rFonts w:ascii="Times New Roman" w:hAnsi="Times New Roman" w:cs="Times New Roman"/>
-          <w:b/>
-          <w:bCs/>
-          <w:sz w:val="24"/>
-          <w:szCs w:val="24"/>
-        </w:rPr>
-        <w:t>structured</w:t>
-      </w:r>
-      <w:proofErr w:type="spellEnd"/>
-      <w:r>
-        <w:rPr>
-          <w:rFonts w:ascii="Times New Roman" w:hAnsi="Times New Roman" w:cs="Times New Roman"/>
-          <w:b/>
-          <w:bCs/>
-          <w:sz w:val="24"/>
-          <w:szCs w:val="24"/>
-        </w:rPr>
-        <w:t xml:space="preserve"> prompt</w:t>
+        <w:t>Test de la technique du structured prompt</w:t>
       </w:r>
     </w:p>
     <w:p>
@@ -2524,36 +2444,8 @@
           <w:sz w:val="24"/>
           <w:szCs w:val="24"/>
         </w:rPr>
-        <w:t xml:space="preserve"> et il nous permet de tester directement les capacités du LLM utilisé car les réponses qu’il nous fournit ne sont basés que sur ses connaissances lors de l’entrainement. Elle permet aussi de d’économiser des </w:t>
-      </w:r>
-      <w:proofErr w:type="spellStart"/>
-      <w:r>
-        <w:rPr>
-          <w:rFonts w:ascii="Times New Roman" w:hAnsi="Times New Roman" w:cs="Times New Roman"/>
-          <w:sz w:val="24"/>
-          <w:szCs w:val="24"/>
-        </w:rPr>
-        <w:t>tokens</w:t>
-      </w:r>
-      <w:proofErr w:type="spellEnd"/>
-      <w:r>
-        <w:rPr>
-          <w:rFonts w:ascii="Times New Roman" w:hAnsi="Times New Roman" w:cs="Times New Roman"/>
-          <w:sz w:val="24"/>
-          <w:szCs w:val="24"/>
-        </w:rPr>
-        <w:t xml:space="preserve"> mais elle présente l’inconvénient de fournir des réponses approximatives car ne disposant pas d’exemples pour régler le problème qui lui a été soumis. Ainsi, nous n’avons aucun contrôle sur le format de réponses. Le one shot à la différence permet de cadrer le format de réponse car il permet d’inclure un exemple dans le prompt mais avec moins d’efforts sur l’ambiguïté et la prise en compte des nuances voulante être relevé. La technique du few-shot vient régler ce problème car il permet de soumettre des exemples bien choisies au modèle. Il prend cependant plus de temps à préparer, nécessite plus de </w:t>
-      </w:r>
-      <w:proofErr w:type="spellStart"/>
-      <w:r>
-        <w:rPr>
-          <w:rFonts w:ascii="Times New Roman" w:hAnsi="Times New Roman" w:cs="Times New Roman"/>
-          <w:sz w:val="24"/>
-          <w:szCs w:val="24"/>
-        </w:rPr>
-        <w:t>tokens</w:t>
-      </w:r>
-      <w:proofErr w:type="spellEnd"/>
+        <w:t xml:space="preserve"> et il nous permet de tester directement les capacités du LLM utilisé car les réponses qu’il nous fournit ne sont basés que sur ses connaissances lors de l’entrainement. Elle permet aussi de d’économiser des tokens mais elle présente l’inconvénient de fournir des réponses approximatives car ne disposant pas d’exemples pour régler le problème qui lui a été soumis. Ainsi, nous n’avons aucun contrôle sur le format de réponses. Le one shot à la différence permet de cadrer le format de réponse car il permet d’inclure un exemple dans le prompt mais avec moins d’efforts sur l’ambiguïté et la prise en compte des nuances voulante être relevé. La technique du few-shot vient régler ce problème car il permet de soumettre des exemples bien choisies au modèle. Il prend cependant plus de temps à préparer, nécessite plus de tokens</w:t>
+      </w:r>
     </w:p>
     <w:p>
       <w:pPr>
@@ -2579,25 +2471,7 @@
           <w:sz w:val="24"/>
           <w:szCs w:val="24"/>
         </w:rPr>
-        <w:t xml:space="preserve">la technique du </w:t>
-      </w:r>
-      <w:proofErr w:type="spellStart"/>
-      <w:r>
-        <w:rPr>
-          <w:rFonts w:ascii="Times New Roman" w:hAnsi="Times New Roman" w:cs="Times New Roman"/>
-          <w:sz w:val="24"/>
-          <w:szCs w:val="24"/>
-        </w:rPr>
-        <w:t>structured</w:t>
-      </w:r>
-      <w:proofErr w:type="spellEnd"/>
-      <w:r>
-        <w:rPr>
-          <w:rFonts w:ascii="Times New Roman" w:hAnsi="Times New Roman" w:cs="Times New Roman"/>
-          <w:sz w:val="24"/>
-          <w:szCs w:val="24"/>
-        </w:rPr>
-        <w:t>-prompt apporte l’avantage de préciser clairement la logique de raisonnement et peut être réutilisé. Il est plus facile à ajuster en cas d’itération requise pour affiner les réponses du LLM.</w:t>
+        <w:t>la technique du structured-prompt apporte l’avantage de préciser clairement la logique de raisonnement et peut être réutilisé. Il est plus facile à ajuster en cas d’itération requise pour affiner les réponses du LLM.</w:t>
       </w:r>
     </w:p>
     <w:p>
@@ -2936,7 +2810,6 @@
           <w:szCs w:val="24"/>
         </w:rPr>
       </w:pPr>
-      <w:proofErr w:type="gramStart"/>
       <w:r>
         <w:rPr>
           <w:rFonts w:ascii="Times New Roman" w:hAnsi="Times New Roman" w:cs="Times New Roman"/>
@@ -2947,7 +2820,6 @@
         </w:rPr>
         <w:t>Prompt analyse</w:t>
       </w:r>
-      <w:proofErr w:type="gramEnd"/>
     </w:p>
     <w:p>
       <w:pPr>
@@ -3304,7 +3176,6 @@
         </w:rPr>
         <w:t xml:space="preserve">3. Identifie les thèmes les plus fréquents ou </w:t>
       </w:r>
-      <w:proofErr w:type="spellStart"/>
       <w:r>
         <w:rPr>
           <w:rFonts w:ascii="Times New Roman" w:hAnsi="Times New Roman" w:cs="Times New Roman"/>
@@ -3321,7 +3192,6 @@
         </w:rPr>
         <w:t>s</w:t>
       </w:r>
-      <w:proofErr w:type="spellEnd"/>
       <w:r>
         <w:rPr>
           <w:rFonts w:ascii="Times New Roman" w:hAnsi="Times New Roman" w:cs="Times New Roman"/>
@@ -3624,6 +3494,330 @@
     </w:p>
     <w:p>
       <w:pPr>
+        <w:pStyle w:val="Paragraphedeliste"/>
+        <w:numPr>
+          <w:ilvl w:val="0"/>
+          <w:numId w:val="10"/>
+        </w:numPr>
+        <w:spacing w:line="360" w:lineRule="auto"/>
+        <w:jc w:val="center"/>
+        <w:rPr>
+          <w:rFonts w:ascii="Times New Roman" w:hAnsi="Times New Roman" w:cs="Times New Roman"/>
+          <w:b/>
+          <w:bCs/>
+          <w:sz w:val="24"/>
+          <w:szCs w:val="24"/>
+        </w:rPr>
+      </w:pPr>
+      <w:r>
+        <w:rPr>
+          <w:rFonts w:ascii="Times New Roman" w:hAnsi="Times New Roman" w:cs="Times New Roman"/>
+          <w:b/>
+          <w:bCs/>
+          <w:sz w:val="24"/>
+          <w:szCs w:val="24"/>
+        </w:rPr>
+        <w:t>Second prompt (auto-vérification)</w:t>
+      </w:r>
+    </w:p>
+    <w:p>
+      <w:pPr>
+        <w:spacing w:line="360" w:lineRule="auto"/>
+        <w:ind w:left="360"/>
+        <w:jc w:val="both"/>
+        <w:rPr>
+          <w:rFonts w:ascii="Times New Roman" w:hAnsi="Times New Roman" w:cs="Times New Roman"/>
+          <w:sz w:val="24"/>
+          <w:szCs w:val="24"/>
+        </w:rPr>
+      </w:pPr>
+      <w:r>
+        <w:rPr>
+          <w:rFonts w:ascii="Times New Roman" w:hAnsi="Times New Roman" w:cs="Times New Roman"/>
+          <w:sz w:val="24"/>
+          <w:szCs w:val="24"/>
+        </w:rPr>
+        <w:t>Relis attentivement ta réponse précédente et vérifie-la selon les critères suivants :</w:t>
+      </w:r>
+    </w:p>
+    <w:p>
+      <w:pPr>
+        <w:spacing w:line="360" w:lineRule="auto"/>
+        <w:ind w:left="360"/>
+        <w:jc w:val="both"/>
+        <w:rPr>
+          <w:rFonts w:ascii="Times New Roman" w:hAnsi="Times New Roman" w:cs="Times New Roman"/>
+          <w:sz w:val="24"/>
+          <w:szCs w:val="24"/>
+        </w:rPr>
+      </w:pPr>
+      <w:r>
+        <w:rPr>
+          <w:rFonts w:ascii="Times New Roman" w:hAnsi="Times New Roman" w:cs="Times New Roman"/>
+          <w:sz w:val="24"/>
+          <w:szCs w:val="24"/>
+        </w:rPr>
+        <w:t>1. Informations non justifiées : chaque problème mentionné est-il bien appuyé par au moins un avis cité explicitement parmi les 5 fournis ?</w:t>
+      </w:r>
+    </w:p>
+    <w:p>
+      <w:pPr>
+        <w:spacing w:line="360" w:lineRule="auto"/>
+        <w:ind w:left="360"/>
+        <w:jc w:val="both"/>
+        <w:rPr>
+          <w:rFonts w:ascii="Times New Roman" w:hAnsi="Times New Roman" w:cs="Times New Roman"/>
+          <w:sz w:val="24"/>
+          <w:szCs w:val="24"/>
+        </w:rPr>
+      </w:pPr>
+      <w:r>
+        <w:rPr>
+          <w:rFonts w:ascii="Times New Roman" w:hAnsi="Times New Roman" w:cs="Times New Roman"/>
+          <w:sz w:val="24"/>
+          <w:szCs w:val="24"/>
+        </w:rPr>
+        <w:t>2. Contradictions : y a-t-il des incohérences entre les différentes parties de ta réponse (par exemple, un problème identifié qui contredit un autre) ?</w:t>
+      </w:r>
+    </w:p>
+    <w:p>
+      <w:pPr>
+        <w:spacing w:line="360" w:lineRule="auto"/>
+        <w:ind w:left="360"/>
+        <w:jc w:val="both"/>
+        <w:rPr>
+          <w:rFonts w:ascii="Times New Roman" w:hAnsi="Times New Roman" w:cs="Times New Roman"/>
+          <w:sz w:val="24"/>
+          <w:szCs w:val="24"/>
+        </w:rPr>
+      </w:pPr>
+      <w:r>
+        <w:rPr>
+          <w:rFonts w:ascii="Times New Roman" w:hAnsi="Times New Roman" w:cs="Times New Roman"/>
+          <w:sz w:val="24"/>
+          <w:szCs w:val="24"/>
+        </w:rPr>
+        <w:t>3. Informations absentes : y a-t-il des éléments importants mentionnés dans les avis que tu n'as pas pris en compte dans ton analyse ?</w:t>
+      </w:r>
+    </w:p>
+    <w:p>
+      <w:pPr>
+        <w:spacing w:line="360" w:lineRule="auto"/>
+        <w:ind w:left="360"/>
+        <w:jc w:val="both"/>
+        <w:rPr>
+          <w:rFonts w:ascii="Times New Roman" w:hAnsi="Times New Roman" w:cs="Times New Roman"/>
+          <w:sz w:val="24"/>
+          <w:szCs w:val="24"/>
+        </w:rPr>
+      </w:pPr>
+      <w:r>
+        <w:rPr>
+          <w:rFonts w:ascii="Times New Roman" w:hAnsi="Times New Roman" w:cs="Times New Roman"/>
+          <w:sz w:val="24"/>
+          <w:szCs w:val="24"/>
+        </w:rPr>
+        <w:t>4. Hallucinations : as-tu mentionné un fait, un chiffre ou un détail qui n'apparaît dans aucun des 5 avis fournis ?</w:t>
+      </w:r>
+    </w:p>
+    <w:p>
+      <w:pPr>
+        <w:spacing w:line="360" w:lineRule="auto"/>
+        <w:ind w:left="360"/>
+        <w:jc w:val="both"/>
+        <w:rPr>
+          <w:rFonts w:ascii="Times New Roman" w:hAnsi="Times New Roman" w:cs="Times New Roman"/>
+          <w:sz w:val="24"/>
+          <w:szCs w:val="24"/>
+        </w:rPr>
+      </w:pPr>
+      <w:r>
+        <w:rPr>
+          <w:rFonts w:ascii="Times New Roman" w:hAnsi="Times New Roman" w:cs="Times New Roman"/>
+          <w:sz w:val="24"/>
+          <w:szCs w:val="24"/>
+        </w:rPr>
+        <w:t>5. Respect des contraintes : as-tu bien respecté la consigne de ne te baser que sur les avis fournis, sans ajouter d'hypothèse extérieure ?</w:t>
+      </w:r>
+    </w:p>
+    <w:p>
+      <w:pPr>
+        <w:spacing w:line="360" w:lineRule="auto"/>
+        <w:ind w:left="360"/>
+        <w:jc w:val="both"/>
+        <w:rPr>
+          <w:rFonts w:ascii="Times New Roman" w:hAnsi="Times New Roman" w:cs="Times New Roman"/>
+          <w:sz w:val="24"/>
+          <w:szCs w:val="24"/>
+        </w:rPr>
+      </w:pPr>
+      <w:r>
+        <w:rPr>
+          <w:rFonts w:ascii="Times New Roman" w:hAnsi="Times New Roman" w:cs="Times New Roman"/>
+          <w:sz w:val="24"/>
+          <w:szCs w:val="24"/>
+        </w:rPr>
+        <w:t>Pour chaque point, réponds explicitement par "Conforme" ou "Non conforme", avec une brève justification. Si tu identifies un problème, corrige ta réponse initiale en conséquence.</w:t>
+      </w:r>
+    </w:p>
+    <w:p>
+      <w:pPr>
+        <w:spacing w:line="360" w:lineRule="auto"/>
+        <w:ind w:left="360"/>
+        <w:jc w:val="both"/>
+        <w:rPr>
+          <w:rFonts w:ascii="Times New Roman" w:hAnsi="Times New Roman" w:cs="Times New Roman"/>
+          <w:sz w:val="24"/>
+          <w:szCs w:val="24"/>
+        </w:rPr>
+      </w:pPr>
+      <w:r>
+        <w:rPr>
+          <w:rFonts w:ascii="Times New Roman" w:hAnsi="Times New Roman" w:cs="Times New Roman"/>
+          <w:sz w:val="24"/>
+          <w:szCs w:val="24"/>
+        </w:rPr>
+        <w:drawing>
+          <wp:inline distT="0" distB="0" distL="0" distR="0" wp14:anchorId="524D7858" wp14:editId="7CFF999D">
+            <wp:extent cx="5760720" cy="3780790"/>
+            <wp:effectExtent l="0" t="0" r="0" b="0"/>
+            <wp:docPr id="457465121" name="Image 1"/>
+            <wp:cNvGraphicFramePr>
+              <a:graphicFrameLocks xmlns:a="http://schemas.openxmlformats.org/drawingml/2006/main" noChangeAspect="1"/>
+            </wp:cNvGraphicFramePr>
+            <a:graphic xmlns:a="http://schemas.openxmlformats.org/drawingml/2006/main">
+              <a:graphicData uri="http://schemas.openxmlformats.org/drawingml/2006/picture">
+                <pic:pic xmlns:pic="http://schemas.openxmlformats.org/drawingml/2006/picture">
+                  <pic:nvPicPr>
+                    <pic:cNvPr id="457465121" name=""/>
+                    <pic:cNvPicPr/>
+                  </pic:nvPicPr>
+                  <pic:blipFill>
+                    <a:blip r:embed="rId12"/>
+                    <a:stretch>
+                      <a:fillRect/>
+                    </a:stretch>
+                  </pic:blipFill>
+                  <pic:spPr>
+                    <a:xfrm>
+                      <a:off x="0" y="0"/>
+                      <a:ext cx="5760720" cy="3780790"/>
+                    </a:xfrm>
+                    <a:prstGeom prst="rect">
+                      <a:avLst/>
+                    </a:prstGeom>
+                  </pic:spPr>
+                </pic:pic>
+              </a:graphicData>
+            </a:graphic>
+          </wp:inline>
+        </w:drawing>
+      </w:r>
+    </w:p>
+    <w:p>
+      <w:pPr>
+        <w:spacing w:line="360" w:lineRule="auto"/>
+        <w:ind w:left="360"/>
+        <w:jc w:val="both"/>
+        <w:rPr>
+          <w:rFonts w:ascii="Times New Roman" w:hAnsi="Times New Roman" w:cs="Times New Roman"/>
+          <w:sz w:val="24"/>
+          <w:szCs w:val="24"/>
+        </w:rPr>
+      </w:pPr>
+      <w:r>
+        <w:rPr>
+          <w:rFonts w:ascii="Times New Roman" w:hAnsi="Times New Roman" w:cs="Times New Roman"/>
+          <w:sz w:val="24"/>
+          <w:szCs w:val="24"/>
+        </w:rPr>
+        <w:drawing>
+          <wp:inline distT="0" distB="0" distL="0" distR="0" wp14:anchorId="2B5C3D32" wp14:editId="2A42548B">
+            <wp:extent cx="5760720" cy="5534025"/>
+            <wp:effectExtent l="0" t="0" r="0" b="9525"/>
+            <wp:docPr id="1785235016" name="Image 1"/>
+            <wp:cNvGraphicFramePr>
+              <a:graphicFrameLocks xmlns:a="http://schemas.openxmlformats.org/drawingml/2006/main" noChangeAspect="1"/>
+            </wp:cNvGraphicFramePr>
+            <a:graphic xmlns:a="http://schemas.openxmlformats.org/drawingml/2006/main">
+              <a:graphicData uri="http://schemas.openxmlformats.org/drawingml/2006/picture">
+                <pic:pic xmlns:pic="http://schemas.openxmlformats.org/drawingml/2006/picture">
+                  <pic:nvPicPr>
+                    <pic:cNvPr id="1785235016" name=""/>
+                    <pic:cNvPicPr/>
+                  </pic:nvPicPr>
+                  <pic:blipFill>
+                    <a:blip r:embed="rId13"/>
+                    <a:stretch>
+                      <a:fillRect/>
+                    </a:stretch>
+                  </pic:blipFill>
+                  <pic:spPr>
+                    <a:xfrm>
+                      <a:off x="0" y="0"/>
+                      <a:ext cx="5760720" cy="5534025"/>
+                    </a:xfrm>
+                    <a:prstGeom prst="rect">
+                      <a:avLst/>
+                    </a:prstGeom>
+                  </pic:spPr>
+                </pic:pic>
+              </a:graphicData>
+            </a:graphic>
+          </wp:inline>
+        </w:drawing>
+      </w:r>
+    </w:p>
+    <w:p>
+      <w:pPr>
+        <w:spacing w:line="360" w:lineRule="auto"/>
+        <w:rPr>
+          <w:rFonts w:ascii="Times New Roman" w:hAnsi="Times New Roman" w:cs="Times New Roman"/>
+          <w:b/>
+          <w:bCs/>
+          <w:sz w:val="28"/>
+          <w:szCs w:val="28"/>
+        </w:rPr>
+      </w:pPr>
+    </w:p>
+    <w:p>
+      <w:pPr>
+        <w:spacing w:line="360" w:lineRule="auto"/>
+        <w:jc w:val="both"/>
+        <w:rPr>
+          <w:rFonts w:ascii="Times New Roman" w:hAnsi="Times New Roman" w:cs="Times New Roman"/>
+          <w:sz w:val="24"/>
+          <w:szCs w:val="24"/>
+        </w:rPr>
+      </w:pPr>
+    </w:p>
+    <w:p>
+      <w:pPr>
+        <w:spacing w:line="360" w:lineRule="auto"/>
+        <w:jc w:val="both"/>
+        <w:rPr>
+          <w:rFonts w:ascii="Times New Roman" w:hAnsi="Times New Roman" w:cs="Times New Roman"/>
+          <w:sz w:val="24"/>
+          <w:szCs w:val="24"/>
+        </w:rPr>
+      </w:pPr>
+    </w:p>
+    <w:p>
+      <w:pPr>
+        <w:spacing w:line="360" w:lineRule="auto"/>
+        <w:ind w:left="360"/>
+        <w:jc w:val="center"/>
+        <w:rPr>
+          <w:rFonts w:ascii="Times New Roman" w:hAnsi="Times New Roman" w:cs="Times New Roman"/>
+          <w:b/>
+          <w:bCs/>
+          <w:sz w:val="24"/>
+          <w:szCs w:val="24"/>
+        </w:rPr>
+      </w:pPr>
+    </w:p>
+    <w:p>
+      <w:pPr>
         <w:spacing w:line="360" w:lineRule="auto"/>
         <w:ind w:left="360"/>
         <w:rPr>
@@ -3658,7 +3852,7 @@
                     <pic:cNvPicPr/>
                   </pic:nvPicPr>
                   <pic:blipFill>
-                    <a:blip r:embed="rId12"/>
+                    <a:blip r:embed="rId14"/>
                     <a:stretch>
                       <a:fillRect/>
                     </a:stretch>

</xml_diff>

<commit_message>
Partie 4 – Sorties structurées: Sortie au format JSON
</commit_message>
<xml_diff>
--- a/ai-business_assistant/correction_atelier_prompt-engineering.docx
+++ b/ai-business_assistant/correction_atelier_prompt-engineering.docx
@@ -1,6 +1,6 @@
 
 <file path=word/document.xml><?xml version="1.0" encoding="utf-8"?>
-<w:document xmlns:wpc="http://schemas.microsoft.com/office/word/2010/wordprocessingCanvas" xmlns:cx="http://schemas.microsoft.com/office/drawing/2014/chartex" xmlns:cx1="http://schemas.microsoft.com/office/drawing/2015/9/8/chartex" xmlns:cx2="http://schemas.microsoft.com/office/drawing/2015/10/21/chartex" xmlns:cx3="http://schemas.microsoft.com/office/drawing/2016/5/9/chartex" xmlns:cx4="http://schemas.microsoft.com/office/drawing/2016/5/10/chartex" xmlns:cx5="http://schemas.microsoft.com/office/drawing/2016/5/11/chartex" xmlns:cx6="http://schemas.microsoft.com/office/drawing/2016/5/12/chartex" xmlns:cx7="http://schemas.microsoft.com/office/drawing/2016/5/13/chartex" xmlns:cx8="http://schemas.microsoft.com/office/drawing/2016/5/14/chartex" xmlns:mc="http://schemas.openxmlformats.org/markup-compatibility/2006" xmlns:aink="http://schemas.microsoft.com/office/drawing/2016/ink" xmlns:am3d="http://schemas.microsoft.com/office/drawing/2017/model3d" xmlns:o="urn:schemas-microsoft-com:office:office" xmlns:oel="http://schemas.microsoft.com/office/2019/extlst" xmlns:r="http://schemas.openxmlformats.org/officeDocument/2006/relationships" xmlns:m="http://schemas.openxmlformats.org/officeDocument/2006/math" xmlns:v="urn:schemas-microsoft-com:vml" xmlns:wp14="http://schemas.microsoft.com/office/word/2010/wordprocessingDrawing" xmlns:wp="http://schemas.openxmlformats.org/drawingml/2006/wordprocessingDrawing" xmlns:w10="urn:schemas-microsoft-com:office:word" xmlns:w="http://schemas.openxmlformats.org/wordprocessingml/2006/main" xmlns:w14="http://schemas.microsoft.com/office/word/2010/wordml" xmlns:w15="http://schemas.microsoft.com/office/word/2012/wordml" xmlns:w16cex="http://schemas.microsoft.com/office/word/2018/wordml/cex" xmlns:w16cid="http://schemas.microsoft.com/office/word/2016/wordml/cid" xmlns:w16="http://schemas.microsoft.com/office/word/2018/wordml" xmlns:w16du="http://schemas.microsoft.com/office/word/2023/wordml/word16du" xmlns:w16sdtdh="http://schemas.microsoft.com/office/word/2020/wordml/sdtdatahash" xmlns:w16sdtfl="http://schemas.microsoft.com/office/word/2024/wordml/sdtformatlock" xmlns:w16se="http://schemas.microsoft.com/office/word/2015/wordml/symex" xmlns:wpg="http://schemas.microsoft.com/office/word/2010/wordprocessingGroup" xmlns:wpi="http://schemas.microsoft.com/office/word/2010/wordprocessingInk" xmlns:wne="http://schemas.microsoft.com/office/word/2006/wordml" xmlns:wps="http://schemas.microsoft.com/office/word/2010/wordprocessingShape" mc:Ignorable="w14 w15 w16se w16cid w16 w16cex w16sdtdh w16sdtfl w16du wp14">
+<w:document xmlns:wpc="http://schemas.microsoft.com/office/word/2010/wordprocessingCanvas" xmlns:mc="http://schemas.openxmlformats.org/markup-compatibility/2006" xmlns:o="urn:schemas-microsoft-com:office:office" xmlns:r="http://schemas.openxmlformats.org/officeDocument/2006/relationships" xmlns:m="http://schemas.openxmlformats.org/officeDocument/2006/math" xmlns:v="urn:schemas-microsoft-com:vml" xmlns:wp14="http://schemas.microsoft.com/office/word/2010/wordprocessingDrawing" xmlns:wp="http://schemas.openxmlformats.org/drawingml/2006/wordprocessingDrawing" xmlns:w10="urn:schemas-microsoft-com:office:word" xmlns:w="http://schemas.openxmlformats.org/wordprocessingml/2006/main" xmlns:w14="http://schemas.microsoft.com/office/word/2010/wordml" xmlns:w15="http://schemas.microsoft.com/office/word/2012/wordml" xmlns:wpg="http://schemas.microsoft.com/office/word/2010/wordprocessingGroup" xmlns:wpi="http://schemas.microsoft.com/office/word/2010/wordprocessingInk" xmlns:wne="http://schemas.microsoft.com/office/word/2006/wordml" xmlns:wps="http://schemas.microsoft.com/office/word/2010/wordprocessingShape" mc:Ignorable="w14 w15 wp14">
   <w:body>
     <w:p>
       <w:pPr>
@@ -149,17 +149,7 @@
           <w:sz w:val="28"/>
           <w:szCs w:val="28"/>
         </w:rPr>
-        <w:t>Partie 1 – Anatomie d'un prompt</w:t>
-      </w:r>
-      <w:r>
-        <w:rPr>
-          <w:rFonts w:ascii="Times New Roman" w:hAnsi="Times New Roman" w:cs="Times New Roman"/>
-          <w:b/>
-          <w:bCs/>
-          <w:sz w:val="28"/>
-          <w:szCs w:val="28"/>
-        </w:rPr>
-        <w:t> :</w:t>
+        <w:t>Partie 1 – Anatomie d'un prompt :</w:t>
       </w:r>
       <w:r>
         <w:rPr>
@@ -182,7 +172,7 @@
     </w:p>
     <w:p>
       <w:pPr>
-        <w:pStyle w:val="Paragraphedeliste"/>
+        <w:pStyle w:val="ListParagraph"/>
         <w:numPr>
           <w:ilvl w:val="0"/>
           <w:numId w:val="1"/>
@@ -225,13 +215,40 @@
           <w:sz w:val="24"/>
           <w:szCs w:val="24"/>
         </w:rPr>
-        <w:t>Rôle :</w:t>
-      </w:r>
-      <w:r>
-        <w:rPr>
-          <w:rFonts w:ascii="Times New Roman" w:hAnsi="Times New Roman" w:cs="Times New Roman"/>
-          <w:b/>
-          <w:bCs/>
+        <w:t xml:space="preserve">Rôle : </w:t>
+      </w:r>
+      <w:r>
+        <w:rPr>
+          <w:rFonts w:ascii="Times New Roman" w:hAnsi="Times New Roman" w:cs="Times New Roman"/>
+          <w:sz w:val="24"/>
+          <w:szCs w:val="24"/>
+        </w:rPr>
+        <w:t>Tu es un analyste spécialisé en satisfaction client, expérimenté dans l'analyse de feedback textuel.</w:t>
+      </w:r>
+    </w:p>
+    <w:p>
+      <w:pPr>
+        <w:spacing w:line="360" w:lineRule="auto"/>
+        <w:jc w:val="both"/>
+        <w:rPr>
+          <w:rFonts w:ascii="Times New Roman" w:hAnsi="Times New Roman" w:cs="Times New Roman"/>
+          <w:sz w:val="24"/>
+          <w:szCs w:val="24"/>
+        </w:rPr>
+      </w:pPr>
+      <w:r>
+        <w:rPr>
+          <w:rFonts w:ascii="Times New Roman" w:hAnsi="Times New Roman" w:cs="Times New Roman"/>
+          <w:b/>
+          <w:bCs/>
+          <w:sz w:val="24"/>
+          <w:szCs w:val="24"/>
+        </w:rPr>
+        <w:t>Contexte :</w:t>
+      </w:r>
+      <w:r>
+        <w:rPr>
+          <w:rFonts w:ascii="Times New Roman" w:hAnsi="Times New Roman" w:cs="Times New Roman"/>
           <w:sz w:val="24"/>
           <w:szCs w:val="24"/>
         </w:rPr>
@@ -243,28 +260,15 @@
           <w:sz w:val="24"/>
           <w:szCs w:val="24"/>
         </w:rPr>
-        <w:t>Tu es un analyste spécialisé en satisfaction client, expérimenté dans l'analyse de feedback textuel.</w:t>
-      </w:r>
-    </w:p>
-    <w:p>
-      <w:pPr>
-        <w:spacing w:line="360" w:lineRule="auto"/>
-        <w:jc w:val="both"/>
-        <w:rPr>
-          <w:rFonts w:ascii="Times New Roman" w:hAnsi="Times New Roman" w:cs="Times New Roman"/>
-          <w:sz w:val="24"/>
-          <w:szCs w:val="24"/>
-        </w:rPr>
-      </w:pPr>
-      <w:r>
-        <w:rPr>
-          <w:rFonts w:ascii="Times New Roman" w:hAnsi="Times New Roman" w:cs="Times New Roman"/>
-          <w:b/>
-          <w:bCs/>
-          <w:sz w:val="24"/>
-          <w:szCs w:val="24"/>
-        </w:rPr>
-        <w:t>Contexte :</w:t>
+        <w:t xml:space="preserve">L’entreprise évolue dans le secteur de la vente de produits du quotidien et reçoit des retours des clients sous forme de message textuels. </w:t>
+      </w:r>
+      <w:r>
+        <w:rPr>
+          <w:rFonts w:ascii="Times New Roman" w:hAnsi="Times New Roman" w:cs="Times New Roman"/>
+          <w:sz w:val="24"/>
+          <w:szCs w:val="24"/>
+        </w:rPr>
+        <w:t>Les avis sont rédigés en français, de longueur variable, et peuvent contenir des remarques positives, négatives ou mixtes.</w:t>
       </w:r>
       <w:r>
         <w:rPr>
@@ -280,19 +284,52 @@
           <w:sz w:val="24"/>
           <w:szCs w:val="24"/>
         </w:rPr>
-        <w:t xml:space="preserve">L’entreprise évolue dans le secteur de la vente de produits du quotidien et reçoit des retours des clients sous forme de message textuels. </w:t>
-      </w:r>
-      <w:r>
-        <w:rPr>
-          <w:rFonts w:ascii="Times New Roman" w:hAnsi="Times New Roman" w:cs="Times New Roman"/>
-          <w:sz w:val="24"/>
-          <w:szCs w:val="24"/>
-        </w:rPr>
-        <w:t>Les avis sont rédigés en français, de longueur variable, et peuvent contenir des remarques positives, négatives ou mixtes.</w:t>
-      </w:r>
-      <w:r>
-        <w:rPr>
-          <w:rFonts w:ascii="Times New Roman" w:hAnsi="Times New Roman" w:cs="Times New Roman"/>
+        <w:t xml:space="preserve">Voici une liste d'avis clients concernant </w:t>
+      </w:r>
+      <w:r>
+        <w:rPr>
+          <w:rFonts w:ascii="Times New Roman" w:hAnsi="Times New Roman" w:cs="Times New Roman"/>
+          <w:sz w:val="24"/>
+          <w:szCs w:val="24"/>
+        </w:rPr>
+        <w:t>la période récente</w:t>
+      </w:r>
+      <w:r>
+        <w:rPr>
+          <w:rFonts w:ascii="Times New Roman" w:hAnsi="Times New Roman" w:cs="Times New Roman"/>
+          <w:sz w:val="24"/>
+          <w:szCs w:val="24"/>
+        </w:rPr>
+        <w:t>.</w:t>
+      </w:r>
+    </w:p>
+    <w:p>
+      <w:pPr>
+        <w:spacing w:line="360" w:lineRule="auto"/>
+        <w:jc w:val="both"/>
+        <w:rPr>
+          <w:rFonts w:ascii="Times New Roman" w:hAnsi="Times New Roman" w:cs="Times New Roman"/>
+          <w:b/>
+          <w:bCs/>
+          <w:sz w:val="24"/>
+          <w:szCs w:val="24"/>
+        </w:rPr>
+      </w:pPr>
+      <w:r>
+        <w:rPr>
+          <w:rFonts w:ascii="Times New Roman" w:hAnsi="Times New Roman" w:cs="Times New Roman"/>
+          <w:b/>
+          <w:bCs/>
+          <w:sz w:val="24"/>
+          <w:szCs w:val="24"/>
+        </w:rPr>
+        <w:t>Avis 1 :</w:t>
+      </w:r>
+      <w:r>
+        <w:rPr>
+          <w:rFonts w:ascii="Times New Roman" w:hAnsi="Times New Roman" w:cs="Times New Roman"/>
+          <w:b/>
+          <w:bCs/>
           <w:sz w:val="24"/>
           <w:szCs w:val="24"/>
         </w:rPr>
@@ -304,46 +341,29 @@
           <w:sz w:val="24"/>
           <w:szCs w:val="24"/>
         </w:rPr>
-        <w:t xml:space="preserve">Voici une liste d'avis clients concernant </w:t>
-      </w:r>
-      <w:r>
-        <w:rPr>
-          <w:rFonts w:ascii="Times New Roman" w:hAnsi="Times New Roman" w:cs="Times New Roman"/>
-          <w:sz w:val="24"/>
-          <w:szCs w:val="24"/>
-        </w:rPr>
-        <w:t>la période récente</w:t>
-      </w:r>
-      <w:r>
-        <w:rPr>
-          <w:rFonts w:ascii="Times New Roman" w:hAnsi="Times New Roman" w:cs="Times New Roman"/>
-          <w:sz w:val="24"/>
-          <w:szCs w:val="24"/>
-        </w:rPr>
-        <w:t>.</w:t>
-      </w:r>
-    </w:p>
-    <w:p>
-      <w:pPr>
-        <w:spacing w:line="360" w:lineRule="auto"/>
-        <w:jc w:val="both"/>
-        <w:rPr>
-          <w:rFonts w:ascii="Times New Roman" w:hAnsi="Times New Roman" w:cs="Times New Roman"/>
-          <w:b/>
-          <w:bCs/>
-          <w:sz w:val="24"/>
-          <w:szCs w:val="24"/>
-        </w:rPr>
-      </w:pPr>
-      <w:r>
-        <w:rPr>
-          <w:rFonts w:ascii="Times New Roman" w:hAnsi="Times New Roman" w:cs="Times New Roman"/>
-          <w:b/>
-          <w:bCs/>
-          <w:sz w:val="24"/>
-          <w:szCs w:val="24"/>
-        </w:rPr>
-        <w:t>Avis 1 :</w:t>
+        <w:t>"Le produit est de très bonne qualité, exactement comme sur les photos. Par contre, la livraison a pris presque 10 jours alors que 3-5 jours étaient annoncés."</w:t>
+      </w:r>
+    </w:p>
+    <w:p>
+      <w:pPr>
+        <w:jc w:val="both"/>
+        <w:rPr>
+          <w:rFonts w:ascii="Times New Roman" w:hAnsi="Times New Roman" w:cs="Times New Roman"/>
+          <w:b/>
+          <w:bCs/>
+          <w:sz w:val="24"/>
+          <w:szCs w:val="24"/>
+        </w:rPr>
+      </w:pPr>
+      <w:r>
+        <w:rPr>
+          <w:rFonts w:ascii="Times New Roman" w:hAnsi="Times New Roman" w:cs="Times New Roman"/>
+          <w:b/>
+          <w:bCs/>
+          <w:sz w:val="24"/>
+          <w:szCs w:val="24"/>
+        </w:rPr>
+        <w:t>Avis 2 :</w:t>
       </w:r>
       <w:r>
         <w:rPr>
@@ -361,29 +381,48 @@
           <w:sz w:val="24"/>
           <w:szCs w:val="24"/>
         </w:rPr>
-        <w:t>"Le produit est de très bonne qualité, exactement comme sur les photos. Par contre, la livraison a pris presque 10 jours alors que 3-5 jours étaient annoncés."</w:t>
-      </w:r>
-    </w:p>
-    <w:p>
-      <w:pPr>
-        <w:jc w:val="both"/>
-        <w:rPr>
-          <w:rFonts w:ascii="Times New Roman" w:hAnsi="Times New Roman" w:cs="Times New Roman"/>
-          <w:b/>
-          <w:bCs/>
-          <w:sz w:val="24"/>
-          <w:szCs w:val="24"/>
-        </w:rPr>
-      </w:pPr>
-      <w:r>
-        <w:rPr>
-          <w:rFonts w:ascii="Times New Roman" w:hAnsi="Times New Roman" w:cs="Times New Roman"/>
-          <w:b/>
-          <w:bCs/>
-          <w:sz w:val="24"/>
-          <w:szCs w:val="24"/>
-        </w:rPr>
-        <w:t>Avis 2 :</w:t>
+        <w:t xml:space="preserve">"Service client injoignable, j'ai attendu 3 semaines pour une réponse à mon email. </w:t>
+      </w:r>
+    </w:p>
+    <w:p>
+      <w:pPr>
+        <w:jc w:val="both"/>
+        <w:rPr>
+          <w:rFonts w:ascii="Times New Roman" w:hAnsi="Times New Roman" w:cs="Times New Roman"/>
+          <w:sz w:val="24"/>
+          <w:szCs w:val="24"/>
+        </w:rPr>
+      </w:pPr>
+      <w:r>
+        <w:rPr>
+          <w:rFonts w:ascii="Times New Roman" w:hAnsi="Times New Roman" w:cs="Times New Roman"/>
+          <w:sz w:val="24"/>
+          <w:szCs w:val="24"/>
+        </w:rPr>
+        <w:t>Le produit en lui-même est correct mais cette expérience m'a beaucoup déçu."</w:t>
+      </w:r>
+    </w:p>
+    <w:p>
+      <w:pPr>
+        <w:spacing w:line="360" w:lineRule="auto"/>
+        <w:jc w:val="both"/>
+        <w:rPr>
+          <w:rFonts w:ascii="Times New Roman" w:hAnsi="Times New Roman" w:cs="Times New Roman"/>
+          <w:b/>
+          <w:bCs/>
+          <w:sz w:val="24"/>
+          <w:szCs w:val="24"/>
+        </w:rPr>
+      </w:pPr>
+      <w:r>
+        <w:rPr>
+          <w:rFonts w:ascii="Times New Roman" w:hAnsi="Times New Roman" w:cs="Times New Roman"/>
+          <w:b/>
+          <w:bCs/>
+          <w:sz w:val="24"/>
+          <w:szCs w:val="24"/>
+        </w:rPr>
+        <w:t>Avis 3 :</w:t>
       </w:r>
       <w:r>
         <w:rPr>
@@ -401,48 +440,30 @@
           <w:sz w:val="24"/>
           <w:szCs w:val="24"/>
         </w:rPr>
-        <w:t xml:space="preserve">"Service client injoignable, j'ai attendu 3 semaines pour une réponse à mon email. </w:t>
-      </w:r>
-    </w:p>
-    <w:p>
-      <w:pPr>
-        <w:jc w:val="both"/>
-        <w:rPr>
-          <w:rFonts w:ascii="Times New Roman" w:hAnsi="Times New Roman" w:cs="Times New Roman"/>
-          <w:sz w:val="24"/>
-          <w:szCs w:val="24"/>
-        </w:rPr>
-      </w:pPr>
-      <w:r>
-        <w:rPr>
-          <w:rFonts w:ascii="Times New Roman" w:hAnsi="Times New Roman" w:cs="Times New Roman"/>
-          <w:sz w:val="24"/>
-          <w:szCs w:val="24"/>
-        </w:rPr>
-        <w:t>Le produit en lui-même est correct mais cette expérience m'a beaucoup déçu."</w:t>
-      </w:r>
-    </w:p>
-    <w:p>
-      <w:pPr>
-        <w:spacing w:line="360" w:lineRule="auto"/>
-        <w:jc w:val="both"/>
-        <w:rPr>
-          <w:rFonts w:ascii="Times New Roman" w:hAnsi="Times New Roman" w:cs="Times New Roman"/>
-          <w:b/>
-          <w:bCs/>
-          <w:sz w:val="24"/>
-          <w:szCs w:val="24"/>
-        </w:rPr>
-      </w:pPr>
-      <w:r>
-        <w:rPr>
-          <w:rFonts w:ascii="Times New Roman" w:hAnsi="Times New Roman" w:cs="Times New Roman"/>
-          <w:b/>
-          <w:bCs/>
-          <w:sz w:val="24"/>
-          <w:szCs w:val="24"/>
-        </w:rPr>
-        <w:t>Avis 3 :</w:t>
+        <w:t>"Je suis très satisfait de mon achat ! Le rapport qualité-prix est excellent et la livraison est arrivée en avance. Je recommande vivement."</w:t>
+      </w:r>
+    </w:p>
+    <w:p>
+      <w:pPr>
+        <w:spacing w:line="360" w:lineRule="auto"/>
+        <w:jc w:val="both"/>
+        <w:rPr>
+          <w:rFonts w:ascii="Times New Roman" w:hAnsi="Times New Roman" w:cs="Times New Roman"/>
+          <w:b/>
+          <w:bCs/>
+          <w:sz w:val="24"/>
+          <w:szCs w:val="24"/>
+        </w:rPr>
+      </w:pPr>
+      <w:r>
+        <w:rPr>
+          <w:rFonts w:ascii="Times New Roman" w:hAnsi="Times New Roman" w:cs="Times New Roman"/>
+          <w:b/>
+          <w:bCs/>
+          <w:sz w:val="24"/>
+          <w:szCs w:val="24"/>
+        </w:rPr>
+        <w:t>Avis 4 :</w:t>
       </w:r>
       <w:r>
         <w:rPr>
@@ -460,36 +481,11 @@
           <w:sz w:val="24"/>
           <w:szCs w:val="24"/>
         </w:rPr>
-        <w:t>"Je suis très satisfait de mon achat ! Le rapport qualité-prix est excellent et la livraison est arrivée en avance. Je recommande vivement."</w:t>
-      </w:r>
-    </w:p>
-    <w:p>
-      <w:pPr>
-        <w:spacing w:line="360" w:lineRule="auto"/>
-        <w:jc w:val="both"/>
-        <w:rPr>
-          <w:rFonts w:ascii="Times New Roman" w:hAnsi="Times New Roman" w:cs="Times New Roman"/>
-          <w:b/>
-          <w:bCs/>
-          <w:sz w:val="24"/>
-          <w:szCs w:val="24"/>
-        </w:rPr>
-      </w:pPr>
-      <w:r>
-        <w:rPr>
-          <w:rFonts w:ascii="Times New Roman" w:hAnsi="Times New Roman" w:cs="Times New Roman"/>
-          <w:b/>
-          <w:bCs/>
-          <w:sz w:val="24"/>
-          <w:szCs w:val="24"/>
-        </w:rPr>
-        <w:t>Avis 4 :</w:t>
-      </w:r>
-      <w:r>
-        <w:rPr>
-          <w:rFonts w:ascii="Times New Roman" w:hAnsi="Times New Roman" w:cs="Times New Roman"/>
-          <w:b/>
-          <w:bCs/>
+        <w:t>"Le prix est trop élevé par rapport à la concurrence pour une qualité équivalente.</w:t>
+      </w:r>
+      <w:r>
+        <w:rPr>
+          <w:rFonts w:ascii="Times New Roman" w:hAnsi="Times New Roman" w:cs="Times New Roman"/>
           <w:sz w:val="24"/>
           <w:szCs w:val="24"/>
         </w:rPr>
@@ -501,11 +497,36 @@
           <w:sz w:val="24"/>
           <w:szCs w:val="24"/>
         </w:rPr>
-        <w:t>"Le prix est trop élevé par rapport à la concurrence pour une qualité équivalente.</w:t>
-      </w:r>
-      <w:r>
-        <w:rPr>
-          <w:rFonts w:ascii="Times New Roman" w:hAnsi="Times New Roman" w:cs="Times New Roman"/>
+        <w:t>L'emballage était aussi abîmé à la réception."</w:t>
+      </w:r>
+    </w:p>
+    <w:p>
+      <w:pPr>
+        <w:spacing w:line="360" w:lineRule="auto"/>
+        <w:jc w:val="both"/>
+        <w:rPr>
+          <w:rFonts w:ascii="Times New Roman" w:hAnsi="Times New Roman" w:cs="Times New Roman"/>
+          <w:b/>
+          <w:bCs/>
+          <w:sz w:val="24"/>
+          <w:szCs w:val="24"/>
+        </w:rPr>
+      </w:pPr>
+      <w:r>
+        <w:rPr>
+          <w:rFonts w:ascii="Times New Roman" w:hAnsi="Times New Roman" w:cs="Times New Roman"/>
+          <w:b/>
+          <w:bCs/>
+          <w:sz w:val="24"/>
+          <w:szCs w:val="24"/>
+        </w:rPr>
+        <w:t>Avis 5 :</w:t>
+      </w:r>
+      <w:r>
+        <w:rPr>
+          <w:rFonts w:ascii="Times New Roman" w:hAnsi="Times New Roman" w:cs="Times New Roman"/>
+          <w:b/>
+          <w:bCs/>
           <w:sz w:val="24"/>
           <w:szCs w:val="24"/>
         </w:rPr>
@@ -517,30 +538,29 @@
           <w:sz w:val="24"/>
           <w:szCs w:val="24"/>
         </w:rPr>
-        <w:t>L'emballage était aussi abîmé à la réception."</w:t>
-      </w:r>
-    </w:p>
-    <w:p>
-      <w:pPr>
-        <w:spacing w:line="360" w:lineRule="auto"/>
-        <w:jc w:val="both"/>
-        <w:rPr>
-          <w:rFonts w:ascii="Times New Roman" w:hAnsi="Times New Roman" w:cs="Times New Roman"/>
-          <w:b/>
-          <w:bCs/>
-          <w:sz w:val="24"/>
-          <w:szCs w:val="24"/>
-        </w:rPr>
-      </w:pPr>
-      <w:r>
-        <w:rPr>
-          <w:rFonts w:ascii="Times New Roman" w:hAnsi="Times New Roman" w:cs="Times New Roman"/>
-          <w:b/>
-          <w:bCs/>
-          <w:sz w:val="24"/>
-          <w:szCs w:val="24"/>
-        </w:rPr>
-        <w:t>Avis 5 :</w:t>
+        <w:t>"Application mobile pratique, commande simple à passer. Cependant, le produit reçu ne correspondait pas exactement à la couleur commandée."</w:t>
+      </w:r>
+    </w:p>
+    <w:p>
+      <w:pPr>
+        <w:jc w:val="both"/>
+        <w:rPr>
+          <w:rFonts w:ascii="Times New Roman" w:hAnsi="Times New Roman" w:cs="Times New Roman"/>
+          <w:b/>
+          <w:bCs/>
+          <w:sz w:val="24"/>
+          <w:szCs w:val="24"/>
+        </w:rPr>
+      </w:pPr>
+      <w:r>
+        <w:rPr>
+          <w:rFonts w:ascii="Times New Roman" w:hAnsi="Times New Roman" w:cs="Times New Roman"/>
+          <w:b/>
+          <w:bCs/>
+          <w:sz w:val="24"/>
+          <w:szCs w:val="24"/>
+        </w:rPr>
+        <w:t>Tâche :</w:t>
       </w:r>
       <w:r>
         <w:rPr>
@@ -558,46 +578,6 @@
           <w:sz w:val="24"/>
           <w:szCs w:val="24"/>
         </w:rPr>
-        <w:t>"Application mobile pratique, commande simple à passer. Cependant, le produit reçu ne correspondait pas exactement à la couleur commandée."</w:t>
-      </w:r>
-    </w:p>
-    <w:p>
-      <w:pPr>
-        <w:jc w:val="both"/>
-        <w:rPr>
-          <w:rFonts w:ascii="Times New Roman" w:hAnsi="Times New Roman" w:cs="Times New Roman"/>
-          <w:b/>
-          <w:bCs/>
-          <w:sz w:val="24"/>
-          <w:szCs w:val="24"/>
-        </w:rPr>
-      </w:pPr>
-      <w:r>
-        <w:rPr>
-          <w:rFonts w:ascii="Times New Roman" w:hAnsi="Times New Roman" w:cs="Times New Roman"/>
-          <w:b/>
-          <w:bCs/>
-          <w:sz w:val="24"/>
-          <w:szCs w:val="24"/>
-        </w:rPr>
-        <w:t>Tâche :</w:t>
-      </w:r>
-      <w:r>
-        <w:rPr>
-          <w:rFonts w:ascii="Times New Roman" w:hAnsi="Times New Roman" w:cs="Times New Roman"/>
-          <w:b/>
-          <w:bCs/>
-          <w:sz w:val="24"/>
-          <w:szCs w:val="24"/>
-        </w:rPr>
-        <w:t xml:space="preserve"> </w:t>
-      </w:r>
-      <w:r>
-        <w:rPr>
-          <w:rFonts w:ascii="Times New Roman" w:hAnsi="Times New Roman" w:cs="Times New Roman"/>
-          <w:sz w:val="24"/>
-          <w:szCs w:val="24"/>
-        </w:rPr>
         <w:t>Analyse ces avis clients afin de</w:t>
       </w:r>
       <w:r>
@@ -611,7 +591,7 @@
     </w:p>
     <w:p>
       <w:pPr>
-        <w:pStyle w:val="Paragraphedeliste"/>
+        <w:pStyle w:val="ListParagraph"/>
         <w:numPr>
           <w:ilvl w:val="0"/>
           <w:numId w:val="5"/>
@@ -630,12 +610,13 @@
           <w:sz w:val="24"/>
           <w:szCs w:val="24"/>
         </w:rPr>
+        <w:lastRenderedPageBreak/>
         <w:t>Identifier les thèmes récurrents évoqués par les clients (ex : qualité du produit, délai de livraison, service client, prix...).</w:t>
       </w:r>
     </w:p>
     <w:p>
       <w:pPr>
-        <w:pStyle w:val="Paragraphedeliste"/>
+        <w:pStyle w:val="ListParagraph"/>
         <w:numPr>
           <w:ilvl w:val="0"/>
           <w:numId w:val="5"/>
@@ -659,7 +640,7 @@
     </w:p>
     <w:p>
       <w:pPr>
-        <w:pStyle w:val="Paragraphedeliste"/>
+        <w:pStyle w:val="ListParagraph"/>
         <w:numPr>
           <w:ilvl w:val="0"/>
           <w:numId w:val="5"/>
@@ -678,7 +659,6 @@
           <w:sz w:val="24"/>
           <w:szCs w:val="24"/>
         </w:rPr>
-        <w:lastRenderedPageBreak/>
         <w:t>Proposer 2 à 3 recommandations concrètes pour améliorer la satisfaction client.</w:t>
       </w:r>
     </w:p>
@@ -706,7 +686,7 @@
     </w:p>
     <w:p>
       <w:pPr>
-        <w:pStyle w:val="Paragraphedeliste"/>
+        <w:pStyle w:val="ListParagraph"/>
         <w:numPr>
           <w:ilvl w:val="0"/>
           <w:numId w:val="2"/>
@@ -730,7 +710,7 @@
     </w:p>
     <w:p>
       <w:pPr>
-        <w:pStyle w:val="Paragraphedeliste"/>
+        <w:pStyle w:val="ListParagraph"/>
         <w:numPr>
           <w:ilvl w:val="0"/>
           <w:numId w:val="2"/>
@@ -754,7 +734,7 @@
     </w:p>
     <w:p>
       <w:pPr>
-        <w:pStyle w:val="Paragraphedeliste"/>
+        <w:pStyle w:val="ListParagraph"/>
         <w:numPr>
           <w:ilvl w:val="0"/>
           <w:numId w:val="2"/>
@@ -818,7 +798,7 @@
     </w:p>
     <w:p>
       <w:pPr>
-        <w:pStyle w:val="Paragraphedeliste"/>
+        <w:pStyle w:val="ListParagraph"/>
         <w:numPr>
           <w:ilvl w:val="0"/>
           <w:numId w:val="2"/>
@@ -842,7 +822,7 @@
     </w:p>
     <w:p>
       <w:pPr>
-        <w:pStyle w:val="Paragraphedeliste"/>
+        <w:pStyle w:val="ListParagraph"/>
         <w:numPr>
           <w:ilvl w:val="0"/>
           <w:numId w:val="2"/>
@@ -866,7 +846,7 @@
     </w:p>
     <w:p>
       <w:pPr>
-        <w:pStyle w:val="Paragraphedeliste"/>
+        <w:pStyle w:val="ListParagraph"/>
         <w:numPr>
           <w:ilvl w:val="0"/>
           <w:numId w:val="2"/>
@@ -890,7 +870,7 @@
     </w:p>
     <w:p>
       <w:pPr>
-        <w:pStyle w:val="Paragraphedeliste"/>
+        <w:pStyle w:val="ListParagraph"/>
         <w:numPr>
           <w:ilvl w:val="0"/>
           <w:numId w:val="1"/>
@@ -929,8 +909,10 @@
       <w:r>
         <w:rPr>
           <w:rFonts w:ascii="Times New Roman" w:hAnsi="Times New Roman" w:cs="Times New Roman"/>
-          <w:sz w:val="24"/>
-          <w:szCs w:val="24"/>
+          <w:noProof/>
+          <w:sz w:val="24"/>
+          <w:szCs w:val="24"/>
+          <w:lang w:eastAsia="fr-FR"/>
         </w:rPr>
         <w:drawing>
           <wp:inline distT="0" distB="0" distL="0" distR="0" wp14:anchorId="1B3BB7DD" wp14:editId="6F6A3212">
@@ -982,9 +964,12 @@
       <w:r>
         <w:rPr>
           <w:rFonts w:ascii="Times New Roman" w:hAnsi="Times New Roman" w:cs="Times New Roman"/>
-          <w:sz w:val="24"/>
-          <w:szCs w:val="24"/>
-        </w:rPr>
+          <w:noProof/>
+          <w:sz w:val="24"/>
+          <w:szCs w:val="24"/>
+          <w:lang w:eastAsia="fr-FR"/>
+        </w:rPr>
+        <w:lastRenderedPageBreak/>
         <w:drawing>
           <wp:inline distT="0" distB="0" distL="0" distR="0" wp14:anchorId="69A508D1" wp14:editId="25B85F0F">
             <wp:extent cx="5760720" cy="2367915"/>
@@ -1073,7 +1058,7 @@
     <w:p>
       <w:pPr>
         <w:spacing w:line="360" w:lineRule="auto"/>
-        <w:jc w:val="both"/>
+        <w:jc w:val="center"/>
         <w:rPr>
           <w:rFonts w:ascii="Times New Roman" w:hAnsi="Times New Roman" w:cs="Times New Roman"/>
           <w:b/>
@@ -1095,7 +1080,7 @@
     </w:p>
     <w:p>
       <w:pPr>
-        <w:pStyle w:val="Paragraphedeliste"/>
+        <w:pStyle w:val="ListParagraph"/>
         <w:numPr>
           <w:ilvl w:val="0"/>
           <w:numId w:val="1"/>
@@ -1180,7 +1165,7 @@
     </w:p>
     <w:p>
       <w:pPr>
-        <w:pStyle w:val="Paragraphedeliste"/>
+        <w:pStyle w:val="ListParagraph"/>
         <w:numPr>
           <w:ilvl w:val="0"/>
           <w:numId w:val="1"/>
@@ -1219,8 +1204,10 @@
       <w:r>
         <w:rPr>
           <w:rFonts w:ascii="Times New Roman" w:hAnsi="Times New Roman" w:cs="Times New Roman"/>
-          <w:sz w:val="24"/>
-          <w:szCs w:val="24"/>
+          <w:noProof/>
+          <w:sz w:val="24"/>
+          <w:szCs w:val="24"/>
+          <w:lang w:eastAsia="fr-FR"/>
         </w:rPr>
         <w:drawing>
           <wp:inline distT="0" distB="0" distL="0" distR="0" wp14:anchorId="361B75C6" wp14:editId="3A51DAF8">
@@ -1262,29 +1249,29 @@
     <w:p>
       <w:pPr>
         <w:spacing w:line="360" w:lineRule="auto"/>
-        <w:jc w:val="both"/>
-        <w:rPr>
-          <w:rFonts w:ascii="Times New Roman" w:hAnsi="Times New Roman" w:cs="Times New Roman"/>
-          <w:b/>
-          <w:bCs/>
-          <w:sz w:val="24"/>
-          <w:szCs w:val="24"/>
-        </w:rPr>
-      </w:pPr>
-      <w:r>
-        <w:rPr>
-          <w:rFonts w:ascii="Times New Roman" w:hAnsi="Times New Roman" w:cs="Times New Roman"/>
-          <w:b/>
-          <w:bCs/>
-          <w:sz w:val="24"/>
-          <w:szCs w:val="24"/>
-        </w:rPr>
-        <w:t>Test de la technique du One-shot </w:t>
-      </w:r>
-    </w:p>
-    <w:p>
-      <w:pPr>
-        <w:pStyle w:val="Paragraphedeliste"/>
+        <w:jc w:val="center"/>
+        <w:rPr>
+          <w:rFonts w:ascii="Times New Roman" w:hAnsi="Times New Roman" w:cs="Times New Roman"/>
+          <w:b/>
+          <w:bCs/>
+          <w:sz w:val="24"/>
+          <w:szCs w:val="24"/>
+        </w:rPr>
+      </w:pPr>
+      <w:r>
+        <w:rPr>
+          <w:rFonts w:ascii="Times New Roman" w:hAnsi="Times New Roman" w:cs="Times New Roman"/>
+          <w:b/>
+          <w:bCs/>
+          <w:sz w:val="24"/>
+          <w:szCs w:val="24"/>
+        </w:rPr>
+        <w:t>Test de la technique du One-shot</w:t>
+      </w:r>
+    </w:p>
+    <w:p>
+      <w:pPr>
+        <w:pStyle w:val="ListParagraph"/>
         <w:numPr>
           <w:ilvl w:val="0"/>
           <w:numId w:val="1"/>
@@ -1326,6 +1313,7 @@
           <w:sz w:val="24"/>
           <w:szCs w:val="24"/>
         </w:rPr>
+        <w:lastRenderedPageBreak/>
         <w:t>Voici un exemple de classification de commentaire :</w:t>
       </w:r>
     </w:p>
@@ -1442,7 +1430,7 @@
     </w:p>
     <w:p>
       <w:pPr>
-        <w:pStyle w:val="Paragraphedeliste"/>
+        <w:pStyle w:val="ListParagraph"/>
         <w:numPr>
           <w:ilvl w:val="0"/>
           <w:numId w:val="1"/>
@@ -1481,8 +1469,10 @@
       <w:r>
         <w:rPr>
           <w:rFonts w:ascii="Times New Roman" w:hAnsi="Times New Roman" w:cs="Times New Roman"/>
-          <w:sz w:val="24"/>
-          <w:szCs w:val="24"/>
+          <w:noProof/>
+          <w:sz w:val="24"/>
+          <w:szCs w:val="24"/>
+          <w:lang w:eastAsia="fr-FR"/>
         </w:rPr>
         <w:drawing>
           <wp:inline distT="0" distB="0" distL="0" distR="0" wp14:anchorId="1605C9D7" wp14:editId="4EA98368">
@@ -1524,29 +1514,29 @@
     <w:p>
       <w:pPr>
         <w:spacing w:line="360" w:lineRule="auto"/>
-        <w:jc w:val="both"/>
-        <w:rPr>
-          <w:rFonts w:ascii="Times New Roman" w:hAnsi="Times New Roman" w:cs="Times New Roman"/>
-          <w:b/>
-          <w:bCs/>
-          <w:sz w:val="24"/>
-          <w:szCs w:val="24"/>
-        </w:rPr>
-      </w:pPr>
-      <w:r>
-        <w:rPr>
-          <w:rFonts w:ascii="Times New Roman" w:hAnsi="Times New Roman" w:cs="Times New Roman"/>
-          <w:b/>
-          <w:bCs/>
-          <w:sz w:val="24"/>
-          <w:szCs w:val="24"/>
-        </w:rPr>
-        <w:t>Test de la technique du few-shot </w:t>
-      </w:r>
-    </w:p>
-    <w:p>
-      <w:pPr>
-        <w:pStyle w:val="Paragraphedeliste"/>
+        <w:jc w:val="center"/>
+        <w:rPr>
+          <w:rFonts w:ascii="Times New Roman" w:hAnsi="Times New Roman" w:cs="Times New Roman"/>
+          <w:b/>
+          <w:bCs/>
+          <w:sz w:val="24"/>
+          <w:szCs w:val="24"/>
+        </w:rPr>
+      </w:pPr>
+      <w:r>
+        <w:rPr>
+          <w:rFonts w:ascii="Times New Roman" w:hAnsi="Times New Roman" w:cs="Times New Roman"/>
+          <w:b/>
+          <w:bCs/>
+          <w:sz w:val="24"/>
+          <w:szCs w:val="24"/>
+        </w:rPr>
+        <w:t>Test de la technique du few-shot</w:t>
+      </w:r>
+    </w:p>
+    <w:p>
+      <w:pPr>
+        <w:pStyle w:val="ListParagraph"/>
         <w:numPr>
           <w:ilvl w:val="0"/>
           <w:numId w:val="1"/>
@@ -1822,7 +1812,7 @@
     </w:p>
     <w:p>
       <w:pPr>
-        <w:pStyle w:val="Paragraphedeliste"/>
+        <w:pStyle w:val="ListParagraph"/>
         <w:numPr>
           <w:ilvl w:val="0"/>
           <w:numId w:val="1"/>
@@ -1865,9 +1855,12 @@
           <w:rFonts w:ascii="Times New Roman" w:hAnsi="Times New Roman" w:cs="Times New Roman"/>
           <w:b/>
           <w:bCs/>
-          <w:sz w:val="24"/>
-          <w:szCs w:val="24"/>
-        </w:rPr>
+          <w:noProof/>
+          <w:sz w:val="24"/>
+          <w:szCs w:val="24"/>
+          <w:lang w:eastAsia="fr-FR"/>
+        </w:rPr>
+        <w:lastRenderedPageBreak/>
         <w:drawing>
           <wp:inline distT="0" distB="0" distL="0" distR="0" wp14:anchorId="6E11FC21" wp14:editId="55DC7B7F">
             <wp:extent cx="5760720" cy="808990"/>
@@ -1908,7 +1901,7 @@
     <w:p>
       <w:pPr>
         <w:spacing w:line="360" w:lineRule="auto"/>
-        <w:jc w:val="both"/>
+        <w:jc w:val="center"/>
         <w:rPr>
           <w:rFonts w:ascii="Times New Roman" w:hAnsi="Times New Roman" w:cs="Times New Roman"/>
           <w:b/>
@@ -1930,7 +1923,7 @@
     </w:p>
     <w:p>
       <w:pPr>
-        <w:pStyle w:val="Paragraphedeliste"/>
+        <w:pStyle w:val="ListParagraph"/>
         <w:numPr>
           <w:ilvl w:val="0"/>
           <w:numId w:val="1"/>
@@ -1982,15 +1975,7 @@
           <w:sz w:val="24"/>
           <w:szCs w:val="24"/>
         </w:rPr>
-        <w:t xml:space="preserve"> </w:t>
-      </w:r>
-      <w:r>
-        <w:rPr>
-          <w:rFonts w:ascii="Times New Roman" w:hAnsi="Times New Roman" w:cs="Times New Roman"/>
-          <w:sz w:val="24"/>
-          <w:szCs w:val="24"/>
-        </w:rPr>
-        <w:t>Tu es un outil d'analyse de sentiment pour des commentaires clients</w:t>
+        <w:t xml:space="preserve"> Tu es un outil d'analyse de sentiment pour des commentaires clients</w:t>
       </w:r>
       <w:r>
         <w:rPr>
@@ -2027,15 +2012,7 @@
           <w:sz w:val="24"/>
           <w:szCs w:val="24"/>
         </w:rPr>
-        <w:t xml:space="preserve"> </w:t>
-      </w:r>
-      <w:r>
-        <w:rPr>
-          <w:rFonts w:ascii="Times New Roman" w:hAnsi="Times New Roman" w:cs="Times New Roman"/>
-          <w:sz w:val="24"/>
-          <w:szCs w:val="24"/>
-        </w:rPr>
-        <w:t>Classe le commentaire suivant selon sa tonalité globale.</w:t>
+        <w:t xml:space="preserve"> Classe le commentaire suivant selon sa tonalité globale.</w:t>
       </w:r>
     </w:p>
     <w:p>
@@ -2290,7 +2267,7 @@
     </w:p>
     <w:p>
       <w:pPr>
-        <w:pStyle w:val="Paragraphedeliste"/>
+        <w:pStyle w:val="ListParagraph"/>
         <w:numPr>
           <w:ilvl w:val="0"/>
           <w:numId w:val="1"/>
@@ -2329,8 +2306,10 @@
       <w:r>
         <w:rPr>
           <w:rFonts w:ascii="Times New Roman" w:hAnsi="Times New Roman" w:cs="Times New Roman"/>
-          <w:sz w:val="24"/>
-          <w:szCs w:val="24"/>
+          <w:noProof/>
+          <w:sz w:val="24"/>
+          <w:szCs w:val="24"/>
+          <w:lang w:eastAsia="fr-FR"/>
         </w:rPr>
         <w:drawing>
           <wp:inline distT="0" distB="0" distL="0" distR="0" wp14:anchorId="4E01CB2C" wp14:editId="7BFEE9D9">
@@ -2371,7 +2350,7 @@
     </w:p>
     <w:p>
       <w:pPr>
-        <w:pStyle w:val="Paragraphedeliste"/>
+        <w:pStyle w:val="ListParagraph"/>
         <w:numPr>
           <w:ilvl w:val="0"/>
           <w:numId w:val="1"/>
@@ -2444,7 +2423,48 @@
           <w:sz w:val="24"/>
           <w:szCs w:val="24"/>
         </w:rPr>
-        <w:t xml:space="preserve"> et il nous permet de tester directement les capacités du LLM utilisé car les réponses qu’il nous fournit ne sont basés que sur ses connaissances lors de l’entrainement. Elle permet aussi de d’économiser des tokens mais elle présente l’inconvénient de fournir des réponses approximatives car ne disposant pas d’exemples pour régler le problème qui lui a été soumis. Ainsi, nous n’avons aucun contrôle sur le format de réponses. Le one shot à la différence permet de cadrer le format de réponse car il permet d’inclure un exemple dans le prompt mais avec moins d’efforts sur l’ambiguïté et la prise en compte des nuances voulante être relevé. La technique du few-shot vient régler ce problème car il permet de soumettre des exemples bien choisies au modèle. Il prend cependant plus de temps à préparer, nécessite plus de tokens</w:t>
+        <w:t xml:space="preserve"> et il nous permet de tester directement les capacités du LLM utilisé car les réponses qu’il nous fournit ne sont </w:t>
+      </w:r>
+      <w:r>
+        <w:rPr>
+          <w:rFonts w:ascii="Times New Roman" w:hAnsi="Times New Roman" w:cs="Times New Roman"/>
+          <w:sz w:val="24"/>
+          <w:szCs w:val="24"/>
+        </w:rPr>
+        <w:t>basées</w:t>
+      </w:r>
+      <w:r>
+        <w:rPr>
+          <w:rFonts w:ascii="Times New Roman" w:hAnsi="Times New Roman" w:cs="Times New Roman"/>
+          <w:sz w:val="24"/>
+          <w:szCs w:val="24"/>
+        </w:rPr>
+        <w:t xml:space="preserve"> que sur ses connaissances lors de l’entrainement. Elle permet aussi de </w:t>
+      </w:r>
+      <w:r>
+        <w:rPr>
+          <w:rFonts w:ascii="Times New Roman" w:hAnsi="Times New Roman" w:cs="Times New Roman"/>
+          <w:sz w:val="24"/>
+          <w:szCs w:val="24"/>
+        </w:rPr>
+        <w:lastRenderedPageBreak/>
+        <w:t xml:space="preserve">d’économiser des tokens mais elle présente l’inconvénient de fournir des réponses approximatives car ne disposant pas d’exemples pour régler le problème qui lui a été soumis. Ainsi, nous n’avons aucun contrôle sur le format de réponses. Le one shot à la différence permet de cadrer le format de réponse car il permet d’inclure un exemple dans le prompt mais avec moins d’efforts sur l’ambiguïté et la prise en compte des nuances voulante être relevé. La technique du few-shot vient régler ce problème car il permet de soumettre des exemples bien </w:t>
+      </w:r>
+      <w:r>
+        <w:rPr>
+          <w:rFonts w:ascii="Times New Roman" w:hAnsi="Times New Roman" w:cs="Times New Roman"/>
+          <w:sz w:val="24"/>
+          <w:szCs w:val="24"/>
+        </w:rPr>
+        <w:t>choisis</w:t>
+      </w:r>
+      <w:r>
+        <w:rPr>
+          <w:rFonts w:ascii="Times New Roman" w:hAnsi="Times New Roman" w:cs="Times New Roman"/>
+          <w:sz w:val="24"/>
+          <w:szCs w:val="24"/>
+        </w:rPr>
+        <w:t xml:space="preserve"> au modèle. Il prend cependant plus de temps à préparer, nécessite plus de tokens</w:t>
       </w:r>
     </w:p>
     <w:p>
@@ -2505,7 +2525,7 @@
     </w:p>
     <w:p>
       <w:pPr>
-        <w:pStyle w:val="Paragraphedeliste"/>
+        <w:pStyle w:val="ListParagraph"/>
         <w:numPr>
           <w:ilvl w:val="0"/>
           <w:numId w:val="7"/>
@@ -2529,7 +2549,7 @@
     </w:p>
     <w:p>
       <w:pPr>
-        <w:pStyle w:val="Paragraphedeliste"/>
+        <w:pStyle w:val="ListParagraph"/>
         <w:numPr>
           <w:ilvl w:val="0"/>
           <w:numId w:val="1"/>
@@ -2599,7 +2619,7 @@
           <w:sz w:val="24"/>
           <w:szCs w:val="24"/>
         </w:rPr>
-        <w:t>→ Identifier, pour chaque avis, les éléments factuels mentionnés (ce qui est dit, sans interprétation).</w:t>
+        <w:t>Identifier, pour chaque avis, les éléments factuels mentionnés (ce qui est dit, sans interprétation).</w:t>
       </w:r>
     </w:p>
     <w:p>
@@ -2617,8 +2637,17 @@
           <w:rFonts w:ascii="Times New Roman" w:hAnsi="Times New Roman" w:cs="Times New Roman"/>
           <w:sz w:val="24"/>
           <w:szCs w:val="24"/>
-        </w:rPr>
-        <w:t>Étape 2 : Catégorisation</w:t>
+          <w:u w:val="single"/>
+        </w:rPr>
+        <w:t xml:space="preserve">Étape 2 : </w:t>
+      </w:r>
+      <w:r>
+        <w:rPr>
+          <w:rFonts w:ascii="Times New Roman" w:hAnsi="Times New Roman" w:cs="Times New Roman"/>
+          <w:sz w:val="24"/>
+          <w:szCs w:val="24"/>
+        </w:rPr>
+        <w:t>Catégorisation</w:t>
       </w:r>
     </w:p>
     <w:p>
@@ -2637,23 +2666,7 @@
           <w:sz w:val="24"/>
           <w:szCs w:val="24"/>
         </w:rPr>
-        <w:t xml:space="preserve">→ Regrouper ces éléments par thème (ex : livraison, qualité produit, </w:t>
-      </w:r>
-      <w:r>
-        <w:rPr>
-          <w:rFonts w:ascii="Times New Roman" w:hAnsi="Times New Roman" w:cs="Times New Roman"/>
-          <w:sz w:val="24"/>
-          <w:szCs w:val="24"/>
-        </w:rPr>
-        <w:t>service client</w:t>
-      </w:r>
-      <w:r>
-        <w:rPr>
-          <w:rFonts w:ascii="Times New Roman" w:hAnsi="Times New Roman" w:cs="Times New Roman"/>
-          <w:sz w:val="24"/>
-          <w:szCs w:val="24"/>
-        </w:rPr>
-        <w:t>, prix...).</w:t>
+        <w:t>Regrouper ces éléments par thème (ex : livraison, qualité produit, service client, prix...).</w:t>
       </w:r>
     </w:p>
     <w:p>
@@ -2671,8 +2684,17 @@
           <w:rFonts w:ascii="Times New Roman" w:hAnsi="Times New Roman" w:cs="Times New Roman"/>
           <w:sz w:val="24"/>
           <w:szCs w:val="24"/>
-        </w:rPr>
-        <w:t>Étape 3 : Priorisation</w:t>
+          <w:u w:val="single"/>
+        </w:rPr>
+        <w:t>Étape 3 :</w:t>
+      </w:r>
+      <w:r>
+        <w:rPr>
+          <w:rFonts w:ascii="Times New Roman" w:hAnsi="Times New Roman" w:cs="Times New Roman"/>
+          <w:sz w:val="24"/>
+          <w:szCs w:val="24"/>
+        </w:rPr>
+        <w:t xml:space="preserve"> Priorisation</w:t>
       </w:r>
     </w:p>
     <w:p>
@@ -2691,7 +2713,7 @@
           <w:sz w:val="24"/>
           <w:szCs w:val="24"/>
         </w:rPr>
-        <w:t>→ Déterminer quels thèmes reviennent le plus fréquemment et/ou semblent avoir le plus d'impact sur la satisfaction client.</w:t>
+        <w:t>Déterminer quels thèmes reviennent le plus fréquemment et/ou semblent avoir le plus d'impact sur la satisfaction client.</w:t>
       </w:r>
     </w:p>
     <w:p>
@@ -2709,8 +2731,17 @@
           <w:rFonts w:ascii="Times New Roman" w:hAnsi="Times New Roman" w:cs="Times New Roman"/>
           <w:sz w:val="24"/>
           <w:szCs w:val="24"/>
-        </w:rPr>
-        <w:t>Étape 4 : Formulation des problèmes</w:t>
+          <w:u w:val="single"/>
+        </w:rPr>
+        <w:t>Étape 4 :</w:t>
+      </w:r>
+      <w:r>
+        <w:rPr>
+          <w:rFonts w:ascii="Times New Roman" w:hAnsi="Times New Roman" w:cs="Times New Roman"/>
+          <w:sz w:val="24"/>
+          <w:szCs w:val="24"/>
+        </w:rPr>
+        <w:t xml:space="preserve"> Formulation des problèmes</w:t>
       </w:r>
     </w:p>
     <w:p>
@@ -2729,7 +2760,7 @@
           <w:sz w:val="24"/>
           <w:szCs w:val="24"/>
         </w:rPr>
-        <w:t>→ Reformuler chaque thème prioritaire sous forme de "problème" clair et actionnable.</w:t>
+        <w:t>Reformuler chaque thème prioritaire sous forme de "problème" clair et actionnable.</w:t>
       </w:r>
     </w:p>
     <w:p>
@@ -2747,8 +2778,17 @@
           <w:rFonts w:ascii="Times New Roman" w:hAnsi="Times New Roman" w:cs="Times New Roman"/>
           <w:sz w:val="24"/>
           <w:szCs w:val="24"/>
-        </w:rPr>
-        <w:t>Étape 5 : Recommandations</w:t>
+          <w:u w:val="single"/>
+        </w:rPr>
+        <w:t>Étape 5 :</w:t>
+      </w:r>
+      <w:r>
+        <w:rPr>
+          <w:rFonts w:ascii="Times New Roman" w:hAnsi="Times New Roman" w:cs="Times New Roman"/>
+          <w:sz w:val="24"/>
+          <w:szCs w:val="24"/>
+        </w:rPr>
+        <w:t xml:space="preserve"> Recommandations</w:t>
       </w:r>
     </w:p>
     <w:p>
@@ -2767,12 +2807,23 @@
           <w:sz w:val="24"/>
           <w:szCs w:val="24"/>
         </w:rPr>
-        <w:t>→ Pour chaque problème identifié, proposer une action concrète et réaliste pour l'entreprise.</w:t>
-      </w:r>
-    </w:p>
-    <w:p>
-      <w:pPr>
-        <w:pStyle w:val="Paragraphedeliste"/>
+        <w:t>Pour chaque problème identifié, proposer une action concrète et réaliste pour l'entreprise.</w:t>
+      </w:r>
+    </w:p>
+    <w:p>
+      <w:pPr>
+        <w:spacing w:line="276" w:lineRule="auto"/>
+        <w:ind w:left="360"/>
+        <w:rPr>
+          <w:rFonts w:ascii="Times New Roman" w:hAnsi="Times New Roman" w:cs="Times New Roman"/>
+          <w:sz w:val="24"/>
+          <w:szCs w:val="24"/>
+        </w:rPr>
+      </w:pPr>
+    </w:p>
+    <w:p>
+      <w:pPr>
+        <w:pStyle w:val="ListParagraph"/>
         <w:numPr>
           <w:ilvl w:val="0"/>
           <w:numId w:val="7"/>
@@ -2795,7 +2846,7 @@
     </w:p>
     <w:p>
       <w:pPr>
-        <w:pStyle w:val="Paragraphedeliste"/>
+        <w:pStyle w:val="ListParagraph"/>
         <w:numPr>
           <w:ilvl w:val="0"/>
           <w:numId w:val="1"/>
@@ -2818,7 +2869,28 @@
           <w:sz w:val="24"/>
           <w:szCs w:val="24"/>
         </w:rPr>
-        <w:t>Prompt analyse</w:t>
+        <w:lastRenderedPageBreak/>
+        <w:t xml:space="preserve">Prompt </w:t>
+      </w:r>
+      <w:r>
+        <w:rPr>
+          <w:rFonts w:ascii="Times New Roman" w:hAnsi="Times New Roman" w:cs="Times New Roman"/>
+          <w:b/>
+          <w:bCs/>
+          <w:sz w:val="24"/>
+          <w:szCs w:val="24"/>
+        </w:rPr>
+        <w:t>proposé pour l’</w:t>
+      </w:r>
+      <w:r>
+        <w:rPr>
+          <w:rFonts w:ascii="Times New Roman" w:hAnsi="Times New Roman" w:cs="Times New Roman"/>
+          <w:b/>
+          <w:bCs/>
+          <w:sz w:val="24"/>
+          <w:szCs w:val="24"/>
+        </w:rPr>
+        <w:t>analyse</w:t>
       </w:r>
     </w:p>
     <w:p>
@@ -3174,15 +3246,7 @@
           <w:sz w:val="24"/>
           <w:szCs w:val="24"/>
         </w:rPr>
-        <w:t xml:space="preserve">3. Identifie les thèmes les plus fréquents ou </w:t>
-      </w:r>
-      <w:r>
-        <w:rPr>
-          <w:rFonts w:ascii="Times New Roman" w:hAnsi="Times New Roman" w:cs="Times New Roman"/>
-          <w:sz w:val="24"/>
-          <w:szCs w:val="24"/>
-        </w:rPr>
-        <w:t>impactant</w:t>
+        <w:t>3. Identifie les thèmes les plus fréquents ou impactant</w:t>
       </w:r>
       <w:r>
         <w:rPr>
@@ -3264,7 +3328,7 @@
     </w:p>
     <w:p>
       <w:pPr>
-        <w:pStyle w:val="Paragraphedeliste"/>
+        <w:pStyle w:val="ListParagraph"/>
         <w:numPr>
           <w:ilvl w:val="0"/>
           <w:numId w:val="2"/>
@@ -3287,7 +3351,7 @@
     </w:p>
     <w:p>
       <w:pPr>
-        <w:pStyle w:val="Paragraphedeliste"/>
+        <w:pStyle w:val="ListParagraph"/>
         <w:numPr>
           <w:ilvl w:val="0"/>
           <w:numId w:val="2"/>
@@ -3310,7 +3374,7 @@
     </w:p>
     <w:p>
       <w:pPr>
-        <w:pStyle w:val="Paragraphedeliste"/>
+        <w:pStyle w:val="ListParagraph"/>
         <w:numPr>
           <w:ilvl w:val="0"/>
           <w:numId w:val="2"/>
@@ -3343,19 +3407,6 @@
           <w:szCs w:val="24"/>
         </w:rPr>
       </w:pPr>
-    </w:p>
-    <w:p>
-      <w:pPr>
-        <w:spacing w:line="360" w:lineRule="auto"/>
-        <w:ind w:left="360"/>
-        <w:rPr>
-          <w:rFonts w:ascii="Times New Roman" w:hAnsi="Times New Roman" w:cs="Times New Roman"/>
-          <w:b/>
-          <w:bCs/>
-          <w:sz w:val="24"/>
-          <w:szCs w:val="24"/>
-        </w:rPr>
-      </w:pPr>
       <w:r>
         <w:rPr>
           <w:rFonts w:ascii="Times New Roman" w:hAnsi="Times New Roman" w:cs="Times New Roman"/>
@@ -3369,7 +3420,7 @@
     </w:p>
     <w:p>
       <w:pPr>
-        <w:pStyle w:val="Paragraphedeliste"/>
+        <w:pStyle w:val="ListParagraph"/>
         <w:numPr>
           <w:ilvl w:val="0"/>
           <w:numId w:val="2"/>
@@ -3392,7 +3443,7 @@
     </w:p>
     <w:p>
       <w:pPr>
-        <w:pStyle w:val="Paragraphedeliste"/>
+        <w:pStyle w:val="ListParagraph"/>
         <w:numPr>
           <w:ilvl w:val="0"/>
           <w:numId w:val="2"/>
@@ -3412,10 +3463,18 @@
         </w:rPr>
         <w:t>Recommandations associées</w:t>
       </w:r>
-    </w:p>
-    <w:p>
-      <w:pPr>
-        <w:pStyle w:val="Paragraphedeliste"/>
+      <w:r>
+        <w:rPr>
+          <w:rFonts w:ascii="Times New Roman" w:hAnsi="Times New Roman" w:cs="Times New Roman"/>
+          <w:sz w:val="24"/>
+          <w:szCs w:val="24"/>
+        </w:rPr>
+        <w:t>.</w:t>
+      </w:r>
+    </w:p>
+    <w:p>
+      <w:pPr>
+        <w:pStyle w:val="ListParagraph"/>
         <w:numPr>
           <w:ilvl w:val="0"/>
           <w:numId w:val="10"/>
@@ -3438,6 +3497,7 @@
           <w:sz w:val="24"/>
           <w:szCs w:val="24"/>
         </w:rPr>
+        <w:lastRenderedPageBreak/>
         <w:t>Réponse de Claude</w:t>
       </w:r>
     </w:p>
@@ -3455,6 +3515,10 @@
         </w:rPr>
       </w:pPr>
       <w:r>
+        <w:rPr>
+          <w:noProof/>
+          <w:lang w:eastAsia="fr-FR"/>
+        </w:rPr>
         <w:drawing>
           <wp:inline distT="0" distB="0" distL="0" distR="0" wp14:anchorId="7053E743" wp14:editId="7A58ADB1">
             <wp:extent cx="5760720" cy="5187315"/>
@@ -3494,7 +3558,68 @@
     </w:p>
     <w:p>
       <w:pPr>
-        <w:pStyle w:val="Paragraphedeliste"/>
+        <w:spacing w:line="360" w:lineRule="auto"/>
+        <w:ind w:left="360"/>
+        <w:jc w:val="center"/>
+        <w:rPr>
+          <w:rFonts w:ascii="Times New Roman" w:hAnsi="Times New Roman" w:cs="Times New Roman"/>
+          <w:b/>
+          <w:bCs/>
+          <w:sz w:val="24"/>
+          <w:szCs w:val="24"/>
+        </w:rPr>
+      </w:pPr>
+      <w:r>
+        <w:rPr>
+          <w:rFonts w:ascii="Times New Roman" w:hAnsi="Times New Roman" w:cs="Times New Roman"/>
+          <w:b/>
+          <w:bCs/>
+          <w:noProof/>
+          <w:sz w:val="24"/>
+          <w:szCs w:val="24"/>
+          <w:lang w:eastAsia="fr-FR"/>
+        </w:rPr>
+        <w:lastRenderedPageBreak/>
+        <w:drawing>
+          <wp:inline distT="0" distB="0" distL="0" distR="0" wp14:anchorId="31E20BB4" wp14:editId="5E513FAC">
+            <wp:extent cx="5760720" cy="4962525"/>
+            <wp:effectExtent l="0" t="0" r="0" b="9525"/>
+            <wp:docPr id="52188413" name="Image 1"/>
+            <wp:cNvGraphicFramePr>
+              <a:graphicFrameLocks xmlns:a="http://schemas.openxmlformats.org/drawingml/2006/main" noChangeAspect="1"/>
+            </wp:cNvGraphicFramePr>
+            <a:graphic xmlns:a="http://schemas.openxmlformats.org/drawingml/2006/main">
+              <a:graphicData uri="http://schemas.openxmlformats.org/drawingml/2006/picture">
+                <pic:pic xmlns:pic="http://schemas.openxmlformats.org/drawingml/2006/picture">
+                  <pic:nvPicPr>
+                    <pic:cNvPr id="52188413" name=""/>
+                    <pic:cNvPicPr/>
+                  </pic:nvPicPr>
+                  <pic:blipFill>
+                    <a:blip r:embed="rId12"/>
+                    <a:stretch>
+                      <a:fillRect/>
+                    </a:stretch>
+                  </pic:blipFill>
+                  <pic:spPr>
+                    <a:xfrm>
+                      <a:off x="0" y="0"/>
+                      <a:ext cx="5760720" cy="4962525"/>
+                    </a:xfrm>
+                    <a:prstGeom prst="rect">
+                      <a:avLst/>
+                    </a:prstGeom>
+                  </pic:spPr>
+                </pic:pic>
+              </a:graphicData>
+            </a:graphic>
+          </wp:inline>
+        </w:drawing>
+      </w:r>
+    </w:p>
+    <w:p>
+      <w:pPr>
+        <w:pStyle w:val="ListParagraph"/>
         <w:numPr>
           <w:ilvl w:val="0"/>
           <w:numId w:val="10"/>
@@ -3657,11 +3782,38 @@
           <w:sz w:val="24"/>
           <w:szCs w:val="24"/>
         </w:rPr>
+        <w:lastRenderedPageBreak/>
         <w:t>Pour chaque point, réponds explicitement par "Conforme" ou "Non conforme", avec une brève justification. Si tu identifies un problème, corrige ta réponse initiale en conséquence.</w:t>
       </w:r>
     </w:p>
     <w:p>
       <w:pPr>
+        <w:pStyle w:val="Heading2"/>
+        <w:numPr>
+          <w:ilvl w:val="0"/>
+          <w:numId w:val="10"/>
+        </w:numPr>
+        <w:spacing w:line="360" w:lineRule="auto"/>
+        <w:jc w:val="center"/>
+        <w:rPr>
+          <w:rFonts w:ascii="Times New Roman" w:hAnsi="Times New Roman" w:cs="Times New Roman"/>
+          <w:b/>
+          <w:color w:val="auto"/>
+          <w:sz w:val="24"/>
+        </w:rPr>
+      </w:pPr>
+      <w:r>
+        <w:rPr>
+          <w:rFonts w:ascii="Times New Roman" w:hAnsi="Times New Roman" w:cs="Times New Roman"/>
+          <w:b/>
+          <w:color w:val="auto"/>
+          <w:sz w:val="24"/>
+        </w:rPr>
+        <w:t>Réponse de Claude</w:t>
+      </w:r>
+    </w:p>
+    <w:p>
+      <w:pPr>
         <w:spacing w:line="360" w:lineRule="auto"/>
         <w:ind w:left="360"/>
         <w:jc w:val="both"/>
@@ -3674,8 +3826,10 @@
       <w:r>
         <w:rPr>
           <w:rFonts w:ascii="Times New Roman" w:hAnsi="Times New Roman" w:cs="Times New Roman"/>
-          <w:sz w:val="24"/>
-          <w:szCs w:val="24"/>
+          <w:noProof/>
+          <w:sz w:val="24"/>
+          <w:szCs w:val="24"/>
+          <w:lang w:eastAsia="fr-FR"/>
         </w:rPr>
         <w:drawing>
           <wp:inline distT="0" distB="0" distL="0" distR="0" wp14:anchorId="524D7858" wp14:editId="7CFF999D">
@@ -3693,7 +3847,7 @@
                     <pic:cNvPicPr/>
                   </pic:nvPicPr>
                   <pic:blipFill>
-                    <a:blip r:embed="rId12"/>
+                    <a:blip r:embed="rId13"/>
                     <a:stretch>
                       <a:fillRect/>
                     </a:stretch>
@@ -3725,17 +3879,1081 @@
           <w:szCs w:val="24"/>
         </w:rPr>
       </w:pPr>
-      <w:r>
-        <w:rPr>
-          <w:rFonts w:ascii="Times New Roman" w:hAnsi="Times New Roman" w:cs="Times New Roman"/>
+    </w:p>
+    <w:p>
+      <w:pPr>
+        <w:autoSpaceDE w:val="0"/>
+        <w:autoSpaceDN w:val="0"/>
+        <w:adjustRightInd w:val="0"/>
+        <w:spacing w:after="0" w:line="240" w:lineRule="auto"/>
+        <w:rPr>
+          <w:rFonts w:ascii="Times New Roman" w:hAnsi="Times New Roman" w:cs="Times New Roman"/>
+          <w:b/>
+          <w:kern w:val="0"/>
+          <w:sz w:val="28"/>
+          <w:szCs w:val="24"/>
+        </w:rPr>
+      </w:pPr>
+      <w:r>
+        <w:rPr>
+          <w:rFonts w:ascii="Times New Roman" w:hAnsi="Times New Roman" w:cs="Times New Roman"/>
+          <w:b/>
+          <w:kern w:val="0"/>
+          <w:sz w:val="28"/>
+          <w:szCs w:val="24"/>
+        </w:rPr>
+        <w:t>Partie 4 – Sorties structurées</w:t>
+      </w:r>
+    </w:p>
+    <w:p>
+      <w:pPr>
+        <w:autoSpaceDE w:val="0"/>
+        <w:autoSpaceDN w:val="0"/>
+        <w:adjustRightInd w:val="0"/>
+        <w:spacing w:after="0" w:line="360" w:lineRule="auto"/>
+        <w:jc w:val="both"/>
+        <w:rPr>
+          <w:rFonts w:ascii="Times New Roman" w:hAnsi="Times New Roman" w:cs="Times New Roman"/>
+          <w:color w:val="000000"/>
+          <w:kern w:val="0"/>
+          <w:sz w:val="24"/>
+          <w:szCs w:val="24"/>
+        </w:rPr>
+      </w:pPr>
+      <w:r>
+        <w:rPr>
+          <w:rFonts w:ascii="Times New Roman" w:hAnsi="Times New Roman" w:cs="Times New Roman"/>
+          <w:color w:val="000000"/>
+          <w:kern w:val="0"/>
+          <w:sz w:val="24"/>
+          <w:szCs w:val="24"/>
+        </w:rPr>
+        <w:t>Le LLM retourne :</w:t>
+      </w:r>
+    </w:p>
+    <w:p>
+      <w:pPr>
+        <w:autoSpaceDE w:val="0"/>
+        <w:autoSpaceDN w:val="0"/>
+        <w:adjustRightInd w:val="0"/>
+        <w:spacing w:after="0" w:line="360" w:lineRule="auto"/>
+        <w:jc w:val="both"/>
+        <w:rPr>
+          <w:rFonts w:ascii="Times New Roman" w:hAnsi="Times New Roman" w:cs="Times New Roman"/>
+          <w:color w:val="000000"/>
+          <w:kern w:val="0"/>
+          <w:sz w:val="24"/>
+          <w:szCs w:val="24"/>
+        </w:rPr>
+      </w:pPr>
+      <w:r>
+        <w:rPr>
+          <w:rFonts w:ascii="Times New Roman" w:hAnsi="Times New Roman" w:cs="Times New Roman"/>
+          <w:color w:val="000000"/>
+          <w:kern w:val="0"/>
+          <w:sz w:val="24"/>
+          <w:szCs w:val="24"/>
+        </w:rPr>
+        <w:t>« Le commentaire semble plutôt négatif. Le client est mécontent du délai de livraison... »</w:t>
+      </w:r>
+    </w:p>
+    <w:p>
+      <w:pPr>
+        <w:pStyle w:val="ListParagraph"/>
+        <w:numPr>
+          <w:ilvl w:val="0"/>
+          <w:numId w:val="11"/>
+        </w:numPr>
+        <w:autoSpaceDE w:val="0"/>
+        <w:autoSpaceDN w:val="0"/>
+        <w:adjustRightInd w:val="0"/>
+        <w:spacing w:after="0" w:line="360" w:lineRule="auto"/>
+        <w:jc w:val="both"/>
+        <w:rPr>
+          <w:rFonts w:ascii="Times New Roman" w:hAnsi="Times New Roman" w:cs="Times New Roman"/>
+          <w:color w:val="000000"/>
+          <w:kern w:val="0"/>
+          <w:sz w:val="24"/>
+          <w:szCs w:val="24"/>
+        </w:rPr>
+      </w:pPr>
+      <w:r>
+        <w:rPr>
+          <w:rFonts w:ascii="Times New Roman" w:hAnsi="Times New Roman" w:cs="Times New Roman"/>
+          <w:color w:val="000000"/>
+          <w:kern w:val="0"/>
+          <w:sz w:val="24"/>
+          <w:szCs w:val="24"/>
+        </w:rPr>
+        <w:t>Pour rendre cette réponse plus facile à exploiter par une application, créer u</w:t>
+      </w:r>
+      <w:r>
+        <w:rPr>
+          <w:rFonts w:ascii="Times New Roman" w:hAnsi="Times New Roman" w:cs="Times New Roman"/>
+          <w:color w:val="000000"/>
+          <w:kern w:val="0"/>
+          <w:sz w:val="24"/>
+          <w:szCs w:val="24"/>
+        </w:rPr>
+        <w:t xml:space="preserve">n prompt </w:t>
+      </w:r>
+      <w:r>
+        <w:rPr>
+          <w:rFonts w:ascii="Times New Roman" w:hAnsi="Times New Roman" w:cs="Times New Roman"/>
+          <w:color w:val="000000"/>
+          <w:kern w:val="0"/>
+          <w:sz w:val="24"/>
+          <w:szCs w:val="24"/>
+        </w:rPr>
+        <w:t xml:space="preserve">demandant du JSON avec les champs sentiment, </w:t>
+      </w:r>
+      <w:r>
+        <w:rPr>
+          <w:rFonts w:ascii="Times New Roman" w:hAnsi="Times New Roman" w:cs="Times New Roman"/>
+          <w:color w:val="000000"/>
+          <w:kern w:val="0"/>
+          <w:sz w:val="24"/>
+          <w:szCs w:val="24"/>
+        </w:rPr>
+        <w:t>catégorie</w:t>
+      </w:r>
+      <w:r>
+        <w:rPr>
+          <w:rFonts w:ascii="Times New Roman" w:hAnsi="Times New Roman" w:cs="Times New Roman"/>
+          <w:color w:val="000000"/>
+          <w:kern w:val="0"/>
+          <w:sz w:val="24"/>
+          <w:szCs w:val="24"/>
+        </w:rPr>
+        <w:t xml:space="preserve">, urgence, </w:t>
+      </w:r>
+      <w:r>
+        <w:rPr>
+          <w:rFonts w:ascii="Times New Roman" w:hAnsi="Times New Roman" w:cs="Times New Roman"/>
+          <w:color w:val="000000"/>
+          <w:kern w:val="0"/>
+          <w:sz w:val="24"/>
+          <w:szCs w:val="24"/>
+        </w:rPr>
+        <w:t>problème</w:t>
+      </w:r>
+      <w:r>
+        <w:rPr>
+          <w:rFonts w:ascii="Times New Roman" w:hAnsi="Times New Roman" w:cs="Times New Roman"/>
+          <w:color w:val="000000"/>
+          <w:kern w:val="0"/>
+          <w:sz w:val="24"/>
+          <w:szCs w:val="24"/>
+        </w:rPr>
+        <w:t>, confiance</w:t>
+      </w:r>
+      <w:r>
+        <w:rPr>
+          <w:rFonts w:ascii="Times New Roman" w:hAnsi="Times New Roman" w:cs="Times New Roman"/>
+          <w:color w:val="000000"/>
+          <w:kern w:val="0"/>
+          <w:sz w:val="24"/>
+          <w:szCs w:val="24"/>
+        </w:rPr>
+        <w:t xml:space="preserve">. </w:t>
+      </w:r>
+      <w:r>
+        <w:rPr>
+          <w:rFonts w:ascii="Times New Roman" w:hAnsi="Times New Roman" w:cs="Times New Roman"/>
+          <w:color w:val="000000"/>
+          <w:kern w:val="0"/>
+          <w:sz w:val="24"/>
+          <w:szCs w:val="24"/>
+        </w:rPr>
+        <w:t>Préciser les types des va</w:t>
+      </w:r>
+      <w:r>
+        <w:rPr>
+          <w:rFonts w:ascii="Times New Roman" w:hAnsi="Times New Roman" w:cs="Times New Roman"/>
+          <w:color w:val="000000"/>
+          <w:kern w:val="0"/>
+          <w:sz w:val="24"/>
+          <w:szCs w:val="24"/>
+        </w:rPr>
+        <w:t>leurs et les valeurs autorisées</w:t>
+      </w:r>
+    </w:p>
+    <w:p>
+      <w:pPr>
+        <w:autoSpaceDE w:val="0"/>
+        <w:autoSpaceDN w:val="0"/>
+        <w:adjustRightInd w:val="0"/>
+        <w:spacing w:after="0" w:line="360" w:lineRule="auto"/>
+        <w:jc w:val="both"/>
+        <w:rPr>
+          <w:rFonts w:ascii="Times New Roman" w:hAnsi="Times New Roman" w:cs="Times New Roman"/>
+          <w:color w:val="000000"/>
+          <w:kern w:val="0"/>
+          <w:sz w:val="24"/>
+          <w:szCs w:val="24"/>
+        </w:rPr>
+      </w:pPr>
+      <w:r>
+        <w:rPr>
+          <w:rFonts w:ascii="Times New Roman" w:hAnsi="Times New Roman" w:cs="Times New Roman"/>
+          <w:color w:val="000000"/>
+          <w:kern w:val="0"/>
+          <w:sz w:val="24"/>
+          <w:szCs w:val="24"/>
+        </w:rPr>
+        <w:t>Exemple de résultat</w:t>
+      </w:r>
+    </w:p>
+    <w:p>
+      <w:pPr>
+        <w:autoSpaceDE w:val="0"/>
+        <w:autoSpaceDN w:val="0"/>
+        <w:adjustRightInd w:val="0"/>
+        <w:spacing w:after="0" w:line="276" w:lineRule="auto"/>
+        <w:jc w:val="both"/>
+        <w:rPr>
+          <w:rFonts w:ascii="Times New Roman" w:hAnsi="Times New Roman" w:cs="Times New Roman"/>
+          <w:kern w:val="0"/>
+          <w:sz w:val="24"/>
+          <w:szCs w:val="24"/>
+        </w:rPr>
+      </w:pPr>
+      <w:r>
+        <w:rPr>
+          <w:rFonts w:ascii="Times New Roman" w:hAnsi="Times New Roman" w:cs="Times New Roman"/>
+          <w:kern w:val="0"/>
+          <w:sz w:val="24"/>
+          <w:szCs w:val="24"/>
+        </w:rPr>
+        <w:t>{</w:t>
+      </w:r>
+    </w:p>
+    <w:p>
+      <w:pPr>
+        <w:autoSpaceDE w:val="0"/>
+        <w:autoSpaceDN w:val="0"/>
+        <w:adjustRightInd w:val="0"/>
+        <w:spacing w:after="0" w:line="276" w:lineRule="auto"/>
+        <w:jc w:val="both"/>
+        <w:rPr>
+          <w:rFonts w:ascii="Times New Roman" w:hAnsi="Times New Roman" w:cs="Times New Roman"/>
+          <w:kern w:val="0"/>
+          <w:sz w:val="24"/>
+          <w:szCs w:val="24"/>
+        </w:rPr>
+      </w:pPr>
+      <w:r>
+        <w:rPr>
+          <w:rFonts w:ascii="Times New Roman" w:hAnsi="Times New Roman" w:cs="Times New Roman"/>
+          <w:kern w:val="0"/>
+          <w:sz w:val="24"/>
+          <w:szCs w:val="24"/>
+        </w:rPr>
+        <w:t>"sentiment": "negatif",</w:t>
+      </w:r>
+    </w:p>
+    <w:p>
+      <w:pPr>
+        <w:autoSpaceDE w:val="0"/>
+        <w:autoSpaceDN w:val="0"/>
+        <w:adjustRightInd w:val="0"/>
+        <w:spacing w:after="0" w:line="276" w:lineRule="auto"/>
+        <w:jc w:val="both"/>
+        <w:rPr>
+          <w:rFonts w:ascii="Times New Roman" w:hAnsi="Times New Roman" w:cs="Times New Roman"/>
+          <w:kern w:val="0"/>
+          <w:sz w:val="24"/>
+          <w:szCs w:val="24"/>
+        </w:rPr>
+      </w:pPr>
+      <w:r>
+        <w:rPr>
+          <w:rFonts w:ascii="Times New Roman" w:hAnsi="Times New Roman" w:cs="Times New Roman"/>
+          <w:kern w:val="0"/>
+          <w:sz w:val="24"/>
+          <w:szCs w:val="24"/>
+        </w:rPr>
+        <w:t>"categorie": "livraison",</w:t>
+      </w:r>
+    </w:p>
+    <w:p>
+      <w:pPr>
+        <w:autoSpaceDE w:val="0"/>
+        <w:autoSpaceDN w:val="0"/>
+        <w:adjustRightInd w:val="0"/>
+        <w:spacing w:after="0" w:line="276" w:lineRule="auto"/>
+        <w:jc w:val="both"/>
+        <w:rPr>
+          <w:rFonts w:ascii="Times New Roman" w:hAnsi="Times New Roman" w:cs="Times New Roman"/>
+          <w:kern w:val="0"/>
+          <w:sz w:val="24"/>
+          <w:szCs w:val="24"/>
+        </w:rPr>
+      </w:pPr>
+      <w:r>
+        <w:rPr>
+          <w:rFonts w:ascii="Times New Roman" w:hAnsi="Times New Roman" w:cs="Times New Roman"/>
+          <w:kern w:val="0"/>
+          <w:sz w:val="24"/>
+          <w:szCs w:val="24"/>
+        </w:rPr>
+        <w:t>"urgence": "moyenne",</w:t>
+      </w:r>
+    </w:p>
+    <w:p>
+      <w:pPr>
+        <w:autoSpaceDE w:val="0"/>
+        <w:autoSpaceDN w:val="0"/>
+        <w:adjustRightInd w:val="0"/>
+        <w:spacing w:after="0" w:line="276" w:lineRule="auto"/>
+        <w:jc w:val="both"/>
+        <w:rPr>
+          <w:rFonts w:ascii="Times New Roman" w:hAnsi="Times New Roman" w:cs="Times New Roman"/>
+          <w:kern w:val="0"/>
+          <w:sz w:val="24"/>
+          <w:szCs w:val="24"/>
+        </w:rPr>
+      </w:pPr>
+      <w:r>
+        <w:rPr>
+          <w:rFonts w:ascii="Times New Roman" w:hAnsi="Times New Roman" w:cs="Times New Roman"/>
+          <w:kern w:val="0"/>
+          <w:sz w:val="24"/>
+          <w:szCs w:val="24"/>
+        </w:rPr>
+        <w:t>"probleme": "Retard de livraison",</w:t>
+      </w:r>
+    </w:p>
+    <w:p>
+      <w:pPr>
+        <w:autoSpaceDE w:val="0"/>
+        <w:autoSpaceDN w:val="0"/>
+        <w:adjustRightInd w:val="0"/>
+        <w:spacing w:after="0" w:line="276" w:lineRule="auto"/>
+        <w:jc w:val="both"/>
+        <w:rPr>
+          <w:rFonts w:ascii="Times New Roman" w:hAnsi="Times New Roman" w:cs="Times New Roman"/>
+          <w:kern w:val="0"/>
+          <w:sz w:val="24"/>
+          <w:szCs w:val="24"/>
+        </w:rPr>
+      </w:pPr>
+      <w:r>
+        <w:rPr>
+          <w:rFonts w:ascii="Times New Roman" w:hAnsi="Times New Roman" w:cs="Times New Roman"/>
+          <w:kern w:val="0"/>
+          <w:sz w:val="24"/>
+          <w:szCs w:val="24"/>
+        </w:rPr>
+        <w:t>"confiance": 0.91</w:t>
+      </w:r>
+    </w:p>
+    <w:p>
+      <w:pPr>
+        <w:autoSpaceDE w:val="0"/>
+        <w:autoSpaceDN w:val="0"/>
+        <w:adjustRightInd w:val="0"/>
+        <w:spacing w:after="0" w:line="276" w:lineRule="auto"/>
+        <w:jc w:val="both"/>
+        <w:rPr>
+          <w:rFonts w:ascii="Times New Roman" w:hAnsi="Times New Roman" w:cs="Times New Roman"/>
+          <w:kern w:val="0"/>
+          <w:sz w:val="24"/>
+          <w:szCs w:val="24"/>
+        </w:rPr>
+      </w:pPr>
+      <w:r>
+        <w:rPr>
+          <w:rFonts w:ascii="Times New Roman" w:hAnsi="Times New Roman" w:cs="Times New Roman"/>
+          <w:kern w:val="0"/>
+          <w:sz w:val="24"/>
+          <w:szCs w:val="24"/>
+        </w:rPr>
+        <w:t>}</w:t>
+      </w:r>
+    </w:p>
+    <w:p>
+      <w:pPr>
+        <w:pStyle w:val="ListParagraph"/>
+        <w:numPr>
+          <w:ilvl w:val="0"/>
+          <w:numId w:val="10"/>
+        </w:numPr>
+        <w:autoSpaceDE w:val="0"/>
+        <w:autoSpaceDN w:val="0"/>
+        <w:adjustRightInd w:val="0"/>
+        <w:spacing w:after="0" w:line="276" w:lineRule="auto"/>
+        <w:jc w:val="center"/>
+        <w:rPr>
+          <w:rFonts w:ascii="Times New Roman" w:hAnsi="Times New Roman" w:cs="Times New Roman"/>
+          <w:b/>
+          <w:color w:val="000000"/>
+          <w:kern w:val="0"/>
+          <w:sz w:val="24"/>
+          <w:szCs w:val="24"/>
+        </w:rPr>
+      </w:pPr>
+      <w:r>
+        <w:rPr>
+          <w:rFonts w:ascii="Times New Roman" w:hAnsi="Times New Roman" w:cs="Times New Roman"/>
+          <w:b/>
+          <w:color w:val="000000"/>
+          <w:kern w:val="0"/>
+          <w:sz w:val="24"/>
+          <w:szCs w:val="24"/>
+        </w:rPr>
+        <w:t>Prompt proposé</w:t>
+      </w:r>
+    </w:p>
+    <w:p>
+      <w:pPr>
+        <w:autoSpaceDE w:val="0"/>
+        <w:autoSpaceDN w:val="0"/>
+        <w:adjustRightInd w:val="0"/>
+        <w:spacing w:after="0" w:line="276" w:lineRule="auto"/>
+        <w:jc w:val="both"/>
+        <w:rPr>
+          <w:rFonts w:ascii="Times New Roman" w:hAnsi="Times New Roman" w:cs="Times New Roman"/>
+          <w:b/>
+          <w:color w:val="000000"/>
+          <w:kern w:val="0"/>
+          <w:sz w:val="24"/>
+          <w:szCs w:val="24"/>
+        </w:rPr>
+      </w:pPr>
+      <w:r>
+        <w:rPr>
+          <w:rFonts w:ascii="Times New Roman" w:hAnsi="Times New Roman" w:cs="Times New Roman"/>
+          <w:b/>
+          <w:color w:val="000000"/>
+          <w:kern w:val="0"/>
+          <w:sz w:val="24"/>
+          <w:szCs w:val="24"/>
+        </w:rPr>
+        <w:t>Rôle :</w:t>
+      </w:r>
+    </w:p>
+    <w:p>
+      <w:pPr>
+        <w:autoSpaceDE w:val="0"/>
+        <w:autoSpaceDN w:val="0"/>
+        <w:adjustRightInd w:val="0"/>
+        <w:spacing w:after="0" w:line="360" w:lineRule="auto"/>
+        <w:jc w:val="both"/>
+        <w:rPr>
+          <w:rFonts w:ascii="Times New Roman" w:hAnsi="Times New Roman" w:cs="Times New Roman"/>
+          <w:b/>
+          <w:color w:val="000000"/>
+          <w:kern w:val="0"/>
+          <w:sz w:val="24"/>
+          <w:szCs w:val="24"/>
+        </w:rPr>
+      </w:pPr>
+      <w:r>
+        <w:rPr>
+          <w:rFonts w:ascii="Times New Roman" w:hAnsi="Times New Roman" w:cs="Times New Roman"/>
+          <w:color w:val="000000"/>
+          <w:kern w:val="0"/>
+          <w:sz w:val="24"/>
+          <w:szCs w:val="24"/>
+        </w:rPr>
+        <w:lastRenderedPageBreak/>
+        <w:t>Tu es un outil d'analyse automatique de commentaires clients, destiné à alimenter une application de</w:t>
+      </w:r>
+      <w:r>
+        <w:rPr>
+          <w:rFonts w:ascii="Times New Roman" w:hAnsi="Times New Roman" w:cs="Times New Roman"/>
+          <w:color w:val="000000"/>
+          <w:kern w:val="0"/>
+          <w:sz w:val="24"/>
+          <w:szCs w:val="24"/>
+        </w:rPr>
+        <w:t xml:space="preserve"> gestion de la relation client.</w:t>
+      </w:r>
+    </w:p>
+    <w:p>
+      <w:pPr>
+        <w:autoSpaceDE w:val="0"/>
+        <w:autoSpaceDN w:val="0"/>
+        <w:adjustRightInd w:val="0"/>
+        <w:spacing w:after="0" w:line="360" w:lineRule="auto"/>
+        <w:jc w:val="both"/>
+        <w:rPr>
+          <w:rFonts w:ascii="Times New Roman" w:hAnsi="Times New Roman" w:cs="Times New Roman"/>
+          <w:b/>
+          <w:color w:val="000000"/>
+          <w:kern w:val="0"/>
+          <w:sz w:val="24"/>
+          <w:szCs w:val="24"/>
+        </w:rPr>
+      </w:pPr>
+      <w:r>
+        <w:rPr>
+          <w:rFonts w:ascii="Times New Roman" w:hAnsi="Times New Roman" w:cs="Times New Roman"/>
+          <w:b/>
+          <w:color w:val="000000"/>
+          <w:kern w:val="0"/>
+          <w:sz w:val="24"/>
+          <w:szCs w:val="24"/>
+        </w:rPr>
+        <w:t>Tâche :</w:t>
+      </w:r>
+    </w:p>
+    <w:p>
+      <w:pPr>
+        <w:autoSpaceDE w:val="0"/>
+        <w:autoSpaceDN w:val="0"/>
+        <w:adjustRightInd w:val="0"/>
+        <w:spacing w:after="0" w:line="360" w:lineRule="auto"/>
+        <w:jc w:val="both"/>
+        <w:rPr>
+          <w:rFonts w:ascii="Times New Roman" w:hAnsi="Times New Roman" w:cs="Times New Roman"/>
+          <w:color w:val="000000"/>
+          <w:kern w:val="0"/>
+          <w:sz w:val="24"/>
+          <w:szCs w:val="24"/>
+        </w:rPr>
+      </w:pPr>
+      <w:r>
+        <w:rPr>
+          <w:rFonts w:ascii="Times New Roman" w:hAnsi="Times New Roman" w:cs="Times New Roman"/>
+          <w:color w:val="000000"/>
+          <w:kern w:val="0"/>
+          <w:sz w:val="24"/>
+          <w:szCs w:val="24"/>
+        </w:rPr>
+        <w:t>Analyse le commentaire suivant et retourne le résultat</w:t>
+      </w:r>
+      <w:r>
+        <w:rPr>
+          <w:rFonts w:ascii="Times New Roman" w:hAnsi="Times New Roman" w:cs="Times New Roman"/>
+          <w:color w:val="000000"/>
+          <w:kern w:val="0"/>
+          <w:sz w:val="24"/>
+          <w:szCs w:val="24"/>
+        </w:rPr>
+        <w:t xml:space="preserve"> exclusivement au format JSON, </w:t>
+      </w:r>
+      <w:r>
+        <w:rPr>
+          <w:rFonts w:ascii="Times New Roman" w:hAnsi="Times New Roman" w:cs="Times New Roman"/>
+          <w:color w:val="000000"/>
+          <w:kern w:val="0"/>
+          <w:sz w:val="24"/>
+          <w:szCs w:val="24"/>
+        </w:rPr>
+        <w:t>avec les champs suivants :</w:t>
+      </w:r>
+    </w:p>
+    <w:p>
+      <w:pPr>
+        <w:autoSpaceDE w:val="0"/>
+        <w:autoSpaceDN w:val="0"/>
+        <w:adjustRightInd w:val="0"/>
+        <w:spacing w:after="0" w:line="360" w:lineRule="auto"/>
+        <w:jc w:val="both"/>
+        <w:rPr>
+          <w:rFonts w:ascii="Times New Roman" w:hAnsi="Times New Roman" w:cs="Times New Roman"/>
+          <w:color w:val="000000"/>
+          <w:kern w:val="0"/>
+          <w:sz w:val="24"/>
+          <w:szCs w:val="24"/>
+        </w:rPr>
+      </w:pPr>
+      <w:r>
+        <w:rPr>
+          <w:rFonts w:ascii="Times New Roman" w:hAnsi="Times New Roman" w:cs="Times New Roman"/>
+          <w:b/>
+          <w:color w:val="000000"/>
+          <w:kern w:val="0"/>
+          <w:sz w:val="24"/>
+          <w:szCs w:val="24"/>
+        </w:rPr>
+        <w:t>- "sentiment" (chaîne de caractères)</w:t>
+      </w:r>
+      <w:r>
+        <w:rPr>
+          <w:rFonts w:ascii="Times New Roman" w:hAnsi="Times New Roman" w:cs="Times New Roman"/>
+          <w:b/>
+          <w:color w:val="000000"/>
+          <w:kern w:val="0"/>
+          <w:sz w:val="24"/>
+          <w:szCs w:val="24"/>
+        </w:rPr>
+        <w:t xml:space="preserve"> : </w:t>
+      </w:r>
+      <w:r>
+        <w:rPr>
+          <w:rFonts w:ascii="Times New Roman" w:hAnsi="Times New Roman" w:cs="Times New Roman"/>
+          <w:color w:val="000000"/>
+          <w:kern w:val="0"/>
+          <w:sz w:val="24"/>
+          <w:szCs w:val="24"/>
+        </w:rPr>
+        <w:t xml:space="preserve">la tonalité du commentaire. </w:t>
+      </w:r>
+      <w:r>
+        <w:rPr>
+          <w:rFonts w:ascii="Times New Roman" w:hAnsi="Times New Roman" w:cs="Times New Roman"/>
+          <w:color w:val="000000"/>
+          <w:kern w:val="0"/>
+          <w:sz w:val="24"/>
+          <w:szCs w:val="24"/>
+        </w:rPr>
+        <w:t>Valeurs autorisées : "positif", "negatif", "neutre".</w:t>
+      </w:r>
+    </w:p>
+    <w:p>
+      <w:pPr>
+        <w:autoSpaceDE w:val="0"/>
+        <w:autoSpaceDN w:val="0"/>
+        <w:adjustRightInd w:val="0"/>
+        <w:spacing w:after="0" w:line="360" w:lineRule="auto"/>
+        <w:jc w:val="both"/>
+        <w:rPr>
+          <w:rFonts w:ascii="Times New Roman" w:hAnsi="Times New Roman" w:cs="Times New Roman"/>
+          <w:color w:val="000000"/>
+          <w:kern w:val="0"/>
+          <w:sz w:val="24"/>
+          <w:szCs w:val="24"/>
+        </w:rPr>
+      </w:pPr>
+      <w:r>
+        <w:rPr>
+          <w:rFonts w:ascii="Times New Roman" w:hAnsi="Times New Roman" w:cs="Times New Roman"/>
+          <w:b/>
+          <w:color w:val="000000"/>
+          <w:kern w:val="0"/>
+          <w:sz w:val="24"/>
+          <w:szCs w:val="24"/>
+        </w:rPr>
+        <w:t>- "categorie" (chaîne de caractère</w:t>
+      </w:r>
+      <w:r>
+        <w:rPr>
+          <w:rFonts w:ascii="Times New Roman" w:hAnsi="Times New Roman" w:cs="Times New Roman"/>
+          <w:b/>
+          <w:color w:val="000000"/>
+          <w:kern w:val="0"/>
+          <w:sz w:val="24"/>
+          <w:szCs w:val="24"/>
+        </w:rPr>
+        <w:t xml:space="preserve">s) : </w:t>
+      </w:r>
+      <w:r>
+        <w:rPr>
+          <w:rFonts w:ascii="Times New Roman" w:hAnsi="Times New Roman" w:cs="Times New Roman"/>
+          <w:color w:val="000000"/>
+          <w:kern w:val="0"/>
+          <w:sz w:val="24"/>
+          <w:szCs w:val="24"/>
+        </w:rPr>
+        <w:t xml:space="preserve">le thème principal évoqué </w:t>
+      </w:r>
+      <w:r>
+        <w:rPr>
+          <w:rFonts w:ascii="Times New Roman" w:hAnsi="Times New Roman" w:cs="Times New Roman"/>
+          <w:color w:val="000000"/>
+          <w:kern w:val="0"/>
+          <w:sz w:val="24"/>
+          <w:szCs w:val="24"/>
+        </w:rPr>
+        <w:t>(ex : "livrais</w:t>
+      </w:r>
+      <w:r>
+        <w:rPr>
+          <w:rFonts w:ascii="Times New Roman" w:hAnsi="Times New Roman" w:cs="Times New Roman"/>
+          <w:color w:val="000000"/>
+          <w:kern w:val="0"/>
+          <w:sz w:val="24"/>
+          <w:szCs w:val="24"/>
+        </w:rPr>
+        <w:t>on", "produit", "prix", "service_</w:t>
+      </w:r>
+      <w:r>
+        <w:rPr>
+          <w:rFonts w:ascii="Times New Roman" w:hAnsi="Times New Roman" w:cs="Times New Roman"/>
+          <w:color w:val="000000"/>
+          <w:kern w:val="0"/>
+          <w:sz w:val="24"/>
+          <w:szCs w:val="24"/>
+        </w:rPr>
+        <w:t>client", "autre").</w:t>
+      </w:r>
+    </w:p>
+    <w:p>
+      <w:pPr>
+        <w:autoSpaceDE w:val="0"/>
+        <w:autoSpaceDN w:val="0"/>
+        <w:adjustRightInd w:val="0"/>
+        <w:spacing w:after="0" w:line="360" w:lineRule="auto"/>
+        <w:jc w:val="both"/>
+        <w:rPr>
+          <w:rFonts w:ascii="Times New Roman" w:hAnsi="Times New Roman" w:cs="Times New Roman"/>
+          <w:b/>
+          <w:color w:val="000000"/>
+          <w:kern w:val="0"/>
+          <w:sz w:val="24"/>
+          <w:szCs w:val="24"/>
+        </w:rPr>
+      </w:pPr>
+      <w:r>
+        <w:rPr>
+          <w:rFonts w:ascii="Times New Roman" w:hAnsi="Times New Roman" w:cs="Times New Roman"/>
+          <w:b/>
+          <w:color w:val="000000"/>
+          <w:kern w:val="0"/>
+          <w:sz w:val="24"/>
+          <w:szCs w:val="24"/>
+        </w:rPr>
+        <w:t xml:space="preserve">- "urgence" (chaîne de caractères) : </w:t>
+      </w:r>
+      <w:r>
+        <w:rPr>
+          <w:rFonts w:ascii="Times New Roman" w:hAnsi="Times New Roman" w:cs="Times New Roman"/>
+          <w:color w:val="000000"/>
+          <w:kern w:val="0"/>
+          <w:sz w:val="24"/>
+          <w:szCs w:val="24"/>
+        </w:rPr>
+        <w:t>le niveau d'urg</w:t>
+      </w:r>
+      <w:r>
+        <w:rPr>
+          <w:rFonts w:ascii="Times New Roman" w:hAnsi="Times New Roman" w:cs="Times New Roman"/>
+          <w:color w:val="000000"/>
+          <w:kern w:val="0"/>
+          <w:sz w:val="24"/>
+          <w:szCs w:val="24"/>
+        </w:rPr>
+        <w:t xml:space="preserve">ence à traiter ce commentaire. </w:t>
+      </w:r>
+      <w:r>
+        <w:rPr>
+          <w:rFonts w:ascii="Times New Roman" w:hAnsi="Times New Roman" w:cs="Times New Roman"/>
+          <w:color w:val="000000"/>
+          <w:kern w:val="0"/>
+          <w:sz w:val="24"/>
+          <w:szCs w:val="24"/>
+        </w:rPr>
+        <w:t>Valeurs autorisées : "faible", "moyenne", "élevée".</w:t>
+      </w:r>
+    </w:p>
+    <w:p>
+      <w:pPr>
+        <w:autoSpaceDE w:val="0"/>
+        <w:autoSpaceDN w:val="0"/>
+        <w:adjustRightInd w:val="0"/>
+        <w:spacing w:after="0" w:line="360" w:lineRule="auto"/>
+        <w:jc w:val="both"/>
+        <w:rPr>
+          <w:rFonts w:ascii="Times New Roman" w:hAnsi="Times New Roman" w:cs="Times New Roman"/>
+          <w:color w:val="000000"/>
+          <w:kern w:val="0"/>
+          <w:sz w:val="24"/>
+          <w:szCs w:val="24"/>
+        </w:rPr>
+      </w:pPr>
+      <w:r>
+        <w:rPr>
+          <w:rFonts w:ascii="Times New Roman" w:hAnsi="Times New Roman" w:cs="Times New Roman"/>
+          <w:b/>
+          <w:color w:val="000000"/>
+          <w:kern w:val="0"/>
+          <w:sz w:val="24"/>
+          <w:szCs w:val="24"/>
+        </w:rPr>
+        <w:t xml:space="preserve">- "probleme" (chaîne de caractères) : </w:t>
+      </w:r>
+      <w:r>
+        <w:rPr>
+          <w:rFonts w:ascii="Times New Roman" w:hAnsi="Times New Roman" w:cs="Times New Roman"/>
+          <w:color w:val="000000"/>
+          <w:kern w:val="0"/>
+          <w:sz w:val="24"/>
+          <w:szCs w:val="24"/>
+        </w:rPr>
+        <w:t>une descriptio</w:t>
+      </w:r>
+      <w:r>
+        <w:rPr>
+          <w:rFonts w:ascii="Times New Roman" w:hAnsi="Times New Roman" w:cs="Times New Roman"/>
+          <w:color w:val="000000"/>
+          <w:kern w:val="0"/>
+          <w:sz w:val="24"/>
+          <w:szCs w:val="24"/>
+        </w:rPr>
+        <w:t xml:space="preserve">n courte et claire du problème </w:t>
+      </w:r>
+      <w:r>
+        <w:rPr>
+          <w:rFonts w:ascii="Times New Roman" w:hAnsi="Times New Roman" w:cs="Times New Roman"/>
+          <w:color w:val="000000"/>
+          <w:kern w:val="0"/>
+          <w:sz w:val="24"/>
+          <w:szCs w:val="24"/>
+        </w:rPr>
+        <w:t>identifié, en une phrase.</w:t>
+      </w:r>
+    </w:p>
+    <w:p>
+      <w:pPr>
+        <w:autoSpaceDE w:val="0"/>
+        <w:autoSpaceDN w:val="0"/>
+        <w:adjustRightInd w:val="0"/>
+        <w:spacing w:after="0" w:line="360" w:lineRule="auto"/>
+        <w:jc w:val="both"/>
+        <w:rPr>
+          <w:rFonts w:ascii="Times New Roman" w:hAnsi="Times New Roman" w:cs="Times New Roman"/>
+          <w:color w:val="000000"/>
+          <w:kern w:val="0"/>
+          <w:sz w:val="24"/>
+          <w:szCs w:val="24"/>
+        </w:rPr>
+      </w:pPr>
+      <w:r>
+        <w:rPr>
+          <w:rFonts w:ascii="Times New Roman" w:hAnsi="Times New Roman" w:cs="Times New Roman"/>
+          <w:b/>
+          <w:color w:val="000000"/>
+          <w:kern w:val="0"/>
+          <w:sz w:val="24"/>
+          <w:szCs w:val="24"/>
+        </w:rPr>
+        <w:t xml:space="preserve">- "confiance" (nombre décimal) : </w:t>
+      </w:r>
+      <w:r>
+        <w:rPr>
+          <w:rFonts w:ascii="Times New Roman" w:hAnsi="Times New Roman" w:cs="Times New Roman"/>
+          <w:color w:val="000000"/>
+          <w:kern w:val="0"/>
+          <w:sz w:val="24"/>
+          <w:szCs w:val="24"/>
+        </w:rPr>
+        <w:t>ton niveau de</w:t>
+      </w:r>
+      <w:r>
+        <w:rPr>
+          <w:rFonts w:ascii="Times New Roman" w:hAnsi="Times New Roman" w:cs="Times New Roman"/>
+          <w:color w:val="000000"/>
+          <w:kern w:val="0"/>
+          <w:sz w:val="24"/>
+          <w:szCs w:val="24"/>
+        </w:rPr>
+        <w:t xml:space="preserve"> confiance dans cette analyse, </w:t>
+      </w:r>
+      <w:r>
+        <w:rPr>
+          <w:rFonts w:ascii="Times New Roman" w:hAnsi="Times New Roman" w:cs="Times New Roman"/>
+          <w:color w:val="000000"/>
+          <w:kern w:val="0"/>
+          <w:sz w:val="24"/>
+          <w:szCs w:val="24"/>
+        </w:rPr>
+        <w:t>compris entre 0 et 1 (ex : 0.85).</w:t>
+      </w:r>
+    </w:p>
+    <w:p>
+      <w:pPr>
+        <w:autoSpaceDE w:val="0"/>
+        <w:autoSpaceDN w:val="0"/>
+        <w:adjustRightInd w:val="0"/>
+        <w:spacing w:after="0" w:line="360" w:lineRule="auto"/>
+        <w:jc w:val="both"/>
+        <w:rPr>
+          <w:rFonts w:ascii="Times New Roman" w:hAnsi="Times New Roman" w:cs="Times New Roman"/>
+          <w:color w:val="000000"/>
+          <w:kern w:val="0"/>
+          <w:sz w:val="24"/>
+          <w:szCs w:val="24"/>
+        </w:rPr>
+      </w:pPr>
+      <w:r>
+        <w:rPr>
+          <w:rFonts w:ascii="Times New Roman" w:hAnsi="Times New Roman" w:cs="Times New Roman"/>
+          <w:b/>
+          <w:color w:val="000000"/>
+          <w:kern w:val="0"/>
+          <w:sz w:val="24"/>
+          <w:szCs w:val="24"/>
+        </w:rPr>
+        <w:t xml:space="preserve">Commentaire à analyser : </w:t>
+      </w:r>
+      <w:r>
+        <w:rPr>
+          <w:rFonts w:ascii="Times New Roman" w:hAnsi="Times New Roman" w:cs="Times New Roman"/>
+          <w:color w:val="000000"/>
+          <w:kern w:val="0"/>
+          <w:sz w:val="24"/>
+          <w:szCs w:val="24"/>
+        </w:rPr>
+        <w:t>"Le service est rapide mais l'app</w:t>
+      </w:r>
+      <w:r>
+        <w:rPr>
+          <w:rFonts w:ascii="Times New Roman" w:hAnsi="Times New Roman" w:cs="Times New Roman"/>
+          <w:color w:val="000000"/>
+          <w:kern w:val="0"/>
+          <w:sz w:val="24"/>
+          <w:szCs w:val="24"/>
+        </w:rPr>
+        <w:t>lication plante régulièrement."</w:t>
+      </w:r>
+    </w:p>
+    <w:p>
+      <w:pPr>
+        <w:autoSpaceDE w:val="0"/>
+        <w:autoSpaceDN w:val="0"/>
+        <w:adjustRightInd w:val="0"/>
+        <w:spacing w:after="0" w:line="360" w:lineRule="auto"/>
+        <w:jc w:val="both"/>
+        <w:rPr>
+          <w:rFonts w:ascii="Times New Roman" w:hAnsi="Times New Roman" w:cs="Times New Roman"/>
+          <w:b/>
+          <w:color w:val="000000"/>
+          <w:kern w:val="0"/>
+          <w:sz w:val="24"/>
+          <w:szCs w:val="24"/>
+        </w:rPr>
+      </w:pPr>
+      <w:r>
+        <w:rPr>
+          <w:rFonts w:ascii="Times New Roman" w:hAnsi="Times New Roman" w:cs="Times New Roman"/>
+          <w:b/>
+          <w:color w:val="000000"/>
+          <w:kern w:val="0"/>
+          <w:sz w:val="24"/>
+          <w:szCs w:val="24"/>
+        </w:rPr>
+        <w:t>Contraintes :</w:t>
+      </w:r>
+    </w:p>
+    <w:p>
+      <w:pPr>
+        <w:autoSpaceDE w:val="0"/>
+        <w:autoSpaceDN w:val="0"/>
+        <w:adjustRightInd w:val="0"/>
+        <w:spacing w:after="0" w:line="360" w:lineRule="auto"/>
+        <w:jc w:val="both"/>
+        <w:rPr>
+          <w:rFonts w:ascii="Times New Roman" w:hAnsi="Times New Roman" w:cs="Times New Roman"/>
+          <w:color w:val="000000"/>
+          <w:kern w:val="0"/>
+          <w:sz w:val="24"/>
+          <w:szCs w:val="24"/>
+        </w:rPr>
+      </w:pPr>
+      <w:r>
+        <w:rPr>
+          <w:rFonts w:ascii="Times New Roman" w:hAnsi="Times New Roman" w:cs="Times New Roman"/>
+          <w:b/>
+          <w:color w:val="000000"/>
+          <w:kern w:val="0"/>
+          <w:sz w:val="24"/>
+          <w:szCs w:val="24"/>
+        </w:rPr>
+        <w:t xml:space="preserve">- </w:t>
+      </w:r>
+      <w:r>
+        <w:rPr>
+          <w:rFonts w:ascii="Times New Roman" w:hAnsi="Times New Roman" w:cs="Times New Roman"/>
+          <w:color w:val="000000"/>
+          <w:kern w:val="0"/>
+          <w:sz w:val="24"/>
+          <w:szCs w:val="24"/>
+        </w:rPr>
+        <w:t>Réponds uniquement avec le JSON, sans aucun texte avant ou après.</w:t>
+      </w:r>
+    </w:p>
+    <w:p>
+      <w:pPr>
+        <w:autoSpaceDE w:val="0"/>
+        <w:autoSpaceDN w:val="0"/>
+        <w:adjustRightInd w:val="0"/>
+        <w:spacing w:after="0" w:line="360" w:lineRule="auto"/>
+        <w:jc w:val="both"/>
+        <w:rPr>
+          <w:rFonts w:ascii="Times New Roman" w:hAnsi="Times New Roman" w:cs="Times New Roman"/>
+          <w:color w:val="000000"/>
+          <w:kern w:val="0"/>
+          <w:sz w:val="24"/>
+          <w:szCs w:val="24"/>
+        </w:rPr>
+      </w:pPr>
+      <w:r>
+        <w:rPr>
+          <w:rFonts w:ascii="Times New Roman" w:hAnsi="Times New Roman" w:cs="Times New Roman"/>
+          <w:color w:val="000000"/>
+          <w:kern w:val="0"/>
+          <w:sz w:val="24"/>
+          <w:szCs w:val="24"/>
+        </w:rPr>
+        <w:t>- N'ajoute aucun champ en dehors de ceux demandés.</w:t>
+      </w:r>
+    </w:p>
+    <w:p>
+      <w:pPr>
+        <w:pStyle w:val="ListParagraph"/>
+        <w:numPr>
+          <w:ilvl w:val="0"/>
+          <w:numId w:val="10"/>
+        </w:numPr>
+        <w:autoSpaceDE w:val="0"/>
+        <w:autoSpaceDN w:val="0"/>
+        <w:adjustRightInd w:val="0"/>
+        <w:spacing w:after="0" w:line="360" w:lineRule="auto"/>
+        <w:jc w:val="center"/>
+        <w:rPr>
+          <w:rFonts w:ascii="Times New Roman" w:hAnsi="Times New Roman" w:cs="Times New Roman"/>
+          <w:b/>
+          <w:color w:val="000000"/>
+          <w:kern w:val="0"/>
+          <w:sz w:val="24"/>
+          <w:szCs w:val="24"/>
+        </w:rPr>
+      </w:pPr>
+      <w:r>
+        <w:rPr>
+          <w:rFonts w:ascii="Times New Roman" w:hAnsi="Times New Roman" w:cs="Times New Roman"/>
+          <w:b/>
+          <w:color w:val="000000"/>
+          <w:kern w:val="0"/>
+          <w:sz w:val="24"/>
+          <w:szCs w:val="24"/>
+        </w:rPr>
+        <w:t>Réponse de Claude</w:t>
+      </w:r>
+    </w:p>
+    <w:p>
+      <w:pPr>
+        <w:autoSpaceDE w:val="0"/>
+        <w:autoSpaceDN w:val="0"/>
+        <w:adjustRightInd w:val="0"/>
+        <w:spacing w:after="0" w:line="360" w:lineRule="auto"/>
+        <w:ind w:left="360"/>
+        <w:rPr>
+          <w:rFonts w:ascii="Times New Roman" w:hAnsi="Times New Roman" w:cs="Times New Roman"/>
+          <w:b/>
+          <w:color w:val="000000"/>
+          <w:kern w:val="0"/>
+          <w:sz w:val="24"/>
+          <w:szCs w:val="24"/>
+        </w:rPr>
+      </w:pPr>
+      <w:r>
+        <w:rPr>
+          <w:rFonts w:ascii="Times New Roman" w:hAnsi="Times New Roman" w:cs="Times New Roman"/>
+          <w:b/>
+          <w:color w:val="000000"/>
+          <w:kern w:val="0"/>
           <w:sz w:val="24"/>
           <w:szCs w:val="24"/>
         </w:rPr>
         <w:drawing>
-          <wp:inline distT="0" distB="0" distL="0" distR="0" wp14:anchorId="2B5C3D32" wp14:editId="2A42548B">
-            <wp:extent cx="5760720" cy="5534025"/>
-            <wp:effectExtent l="0" t="0" r="0" b="9525"/>
-            <wp:docPr id="1785235016" name="Image 1"/>
+          <wp:inline distT="0" distB="0" distL="0" distR="0" wp14:anchorId="6F092AB9" wp14:editId="5A8F9D07">
+            <wp:extent cx="5760720" cy="2529205"/>
+            <wp:effectExtent l="0" t="0" r="0" b="4445"/>
+            <wp:docPr id="1" name="Picture 1"/>
             <wp:cNvGraphicFramePr>
               <a:graphicFrameLocks xmlns:a="http://schemas.openxmlformats.org/drawingml/2006/main" noChangeAspect="1"/>
             </wp:cNvGraphicFramePr>
@@ -3743,112 +4961,7 @@
               <a:graphicData uri="http://schemas.openxmlformats.org/drawingml/2006/picture">
                 <pic:pic xmlns:pic="http://schemas.openxmlformats.org/drawingml/2006/picture">
                   <pic:nvPicPr>
-                    <pic:cNvPr id="1785235016" name=""/>
-                    <pic:cNvPicPr/>
-                  </pic:nvPicPr>
-                  <pic:blipFill>
-                    <a:blip r:embed="rId13"/>
-                    <a:stretch>
-                      <a:fillRect/>
-                    </a:stretch>
-                  </pic:blipFill>
-                  <pic:spPr>
-                    <a:xfrm>
-                      <a:off x="0" y="0"/>
-                      <a:ext cx="5760720" cy="5534025"/>
-                    </a:xfrm>
-                    <a:prstGeom prst="rect">
-                      <a:avLst/>
-                    </a:prstGeom>
-                  </pic:spPr>
-                </pic:pic>
-              </a:graphicData>
-            </a:graphic>
-          </wp:inline>
-        </w:drawing>
-      </w:r>
-    </w:p>
-    <w:p>
-      <w:pPr>
-        <w:spacing w:line="360" w:lineRule="auto"/>
-        <w:rPr>
-          <w:rFonts w:ascii="Times New Roman" w:hAnsi="Times New Roman" w:cs="Times New Roman"/>
-          <w:b/>
-          <w:bCs/>
-          <w:sz w:val="28"/>
-          <w:szCs w:val="28"/>
-        </w:rPr>
-      </w:pPr>
-    </w:p>
-    <w:p>
-      <w:pPr>
-        <w:spacing w:line="360" w:lineRule="auto"/>
-        <w:jc w:val="both"/>
-        <w:rPr>
-          <w:rFonts w:ascii="Times New Roman" w:hAnsi="Times New Roman" w:cs="Times New Roman"/>
-          <w:sz w:val="24"/>
-          <w:szCs w:val="24"/>
-        </w:rPr>
-      </w:pPr>
-    </w:p>
-    <w:p>
-      <w:pPr>
-        <w:spacing w:line="360" w:lineRule="auto"/>
-        <w:jc w:val="both"/>
-        <w:rPr>
-          <w:rFonts w:ascii="Times New Roman" w:hAnsi="Times New Roman" w:cs="Times New Roman"/>
-          <w:sz w:val="24"/>
-          <w:szCs w:val="24"/>
-        </w:rPr>
-      </w:pPr>
-    </w:p>
-    <w:p>
-      <w:pPr>
-        <w:spacing w:line="360" w:lineRule="auto"/>
-        <w:ind w:left="360"/>
-        <w:jc w:val="center"/>
-        <w:rPr>
-          <w:rFonts w:ascii="Times New Roman" w:hAnsi="Times New Roman" w:cs="Times New Roman"/>
-          <w:b/>
-          <w:bCs/>
-          <w:sz w:val="24"/>
-          <w:szCs w:val="24"/>
-        </w:rPr>
-      </w:pPr>
-    </w:p>
-    <w:p>
-      <w:pPr>
-        <w:spacing w:line="360" w:lineRule="auto"/>
-        <w:ind w:left="360"/>
-        <w:rPr>
-          <w:rFonts w:ascii="Times New Roman" w:hAnsi="Times New Roman" w:cs="Times New Roman"/>
-          <w:b/>
-          <w:bCs/>
-          <w:sz w:val="24"/>
-          <w:szCs w:val="24"/>
-        </w:rPr>
-      </w:pPr>
-      <w:r>
-        <w:rPr>
-          <w:rFonts w:ascii="Times New Roman" w:hAnsi="Times New Roman" w:cs="Times New Roman"/>
-          <w:b/>
-          <w:bCs/>
-          <w:sz w:val="24"/>
-          <w:szCs w:val="24"/>
-        </w:rPr>
-        <w:drawing>
-          <wp:inline distT="0" distB="0" distL="0" distR="0" wp14:anchorId="2DC74EC1" wp14:editId="2C4212D6">
-            <wp:extent cx="5760720" cy="4962525"/>
-            <wp:effectExtent l="0" t="0" r="0" b="9525"/>
-            <wp:docPr id="52188413" name="Image 1"/>
-            <wp:cNvGraphicFramePr>
-              <a:graphicFrameLocks xmlns:a="http://schemas.openxmlformats.org/drawingml/2006/main" noChangeAspect="1"/>
-            </wp:cNvGraphicFramePr>
-            <a:graphic xmlns:a="http://schemas.openxmlformats.org/drawingml/2006/main">
-              <a:graphicData uri="http://schemas.openxmlformats.org/drawingml/2006/picture">
-                <pic:pic xmlns:pic="http://schemas.openxmlformats.org/drawingml/2006/picture">
-                  <pic:nvPicPr>
-                    <pic:cNvPr id="52188413" name=""/>
+                    <pic:cNvPr id="1" name=""/>
                     <pic:cNvPicPr/>
                   </pic:nvPicPr>
                   <pic:blipFill>
@@ -3860,7 +4973,7 @@
                   <pic:spPr>
                     <a:xfrm>
                       <a:off x="0" y="0"/>
-                      <a:ext cx="5760720" cy="4962525"/>
+                      <a:ext cx="5760720" cy="2529205"/>
                     </a:xfrm>
                     <a:prstGeom prst="rect">
                       <a:avLst/>
@@ -3872,6 +4985,86 @@
           </wp:inline>
         </w:drawing>
       </w:r>
+    </w:p>
+    <w:p>
+      <w:pPr>
+        <w:autoSpaceDE w:val="0"/>
+        <w:autoSpaceDN w:val="0"/>
+        <w:adjustRightInd w:val="0"/>
+        <w:spacing w:after="0" w:line="360" w:lineRule="auto"/>
+        <w:ind w:left="360"/>
+        <w:rPr>
+          <w:rFonts w:ascii="Times New Roman" w:hAnsi="Times New Roman" w:cs="Times New Roman"/>
+          <w:b/>
+          <w:color w:val="000000"/>
+          <w:kern w:val="0"/>
+          <w:sz w:val="24"/>
+          <w:szCs w:val="24"/>
+        </w:rPr>
+      </w:pPr>
+      <w:bookmarkStart w:id="0" w:name="_GoBack"/>
+      <w:bookmarkEnd w:id="0"/>
+    </w:p>
+    <w:p>
+      <w:pPr>
+        <w:spacing w:line="360" w:lineRule="auto"/>
+        <w:rPr>
+          <w:rFonts w:ascii="Times New Roman" w:hAnsi="Times New Roman" w:cs="Times New Roman"/>
+          <w:b/>
+          <w:bCs/>
+          <w:sz w:val="28"/>
+          <w:szCs w:val="28"/>
+        </w:rPr>
+      </w:pPr>
+    </w:p>
+    <w:p>
+      <w:pPr>
+        <w:spacing w:line="360" w:lineRule="auto"/>
+        <w:jc w:val="both"/>
+        <w:rPr>
+          <w:rFonts w:ascii="Times New Roman" w:hAnsi="Times New Roman" w:cs="Times New Roman"/>
+          <w:sz w:val="24"/>
+          <w:szCs w:val="24"/>
+        </w:rPr>
+      </w:pPr>
+    </w:p>
+    <w:p>
+      <w:pPr>
+        <w:spacing w:line="360" w:lineRule="auto"/>
+        <w:jc w:val="both"/>
+        <w:rPr>
+          <w:rFonts w:ascii="Times New Roman" w:hAnsi="Times New Roman" w:cs="Times New Roman"/>
+          <w:sz w:val="24"/>
+          <w:szCs w:val="24"/>
+        </w:rPr>
+      </w:pPr>
+    </w:p>
+    <w:p>
+      <w:pPr>
+        <w:spacing w:line="360" w:lineRule="auto"/>
+        <w:ind w:left="360"/>
+        <w:jc w:val="center"/>
+        <w:rPr>
+          <w:rFonts w:ascii="Times New Roman" w:hAnsi="Times New Roman" w:cs="Times New Roman"/>
+          <w:b/>
+          <w:bCs/>
+          <w:sz w:val="24"/>
+          <w:szCs w:val="24"/>
+        </w:rPr>
+      </w:pPr>
+    </w:p>
+    <w:p>
+      <w:pPr>
+        <w:spacing w:line="360" w:lineRule="auto"/>
+        <w:ind w:left="360"/>
+        <w:rPr>
+          <w:rFonts w:ascii="Times New Roman" w:hAnsi="Times New Roman" w:cs="Times New Roman"/>
+          <w:b/>
+          <w:bCs/>
+          <w:sz w:val="24"/>
+          <w:szCs w:val="24"/>
+        </w:rPr>
+      </w:pPr>
     </w:p>
     <w:sectPr>
       <w:pgSz w:w="11906" w:h="16838"/>
@@ -3884,8 +5077,8 @@
 </file>
 
 <file path=word/numbering.xml><?xml version="1.0" encoding="utf-8"?>
-<w:numbering xmlns:wpc="http://schemas.microsoft.com/office/word/2010/wordprocessingCanvas" xmlns:cx="http://schemas.microsoft.com/office/drawing/2014/chartex" xmlns:cx1="http://schemas.microsoft.com/office/drawing/2015/9/8/chartex" xmlns:cx2="http://schemas.microsoft.com/office/drawing/2015/10/21/chartex" xmlns:cx3="http://schemas.microsoft.com/office/drawing/2016/5/9/chartex" xmlns:cx4="http://schemas.microsoft.com/office/drawing/2016/5/10/chartex" xmlns:cx5="http://schemas.microsoft.com/office/drawing/2016/5/11/chartex" xmlns:cx6="http://schemas.microsoft.com/office/drawing/2016/5/12/chartex" xmlns:cx7="http://schemas.microsoft.com/office/drawing/2016/5/13/chartex" xmlns:cx8="http://schemas.microsoft.com/office/drawing/2016/5/14/chartex" xmlns:mc="http://schemas.openxmlformats.org/markup-compatibility/2006" xmlns:aink="http://schemas.microsoft.com/office/drawing/2016/ink" xmlns:am3d="http://schemas.microsoft.com/office/drawing/2017/model3d" xmlns:o="urn:schemas-microsoft-com:office:office" xmlns:oel="http://schemas.microsoft.com/office/2019/extlst" xmlns:r="http://schemas.openxmlformats.org/officeDocument/2006/relationships" xmlns:m="http://schemas.openxmlformats.org/officeDocument/2006/math" xmlns:v="urn:schemas-microsoft-com:vml" xmlns:wp14="http://schemas.microsoft.com/office/word/2010/wordprocessingDrawing" xmlns:wp="http://schemas.openxmlformats.org/drawingml/2006/wordprocessingDrawing" xmlns:w10="urn:schemas-microsoft-com:office:word" xmlns:w="http://schemas.openxmlformats.org/wordprocessingml/2006/main" xmlns:w14="http://schemas.microsoft.com/office/word/2010/wordml" xmlns:w15="http://schemas.microsoft.com/office/word/2012/wordml" xmlns:w16cex="http://schemas.microsoft.com/office/word/2018/wordml/cex" xmlns:w16cid="http://schemas.microsoft.com/office/word/2016/wordml/cid" xmlns:w16="http://schemas.microsoft.com/office/word/2018/wordml" xmlns:w16du="http://schemas.microsoft.com/office/word/2023/wordml/word16du" xmlns:w16sdtdh="http://schemas.microsoft.com/office/word/2020/wordml/sdtdatahash" xmlns:w16sdtfl="http://schemas.microsoft.com/office/word/2024/wordml/sdtformatlock" xmlns:w16se="http://schemas.microsoft.com/office/word/2015/wordml/symex" xmlns:wpg="http://schemas.microsoft.com/office/word/2010/wordprocessingGroup" xmlns:wpi="http://schemas.microsoft.com/office/word/2010/wordprocessingInk" xmlns:wne="http://schemas.microsoft.com/office/word/2006/wordml" xmlns:wps="http://schemas.microsoft.com/office/word/2010/wordprocessingShape" mc:Ignorable="w14 w15 w16se w16cid w16 w16cex w16sdtdh w16sdtfl w16du wp14">
-  <w:abstractNum w:abstractNumId="0" w15:restartNumberingAfterBreak="0">
+<w:numbering xmlns:wpc="http://schemas.microsoft.com/office/word/2010/wordprocessingCanvas" xmlns:mc="http://schemas.openxmlformats.org/markup-compatibility/2006" xmlns:o="urn:schemas-microsoft-com:office:office" xmlns:r="http://schemas.openxmlformats.org/officeDocument/2006/relationships" xmlns:m="http://schemas.openxmlformats.org/officeDocument/2006/math" xmlns:v="urn:schemas-microsoft-com:vml" xmlns:wp14="http://schemas.microsoft.com/office/word/2010/wordprocessingDrawing" xmlns:wp="http://schemas.openxmlformats.org/drawingml/2006/wordprocessingDrawing" xmlns:w10="urn:schemas-microsoft-com:office:word" xmlns:w="http://schemas.openxmlformats.org/wordprocessingml/2006/main" xmlns:w14="http://schemas.microsoft.com/office/word/2010/wordml" xmlns:w15="http://schemas.microsoft.com/office/word/2012/wordml" xmlns:wpg="http://schemas.microsoft.com/office/word/2010/wordprocessingGroup" xmlns:wpi="http://schemas.microsoft.com/office/word/2010/wordprocessingInk" xmlns:wne="http://schemas.microsoft.com/office/word/2006/wordml" xmlns:wps="http://schemas.microsoft.com/office/word/2010/wordprocessingShape" mc:Ignorable="w14 w15 wp14">
+  <w:abstractNum w:abstractNumId="0">
     <w:nsid w:val="036B4D12"/>
     <w:multiLevelType w:val="hybridMultilevel"/>
     <w:tmpl w:val="5C46682A"/>
@@ -3974,7 +5167,7 @@
       </w:pPr>
     </w:lvl>
   </w:abstractNum>
-  <w:abstractNum w:abstractNumId="1" w15:restartNumberingAfterBreak="0">
+  <w:abstractNum w:abstractNumId="1">
     <w:nsid w:val="165A331E"/>
     <w:multiLevelType w:val="hybridMultilevel"/>
     <w:tmpl w:val="9A24C640"/>
@@ -4086,10 +5279,10 @@
       </w:rPr>
     </w:lvl>
   </w:abstractNum>
-  <w:abstractNum w:abstractNumId="2" w15:restartNumberingAfterBreak="0">
+  <w:abstractNum w:abstractNumId="2">
     <w:nsid w:val="40234EF3"/>
     <w:multiLevelType w:val="hybridMultilevel"/>
-    <w:tmpl w:val="AEE61C34"/>
+    <w:tmpl w:val="C1489748"/>
     <w:lvl w:ilvl="0" w:tplc="040C0009">
       <w:start w:val="1"/>
       <w:numFmt w:val="bullet"/>
@@ -4199,7 +5392,7 @@
       </w:rPr>
     </w:lvl>
   </w:abstractNum>
-  <w:abstractNum w:abstractNumId="3" w15:restartNumberingAfterBreak="0">
+  <w:abstractNum w:abstractNumId="3">
     <w:nsid w:val="4E6D6647"/>
     <w:multiLevelType w:val="hybridMultilevel"/>
     <w:tmpl w:val="0BC2673C"/>
@@ -4311,7 +5504,7 @@
       </w:rPr>
     </w:lvl>
   </w:abstractNum>
-  <w:abstractNum w:abstractNumId="4" w15:restartNumberingAfterBreak="0">
+  <w:abstractNum w:abstractNumId="4">
     <w:nsid w:val="52344C8A"/>
     <w:multiLevelType w:val="hybridMultilevel"/>
     <w:tmpl w:val="159A3A58"/>
@@ -4423,7 +5616,7 @@
       </w:rPr>
     </w:lvl>
   </w:abstractNum>
-  <w:abstractNum w:abstractNumId="5" w15:restartNumberingAfterBreak="0">
+  <w:abstractNum w:abstractNumId="5">
     <w:nsid w:val="5D3211AD"/>
     <w:multiLevelType w:val="hybridMultilevel"/>
     <w:tmpl w:val="8DBABEC8"/>
@@ -4509,7 +5702,7 @@
       </w:pPr>
     </w:lvl>
   </w:abstractNum>
-  <w:abstractNum w:abstractNumId="6" w15:restartNumberingAfterBreak="0">
+  <w:abstractNum w:abstractNumId="6">
     <w:nsid w:val="6C944ACB"/>
     <w:multiLevelType w:val="hybridMultilevel"/>
     <w:tmpl w:val="3E026470"/>
@@ -4595,7 +5788,96 @@
       </w:pPr>
     </w:lvl>
   </w:abstractNum>
-  <w:abstractNum w:abstractNumId="7" w15:restartNumberingAfterBreak="0">
+  <w:abstractNum w:abstractNumId="7">
+    <w:nsid w:val="707328F1"/>
+    <w:multiLevelType w:val="hybridMultilevel"/>
+    <w:tmpl w:val="41D04420"/>
+    <w:lvl w:ilvl="0" w:tplc="040C000F">
+      <w:start w:val="1"/>
+      <w:numFmt w:val="decimal"/>
+      <w:lvlText w:val="%1."/>
+      <w:lvlJc w:val="left"/>
+      <w:pPr>
+        <w:ind w:left="720" w:hanging="360"/>
+      </w:pPr>
+      <w:rPr>
+        <w:rFonts w:hint="default"/>
+      </w:rPr>
+    </w:lvl>
+    <w:lvl w:ilvl="1" w:tplc="040C0019" w:tentative="1">
+      <w:start w:val="1"/>
+      <w:numFmt w:val="lowerLetter"/>
+      <w:lvlText w:val="%2."/>
+      <w:lvlJc w:val="left"/>
+      <w:pPr>
+        <w:ind w:left="1440" w:hanging="360"/>
+      </w:pPr>
+    </w:lvl>
+    <w:lvl w:ilvl="2" w:tplc="040C001B" w:tentative="1">
+      <w:start w:val="1"/>
+      <w:numFmt w:val="lowerRoman"/>
+      <w:lvlText w:val="%3."/>
+      <w:lvlJc w:val="right"/>
+      <w:pPr>
+        <w:ind w:left="2160" w:hanging="180"/>
+      </w:pPr>
+    </w:lvl>
+    <w:lvl w:ilvl="3" w:tplc="040C000F" w:tentative="1">
+      <w:start w:val="1"/>
+      <w:numFmt w:val="decimal"/>
+      <w:lvlText w:val="%4."/>
+      <w:lvlJc w:val="left"/>
+      <w:pPr>
+        <w:ind w:left="2880" w:hanging="360"/>
+      </w:pPr>
+    </w:lvl>
+    <w:lvl w:ilvl="4" w:tplc="040C0019" w:tentative="1">
+      <w:start w:val="1"/>
+      <w:numFmt w:val="lowerLetter"/>
+      <w:lvlText w:val="%5."/>
+      <w:lvlJc w:val="left"/>
+      <w:pPr>
+        <w:ind w:left="3600" w:hanging="360"/>
+      </w:pPr>
+    </w:lvl>
+    <w:lvl w:ilvl="5" w:tplc="040C001B" w:tentative="1">
+      <w:start w:val="1"/>
+      <w:numFmt w:val="lowerRoman"/>
+      <w:lvlText w:val="%6."/>
+      <w:lvlJc w:val="right"/>
+      <w:pPr>
+        <w:ind w:left="4320" w:hanging="180"/>
+      </w:pPr>
+    </w:lvl>
+    <w:lvl w:ilvl="6" w:tplc="040C000F" w:tentative="1">
+      <w:start w:val="1"/>
+      <w:numFmt w:val="decimal"/>
+      <w:lvlText w:val="%7."/>
+      <w:lvlJc w:val="left"/>
+      <w:pPr>
+        <w:ind w:left="5040" w:hanging="360"/>
+      </w:pPr>
+    </w:lvl>
+    <w:lvl w:ilvl="7" w:tplc="040C0019" w:tentative="1">
+      <w:start w:val="1"/>
+      <w:numFmt w:val="lowerLetter"/>
+      <w:lvlText w:val="%8."/>
+      <w:lvlJc w:val="left"/>
+      <w:pPr>
+        <w:ind w:left="5760" w:hanging="360"/>
+      </w:pPr>
+    </w:lvl>
+    <w:lvl w:ilvl="8" w:tplc="040C001B" w:tentative="1">
+      <w:start w:val="1"/>
+      <w:numFmt w:val="lowerRoman"/>
+      <w:lvlText w:val="%9."/>
+      <w:lvlJc w:val="right"/>
+      <w:pPr>
+        <w:ind w:left="6480" w:hanging="180"/>
+      </w:pPr>
+    </w:lvl>
+  </w:abstractNum>
+  <w:abstractNum w:abstractNumId="8">
     <w:nsid w:val="73583B76"/>
     <w:multiLevelType w:val="hybridMultilevel"/>
     <w:tmpl w:val="783C0D26"/>
@@ -4687,7 +5969,7 @@
       </w:pPr>
     </w:lvl>
   </w:abstractNum>
-  <w:abstractNum w:abstractNumId="8" w15:restartNumberingAfterBreak="0">
+  <w:abstractNum w:abstractNumId="9">
     <w:nsid w:val="73BE1235"/>
     <w:multiLevelType w:val="hybridMultilevel"/>
     <w:tmpl w:val="708ADF02"/>
@@ -4800,7 +6082,7 @@
       </w:rPr>
     </w:lvl>
   </w:abstractNum>
-  <w:abstractNum w:abstractNumId="9" w15:restartNumberingAfterBreak="0">
+  <w:abstractNum w:abstractNumId="10">
     <w:nsid w:val="7D1021B1"/>
     <w:multiLevelType w:val="hybridMultilevel"/>
     <w:tmpl w:val="B7B664D6"/>
@@ -4912,41 +6194,44 @@
       </w:rPr>
     </w:lvl>
   </w:abstractNum>
-  <w:num w:numId="1" w16cid:durableId="841430555">
+  <w:num w:numId="1">
+    <w:abstractNumId w:val="9"/>
+  </w:num>
+  <w:num w:numId="2">
+    <w:abstractNumId w:val="10"/>
+  </w:num>
+  <w:num w:numId="3">
+    <w:abstractNumId w:val="4"/>
+  </w:num>
+  <w:num w:numId="4">
+    <w:abstractNumId w:val="6"/>
+  </w:num>
+  <w:num w:numId="5">
     <w:abstractNumId w:val="8"/>
   </w:num>
-  <w:num w:numId="2" w16cid:durableId="1977026907">
-    <w:abstractNumId w:val="9"/>
-  </w:num>
-  <w:num w:numId="3" w16cid:durableId="311643469">
-    <w:abstractNumId w:val="4"/>
-  </w:num>
-  <w:num w:numId="4" w16cid:durableId="687371080">
-    <w:abstractNumId w:val="6"/>
-  </w:num>
-  <w:num w:numId="5" w16cid:durableId="423110556">
-    <w:abstractNumId w:val="7"/>
-  </w:num>
-  <w:num w:numId="6" w16cid:durableId="92433831">
+  <w:num w:numId="6">
     <w:abstractNumId w:val="5"/>
   </w:num>
-  <w:num w:numId="7" w16cid:durableId="1604923155">
+  <w:num w:numId="7">
     <w:abstractNumId w:val="0"/>
   </w:num>
-  <w:num w:numId="8" w16cid:durableId="1075855144">
+  <w:num w:numId="8">
     <w:abstractNumId w:val="1"/>
   </w:num>
-  <w:num w:numId="9" w16cid:durableId="22638674">
+  <w:num w:numId="9">
     <w:abstractNumId w:val="3"/>
   </w:num>
-  <w:num w:numId="10" w16cid:durableId="296423199">
+  <w:num w:numId="10">
     <w:abstractNumId w:val="2"/>
+  </w:num>
+  <w:num w:numId="11">
+    <w:abstractNumId w:val="7"/>
   </w:num>
 </w:numbering>
 </file>
 
 <file path=word/styles.xml><?xml version="1.0" encoding="utf-8"?>
-<w:styles xmlns:mc="http://schemas.openxmlformats.org/markup-compatibility/2006" xmlns:r="http://schemas.openxmlformats.org/officeDocument/2006/relationships" xmlns:w="http://schemas.openxmlformats.org/wordprocessingml/2006/main" xmlns:w14="http://schemas.microsoft.com/office/word/2010/wordml" xmlns:w15="http://schemas.microsoft.com/office/word/2012/wordml" xmlns:w16cex="http://schemas.microsoft.com/office/word/2018/wordml/cex" xmlns:w16cid="http://schemas.microsoft.com/office/word/2016/wordml/cid" xmlns:w16="http://schemas.microsoft.com/office/word/2018/wordml" xmlns:w16du="http://schemas.microsoft.com/office/word/2023/wordml/word16du" xmlns:w16sdtdh="http://schemas.microsoft.com/office/word/2020/wordml/sdtdatahash" xmlns:w16sdtfl="http://schemas.microsoft.com/office/word/2024/wordml/sdtformatlock" xmlns:w16se="http://schemas.microsoft.com/office/word/2015/wordml/symex" mc:Ignorable="w14 w15 w16se w16cid w16 w16cex w16sdtdh w16sdtfl w16du">
+<w:styles xmlns:mc="http://schemas.openxmlformats.org/markup-compatibility/2006" xmlns:r="http://schemas.openxmlformats.org/officeDocument/2006/relationships" xmlns:w="http://schemas.openxmlformats.org/wordprocessingml/2006/main" xmlns:w14="http://schemas.microsoft.com/office/word/2010/wordml" xmlns:w15="http://schemas.microsoft.com/office/word/2012/wordml" mc:Ignorable="w14 w15">
   <w:docDefaults>
     <w:rPrDefault>
       <w:rPr>
@@ -4964,7 +6249,7 @@
       </w:pPr>
     </w:pPrDefault>
   </w:docDefaults>
-  <w:latentStyles w:defLockedState="0" w:defUIPriority="99" w:defSemiHidden="0" w:defUnhideWhenUsed="0" w:defQFormat="0" w:count="376">
+  <w:latentStyles w:defLockedState="0" w:defUIPriority="99" w:defSemiHidden="0" w:defUnhideWhenUsed="0" w:defQFormat="0" w:count="371">
     <w:lsdException w:name="Normal" w:uiPriority="0" w:qFormat="1"/>
     <w:lsdException w:name="heading 1" w:uiPriority="9" w:qFormat="1"/>
     <w:lsdException w:name="heading 2" w:semiHidden="1" w:uiPriority="9" w:unhideWhenUsed="1" w:qFormat="1"/>
@@ -5336,21 +6621,16 @@
     <w:lsdException w:name="List Table 5 Dark Accent 6" w:uiPriority="50"/>
     <w:lsdException w:name="List Table 6 Colorful Accent 6" w:uiPriority="51"/>
     <w:lsdException w:name="List Table 7 Colorful Accent 6" w:uiPriority="52"/>
-    <w:lsdException w:name="Mention" w:semiHidden="1" w:unhideWhenUsed="1"/>
-    <w:lsdException w:name="Smart Hyperlink" w:semiHidden="1" w:unhideWhenUsed="1"/>
-    <w:lsdException w:name="Hashtag" w:semiHidden="1" w:unhideWhenUsed="1"/>
-    <w:lsdException w:name="Unresolved Mention" w:semiHidden="1" w:unhideWhenUsed="1"/>
-    <w:lsdException w:name="Smart Link" w:semiHidden="1" w:unhideWhenUsed="1"/>
   </w:latentStyles>
   <w:style w:type="paragraph" w:default="1" w:styleId="Normal">
     <w:name w:val="Normal"/>
     <w:qFormat/>
   </w:style>
-  <w:style w:type="paragraph" w:styleId="Titre1">
+  <w:style w:type="paragraph" w:styleId="Heading1">
     <w:name w:val="heading 1"/>
     <w:basedOn w:val="Normal"/>
     <w:next w:val="Normal"/>
-    <w:link w:val="Titre1Car"/>
+    <w:link w:val="Heading1Char"/>
     <w:uiPriority w:val="9"/>
     <w:qFormat/>
     <w:rsid w:val="002F306B"/>
@@ -5367,13 +6647,12 @@
       <w:szCs w:val="40"/>
     </w:rPr>
   </w:style>
-  <w:style w:type="paragraph" w:styleId="Titre2">
+  <w:style w:type="paragraph" w:styleId="Heading2">
     <w:name w:val="heading 2"/>
     <w:basedOn w:val="Normal"/>
     <w:next w:val="Normal"/>
-    <w:link w:val="Titre2Car"/>
+    <w:link w:val="Heading2Char"/>
     <w:uiPriority w:val="9"/>
-    <w:semiHidden/>
     <w:unhideWhenUsed/>
     <w:qFormat/>
     <w:rsid w:val="002F306B"/>
@@ -5390,11 +6669,11 @@
       <w:szCs w:val="32"/>
     </w:rPr>
   </w:style>
-  <w:style w:type="paragraph" w:styleId="Titre3">
+  <w:style w:type="paragraph" w:styleId="Heading3">
     <w:name w:val="heading 3"/>
     <w:basedOn w:val="Normal"/>
     <w:next w:val="Normal"/>
-    <w:link w:val="Titre3Car"/>
+    <w:link w:val="Heading3Char"/>
     <w:uiPriority w:val="9"/>
     <w:semiHidden/>
     <w:unhideWhenUsed/>
@@ -5413,11 +6692,11 @@
       <w:szCs w:val="28"/>
     </w:rPr>
   </w:style>
-  <w:style w:type="paragraph" w:styleId="Titre4">
+  <w:style w:type="paragraph" w:styleId="Heading4">
     <w:name w:val="heading 4"/>
     <w:basedOn w:val="Normal"/>
     <w:next w:val="Normal"/>
-    <w:link w:val="Titre4Car"/>
+    <w:link w:val="Heading4Char"/>
     <w:uiPriority w:val="9"/>
     <w:semiHidden/>
     <w:unhideWhenUsed/>
@@ -5436,11 +6715,11 @@
       <w:color w:val="2E74B5" w:themeColor="accent1" w:themeShade="BF"/>
     </w:rPr>
   </w:style>
-  <w:style w:type="paragraph" w:styleId="Titre5">
+  <w:style w:type="paragraph" w:styleId="Heading5">
     <w:name w:val="heading 5"/>
     <w:basedOn w:val="Normal"/>
     <w:next w:val="Normal"/>
-    <w:link w:val="Titre5Car"/>
+    <w:link w:val="Heading5Char"/>
     <w:uiPriority w:val="9"/>
     <w:semiHidden/>
     <w:unhideWhenUsed/>
@@ -5457,11 +6736,11 @@
       <w:color w:val="2E74B5" w:themeColor="accent1" w:themeShade="BF"/>
     </w:rPr>
   </w:style>
-  <w:style w:type="paragraph" w:styleId="Titre6">
+  <w:style w:type="paragraph" w:styleId="Heading6">
     <w:name w:val="heading 6"/>
     <w:basedOn w:val="Normal"/>
     <w:next w:val="Normal"/>
-    <w:link w:val="Titre6Car"/>
+    <w:link w:val="Heading6Char"/>
     <w:uiPriority w:val="9"/>
     <w:semiHidden/>
     <w:unhideWhenUsed/>
@@ -5480,11 +6759,11 @@
       <w:color w:val="595959" w:themeColor="text1" w:themeTint="A6"/>
     </w:rPr>
   </w:style>
-  <w:style w:type="paragraph" w:styleId="Titre7">
+  <w:style w:type="paragraph" w:styleId="Heading7">
     <w:name w:val="heading 7"/>
     <w:basedOn w:val="Normal"/>
     <w:next w:val="Normal"/>
-    <w:link w:val="Titre7Car"/>
+    <w:link w:val="Heading7Char"/>
     <w:uiPriority w:val="9"/>
     <w:semiHidden/>
     <w:unhideWhenUsed/>
@@ -5501,11 +6780,11 @@
       <w:color w:val="595959" w:themeColor="text1" w:themeTint="A6"/>
     </w:rPr>
   </w:style>
-  <w:style w:type="paragraph" w:styleId="Titre8">
+  <w:style w:type="paragraph" w:styleId="Heading8">
     <w:name w:val="heading 8"/>
     <w:basedOn w:val="Normal"/>
     <w:next w:val="Normal"/>
-    <w:link w:val="Titre8Car"/>
+    <w:link w:val="Heading8Char"/>
     <w:uiPriority w:val="9"/>
     <w:semiHidden/>
     <w:unhideWhenUsed/>
@@ -5524,11 +6803,11 @@
       <w:color w:val="272727" w:themeColor="text1" w:themeTint="D8"/>
     </w:rPr>
   </w:style>
-  <w:style w:type="paragraph" w:styleId="Titre9">
+  <w:style w:type="paragraph" w:styleId="Heading9">
     <w:name w:val="heading 9"/>
     <w:basedOn w:val="Normal"/>
     <w:next w:val="Normal"/>
-    <w:link w:val="Titre9Car"/>
+    <w:link w:val="Heading9Char"/>
     <w:uiPriority w:val="9"/>
     <w:semiHidden/>
     <w:unhideWhenUsed/>
@@ -5545,12 +6824,13 @@
       <w:color w:val="272727" w:themeColor="text1" w:themeTint="D8"/>
     </w:rPr>
   </w:style>
-  <w:style w:type="character" w:default="1" w:styleId="Policepardfaut">
+  <w:style w:type="character" w:default="1" w:styleId="DefaultParagraphFont">
     <w:name w:val="Default Paragraph Font"/>
     <w:uiPriority w:val="1"/>
+    <w:semiHidden/>
     <w:unhideWhenUsed/>
   </w:style>
-  <w:style w:type="table" w:default="1" w:styleId="TableauNormal">
+  <w:style w:type="table" w:default="1" w:styleId="TableNormal">
     <w:name w:val="Normal Table"/>
     <w:uiPriority w:val="99"/>
     <w:semiHidden/>
@@ -5565,16 +6845,16 @@
       </w:tblCellMar>
     </w:tblPr>
   </w:style>
-  <w:style w:type="numbering" w:default="1" w:styleId="Aucuneliste">
+  <w:style w:type="numbering" w:default="1" w:styleId="NoList">
     <w:name w:val="No List"/>
     <w:uiPriority w:val="99"/>
     <w:semiHidden/>
     <w:unhideWhenUsed/>
   </w:style>
-  <w:style w:type="character" w:customStyle="1" w:styleId="Titre1Car">
-    <w:name w:val="Titre 1 Car"/>
-    <w:basedOn w:val="Policepardfaut"/>
-    <w:link w:val="Titre1"/>
+  <w:style w:type="character" w:customStyle="1" w:styleId="Heading1Char">
+    <w:name w:val="Heading 1 Char"/>
+    <w:basedOn w:val="DefaultParagraphFont"/>
+    <w:link w:val="Heading1"/>
     <w:uiPriority w:val="9"/>
     <w:rsid w:val="002F306B"/>
     <w:rPr>
@@ -5584,12 +6864,11 @@
       <w:szCs w:val="40"/>
     </w:rPr>
   </w:style>
-  <w:style w:type="character" w:customStyle="1" w:styleId="Titre2Car">
-    <w:name w:val="Titre 2 Car"/>
-    <w:basedOn w:val="Policepardfaut"/>
-    <w:link w:val="Titre2"/>
+  <w:style w:type="character" w:customStyle="1" w:styleId="Heading2Char">
+    <w:name w:val="Heading 2 Char"/>
+    <w:basedOn w:val="DefaultParagraphFont"/>
+    <w:link w:val="Heading2"/>
     <w:uiPriority w:val="9"/>
-    <w:semiHidden/>
     <w:rsid w:val="002F306B"/>
     <w:rPr>
       <w:rFonts w:asciiTheme="majorHAnsi" w:eastAsiaTheme="majorEastAsia" w:hAnsiTheme="majorHAnsi" w:cstheme="majorBidi"/>
@@ -5598,10 +6877,10 @@
       <w:szCs w:val="32"/>
     </w:rPr>
   </w:style>
-  <w:style w:type="character" w:customStyle="1" w:styleId="Titre3Car">
-    <w:name w:val="Titre 3 Car"/>
-    <w:basedOn w:val="Policepardfaut"/>
-    <w:link w:val="Titre3"/>
+  <w:style w:type="character" w:customStyle="1" w:styleId="Heading3Char">
+    <w:name w:val="Heading 3 Char"/>
+    <w:basedOn w:val="DefaultParagraphFont"/>
+    <w:link w:val="Heading3"/>
     <w:uiPriority w:val="9"/>
     <w:semiHidden/>
     <w:rsid w:val="002F306B"/>
@@ -5612,10 +6891,10 @@
       <w:szCs w:val="28"/>
     </w:rPr>
   </w:style>
-  <w:style w:type="character" w:customStyle="1" w:styleId="Titre4Car">
-    <w:name w:val="Titre 4 Car"/>
-    <w:basedOn w:val="Policepardfaut"/>
-    <w:link w:val="Titre4"/>
+  <w:style w:type="character" w:customStyle="1" w:styleId="Heading4Char">
+    <w:name w:val="Heading 4 Char"/>
+    <w:basedOn w:val="DefaultParagraphFont"/>
+    <w:link w:val="Heading4"/>
     <w:uiPriority w:val="9"/>
     <w:semiHidden/>
     <w:rsid w:val="002F306B"/>
@@ -5626,10 +6905,10 @@
       <w:color w:val="2E74B5" w:themeColor="accent1" w:themeShade="BF"/>
     </w:rPr>
   </w:style>
-  <w:style w:type="character" w:customStyle="1" w:styleId="Titre5Car">
-    <w:name w:val="Titre 5 Car"/>
-    <w:basedOn w:val="Policepardfaut"/>
-    <w:link w:val="Titre5"/>
+  <w:style w:type="character" w:customStyle="1" w:styleId="Heading5Char">
+    <w:name w:val="Heading 5 Char"/>
+    <w:basedOn w:val="DefaultParagraphFont"/>
+    <w:link w:val="Heading5"/>
     <w:uiPriority w:val="9"/>
     <w:semiHidden/>
     <w:rsid w:val="002F306B"/>
@@ -5638,10 +6917,10 @@
       <w:color w:val="2E74B5" w:themeColor="accent1" w:themeShade="BF"/>
     </w:rPr>
   </w:style>
-  <w:style w:type="character" w:customStyle="1" w:styleId="Titre6Car">
-    <w:name w:val="Titre 6 Car"/>
-    <w:basedOn w:val="Policepardfaut"/>
-    <w:link w:val="Titre6"/>
+  <w:style w:type="character" w:customStyle="1" w:styleId="Heading6Char">
+    <w:name w:val="Heading 6 Char"/>
+    <w:basedOn w:val="DefaultParagraphFont"/>
+    <w:link w:val="Heading6"/>
     <w:uiPriority w:val="9"/>
     <w:semiHidden/>
     <w:rsid w:val="002F306B"/>
@@ -5652,10 +6931,10 @@
       <w:color w:val="595959" w:themeColor="text1" w:themeTint="A6"/>
     </w:rPr>
   </w:style>
-  <w:style w:type="character" w:customStyle="1" w:styleId="Titre7Car">
-    <w:name w:val="Titre 7 Car"/>
-    <w:basedOn w:val="Policepardfaut"/>
-    <w:link w:val="Titre7"/>
+  <w:style w:type="character" w:customStyle="1" w:styleId="Heading7Char">
+    <w:name w:val="Heading 7 Char"/>
+    <w:basedOn w:val="DefaultParagraphFont"/>
+    <w:link w:val="Heading7"/>
     <w:uiPriority w:val="9"/>
     <w:semiHidden/>
     <w:rsid w:val="002F306B"/>
@@ -5664,10 +6943,10 @@
       <w:color w:val="595959" w:themeColor="text1" w:themeTint="A6"/>
     </w:rPr>
   </w:style>
-  <w:style w:type="character" w:customStyle="1" w:styleId="Titre8Car">
-    <w:name w:val="Titre 8 Car"/>
-    <w:basedOn w:val="Policepardfaut"/>
-    <w:link w:val="Titre8"/>
+  <w:style w:type="character" w:customStyle="1" w:styleId="Heading8Char">
+    <w:name w:val="Heading 8 Char"/>
+    <w:basedOn w:val="DefaultParagraphFont"/>
+    <w:link w:val="Heading8"/>
     <w:uiPriority w:val="9"/>
     <w:semiHidden/>
     <w:rsid w:val="002F306B"/>
@@ -5678,10 +6957,10 @@
       <w:color w:val="272727" w:themeColor="text1" w:themeTint="D8"/>
     </w:rPr>
   </w:style>
-  <w:style w:type="character" w:customStyle="1" w:styleId="Titre9Car">
-    <w:name w:val="Titre 9 Car"/>
-    <w:basedOn w:val="Policepardfaut"/>
-    <w:link w:val="Titre9"/>
+  <w:style w:type="character" w:customStyle="1" w:styleId="Heading9Char">
+    <w:name w:val="Heading 9 Char"/>
+    <w:basedOn w:val="DefaultParagraphFont"/>
+    <w:link w:val="Heading9"/>
     <w:uiPriority w:val="9"/>
     <w:semiHidden/>
     <w:rsid w:val="002F306B"/>
@@ -5690,11 +6969,11 @@
       <w:color w:val="272727" w:themeColor="text1" w:themeTint="D8"/>
     </w:rPr>
   </w:style>
-  <w:style w:type="paragraph" w:styleId="Titre">
+  <w:style w:type="paragraph" w:styleId="Title">
     <w:name w:val="Title"/>
     <w:basedOn w:val="Normal"/>
     <w:next w:val="Normal"/>
-    <w:link w:val="TitreCar"/>
+    <w:link w:val="TitleChar"/>
     <w:uiPriority w:val="10"/>
     <w:qFormat/>
     <w:rsid w:val="002F306B"/>
@@ -5710,10 +6989,10 @@
       <w:szCs w:val="56"/>
     </w:rPr>
   </w:style>
-  <w:style w:type="character" w:customStyle="1" w:styleId="TitreCar">
-    <w:name w:val="Titre Car"/>
-    <w:basedOn w:val="Policepardfaut"/>
-    <w:link w:val="Titre"/>
+  <w:style w:type="character" w:customStyle="1" w:styleId="TitleChar">
+    <w:name w:val="Title Char"/>
+    <w:basedOn w:val="DefaultParagraphFont"/>
+    <w:link w:val="Title"/>
     <w:uiPriority w:val="10"/>
     <w:rsid w:val="002F306B"/>
     <w:rPr>
@@ -5724,11 +7003,11 @@
       <w:szCs w:val="56"/>
     </w:rPr>
   </w:style>
-  <w:style w:type="paragraph" w:styleId="Sous-titre">
+  <w:style w:type="paragraph" w:styleId="Subtitle">
     <w:name w:val="Subtitle"/>
     <w:basedOn w:val="Normal"/>
     <w:next w:val="Normal"/>
-    <w:link w:val="Sous-titreCar"/>
+    <w:link w:val="SubtitleChar"/>
     <w:uiPriority w:val="11"/>
     <w:qFormat/>
     <w:rsid w:val="002F306B"/>
@@ -5745,10 +7024,10 @@
       <w:szCs w:val="28"/>
     </w:rPr>
   </w:style>
-  <w:style w:type="character" w:customStyle="1" w:styleId="Sous-titreCar">
-    <w:name w:val="Sous-titre Car"/>
-    <w:basedOn w:val="Policepardfaut"/>
-    <w:link w:val="Sous-titre"/>
+  <w:style w:type="character" w:customStyle="1" w:styleId="SubtitleChar">
+    <w:name w:val="Subtitle Char"/>
+    <w:basedOn w:val="DefaultParagraphFont"/>
+    <w:link w:val="Subtitle"/>
     <w:uiPriority w:val="11"/>
     <w:rsid w:val="002F306B"/>
     <w:rPr>
@@ -5759,11 +7038,11 @@
       <w:szCs w:val="28"/>
     </w:rPr>
   </w:style>
-  <w:style w:type="paragraph" w:styleId="Citation">
+  <w:style w:type="paragraph" w:styleId="Quote">
     <w:name w:val="Quote"/>
     <w:basedOn w:val="Normal"/>
     <w:next w:val="Normal"/>
-    <w:link w:val="CitationCar"/>
+    <w:link w:val="QuoteChar"/>
     <w:uiPriority w:val="29"/>
     <w:qFormat/>
     <w:rsid w:val="002F306B"/>
@@ -5777,10 +7056,10 @@
       <w:color w:val="404040" w:themeColor="text1" w:themeTint="BF"/>
     </w:rPr>
   </w:style>
-  <w:style w:type="character" w:customStyle="1" w:styleId="CitationCar">
-    <w:name w:val="Citation Car"/>
-    <w:basedOn w:val="Policepardfaut"/>
-    <w:link w:val="Citation"/>
+  <w:style w:type="character" w:customStyle="1" w:styleId="QuoteChar">
+    <w:name w:val="Quote Char"/>
+    <w:basedOn w:val="DefaultParagraphFont"/>
+    <w:link w:val="Quote"/>
     <w:uiPriority w:val="29"/>
     <w:rsid w:val="002F306B"/>
     <w:rPr>
@@ -5789,7 +7068,7 @@
       <w:color w:val="404040" w:themeColor="text1" w:themeTint="BF"/>
     </w:rPr>
   </w:style>
-  <w:style w:type="paragraph" w:styleId="Paragraphedeliste">
+  <w:style w:type="paragraph" w:styleId="ListParagraph">
     <w:name w:val="List Paragraph"/>
     <w:basedOn w:val="Normal"/>
     <w:uiPriority w:val="34"/>
@@ -5800,9 +7079,9 @@
       <w:contextualSpacing/>
     </w:pPr>
   </w:style>
-  <w:style w:type="character" w:styleId="Accentuationintense">
+  <w:style w:type="character" w:styleId="IntenseEmphasis">
     <w:name w:val="Intense Emphasis"/>
-    <w:basedOn w:val="Policepardfaut"/>
+    <w:basedOn w:val="DefaultParagraphFont"/>
     <w:uiPriority w:val="21"/>
     <w:qFormat/>
     <w:rsid w:val="002F306B"/>
@@ -5812,11 +7091,11 @@
       <w:color w:val="2E74B5" w:themeColor="accent1" w:themeShade="BF"/>
     </w:rPr>
   </w:style>
-  <w:style w:type="paragraph" w:styleId="Citationintense">
+  <w:style w:type="paragraph" w:styleId="IntenseQuote">
     <w:name w:val="Intense Quote"/>
     <w:basedOn w:val="Normal"/>
     <w:next w:val="Normal"/>
-    <w:link w:val="CitationintenseCar"/>
+    <w:link w:val="IntenseQuoteChar"/>
     <w:uiPriority w:val="30"/>
     <w:qFormat/>
     <w:rsid w:val="002F306B"/>
@@ -5835,10 +7114,10 @@
       <w:color w:val="2E74B5" w:themeColor="accent1" w:themeShade="BF"/>
     </w:rPr>
   </w:style>
-  <w:style w:type="character" w:customStyle="1" w:styleId="CitationintenseCar">
-    <w:name w:val="Citation intense Car"/>
-    <w:basedOn w:val="Policepardfaut"/>
-    <w:link w:val="Citationintense"/>
+  <w:style w:type="character" w:customStyle="1" w:styleId="IntenseQuoteChar">
+    <w:name w:val="Intense Quote Char"/>
+    <w:basedOn w:val="DefaultParagraphFont"/>
+    <w:link w:val="IntenseQuote"/>
     <w:uiPriority w:val="30"/>
     <w:rsid w:val="002F306B"/>
     <w:rPr>
@@ -5847,9 +7126,9 @@
       <w:color w:val="2E74B5" w:themeColor="accent1" w:themeShade="BF"/>
     </w:rPr>
   </w:style>
-  <w:style w:type="character" w:styleId="Rfrenceintense">
+  <w:style w:type="character" w:styleId="IntenseReference">
     <w:name w:val="Intense Reference"/>
-    <w:basedOn w:val="Policepardfaut"/>
+    <w:basedOn w:val="DefaultParagraphFont"/>
     <w:uiPriority w:val="32"/>
     <w:qFormat/>
     <w:rsid w:val="002F306B"/>

</xml_diff>

<commit_message>
Partie 4 – Sorties structurées: Ajout d'une validation pour un formatde sortie plus structuré
</commit_message>
<xml_diff>
--- a/ai-business_assistant/correction_atelier_prompt-engineering.docx
+++ b/ai-business_assistant/correction_atelier_prompt-engineering.docx
@@ -77,7 +77,25 @@
           <w:sz w:val="24"/>
           <w:szCs w:val="24"/>
         </w:rPr>
-        <w:t>d'aider ses collaborateurs à exploiter des documents, analyser des données, faire du machine</w:t>
+        <w:t xml:space="preserve">d'aider ses collaborateurs à exploiter des documents, analyser des données, faire </w:t>
+      </w:r>
+      <w:proofErr w:type="gramStart"/>
+      <w:r>
+        <w:rPr>
+          <w:rFonts w:ascii="Times New Roman" w:hAnsi="Times New Roman" w:cs="Times New Roman"/>
+          <w:sz w:val="24"/>
+          <w:szCs w:val="24"/>
+        </w:rPr>
+        <w:t>du</w:t>
+      </w:r>
+      <w:proofErr w:type="gramEnd"/>
+      <w:r>
+        <w:rPr>
+          <w:rFonts w:ascii="Times New Roman" w:hAnsi="Times New Roman" w:cs="Times New Roman"/>
+          <w:sz w:val="24"/>
+          <w:szCs w:val="24"/>
+        </w:rPr>
+        <w:t xml:space="preserve"> machine</w:t>
       </w:r>
       <w:r>
         <w:rPr>
@@ -87,13 +105,23 @@
         </w:rPr>
         <w:t xml:space="preserve"> </w:t>
       </w:r>
-      <w:r>
-        <w:rPr>
-          <w:rFonts w:ascii="Times New Roman" w:hAnsi="Times New Roman" w:cs="Times New Roman"/>
-          <w:sz w:val="24"/>
-          <w:szCs w:val="24"/>
-        </w:rPr>
-        <w:t>learning et produire des résultats structurés.</w:t>
+      <w:proofErr w:type="spellStart"/>
+      <w:r>
+        <w:rPr>
+          <w:rFonts w:ascii="Times New Roman" w:hAnsi="Times New Roman" w:cs="Times New Roman"/>
+          <w:sz w:val="24"/>
+          <w:szCs w:val="24"/>
+        </w:rPr>
+        <w:t>learning</w:t>
+      </w:r>
+      <w:proofErr w:type="spellEnd"/>
+      <w:r>
+        <w:rPr>
+          <w:rFonts w:ascii="Times New Roman" w:hAnsi="Times New Roman" w:cs="Times New Roman"/>
+          <w:sz w:val="24"/>
+          <w:szCs w:val="24"/>
+        </w:rPr>
+        <w:t xml:space="preserve"> et produire des résultats structurés.</w:t>
       </w:r>
     </w:p>
     <w:p>
@@ -1025,8 +1053,20 @@
           <w:sz w:val="28"/>
           <w:szCs w:val="28"/>
         </w:rPr>
-        <w:t>Partie 2 - Comparer les techniques de prompting</w:t>
-      </w:r>
+        <w:t xml:space="preserve">Partie 2 - Comparer les techniques de </w:t>
+      </w:r>
+      <w:proofErr w:type="spellStart"/>
+      <w:r>
+        <w:rPr>
+          <w:rFonts w:ascii="Times New Roman" w:hAnsi="Times New Roman" w:cs="Times New Roman"/>
+          <w:b/>
+          <w:bCs/>
+          <w:sz w:val="28"/>
+          <w:szCs w:val="28"/>
+        </w:rPr>
+        <w:t>prompting</w:t>
+      </w:r>
+      <w:proofErr w:type="spellEnd"/>
       <w:r>
         <w:rPr>
           <w:rFonts w:ascii="Times New Roman" w:hAnsi="Times New Roman" w:cs="Times New Roman"/>
@@ -1052,7 +1092,61 @@
           <w:sz w:val="24"/>
           <w:szCs w:val="24"/>
         </w:rPr>
-        <w:t>Tester puis évaluer les résultats obtenus avec les techniques zero-shot, one-shot, few-shot et un prompt structuré sur une demande du genre : « Classer le commentaire suivant : "Le service est rapide mais l'application plante régulièrement." Classes possibles : positif, négatif, neutre. »</w:t>
+        <w:t xml:space="preserve">Tester puis évaluer les résultats obtenus avec les techniques </w:t>
+      </w:r>
+      <w:proofErr w:type="spellStart"/>
+      <w:r>
+        <w:rPr>
+          <w:rFonts w:ascii="Times New Roman" w:hAnsi="Times New Roman" w:cs="Times New Roman"/>
+          <w:sz w:val="24"/>
+          <w:szCs w:val="24"/>
+        </w:rPr>
+        <w:t>zero-shot</w:t>
+      </w:r>
+      <w:proofErr w:type="spellEnd"/>
+      <w:r>
+        <w:rPr>
+          <w:rFonts w:ascii="Times New Roman" w:hAnsi="Times New Roman" w:cs="Times New Roman"/>
+          <w:sz w:val="24"/>
+          <w:szCs w:val="24"/>
+        </w:rPr>
+        <w:t>, one-</w:t>
+      </w:r>
+      <w:proofErr w:type="spellStart"/>
+      <w:r>
+        <w:rPr>
+          <w:rFonts w:ascii="Times New Roman" w:hAnsi="Times New Roman" w:cs="Times New Roman"/>
+          <w:sz w:val="24"/>
+          <w:szCs w:val="24"/>
+        </w:rPr>
+        <w:t>shot</w:t>
+      </w:r>
+      <w:proofErr w:type="spellEnd"/>
+      <w:r>
+        <w:rPr>
+          <w:rFonts w:ascii="Times New Roman" w:hAnsi="Times New Roman" w:cs="Times New Roman"/>
+          <w:sz w:val="24"/>
+          <w:szCs w:val="24"/>
+        </w:rPr>
+        <w:t>, few-</w:t>
+      </w:r>
+      <w:proofErr w:type="spellStart"/>
+      <w:r>
+        <w:rPr>
+          <w:rFonts w:ascii="Times New Roman" w:hAnsi="Times New Roman" w:cs="Times New Roman"/>
+          <w:sz w:val="24"/>
+          <w:szCs w:val="24"/>
+        </w:rPr>
+        <w:t>shot</w:t>
+      </w:r>
+      <w:proofErr w:type="spellEnd"/>
+      <w:r>
+        <w:rPr>
+          <w:rFonts w:ascii="Times New Roman" w:hAnsi="Times New Roman" w:cs="Times New Roman"/>
+          <w:sz w:val="24"/>
+          <w:szCs w:val="24"/>
+        </w:rPr>
+        <w:t xml:space="preserve"> et un prompt structuré sur une demande du genre : « Classer le commentaire suivant : "Le service est rapide mais l'application plante régulièrement." Classes possibles : positif, négatif, neutre. »</w:t>
       </w:r>
     </w:p>
     <w:p>
@@ -1075,8 +1169,20 @@
           <w:sz w:val="24"/>
           <w:szCs w:val="24"/>
         </w:rPr>
-        <w:t>Test avec la technique du zéro shot</w:t>
-      </w:r>
+        <w:t xml:space="preserve">Test avec la technique du zéro </w:t>
+      </w:r>
+      <w:proofErr w:type="spellStart"/>
+      <w:r>
+        <w:rPr>
+          <w:rFonts w:ascii="Times New Roman" w:hAnsi="Times New Roman" w:cs="Times New Roman"/>
+          <w:b/>
+          <w:bCs/>
+          <w:sz w:val="24"/>
+          <w:szCs w:val="24"/>
+        </w:rPr>
+        <w:t>shot</w:t>
+      </w:r>
+      <w:proofErr w:type="spellEnd"/>
     </w:p>
     <w:p>
       <w:pPr>
@@ -1266,8 +1372,32 @@
           <w:sz w:val="24"/>
           <w:szCs w:val="24"/>
         </w:rPr>
-        <w:t>Test de la technique du One-shot</w:t>
-      </w:r>
+        <w:t xml:space="preserve">Test de la technique </w:t>
+      </w:r>
+      <w:proofErr w:type="gramStart"/>
+      <w:r>
+        <w:rPr>
+          <w:rFonts w:ascii="Times New Roman" w:hAnsi="Times New Roman" w:cs="Times New Roman"/>
+          <w:b/>
+          <w:bCs/>
+          <w:sz w:val="24"/>
+          <w:szCs w:val="24"/>
+        </w:rPr>
+        <w:t>du One-</w:t>
+      </w:r>
+      <w:proofErr w:type="spellStart"/>
+      <w:r>
+        <w:rPr>
+          <w:rFonts w:ascii="Times New Roman" w:hAnsi="Times New Roman" w:cs="Times New Roman"/>
+          <w:b/>
+          <w:bCs/>
+          <w:sz w:val="24"/>
+          <w:szCs w:val="24"/>
+        </w:rPr>
+        <w:t>shot</w:t>
+      </w:r>
+      <w:proofErr w:type="spellEnd"/>
+      <w:proofErr w:type="gramEnd"/>
     </w:p>
     <w:p>
       <w:pPr>
@@ -1531,8 +1661,20 @@
           <w:sz w:val="24"/>
           <w:szCs w:val="24"/>
         </w:rPr>
-        <w:t>Test de la technique du few-shot</w:t>
-      </w:r>
+        <w:t>Test de la technique du few-</w:t>
+      </w:r>
+      <w:proofErr w:type="spellStart"/>
+      <w:r>
+        <w:rPr>
+          <w:rFonts w:ascii="Times New Roman" w:hAnsi="Times New Roman" w:cs="Times New Roman"/>
+          <w:b/>
+          <w:bCs/>
+          <w:sz w:val="24"/>
+          <w:szCs w:val="24"/>
+        </w:rPr>
+        <w:t>shot</w:t>
+      </w:r>
+      <w:proofErr w:type="spellEnd"/>
     </w:p>
     <w:p>
       <w:pPr>
@@ -1918,7 +2060,29 @@
           <w:sz w:val="24"/>
           <w:szCs w:val="24"/>
         </w:rPr>
-        <w:t>Test de la technique du structured prompt</w:t>
+        <w:t xml:space="preserve">Test de la technique du </w:t>
+      </w:r>
+      <w:proofErr w:type="spellStart"/>
+      <w:r>
+        <w:rPr>
+          <w:rFonts w:ascii="Times New Roman" w:hAnsi="Times New Roman" w:cs="Times New Roman"/>
+          <w:b/>
+          <w:bCs/>
+          <w:sz w:val="24"/>
+          <w:szCs w:val="24"/>
+        </w:rPr>
+        <w:t>structured</w:t>
+      </w:r>
+      <w:proofErr w:type="spellEnd"/>
+      <w:r>
+        <w:rPr>
+          <w:rFonts w:ascii="Times New Roman" w:hAnsi="Times New Roman" w:cs="Times New Roman"/>
+          <w:b/>
+          <w:bCs/>
+          <w:sz w:val="24"/>
+          <w:szCs w:val="24"/>
+        </w:rPr>
+        <w:t xml:space="preserve"> prompt</w:t>
       </w:r>
     </w:p>
     <w:p>
@@ -2415,7 +2579,25 @@
           <w:sz w:val="24"/>
           <w:szCs w:val="24"/>
         </w:rPr>
-        <w:t xml:space="preserve"> shot est plus facile à écrire</w:t>
+        <w:t xml:space="preserve"> </w:t>
+      </w:r>
+      <w:proofErr w:type="spellStart"/>
+      <w:r>
+        <w:rPr>
+          <w:rFonts w:ascii="Times New Roman" w:hAnsi="Times New Roman" w:cs="Times New Roman"/>
+          <w:sz w:val="24"/>
+          <w:szCs w:val="24"/>
+        </w:rPr>
+        <w:t>shot</w:t>
+      </w:r>
+      <w:proofErr w:type="spellEnd"/>
+      <w:r>
+        <w:rPr>
+          <w:rFonts w:ascii="Times New Roman" w:hAnsi="Times New Roman" w:cs="Times New Roman"/>
+          <w:sz w:val="24"/>
+          <w:szCs w:val="24"/>
+        </w:rPr>
+        <w:t xml:space="preserve"> est plus facile à écrire</w:t>
       </w:r>
       <w:r>
         <w:rPr>
@@ -2448,7 +2630,61 @@
           <w:szCs w:val="24"/>
         </w:rPr>
         <w:lastRenderedPageBreak/>
-        <w:t xml:space="preserve">d’économiser des tokens mais elle présente l’inconvénient de fournir des réponses approximatives car ne disposant pas d’exemples pour régler le problème qui lui a été soumis. Ainsi, nous n’avons aucun contrôle sur le format de réponses. Le one shot à la différence permet de cadrer le format de réponse car il permet d’inclure un exemple dans le prompt mais avec moins d’efforts sur l’ambiguïté et la prise en compte des nuances voulante être relevé. La technique du few-shot vient régler ce problème car il permet de soumettre des exemples bien </w:t>
+        <w:t xml:space="preserve">d’économiser des </w:t>
+      </w:r>
+      <w:proofErr w:type="spellStart"/>
+      <w:r>
+        <w:rPr>
+          <w:rFonts w:ascii="Times New Roman" w:hAnsi="Times New Roman" w:cs="Times New Roman"/>
+          <w:sz w:val="24"/>
+          <w:szCs w:val="24"/>
+        </w:rPr>
+        <w:t>tokens</w:t>
+      </w:r>
+      <w:proofErr w:type="spellEnd"/>
+      <w:r>
+        <w:rPr>
+          <w:rFonts w:ascii="Times New Roman" w:hAnsi="Times New Roman" w:cs="Times New Roman"/>
+          <w:sz w:val="24"/>
+          <w:szCs w:val="24"/>
+        </w:rPr>
+        <w:t xml:space="preserve"> mais elle présente l’inconvénient de fournir des réponses approximatives car ne disposant pas d’exemples pour régler le problème qui lui a été soumis. Ainsi, nous n’avons aucun contrôle sur le format de réponses. Le one </w:t>
+      </w:r>
+      <w:proofErr w:type="spellStart"/>
+      <w:r>
+        <w:rPr>
+          <w:rFonts w:ascii="Times New Roman" w:hAnsi="Times New Roman" w:cs="Times New Roman"/>
+          <w:sz w:val="24"/>
+          <w:szCs w:val="24"/>
+        </w:rPr>
+        <w:t>shot</w:t>
+      </w:r>
+      <w:proofErr w:type="spellEnd"/>
+      <w:r>
+        <w:rPr>
+          <w:rFonts w:ascii="Times New Roman" w:hAnsi="Times New Roman" w:cs="Times New Roman"/>
+          <w:sz w:val="24"/>
+          <w:szCs w:val="24"/>
+        </w:rPr>
+        <w:t xml:space="preserve"> à la différence permet de cadrer le format de réponse car il permet d’inclure un exemple dans le prompt mais avec moins d’efforts sur l’ambiguïté et la prise en compte des nuances voulante être relevé. La technique du few-</w:t>
+      </w:r>
+      <w:proofErr w:type="spellStart"/>
+      <w:r>
+        <w:rPr>
+          <w:rFonts w:ascii="Times New Roman" w:hAnsi="Times New Roman" w:cs="Times New Roman"/>
+          <w:sz w:val="24"/>
+          <w:szCs w:val="24"/>
+        </w:rPr>
+        <w:t>shot</w:t>
+      </w:r>
+      <w:proofErr w:type="spellEnd"/>
+      <w:r>
+        <w:rPr>
+          <w:rFonts w:ascii="Times New Roman" w:hAnsi="Times New Roman" w:cs="Times New Roman"/>
+          <w:sz w:val="24"/>
+          <w:szCs w:val="24"/>
+        </w:rPr>
+        <w:t xml:space="preserve"> vient régler ce problème car il permet de soumettre des exemples bien </w:t>
       </w:r>
       <w:r>
         <w:rPr>
@@ -2464,8 +2700,18 @@
           <w:sz w:val="24"/>
           <w:szCs w:val="24"/>
         </w:rPr>
-        <w:t xml:space="preserve"> au modèle. Il prend cependant plus de temps à préparer, nécessite plus de tokens</w:t>
-      </w:r>
+        <w:t xml:space="preserve"> au modèle. Il prend cependant plus de temps à préparer, nécessite plus de </w:t>
+      </w:r>
+      <w:proofErr w:type="spellStart"/>
+      <w:r>
+        <w:rPr>
+          <w:rFonts w:ascii="Times New Roman" w:hAnsi="Times New Roman" w:cs="Times New Roman"/>
+          <w:sz w:val="24"/>
+          <w:szCs w:val="24"/>
+        </w:rPr>
+        <w:t>tokens</w:t>
+      </w:r>
+      <w:proofErr w:type="spellEnd"/>
     </w:p>
     <w:p>
       <w:pPr>
@@ -2491,7 +2737,25 @@
           <w:sz w:val="24"/>
           <w:szCs w:val="24"/>
         </w:rPr>
-        <w:t>la technique du structured-prompt apporte l’avantage de préciser clairement la logique de raisonnement et peut être réutilisé. Il est plus facile à ajuster en cas d’itération requise pour affiner les réponses du LLM.</w:t>
+        <w:t xml:space="preserve">la technique du </w:t>
+      </w:r>
+      <w:proofErr w:type="spellStart"/>
+      <w:r>
+        <w:rPr>
+          <w:rFonts w:ascii="Times New Roman" w:hAnsi="Times New Roman" w:cs="Times New Roman"/>
+          <w:sz w:val="24"/>
+          <w:szCs w:val="24"/>
+        </w:rPr>
+        <w:t>structured</w:t>
+      </w:r>
+      <w:proofErr w:type="spellEnd"/>
+      <w:r>
+        <w:rPr>
+          <w:rFonts w:ascii="Times New Roman" w:hAnsi="Times New Roman" w:cs="Times New Roman"/>
+          <w:sz w:val="24"/>
+          <w:szCs w:val="24"/>
+        </w:rPr>
+        <w:t>-prompt apporte l’avantage de préciser clairement la logique de raisonnement et peut être réutilisé. Il est plus facile à ajuster en cas d’itération requise pour affiner les réponses du LLM.</w:t>
       </w:r>
     </w:p>
     <w:p>
@@ -3246,7 +3510,16 @@
           <w:sz w:val="24"/>
           <w:szCs w:val="24"/>
         </w:rPr>
-        <w:t>3. Identifie les thèmes les plus fréquents ou impactant</w:t>
+        <w:t xml:space="preserve">3. Identifie les thèmes les plus fréquents ou </w:t>
+      </w:r>
+      <w:proofErr w:type="spellStart"/>
+      <w:r>
+        <w:rPr>
+          <w:rFonts w:ascii="Times New Roman" w:hAnsi="Times New Roman" w:cs="Times New Roman"/>
+          <w:sz w:val="24"/>
+          <w:szCs w:val="24"/>
+        </w:rPr>
+        <w:t>impactant</w:t>
       </w:r>
       <w:r>
         <w:rPr>
@@ -3256,6 +3529,7 @@
         </w:rPr>
         <w:t>s</w:t>
       </w:r>
+      <w:proofErr w:type="spellEnd"/>
       <w:r>
         <w:rPr>
           <w:rFonts w:ascii="Times New Roman" w:hAnsi="Times New Roman" w:cs="Times New Roman"/>
@@ -5002,53 +5276,751 @@
           <w:szCs w:val="24"/>
         </w:rPr>
       </w:pPr>
+    </w:p>
+    <w:p>
+      <w:pPr>
+        <w:pStyle w:val="ListParagraph"/>
+        <w:numPr>
+          <w:ilvl w:val="0"/>
+          <w:numId w:val="11"/>
+        </w:numPr>
+        <w:autoSpaceDE w:val="0"/>
+        <w:autoSpaceDN w:val="0"/>
+        <w:adjustRightInd w:val="0"/>
+        <w:spacing w:after="0" w:line="360" w:lineRule="auto"/>
+        <w:rPr>
+          <w:rFonts w:ascii="Times New Roman" w:hAnsi="Times New Roman" w:cs="Times New Roman"/>
+          <w:color w:val="000000"/>
+          <w:kern w:val="0"/>
+          <w:sz w:val="24"/>
+          <w:szCs w:val="24"/>
+        </w:rPr>
+      </w:pPr>
+      <w:r>
+        <w:rPr>
+          <w:rFonts w:ascii="Times New Roman" w:hAnsi="Times New Roman" w:cs="Times New Roman"/>
+          <w:color w:val="000000"/>
+          <w:kern w:val="0"/>
+          <w:sz w:val="24"/>
+          <w:szCs w:val="24"/>
+        </w:rPr>
+        <w:t>Ajouter une validation en définissant les règles de sortie suivantes : format JSON valide</w:t>
+      </w:r>
+      <w:r>
+        <w:rPr>
+          <w:rFonts w:ascii="Times New Roman" w:hAnsi="Times New Roman" w:cs="Times New Roman"/>
+          <w:color w:val="000000"/>
+          <w:kern w:val="0"/>
+          <w:sz w:val="24"/>
+          <w:szCs w:val="24"/>
+        </w:rPr>
+        <w:t xml:space="preserve"> ; </w:t>
+      </w:r>
+      <w:r>
+        <w:rPr>
+          <w:rFonts w:ascii="Times New Roman" w:hAnsi="Times New Roman" w:cs="Times New Roman"/>
+          <w:color w:val="000000"/>
+          <w:kern w:val="0"/>
+          <w:sz w:val="24"/>
+          <w:szCs w:val="24"/>
+        </w:rPr>
+        <w:t xml:space="preserve">aucune propriété supplémentaire ; sentiment vaut positif, negatif </w:t>
+      </w:r>
+      <w:r>
+        <w:rPr>
+          <w:rFonts w:ascii="Times New Roman" w:hAnsi="Times New Roman" w:cs="Times New Roman"/>
+          <w:color w:val="000000"/>
+          <w:kern w:val="0"/>
+          <w:sz w:val="24"/>
+          <w:szCs w:val="24"/>
+        </w:rPr>
+        <w:t xml:space="preserve">ou </w:t>
+      </w:r>
+      <w:r>
+        <w:rPr>
+          <w:rFonts w:ascii="Times New Roman" w:hAnsi="Times New Roman" w:cs="Times New Roman"/>
+          <w:color w:val="000000"/>
+          <w:kern w:val="0"/>
+          <w:sz w:val="24"/>
+          <w:szCs w:val="24"/>
+        </w:rPr>
+        <w:t>neutre ; confiance est</w:t>
+      </w:r>
+      <w:r>
+        <w:rPr>
+          <w:rFonts w:ascii="Times New Roman" w:hAnsi="Times New Roman" w:cs="Times New Roman"/>
+          <w:color w:val="000000"/>
+          <w:kern w:val="0"/>
+          <w:sz w:val="24"/>
+          <w:szCs w:val="24"/>
+        </w:rPr>
+        <w:t xml:space="preserve"> </w:t>
+      </w:r>
       <w:bookmarkStart w:id="0" w:name="_GoBack"/>
       <w:bookmarkEnd w:id="0"/>
-    </w:p>
-    <w:p>
-      <w:pPr>
-        <w:spacing w:line="360" w:lineRule="auto"/>
-        <w:rPr>
-          <w:rFonts w:ascii="Times New Roman" w:hAnsi="Times New Roman" w:cs="Times New Roman"/>
-          <w:b/>
-          <w:bCs/>
-          <w:sz w:val="28"/>
+      <w:r>
+        <w:rPr>
+          <w:rFonts w:ascii="Times New Roman" w:hAnsi="Times New Roman" w:cs="Times New Roman"/>
+          <w:color w:val="000000"/>
+          <w:kern w:val="0"/>
+          <w:sz w:val="24"/>
+          <w:szCs w:val="24"/>
+        </w:rPr>
+        <w:t>compris entre 0 et 1 ; urgence vaut faible, moyenne ou élevée.</w:t>
+      </w:r>
+    </w:p>
+    <w:p>
+      <w:pPr>
+        <w:pStyle w:val="ListParagraph"/>
+        <w:numPr>
+          <w:ilvl w:val="0"/>
+          <w:numId w:val="10"/>
+        </w:numPr>
+        <w:autoSpaceDE w:val="0"/>
+        <w:autoSpaceDN w:val="0"/>
+        <w:adjustRightInd w:val="0"/>
+        <w:spacing w:after="0" w:line="360" w:lineRule="auto"/>
+        <w:jc w:val="center"/>
+        <w:rPr>
+          <w:rFonts w:ascii="Times New Roman" w:hAnsi="Times New Roman" w:cs="Times New Roman"/>
+          <w:b/>
+          <w:color w:val="000000"/>
+          <w:kern w:val="0"/>
+          <w:sz w:val="24"/>
+          <w:szCs w:val="24"/>
+        </w:rPr>
+      </w:pPr>
+      <w:r>
+        <w:rPr>
+          <w:rFonts w:ascii="Times New Roman" w:hAnsi="Times New Roman" w:cs="Times New Roman"/>
+          <w:b/>
+          <w:color w:val="000000"/>
+          <w:kern w:val="0"/>
+          <w:sz w:val="24"/>
+          <w:szCs w:val="24"/>
+        </w:rPr>
+        <w:lastRenderedPageBreak/>
+        <w:t>Prompt proposé</w:t>
+      </w:r>
+    </w:p>
+    <w:p>
+      <w:pPr>
+        <w:spacing w:line="360" w:lineRule="auto"/>
+        <w:jc w:val="both"/>
+        <w:rPr>
+          <w:rFonts w:ascii="Times New Roman" w:hAnsi="Times New Roman" w:cs="Times New Roman"/>
+          <w:b/>
+          <w:bCs/>
+          <w:sz w:val="24"/>
           <w:szCs w:val="28"/>
         </w:rPr>
       </w:pPr>
-    </w:p>
-    <w:p>
-      <w:pPr>
-        <w:spacing w:line="360" w:lineRule="auto"/>
-        <w:jc w:val="both"/>
-        <w:rPr>
-          <w:rFonts w:ascii="Times New Roman" w:hAnsi="Times New Roman" w:cs="Times New Roman"/>
-          <w:sz w:val="24"/>
-          <w:szCs w:val="24"/>
-        </w:rPr>
-      </w:pPr>
-    </w:p>
-    <w:p>
-      <w:pPr>
-        <w:spacing w:line="360" w:lineRule="auto"/>
-        <w:jc w:val="both"/>
-        <w:rPr>
-          <w:rFonts w:ascii="Times New Roman" w:hAnsi="Times New Roman" w:cs="Times New Roman"/>
-          <w:sz w:val="24"/>
-          <w:szCs w:val="24"/>
-        </w:rPr>
-      </w:pPr>
+      <w:r>
+        <w:rPr>
+          <w:rFonts w:ascii="Times New Roman" w:hAnsi="Times New Roman" w:cs="Times New Roman"/>
+          <w:b/>
+          <w:bCs/>
+          <w:sz w:val="24"/>
+          <w:szCs w:val="28"/>
+        </w:rPr>
+        <w:t>Rôle :</w:t>
+      </w:r>
+    </w:p>
+    <w:p>
+      <w:pPr>
+        <w:spacing w:line="360" w:lineRule="auto"/>
+        <w:jc w:val="both"/>
+        <w:rPr>
+          <w:rFonts w:ascii="Times New Roman" w:hAnsi="Times New Roman" w:cs="Times New Roman"/>
+          <w:bCs/>
+          <w:sz w:val="24"/>
+          <w:szCs w:val="28"/>
+        </w:rPr>
+      </w:pPr>
+      <w:r>
+        <w:rPr>
+          <w:rFonts w:ascii="Times New Roman" w:hAnsi="Times New Roman" w:cs="Times New Roman"/>
+          <w:bCs/>
+          <w:sz w:val="24"/>
+          <w:szCs w:val="28"/>
+        </w:rPr>
+        <w:t>Tu es un outil d'analyse automatique de commentaire</w:t>
+      </w:r>
+      <w:r>
+        <w:rPr>
+          <w:rFonts w:ascii="Times New Roman" w:hAnsi="Times New Roman" w:cs="Times New Roman"/>
+          <w:bCs/>
+          <w:sz w:val="24"/>
+          <w:szCs w:val="28"/>
+        </w:rPr>
+        <w:t xml:space="preserve">s clients, destiné à alimenter </w:t>
+      </w:r>
+      <w:r>
+        <w:rPr>
+          <w:rFonts w:ascii="Times New Roman" w:hAnsi="Times New Roman" w:cs="Times New Roman"/>
+          <w:bCs/>
+          <w:sz w:val="24"/>
+          <w:szCs w:val="28"/>
+        </w:rPr>
+        <w:t xml:space="preserve">une application de gestion de la </w:t>
+      </w:r>
+      <w:r>
+        <w:rPr>
+          <w:rFonts w:ascii="Times New Roman" w:hAnsi="Times New Roman" w:cs="Times New Roman"/>
+          <w:bCs/>
+          <w:sz w:val="24"/>
+          <w:szCs w:val="28"/>
+        </w:rPr>
+        <w:t>relation client.</w:t>
+      </w:r>
+    </w:p>
+    <w:p>
+      <w:pPr>
+        <w:spacing w:line="360" w:lineRule="auto"/>
+        <w:jc w:val="both"/>
+        <w:rPr>
+          <w:rFonts w:ascii="Times New Roman" w:hAnsi="Times New Roman" w:cs="Times New Roman"/>
+          <w:b/>
+          <w:bCs/>
+          <w:sz w:val="24"/>
+          <w:szCs w:val="28"/>
+        </w:rPr>
+      </w:pPr>
+      <w:r>
+        <w:rPr>
+          <w:rFonts w:ascii="Times New Roman" w:hAnsi="Times New Roman" w:cs="Times New Roman"/>
+          <w:b/>
+          <w:bCs/>
+          <w:sz w:val="24"/>
+          <w:szCs w:val="28"/>
+        </w:rPr>
+        <w:t>Tâche :</w:t>
+      </w:r>
+    </w:p>
+    <w:p>
+      <w:pPr>
+        <w:spacing w:line="360" w:lineRule="auto"/>
+        <w:jc w:val="both"/>
+        <w:rPr>
+          <w:rFonts w:ascii="Times New Roman" w:hAnsi="Times New Roman" w:cs="Times New Roman"/>
+          <w:bCs/>
+          <w:sz w:val="24"/>
+          <w:szCs w:val="28"/>
+        </w:rPr>
+      </w:pPr>
+      <w:r>
+        <w:rPr>
+          <w:rFonts w:ascii="Times New Roman" w:hAnsi="Times New Roman" w:cs="Times New Roman"/>
+          <w:bCs/>
+          <w:sz w:val="24"/>
+          <w:szCs w:val="28"/>
+        </w:rPr>
+        <w:t>Analyse le commentaire suivant et retourne le résultat</w:t>
+      </w:r>
+      <w:r>
+        <w:rPr>
+          <w:rFonts w:ascii="Times New Roman" w:hAnsi="Times New Roman" w:cs="Times New Roman"/>
+          <w:bCs/>
+          <w:sz w:val="24"/>
+          <w:szCs w:val="28"/>
+        </w:rPr>
+        <w:t xml:space="preserve"> exclusivement au format JSON, avec les champs suivants :</w:t>
+      </w:r>
+    </w:p>
+    <w:p>
+      <w:pPr>
+        <w:spacing w:line="360" w:lineRule="auto"/>
+        <w:jc w:val="both"/>
+        <w:rPr>
+          <w:rFonts w:ascii="Times New Roman" w:hAnsi="Times New Roman" w:cs="Times New Roman"/>
+          <w:bCs/>
+          <w:sz w:val="24"/>
+          <w:szCs w:val="28"/>
+        </w:rPr>
+      </w:pPr>
+      <w:r>
+        <w:rPr>
+          <w:rFonts w:ascii="Times New Roman" w:hAnsi="Times New Roman" w:cs="Times New Roman"/>
+          <w:bCs/>
+          <w:sz w:val="24"/>
+          <w:szCs w:val="28"/>
+        </w:rPr>
+        <w:t>- "sentiment" (chaîne de caractères)</w:t>
+      </w:r>
+    </w:p>
+    <w:p>
+      <w:pPr>
+        <w:spacing w:line="360" w:lineRule="auto"/>
+        <w:jc w:val="both"/>
+        <w:rPr>
+          <w:rFonts w:ascii="Times New Roman" w:hAnsi="Times New Roman" w:cs="Times New Roman"/>
+          <w:bCs/>
+          <w:sz w:val="24"/>
+          <w:szCs w:val="28"/>
+        </w:rPr>
+      </w:pPr>
+      <w:r>
+        <w:rPr>
+          <w:rFonts w:ascii="Times New Roman" w:hAnsi="Times New Roman" w:cs="Times New Roman"/>
+          <w:bCs/>
+          <w:sz w:val="24"/>
+          <w:szCs w:val="28"/>
+        </w:rPr>
+        <w:t>- "categorie" (chaîne de caractères)</w:t>
+      </w:r>
+    </w:p>
+    <w:p>
+      <w:pPr>
+        <w:spacing w:line="360" w:lineRule="auto"/>
+        <w:jc w:val="both"/>
+        <w:rPr>
+          <w:rFonts w:ascii="Times New Roman" w:hAnsi="Times New Roman" w:cs="Times New Roman"/>
+          <w:bCs/>
+          <w:sz w:val="24"/>
+          <w:szCs w:val="28"/>
+        </w:rPr>
+      </w:pPr>
+      <w:r>
+        <w:rPr>
+          <w:rFonts w:ascii="Times New Roman" w:hAnsi="Times New Roman" w:cs="Times New Roman"/>
+          <w:bCs/>
+          <w:sz w:val="24"/>
+          <w:szCs w:val="28"/>
+        </w:rPr>
+        <w:t>- "urgence" (chaîne de caractères)</w:t>
+      </w:r>
+    </w:p>
+    <w:p>
+      <w:pPr>
+        <w:spacing w:line="360" w:lineRule="auto"/>
+        <w:jc w:val="both"/>
+        <w:rPr>
+          <w:rFonts w:ascii="Times New Roman" w:hAnsi="Times New Roman" w:cs="Times New Roman"/>
+          <w:bCs/>
+          <w:sz w:val="24"/>
+          <w:szCs w:val="28"/>
+        </w:rPr>
+      </w:pPr>
+      <w:r>
+        <w:rPr>
+          <w:rFonts w:ascii="Times New Roman" w:hAnsi="Times New Roman" w:cs="Times New Roman"/>
+          <w:bCs/>
+          <w:sz w:val="24"/>
+          <w:szCs w:val="28"/>
+        </w:rPr>
+        <w:t>- "probleme" (chaîne de caractères)</w:t>
+      </w:r>
+    </w:p>
+    <w:p>
+      <w:pPr>
+        <w:spacing w:line="360" w:lineRule="auto"/>
+        <w:jc w:val="both"/>
+        <w:rPr>
+          <w:rFonts w:ascii="Times New Roman" w:hAnsi="Times New Roman" w:cs="Times New Roman"/>
+          <w:bCs/>
+          <w:sz w:val="24"/>
+          <w:szCs w:val="28"/>
+        </w:rPr>
+      </w:pPr>
+      <w:r>
+        <w:rPr>
+          <w:rFonts w:ascii="Times New Roman" w:hAnsi="Times New Roman" w:cs="Times New Roman"/>
+          <w:bCs/>
+          <w:sz w:val="24"/>
+          <w:szCs w:val="28"/>
+        </w:rPr>
+        <w:t>- "confiance" (nombre décimal)</w:t>
+      </w:r>
+    </w:p>
+    <w:p>
+      <w:pPr>
+        <w:spacing w:line="360" w:lineRule="auto"/>
+        <w:jc w:val="both"/>
+        <w:rPr>
+          <w:rFonts w:ascii="Times New Roman" w:hAnsi="Times New Roman" w:cs="Times New Roman"/>
+          <w:b/>
+          <w:bCs/>
+          <w:sz w:val="24"/>
+          <w:szCs w:val="28"/>
+        </w:rPr>
+      </w:pPr>
+      <w:r>
+        <w:rPr>
+          <w:rFonts w:ascii="Times New Roman" w:hAnsi="Times New Roman" w:cs="Times New Roman"/>
+          <w:b/>
+          <w:bCs/>
+          <w:sz w:val="24"/>
+          <w:szCs w:val="28"/>
+        </w:rPr>
+        <w:t>Commentaire à analyser :</w:t>
+      </w:r>
+    </w:p>
+    <w:p>
+      <w:pPr>
+        <w:spacing w:line="360" w:lineRule="auto"/>
+        <w:jc w:val="both"/>
+        <w:rPr>
+          <w:rFonts w:ascii="Times New Roman" w:hAnsi="Times New Roman" w:cs="Times New Roman"/>
+          <w:bCs/>
+          <w:sz w:val="24"/>
+          <w:szCs w:val="28"/>
+        </w:rPr>
+      </w:pPr>
+      <w:r>
+        <w:rPr>
+          <w:rFonts w:ascii="Times New Roman" w:hAnsi="Times New Roman" w:cs="Times New Roman"/>
+          <w:bCs/>
+          <w:sz w:val="24"/>
+          <w:szCs w:val="28"/>
+        </w:rPr>
+        <w:t>"Le service est rapide mais l'app</w:t>
+      </w:r>
+      <w:r>
+        <w:rPr>
+          <w:rFonts w:ascii="Times New Roman" w:hAnsi="Times New Roman" w:cs="Times New Roman"/>
+          <w:bCs/>
+          <w:sz w:val="24"/>
+          <w:szCs w:val="28"/>
+        </w:rPr>
+        <w:t>lication plante régulièrement."</w:t>
+      </w:r>
+    </w:p>
+    <w:p>
+      <w:pPr>
+        <w:spacing w:line="360" w:lineRule="auto"/>
+        <w:jc w:val="both"/>
+        <w:rPr>
+          <w:rFonts w:ascii="Times New Roman" w:hAnsi="Times New Roman" w:cs="Times New Roman"/>
+          <w:b/>
+          <w:bCs/>
+          <w:sz w:val="24"/>
+          <w:szCs w:val="28"/>
+        </w:rPr>
+      </w:pPr>
+      <w:r>
+        <w:rPr>
+          <w:rFonts w:ascii="Times New Roman" w:hAnsi="Times New Roman" w:cs="Times New Roman"/>
+          <w:b/>
+          <w:bCs/>
+          <w:sz w:val="24"/>
+          <w:szCs w:val="28"/>
+        </w:rPr>
+        <w:t>Règles de validation strictes (à respecter impérativement) :</w:t>
+      </w:r>
+    </w:p>
+    <w:p>
+      <w:pPr>
+        <w:spacing w:line="360" w:lineRule="auto"/>
+        <w:jc w:val="both"/>
+        <w:rPr>
+          <w:rFonts w:ascii="Times New Roman" w:hAnsi="Times New Roman" w:cs="Times New Roman"/>
+          <w:bCs/>
+          <w:sz w:val="24"/>
+          <w:szCs w:val="28"/>
+        </w:rPr>
+      </w:pPr>
+      <w:r>
+        <w:rPr>
+          <w:rFonts w:ascii="Times New Roman" w:hAnsi="Times New Roman" w:cs="Times New Roman"/>
+          <w:bCs/>
+          <w:sz w:val="24"/>
+          <w:szCs w:val="28"/>
+        </w:rPr>
+        <w:t>1. Le résultat doit être un JSON valide et rien</w:t>
+      </w:r>
+      <w:r>
+        <w:rPr>
+          <w:rFonts w:ascii="Times New Roman" w:hAnsi="Times New Roman" w:cs="Times New Roman"/>
+          <w:bCs/>
+          <w:sz w:val="24"/>
+          <w:szCs w:val="28"/>
+        </w:rPr>
+        <w:t xml:space="preserve"> d'autre (pas de texte, pas de </w:t>
+      </w:r>
+      <w:r>
+        <w:rPr>
+          <w:rFonts w:ascii="Times New Roman" w:hAnsi="Times New Roman" w:cs="Times New Roman"/>
+          <w:bCs/>
+          <w:sz w:val="24"/>
+          <w:szCs w:val="28"/>
+        </w:rPr>
+        <w:t xml:space="preserve">balises </w:t>
+      </w:r>
+      <w:proofErr w:type="spellStart"/>
+      <w:r>
+        <w:rPr>
+          <w:rFonts w:ascii="Times New Roman" w:hAnsi="Times New Roman" w:cs="Times New Roman"/>
+          <w:bCs/>
+          <w:sz w:val="24"/>
+          <w:szCs w:val="28"/>
+        </w:rPr>
+        <w:t>Markdown</w:t>
+      </w:r>
+      <w:proofErr w:type="spellEnd"/>
+      <w:r>
+        <w:rPr>
+          <w:rFonts w:ascii="Times New Roman" w:hAnsi="Times New Roman" w:cs="Times New Roman"/>
+          <w:bCs/>
+          <w:sz w:val="24"/>
+          <w:szCs w:val="28"/>
+        </w:rPr>
+        <w:t xml:space="preserve"> comme ```</w:t>
+      </w:r>
+      <w:proofErr w:type="spellStart"/>
+      <w:r>
+        <w:rPr>
+          <w:rFonts w:ascii="Times New Roman" w:hAnsi="Times New Roman" w:cs="Times New Roman"/>
+          <w:bCs/>
+          <w:sz w:val="24"/>
+          <w:szCs w:val="28"/>
+        </w:rPr>
+        <w:t>json</w:t>
+      </w:r>
+      <w:proofErr w:type="spellEnd"/>
+      <w:r>
+        <w:rPr>
+          <w:rFonts w:ascii="Times New Roman" w:hAnsi="Times New Roman" w:cs="Times New Roman"/>
+          <w:bCs/>
+          <w:sz w:val="24"/>
+          <w:szCs w:val="28"/>
+        </w:rPr>
+        <w:t>).</w:t>
+      </w:r>
+    </w:p>
+    <w:p>
+      <w:pPr>
+        <w:spacing w:line="360" w:lineRule="auto"/>
+        <w:jc w:val="both"/>
+        <w:rPr>
+          <w:rFonts w:ascii="Times New Roman" w:hAnsi="Times New Roman" w:cs="Times New Roman"/>
+          <w:bCs/>
+          <w:sz w:val="24"/>
+          <w:szCs w:val="28"/>
+        </w:rPr>
+      </w:pPr>
+      <w:r>
+        <w:rPr>
+          <w:rFonts w:ascii="Times New Roman" w:hAnsi="Times New Roman" w:cs="Times New Roman"/>
+          <w:bCs/>
+          <w:sz w:val="24"/>
+          <w:szCs w:val="28"/>
+        </w:rPr>
+        <w:t>2. Aucune propriété supplémentaire ne doit être ajoutée en dehors des 5 champs listés.</w:t>
+      </w:r>
+    </w:p>
+    <w:p>
+      <w:pPr>
+        <w:spacing w:line="360" w:lineRule="auto"/>
+        <w:jc w:val="both"/>
+        <w:rPr>
+          <w:rFonts w:ascii="Times New Roman" w:hAnsi="Times New Roman" w:cs="Times New Roman"/>
+          <w:bCs/>
+          <w:sz w:val="24"/>
+          <w:szCs w:val="28"/>
+        </w:rPr>
+      </w:pPr>
+      <w:r>
+        <w:rPr>
+          <w:rFonts w:ascii="Times New Roman" w:hAnsi="Times New Roman" w:cs="Times New Roman"/>
+          <w:bCs/>
+          <w:sz w:val="24"/>
+          <w:szCs w:val="28"/>
+        </w:rPr>
+        <w:t>3. Le champ "sentiment" doit obligatoirement valoir "p</w:t>
+      </w:r>
+      <w:r>
+        <w:rPr>
+          <w:rFonts w:ascii="Times New Roman" w:hAnsi="Times New Roman" w:cs="Times New Roman"/>
+          <w:bCs/>
+          <w:sz w:val="24"/>
+          <w:szCs w:val="28"/>
+        </w:rPr>
+        <w:t xml:space="preserve">ositif", "negatif" ou "neutre" </w:t>
+      </w:r>
+      <w:r>
+        <w:rPr>
+          <w:rFonts w:ascii="Times New Roman" w:hAnsi="Times New Roman" w:cs="Times New Roman"/>
+          <w:bCs/>
+          <w:sz w:val="24"/>
+          <w:szCs w:val="28"/>
+        </w:rPr>
+        <w:t>aucune autre valeur n'est acceptée.</w:t>
+      </w:r>
+    </w:p>
+    <w:p>
+      <w:pPr>
+        <w:spacing w:line="360" w:lineRule="auto"/>
+        <w:jc w:val="both"/>
+        <w:rPr>
+          <w:rFonts w:ascii="Times New Roman" w:hAnsi="Times New Roman" w:cs="Times New Roman"/>
+          <w:bCs/>
+          <w:sz w:val="24"/>
+          <w:szCs w:val="28"/>
+        </w:rPr>
+      </w:pPr>
+      <w:r>
+        <w:rPr>
+          <w:rFonts w:ascii="Times New Roman" w:hAnsi="Times New Roman" w:cs="Times New Roman"/>
+          <w:bCs/>
+          <w:sz w:val="24"/>
+          <w:szCs w:val="28"/>
+        </w:rPr>
+        <w:t>4. Le champ "confiance" doit être un nombre décimal strictement compris entre 0 et 1.</w:t>
+      </w:r>
+    </w:p>
+    <w:p>
+      <w:pPr>
+        <w:spacing w:line="360" w:lineRule="auto"/>
+        <w:jc w:val="both"/>
+        <w:rPr>
+          <w:rFonts w:ascii="Times New Roman" w:hAnsi="Times New Roman" w:cs="Times New Roman"/>
+          <w:bCs/>
+          <w:sz w:val="24"/>
+          <w:szCs w:val="28"/>
+        </w:rPr>
+      </w:pPr>
+      <w:r>
+        <w:rPr>
+          <w:rFonts w:ascii="Times New Roman" w:hAnsi="Times New Roman" w:cs="Times New Roman"/>
+          <w:bCs/>
+          <w:sz w:val="24"/>
+          <w:szCs w:val="28"/>
+        </w:rPr>
+        <w:t>5. Le champ "urgence" doit obligatoirement valoir "</w:t>
+      </w:r>
+      <w:r>
+        <w:rPr>
+          <w:rFonts w:ascii="Times New Roman" w:hAnsi="Times New Roman" w:cs="Times New Roman"/>
+          <w:bCs/>
+          <w:sz w:val="24"/>
+          <w:szCs w:val="28"/>
+        </w:rPr>
+        <w:t>faible", "moyenne" ou "élevée".</w:t>
+      </w:r>
+    </w:p>
+    <w:p>
+      <w:pPr>
+        <w:spacing w:line="360" w:lineRule="auto"/>
+        <w:jc w:val="both"/>
+        <w:rPr>
+          <w:rFonts w:ascii="Times New Roman" w:hAnsi="Times New Roman" w:cs="Times New Roman"/>
+          <w:bCs/>
+          <w:sz w:val="24"/>
+          <w:szCs w:val="28"/>
+        </w:rPr>
+      </w:pPr>
+      <w:r>
+        <w:rPr>
+          <w:rFonts w:ascii="Times New Roman" w:hAnsi="Times New Roman" w:cs="Times New Roman"/>
+          <w:bCs/>
+          <w:sz w:val="24"/>
+          <w:szCs w:val="28"/>
+        </w:rPr>
+        <w:t>Avant de répondre, vérifie mentalement que ton JSON respecte bien ces 5 règles.</w:t>
+      </w:r>
+    </w:p>
+    <w:p>
+      <w:pPr>
+        <w:pStyle w:val="ListParagraph"/>
+        <w:numPr>
+          <w:ilvl w:val="0"/>
+          <w:numId w:val="10"/>
+        </w:numPr>
+        <w:spacing w:line="360" w:lineRule="auto"/>
+        <w:jc w:val="center"/>
+        <w:rPr>
+          <w:rFonts w:ascii="Times New Roman" w:hAnsi="Times New Roman" w:cs="Times New Roman"/>
+          <w:b/>
+          <w:bCs/>
+          <w:sz w:val="24"/>
+          <w:szCs w:val="28"/>
+        </w:rPr>
+      </w:pPr>
+      <w:r>
+        <w:rPr>
+          <w:rFonts w:ascii="Times New Roman" w:hAnsi="Times New Roman" w:cs="Times New Roman"/>
+          <w:b/>
+          <w:bCs/>
+          <w:sz w:val="24"/>
+          <w:szCs w:val="28"/>
+        </w:rPr>
+        <w:t>Réponse de Claude</w:t>
+      </w:r>
     </w:p>
     <w:p>
       <w:pPr>
         <w:spacing w:line="360" w:lineRule="auto"/>
         <w:ind w:left="360"/>
-        <w:jc w:val="center"/>
-        <w:rPr>
-          <w:rFonts w:ascii="Times New Roman" w:hAnsi="Times New Roman" w:cs="Times New Roman"/>
-          <w:b/>
-          <w:bCs/>
-          <w:sz w:val="24"/>
+        <w:rPr>
+          <w:rFonts w:ascii="Times New Roman" w:hAnsi="Times New Roman" w:cs="Times New Roman"/>
+          <w:b/>
+          <w:bCs/>
+          <w:sz w:val="24"/>
+          <w:szCs w:val="28"/>
+        </w:rPr>
+      </w:pPr>
+      <w:r>
+        <w:rPr>
+          <w:rFonts w:ascii="Times New Roman" w:hAnsi="Times New Roman" w:cs="Times New Roman"/>
+          <w:b/>
+          <w:bCs/>
+          <w:sz w:val="24"/>
+          <w:szCs w:val="28"/>
+        </w:rPr>
+        <w:lastRenderedPageBreak/>
+        <w:drawing>
+          <wp:inline distT="0" distB="0" distL="0" distR="0" wp14:anchorId="2D61921D" wp14:editId="5DB8512E">
+            <wp:extent cx="5760720" cy="1343025"/>
+            <wp:effectExtent l="0" t="0" r="0" b="9525"/>
+            <wp:docPr id="2" name="Picture 2"/>
+            <wp:cNvGraphicFramePr>
+              <a:graphicFrameLocks xmlns:a="http://schemas.openxmlformats.org/drawingml/2006/main" noChangeAspect="1"/>
+            </wp:cNvGraphicFramePr>
+            <a:graphic xmlns:a="http://schemas.openxmlformats.org/drawingml/2006/main">
+              <a:graphicData uri="http://schemas.openxmlformats.org/drawingml/2006/picture">
+                <pic:pic xmlns:pic="http://schemas.openxmlformats.org/drawingml/2006/picture">
+                  <pic:nvPicPr>
+                    <pic:cNvPr id="1" name=""/>
+                    <pic:cNvPicPr/>
+                  </pic:nvPicPr>
+                  <pic:blipFill>
+                    <a:blip r:embed="rId15"/>
+                    <a:stretch>
+                      <a:fillRect/>
+                    </a:stretch>
+                  </pic:blipFill>
+                  <pic:spPr>
+                    <a:xfrm>
+                      <a:off x="0" y="0"/>
+                      <a:ext cx="5760720" cy="1343025"/>
+                    </a:xfrm>
+                    <a:prstGeom prst="rect">
+                      <a:avLst/>
+                    </a:prstGeom>
+                  </pic:spPr>
+                </pic:pic>
+              </a:graphicData>
+            </a:graphic>
+          </wp:inline>
+        </w:drawing>
+      </w:r>
+    </w:p>
+    <w:p>
+      <w:pPr>
+        <w:spacing w:line="360" w:lineRule="auto"/>
+        <w:jc w:val="both"/>
+        <w:rPr>
+          <w:rFonts w:ascii="Times New Roman" w:hAnsi="Times New Roman" w:cs="Times New Roman"/>
+          <w:szCs w:val="24"/>
+        </w:rPr>
+      </w:pPr>
+    </w:p>
+    <w:p>
+      <w:pPr>
+        <w:spacing w:line="360" w:lineRule="auto"/>
+        <w:jc w:val="both"/>
+        <w:rPr>
+          <w:rFonts w:ascii="Times New Roman" w:hAnsi="Times New Roman" w:cs="Times New Roman"/>
           <w:szCs w:val="24"/>
         </w:rPr>
       </w:pPr>
@@ -5057,11 +6029,22 @@
       <w:pPr>
         <w:spacing w:line="360" w:lineRule="auto"/>
         <w:ind w:left="360"/>
-        <w:rPr>
-          <w:rFonts w:ascii="Times New Roman" w:hAnsi="Times New Roman" w:cs="Times New Roman"/>
-          <w:b/>
-          <w:bCs/>
-          <w:sz w:val="24"/>
+        <w:jc w:val="both"/>
+        <w:rPr>
+          <w:rFonts w:ascii="Times New Roman" w:hAnsi="Times New Roman" w:cs="Times New Roman"/>
+          <w:bCs/>
+          <w:szCs w:val="24"/>
+        </w:rPr>
+      </w:pPr>
+    </w:p>
+    <w:p>
+      <w:pPr>
+        <w:spacing w:line="360" w:lineRule="auto"/>
+        <w:ind w:left="360"/>
+        <w:jc w:val="both"/>
+        <w:rPr>
+          <w:rFonts w:ascii="Times New Roman" w:hAnsi="Times New Roman" w:cs="Times New Roman"/>
+          <w:bCs/>
           <w:szCs w:val="24"/>
         </w:rPr>
       </w:pPr>
@@ -5282,7 +6265,7 @@
   <w:abstractNum w:abstractNumId="2">
     <w:nsid w:val="40234EF3"/>
     <w:multiLevelType w:val="hybridMultilevel"/>
-    <w:tmpl w:val="C1489748"/>
+    <w:tmpl w:val="85162952"/>
     <w:lvl w:ilvl="0" w:tplc="040C0009">
       <w:start w:val="1"/>
       <w:numFmt w:val="bullet"/>

</xml_diff>

<commit_message>
Partie 5 – Prompts pour les applications métier: Résumé et traduction de documents
</commit_message>
<xml_diff>
--- a/ai-business_assistant/correction_atelier_prompt-engineering.docx
+++ b/ai-business_assistant/correction_atelier_prompt-engineering.docx
@@ -5356,8 +5356,6 @@
         </w:rPr>
         <w:t xml:space="preserve"> </w:t>
       </w:r>
-      <w:bookmarkStart w:id="0" w:name="_GoBack"/>
-      <w:bookmarkEnd w:id="0"/>
       <w:r>
         <w:rPr>
           <w:rFonts w:ascii="Times New Roman" w:hAnsi="Times New Roman" w:cs="Times New Roman"/>
@@ -6008,19 +6006,1171 @@
     <w:p>
       <w:pPr>
         <w:spacing w:line="360" w:lineRule="auto"/>
-        <w:jc w:val="both"/>
-        <w:rPr>
-          <w:rFonts w:ascii="Times New Roman" w:hAnsi="Times New Roman" w:cs="Times New Roman"/>
-          <w:szCs w:val="24"/>
-        </w:rPr>
-      </w:pPr>
-    </w:p>
-    <w:p>
-      <w:pPr>
-        <w:spacing w:line="360" w:lineRule="auto"/>
-        <w:jc w:val="both"/>
-        <w:rPr>
-          <w:rFonts w:ascii="Times New Roman" w:hAnsi="Times New Roman" w:cs="Times New Roman"/>
+        <w:rPr>
+          <w:rFonts w:ascii="Times New Roman" w:hAnsi="Times New Roman" w:cs="Times New Roman"/>
+          <w:b/>
+          <w:kern w:val="0"/>
+          <w:sz w:val="28"/>
+          <w:szCs w:val="28"/>
+        </w:rPr>
+      </w:pPr>
+      <w:r>
+        <w:rPr>
+          <w:rFonts w:ascii="Times New Roman" w:hAnsi="Times New Roman" w:cs="Times New Roman"/>
+          <w:b/>
+          <w:kern w:val="0"/>
+          <w:sz w:val="28"/>
+          <w:szCs w:val="28"/>
+        </w:rPr>
+        <w:t>Partie 5 – Prompts pour les applications métier</w:t>
+      </w:r>
+    </w:p>
+    <w:p>
+      <w:pPr>
+        <w:pStyle w:val="ListParagraph"/>
+        <w:numPr>
+          <w:ilvl w:val="0"/>
+          <w:numId w:val="12"/>
+        </w:numPr>
+        <w:spacing w:line="360" w:lineRule="auto"/>
+        <w:jc w:val="both"/>
+        <w:rPr>
+          <w:rFonts w:ascii="Times New Roman" w:hAnsi="Times New Roman" w:cs="Times New Roman"/>
+          <w:bCs/>
+          <w:sz w:val="24"/>
+          <w:szCs w:val="28"/>
+        </w:rPr>
+      </w:pPr>
+      <w:r>
+        <w:rPr>
+          <w:rFonts w:ascii="Times New Roman" w:hAnsi="Times New Roman" w:cs="Times New Roman"/>
+          <w:bCs/>
+          <w:sz w:val="24"/>
+          <w:szCs w:val="28"/>
+        </w:rPr>
+        <w:t>Créer un prompt permettant de résumer un document</w:t>
+      </w:r>
+      <w:r>
+        <w:rPr>
+          <w:rFonts w:ascii="Times New Roman" w:hAnsi="Times New Roman" w:cs="Times New Roman"/>
+          <w:bCs/>
+          <w:sz w:val="24"/>
+          <w:szCs w:val="28"/>
+        </w:rPr>
+        <w:t xml:space="preserve"> avec les contraintes : maximum </w:t>
+      </w:r>
+      <w:r>
+        <w:rPr>
+          <w:rFonts w:ascii="Times New Roman" w:hAnsi="Times New Roman" w:cs="Times New Roman"/>
+          <w:bCs/>
+          <w:sz w:val="24"/>
+          <w:szCs w:val="28"/>
+        </w:rPr>
+        <w:t>250mots ; conserver les informations factuelles ; identifier les objec</w:t>
+      </w:r>
+      <w:r>
+        <w:rPr>
+          <w:rFonts w:ascii="Times New Roman" w:hAnsi="Times New Roman" w:cs="Times New Roman"/>
+          <w:bCs/>
+          <w:sz w:val="24"/>
+          <w:szCs w:val="28"/>
+        </w:rPr>
+        <w:t>tifs ; identifier les résultats</w:t>
+      </w:r>
+      <w:r>
+        <w:rPr>
+          <w:rFonts w:ascii="Times New Roman" w:hAnsi="Times New Roman" w:cs="Times New Roman"/>
+          <w:bCs/>
+          <w:sz w:val="24"/>
+          <w:szCs w:val="28"/>
+        </w:rPr>
+        <w:t>;</w:t>
+      </w:r>
+      <w:r>
+        <w:rPr>
+          <w:rFonts w:ascii="Times New Roman" w:hAnsi="Times New Roman" w:cs="Times New Roman"/>
+          <w:bCs/>
+          <w:sz w:val="24"/>
+          <w:szCs w:val="28"/>
+        </w:rPr>
+        <w:t xml:space="preserve"> </w:t>
+      </w:r>
+      <w:r>
+        <w:rPr>
+          <w:rFonts w:ascii="Times New Roman" w:hAnsi="Times New Roman" w:cs="Times New Roman"/>
+          <w:bCs/>
+          <w:sz w:val="24"/>
+          <w:szCs w:val="28"/>
+        </w:rPr>
+        <w:t>identifier les recommandations ; n'inventer aucune information.</w:t>
+      </w:r>
+    </w:p>
+    <w:p>
+      <w:pPr>
+        <w:pStyle w:val="ListParagraph"/>
+        <w:numPr>
+          <w:ilvl w:val="0"/>
+          <w:numId w:val="10"/>
+        </w:numPr>
+        <w:spacing w:line="360" w:lineRule="auto"/>
+        <w:jc w:val="center"/>
+        <w:rPr>
+          <w:rFonts w:ascii="Times New Roman" w:hAnsi="Times New Roman" w:cs="Times New Roman"/>
+          <w:bCs/>
+          <w:sz w:val="24"/>
+          <w:szCs w:val="28"/>
+        </w:rPr>
+      </w:pPr>
+      <w:r>
+        <w:rPr>
+          <w:rFonts w:ascii="Times New Roman" w:hAnsi="Times New Roman" w:cs="Times New Roman"/>
+          <w:b/>
+          <w:bCs/>
+          <w:sz w:val="24"/>
+          <w:szCs w:val="28"/>
+        </w:rPr>
+        <w:t>Prompt proposé</w:t>
+      </w:r>
+    </w:p>
+    <w:p>
+      <w:pPr>
+        <w:spacing w:line="360" w:lineRule="auto"/>
+        <w:jc w:val="both"/>
+        <w:rPr>
+          <w:rFonts w:ascii="Times New Roman" w:hAnsi="Times New Roman" w:cs="Times New Roman"/>
+          <w:b/>
+          <w:bCs/>
+          <w:sz w:val="24"/>
+          <w:szCs w:val="28"/>
+        </w:rPr>
+      </w:pPr>
+      <w:r>
+        <w:rPr>
+          <w:rFonts w:ascii="Times New Roman" w:hAnsi="Times New Roman" w:cs="Times New Roman"/>
+          <w:b/>
+          <w:bCs/>
+          <w:sz w:val="24"/>
+          <w:szCs w:val="28"/>
+        </w:rPr>
+        <w:t>Rôle :</w:t>
+      </w:r>
+    </w:p>
+    <w:p>
+      <w:pPr>
+        <w:spacing w:line="360" w:lineRule="auto"/>
+        <w:jc w:val="both"/>
+        <w:rPr>
+          <w:rFonts w:ascii="Times New Roman" w:hAnsi="Times New Roman" w:cs="Times New Roman"/>
+          <w:bCs/>
+          <w:sz w:val="24"/>
+          <w:szCs w:val="28"/>
+        </w:rPr>
+      </w:pPr>
+      <w:r>
+        <w:rPr>
+          <w:rFonts w:ascii="Times New Roman" w:hAnsi="Times New Roman" w:cs="Times New Roman"/>
+          <w:bCs/>
+          <w:sz w:val="24"/>
+          <w:szCs w:val="28"/>
+        </w:rPr>
+        <w:t xml:space="preserve">Tu es un assistant de synthèse documentaire </w:t>
+      </w:r>
+      <w:r>
+        <w:rPr>
+          <w:rFonts w:ascii="Times New Roman" w:hAnsi="Times New Roman" w:cs="Times New Roman"/>
+          <w:bCs/>
+          <w:sz w:val="24"/>
+          <w:szCs w:val="28"/>
+        </w:rPr>
+        <w:t>pour un contexte professionnel.</w:t>
+      </w:r>
+    </w:p>
+    <w:p>
+      <w:pPr>
+        <w:spacing w:line="360" w:lineRule="auto"/>
+        <w:jc w:val="both"/>
+        <w:rPr>
+          <w:rFonts w:ascii="Times New Roman" w:hAnsi="Times New Roman" w:cs="Times New Roman"/>
+          <w:b/>
+          <w:bCs/>
+          <w:sz w:val="24"/>
+          <w:szCs w:val="28"/>
+        </w:rPr>
+      </w:pPr>
+      <w:r>
+        <w:rPr>
+          <w:rFonts w:ascii="Times New Roman" w:hAnsi="Times New Roman" w:cs="Times New Roman"/>
+          <w:b/>
+          <w:bCs/>
+          <w:sz w:val="24"/>
+          <w:szCs w:val="28"/>
+        </w:rPr>
+        <w:t>Tâche :</w:t>
+      </w:r>
+    </w:p>
+    <w:p>
+      <w:pPr>
+        <w:spacing w:line="360" w:lineRule="auto"/>
+        <w:jc w:val="both"/>
+        <w:rPr>
+          <w:rFonts w:ascii="Times New Roman" w:hAnsi="Times New Roman" w:cs="Times New Roman"/>
+          <w:bCs/>
+          <w:sz w:val="24"/>
+          <w:szCs w:val="28"/>
+        </w:rPr>
+      </w:pPr>
+      <w:r>
+        <w:rPr>
+          <w:rFonts w:ascii="Times New Roman" w:hAnsi="Times New Roman" w:cs="Times New Roman"/>
+          <w:bCs/>
+          <w:sz w:val="24"/>
+          <w:szCs w:val="28"/>
+        </w:rPr>
+        <w:t>Résume le document suivant en respect</w:t>
+      </w:r>
+      <w:r>
+        <w:rPr>
+          <w:rFonts w:ascii="Times New Roman" w:hAnsi="Times New Roman" w:cs="Times New Roman"/>
+          <w:bCs/>
+          <w:sz w:val="24"/>
+          <w:szCs w:val="28"/>
+        </w:rPr>
+        <w:t>ant les contraintes ci-dessous.</w:t>
+      </w:r>
+    </w:p>
+    <w:p>
+      <w:pPr>
+        <w:spacing w:line="360" w:lineRule="auto"/>
+        <w:jc w:val="both"/>
+        <w:rPr>
+          <w:rFonts w:ascii="Times New Roman" w:hAnsi="Times New Roman" w:cs="Times New Roman"/>
+          <w:b/>
+          <w:bCs/>
+          <w:sz w:val="24"/>
+          <w:szCs w:val="28"/>
+        </w:rPr>
+      </w:pPr>
+      <w:r>
+        <w:rPr>
+          <w:rFonts w:ascii="Times New Roman" w:hAnsi="Times New Roman" w:cs="Times New Roman"/>
+          <w:b/>
+          <w:bCs/>
+          <w:sz w:val="24"/>
+          <w:szCs w:val="28"/>
+        </w:rPr>
+        <w:t>Contraintes :</w:t>
+      </w:r>
+    </w:p>
+    <w:p>
+      <w:pPr>
+        <w:spacing w:line="360" w:lineRule="auto"/>
+        <w:jc w:val="both"/>
+        <w:rPr>
+          <w:rFonts w:ascii="Times New Roman" w:hAnsi="Times New Roman" w:cs="Times New Roman"/>
+          <w:bCs/>
+          <w:sz w:val="24"/>
+          <w:szCs w:val="28"/>
+        </w:rPr>
+      </w:pPr>
+      <w:r>
+        <w:rPr>
+          <w:rFonts w:ascii="Times New Roman" w:hAnsi="Times New Roman" w:cs="Times New Roman"/>
+          <w:bCs/>
+          <w:sz w:val="24"/>
+          <w:szCs w:val="28"/>
+        </w:rPr>
+        <w:t>- Longueur maximale : 250 mots.</w:t>
+      </w:r>
+    </w:p>
+    <w:p>
+      <w:pPr>
+        <w:spacing w:line="360" w:lineRule="auto"/>
+        <w:jc w:val="both"/>
+        <w:rPr>
+          <w:rFonts w:ascii="Times New Roman" w:hAnsi="Times New Roman" w:cs="Times New Roman"/>
+          <w:bCs/>
+          <w:sz w:val="24"/>
+          <w:szCs w:val="28"/>
+        </w:rPr>
+      </w:pPr>
+      <w:r>
+        <w:rPr>
+          <w:rFonts w:ascii="Times New Roman" w:hAnsi="Times New Roman" w:cs="Times New Roman"/>
+          <w:bCs/>
+          <w:sz w:val="24"/>
+          <w:szCs w:val="28"/>
+        </w:rPr>
+        <w:t>- Conserve uniquement les informations factuel</w:t>
+      </w:r>
+      <w:r>
+        <w:rPr>
+          <w:rFonts w:ascii="Times New Roman" w:hAnsi="Times New Roman" w:cs="Times New Roman"/>
+          <w:bCs/>
+          <w:sz w:val="24"/>
+          <w:szCs w:val="28"/>
+        </w:rPr>
+        <w:t xml:space="preserve">les présentes dans le document (dates, chiffres, </w:t>
+      </w:r>
+      <w:r>
+        <w:rPr>
+          <w:rFonts w:ascii="Times New Roman" w:hAnsi="Times New Roman" w:cs="Times New Roman"/>
+          <w:bCs/>
+          <w:sz w:val="24"/>
+          <w:szCs w:val="28"/>
+        </w:rPr>
+        <w:t>noms, décisions...).</w:t>
+      </w:r>
+    </w:p>
+    <w:p>
+      <w:pPr>
+        <w:spacing w:line="360" w:lineRule="auto"/>
+        <w:jc w:val="both"/>
+        <w:rPr>
+          <w:rFonts w:ascii="Times New Roman" w:hAnsi="Times New Roman" w:cs="Times New Roman"/>
+          <w:bCs/>
+          <w:sz w:val="24"/>
+          <w:szCs w:val="28"/>
+        </w:rPr>
+      </w:pPr>
+      <w:r>
+        <w:rPr>
+          <w:rFonts w:ascii="Times New Roman" w:hAnsi="Times New Roman" w:cs="Times New Roman"/>
+          <w:bCs/>
+          <w:sz w:val="24"/>
+          <w:szCs w:val="28"/>
+        </w:rPr>
+        <w:t>- Identifie clairement les objectifs mentionnés dans le document.</w:t>
+      </w:r>
+    </w:p>
+    <w:p>
+      <w:pPr>
+        <w:spacing w:line="360" w:lineRule="auto"/>
+        <w:jc w:val="both"/>
+        <w:rPr>
+          <w:rFonts w:ascii="Times New Roman" w:hAnsi="Times New Roman" w:cs="Times New Roman"/>
+          <w:bCs/>
+          <w:sz w:val="24"/>
+          <w:szCs w:val="28"/>
+        </w:rPr>
+      </w:pPr>
+      <w:r>
+        <w:rPr>
+          <w:rFonts w:ascii="Times New Roman" w:hAnsi="Times New Roman" w:cs="Times New Roman"/>
+          <w:bCs/>
+          <w:sz w:val="24"/>
+          <w:szCs w:val="28"/>
+        </w:rPr>
+        <w:t>- Identifie clairement les résultats obtenus ou observés.</w:t>
+      </w:r>
+    </w:p>
+    <w:p>
+      <w:pPr>
+        <w:spacing w:line="360" w:lineRule="auto"/>
+        <w:jc w:val="both"/>
+        <w:rPr>
+          <w:rFonts w:ascii="Times New Roman" w:hAnsi="Times New Roman" w:cs="Times New Roman"/>
+          <w:bCs/>
+          <w:sz w:val="24"/>
+          <w:szCs w:val="28"/>
+        </w:rPr>
+      </w:pPr>
+      <w:r>
+        <w:rPr>
+          <w:rFonts w:ascii="Times New Roman" w:hAnsi="Times New Roman" w:cs="Times New Roman"/>
+          <w:bCs/>
+          <w:sz w:val="24"/>
+          <w:szCs w:val="28"/>
+        </w:rPr>
+        <w:t>- Identifie clairement les recommandations formulées, si elles existent.</w:t>
+      </w:r>
+    </w:p>
+    <w:p>
+      <w:pPr>
+        <w:spacing w:line="360" w:lineRule="auto"/>
+        <w:jc w:val="both"/>
+        <w:rPr>
+          <w:rFonts w:ascii="Times New Roman" w:hAnsi="Times New Roman" w:cs="Times New Roman"/>
+          <w:bCs/>
+          <w:sz w:val="24"/>
+          <w:szCs w:val="28"/>
+        </w:rPr>
+      </w:pPr>
+      <w:r>
+        <w:rPr>
+          <w:rFonts w:ascii="Times New Roman" w:hAnsi="Times New Roman" w:cs="Times New Roman"/>
+          <w:bCs/>
+          <w:sz w:val="24"/>
+          <w:szCs w:val="28"/>
+        </w:rPr>
+        <w:t>- N'invente aucune information absente</w:t>
+      </w:r>
+      <w:r>
+        <w:rPr>
+          <w:rFonts w:ascii="Times New Roman" w:hAnsi="Times New Roman" w:cs="Times New Roman"/>
+          <w:bCs/>
+          <w:sz w:val="24"/>
+          <w:szCs w:val="28"/>
+        </w:rPr>
+        <w:t xml:space="preserve"> du document. Si une catégorie </w:t>
+      </w:r>
+      <w:r>
+        <w:rPr>
+          <w:rFonts w:ascii="Times New Roman" w:hAnsi="Times New Roman" w:cs="Times New Roman"/>
+          <w:bCs/>
+          <w:sz w:val="24"/>
+          <w:szCs w:val="28"/>
+        </w:rPr>
+        <w:t>(objectifs, résultats ou recommandations) n'est pas présente dans le texte, indique-le explicit</w:t>
+      </w:r>
+      <w:r>
+        <w:rPr>
+          <w:rFonts w:ascii="Times New Roman" w:hAnsi="Times New Roman" w:cs="Times New Roman"/>
+          <w:bCs/>
+          <w:sz w:val="24"/>
+          <w:szCs w:val="28"/>
+        </w:rPr>
+        <w:t>ement plutôt que de l'inventer.</w:t>
+      </w:r>
+    </w:p>
+    <w:p>
+      <w:pPr>
+        <w:spacing w:line="360" w:lineRule="auto"/>
+        <w:jc w:val="both"/>
+        <w:rPr>
+          <w:rFonts w:ascii="Times New Roman" w:hAnsi="Times New Roman" w:cs="Times New Roman"/>
+          <w:b/>
+          <w:bCs/>
+          <w:sz w:val="24"/>
+          <w:szCs w:val="28"/>
+        </w:rPr>
+      </w:pPr>
+      <w:r>
+        <w:rPr>
+          <w:rFonts w:ascii="Times New Roman" w:hAnsi="Times New Roman" w:cs="Times New Roman"/>
+          <w:b/>
+          <w:bCs/>
+          <w:sz w:val="24"/>
+          <w:szCs w:val="28"/>
+        </w:rPr>
+        <w:t>Format de sortie :</w:t>
+      </w:r>
+    </w:p>
+    <w:p>
+      <w:pPr>
+        <w:spacing w:line="360" w:lineRule="auto"/>
+        <w:jc w:val="both"/>
+        <w:rPr>
+          <w:rFonts w:ascii="Times New Roman" w:hAnsi="Times New Roman" w:cs="Times New Roman"/>
+          <w:bCs/>
+          <w:sz w:val="24"/>
+          <w:szCs w:val="28"/>
+        </w:rPr>
+      </w:pPr>
+      <w:r>
+        <w:rPr>
+          <w:rFonts w:ascii="Times New Roman" w:hAnsi="Times New Roman" w:cs="Times New Roman"/>
+          <w:bCs/>
+          <w:sz w:val="24"/>
+          <w:szCs w:val="28"/>
+        </w:rPr>
+        <w:t>- Résumé général (quelques phrases)</w:t>
+      </w:r>
+    </w:p>
+    <w:p>
+      <w:pPr>
+        <w:spacing w:line="360" w:lineRule="auto"/>
+        <w:jc w:val="both"/>
+        <w:rPr>
+          <w:rFonts w:ascii="Times New Roman" w:hAnsi="Times New Roman" w:cs="Times New Roman"/>
+          <w:bCs/>
+          <w:sz w:val="24"/>
+          <w:szCs w:val="28"/>
+        </w:rPr>
+      </w:pPr>
+      <w:r>
+        <w:rPr>
+          <w:rFonts w:ascii="Times New Roman" w:hAnsi="Times New Roman" w:cs="Times New Roman"/>
+          <w:bCs/>
+          <w:sz w:val="24"/>
+          <w:szCs w:val="28"/>
+        </w:rPr>
+        <w:t>- Objectifs</w:t>
+      </w:r>
+    </w:p>
+    <w:p>
+      <w:pPr>
+        <w:spacing w:line="360" w:lineRule="auto"/>
+        <w:jc w:val="both"/>
+        <w:rPr>
+          <w:rFonts w:ascii="Times New Roman" w:hAnsi="Times New Roman" w:cs="Times New Roman"/>
+          <w:bCs/>
+          <w:sz w:val="24"/>
+          <w:szCs w:val="28"/>
+        </w:rPr>
+      </w:pPr>
+      <w:r>
+        <w:rPr>
+          <w:rFonts w:ascii="Times New Roman" w:hAnsi="Times New Roman" w:cs="Times New Roman"/>
+          <w:bCs/>
+          <w:sz w:val="24"/>
+          <w:szCs w:val="28"/>
+        </w:rPr>
+        <w:lastRenderedPageBreak/>
+        <w:t>- Résultats</w:t>
+      </w:r>
+    </w:p>
+    <w:p>
+      <w:pPr>
+        <w:spacing w:line="360" w:lineRule="auto"/>
+        <w:jc w:val="both"/>
+        <w:rPr>
+          <w:rFonts w:ascii="Times New Roman" w:hAnsi="Times New Roman" w:cs="Times New Roman"/>
+          <w:bCs/>
+          <w:sz w:val="24"/>
+          <w:szCs w:val="28"/>
+        </w:rPr>
+      </w:pPr>
+      <w:r>
+        <w:rPr>
+          <w:rFonts w:ascii="Times New Roman" w:hAnsi="Times New Roman" w:cs="Times New Roman"/>
+          <w:bCs/>
+          <w:sz w:val="24"/>
+          <w:szCs w:val="28"/>
+        </w:rPr>
+        <w:t>- Recommandations</w:t>
+      </w:r>
+    </w:p>
+    <w:p>
+      <w:pPr>
+        <w:pStyle w:val="ListParagraph"/>
+        <w:numPr>
+          <w:ilvl w:val="0"/>
+          <w:numId w:val="10"/>
+        </w:numPr>
+        <w:spacing w:line="360" w:lineRule="auto"/>
+        <w:jc w:val="center"/>
+        <w:rPr>
+          <w:rFonts w:ascii="Times New Roman" w:hAnsi="Times New Roman" w:cs="Times New Roman"/>
+          <w:b/>
+          <w:sz w:val="24"/>
+          <w:szCs w:val="24"/>
+        </w:rPr>
+      </w:pPr>
+      <w:r>
+        <w:rPr>
+          <w:rFonts w:ascii="Times New Roman" w:hAnsi="Times New Roman" w:cs="Times New Roman"/>
+          <w:b/>
+          <w:sz w:val="24"/>
+          <w:szCs w:val="24"/>
+        </w:rPr>
+        <w:t>Réponse de Claude</w:t>
+      </w:r>
+    </w:p>
+    <w:p>
+      <w:pPr>
+        <w:spacing w:line="360" w:lineRule="auto"/>
+        <w:jc w:val="both"/>
+        <w:rPr>
+          <w:rFonts w:ascii="Times New Roman" w:hAnsi="Times New Roman" w:cs="Times New Roman"/>
+          <w:szCs w:val="24"/>
+        </w:rPr>
+      </w:pPr>
+      <w:r>
+        <w:rPr>
+          <w:rFonts w:ascii="Times New Roman" w:hAnsi="Times New Roman" w:cs="Times New Roman"/>
+          <w:szCs w:val="24"/>
+        </w:rPr>
+        <w:drawing>
+          <wp:inline distT="0" distB="0" distL="0" distR="0" wp14:anchorId="62ECFA7B" wp14:editId="72B932B9">
+            <wp:extent cx="5760720" cy="4102100"/>
+            <wp:effectExtent l="0" t="0" r="0" b="0"/>
+            <wp:docPr id="3" name="Picture 3"/>
+            <wp:cNvGraphicFramePr>
+              <a:graphicFrameLocks xmlns:a="http://schemas.openxmlformats.org/drawingml/2006/main" noChangeAspect="1"/>
+            </wp:cNvGraphicFramePr>
+            <a:graphic xmlns:a="http://schemas.openxmlformats.org/drawingml/2006/main">
+              <a:graphicData uri="http://schemas.openxmlformats.org/drawingml/2006/picture">
+                <pic:pic xmlns:pic="http://schemas.openxmlformats.org/drawingml/2006/picture">
+                  <pic:nvPicPr>
+                    <pic:cNvPr id="1" name=""/>
+                    <pic:cNvPicPr/>
+                  </pic:nvPicPr>
+                  <pic:blipFill>
+                    <a:blip r:embed="rId16"/>
+                    <a:stretch>
+                      <a:fillRect/>
+                    </a:stretch>
+                  </pic:blipFill>
+                  <pic:spPr>
+                    <a:xfrm>
+                      <a:off x="0" y="0"/>
+                      <a:ext cx="5760720" cy="4102100"/>
+                    </a:xfrm>
+                    <a:prstGeom prst="rect">
+                      <a:avLst/>
+                    </a:prstGeom>
+                  </pic:spPr>
+                </pic:pic>
+              </a:graphicData>
+            </a:graphic>
+          </wp:inline>
+        </w:drawing>
+      </w:r>
+    </w:p>
+    <w:p>
+      <w:pPr>
+        <w:spacing w:line="360" w:lineRule="auto"/>
+        <w:jc w:val="both"/>
+        <w:rPr>
+          <w:rFonts w:ascii="Times New Roman" w:hAnsi="Times New Roman" w:cs="Times New Roman"/>
+          <w:szCs w:val="24"/>
+        </w:rPr>
+      </w:pPr>
+      <w:r>
+        <w:rPr>
+          <w:rFonts w:ascii="Times New Roman" w:hAnsi="Times New Roman" w:cs="Times New Roman"/>
+          <w:szCs w:val="24"/>
+        </w:rPr>
+        <w:lastRenderedPageBreak/>
+        <w:drawing>
+          <wp:inline distT="0" distB="0" distL="0" distR="0" wp14:anchorId="1AD44CF7" wp14:editId="160F43B6">
+            <wp:extent cx="5760720" cy="3809365"/>
+            <wp:effectExtent l="0" t="0" r="0" b="635"/>
+            <wp:docPr id="4" name="Picture 4"/>
+            <wp:cNvGraphicFramePr>
+              <a:graphicFrameLocks xmlns:a="http://schemas.openxmlformats.org/drawingml/2006/main" noChangeAspect="1"/>
+            </wp:cNvGraphicFramePr>
+            <a:graphic xmlns:a="http://schemas.openxmlformats.org/drawingml/2006/main">
+              <a:graphicData uri="http://schemas.openxmlformats.org/drawingml/2006/picture">
+                <pic:pic xmlns:pic="http://schemas.openxmlformats.org/drawingml/2006/picture">
+                  <pic:nvPicPr>
+                    <pic:cNvPr id="1" name=""/>
+                    <pic:cNvPicPr/>
+                  </pic:nvPicPr>
+                  <pic:blipFill>
+                    <a:blip r:embed="rId17"/>
+                    <a:stretch>
+                      <a:fillRect/>
+                    </a:stretch>
+                  </pic:blipFill>
+                  <pic:spPr>
+                    <a:xfrm>
+                      <a:off x="0" y="0"/>
+                      <a:ext cx="5760720" cy="3809365"/>
+                    </a:xfrm>
+                    <a:prstGeom prst="rect">
+                      <a:avLst/>
+                    </a:prstGeom>
+                  </pic:spPr>
+                </pic:pic>
+              </a:graphicData>
+            </a:graphic>
+          </wp:inline>
+        </w:drawing>
+      </w:r>
+    </w:p>
+    <w:p>
+      <w:pPr>
+        <w:pStyle w:val="ListParagraph"/>
+        <w:numPr>
+          <w:ilvl w:val="0"/>
+          <w:numId w:val="12"/>
+        </w:numPr>
+        <w:spacing w:line="360" w:lineRule="auto"/>
+        <w:jc w:val="both"/>
+        <w:rPr>
+          <w:rFonts w:ascii="Times New Roman" w:hAnsi="Times New Roman" w:cs="Times New Roman"/>
+          <w:sz w:val="24"/>
+          <w:szCs w:val="24"/>
+        </w:rPr>
+      </w:pPr>
+      <w:r>
+        <w:rPr>
+          <w:rFonts w:ascii="Times New Roman" w:hAnsi="Times New Roman" w:cs="Times New Roman"/>
+          <w:sz w:val="24"/>
+          <w:szCs w:val="24"/>
+        </w:rPr>
+        <w:t>Créer un prompt permettant de traduire un document français en anglais avec les</w:t>
+      </w:r>
+      <w:r>
+        <w:rPr>
+          <w:rFonts w:ascii="Times New Roman" w:hAnsi="Times New Roman" w:cs="Times New Roman"/>
+          <w:sz w:val="24"/>
+          <w:szCs w:val="24"/>
+        </w:rPr>
+        <w:t xml:space="preserve"> </w:t>
+      </w:r>
+      <w:r>
+        <w:rPr>
+          <w:rFonts w:ascii="Times New Roman" w:hAnsi="Times New Roman" w:cs="Times New Roman"/>
+          <w:sz w:val="24"/>
+          <w:szCs w:val="24"/>
+        </w:rPr>
+        <w:t>contraintes : conserver le sens ; conserver la structure ; conserver les termes techniques ; ne</w:t>
+      </w:r>
+      <w:r>
+        <w:rPr>
+          <w:rFonts w:ascii="Times New Roman" w:hAnsi="Times New Roman" w:cs="Times New Roman"/>
+          <w:sz w:val="24"/>
+          <w:szCs w:val="24"/>
+        </w:rPr>
+        <w:t xml:space="preserve"> </w:t>
+      </w:r>
+      <w:r>
+        <w:rPr>
+          <w:rFonts w:ascii="Times New Roman" w:hAnsi="Times New Roman" w:cs="Times New Roman"/>
+          <w:sz w:val="24"/>
+          <w:szCs w:val="24"/>
+        </w:rPr>
+        <w:t>pas résumer ; ne rajoute aucune information</w:t>
+      </w:r>
+    </w:p>
+    <w:p>
+      <w:pPr>
+        <w:pStyle w:val="ListParagraph"/>
+        <w:numPr>
+          <w:ilvl w:val="0"/>
+          <w:numId w:val="10"/>
+        </w:numPr>
+        <w:spacing w:line="360" w:lineRule="auto"/>
+        <w:jc w:val="center"/>
+        <w:rPr>
+          <w:rFonts w:ascii="Times New Roman" w:hAnsi="Times New Roman" w:cs="Times New Roman"/>
+          <w:bCs/>
+          <w:sz w:val="24"/>
+          <w:szCs w:val="28"/>
+        </w:rPr>
+      </w:pPr>
+      <w:r>
+        <w:rPr>
+          <w:rFonts w:ascii="Times New Roman" w:hAnsi="Times New Roman" w:cs="Times New Roman"/>
+          <w:b/>
+          <w:bCs/>
+          <w:sz w:val="24"/>
+          <w:szCs w:val="28"/>
+        </w:rPr>
+        <w:t>Prompt proposé</w:t>
+      </w:r>
+    </w:p>
+    <w:p>
+      <w:pPr>
+        <w:spacing w:line="360" w:lineRule="auto"/>
+        <w:jc w:val="both"/>
+        <w:rPr>
+          <w:rFonts w:ascii="Times New Roman" w:hAnsi="Times New Roman" w:cs="Times New Roman"/>
+          <w:b/>
+          <w:sz w:val="24"/>
+          <w:szCs w:val="24"/>
+        </w:rPr>
+      </w:pPr>
+      <w:r>
+        <w:rPr>
+          <w:rFonts w:ascii="Times New Roman" w:hAnsi="Times New Roman" w:cs="Times New Roman"/>
+          <w:b/>
+          <w:sz w:val="24"/>
+          <w:szCs w:val="24"/>
+        </w:rPr>
+        <w:t>Rôle :</w:t>
+      </w:r>
+    </w:p>
+    <w:p>
+      <w:pPr>
+        <w:spacing w:line="360" w:lineRule="auto"/>
+        <w:jc w:val="both"/>
+        <w:rPr>
+          <w:rFonts w:ascii="Times New Roman" w:hAnsi="Times New Roman" w:cs="Times New Roman"/>
+          <w:sz w:val="24"/>
+          <w:szCs w:val="24"/>
+        </w:rPr>
+      </w:pPr>
+      <w:r>
+        <w:rPr>
+          <w:rFonts w:ascii="Times New Roman" w:hAnsi="Times New Roman" w:cs="Times New Roman"/>
+          <w:sz w:val="24"/>
+          <w:szCs w:val="24"/>
+        </w:rPr>
+        <w:t>Tu es un traducteur professionnel spécialisé dans les document</w:t>
+      </w:r>
+      <w:r>
+        <w:rPr>
+          <w:rFonts w:ascii="Times New Roman" w:hAnsi="Times New Roman" w:cs="Times New Roman"/>
+          <w:sz w:val="24"/>
+          <w:szCs w:val="24"/>
+        </w:rPr>
+        <w:t>s techniques et professionnels.</w:t>
+      </w:r>
+    </w:p>
+    <w:p>
+      <w:pPr>
+        <w:spacing w:line="360" w:lineRule="auto"/>
+        <w:jc w:val="both"/>
+        <w:rPr>
+          <w:rFonts w:ascii="Times New Roman" w:hAnsi="Times New Roman" w:cs="Times New Roman"/>
+          <w:b/>
+          <w:sz w:val="24"/>
+          <w:szCs w:val="24"/>
+        </w:rPr>
+      </w:pPr>
+      <w:r>
+        <w:rPr>
+          <w:rFonts w:ascii="Times New Roman" w:hAnsi="Times New Roman" w:cs="Times New Roman"/>
+          <w:b/>
+          <w:sz w:val="24"/>
+          <w:szCs w:val="24"/>
+        </w:rPr>
+        <w:t>Tâche :</w:t>
+      </w:r>
+    </w:p>
+    <w:p>
+      <w:pPr>
+        <w:spacing w:line="360" w:lineRule="auto"/>
+        <w:jc w:val="both"/>
+        <w:rPr>
+          <w:rFonts w:ascii="Times New Roman" w:hAnsi="Times New Roman" w:cs="Times New Roman"/>
+          <w:sz w:val="24"/>
+          <w:szCs w:val="24"/>
+        </w:rPr>
+      </w:pPr>
+      <w:r>
+        <w:rPr>
+          <w:rFonts w:ascii="Times New Roman" w:hAnsi="Times New Roman" w:cs="Times New Roman"/>
+          <w:sz w:val="24"/>
+          <w:szCs w:val="24"/>
+        </w:rPr>
+        <w:t>Traduis le document suivant du fr</w:t>
+      </w:r>
+      <w:r>
+        <w:rPr>
+          <w:rFonts w:ascii="Times New Roman" w:hAnsi="Times New Roman" w:cs="Times New Roman"/>
+          <w:sz w:val="24"/>
+          <w:szCs w:val="24"/>
+        </w:rPr>
+        <w:t>ançais vers l'anglais.</w:t>
+      </w:r>
+    </w:p>
+    <w:p>
+      <w:pPr>
+        <w:spacing w:line="360" w:lineRule="auto"/>
+        <w:jc w:val="both"/>
+        <w:rPr>
+          <w:rFonts w:ascii="Times New Roman" w:hAnsi="Times New Roman" w:cs="Times New Roman"/>
+          <w:b/>
+          <w:sz w:val="24"/>
+          <w:szCs w:val="24"/>
+        </w:rPr>
+      </w:pPr>
+      <w:r>
+        <w:rPr>
+          <w:rFonts w:ascii="Times New Roman" w:hAnsi="Times New Roman" w:cs="Times New Roman"/>
+          <w:b/>
+          <w:sz w:val="24"/>
+          <w:szCs w:val="24"/>
+        </w:rPr>
+        <w:t>Contraintes :</w:t>
+      </w:r>
+    </w:p>
+    <w:p>
+      <w:pPr>
+        <w:spacing w:line="360" w:lineRule="auto"/>
+        <w:jc w:val="both"/>
+        <w:rPr>
+          <w:rFonts w:ascii="Times New Roman" w:hAnsi="Times New Roman" w:cs="Times New Roman"/>
+          <w:sz w:val="24"/>
+          <w:szCs w:val="24"/>
+        </w:rPr>
+      </w:pPr>
+      <w:r>
+        <w:rPr>
+          <w:rFonts w:ascii="Times New Roman" w:hAnsi="Times New Roman" w:cs="Times New Roman"/>
+          <w:sz w:val="24"/>
+          <w:szCs w:val="24"/>
+        </w:rPr>
+        <w:t>- Conserve fidèlement le sens original, sans interprétation ni reformulation libre.</w:t>
+      </w:r>
+    </w:p>
+    <w:p>
+      <w:pPr>
+        <w:spacing w:line="360" w:lineRule="auto"/>
+        <w:jc w:val="both"/>
+        <w:rPr>
+          <w:rFonts w:ascii="Times New Roman" w:hAnsi="Times New Roman" w:cs="Times New Roman"/>
+          <w:sz w:val="24"/>
+          <w:szCs w:val="24"/>
+        </w:rPr>
+      </w:pPr>
+      <w:r>
+        <w:rPr>
+          <w:rFonts w:ascii="Times New Roman" w:hAnsi="Times New Roman" w:cs="Times New Roman"/>
+          <w:sz w:val="24"/>
+          <w:szCs w:val="24"/>
+        </w:rPr>
+        <w:t>- Conserve la structure du document (paragraphes, listes, titres) telle qu'elle apparaît dans l'original.</w:t>
+      </w:r>
+    </w:p>
+    <w:p>
+      <w:pPr>
+        <w:spacing w:line="360" w:lineRule="auto"/>
+        <w:jc w:val="both"/>
+        <w:rPr>
+          <w:rFonts w:ascii="Times New Roman" w:hAnsi="Times New Roman" w:cs="Times New Roman"/>
+          <w:sz w:val="24"/>
+          <w:szCs w:val="24"/>
+        </w:rPr>
+      </w:pPr>
+      <w:r>
+        <w:rPr>
+          <w:rFonts w:ascii="Times New Roman" w:hAnsi="Times New Roman" w:cs="Times New Roman"/>
+          <w:sz w:val="24"/>
+          <w:szCs w:val="24"/>
+        </w:rPr>
+        <w:t xml:space="preserve">- Conserve les termes techniques dans leur forme standard </w:t>
+      </w:r>
+      <w:r>
+        <w:rPr>
+          <w:rFonts w:ascii="Times New Roman" w:hAnsi="Times New Roman" w:cs="Times New Roman"/>
+          <w:sz w:val="24"/>
+          <w:szCs w:val="24"/>
+        </w:rPr>
+        <w:t xml:space="preserve">en anglais (ne les traduis pas </w:t>
+      </w:r>
+      <w:r>
+        <w:rPr>
+          <w:rFonts w:ascii="Times New Roman" w:hAnsi="Times New Roman" w:cs="Times New Roman"/>
+          <w:sz w:val="24"/>
+          <w:szCs w:val="24"/>
+        </w:rPr>
+        <w:t>littéralement si un équivalent technique établi existe).</w:t>
+      </w:r>
+    </w:p>
+    <w:p>
+      <w:pPr>
+        <w:spacing w:line="360" w:lineRule="auto"/>
+        <w:jc w:val="both"/>
+        <w:rPr>
+          <w:rFonts w:ascii="Times New Roman" w:hAnsi="Times New Roman" w:cs="Times New Roman"/>
+          <w:sz w:val="24"/>
+          <w:szCs w:val="24"/>
+        </w:rPr>
+      </w:pPr>
+      <w:r>
+        <w:rPr>
+          <w:rFonts w:ascii="Times New Roman" w:hAnsi="Times New Roman" w:cs="Times New Roman"/>
+          <w:sz w:val="24"/>
+          <w:szCs w:val="24"/>
+        </w:rPr>
+        <w:t>- Ne résume pas le contenu : la traduction doit être complète, phrase par phrase.</w:t>
+      </w:r>
+    </w:p>
+    <w:p>
+      <w:pPr>
+        <w:spacing w:line="360" w:lineRule="auto"/>
+        <w:jc w:val="both"/>
+        <w:rPr>
+          <w:rFonts w:ascii="Times New Roman" w:hAnsi="Times New Roman" w:cs="Times New Roman"/>
+          <w:sz w:val="24"/>
+          <w:szCs w:val="24"/>
+        </w:rPr>
+      </w:pPr>
+      <w:r>
+        <w:rPr>
+          <w:rFonts w:ascii="Times New Roman" w:hAnsi="Times New Roman" w:cs="Times New Roman"/>
+          <w:sz w:val="24"/>
+          <w:szCs w:val="24"/>
+        </w:rPr>
+        <w:lastRenderedPageBreak/>
+        <w:t>- N'ajoute aucune information, note ou commentaire qui ne figure</w:t>
+      </w:r>
+      <w:r>
+        <w:rPr>
+          <w:rFonts w:ascii="Times New Roman" w:hAnsi="Times New Roman" w:cs="Times New Roman"/>
+          <w:sz w:val="24"/>
+          <w:szCs w:val="24"/>
+        </w:rPr>
+        <w:t xml:space="preserve"> pas dans le document original.</w:t>
+      </w:r>
+    </w:p>
+    <w:p>
+      <w:pPr>
+        <w:spacing w:line="360" w:lineRule="auto"/>
+        <w:jc w:val="both"/>
+        <w:rPr>
+          <w:rFonts w:ascii="Times New Roman" w:hAnsi="Times New Roman" w:cs="Times New Roman"/>
+          <w:b/>
+          <w:sz w:val="24"/>
+          <w:szCs w:val="24"/>
+        </w:rPr>
+      </w:pPr>
+      <w:r>
+        <w:rPr>
+          <w:rFonts w:ascii="Times New Roman" w:hAnsi="Times New Roman" w:cs="Times New Roman"/>
+          <w:b/>
+          <w:sz w:val="24"/>
+          <w:szCs w:val="24"/>
+        </w:rPr>
+        <w:t>Format de sortie :</w:t>
+      </w:r>
+    </w:p>
+    <w:p>
+      <w:pPr>
+        <w:spacing w:line="360" w:lineRule="auto"/>
+        <w:jc w:val="both"/>
+        <w:rPr>
+          <w:rFonts w:ascii="Times New Roman" w:hAnsi="Times New Roman" w:cs="Times New Roman"/>
+          <w:sz w:val="24"/>
+          <w:szCs w:val="24"/>
+        </w:rPr>
+      </w:pPr>
+      <w:r>
+        <w:rPr>
+          <w:rFonts w:ascii="Times New Roman" w:hAnsi="Times New Roman" w:cs="Times New Roman"/>
+          <w:sz w:val="24"/>
+          <w:szCs w:val="24"/>
+        </w:rPr>
+        <w:t>Fournis uniquement le texte traduit, sans commentaire additionnel.</w:t>
+      </w:r>
+    </w:p>
+    <w:p>
+      <w:pPr>
+        <w:pStyle w:val="ListParagraph"/>
+        <w:numPr>
+          <w:ilvl w:val="0"/>
+          <w:numId w:val="10"/>
+        </w:numPr>
+        <w:spacing w:line="360" w:lineRule="auto"/>
+        <w:jc w:val="center"/>
+        <w:rPr>
+          <w:rFonts w:ascii="Times New Roman" w:hAnsi="Times New Roman" w:cs="Times New Roman"/>
+          <w:b/>
+          <w:sz w:val="24"/>
+          <w:szCs w:val="24"/>
+        </w:rPr>
+      </w:pPr>
+      <w:r>
+        <w:rPr>
+          <w:rFonts w:ascii="Times New Roman" w:hAnsi="Times New Roman" w:cs="Times New Roman"/>
+          <w:b/>
+          <w:sz w:val="24"/>
+          <w:szCs w:val="24"/>
+        </w:rPr>
+        <w:t>Réponse de Claude</w:t>
+      </w:r>
+    </w:p>
+    <w:p>
+      <w:pPr>
+        <w:spacing w:line="360" w:lineRule="auto"/>
+        <w:jc w:val="both"/>
+        <w:rPr>
+          <w:rFonts w:ascii="Times New Roman" w:hAnsi="Times New Roman" w:cs="Times New Roman"/>
+          <w:sz w:val="24"/>
+          <w:szCs w:val="24"/>
+        </w:rPr>
+      </w:pPr>
+      <w:r>
+        <w:rPr>
+          <w:rFonts w:ascii="Times New Roman" w:hAnsi="Times New Roman" w:cs="Times New Roman"/>
+          <w:sz w:val="24"/>
+          <w:szCs w:val="24"/>
+        </w:rPr>
+        <w:drawing>
+          <wp:inline distT="0" distB="0" distL="0" distR="0" wp14:anchorId="41008AFD" wp14:editId="2378CC93">
+            <wp:extent cx="5760720" cy="3762375"/>
+            <wp:effectExtent l="0" t="0" r="0" b="9525"/>
+            <wp:docPr id="5" name="Picture 5"/>
+            <wp:cNvGraphicFramePr>
+              <a:graphicFrameLocks xmlns:a="http://schemas.openxmlformats.org/drawingml/2006/main" noChangeAspect="1"/>
+            </wp:cNvGraphicFramePr>
+            <a:graphic xmlns:a="http://schemas.openxmlformats.org/drawingml/2006/main">
+              <a:graphicData uri="http://schemas.openxmlformats.org/drawingml/2006/picture">
+                <pic:pic xmlns:pic="http://schemas.openxmlformats.org/drawingml/2006/picture">
+                  <pic:nvPicPr>
+                    <pic:cNvPr id="1" name=""/>
+                    <pic:cNvPicPr/>
+                  </pic:nvPicPr>
+                  <pic:blipFill>
+                    <a:blip r:embed="rId18"/>
+                    <a:stretch>
+                      <a:fillRect/>
+                    </a:stretch>
+                  </pic:blipFill>
+                  <pic:spPr>
+                    <a:xfrm>
+                      <a:off x="0" y="0"/>
+                      <a:ext cx="5760720" cy="3762375"/>
+                    </a:xfrm>
+                    <a:prstGeom prst="rect">
+                      <a:avLst/>
+                    </a:prstGeom>
+                  </pic:spPr>
+                </pic:pic>
+              </a:graphicData>
+            </a:graphic>
+          </wp:inline>
+        </w:drawing>
+      </w:r>
+    </w:p>
+    <w:p>
+      <w:pPr>
+        <w:spacing w:line="360" w:lineRule="auto"/>
+        <w:jc w:val="both"/>
+        <w:rPr>
+          <w:rFonts w:ascii="Times New Roman" w:hAnsi="Times New Roman" w:cs="Times New Roman"/>
+          <w:sz w:val="24"/>
+          <w:szCs w:val="24"/>
+        </w:rPr>
+      </w:pPr>
+      <w:r>
+        <w:rPr>
+          <w:rFonts w:ascii="Times New Roman" w:hAnsi="Times New Roman" w:cs="Times New Roman"/>
+          <w:sz w:val="24"/>
+          <w:szCs w:val="24"/>
+        </w:rPr>
+        <w:lastRenderedPageBreak/>
+        <w:drawing>
+          <wp:inline distT="0" distB="0" distL="0" distR="0" wp14:anchorId="5DFB1615" wp14:editId="623BA2E3">
+            <wp:extent cx="5760720" cy="4646930"/>
+            <wp:effectExtent l="0" t="0" r="0" b="1270"/>
+            <wp:docPr id="6" name="Picture 6"/>
+            <wp:cNvGraphicFramePr>
+              <a:graphicFrameLocks xmlns:a="http://schemas.openxmlformats.org/drawingml/2006/main" noChangeAspect="1"/>
+            </wp:cNvGraphicFramePr>
+            <a:graphic xmlns:a="http://schemas.openxmlformats.org/drawingml/2006/main">
+              <a:graphicData uri="http://schemas.openxmlformats.org/drawingml/2006/picture">
+                <pic:pic xmlns:pic="http://schemas.openxmlformats.org/drawingml/2006/picture">
+                  <pic:nvPicPr>
+                    <pic:cNvPr id="1" name=""/>
+                    <pic:cNvPicPr/>
+                  </pic:nvPicPr>
+                  <pic:blipFill>
+                    <a:blip r:embed="rId19"/>
+                    <a:stretch>
+                      <a:fillRect/>
+                    </a:stretch>
+                  </pic:blipFill>
+                  <pic:spPr>
+                    <a:xfrm>
+                      <a:off x="0" y="0"/>
+                      <a:ext cx="5760720" cy="4646930"/>
+                    </a:xfrm>
+                    <a:prstGeom prst="rect">
+                      <a:avLst/>
+                    </a:prstGeom>
+                  </pic:spPr>
+                </pic:pic>
+              </a:graphicData>
+            </a:graphic>
+          </wp:inline>
+        </w:drawing>
+      </w:r>
+      <w:bookmarkStart w:id="0" w:name="_GoBack"/>
+      <w:bookmarkEnd w:id="0"/>
+    </w:p>
+    <w:p>
+      <w:pPr>
+        <w:spacing w:line="360" w:lineRule="auto"/>
+        <w:jc w:val="both"/>
+        <w:rPr>
+          <w:rFonts w:ascii="Times New Roman" w:hAnsi="Times New Roman" w:cs="Times New Roman"/>
+          <w:sz w:val="24"/>
           <w:szCs w:val="24"/>
         </w:rPr>
       </w:pPr>
@@ -6263,9 +7413,98 @@
     </w:lvl>
   </w:abstractNum>
   <w:abstractNum w:abstractNumId="2">
+    <w:nsid w:val="3A296B9A"/>
+    <w:multiLevelType w:val="hybridMultilevel"/>
+    <w:tmpl w:val="2B027B6C"/>
+    <w:lvl w:ilvl="0" w:tplc="040C000F">
+      <w:start w:val="1"/>
+      <w:numFmt w:val="decimal"/>
+      <w:lvlText w:val="%1."/>
+      <w:lvlJc w:val="left"/>
+      <w:pPr>
+        <w:ind w:left="720" w:hanging="360"/>
+      </w:pPr>
+      <w:rPr>
+        <w:rFonts w:hint="default"/>
+      </w:rPr>
+    </w:lvl>
+    <w:lvl w:ilvl="1" w:tplc="040C0019" w:tentative="1">
+      <w:start w:val="1"/>
+      <w:numFmt w:val="lowerLetter"/>
+      <w:lvlText w:val="%2."/>
+      <w:lvlJc w:val="left"/>
+      <w:pPr>
+        <w:ind w:left="1440" w:hanging="360"/>
+      </w:pPr>
+    </w:lvl>
+    <w:lvl w:ilvl="2" w:tplc="040C001B" w:tentative="1">
+      <w:start w:val="1"/>
+      <w:numFmt w:val="lowerRoman"/>
+      <w:lvlText w:val="%3."/>
+      <w:lvlJc w:val="right"/>
+      <w:pPr>
+        <w:ind w:left="2160" w:hanging="180"/>
+      </w:pPr>
+    </w:lvl>
+    <w:lvl w:ilvl="3" w:tplc="040C000F" w:tentative="1">
+      <w:start w:val="1"/>
+      <w:numFmt w:val="decimal"/>
+      <w:lvlText w:val="%4."/>
+      <w:lvlJc w:val="left"/>
+      <w:pPr>
+        <w:ind w:left="2880" w:hanging="360"/>
+      </w:pPr>
+    </w:lvl>
+    <w:lvl w:ilvl="4" w:tplc="040C0019" w:tentative="1">
+      <w:start w:val="1"/>
+      <w:numFmt w:val="lowerLetter"/>
+      <w:lvlText w:val="%5."/>
+      <w:lvlJc w:val="left"/>
+      <w:pPr>
+        <w:ind w:left="3600" w:hanging="360"/>
+      </w:pPr>
+    </w:lvl>
+    <w:lvl w:ilvl="5" w:tplc="040C001B" w:tentative="1">
+      <w:start w:val="1"/>
+      <w:numFmt w:val="lowerRoman"/>
+      <w:lvlText w:val="%6."/>
+      <w:lvlJc w:val="right"/>
+      <w:pPr>
+        <w:ind w:left="4320" w:hanging="180"/>
+      </w:pPr>
+    </w:lvl>
+    <w:lvl w:ilvl="6" w:tplc="040C000F" w:tentative="1">
+      <w:start w:val="1"/>
+      <w:numFmt w:val="decimal"/>
+      <w:lvlText w:val="%7."/>
+      <w:lvlJc w:val="left"/>
+      <w:pPr>
+        <w:ind w:left="5040" w:hanging="360"/>
+      </w:pPr>
+    </w:lvl>
+    <w:lvl w:ilvl="7" w:tplc="040C0019" w:tentative="1">
+      <w:start w:val="1"/>
+      <w:numFmt w:val="lowerLetter"/>
+      <w:lvlText w:val="%8."/>
+      <w:lvlJc w:val="left"/>
+      <w:pPr>
+        <w:ind w:left="5760" w:hanging="360"/>
+      </w:pPr>
+    </w:lvl>
+    <w:lvl w:ilvl="8" w:tplc="040C001B" w:tentative="1">
+      <w:start w:val="1"/>
+      <w:numFmt w:val="lowerRoman"/>
+      <w:lvlText w:val="%9."/>
+      <w:lvlJc w:val="right"/>
+      <w:pPr>
+        <w:ind w:left="6480" w:hanging="180"/>
+      </w:pPr>
+    </w:lvl>
+  </w:abstractNum>
+  <w:abstractNum w:abstractNumId="3">
     <w:nsid w:val="40234EF3"/>
     <w:multiLevelType w:val="hybridMultilevel"/>
-    <w:tmpl w:val="85162952"/>
+    <w:tmpl w:val="1CB480B4"/>
     <w:lvl w:ilvl="0" w:tplc="040C0009">
       <w:start w:val="1"/>
       <w:numFmt w:val="bullet"/>
@@ -6375,7 +7614,7 @@
       </w:rPr>
     </w:lvl>
   </w:abstractNum>
-  <w:abstractNum w:abstractNumId="3">
+  <w:abstractNum w:abstractNumId="4">
     <w:nsid w:val="4E6D6647"/>
     <w:multiLevelType w:val="hybridMultilevel"/>
     <w:tmpl w:val="0BC2673C"/>
@@ -6487,7 +7726,7 @@
       </w:rPr>
     </w:lvl>
   </w:abstractNum>
-  <w:abstractNum w:abstractNumId="4">
+  <w:abstractNum w:abstractNumId="5">
     <w:nsid w:val="52344C8A"/>
     <w:multiLevelType w:val="hybridMultilevel"/>
     <w:tmpl w:val="159A3A58"/>
@@ -6599,7 +7838,7 @@
       </w:rPr>
     </w:lvl>
   </w:abstractNum>
-  <w:abstractNum w:abstractNumId="5">
+  <w:abstractNum w:abstractNumId="6">
     <w:nsid w:val="5D3211AD"/>
     <w:multiLevelType w:val="hybridMultilevel"/>
     <w:tmpl w:val="8DBABEC8"/>
@@ -6685,7 +7924,7 @@
       </w:pPr>
     </w:lvl>
   </w:abstractNum>
-  <w:abstractNum w:abstractNumId="6">
+  <w:abstractNum w:abstractNumId="7">
     <w:nsid w:val="6C944ACB"/>
     <w:multiLevelType w:val="hybridMultilevel"/>
     <w:tmpl w:val="3E026470"/>
@@ -6771,7 +8010,7 @@
       </w:pPr>
     </w:lvl>
   </w:abstractNum>
-  <w:abstractNum w:abstractNumId="7">
+  <w:abstractNum w:abstractNumId="8">
     <w:nsid w:val="707328F1"/>
     <w:multiLevelType w:val="hybridMultilevel"/>
     <w:tmpl w:val="41D04420"/>
@@ -6860,7 +8099,7 @@
       </w:pPr>
     </w:lvl>
   </w:abstractNum>
-  <w:abstractNum w:abstractNumId="8">
+  <w:abstractNum w:abstractNumId="9">
     <w:nsid w:val="73583B76"/>
     <w:multiLevelType w:val="hybridMultilevel"/>
     <w:tmpl w:val="783C0D26"/>
@@ -6952,7 +8191,7 @@
       </w:pPr>
     </w:lvl>
   </w:abstractNum>
-  <w:abstractNum w:abstractNumId="9">
+  <w:abstractNum w:abstractNumId="10">
     <w:nsid w:val="73BE1235"/>
     <w:multiLevelType w:val="hybridMultilevel"/>
     <w:tmpl w:val="708ADF02"/>
@@ -7065,7 +8304,7 @@
       </w:rPr>
     </w:lvl>
   </w:abstractNum>
-  <w:abstractNum w:abstractNumId="10">
+  <w:abstractNum w:abstractNumId="11">
     <w:nsid w:val="7D1021B1"/>
     <w:multiLevelType w:val="hybridMultilevel"/>
     <w:tmpl w:val="B7B664D6"/>
@@ -7177,23 +8416,112 @@
       </w:rPr>
     </w:lvl>
   </w:abstractNum>
+  <w:abstractNum w:abstractNumId="12">
+    <w:nsid w:val="7F3447D5"/>
+    <w:multiLevelType w:val="hybridMultilevel"/>
+    <w:tmpl w:val="2B027B6C"/>
+    <w:lvl w:ilvl="0" w:tplc="040C000F">
+      <w:start w:val="1"/>
+      <w:numFmt w:val="decimal"/>
+      <w:lvlText w:val="%1."/>
+      <w:lvlJc w:val="left"/>
+      <w:pPr>
+        <w:ind w:left="720" w:hanging="360"/>
+      </w:pPr>
+      <w:rPr>
+        <w:rFonts w:hint="default"/>
+      </w:rPr>
+    </w:lvl>
+    <w:lvl w:ilvl="1" w:tplc="040C0019" w:tentative="1">
+      <w:start w:val="1"/>
+      <w:numFmt w:val="lowerLetter"/>
+      <w:lvlText w:val="%2."/>
+      <w:lvlJc w:val="left"/>
+      <w:pPr>
+        <w:ind w:left="1440" w:hanging="360"/>
+      </w:pPr>
+    </w:lvl>
+    <w:lvl w:ilvl="2" w:tplc="040C001B" w:tentative="1">
+      <w:start w:val="1"/>
+      <w:numFmt w:val="lowerRoman"/>
+      <w:lvlText w:val="%3."/>
+      <w:lvlJc w:val="right"/>
+      <w:pPr>
+        <w:ind w:left="2160" w:hanging="180"/>
+      </w:pPr>
+    </w:lvl>
+    <w:lvl w:ilvl="3" w:tplc="040C000F" w:tentative="1">
+      <w:start w:val="1"/>
+      <w:numFmt w:val="decimal"/>
+      <w:lvlText w:val="%4."/>
+      <w:lvlJc w:val="left"/>
+      <w:pPr>
+        <w:ind w:left="2880" w:hanging="360"/>
+      </w:pPr>
+    </w:lvl>
+    <w:lvl w:ilvl="4" w:tplc="040C0019" w:tentative="1">
+      <w:start w:val="1"/>
+      <w:numFmt w:val="lowerLetter"/>
+      <w:lvlText w:val="%5."/>
+      <w:lvlJc w:val="left"/>
+      <w:pPr>
+        <w:ind w:left="3600" w:hanging="360"/>
+      </w:pPr>
+    </w:lvl>
+    <w:lvl w:ilvl="5" w:tplc="040C001B" w:tentative="1">
+      <w:start w:val="1"/>
+      <w:numFmt w:val="lowerRoman"/>
+      <w:lvlText w:val="%6."/>
+      <w:lvlJc w:val="right"/>
+      <w:pPr>
+        <w:ind w:left="4320" w:hanging="180"/>
+      </w:pPr>
+    </w:lvl>
+    <w:lvl w:ilvl="6" w:tplc="040C000F" w:tentative="1">
+      <w:start w:val="1"/>
+      <w:numFmt w:val="decimal"/>
+      <w:lvlText w:val="%7."/>
+      <w:lvlJc w:val="left"/>
+      <w:pPr>
+        <w:ind w:left="5040" w:hanging="360"/>
+      </w:pPr>
+    </w:lvl>
+    <w:lvl w:ilvl="7" w:tplc="040C0019" w:tentative="1">
+      <w:start w:val="1"/>
+      <w:numFmt w:val="lowerLetter"/>
+      <w:lvlText w:val="%8."/>
+      <w:lvlJc w:val="left"/>
+      <w:pPr>
+        <w:ind w:left="5760" w:hanging="360"/>
+      </w:pPr>
+    </w:lvl>
+    <w:lvl w:ilvl="8" w:tplc="040C001B" w:tentative="1">
+      <w:start w:val="1"/>
+      <w:numFmt w:val="lowerRoman"/>
+      <w:lvlText w:val="%9."/>
+      <w:lvlJc w:val="right"/>
+      <w:pPr>
+        <w:ind w:left="6480" w:hanging="180"/>
+      </w:pPr>
+    </w:lvl>
+  </w:abstractNum>
   <w:num w:numId="1">
+    <w:abstractNumId w:val="10"/>
+  </w:num>
+  <w:num w:numId="2">
+    <w:abstractNumId w:val="11"/>
+  </w:num>
+  <w:num w:numId="3">
+    <w:abstractNumId w:val="5"/>
+  </w:num>
+  <w:num w:numId="4">
+    <w:abstractNumId w:val="7"/>
+  </w:num>
+  <w:num w:numId="5">
     <w:abstractNumId w:val="9"/>
   </w:num>
-  <w:num w:numId="2">
-    <w:abstractNumId w:val="10"/>
-  </w:num>
-  <w:num w:numId="3">
-    <w:abstractNumId w:val="4"/>
-  </w:num>
-  <w:num w:numId="4">
+  <w:num w:numId="6">
     <w:abstractNumId w:val="6"/>
-  </w:num>
-  <w:num w:numId="5">
-    <w:abstractNumId w:val="8"/>
-  </w:num>
-  <w:num w:numId="6">
-    <w:abstractNumId w:val="5"/>
   </w:num>
   <w:num w:numId="7">
     <w:abstractNumId w:val="0"/>
@@ -7202,13 +8530,19 @@
     <w:abstractNumId w:val="1"/>
   </w:num>
   <w:num w:numId="9">
+    <w:abstractNumId w:val="4"/>
+  </w:num>
+  <w:num w:numId="10">
     <w:abstractNumId w:val="3"/>
   </w:num>
-  <w:num w:numId="10">
+  <w:num w:numId="11">
+    <w:abstractNumId w:val="8"/>
+  </w:num>
+  <w:num w:numId="12">
+    <w:abstractNumId w:val="12"/>
+  </w:num>
+  <w:num w:numId="13">
     <w:abstractNumId w:val="2"/>
-  </w:num>
-  <w:num w:numId="11">
-    <w:abstractNumId w:val="7"/>
   </w:num>
 </w:numbering>
 </file>
@@ -7810,7 +9144,6 @@
   <w:style w:type="character" w:default="1" w:styleId="DefaultParagraphFont">
     <w:name w:val="Default Paragraph Font"/>
     <w:uiPriority w:val="1"/>
-    <w:semiHidden/>
     <w:unhideWhenUsed/>
   </w:style>
   <w:style w:type="table" w:default="1" w:styleId="TableNormal">

</xml_diff>

<commit_message>
Partie 5 – Prompts pour les applications métier: Classage de tickets informatiques
</commit_message>
<xml_diff>
--- a/ai-business_assistant/correction_atelier_prompt-engineering.docx
+++ b/ai-business_assistant/correction_atelier_prompt-engineering.docx
@@ -7161,19 +7161,1048 @@
           </wp:inline>
         </w:drawing>
       </w:r>
+    </w:p>
+    <w:p>
+      <w:pPr>
+        <w:pStyle w:val="ListParagraph"/>
+        <w:numPr>
+          <w:ilvl w:val="0"/>
+          <w:numId w:val="12"/>
+        </w:numPr>
+        <w:autoSpaceDE w:val="0"/>
+        <w:autoSpaceDN w:val="0"/>
+        <w:adjustRightInd w:val="0"/>
+        <w:spacing w:after="0" w:line="360" w:lineRule="auto"/>
+        <w:jc w:val="both"/>
+        <w:rPr>
+          <w:rFonts w:ascii="Times New Roman" w:hAnsi="Times New Roman" w:cs="Times New Roman"/>
+          <w:kern w:val="0"/>
+          <w:sz w:val="24"/>
+          <w:szCs w:val="24"/>
+        </w:rPr>
+      </w:pPr>
+      <w:r>
+        <w:rPr>
+          <w:rFonts w:ascii="Times New Roman" w:hAnsi="Times New Roman" w:cs="Times New Roman"/>
+          <w:kern w:val="0"/>
+          <w:sz w:val="24"/>
+          <w:szCs w:val="24"/>
+        </w:rPr>
+        <w:t>Créer un prompt permettant de classer un ticket informatique dans une catégorie (réseau,</w:t>
+      </w:r>
+    </w:p>
+    <w:p>
+      <w:pPr>
+        <w:autoSpaceDE w:val="0"/>
+        <w:autoSpaceDN w:val="0"/>
+        <w:adjustRightInd w:val="0"/>
+        <w:spacing w:after="0" w:line="360" w:lineRule="auto"/>
+        <w:jc w:val="both"/>
+        <w:rPr>
+          <w:rFonts w:ascii="Times New Roman" w:hAnsi="Times New Roman" w:cs="Times New Roman"/>
+          <w:kern w:val="0"/>
+          <w:sz w:val="24"/>
+          <w:szCs w:val="24"/>
+        </w:rPr>
+      </w:pPr>
+      <w:proofErr w:type="gramStart"/>
+      <w:r>
+        <w:rPr>
+          <w:rFonts w:ascii="Times New Roman" w:hAnsi="Times New Roman" w:cs="Times New Roman"/>
+          <w:kern w:val="0"/>
+          <w:sz w:val="24"/>
+          <w:szCs w:val="24"/>
+        </w:rPr>
+        <w:t>logiciel</w:t>
+      </w:r>
+      <w:proofErr w:type="gramEnd"/>
+      <w:r>
+        <w:rPr>
+          <w:rFonts w:ascii="Times New Roman" w:hAnsi="Times New Roman" w:cs="Times New Roman"/>
+          <w:kern w:val="0"/>
+          <w:sz w:val="24"/>
+          <w:szCs w:val="24"/>
+        </w:rPr>
+        <w:t>, matériel, sécurité, accès, autre). La réponse est au format JSON avec les champs</w:t>
+      </w:r>
+    </w:p>
+    <w:p>
+      <w:pPr>
+        <w:spacing w:line="360" w:lineRule="auto"/>
+        <w:jc w:val="both"/>
+        <w:rPr>
+          <w:rFonts w:ascii="Times New Roman" w:hAnsi="Times New Roman" w:cs="Times New Roman"/>
+          <w:kern w:val="0"/>
+          <w:sz w:val="24"/>
+          <w:szCs w:val="24"/>
+        </w:rPr>
+      </w:pPr>
+      <w:proofErr w:type="gramStart"/>
+      <w:r>
+        <w:rPr>
+          <w:rFonts w:ascii="Times New Roman" w:hAnsi="Times New Roman" w:cs="Times New Roman"/>
+          <w:kern w:val="0"/>
+          <w:sz w:val="24"/>
+          <w:szCs w:val="24"/>
+        </w:rPr>
+        <w:t>categorie</w:t>
+      </w:r>
+      <w:proofErr w:type="gramEnd"/>
+      <w:r>
+        <w:rPr>
+          <w:rFonts w:ascii="Times New Roman" w:hAnsi="Times New Roman" w:cs="Times New Roman"/>
+          <w:kern w:val="0"/>
+          <w:sz w:val="24"/>
+          <w:szCs w:val="24"/>
+        </w:rPr>
+        <w:t xml:space="preserve"> et justification</w:t>
+      </w:r>
+    </w:p>
+    <w:p>
+      <w:pPr>
+        <w:pStyle w:val="ListParagraph"/>
+        <w:numPr>
+          <w:ilvl w:val="0"/>
+          <w:numId w:val="10"/>
+        </w:numPr>
+        <w:spacing w:line="360" w:lineRule="auto"/>
+        <w:jc w:val="center"/>
+        <w:rPr>
+          <w:rFonts w:ascii="Times New Roman" w:hAnsi="Times New Roman" w:cs="Times New Roman"/>
+          <w:sz w:val="24"/>
+          <w:szCs w:val="24"/>
+        </w:rPr>
+      </w:pPr>
+      <w:r>
+        <w:rPr>
+          <w:rFonts w:ascii="Times New Roman" w:hAnsi="Times New Roman" w:cs="Times New Roman"/>
+          <w:b/>
+          <w:sz w:val="24"/>
+          <w:szCs w:val="24"/>
+        </w:rPr>
+        <w:t>Prompt proposé</w:t>
+      </w:r>
+    </w:p>
+    <w:p>
+      <w:pPr>
+        <w:spacing w:line="360" w:lineRule="auto"/>
+        <w:rPr>
+          <w:rFonts w:ascii="Times New Roman" w:hAnsi="Times New Roman" w:cs="Times New Roman"/>
+          <w:b/>
+          <w:sz w:val="24"/>
+          <w:szCs w:val="24"/>
+        </w:rPr>
+      </w:pPr>
+      <w:r>
+        <w:rPr>
+          <w:rFonts w:ascii="Times New Roman" w:hAnsi="Times New Roman" w:cs="Times New Roman"/>
+          <w:b/>
+          <w:sz w:val="24"/>
+          <w:szCs w:val="24"/>
+        </w:rPr>
+        <w:t>Rôle :</w:t>
+      </w:r>
+    </w:p>
+    <w:p>
+      <w:pPr>
+        <w:spacing w:line="360" w:lineRule="auto"/>
+        <w:rPr>
+          <w:rFonts w:ascii="Times New Roman" w:hAnsi="Times New Roman" w:cs="Times New Roman"/>
+          <w:sz w:val="24"/>
+          <w:szCs w:val="24"/>
+        </w:rPr>
+      </w:pPr>
+      <w:r>
+        <w:rPr>
+          <w:rFonts w:ascii="Times New Roman" w:hAnsi="Times New Roman" w:cs="Times New Roman"/>
+          <w:sz w:val="24"/>
+          <w:szCs w:val="24"/>
+        </w:rPr>
+        <w:t>Tu es un outil de tri automatique de t</w:t>
+      </w:r>
+      <w:r>
+        <w:rPr>
+          <w:rFonts w:ascii="Times New Roman" w:hAnsi="Times New Roman" w:cs="Times New Roman"/>
+          <w:sz w:val="24"/>
+          <w:szCs w:val="24"/>
+        </w:rPr>
+        <w:t>ickets de support informatique.</w:t>
+      </w:r>
+    </w:p>
+    <w:p>
+      <w:pPr>
+        <w:spacing w:line="360" w:lineRule="auto"/>
+        <w:rPr>
+          <w:rFonts w:ascii="Times New Roman" w:hAnsi="Times New Roman" w:cs="Times New Roman"/>
+          <w:b/>
+          <w:sz w:val="24"/>
+          <w:szCs w:val="24"/>
+        </w:rPr>
+      </w:pPr>
+      <w:r>
+        <w:rPr>
+          <w:rFonts w:ascii="Times New Roman" w:hAnsi="Times New Roman" w:cs="Times New Roman"/>
+          <w:b/>
+          <w:sz w:val="24"/>
+          <w:szCs w:val="24"/>
+        </w:rPr>
+        <w:t>Tâche :</w:t>
+      </w:r>
+    </w:p>
+    <w:p>
+      <w:pPr>
+        <w:spacing w:line="360" w:lineRule="auto"/>
+        <w:rPr>
+          <w:rFonts w:ascii="Times New Roman" w:hAnsi="Times New Roman" w:cs="Times New Roman"/>
+          <w:sz w:val="24"/>
+          <w:szCs w:val="24"/>
+        </w:rPr>
+      </w:pPr>
+      <w:r>
+        <w:rPr>
+          <w:rFonts w:ascii="Times New Roman" w:hAnsi="Times New Roman" w:cs="Times New Roman"/>
+          <w:sz w:val="24"/>
+          <w:szCs w:val="24"/>
+        </w:rPr>
+        <w:t>Classe le ticket suivant dans l'</w:t>
+      </w:r>
+      <w:r>
+        <w:rPr>
+          <w:rFonts w:ascii="Times New Roman" w:hAnsi="Times New Roman" w:cs="Times New Roman"/>
+          <w:sz w:val="24"/>
+          <w:szCs w:val="24"/>
+        </w:rPr>
+        <w:t>une des catégories disponibles.</w:t>
+      </w:r>
+    </w:p>
+    <w:p>
+      <w:pPr>
+        <w:spacing w:line="360" w:lineRule="auto"/>
+        <w:rPr>
+          <w:rFonts w:ascii="Times New Roman" w:hAnsi="Times New Roman" w:cs="Times New Roman"/>
+          <w:b/>
+          <w:sz w:val="24"/>
+          <w:szCs w:val="24"/>
+        </w:rPr>
+      </w:pPr>
+      <w:r>
+        <w:rPr>
+          <w:rFonts w:ascii="Times New Roman" w:hAnsi="Times New Roman" w:cs="Times New Roman"/>
+          <w:b/>
+          <w:sz w:val="24"/>
+          <w:szCs w:val="24"/>
+        </w:rPr>
+        <w:t>Ticket à classer :</w:t>
+      </w:r>
+    </w:p>
+    <w:p>
+      <w:pPr>
+        <w:spacing w:line="360" w:lineRule="auto"/>
+        <w:rPr>
+          <w:b/>
+        </w:rPr>
+      </w:pPr>
+      <w:r>
+        <w:rPr>
+          <w:rFonts w:ascii="Times New Roman" w:hAnsi="Times New Roman" w:cs="Times New Roman"/>
+          <w:b/>
+          <w:sz w:val="24"/>
+        </w:rPr>
+        <w:t xml:space="preserve">Ticket 1 : </w:t>
+      </w:r>
+      <w:r>
+        <w:rPr>
+          <w:rFonts w:ascii="Times New Roman" w:hAnsi="Times New Roman" w:cs="Times New Roman"/>
+          <w:b/>
+          <w:sz w:val="24"/>
+          <w:szCs w:val="24"/>
+        </w:rPr>
+        <w:t>Titre : Connexion Wi-Fi instable au 3e étage</w:t>
+      </w:r>
+    </w:p>
+    <w:p>
+      <w:pPr>
+        <w:spacing w:line="360" w:lineRule="auto"/>
+        <w:rPr>
+          <w:rFonts w:ascii="Times New Roman" w:hAnsi="Times New Roman" w:cs="Times New Roman"/>
+          <w:sz w:val="24"/>
+          <w:szCs w:val="24"/>
+        </w:rPr>
+      </w:pPr>
+    </w:p>
+    <w:p>
+      <w:pPr>
+        <w:spacing w:line="360" w:lineRule="auto"/>
+        <w:rPr>
+          <w:rFonts w:ascii="Times New Roman" w:hAnsi="Times New Roman" w:cs="Times New Roman"/>
+          <w:sz w:val="24"/>
+          <w:szCs w:val="24"/>
+        </w:rPr>
+      </w:pPr>
+      <w:r>
+        <w:rPr>
+          <w:rFonts w:ascii="Times New Roman" w:hAnsi="Times New Roman" w:cs="Times New Roman"/>
+          <w:sz w:val="24"/>
+          <w:szCs w:val="24"/>
+        </w:rPr>
+        <w:lastRenderedPageBreak/>
+        <w:t>Description : Depuis ce matin, plusieurs colla</w:t>
+      </w:r>
+      <w:r>
+        <w:rPr>
+          <w:rFonts w:ascii="Times New Roman" w:hAnsi="Times New Roman" w:cs="Times New Roman"/>
+          <w:sz w:val="24"/>
+          <w:szCs w:val="24"/>
+        </w:rPr>
+        <w:t xml:space="preserve">borateurs du service marketing </w:t>
+      </w:r>
+      <w:r>
+        <w:rPr>
+          <w:rFonts w:ascii="Times New Roman" w:hAnsi="Times New Roman" w:cs="Times New Roman"/>
+          <w:sz w:val="24"/>
+          <w:szCs w:val="24"/>
+        </w:rPr>
+        <w:t>signalent des déconnexions répétées du réseau Wi</w:t>
+      </w:r>
+      <w:r>
+        <w:rPr>
+          <w:rFonts w:ascii="Times New Roman" w:hAnsi="Times New Roman" w:cs="Times New Roman"/>
+          <w:sz w:val="24"/>
+          <w:szCs w:val="24"/>
+        </w:rPr>
+        <w:t xml:space="preserve">-Fi au 3e étage du bâtiment B. </w:t>
+      </w:r>
+      <w:r>
+        <w:rPr>
+          <w:rFonts w:ascii="Times New Roman" w:hAnsi="Times New Roman" w:cs="Times New Roman"/>
+          <w:sz w:val="24"/>
+          <w:szCs w:val="24"/>
+        </w:rPr>
+        <w:t>La connexion se coupe environ toutes les 10 minutes pendant quelqu</w:t>
+      </w:r>
+      <w:r>
+        <w:rPr>
+          <w:rFonts w:ascii="Times New Roman" w:hAnsi="Times New Roman" w:cs="Times New Roman"/>
+          <w:sz w:val="24"/>
+          <w:szCs w:val="24"/>
+        </w:rPr>
+        <w:t xml:space="preserve">es secondes, </w:t>
+      </w:r>
+      <w:r>
+        <w:rPr>
+          <w:rFonts w:ascii="Times New Roman" w:hAnsi="Times New Roman" w:cs="Times New Roman"/>
+          <w:sz w:val="24"/>
+          <w:szCs w:val="24"/>
+        </w:rPr>
+        <w:t xml:space="preserve">puis se rétablit automatiquement. Le problème ne </w:t>
+      </w:r>
+      <w:r>
+        <w:rPr>
+          <w:rFonts w:ascii="Times New Roman" w:hAnsi="Times New Roman" w:cs="Times New Roman"/>
+          <w:sz w:val="24"/>
+          <w:szCs w:val="24"/>
+        </w:rPr>
+        <w:t xml:space="preserve">semble pas affecter les postes </w:t>
+      </w:r>
+      <w:r>
+        <w:rPr>
+          <w:rFonts w:ascii="Times New Roman" w:hAnsi="Times New Roman" w:cs="Times New Roman"/>
+          <w:sz w:val="24"/>
+          <w:szCs w:val="24"/>
+        </w:rPr>
+        <w:t>connectés en filaire (Ethernet). Cela impacte les visioconférences en cours.</w:t>
+      </w:r>
+    </w:p>
+    <w:p>
+      <w:pPr>
+        <w:spacing w:line="360" w:lineRule="auto"/>
+        <w:rPr>
+          <w:rFonts w:ascii="Times New Roman" w:hAnsi="Times New Roman" w:cs="Times New Roman"/>
+          <w:b/>
+          <w:sz w:val="24"/>
+        </w:rPr>
+      </w:pPr>
+      <w:r>
+        <w:rPr>
+          <w:rFonts w:ascii="Times New Roman" w:hAnsi="Times New Roman" w:cs="Times New Roman"/>
+          <w:b/>
+          <w:sz w:val="24"/>
+        </w:rPr>
+        <w:t xml:space="preserve">Ticket 2 : </w:t>
+      </w:r>
+      <w:r>
+        <w:rPr>
+          <w:rFonts w:ascii="Times New Roman" w:hAnsi="Times New Roman" w:cs="Times New Roman"/>
+          <w:b/>
+          <w:sz w:val="24"/>
+          <w:szCs w:val="24"/>
+        </w:rPr>
+        <w:t>Titre : Erreur au démarrage de</w:t>
+      </w:r>
+      <w:r>
+        <w:rPr>
+          <w:rFonts w:ascii="Times New Roman" w:hAnsi="Times New Roman" w:cs="Times New Roman"/>
+          <w:b/>
+          <w:sz w:val="24"/>
+          <w:szCs w:val="24"/>
+        </w:rPr>
+        <w:t xml:space="preserve"> l'application de facturation</w:t>
+      </w:r>
+    </w:p>
+    <w:p>
+      <w:pPr>
+        <w:spacing w:line="360" w:lineRule="auto"/>
+        <w:rPr>
+          <w:rFonts w:ascii="Times New Roman" w:hAnsi="Times New Roman" w:cs="Times New Roman"/>
+          <w:sz w:val="24"/>
+          <w:szCs w:val="24"/>
+        </w:rPr>
+      </w:pPr>
+      <w:r>
+        <w:rPr>
+          <w:rFonts w:ascii="Times New Roman" w:hAnsi="Times New Roman" w:cs="Times New Roman"/>
+          <w:sz w:val="24"/>
+          <w:szCs w:val="24"/>
+        </w:rPr>
+        <w:t>Description : Depuis la mise à jour effectuée hi</w:t>
+      </w:r>
+      <w:r>
+        <w:rPr>
+          <w:rFonts w:ascii="Times New Roman" w:hAnsi="Times New Roman" w:cs="Times New Roman"/>
+          <w:sz w:val="24"/>
+          <w:szCs w:val="24"/>
+        </w:rPr>
+        <w:t xml:space="preserve">er soir, l'application interne </w:t>
+      </w:r>
+      <w:r>
+        <w:rPr>
+          <w:rFonts w:ascii="Times New Roman" w:hAnsi="Times New Roman" w:cs="Times New Roman"/>
+          <w:sz w:val="24"/>
+          <w:szCs w:val="24"/>
+        </w:rPr>
+        <w:t>de facturation affiche un message d'erreur "Exceptio</w:t>
+      </w:r>
+      <w:r>
+        <w:rPr>
+          <w:rFonts w:ascii="Times New Roman" w:hAnsi="Times New Roman" w:cs="Times New Roman"/>
+          <w:sz w:val="24"/>
+          <w:szCs w:val="24"/>
+        </w:rPr>
+        <w:t xml:space="preserve">n non gérée (code 0x8007045A)" </w:t>
+      </w:r>
+      <w:r>
+        <w:rPr>
+          <w:rFonts w:ascii="Times New Roman" w:hAnsi="Times New Roman" w:cs="Times New Roman"/>
+          <w:sz w:val="24"/>
+          <w:szCs w:val="24"/>
+        </w:rPr>
+        <w:t>dès son lancement, avant même l'écran de connexion. Le problè</w:t>
+      </w:r>
+      <w:r>
+        <w:rPr>
+          <w:rFonts w:ascii="Times New Roman" w:hAnsi="Times New Roman" w:cs="Times New Roman"/>
+          <w:sz w:val="24"/>
+          <w:szCs w:val="24"/>
+        </w:rPr>
+        <w:t xml:space="preserve">me touche tous les utilisateurs du service </w:t>
+      </w:r>
+      <w:r>
+        <w:rPr>
+          <w:rFonts w:ascii="Times New Roman" w:hAnsi="Times New Roman" w:cs="Times New Roman"/>
+          <w:sz w:val="24"/>
+          <w:szCs w:val="24"/>
+        </w:rPr>
+        <w:t>comptabilité. Un redém</w:t>
+      </w:r>
+      <w:r>
+        <w:rPr>
+          <w:rFonts w:ascii="Times New Roman" w:hAnsi="Times New Roman" w:cs="Times New Roman"/>
+          <w:sz w:val="24"/>
+          <w:szCs w:val="24"/>
+        </w:rPr>
+        <w:t xml:space="preserve">arrage du poste n'a pas résolu </w:t>
+      </w:r>
+      <w:r>
+        <w:rPr>
+          <w:rFonts w:ascii="Times New Roman" w:hAnsi="Times New Roman" w:cs="Times New Roman"/>
+          <w:sz w:val="24"/>
+          <w:szCs w:val="24"/>
+        </w:rPr>
+        <w:t>l</w:t>
+      </w:r>
+      <w:r>
+        <w:rPr>
+          <w:rFonts w:ascii="Times New Roman" w:hAnsi="Times New Roman" w:cs="Times New Roman"/>
+          <w:sz w:val="24"/>
+          <w:szCs w:val="24"/>
+        </w:rPr>
+        <w:t xml:space="preserve">e souci. Aucun message d'erreur </w:t>
+      </w:r>
+      <w:r>
+        <w:rPr>
+          <w:rFonts w:ascii="Times New Roman" w:hAnsi="Times New Roman" w:cs="Times New Roman"/>
+          <w:sz w:val="24"/>
+          <w:szCs w:val="24"/>
+        </w:rPr>
+        <w:t>similaire n'était survenu avant la mise à jour.</w:t>
+      </w:r>
+    </w:p>
+    <w:p>
+      <w:pPr>
+        <w:spacing w:line="360" w:lineRule="auto"/>
+        <w:rPr>
+          <w:rFonts w:ascii="Times New Roman" w:hAnsi="Times New Roman" w:cs="Times New Roman"/>
+          <w:b/>
+          <w:sz w:val="24"/>
+          <w:szCs w:val="24"/>
+        </w:rPr>
+      </w:pPr>
+      <w:r>
+        <w:rPr>
+          <w:rFonts w:ascii="Times New Roman" w:hAnsi="Times New Roman" w:cs="Times New Roman"/>
+          <w:b/>
+          <w:sz w:val="24"/>
+        </w:rPr>
+        <w:t>Ticket 3</w:t>
+      </w:r>
+      <w:r>
+        <w:rPr>
+          <w:rFonts w:ascii="Times New Roman" w:hAnsi="Times New Roman" w:cs="Times New Roman"/>
+          <w:b/>
+          <w:sz w:val="24"/>
+        </w:rPr>
+        <w:t> :</w:t>
+      </w:r>
+      <w:r>
+        <w:rPr>
+          <w:b/>
+          <w:sz w:val="24"/>
+        </w:rPr>
+        <w:t xml:space="preserve"> </w:t>
+      </w:r>
+      <w:r>
+        <w:rPr>
+          <w:rFonts w:ascii="Times New Roman" w:hAnsi="Times New Roman" w:cs="Times New Roman"/>
+          <w:b/>
+          <w:sz w:val="24"/>
+          <w:szCs w:val="24"/>
+        </w:rPr>
+        <w:t>Titre : Impossible d'accéder au</w:t>
+      </w:r>
+      <w:r>
+        <w:rPr>
+          <w:rFonts w:ascii="Times New Roman" w:hAnsi="Times New Roman" w:cs="Times New Roman"/>
+          <w:b/>
+          <w:sz w:val="24"/>
+          <w:szCs w:val="24"/>
+        </w:rPr>
+        <w:t xml:space="preserve"> dossier partagé "Projets 2026"</w:t>
+      </w:r>
+    </w:p>
+    <w:p>
+      <w:pPr>
+        <w:spacing w:line="360" w:lineRule="auto"/>
+        <w:rPr>
+          <w:rFonts w:ascii="Times New Roman" w:hAnsi="Times New Roman" w:cs="Times New Roman"/>
+          <w:sz w:val="24"/>
+          <w:szCs w:val="24"/>
+        </w:rPr>
+      </w:pPr>
+      <w:r>
+        <w:rPr>
+          <w:rFonts w:ascii="Times New Roman" w:hAnsi="Times New Roman" w:cs="Times New Roman"/>
+          <w:sz w:val="24"/>
+          <w:szCs w:val="24"/>
+        </w:rPr>
+        <w:t>Description : Depuis hier, je ne parviens pl</w:t>
+      </w:r>
+      <w:r>
+        <w:rPr>
+          <w:rFonts w:ascii="Times New Roman" w:hAnsi="Times New Roman" w:cs="Times New Roman"/>
+          <w:sz w:val="24"/>
+          <w:szCs w:val="24"/>
+        </w:rPr>
+        <w:t xml:space="preserve">us à ouvrir le dossier partagé </w:t>
+      </w:r>
+      <w:r>
+        <w:rPr>
+          <w:rFonts w:ascii="Times New Roman" w:hAnsi="Times New Roman" w:cs="Times New Roman"/>
+          <w:sz w:val="24"/>
+          <w:szCs w:val="24"/>
+        </w:rPr>
+        <w:t>"Projets 2026" sur le serveur. Un message indique</w:t>
+      </w:r>
+      <w:r>
+        <w:rPr>
+          <w:rFonts w:ascii="Times New Roman" w:hAnsi="Times New Roman" w:cs="Times New Roman"/>
+          <w:sz w:val="24"/>
+          <w:szCs w:val="24"/>
+        </w:rPr>
+        <w:t xml:space="preserve"> "Accès refusé". Mes collègues de la même équipe semblent </w:t>
+      </w:r>
+      <w:r>
+        <w:rPr>
+          <w:rFonts w:ascii="Times New Roman" w:hAnsi="Times New Roman" w:cs="Times New Roman"/>
+          <w:sz w:val="24"/>
+          <w:szCs w:val="24"/>
+        </w:rPr>
+        <w:t>pouvoir y accéder n</w:t>
+      </w:r>
+      <w:r>
+        <w:rPr>
+          <w:rFonts w:ascii="Times New Roman" w:hAnsi="Times New Roman" w:cs="Times New Roman"/>
+          <w:sz w:val="24"/>
+          <w:szCs w:val="24"/>
+        </w:rPr>
+        <w:t xml:space="preserve">ormalement. Je n'ai pas changé </w:t>
+      </w:r>
+      <w:r>
+        <w:rPr>
+          <w:rFonts w:ascii="Times New Roman" w:hAnsi="Times New Roman" w:cs="Times New Roman"/>
+          <w:sz w:val="24"/>
+          <w:szCs w:val="24"/>
+        </w:rPr>
+        <w:t>mon mot de passe récemment. Je précise que je</w:t>
+      </w:r>
+      <w:r>
+        <w:rPr>
+          <w:rFonts w:ascii="Times New Roman" w:hAnsi="Times New Roman" w:cs="Times New Roman"/>
+          <w:sz w:val="24"/>
+          <w:szCs w:val="24"/>
+        </w:rPr>
+        <w:t xml:space="preserve"> travaille depuis mon domicile </w:t>
+      </w:r>
+      <w:r>
+        <w:rPr>
+          <w:rFonts w:ascii="Times New Roman" w:hAnsi="Times New Roman" w:cs="Times New Roman"/>
+          <w:sz w:val="24"/>
+          <w:szCs w:val="24"/>
+        </w:rPr>
+        <w:t xml:space="preserve">en VPN aujourd'hui, ce n'était peut-être pas </w:t>
+      </w:r>
+      <w:r>
+        <w:rPr>
+          <w:rFonts w:ascii="Times New Roman" w:hAnsi="Times New Roman" w:cs="Times New Roman"/>
+          <w:sz w:val="24"/>
+          <w:szCs w:val="24"/>
+        </w:rPr>
+        <w:t xml:space="preserve">le cas les fois précédentes où </w:t>
+      </w:r>
+      <w:r>
+        <w:rPr>
+          <w:rFonts w:ascii="Times New Roman" w:hAnsi="Times New Roman" w:cs="Times New Roman"/>
+          <w:sz w:val="24"/>
+          <w:szCs w:val="24"/>
+        </w:rPr>
+        <w:t>j'avais réussi à y accéder.</w:t>
+      </w:r>
+    </w:p>
+    <w:p>
+      <w:pPr>
+        <w:spacing w:line="360" w:lineRule="auto"/>
+        <w:rPr>
+          <w:rFonts w:ascii="Times New Roman" w:hAnsi="Times New Roman" w:cs="Times New Roman"/>
+          <w:sz w:val="24"/>
+          <w:szCs w:val="24"/>
+        </w:rPr>
+      </w:pPr>
+      <w:r>
+        <w:rPr>
+          <w:rFonts w:ascii="Times New Roman" w:hAnsi="Times New Roman" w:cs="Times New Roman"/>
+          <w:b/>
+          <w:sz w:val="24"/>
+          <w:szCs w:val="24"/>
+        </w:rPr>
+        <w:t>Catégories possibles :</w:t>
+      </w:r>
+      <w:r>
+        <w:rPr>
+          <w:rFonts w:ascii="Times New Roman" w:hAnsi="Times New Roman" w:cs="Times New Roman"/>
+          <w:sz w:val="24"/>
+          <w:szCs w:val="24"/>
+        </w:rPr>
+        <w:t xml:space="preserve"> </w:t>
+      </w:r>
+    </w:p>
+    <w:p>
+      <w:pPr>
+        <w:spacing w:line="360" w:lineRule="auto"/>
+        <w:rPr>
+          <w:rFonts w:ascii="Times New Roman" w:hAnsi="Times New Roman" w:cs="Times New Roman"/>
+          <w:sz w:val="24"/>
+          <w:szCs w:val="24"/>
+        </w:rPr>
+      </w:pPr>
+      <w:proofErr w:type="gramStart"/>
+      <w:r>
+        <w:rPr>
+          <w:rFonts w:ascii="Times New Roman" w:hAnsi="Times New Roman" w:cs="Times New Roman"/>
+          <w:sz w:val="24"/>
+          <w:szCs w:val="24"/>
+        </w:rPr>
+        <w:t>réseau</w:t>
+      </w:r>
+      <w:proofErr w:type="gramEnd"/>
+      <w:r>
+        <w:rPr>
+          <w:rFonts w:ascii="Times New Roman" w:hAnsi="Times New Roman" w:cs="Times New Roman"/>
+          <w:sz w:val="24"/>
+          <w:szCs w:val="24"/>
+        </w:rPr>
+        <w:t>, logiciel, ma</w:t>
+      </w:r>
+      <w:r>
+        <w:rPr>
+          <w:rFonts w:ascii="Times New Roman" w:hAnsi="Times New Roman" w:cs="Times New Roman"/>
+          <w:sz w:val="24"/>
+          <w:szCs w:val="24"/>
+        </w:rPr>
+        <w:t>tériel, sécurité, accès, autre.</w:t>
+      </w:r>
+    </w:p>
+    <w:p>
+      <w:pPr>
+        <w:spacing w:line="360" w:lineRule="auto"/>
+        <w:rPr>
+          <w:rFonts w:ascii="Times New Roman" w:hAnsi="Times New Roman" w:cs="Times New Roman"/>
+          <w:b/>
+          <w:sz w:val="24"/>
+          <w:szCs w:val="24"/>
+        </w:rPr>
+      </w:pPr>
+      <w:r>
+        <w:rPr>
+          <w:rFonts w:ascii="Times New Roman" w:hAnsi="Times New Roman" w:cs="Times New Roman"/>
+          <w:b/>
+          <w:sz w:val="24"/>
+          <w:szCs w:val="24"/>
+        </w:rPr>
+        <w:t>Contraintes :</w:t>
+      </w:r>
+    </w:p>
+    <w:p>
+      <w:pPr>
+        <w:spacing w:line="360" w:lineRule="auto"/>
+        <w:rPr>
+          <w:rFonts w:ascii="Times New Roman" w:hAnsi="Times New Roman" w:cs="Times New Roman"/>
+          <w:sz w:val="24"/>
+          <w:szCs w:val="24"/>
+        </w:rPr>
+      </w:pPr>
+      <w:r>
+        <w:rPr>
+          <w:rFonts w:ascii="Times New Roman" w:hAnsi="Times New Roman" w:cs="Times New Roman"/>
+          <w:sz w:val="24"/>
+          <w:szCs w:val="24"/>
+        </w:rPr>
+        <w:t>- Choisis une seule catégorie parmi la liste fournie.</w:t>
+      </w:r>
+    </w:p>
+    <w:p>
+      <w:pPr>
+        <w:spacing w:line="360" w:lineRule="auto"/>
+        <w:rPr>
+          <w:rFonts w:ascii="Times New Roman" w:hAnsi="Times New Roman" w:cs="Times New Roman"/>
+          <w:sz w:val="24"/>
+          <w:szCs w:val="24"/>
+        </w:rPr>
+      </w:pPr>
+      <w:r>
+        <w:rPr>
+          <w:rFonts w:ascii="Times New Roman" w:hAnsi="Times New Roman" w:cs="Times New Roman"/>
+          <w:sz w:val="24"/>
+          <w:szCs w:val="24"/>
+        </w:rPr>
+        <w:t>- Si aucune catégorie ne correspond clairement, utilise "autre".</w:t>
+      </w:r>
+    </w:p>
+    <w:p>
+      <w:pPr>
+        <w:spacing w:line="360" w:lineRule="auto"/>
+        <w:rPr>
+          <w:rFonts w:ascii="Times New Roman" w:hAnsi="Times New Roman" w:cs="Times New Roman"/>
+          <w:sz w:val="24"/>
+          <w:szCs w:val="24"/>
+        </w:rPr>
+      </w:pPr>
+      <w:r>
+        <w:rPr>
+          <w:rFonts w:ascii="Times New Roman" w:hAnsi="Times New Roman" w:cs="Times New Roman"/>
+          <w:sz w:val="24"/>
+          <w:szCs w:val="24"/>
+        </w:rPr>
+        <w:t>- Justifie ton choix en une phrase courte, basée uniqu</w:t>
+      </w:r>
+      <w:r>
+        <w:rPr>
+          <w:rFonts w:ascii="Times New Roman" w:hAnsi="Times New Roman" w:cs="Times New Roman"/>
+          <w:sz w:val="24"/>
+          <w:szCs w:val="24"/>
+        </w:rPr>
+        <w:t>ement sur le contenu du ticket.</w:t>
+      </w:r>
+    </w:p>
+    <w:p>
+      <w:pPr>
+        <w:spacing w:line="360" w:lineRule="auto"/>
+        <w:rPr>
+          <w:rFonts w:ascii="Times New Roman" w:hAnsi="Times New Roman" w:cs="Times New Roman"/>
+          <w:b/>
+          <w:sz w:val="24"/>
+          <w:szCs w:val="24"/>
+        </w:rPr>
+      </w:pPr>
+      <w:r>
+        <w:rPr>
+          <w:rFonts w:ascii="Times New Roman" w:hAnsi="Times New Roman" w:cs="Times New Roman"/>
+          <w:b/>
+          <w:sz w:val="24"/>
+          <w:szCs w:val="24"/>
+        </w:rPr>
+        <w:t>Format de sortie :</w:t>
+      </w:r>
+    </w:p>
+    <w:p>
+      <w:pPr>
+        <w:spacing w:line="360" w:lineRule="auto"/>
+        <w:rPr>
+          <w:rFonts w:ascii="Times New Roman" w:hAnsi="Times New Roman" w:cs="Times New Roman"/>
+          <w:sz w:val="24"/>
+          <w:szCs w:val="24"/>
+        </w:rPr>
+      </w:pPr>
+      <w:r>
+        <w:rPr>
+          <w:rFonts w:ascii="Times New Roman" w:hAnsi="Times New Roman" w:cs="Times New Roman"/>
+          <w:sz w:val="24"/>
+          <w:szCs w:val="24"/>
+        </w:rPr>
+        <w:t>Réponds uniquement avec un JSON valide, sans t</w:t>
+      </w:r>
+      <w:r>
+        <w:rPr>
+          <w:rFonts w:ascii="Times New Roman" w:hAnsi="Times New Roman" w:cs="Times New Roman"/>
+          <w:sz w:val="24"/>
+          <w:szCs w:val="24"/>
+        </w:rPr>
+        <w:t xml:space="preserve">exte avant ou après, contenant </w:t>
+      </w:r>
+      <w:r>
+        <w:rPr>
+          <w:rFonts w:ascii="Times New Roman" w:hAnsi="Times New Roman" w:cs="Times New Roman"/>
+          <w:sz w:val="24"/>
+          <w:szCs w:val="24"/>
+        </w:rPr>
+        <w:t>e</w:t>
+      </w:r>
+      <w:r>
+        <w:rPr>
+          <w:rFonts w:ascii="Times New Roman" w:hAnsi="Times New Roman" w:cs="Times New Roman"/>
+          <w:sz w:val="24"/>
+          <w:szCs w:val="24"/>
+        </w:rPr>
+        <w:t>xactement</w:t>
+      </w:r>
+      <w:r>
+        <w:rPr>
+          <w:rFonts w:ascii="Times New Roman" w:hAnsi="Times New Roman" w:cs="Times New Roman"/>
+          <w:sz w:val="24"/>
+          <w:szCs w:val="24"/>
+        </w:rPr>
+        <w:t xml:space="preserve"> ces deux champs :</w:t>
+      </w:r>
+    </w:p>
+    <w:p>
+      <w:pPr>
+        <w:spacing w:line="360" w:lineRule="auto"/>
+        <w:rPr>
+          <w:rFonts w:ascii="Times New Roman" w:hAnsi="Times New Roman" w:cs="Times New Roman"/>
+          <w:sz w:val="24"/>
+          <w:szCs w:val="24"/>
+        </w:rPr>
+      </w:pPr>
+      <w:r>
+        <w:rPr>
+          <w:rFonts w:ascii="Times New Roman" w:hAnsi="Times New Roman" w:cs="Times New Roman"/>
+          <w:sz w:val="24"/>
+          <w:szCs w:val="24"/>
+        </w:rPr>
+        <w:t>{</w:t>
+      </w:r>
+    </w:p>
+    <w:p>
+      <w:pPr>
+        <w:spacing w:line="360" w:lineRule="auto"/>
+        <w:rPr>
+          <w:rFonts w:ascii="Times New Roman" w:hAnsi="Times New Roman" w:cs="Times New Roman"/>
+          <w:sz w:val="24"/>
+          <w:szCs w:val="24"/>
+        </w:rPr>
+      </w:pPr>
+      <w:r>
+        <w:rPr>
+          <w:rFonts w:ascii="Times New Roman" w:hAnsi="Times New Roman" w:cs="Times New Roman"/>
+          <w:sz w:val="24"/>
+          <w:szCs w:val="24"/>
+        </w:rPr>
+        <w:t xml:space="preserve">  "</w:t>
+      </w:r>
+      <w:proofErr w:type="gramStart"/>
+      <w:r>
+        <w:rPr>
+          <w:rFonts w:ascii="Times New Roman" w:hAnsi="Times New Roman" w:cs="Times New Roman"/>
+          <w:sz w:val="24"/>
+          <w:szCs w:val="24"/>
+        </w:rPr>
+        <w:t>categorie</w:t>
+      </w:r>
+      <w:proofErr w:type="gramEnd"/>
+      <w:r>
+        <w:rPr>
+          <w:rFonts w:ascii="Times New Roman" w:hAnsi="Times New Roman" w:cs="Times New Roman"/>
+          <w:sz w:val="24"/>
+          <w:szCs w:val="24"/>
+        </w:rPr>
+        <w:t>": "...",</w:t>
+      </w:r>
+    </w:p>
+    <w:p>
+      <w:pPr>
+        <w:spacing w:line="360" w:lineRule="auto"/>
+        <w:rPr>
+          <w:rFonts w:ascii="Times New Roman" w:hAnsi="Times New Roman" w:cs="Times New Roman"/>
+          <w:sz w:val="24"/>
+          <w:szCs w:val="24"/>
+        </w:rPr>
+      </w:pPr>
+      <w:r>
+        <w:rPr>
+          <w:rFonts w:ascii="Times New Roman" w:hAnsi="Times New Roman" w:cs="Times New Roman"/>
+          <w:sz w:val="24"/>
+          <w:szCs w:val="24"/>
+        </w:rPr>
+        <w:lastRenderedPageBreak/>
+        <w:t xml:space="preserve">  "</w:t>
+      </w:r>
+      <w:proofErr w:type="gramStart"/>
+      <w:r>
+        <w:rPr>
+          <w:rFonts w:ascii="Times New Roman" w:hAnsi="Times New Roman" w:cs="Times New Roman"/>
+          <w:sz w:val="24"/>
+          <w:szCs w:val="24"/>
+        </w:rPr>
+        <w:t>justification</w:t>
+      </w:r>
+      <w:proofErr w:type="gramEnd"/>
+      <w:r>
+        <w:rPr>
+          <w:rFonts w:ascii="Times New Roman" w:hAnsi="Times New Roman" w:cs="Times New Roman"/>
+          <w:sz w:val="24"/>
+          <w:szCs w:val="24"/>
+        </w:rPr>
+        <w:t>": "..."</w:t>
+      </w:r>
+    </w:p>
+    <w:p>
+      <w:pPr>
+        <w:spacing w:line="360" w:lineRule="auto"/>
+        <w:rPr>
+          <w:rFonts w:ascii="Times New Roman" w:hAnsi="Times New Roman" w:cs="Times New Roman"/>
+          <w:sz w:val="24"/>
+          <w:szCs w:val="24"/>
+        </w:rPr>
+      </w:pPr>
+      <w:r>
+        <w:rPr>
+          <w:rFonts w:ascii="Times New Roman" w:hAnsi="Times New Roman" w:cs="Times New Roman"/>
+          <w:sz w:val="24"/>
+          <w:szCs w:val="24"/>
+        </w:rPr>
+        <w:t>}</w:t>
+      </w:r>
+    </w:p>
+    <w:p>
+      <w:pPr>
+        <w:pStyle w:val="ListParagraph"/>
+        <w:numPr>
+          <w:ilvl w:val="0"/>
+          <w:numId w:val="10"/>
+        </w:numPr>
+        <w:spacing w:line="360" w:lineRule="auto"/>
+        <w:jc w:val="center"/>
+        <w:rPr>
+          <w:rFonts w:ascii="Times New Roman" w:hAnsi="Times New Roman" w:cs="Times New Roman"/>
+          <w:sz w:val="24"/>
+          <w:szCs w:val="24"/>
+        </w:rPr>
+      </w:pPr>
+      <w:r>
+        <w:rPr>
+          <w:rFonts w:ascii="Times New Roman" w:hAnsi="Times New Roman" w:cs="Times New Roman"/>
+          <w:b/>
+          <w:sz w:val="24"/>
+          <w:szCs w:val="24"/>
+        </w:rPr>
+        <w:t>Réponse de Claude</w:t>
+      </w:r>
+      <w:r>
+        <w:rPr>
+          <w:rFonts w:ascii="Times New Roman" w:hAnsi="Times New Roman" w:cs="Times New Roman"/>
+          <w:sz w:val="24"/>
+          <w:szCs w:val="24"/>
+        </w:rPr>
+        <w:t xml:space="preserve"> </w:t>
+      </w:r>
+      <w:r>
+        <w:drawing>
+          <wp:inline distT="0" distB="0" distL="0" distR="0" wp14:anchorId="0A082BB5" wp14:editId="4E368031">
+            <wp:extent cx="5760720" cy="4460240"/>
+            <wp:effectExtent l="0" t="0" r="0" b="0"/>
+            <wp:docPr id="7" name="Picture 7"/>
+            <wp:cNvGraphicFramePr>
+              <a:graphicFrameLocks xmlns:a="http://schemas.openxmlformats.org/drawingml/2006/main" noChangeAspect="1"/>
+            </wp:cNvGraphicFramePr>
+            <a:graphic xmlns:a="http://schemas.openxmlformats.org/drawingml/2006/main">
+              <a:graphicData uri="http://schemas.openxmlformats.org/drawingml/2006/picture">
+                <pic:pic xmlns:pic="http://schemas.openxmlformats.org/drawingml/2006/picture">
+                  <pic:nvPicPr>
+                    <pic:cNvPr id="1" name=""/>
+                    <pic:cNvPicPr/>
+                  </pic:nvPicPr>
+                  <pic:blipFill>
+                    <a:blip r:embed="rId20"/>
+                    <a:stretch>
+                      <a:fillRect/>
+                    </a:stretch>
+                  </pic:blipFill>
+                  <pic:spPr>
+                    <a:xfrm>
+                      <a:off x="0" y="0"/>
+                      <a:ext cx="5760720" cy="4460240"/>
+                    </a:xfrm>
+                    <a:prstGeom prst="rect">
+                      <a:avLst/>
+                    </a:prstGeom>
+                  </pic:spPr>
+                </pic:pic>
+              </a:graphicData>
+            </a:graphic>
+          </wp:inline>
+        </w:drawing>
+      </w:r>
+    </w:p>
+    <w:p>
+      <w:pPr>
+        <w:spacing w:line="360" w:lineRule="auto"/>
+        <w:jc w:val="both"/>
+        <w:rPr>
+          <w:rFonts w:ascii="Times New Roman" w:hAnsi="Times New Roman" w:cs="Times New Roman"/>
+          <w:sz w:val="24"/>
+          <w:szCs w:val="24"/>
+        </w:rPr>
+      </w:pPr>
       <w:bookmarkStart w:id="0" w:name="_GoBack"/>
       <w:bookmarkEnd w:id="0"/>
-    </w:p>
-    <w:p>
-      <w:pPr>
-        <w:spacing w:line="360" w:lineRule="auto"/>
-        <w:jc w:val="both"/>
-        <w:rPr>
-          <w:rFonts w:ascii="Times New Roman" w:hAnsi="Times New Roman" w:cs="Times New Roman"/>
-          <w:sz w:val="24"/>
-          <w:szCs w:val="24"/>
-        </w:rPr>
-      </w:pPr>
     </w:p>
     <w:p>
       <w:pPr>
@@ -7504,7 +8533,7 @@
   <w:abstractNum w:abstractNumId="3">
     <w:nsid w:val="40234EF3"/>
     <w:multiLevelType w:val="hybridMultilevel"/>
-    <w:tmpl w:val="1CB480B4"/>
+    <w:tmpl w:val="93DCFA62"/>
     <w:lvl w:ilvl="0" w:tplc="040C0009">
       <w:start w:val="1"/>
       <w:numFmt w:val="bullet"/>

</xml_diff>

<commit_message>
Partie 5 – Prompts pour les applications métier: Extraction de données
</commit_message>
<xml_diff>
--- a/ai-business_assistant/correction_atelier_prompt-engineering.docx
+++ b/ai-business_assistant/correction_atelier_prompt-engineering.docx
@@ -8193,40 +8193,1079 @@
     </w:p>
     <w:p>
       <w:pPr>
-        <w:spacing w:line="360" w:lineRule="auto"/>
-        <w:jc w:val="both"/>
-        <w:rPr>
-          <w:rFonts w:ascii="Times New Roman" w:hAnsi="Times New Roman" w:cs="Times New Roman"/>
+        <w:pStyle w:val="ListParagraph"/>
+        <w:spacing w:line="360" w:lineRule="auto"/>
+        <w:rPr>
+          <w:rFonts w:ascii="Times New Roman" w:hAnsi="Times New Roman" w:cs="Times New Roman"/>
+          <w:sz w:val="24"/>
+          <w:szCs w:val="24"/>
+        </w:rPr>
+      </w:pPr>
+    </w:p>
+    <w:p>
+      <w:pPr>
+        <w:pStyle w:val="ListParagraph"/>
+        <w:numPr>
+          <w:ilvl w:val="0"/>
+          <w:numId w:val="12"/>
+        </w:numPr>
+        <w:spacing w:line="360" w:lineRule="auto"/>
+        <w:jc w:val="both"/>
+        <w:rPr>
+          <w:rFonts w:ascii="Times New Roman" w:hAnsi="Times New Roman" w:cs="Times New Roman"/>
+          <w:bCs/>
+          <w:sz w:val="24"/>
+          <w:szCs w:val="24"/>
+        </w:rPr>
+      </w:pPr>
+      <w:r>
+        <w:rPr>
+          <w:rFonts w:ascii="Times New Roman" w:hAnsi="Times New Roman" w:cs="Times New Roman"/>
+          <w:bCs/>
+          <w:sz w:val="24"/>
+          <w:szCs w:val="24"/>
+        </w:rPr>
+        <w:t>Créer un prompt permettant d’extraire, à partir d’une facture, les infos (</w:t>
+      </w:r>
+      <w:proofErr w:type="spellStart"/>
+      <w:r>
+        <w:rPr>
+          <w:rFonts w:ascii="Times New Roman" w:hAnsi="Times New Roman" w:cs="Times New Roman"/>
+          <w:bCs/>
+          <w:sz w:val="24"/>
+          <w:szCs w:val="24"/>
+        </w:rPr>
+        <w:t>numéro_facture</w:t>
+      </w:r>
+      <w:proofErr w:type="spellEnd"/>
+      <w:r>
+        <w:rPr>
+          <w:rFonts w:ascii="Times New Roman" w:hAnsi="Times New Roman" w:cs="Times New Roman"/>
+          <w:bCs/>
+          <w:sz w:val="24"/>
+          <w:szCs w:val="24"/>
+        </w:rPr>
+        <w:t>,</w:t>
+      </w:r>
+      <w:r>
+        <w:rPr>
+          <w:rFonts w:ascii="Times New Roman" w:hAnsi="Times New Roman" w:cs="Times New Roman"/>
+          <w:bCs/>
+          <w:sz w:val="24"/>
+          <w:szCs w:val="24"/>
+        </w:rPr>
+        <w:t xml:space="preserve"> </w:t>
+      </w:r>
+      <w:r>
+        <w:rPr>
+          <w:rFonts w:ascii="Times New Roman" w:hAnsi="Times New Roman" w:cs="Times New Roman"/>
+          <w:bCs/>
+          <w:sz w:val="24"/>
+          <w:szCs w:val="24"/>
+        </w:rPr>
+        <w:t xml:space="preserve">date, client, </w:t>
+      </w:r>
+      <w:proofErr w:type="spellStart"/>
+      <w:r>
+        <w:rPr>
+          <w:rFonts w:ascii="Times New Roman" w:hAnsi="Times New Roman" w:cs="Times New Roman"/>
+          <w:bCs/>
+          <w:sz w:val="24"/>
+          <w:szCs w:val="24"/>
+        </w:rPr>
+        <w:t>montant_ht</w:t>
+      </w:r>
+      <w:proofErr w:type="spellEnd"/>
+      <w:r>
+        <w:rPr>
+          <w:rFonts w:ascii="Times New Roman" w:hAnsi="Times New Roman" w:cs="Times New Roman"/>
+          <w:bCs/>
+          <w:sz w:val="24"/>
+          <w:szCs w:val="24"/>
+        </w:rPr>
+        <w:t xml:space="preserve">, tva, </w:t>
+      </w:r>
+      <w:proofErr w:type="spellStart"/>
+      <w:r>
+        <w:rPr>
+          <w:rFonts w:ascii="Times New Roman" w:hAnsi="Times New Roman" w:cs="Times New Roman"/>
+          <w:bCs/>
+          <w:sz w:val="24"/>
+          <w:szCs w:val="24"/>
+        </w:rPr>
+        <w:t>montant_ttc</w:t>
+      </w:r>
+      <w:proofErr w:type="spellEnd"/>
+      <w:r>
+        <w:rPr>
+          <w:rFonts w:ascii="Times New Roman" w:hAnsi="Times New Roman" w:cs="Times New Roman"/>
+          <w:bCs/>
+          <w:sz w:val="24"/>
+          <w:szCs w:val="24"/>
+        </w:rPr>
+        <w:t xml:space="preserve">). Retourner uniquement un JSON valide avec </w:t>
+      </w:r>
+      <w:proofErr w:type="spellStart"/>
+      <w:r>
+        <w:rPr>
+          <w:rFonts w:ascii="Times New Roman" w:hAnsi="Times New Roman" w:cs="Times New Roman"/>
+          <w:bCs/>
+          <w:sz w:val="24"/>
+          <w:szCs w:val="24"/>
+        </w:rPr>
+        <w:t>null</w:t>
+      </w:r>
+      <w:proofErr w:type="spellEnd"/>
+      <w:r>
+        <w:rPr>
+          <w:rFonts w:ascii="Times New Roman" w:hAnsi="Times New Roman" w:cs="Times New Roman"/>
+          <w:bCs/>
+          <w:sz w:val="24"/>
+          <w:szCs w:val="24"/>
+        </w:rPr>
+        <w:t xml:space="preserve"> </w:t>
+      </w:r>
+      <w:r>
+        <w:rPr>
+          <w:rFonts w:ascii="Times New Roman" w:hAnsi="Times New Roman" w:cs="Times New Roman"/>
+          <w:bCs/>
+          <w:sz w:val="24"/>
+          <w:szCs w:val="24"/>
+        </w:rPr>
+        <w:t>si une info est absente</w:t>
+      </w:r>
+      <w:r>
+        <w:rPr>
+          <w:rFonts w:ascii="Times New Roman" w:hAnsi="Times New Roman" w:cs="Times New Roman"/>
+          <w:bCs/>
+          <w:sz w:val="24"/>
+          <w:szCs w:val="24"/>
+        </w:rPr>
+        <w:t>.</w:t>
+      </w:r>
+    </w:p>
+    <w:p>
+      <w:pPr>
+        <w:pStyle w:val="ListParagraph"/>
+        <w:spacing w:line="360" w:lineRule="auto"/>
+        <w:jc w:val="center"/>
+        <w:rPr>
+          <w:rFonts w:ascii="Times New Roman" w:hAnsi="Times New Roman" w:cs="Times New Roman"/>
+          <w:b/>
+          <w:bCs/>
+          <w:sz w:val="24"/>
+          <w:szCs w:val="24"/>
+        </w:rPr>
+      </w:pPr>
+      <w:r>
+        <w:rPr>
+          <w:rFonts w:ascii="Times New Roman" w:hAnsi="Times New Roman" w:cs="Times New Roman"/>
+          <w:b/>
+          <w:bCs/>
+          <w:sz w:val="24"/>
+          <w:szCs w:val="24"/>
+        </w:rPr>
+        <w:t>Test sur une facture sans valeurs manquantes</w:t>
+      </w:r>
+    </w:p>
+    <w:p>
+      <w:pPr>
+        <w:pStyle w:val="ListParagraph"/>
+        <w:numPr>
+          <w:ilvl w:val="0"/>
+          <w:numId w:val="10"/>
+        </w:numPr>
+        <w:spacing w:line="360" w:lineRule="auto"/>
+        <w:jc w:val="center"/>
+        <w:rPr>
+          <w:rFonts w:ascii="Times New Roman" w:hAnsi="Times New Roman" w:cs="Times New Roman"/>
+          <w:b/>
+          <w:bCs/>
+          <w:sz w:val="24"/>
+          <w:szCs w:val="24"/>
+        </w:rPr>
+      </w:pPr>
+      <w:r>
+        <w:rPr>
+          <w:rFonts w:ascii="Times New Roman" w:hAnsi="Times New Roman" w:cs="Times New Roman"/>
+          <w:b/>
+          <w:bCs/>
+          <w:sz w:val="24"/>
+          <w:szCs w:val="24"/>
+        </w:rPr>
+        <w:t>Prompt proposé</w:t>
+      </w:r>
+    </w:p>
+    <w:p>
+      <w:pPr>
+        <w:spacing w:line="360" w:lineRule="auto"/>
+        <w:rPr>
+          <w:rFonts w:ascii="Times New Roman" w:hAnsi="Times New Roman" w:cs="Times New Roman"/>
+          <w:b/>
+          <w:bCs/>
+          <w:sz w:val="24"/>
+          <w:szCs w:val="24"/>
+        </w:rPr>
+      </w:pPr>
+      <w:r>
+        <w:rPr>
+          <w:rFonts w:ascii="Times New Roman" w:hAnsi="Times New Roman" w:cs="Times New Roman"/>
+          <w:b/>
+          <w:bCs/>
+          <w:sz w:val="24"/>
+          <w:szCs w:val="24"/>
+        </w:rPr>
+        <w:t>Rôle :</w:t>
+      </w:r>
+    </w:p>
+    <w:p>
+      <w:pPr>
+        <w:spacing w:line="360" w:lineRule="auto"/>
+        <w:rPr>
+          <w:rFonts w:ascii="Times New Roman" w:hAnsi="Times New Roman" w:cs="Times New Roman"/>
+          <w:bCs/>
+          <w:sz w:val="24"/>
+          <w:szCs w:val="24"/>
+        </w:rPr>
+      </w:pPr>
+      <w:r>
+        <w:rPr>
+          <w:rFonts w:ascii="Times New Roman" w:hAnsi="Times New Roman" w:cs="Times New Roman"/>
+          <w:bCs/>
+          <w:sz w:val="24"/>
+          <w:szCs w:val="24"/>
+        </w:rPr>
+        <w:t>Tu es un outil d'extraction de données pour l'aut</w:t>
+      </w:r>
+      <w:r>
+        <w:rPr>
+          <w:rFonts w:ascii="Times New Roman" w:hAnsi="Times New Roman" w:cs="Times New Roman"/>
+          <w:bCs/>
+          <w:sz w:val="24"/>
+          <w:szCs w:val="24"/>
+        </w:rPr>
+        <w:t>omatisation de la comptabilité.</w:t>
+      </w:r>
+    </w:p>
+    <w:p>
+      <w:pPr>
+        <w:spacing w:line="360" w:lineRule="auto"/>
+        <w:rPr>
+          <w:rFonts w:ascii="Times New Roman" w:hAnsi="Times New Roman" w:cs="Times New Roman"/>
+          <w:b/>
+          <w:bCs/>
+          <w:sz w:val="24"/>
+          <w:szCs w:val="24"/>
+        </w:rPr>
+      </w:pPr>
+      <w:r>
+        <w:rPr>
+          <w:rFonts w:ascii="Times New Roman" w:hAnsi="Times New Roman" w:cs="Times New Roman"/>
+          <w:b/>
+          <w:bCs/>
+          <w:sz w:val="24"/>
+          <w:szCs w:val="24"/>
+        </w:rPr>
+        <w:t>Tâche :</w:t>
+      </w:r>
+    </w:p>
+    <w:p>
+      <w:pPr>
+        <w:spacing w:line="360" w:lineRule="auto"/>
+        <w:rPr>
+          <w:rFonts w:ascii="Times New Roman" w:hAnsi="Times New Roman" w:cs="Times New Roman"/>
+          <w:bCs/>
+          <w:sz w:val="24"/>
+          <w:szCs w:val="24"/>
+        </w:rPr>
+      </w:pPr>
+      <w:r>
+        <w:rPr>
+          <w:rFonts w:ascii="Times New Roman" w:hAnsi="Times New Roman" w:cs="Times New Roman"/>
+          <w:bCs/>
+          <w:sz w:val="24"/>
+          <w:szCs w:val="24"/>
+        </w:rPr>
+        <w:t>Extrais les informations suivantes à partir de</w:t>
+      </w:r>
+      <w:r>
+        <w:rPr>
+          <w:rFonts w:ascii="Times New Roman" w:hAnsi="Times New Roman" w:cs="Times New Roman"/>
+          <w:bCs/>
+          <w:sz w:val="24"/>
+          <w:szCs w:val="24"/>
+        </w:rPr>
+        <w:t xml:space="preserve">s </w:t>
+      </w:r>
+      <w:r>
+        <w:rPr>
+          <w:rFonts w:ascii="Times New Roman" w:hAnsi="Times New Roman" w:cs="Times New Roman"/>
+          <w:bCs/>
+          <w:sz w:val="24"/>
+          <w:szCs w:val="24"/>
+        </w:rPr>
+        <w:t>facture</w:t>
+      </w:r>
+      <w:r>
+        <w:rPr>
+          <w:rFonts w:ascii="Times New Roman" w:hAnsi="Times New Roman" w:cs="Times New Roman"/>
+          <w:bCs/>
+          <w:sz w:val="24"/>
+          <w:szCs w:val="24"/>
+        </w:rPr>
+        <w:t>s</w:t>
+      </w:r>
+      <w:r>
+        <w:rPr>
+          <w:rFonts w:ascii="Times New Roman" w:hAnsi="Times New Roman" w:cs="Times New Roman"/>
+          <w:bCs/>
+          <w:sz w:val="24"/>
+          <w:szCs w:val="24"/>
+        </w:rPr>
+        <w:t xml:space="preserve"> fournie</w:t>
+      </w:r>
+      <w:r>
+        <w:rPr>
+          <w:rFonts w:ascii="Times New Roman" w:hAnsi="Times New Roman" w:cs="Times New Roman"/>
+          <w:bCs/>
+          <w:sz w:val="24"/>
+          <w:szCs w:val="24"/>
+        </w:rPr>
+        <w:t>s</w:t>
+      </w:r>
+      <w:r>
+        <w:rPr>
+          <w:rFonts w:ascii="Times New Roman" w:hAnsi="Times New Roman" w:cs="Times New Roman"/>
+          <w:bCs/>
+          <w:sz w:val="24"/>
+          <w:szCs w:val="24"/>
+        </w:rPr>
+        <w:t xml:space="preserve"> : </w:t>
+      </w:r>
+      <w:proofErr w:type="spellStart"/>
+      <w:r>
+        <w:rPr>
+          <w:rFonts w:ascii="Times New Roman" w:hAnsi="Times New Roman" w:cs="Times New Roman"/>
+          <w:bCs/>
+          <w:sz w:val="24"/>
+          <w:szCs w:val="24"/>
+        </w:rPr>
+        <w:t>numéro_facture</w:t>
+      </w:r>
+      <w:proofErr w:type="spellEnd"/>
+      <w:r>
+        <w:rPr>
+          <w:rFonts w:ascii="Times New Roman" w:hAnsi="Times New Roman" w:cs="Times New Roman"/>
+          <w:bCs/>
+          <w:sz w:val="24"/>
+          <w:szCs w:val="24"/>
+        </w:rPr>
+        <w:t xml:space="preserve">, </w:t>
+      </w:r>
+    </w:p>
+    <w:p>
+      <w:pPr>
+        <w:spacing w:line="360" w:lineRule="auto"/>
+        <w:rPr>
+          <w:rFonts w:ascii="Times New Roman" w:hAnsi="Times New Roman" w:cs="Times New Roman"/>
+          <w:bCs/>
+          <w:sz w:val="24"/>
+          <w:szCs w:val="24"/>
+        </w:rPr>
+      </w:pPr>
+      <w:proofErr w:type="gramStart"/>
+      <w:r>
+        <w:rPr>
+          <w:rFonts w:ascii="Times New Roman" w:hAnsi="Times New Roman" w:cs="Times New Roman"/>
+          <w:bCs/>
+          <w:sz w:val="24"/>
+          <w:szCs w:val="24"/>
+        </w:rPr>
+        <w:t>date</w:t>
+      </w:r>
+      <w:proofErr w:type="gramEnd"/>
+      <w:r>
+        <w:rPr>
+          <w:rFonts w:ascii="Times New Roman" w:hAnsi="Times New Roman" w:cs="Times New Roman"/>
+          <w:bCs/>
+          <w:sz w:val="24"/>
+          <w:szCs w:val="24"/>
+        </w:rPr>
+        <w:t>, client</w:t>
+      </w:r>
+      <w:r>
+        <w:rPr>
+          <w:rFonts w:ascii="Times New Roman" w:hAnsi="Times New Roman" w:cs="Times New Roman"/>
+          <w:bCs/>
+          <w:sz w:val="24"/>
+          <w:szCs w:val="24"/>
+        </w:rPr>
+        <w:t xml:space="preserve">, </w:t>
+      </w:r>
+      <w:proofErr w:type="spellStart"/>
+      <w:r>
+        <w:rPr>
+          <w:rFonts w:ascii="Times New Roman" w:hAnsi="Times New Roman" w:cs="Times New Roman"/>
+          <w:bCs/>
+          <w:sz w:val="24"/>
+          <w:szCs w:val="24"/>
+        </w:rPr>
+        <w:t>montant_ht</w:t>
+      </w:r>
+      <w:proofErr w:type="spellEnd"/>
+      <w:r>
+        <w:rPr>
+          <w:rFonts w:ascii="Times New Roman" w:hAnsi="Times New Roman" w:cs="Times New Roman"/>
+          <w:bCs/>
+          <w:sz w:val="24"/>
+          <w:szCs w:val="24"/>
+        </w:rPr>
+        <w:t xml:space="preserve">, tva, </w:t>
+      </w:r>
+      <w:proofErr w:type="spellStart"/>
+      <w:r>
+        <w:rPr>
+          <w:rFonts w:ascii="Times New Roman" w:hAnsi="Times New Roman" w:cs="Times New Roman"/>
+          <w:bCs/>
+          <w:sz w:val="24"/>
+          <w:szCs w:val="24"/>
+        </w:rPr>
+        <w:t>montant_ttc</w:t>
+      </w:r>
+      <w:proofErr w:type="spellEnd"/>
+      <w:r>
+        <w:rPr>
+          <w:rFonts w:ascii="Times New Roman" w:hAnsi="Times New Roman" w:cs="Times New Roman"/>
+          <w:bCs/>
+          <w:sz w:val="24"/>
+          <w:szCs w:val="24"/>
+        </w:rPr>
+        <w:t>.</w:t>
+      </w:r>
+    </w:p>
+    <w:p>
+      <w:pPr>
+        <w:spacing w:line="360" w:lineRule="auto"/>
+        <w:rPr>
+          <w:rFonts w:ascii="Times New Roman" w:hAnsi="Times New Roman" w:cs="Times New Roman"/>
+          <w:b/>
+          <w:bCs/>
+          <w:sz w:val="24"/>
+          <w:szCs w:val="24"/>
+        </w:rPr>
+      </w:pPr>
+      <w:r>
+        <w:rPr>
+          <w:rFonts w:ascii="Times New Roman" w:hAnsi="Times New Roman" w:cs="Times New Roman"/>
+          <w:b/>
+          <w:bCs/>
+          <w:sz w:val="24"/>
+          <w:szCs w:val="24"/>
+        </w:rPr>
+        <w:lastRenderedPageBreak/>
+        <w:t>Contraintes :</w:t>
+      </w:r>
+    </w:p>
+    <w:p>
+      <w:pPr>
+        <w:spacing w:line="360" w:lineRule="auto"/>
+        <w:rPr>
+          <w:rFonts w:ascii="Times New Roman" w:hAnsi="Times New Roman" w:cs="Times New Roman"/>
+          <w:bCs/>
+          <w:sz w:val="24"/>
+          <w:szCs w:val="24"/>
+        </w:rPr>
+      </w:pPr>
+      <w:r>
+        <w:rPr>
+          <w:rFonts w:ascii="Times New Roman" w:hAnsi="Times New Roman" w:cs="Times New Roman"/>
+          <w:bCs/>
+          <w:sz w:val="24"/>
+          <w:szCs w:val="24"/>
+        </w:rPr>
+        <w:t>- Retourne uniquement un JSON valide, sans texte avant ou après.</w:t>
+      </w:r>
+    </w:p>
+    <w:p>
+      <w:pPr>
+        <w:spacing w:line="360" w:lineRule="auto"/>
+        <w:rPr>
+          <w:rFonts w:ascii="Times New Roman" w:hAnsi="Times New Roman" w:cs="Times New Roman"/>
+          <w:bCs/>
+          <w:sz w:val="24"/>
+          <w:szCs w:val="24"/>
+        </w:rPr>
+      </w:pPr>
+      <w:r>
+        <w:rPr>
+          <w:rFonts w:ascii="Times New Roman" w:hAnsi="Times New Roman" w:cs="Times New Roman"/>
+          <w:bCs/>
+          <w:sz w:val="24"/>
+          <w:szCs w:val="24"/>
+        </w:rPr>
+        <w:t>- Si une information est absente ou illisible dans</w:t>
+      </w:r>
+      <w:r>
+        <w:rPr>
+          <w:rFonts w:ascii="Times New Roman" w:hAnsi="Times New Roman" w:cs="Times New Roman"/>
+          <w:bCs/>
+          <w:sz w:val="24"/>
+          <w:szCs w:val="24"/>
+        </w:rPr>
+        <w:t xml:space="preserve"> la facture, indique la valeur </w:t>
+      </w:r>
+      <w:proofErr w:type="spellStart"/>
+      <w:r>
+        <w:rPr>
+          <w:rFonts w:ascii="Times New Roman" w:hAnsi="Times New Roman" w:cs="Times New Roman"/>
+          <w:bCs/>
+          <w:sz w:val="24"/>
+          <w:szCs w:val="24"/>
+        </w:rPr>
+        <w:t>null</w:t>
+      </w:r>
+      <w:proofErr w:type="spellEnd"/>
+      <w:r>
+        <w:rPr>
+          <w:rFonts w:ascii="Times New Roman" w:hAnsi="Times New Roman" w:cs="Times New Roman"/>
+          <w:bCs/>
+          <w:sz w:val="24"/>
+          <w:szCs w:val="24"/>
+        </w:rPr>
+        <w:t xml:space="preserve"> pour ce champ </w:t>
+      </w:r>
+      <w:r>
+        <w:rPr>
+          <w:rFonts w:ascii="Times New Roman" w:hAnsi="Times New Roman" w:cs="Times New Roman"/>
+          <w:bCs/>
+          <w:sz w:val="24"/>
+          <w:szCs w:val="24"/>
+        </w:rPr>
+        <w:t xml:space="preserve"> n'invente jamais une valeur approximative ou estimée.</w:t>
+      </w:r>
+    </w:p>
+    <w:p>
+      <w:pPr>
+        <w:spacing w:line="360" w:lineRule="auto"/>
+        <w:rPr>
+          <w:rFonts w:ascii="Times New Roman" w:hAnsi="Times New Roman" w:cs="Times New Roman"/>
+          <w:bCs/>
+          <w:sz w:val="24"/>
+          <w:szCs w:val="24"/>
+        </w:rPr>
+      </w:pPr>
+      <w:r>
+        <w:rPr>
+          <w:rFonts w:ascii="Times New Roman" w:hAnsi="Times New Roman" w:cs="Times New Roman"/>
+          <w:bCs/>
+          <w:sz w:val="24"/>
+          <w:szCs w:val="24"/>
+        </w:rPr>
+        <w:t>- Les montants (</w:t>
+      </w:r>
+      <w:proofErr w:type="spellStart"/>
+      <w:r>
+        <w:rPr>
+          <w:rFonts w:ascii="Times New Roman" w:hAnsi="Times New Roman" w:cs="Times New Roman"/>
+          <w:bCs/>
+          <w:sz w:val="24"/>
+          <w:szCs w:val="24"/>
+        </w:rPr>
+        <w:t>montant_ht</w:t>
+      </w:r>
+      <w:proofErr w:type="spellEnd"/>
+      <w:r>
+        <w:rPr>
+          <w:rFonts w:ascii="Times New Roman" w:hAnsi="Times New Roman" w:cs="Times New Roman"/>
+          <w:bCs/>
+          <w:sz w:val="24"/>
+          <w:szCs w:val="24"/>
+        </w:rPr>
+        <w:t xml:space="preserve">, tva, </w:t>
+      </w:r>
+      <w:proofErr w:type="spellStart"/>
+      <w:r>
+        <w:rPr>
+          <w:rFonts w:ascii="Times New Roman" w:hAnsi="Times New Roman" w:cs="Times New Roman"/>
+          <w:bCs/>
+          <w:sz w:val="24"/>
+          <w:szCs w:val="24"/>
+        </w:rPr>
+        <w:t>montant_ttc</w:t>
+      </w:r>
+      <w:proofErr w:type="spellEnd"/>
+      <w:r>
+        <w:rPr>
+          <w:rFonts w:ascii="Times New Roman" w:hAnsi="Times New Roman" w:cs="Times New Roman"/>
+          <w:bCs/>
+          <w:sz w:val="24"/>
+          <w:szCs w:val="24"/>
+        </w:rPr>
+        <w:t>) doiv</w:t>
+      </w:r>
+      <w:r>
+        <w:rPr>
+          <w:rFonts w:ascii="Times New Roman" w:hAnsi="Times New Roman" w:cs="Times New Roman"/>
+          <w:bCs/>
+          <w:sz w:val="24"/>
+          <w:szCs w:val="24"/>
+        </w:rPr>
+        <w:t xml:space="preserve">ent être des nombres décimaux, </w:t>
+      </w:r>
+      <w:r>
+        <w:rPr>
+          <w:rFonts w:ascii="Times New Roman" w:hAnsi="Times New Roman" w:cs="Times New Roman"/>
+          <w:bCs/>
+          <w:sz w:val="24"/>
+          <w:szCs w:val="24"/>
+        </w:rPr>
+        <w:t>sans symbole de devise.</w:t>
+      </w:r>
+    </w:p>
+    <w:p>
+      <w:pPr>
+        <w:spacing w:line="360" w:lineRule="auto"/>
+        <w:rPr>
+          <w:rFonts w:ascii="Times New Roman" w:hAnsi="Times New Roman" w:cs="Times New Roman"/>
+          <w:bCs/>
+          <w:sz w:val="24"/>
+          <w:szCs w:val="24"/>
+        </w:rPr>
+      </w:pPr>
+      <w:r>
+        <w:rPr>
+          <w:rFonts w:ascii="Times New Roman" w:hAnsi="Times New Roman" w:cs="Times New Roman"/>
+          <w:bCs/>
+          <w:sz w:val="24"/>
+          <w:szCs w:val="24"/>
+        </w:rPr>
+        <w:t>- Le champ "date" doit être a</w:t>
+      </w:r>
+      <w:r>
+        <w:rPr>
+          <w:rFonts w:ascii="Times New Roman" w:hAnsi="Times New Roman" w:cs="Times New Roman"/>
+          <w:bCs/>
+          <w:sz w:val="24"/>
+          <w:szCs w:val="24"/>
+        </w:rPr>
+        <w:t>u format AAAA-MM-JJ.</w:t>
+      </w:r>
+    </w:p>
+    <w:p>
+      <w:pPr>
+        <w:spacing w:line="360" w:lineRule="auto"/>
+        <w:rPr>
+          <w:rFonts w:ascii="Times New Roman" w:hAnsi="Times New Roman" w:cs="Times New Roman"/>
+          <w:b/>
+          <w:bCs/>
+          <w:sz w:val="24"/>
+          <w:szCs w:val="24"/>
+        </w:rPr>
+      </w:pPr>
+      <w:r>
+        <w:rPr>
+          <w:rFonts w:ascii="Times New Roman" w:hAnsi="Times New Roman" w:cs="Times New Roman"/>
+          <w:b/>
+          <w:bCs/>
+          <w:sz w:val="24"/>
+          <w:szCs w:val="24"/>
+        </w:rPr>
+        <w:t>Format de sortie :</w:t>
+      </w:r>
+    </w:p>
+    <w:p>
+      <w:pPr>
+        <w:spacing w:line="360" w:lineRule="auto"/>
+        <w:rPr>
+          <w:rFonts w:ascii="Times New Roman" w:hAnsi="Times New Roman" w:cs="Times New Roman"/>
+          <w:bCs/>
+          <w:sz w:val="24"/>
+          <w:szCs w:val="24"/>
+        </w:rPr>
+      </w:pPr>
+      <w:r>
+        <w:rPr>
+          <w:rFonts w:ascii="Times New Roman" w:hAnsi="Times New Roman" w:cs="Times New Roman"/>
+          <w:bCs/>
+          <w:sz w:val="24"/>
+          <w:szCs w:val="24"/>
+        </w:rPr>
+        <w:t>Pour chaque facture :</w:t>
+      </w:r>
+    </w:p>
+    <w:p>
+      <w:pPr>
+        <w:spacing w:line="360" w:lineRule="auto"/>
+        <w:rPr>
+          <w:rFonts w:ascii="Times New Roman" w:hAnsi="Times New Roman" w:cs="Times New Roman"/>
+          <w:bCs/>
+          <w:sz w:val="24"/>
+          <w:szCs w:val="24"/>
+        </w:rPr>
+      </w:pPr>
+      <w:r>
+        <w:rPr>
+          <w:rFonts w:ascii="Times New Roman" w:hAnsi="Times New Roman" w:cs="Times New Roman"/>
+          <w:bCs/>
+          <w:sz w:val="24"/>
+          <w:szCs w:val="24"/>
+        </w:rPr>
+        <w:t>{</w:t>
+      </w:r>
+    </w:p>
+    <w:p>
+      <w:pPr>
+        <w:spacing w:line="360" w:lineRule="auto"/>
+        <w:rPr>
+          <w:rFonts w:ascii="Times New Roman" w:hAnsi="Times New Roman" w:cs="Times New Roman"/>
+          <w:bCs/>
+          <w:sz w:val="24"/>
+          <w:szCs w:val="24"/>
+        </w:rPr>
+      </w:pPr>
+      <w:r>
+        <w:rPr>
+          <w:rFonts w:ascii="Times New Roman" w:hAnsi="Times New Roman" w:cs="Times New Roman"/>
+          <w:bCs/>
+          <w:sz w:val="24"/>
+          <w:szCs w:val="24"/>
+        </w:rPr>
+        <w:t xml:space="preserve">  "</w:t>
+      </w:r>
+      <w:proofErr w:type="spellStart"/>
+      <w:proofErr w:type="gramStart"/>
+      <w:r>
+        <w:rPr>
+          <w:rFonts w:ascii="Times New Roman" w:hAnsi="Times New Roman" w:cs="Times New Roman"/>
+          <w:bCs/>
+          <w:sz w:val="24"/>
+          <w:szCs w:val="24"/>
+        </w:rPr>
+        <w:t>numero_facture</w:t>
+      </w:r>
+      <w:proofErr w:type="spellEnd"/>
+      <w:proofErr w:type="gramEnd"/>
+      <w:r>
+        <w:rPr>
+          <w:rFonts w:ascii="Times New Roman" w:hAnsi="Times New Roman" w:cs="Times New Roman"/>
+          <w:bCs/>
+          <w:sz w:val="24"/>
+          <w:szCs w:val="24"/>
+        </w:rPr>
+        <w:t>": "...",</w:t>
+      </w:r>
+    </w:p>
+    <w:p>
+      <w:pPr>
+        <w:spacing w:line="360" w:lineRule="auto"/>
+        <w:rPr>
+          <w:rFonts w:ascii="Times New Roman" w:hAnsi="Times New Roman" w:cs="Times New Roman"/>
+          <w:bCs/>
+          <w:sz w:val="24"/>
+          <w:szCs w:val="24"/>
+        </w:rPr>
+      </w:pPr>
+      <w:r>
+        <w:rPr>
+          <w:rFonts w:ascii="Times New Roman" w:hAnsi="Times New Roman" w:cs="Times New Roman"/>
+          <w:bCs/>
+          <w:sz w:val="24"/>
+          <w:szCs w:val="24"/>
+        </w:rPr>
+        <w:t xml:space="preserve">  "</w:t>
+      </w:r>
+      <w:proofErr w:type="gramStart"/>
+      <w:r>
+        <w:rPr>
+          <w:rFonts w:ascii="Times New Roman" w:hAnsi="Times New Roman" w:cs="Times New Roman"/>
+          <w:bCs/>
+          <w:sz w:val="24"/>
+          <w:szCs w:val="24"/>
+        </w:rPr>
+        <w:t>date</w:t>
+      </w:r>
+      <w:proofErr w:type="gramEnd"/>
+      <w:r>
+        <w:rPr>
+          <w:rFonts w:ascii="Times New Roman" w:hAnsi="Times New Roman" w:cs="Times New Roman"/>
+          <w:bCs/>
+          <w:sz w:val="24"/>
+          <w:szCs w:val="24"/>
+        </w:rPr>
+        <w:t>": "...",</w:t>
+      </w:r>
+    </w:p>
+    <w:p>
+      <w:pPr>
+        <w:spacing w:line="360" w:lineRule="auto"/>
+        <w:rPr>
+          <w:rFonts w:ascii="Times New Roman" w:hAnsi="Times New Roman" w:cs="Times New Roman"/>
+          <w:bCs/>
+          <w:sz w:val="24"/>
+          <w:szCs w:val="24"/>
+        </w:rPr>
+      </w:pPr>
+      <w:r>
+        <w:rPr>
+          <w:rFonts w:ascii="Times New Roman" w:hAnsi="Times New Roman" w:cs="Times New Roman"/>
+          <w:bCs/>
+          <w:sz w:val="24"/>
+          <w:szCs w:val="24"/>
+        </w:rPr>
+        <w:t xml:space="preserve">  "</w:t>
+      </w:r>
+      <w:proofErr w:type="gramStart"/>
+      <w:r>
+        <w:rPr>
+          <w:rFonts w:ascii="Times New Roman" w:hAnsi="Times New Roman" w:cs="Times New Roman"/>
+          <w:bCs/>
+          <w:sz w:val="24"/>
+          <w:szCs w:val="24"/>
+        </w:rPr>
+        <w:t>client</w:t>
+      </w:r>
+      <w:proofErr w:type="gramEnd"/>
+      <w:r>
+        <w:rPr>
+          <w:rFonts w:ascii="Times New Roman" w:hAnsi="Times New Roman" w:cs="Times New Roman"/>
+          <w:bCs/>
+          <w:sz w:val="24"/>
+          <w:szCs w:val="24"/>
+        </w:rPr>
+        <w:t>": "...",</w:t>
+      </w:r>
+    </w:p>
+    <w:p>
+      <w:pPr>
+        <w:spacing w:line="360" w:lineRule="auto"/>
+        <w:rPr>
+          <w:rFonts w:ascii="Times New Roman" w:hAnsi="Times New Roman" w:cs="Times New Roman"/>
+          <w:bCs/>
+          <w:sz w:val="24"/>
+          <w:szCs w:val="24"/>
+        </w:rPr>
+      </w:pPr>
+      <w:r>
+        <w:rPr>
+          <w:rFonts w:ascii="Times New Roman" w:hAnsi="Times New Roman" w:cs="Times New Roman"/>
+          <w:bCs/>
+          <w:sz w:val="24"/>
+          <w:szCs w:val="24"/>
+        </w:rPr>
+        <w:t xml:space="preserve">  "</w:t>
+      </w:r>
+      <w:proofErr w:type="spellStart"/>
+      <w:proofErr w:type="gramStart"/>
+      <w:r>
+        <w:rPr>
+          <w:rFonts w:ascii="Times New Roman" w:hAnsi="Times New Roman" w:cs="Times New Roman"/>
+          <w:bCs/>
+          <w:sz w:val="24"/>
+          <w:szCs w:val="24"/>
+        </w:rPr>
+        <w:t>montant_ht</w:t>
+      </w:r>
+      <w:proofErr w:type="spellEnd"/>
+      <w:proofErr w:type="gramEnd"/>
+      <w:r>
+        <w:rPr>
+          <w:rFonts w:ascii="Times New Roman" w:hAnsi="Times New Roman" w:cs="Times New Roman"/>
+          <w:bCs/>
+          <w:sz w:val="24"/>
+          <w:szCs w:val="24"/>
+        </w:rPr>
+        <w:t>": ...,</w:t>
+      </w:r>
+    </w:p>
+    <w:p>
+      <w:pPr>
+        <w:spacing w:line="360" w:lineRule="auto"/>
+        <w:rPr>
+          <w:rFonts w:ascii="Times New Roman" w:hAnsi="Times New Roman" w:cs="Times New Roman"/>
+          <w:bCs/>
+          <w:sz w:val="24"/>
+          <w:szCs w:val="24"/>
+        </w:rPr>
+      </w:pPr>
+      <w:r>
+        <w:rPr>
+          <w:rFonts w:ascii="Times New Roman" w:hAnsi="Times New Roman" w:cs="Times New Roman"/>
+          <w:bCs/>
+          <w:sz w:val="24"/>
+          <w:szCs w:val="24"/>
+        </w:rPr>
+        <w:t xml:space="preserve">  "</w:t>
+      </w:r>
+      <w:proofErr w:type="gramStart"/>
+      <w:r>
+        <w:rPr>
+          <w:rFonts w:ascii="Times New Roman" w:hAnsi="Times New Roman" w:cs="Times New Roman"/>
+          <w:bCs/>
+          <w:sz w:val="24"/>
+          <w:szCs w:val="24"/>
+        </w:rPr>
+        <w:t>tva</w:t>
+      </w:r>
+      <w:proofErr w:type="gramEnd"/>
+      <w:r>
+        <w:rPr>
+          <w:rFonts w:ascii="Times New Roman" w:hAnsi="Times New Roman" w:cs="Times New Roman"/>
+          <w:bCs/>
+          <w:sz w:val="24"/>
+          <w:szCs w:val="24"/>
+        </w:rPr>
+        <w:t>": ...,</w:t>
+      </w:r>
+    </w:p>
+    <w:p>
+      <w:pPr>
+        <w:spacing w:line="360" w:lineRule="auto"/>
+        <w:rPr>
+          <w:rFonts w:ascii="Times New Roman" w:hAnsi="Times New Roman" w:cs="Times New Roman"/>
+          <w:bCs/>
+          <w:sz w:val="24"/>
+          <w:szCs w:val="24"/>
+        </w:rPr>
+      </w:pPr>
+      <w:r>
+        <w:rPr>
+          <w:rFonts w:ascii="Times New Roman" w:hAnsi="Times New Roman" w:cs="Times New Roman"/>
+          <w:bCs/>
+          <w:sz w:val="24"/>
+          <w:szCs w:val="24"/>
+        </w:rPr>
+        <w:t xml:space="preserve">  "</w:t>
+      </w:r>
+      <w:proofErr w:type="spellStart"/>
+      <w:proofErr w:type="gramStart"/>
+      <w:r>
+        <w:rPr>
+          <w:rFonts w:ascii="Times New Roman" w:hAnsi="Times New Roman" w:cs="Times New Roman"/>
+          <w:bCs/>
+          <w:sz w:val="24"/>
+          <w:szCs w:val="24"/>
+        </w:rPr>
+        <w:t>montant_ttc</w:t>
+      </w:r>
+      <w:proofErr w:type="spellEnd"/>
+      <w:proofErr w:type="gramEnd"/>
+      <w:r>
+        <w:rPr>
+          <w:rFonts w:ascii="Times New Roman" w:hAnsi="Times New Roman" w:cs="Times New Roman"/>
+          <w:bCs/>
+          <w:sz w:val="24"/>
+          <w:szCs w:val="24"/>
+        </w:rPr>
+        <w:t>": ...</w:t>
+      </w:r>
+    </w:p>
+    <w:p>
+      <w:pPr>
+        <w:spacing w:line="360" w:lineRule="auto"/>
+        <w:rPr>
+          <w:rFonts w:ascii="Times New Roman" w:hAnsi="Times New Roman" w:cs="Times New Roman"/>
+          <w:bCs/>
+          <w:sz w:val="24"/>
+          <w:szCs w:val="24"/>
+        </w:rPr>
+      </w:pPr>
+      <w:r>
+        <w:rPr>
+          <w:rFonts w:ascii="Times New Roman" w:hAnsi="Times New Roman" w:cs="Times New Roman"/>
+          <w:bCs/>
+          <w:sz w:val="24"/>
+          <w:szCs w:val="24"/>
+        </w:rPr>
+        <w:t>}</w:t>
+      </w:r>
+    </w:p>
+    <w:p>
+      <w:pPr>
+        <w:pStyle w:val="ListParagraph"/>
+        <w:numPr>
+          <w:ilvl w:val="0"/>
+          <w:numId w:val="10"/>
+        </w:numPr>
+        <w:spacing w:line="360" w:lineRule="auto"/>
+        <w:jc w:val="center"/>
+        <w:rPr>
+          <w:rFonts w:ascii="Times New Roman" w:hAnsi="Times New Roman" w:cs="Times New Roman"/>
+          <w:b/>
+          <w:bCs/>
+          <w:sz w:val="24"/>
+          <w:szCs w:val="24"/>
+        </w:rPr>
+      </w:pPr>
+      <w:r>
+        <w:rPr>
+          <w:rFonts w:ascii="Times New Roman" w:hAnsi="Times New Roman" w:cs="Times New Roman"/>
+          <w:b/>
+          <w:bCs/>
+          <w:sz w:val="24"/>
+          <w:szCs w:val="24"/>
+        </w:rPr>
+        <w:lastRenderedPageBreak/>
+        <w:t>Réponse de Claude</w:t>
+      </w:r>
+      <w:r>
+        <w:rPr>
+          <w:rFonts w:ascii="Times New Roman" w:hAnsi="Times New Roman" w:cs="Times New Roman"/>
+          <w:b/>
+          <w:bCs/>
+          <w:sz w:val="24"/>
+          <w:szCs w:val="24"/>
+        </w:rPr>
+        <w:drawing>
+          <wp:inline distT="0" distB="0" distL="0" distR="0" wp14:anchorId="3D3C9225" wp14:editId="203D8E21">
+            <wp:extent cx="5760720" cy="4289425"/>
+            <wp:effectExtent l="0" t="0" r="0" b="0"/>
+            <wp:docPr id="8" name="Picture 8"/>
+            <wp:cNvGraphicFramePr>
+              <a:graphicFrameLocks xmlns:a="http://schemas.openxmlformats.org/drawingml/2006/main" noChangeAspect="1"/>
+            </wp:cNvGraphicFramePr>
+            <a:graphic xmlns:a="http://schemas.openxmlformats.org/drawingml/2006/main">
+              <a:graphicData uri="http://schemas.openxmlformats.org/drawingml/2006/picture">
+                <pic:pic xmlns:pic="http://schemas.openxmlformats.org/drawingml/2006/picture">
+                  <pic:nvPicPr>
+                    <pic:cNvPr id="1" name=""/>
+                    <pic:cNvPicPr/>
+                  </pic:nvPicPr>
+                  <pic:blipFill>
+                    <a:blip r:embed="rId21"/>
+                    <a:stretch>
+                      <a:fillRect/>
+                    </a:stretch>
+                  </pic:blipFill>
+                  <pic:spPr>
+                    <a:xfrm>
+                      <a:off x="0" y="0"/>
+                      <a:ext cx="5760720" cy="4289425"/>
+                    </a:xfrm>
+                    <a:prstGeom prst="rect">
+                      <a:avLst/>
+                    </a:prstGeom>
+                  </pic:spPr>
+                </pic:pic>
+              </a:graphicData>
+            </a:graphic>
+          </wp:inline>
+        </w:drawing>
+      </w:r>
+    </w:p>
+    <w:p>
+      <w:pPr>
+        <w:spacing w:line="360" w:lineRule="auto"/>
+        <w:ind w:left="360"/>
+        <w:rPr>
+          <w:rFonts w:ascii="Times New Roman" w:hAnsi="Times New Roman" w:cs="Times New Roman"/>
+          <w:b/>
+          <w:bCs/>
           <w:sz w:val="24"/>
           <w:szCs w:val="24"/>
         </w:rPr>
       </w:pPr>
       <w:bookmarkStart w:id="0" w:name="_GoBack"/>
       <w:bookmarkEnd w:id="0"/>
-    </w:p>
-    <w:p>
-      <w:pPr>
-        <w:spacing w:line="360" w:lineRule="auto"/>
-        <w:ind w:left="360"/>
-        <w:jc w:val="both"/>
-        <w:rPr>
-          <w:rFonts w:ascii="Times New Roman" w:hAnsi="Times New Roman" w:cs="Times New Roman"/>
-          <w:bCs/>
-          <w:szCs w:val="24"/>
-        </w:rPr>
-      </w:pPr>
-    </w:p>
-    <w:p>
-      <w:pPr>
-        <w:spacing w:line="360" w:lineRule="auto"/>
-        <w:ind w:left="360"/>
-        <w:jc w:val="both"/>
-        <w:rPr>
-          <w:rFonts w:ascii="Times New Roman" w:hAnsi="Times New Roman" w:cs="Times New Roman"/>
-          <w:bCs/>
-          <w:szCs w:val="24"/>
-        </w:rPr>
-      </w:pPr>
     </w:p>
     <w:sectPr>
       <w:pgSz w:w="11906" w:h="16838"/>
@@ -8533,7 +9572,7 @@
   <w:abstractNum w:abstractNumId="3">
     <w:nsid w:val="40234EF3"/>
     <w:multiLevelType w:val="hybridMultilevel"/>
-    <w:tmpl w:val="93DCFA62"/>
+    <w:tmpl w:val="8C1EBB54"/>
     <w:lvl w:ilvl="0" w:tplc="040C0009">
       <w:start w:val="1"/>
       <w:numFmt w:val="bullet"/>

</xml_diff>

<commit_message>
Partie 5 – Prompts pour les applications métier: Prompt pour la rédaction de email
</commit_message>
<xml_diff>
--- a/ai-business_assistant/correction_atelier_prompt-engineering.docx
+++ b/ai-business_assistant/correction_atelier_prompt-engineering.docx
@@ -9254,6 +9254,126 @@
     </w:p>
     <w:p>
       <w:pPr>
+        <w:pStyle w:val="ListParagraph"/>
+        <w:spacing w:line="360" w:lineRule="auto"/>
+        <w:rPr>
+          <w:rFonts w:ascii="Times New Roman" w:hAnsi="Times New Roman" w:cs="Times New Roman"/>
+          <w:b/>
+          <w:bCs/>
+          <w:sz w:val="24"/>
+          <w:szCs w:val="24"/>
+        </w:rPr>
+      </w:pPr>
+    </w:p>
+    <w:p>
+      <w:pPr>
+        <w:pStyle w:val="ListParagraph"/>
+        <w:numPr>
+          <w:ilvl w:val="0"/>
+          <w:numId w:val="12"/>
+        </w:numPr>
+        <w:spacing w:line="360" w:lineRule="auto"/>
+        <w:rPr>
+          <w:rFonts w:ascii="Times New Roman" w:hAnsi="Times New Roman" w:cs="Times New Roman"/>
+          <w:bCs/>
+          <w:sz w:val="24"/>
+          <w:szCs w:val="24"/>
+        </w:rPr>
+      </w:pPr>
+      <w:r>
+        <w:rPr>
+          <w:rFonts w:ascii="Times New Roman" w:hAnsi="Times New Roman" w:cs="Times New Roman"/>
+          <w:bCs/>
+          <w:sz w:val="24"/>
+          <w:szCs w:val="24"/>
+        </w:rPr>
+        <w:t>Créer un prompt permettant de rédiger un email destiné à un client dont la livraison a pris</w:t>
+      </w:r>
+      <w:r>
+        <w:rPr>
+          <w:rFonts w:ascii="Times New Roman" w:hAnsi="Times New Roman" w:cs="Times New Roman"/>
+          <w:bCs/>
+          <w:sz w:val="24"/>
+          <w:szCs w:val="24"/>
+        </w:rPr>
+        <w:t xml:space="preserve"> </w:t>
+      </w:r>
+      <w:r>
+        <w:rPr>
+          <w:rFonts w:ascii="Times New Roman" w:hAnsi="Times New Roman" w:cs="Times New Roman"/>
+          <w:bCs/>
+          <w:sz w:val="24"/>
+          <w:szCs w:val="24"/>
+        </w:rPr>
+        <w:t>du retard avec les objectifs (reconnaître le retard, présenter des excuses, expliquer la</w:t>
+      </w:r>
+      <w:r>
+        <w:rPr>
+          <w:rFonts w:ascii="Times New Roman" w:hAnsi="Times New Roman" w:cs="Times New Roman"/>
+          <w:bCs/>
+          <w:sz w:val="24"/>
+          <w:szCs w:val="24"/>
+        </w:rPr>
+        <w:t xml:space="preserve"> </w:t>
+      </w:r>
+      <w:r>
+        <w:rPr>
+          <w:rFonts w:ascii="Times New Roman" w:hAnsi="Times New Roman" w:cs="Times New Roman"/>
+          <w:bCs/>
+          <w:sz w:val="24"/>
+          <w:szCs w:val="24"/>
+        </w:rPr>
+        <w:t>situation sans inventer de cause et proposer une solution), le ton (professionnel, courtois et</w:t>
+      </w:r>
+      <w:r>
+        <w:rPr>
+          <w:rFonts w:ascii="Times New Roman" w:hAnsi="Times New Roman" w:cs="Times New Roman"/>
+          <w:bCs/>
+          <w:sz w:val="24"/>
+          <w:szCs w:val="24"/>
+        </w:rPr>
+        <w:t xml:space="preserve"> </w:t>
+      </w:r>
+      <w:r>
+        <w:rPr>
+          <w:rFonts w:ascii="Times New Roman" w:hAnsi="Times New Roman" w:cs="Times New Roman"/>
+          <w:bCs/>
+          <w:sz w:val="24"/>
+          <w:szCs w:val="24"/>
+        </w:rPr>
+        <w:t>rassurant) et la longueur maximale (150 mots)</w:t>
+      </w:r>
+    </w:p>
+    <w:p>
+      <w:pPr>
+        <w:pStyle w:val="ListParagraph"/>
+        <w:numPr>
+          <w:ilvl w:val="0"/>
+          <w:numId w:val="10"/>
+        </w:numPr>
+        <w:spacing w:line="360" w:lineRule="auto"/>
+        <w:jc w:val="center"/>
+        <w:rPr>
+          <w:rFonts w:ascii="Times New Roman" w:hAnsi="Times New Roman" w:cs="Times New Roman"/>
+          <w:b/>
+          <w:bCs/>
+          <w:sz w:val="24"/>
+          <w:szCs w:val="24"/>
+        </w:rPr>
+      </w:pPr>
+      <w:r>
+        <w:rPr>
+          <w:rFonts w:ascii="Times New Roman" w:hAnsi="Times New Roman" w:cs="Times New Roman"/>
+          <w:b/>
+          <w:bCs/>
+          <w:sz w:val="24"/>
+          <w:szCs w:val="24"/>
+        </w:rPr>
+        <w:t>Prompt proposé</w:t>
+      </w:r>
+    </w:p>
+    <w:p>
+      <w:pPr>
         <w:spacing w:line="360" w:lineRule="auto"/>
         <w:ind w:left="360"/>
         <w:rPr>
@@ -9264,8 +9384,637 @@
           <w:szCs w:val="24"/>
         </w:rPr>
       </w:pPr>
+      <w:r>
+        <w:rPr>
+          <w:rFonts w:ascii="Times New Roman" w:hAnsi="Times New Roman" w:cs="Times New Roman"/>
+          <w:b/>
+          <w:bCs/>
+          <w:sz w:val="24"/>
+          <w:szCs w:val="24"/>
+        </w:rPr>
+        <w:t>Rôle :</w:t>
+      </w:r>
+    </w:p>
+    <w:p>
+      <w:pPr>
+        <w:spacing w:line="360" w:lineRule="auto"/>
+        <w:ind w:left="360"/>
+        <w:rPr>
+          <w:rFonts w:ascii="Times New Roman" w:hAnsi="Times New Roman" w:cs="Times New Roman"/>
+          <w:b/>
+          <w:bCs/>
+          <w:sz w:val="24"/>
+          <w:szCs w:val="24"/>
+        </w:rPr>
+      </w:pPr>
+      <w:r>
+        <w:rPr>
+          <w:rFonts w:ascii="Times New Roman" w:hAnsi="Times New Roman" w:cs="Times New Roman"/>
+          <w:bCs/>
+          <w:sz w:val="24"/>
+          <w:szCs w:val="24"/>
+        </w:rPr>
+        <w:t>Tu es un chargé de relation clien</w:t>
+      </w:r>
+      <w:r>
+        <w:rPr>
+          <w:rFonts w:ascii="Times New Roman" w:hAnsi="Times New Roman" w:cs="Times New Roman"/>
+          <w:bCs/>
+          <w:sz w:val="24"/>
+          <w:szCs w:val="24"/>
+        </w:rPr>
+        <w:t>t, professionnel et empathique.</w:t>
+      </w:r>
+    </w:p>
+    <w:p>
+      <w:pPr>
+        <w:spacing w:line="360" w:lineRule="auto"/>
+        <w:ind w:left="360"/>
+        <w:rPr>
+          <w:rFonts w:ascii="Times New Roman" w:hAnsi="Times New Roman" w:cs="Times New Roman"/>
+          <w:b/>
+          <w:bCs/>
+          <w:sz w:val="24"/>
+          <w:szCs w:val="24"/>
+        </w:rPr>
+      </w:pPr>
+      <w:r>
+        <w:rPr>
+          <w:rFonts w:ascii="Times New Roman" w:hAnsi="Times New Roman" w:cs="Times New Roman"/>
+          <w:b/>
+          <w:bCs/>
+          <w:sz w:val="24"/>
+          <w:szCs w:val="24"/>
+        </w:rPr>
+        <w:t>Tâche :</w:t>
+      </w:r>
+    </w:p>
+    <w:p>
+      <w:pPr>
+        <w:spacing w:line="360" w:lineRule="auto"/>
+        <w:ind w:left="360"/>
+        <w:rPr>
+          <w:rFonts w:ascii="Times New Roman" w:hAnsi="Times New Roman" w:cs="Times New Roman"/>
+          <w:bCs/>
+          <w:sz w:val="24"/>
+          <w:szCs w:val="24"/>
+        </w:rPr>
+      </w:pPr>
+      <w:r>
+        <w:rPr>
+          <w:rFonts w:ascii="Times New Roman" w:hAnsi="Times New Roman" w:cs="Times New Roman"/>
+          <w:bCs/>
+          <w:sz w:val="24"/>
+          <w:szCs w:val="24"/>
+        </w:rPr>
+        <w:t>Rédige un email destiné à un client dont la commande a</w:t>
+      </w:r>
+      <w:r>
+        <w:rPr>
+          <w:rFonts w:ascii="Times New Roman" w:hAnsi="Times New Roman" w:cs="Times New Roman"/>
+          <w:bCs/>
+          <w:sz w:val="24"/>
+          <w:szCs w:val="24"/>
+        </w:rPr>
+        <w:t xml:space="preserve"> pris du retard.</w:t>
+      </w:r>
+    </w:p>
+    <w:p>
+      <w:pPr>
+        <w:spacing w:line="360" w:lineRule="auto"/>
+        <w:ind w:left="360"/>
+        <w:rPr>
+          <w:rFonts w:ascii="Times New Roman" w:hAnsi="Times New Roman" w:cs="Times New Roman"/>
+          <w:b/>
+          <w:bCs/>
+          <w:sz w:val="24"/>
+          <w:szCs w:val="24"/>
+        </w:rPr>
+      </w:pPr>
+      <w:r>
+        <w:rPr>
+          <w:rFonts w:ascii="Times New Roman" w:hAnsi="Times New Roman" w:cs="Times New Roman"/>
+          <w:b/>
+          <w:bCs/>
+          <w:sz w:val="24"/>
+          <w:szCs w:val="24"/>
+        </w:rPr>
+        <w:t>Contexte :</w:t>
+      </w:r>
+    </w:p>
+    <w:p>
+      <w:pPr>
+        <w:spacing w:line="360" w:lineRule="auto"/>
+        <w:ind w:left="360"/>
+        <w:rPr>
+          <w:rFonts w:ascii="Times New Roman" w:hAnsi="Times New Roman" w:cs="Times New Roman"/>
+          <w:bCs/>
+          <w:sz w:val="24"/>
+          <w:szCs w:val="24"/>
+        </w:rPr>
+      </w:pPr>
+      <w:r>
+        <w:rPr>
+          <w:rFonts w:ascii="Times New Roman" w:hAnsi="Times New Roman" w:cs="Times New Roman"/>
+          <w:bCs/>
+          <w:sz w:val="24"/>
+          <w:szCs w:val="24"/>
+        </w:rPr>
+        <w:t>Numéro de commande : CMD-58291</w:t>
+      </w:r>
+    </w:p>
+    <w:p>
+      <w:pPr>
+        <w:spacing w:line="360" w:lineRule="auto"/>
+        <w:ind w:left="360"/>
+        <w:rPr>
+          <w:rFonts w:ascii="Times New Roman" w:hAnsi="Times New Roman" w:cs="Times New Roman"/>
+          <w:bCs/>
+          <w:sz w:val="24"/>
+          <w:szCs w:val="24"/>
+        </w:rPr>
+      </w:pPr>
+      <w:r>
+        <w:rPr>
+          <w:rFonts w:ascii="Times New Roman" w:hAnsi="Times New Roman" w:cs="Times New Roman"/>
+          <w:bCs/>
+          <w:sz w:val="24"/>
+          <w:szCs w:val="24"/>
+        </w:rPr>
+        <w:t>Client : Amadou Diallo</w:t>
+      </w:r>
+    </w:p>
+    <w:p>
+      <w:pPr>
+        <w:spacing w:line="360" w:lineRule="auto"/>
+        <w:ind w:left="360"/>
+        <w:rPr>
+          <w:rFonts w:ascii="Times New Roman" w:hAnsi="Times New Roman" w:cs="Times New Roman"/>
+          <w:bCs/>
+          <w:sz w:val="24"/>
+          <w:szCs w:val="24"/>
+        </w:rPr>
+      </w:pPr>
+      <w:r>
+        <w:rPr>
+          <w:rFonts w:ascii="Times New Roman" w:hAnsi="Times New Roman" w:cs="Times New Roman"/>
+          <w:bCs/>
+          <w:sz w:val="24"/>
+          <w:szCs w:val="24"/>
+        </w:rPr>
+        <w:lastRenderedPageBreak/>
+        <w:t>Date de commande initiale : 3 mai 2026</w:t>
+      </w:r>
+    </w:p>
+    <w:p>
+      <w:pPr>
+        <w:spacing w:line="360" w:lineRule="auto"/>
+        <w:ind w:left="360"/>
+        <w:rPr>
+          <w:rFonts w:ascii="Times New Roman" w:hAnsi="Times New Roman" w:cs="Times New Roman"/>
+          <w:bCs/>
+          <w:sz w:val="24"/>
+          <w:szCs w:val="24"/>
+        </w:rPr>
+      </w:pPr>
+      <w:r>
+        <w:rPr>
+          <w:rFonts w:ascii="Times New Roman" w:hAnsi="Times New Roman" w:cs="Times New Roman"/>
+          <w:bCs/>
+          <w:sz w:val="24"/>
+          <w:szCs w:val="24"/>
+        </w:rPr>
+        <w:t>Délai initialement annoncé : 5 jours ouvrés</w:t>
+      </w:r>
+    </w:p>
+    <w:p>
+      <w:pPr>
+        <w:spacing w:line="360" w:lineRule="auto"/>
+        <w:ind w:left="360"/>
+        <w:rPr>
+          <w:rFonts w:ascii="Times New Roman" w:hAnsi="Times New Roman" w:cs="Times New Roman"/>
+          <w:bCs/>
+          <w:sz w:val="24"/>
+          <w:szCs w:val="24"/>
+        </w:rPr>
+      </w:pPr>
+      <w:r>
+        <w:rPr>
+          <w:rFonts w:ascii="Times New Roman" w:hAnsi="Times New Roman" w:cs="Times New Roman"/>
+          <w:bCs/>
+          <w:sz w:val="24"/>
+          <w:szCs w:val="24"/>
+        </w:rPr>
+        <w:t>Cause du retard : rupture de stock temporaire chez le fournisseur</w:t>
+      </w:r>
+    </w:p>
+    <w:p>
+      <w:pPr>
+        <w:spacing w:line="360" w:lineRule="auto"/>
+        <w:ind w:left="360"/>
+        <w:rPr>
+          <w:rFonts w:ascii="Times New Roman" w:hAnsi="Times New Roman" w:cs="Times New Roman"/>
+          <w:bCs/>
+          <w:sz w:val="24"/>
+          <w:szCs w:val="24"/>
+        </w:rPr>
+      </w:pPr>
+      <w:r>
+        <w:rPr>
+          <w:rFonts w:ascii="Times New Roman" w:hAnsi="Times New Roman" w:cs="Times New Roman"/>
+          <w:bCs/>
+          <w:sz w:val="24"/>
+          <w:szCs w:val="24"/>
+        </w:rPr>
+        <w:t>Nouveau délai estimé : livraison sous 4 jours supplémentaires</w:t>
+      </w:r>
+    </w:p>
+    <w:p>
+      <w:pPr>
+        <w:spacing w:line="360" w:lineRule="auto"/>
+        <w:ind w:left="360"/>
+        <w:rPr>
+          <w:rFonts w:ascii="Times New Roman" w:hAnsi="Times New Roman" w:cs="Times New Roman"/>
+          <w:bCs/>
+          <w:sz w:val="24"/>
+          <w:szCs w:val="24"/>
+        </w:rPr>
+      </w:pPr>
+      <w:r>
+        <w:rPr>
+          <w:rFonts w:ascii="Times New Roman" w:hAnsi="Times New Roman" w:cs="Times New Roman"/>
+          <w:bCs/>
+          <w:sz w:val="24"/>
+          <w:szCs w:val="24"/>
+        </w:rPr>
+        <w:t>Geste commercial proposé : remise de 10% sur la commande actuelle</w:t>
+      </w:r>
+    </w:p>
+    <w:p>
+      <w:pPr>
+        <w:spacing w:line="360" w:lineRule="auto"/>
+        <w:ind w:left="360"/>
+        <w:rPr>
+          <w:rFonts w:ascii="Times New Roman" w:hAnsi="Times New Roman" w:cs="Times New Roman"/>
+          <w:b/>
+          <w:bCs/>
+          <w:sz w:val="24"/>
+          <w:szCs w:val="24"/>
+        </w:rPr>
+      </w:pPr>
+      <w:r>
+        <w:rPr>
+          <w:rFonts w:ascii="Times New Roman" w:hAnsi="Times New Roman" w:cs="Times New Roman"/>
+          <w:b/>
+          <w:bCs/>
+          <w:sz w:val="24"/>
+          <w:szCs w:val="24"/>
+        </w:rPr>
+        <w:t>Objectifs de l'email :</w:t>
+      </w:r>
+    </w:p>
+    <w:p>
+      <w:pPr>
+        <w:spacing w:line="360" w:lineRule="auto"/>
+        <w:ind w:left="360"/>
+        <w:rPr>
+          <w:rFonts w:ascii="Times New Roman" w:hAnsi="Times New Roman" w:cs="Times New Roman"/>
+          <w:bCs/>
+          <w:sz w:val="24"/>
+          <w:szCs w:val="24"/>
+        </w:rPr>
+      </w:pPr>
+      <w:r>
+        <w:rPr>
+          <w:rFonts w:ascii="Times New Roman" w:hAnsi="Times New Roman" w:cs="Times New Roman"/>
+          <w:bCs/>
+          <w:sz w:val="24"/>
+          <w:szCs w:val="24"/>
+        </w:rPr>
+        <w:t>- Reconnaître explicitement le retard.</w:t>
+      </w:r>
+    </w:p>
+    <w:p>
+      <w:pPr>
+        <w:spacing w:line="360" w:lineRule="auto"/>
+        <w:ind w:left="360"/>
+        <w:rPr>
+          <w:rFonts w:ascii="Times New Roman" w:hAnsi="Times New Roman" w:cs="Times New Roman"/>
+          <w:bCs/>
+          <w:sz w:val="24"/>
+          <w:szCs w:val="24"/>
+        </w:rPr>
+      </w:pPr>
+      <w:r>
+        <w:rPr>
+          <w:rFonts w:ascii="Times New Roman" w:hAnsi="Times New Roman" w:cs="Times New Roman"/>
+          <w:bCs/>
+          <w:sz w:val="24"/>
+          <w:szCs w:val="24"/>
+        </w:rPr>
+        <w:t>- Présenter des excuses sincères.</w:t>
+      </w:r>
+    </w:p>
+    <w:p>
+      <w:pPr>
+        <w:spacing w:line="360" w:lineRule="auto"/>
+        <w:ind w:left="360"/>
+        <w:rPr>
+          <w:rFonts w:ascii="Times New Roman" w:hAnsi="Times New Roman" w:cs="Times New Roman"/>
+          <w:bCs/>
+          <w:sz w:val="24"/>
+          <w:szCs w:val="24"/>
+        </w:rPr>
+      </w:pPr>
+      <w:r>
+        <w:rPr>
+          <w:rFonts w:ascii="Times New Roman" w:hAnsi="Times New Roman" w:cs="Times New Roman"/>
+          <w:bCs/>
+          <w:sz w:val="24"/>
+          <w:szCs w:val="24"/>
+        </w:rPr>
+        <w:t xml:space="preserve">- Expliquer la situation, sans inventer de </w:t>
+      </w:r>
+      <w:r>
+        <w:rPr>
+          <w:rFonts w:ascii="Times New Roman" w:hAnsi="Times New Roman" w:cs="Times New Roman"/>
+          <w:bCs/>
+          <w:sz w:val="24"/>
+          <w:szCs w:val="24"/>
+        </w:rPr>
+        <w:t xml:space="preserve">cause si elle n'est pas connue </w:t>
+      </w:r>
+      <w:r>
+        <w:rPr>
+          <w:rFonts w:ascii="Times New Roman" w:hAnsi="Times New Roman" w:cs="Times New Roman"/>
+          <w:bCs/>
+          <w:sz w:val="24"/>
+          <w:szCs w:val="24"/>
+        </w:rPr>
+        <w:t>(rester général dans ce cas, par exemple "un contretemps logistique").</w:t>
+      </w:r>
+    </w:p>
+    <w:p>
+      <w:pPr>
+        <w:spacing w:line="360" w:lineRule="auto"/>
+        <w:ind w:left="360"/>
+        <w:rPr>
+          <w:rFonts w:ascii="Times New Roman" w:hAnsi="Times New Roman" w:cs="Times New Roman"/>
+          <w:bCs/>
+          <w:sz w:val="24"/>
+          <w:szCs w:val="24"/>
+        </w:rPr>
+      </w:pPr>
+      <w:r>
+        <w:rPr>
+          <w:rFonts w:ascii="Times New Roman" w:hAnsi="Times New Roman" w:cs="Times New Roman"/>
+          <w:bCs/>
+          <w:sz w:val="24"/>
+          <w:szCs w:val="24"/>
+        </w:rPr>
+        <w:t xml:space="preserve">- Proposer une solution </w:t>
+      </w:r>
+      <w:r>
+        <w:rPr>
+          <w:rFonts w:ascii="Times New Roman" w:hAnsi="Times New Roman" w:cs="Times New Roman"/>
+          <w:bCs/>
+          <w:sz w:val="24"/>
+          <w:szCs w:val="24"/>
+        </w:rPr>
+        <w:t>ou un geste commercial concret.</w:t>
+      </w:r>
+    </w:p>
+    <w:p>
+      <w:pPr>
+        <w:spacing w:line="360" w:lineRule="auto"/>
+        <w:ind w:left="360"/>
+        <w:rPr>
+          <w:rFonts w:ascii="Times New Roman" w:hAnsi="Times New Roman" w:cs="Times New Roman"/>
+          <w:b/>
+          <w:bCs/>
+          <w:sz w:val="24"/>
+          <w:szCs w:val="24"/>
+        </w:rPr>
+      </w:pPr>
+      <w:r>
+        <w:rPr>
+          <w:rFonts w:ascii="Times New Roman" w:hAnsi="Times New Roman" w:cs="Times New Roman"/>
+          <w:b/>
+          <w:bCs/>
+          <w:sz w:val="24"/>
+          <w:szCs w:val="24"/>
+        </w:rPr>
+        <w:t>Contraintes :</w:t>
+      </w:r>
+    </w:p>
+    <w:p>
+      <w:pPr>
+        <w:spacing w:line="360" w:lineRule="auto"/>
+        <w:ind w:left="360"/>
+        <w:rPr>
+          <w:rFonts w:ascii="Times New Roman" w:hAnsi="Times New Roman" w:cs="Times New Roman"/>
+          <w:bCs/>
+          <w:sz w:val="24"/>
+          <w:szCs w:val="24"/>
+        </w:rPr>
+      </w:pPr>
+      <w:r>
+        <w:rPr>
+          <w:rFonts w:ascii="Times New Roman" w:hAnsi="Times New Roman" w:cs="Times New Roman"/>
+          <w:bCs/>
+          <w:sz w:val="24"/>
+          <w:szCs w:val="24"/>
+        </w:rPr>
+        <w:t>- Ton : professionnel, courtois et rassurant — éviter tout ton froid ou trop formel.</w:t>
+      </w:r>
+    </w:p>
+    <w:p>
+      <w:pPr>
+        <w:spacing w:line="360" w:lineRule="auto"/>
+        <w:ind w:left="360"/>
+        <w:rPr>
+          <w:rFonts w:ascii="Times New Roman" w:hAnsi="Times New Roman" w:cs="Times New Roman"/>
+          <w:bCs/>
+          <w:sz w:val="24"/>
+          <w:szCs w:val="24"/>
+        </w:rPr>
+      </w:pPr>
+      <w:r>
+        <w:rPr>
+          <w:rFonts w:ascii="Times New Roman" w:hAnsi="Times New Roman" w:cs="Times New Roman"/>
+          <w:bCs/>
+          <w:sz w:val="24"/>
+          <w:szCs w:val="24"/>
+        </w:rPr>
+        <w:t>- Longueur maximale : 150 mots.</w:t>
+      </w:r>
+    </w:p>
+    <w:p>
+      <w:pPr>
+        <w:spacing w:line="360" w:lineRule="auto"/>
+        <w:ind w:left="360"/>
+        <w:rPr>
+          <w:rFonts w:ascii="Times New Roman" w:hAnsi="Times New Roman" w:cs="Times New Roman"/>
+          <w:bCs/>
+          <w:sz w:val="24"/>
+          <w:szCs w:val="24"/>
+        </w:rPr>
+      </w:pPr>
+      <w:r>
+        <w:rPr>
+          <w:rFonts w:ascii="Times New Roman" w:hAnsi="Times New Roman" w:cs="Times New Roman"/>
+          <w:bCs/>
+          <w:sz w:val="24"/>
+          <w:szCs w:val="24"/>
+        </w:rPr>
+        <w:t xml:space="preserve">- Ne pas inventer de détails factuels (numéro de </w:t>
+      </w:r>
+      <w:r>
+        <w:rPr>
+          <w:rFonts w:ascii="Times New Roman" w:hAnsi="Times New Roman" w:cs="Times New Roman"/>
+          <w:bCs/>
+          <w:sz w:val="24"/>
+          <w:szCs w:val="24"/>
+        </w:rPr>
+        <w:t xml:space="preserve">commande, date précise...) qui </w:t>
+      </w:r>
+      <w:r>
+        <w:rPr>
+          <w:rFonts w:ascii="Times New Roman" w:hAnsi="Times New Roman" w:cs="Times New Roman"/>
+          <w:bCs/>
+          <w:sz w:val="24"/>
+          <w:szCs w:val="24"/>
+        </w:rPr>
+        <w:t>ne seraien</w:t>
+      </w:r>
+      <w:r>
+        <w:rPr>
+          <w:rFonts w:ascii="Times New Roman" w:hAnsi="Times New Roman" w:cs="Times New Roman"/>
+          <w:bCs/>
+          <w:sz w:val="24"/>
+          <w:szCs w:val="24"/>
+        </w:rPr>
+        <w:t>t pas fournis dans le contexte.</w:t>
+      </w:r>
+    </w:p>
+    <w:p>
+      <w:pPr>
+        <w:spacing w:line="360" w:lineRule="auto"/>
+        <w:ind w:left="360"/>
+        <w:rPr>
+          <w:rFonts w:ascii="Times New Roman" w:hAnsi="Times New Roman" w:cs="Times New Roman"/>
+          <w:b/>
+          <w:bCs/>
+          <w:sz w:val="24"/>
+          <w:szCs w:val="24"/>
+        </w:rPr>
+      </w:pPr>
+      <w:r>
+        <w:rPr>
+          <w:rFonts w:ascii="Times New Roman" w:hAnsi="Times New Roman" w:cs="Times New Roman"/>
+          <w:b/>
+          <w:bCs/>
+          <w:sz w:val="24"/>
+          <w:szCs w:val="24"/>
+        </w:rPr>
+        <w:t>Format de sortie :</w:t>
+      </w:r>
+    </w:p>
+    <w:p>
+      <w:pPr>
+        <w:spacing w:line="360" w:lineRule="auto"/>
+        <w:ind w:left="360"/>
+        <w:rPr>
+          <w:rFonts w:ascii="Times New Roman" w:hAnsi="Times New Roman" w:cs="Times New Roman"/>
+          <w:bCs/>
+          <w:sz w:val="24"/>
+          <w:szCs w:val="24"/>
+        </w:rPr>
+      </w:pPr>
+      <w:r>
+        <w:rPr>
+          <w:rFonts w:ascii="Times New Roman" w:hAnsi="Times New Roman" w:cs="Times New Roman"/>
+          <w:bCs/>
+          <w:sz w:val="24"/>
+          <w:szCs w:val="24"/>
+        </w:rPr>
+        <w:t>Un email complet avec objet, formule d'introduction, corps du message, et formule de politesse.</w:t>
+      </w:r>
+    </w:p>
+    <w:p>
+      <w:pPr>
+        <w:pStyle w:val="ListParagraph"/>
+        <w:numPr>
+          <w:ilvl w:val="0"/>
+          <w:numId w:val="10"/>
+        </w:numPr>
+        <w:spacing w:line="360" w:lineRule="auto"/>
+        <w:jc w:val="center"/>
+        <w:rPr>
+          <w:rFonts w:ascii="Times New Roman" w:hAnsi="Times New Roman" w:cs="Times New Roman"/>
+          <w:b/>
+          <w:bCs/>
+          <w:sz w:val="24"/>
+          <w:szCs w:val="24"/>
+        </w:rPr>
+      </w:pPr>
+      <w:r>
+        <w:rPr>
+          <w:rFonts w:ascii="Times New Roman" w:hAnsi="Times New Roman" w:cs="Times New Roman"/>
+          <w:b/>
+          <w:bCs/>
+          <w:sz w:val="24"/>
+          <w:szCs w:val="24"/>
+        </w:rPr>
+        <w:lastRenderedPageBreak/>
+        <w:t>Réponse de Claude</w:t>
+      </w:r>
       <w:bookmarkStart w:id="0" w:name="_GoBack"/>
       <w:bookmarkEnd w:id="0"/>
+      <w:r>
+        <w:rPr>
+          <w:rFonts w:ascii="Times New Roman" w:hAnsi="Times New Roman" w:cs="Times New Roman"/>
+          <w:b/>
+          <w:bCs/>
+          <w:sz w:val="24"/>
+          <w:szCs w:val="24"/>
+        </w:rPr>
+        <w:drawing>
+          <wp:inline distT="0" distB="0" distL="0" distR="0" wp14:anchorId="34001F1F" wp14:editId="289EEB20">
+            <wp:extent cx="5760720" cy="3713480"/>
+            <wp:effectExtent l="0" t="0" r="0" b="1270"/>
+            <wp:docPr id="9" name="Picture 9"/>
+            <wp:cNvGraphicFramePr>
+              <a:graphicFrameLocks xmlns:a="http://schemas.openxmlformats.org/drawingml/2006/main" noChangeAspect="1"/>
+            </wp:cNvGraphicFramePr>
+            <a:graphic xmlns:a="http://schemas.openxmlformats.org/drawingml/2006/main">
+              <a:graphicData uri="http://schemas.openxmlformats.org/drawingml/2006/picture">
+                <pic:pic xmlns:pic="http://schemas.openxmlformats.org/drawingml/2006/picture">
+                  <pic:nvPicPr>
+                    <pic:cNvPr id="1" name=""/>
+                    <pic:cNvPicPr/>
+                  </pic:nvPicPr>
+                  <pic:blipFill>
+                    <a:blip r:embed="rId22"/>
+                    <a:stretch>
+                      <a:fillRect/>
+                    </a:stretch>
+                  </pic:blipFill>
+                  <pic:spPr>
+                    <a:xfrm>
+                      <a:off x="0" y="0"/>
+                      <a:ext cx="5760720" cy="3713480"/>
+                    </a:xfrm>
+                    <a:prstGeom prst="rect">
+                      <a:avLst/>
+                    </a:prstGeom>
+                  </pic:spPr>
+                </pic:pic>
+              </a:graphicData>
+            </a:graphic>
+          </wp:inline>
+        </w:drawing>
+      </w:r>
     </w:p>
     <w:sectPr>
       <w:pgSz w:w="11906" w:h="16838"/>
@@ -9572,7 +10321,7 @@
   <w:abstractNum w:abstractNumId="3">
     <w:nsid w:val="40234EF3"/>
     <w:multiLevelType w:val="hybridMultilevel"/>
-    <w:tmpl w:val="8C1EBB54"/>
+    <w:tmpl w:val="6650A6AA"/>
     <w:lvl w:ilvl="0" w:tplc="040C0009">
       <w:start w:val="1"/>
       <w:numFmt w:val="bullet"/>

</xml_diff>

<commit_message>
Partie 6 – Prompt Engineering pour le Machine Learning:Prompt pour proposer des stratégies
</commit_message>
<xml_diff>
--- a/ai-business_assistant/correction_atelier_prompt-engineering.docx
+++ b/ai-business_assistant/correction_atelier_prompt-engineering.docx
@@ -4764,17 +4764,7 @@
           <w:sz w:val="24"/>
           <w:szCs w:val="24"/>
         </w:rPr>
-        <w:t xml:space="preserve">la tonalité du commentaire. </w:t>
-      </w:r>
-      <w:r>
-        <w:rPr>
-          <w:rFonts w:ascii="Times New Roman" w:hAnsi="Times New Roman" w:cs="Times New Roman"/>
-          <w:color w:val="000000"/>
-          <w:kern w:val="0"/>
-          <w:sz w:val="24"/>
-          <w:szCs w:val="24"/>
-        </w:rPr>
-        <w:t>Valeurs autorisées : "positif", "negatif", "neutre".</w:t>
+        <w:t>la tonalité du commentaire. Valeurs autorisées : "positif", "negatif", "neutre".</w:t>
       </w:r>
     </w:p>
     <w:p>
@@ -4822,17 +4812,7 @@
           <w:sz w:val="24"/>
           <w:szCs w:val="24"/>
         </w:rPr>
-        <w:t xml:space="preserve">le thème principal évoqué </w:t>
-      </w:r>
-      <w:r>
-        <w:rPr>
-          <w:rFonts w:ascii="Times New Roman" w:hAnsi="Times New Roman" w:cs="Times New Roman"/>
-          <w:color w:val="000000"/>
-          <w:kern w:val="0"/>
-          <w:sz w:val="24"/>
-          <w:szCs w:val="24"/>
-        </w:rPr>
-        <w:t>(ex : "livrais</w:t>
+        <w:t>le thème principal évoqué (ex : "livrais</w:t>
       </w:r>
       <w:r>
         <w:rPr>
@@ -4890,27 +4870,7 @@
           <w:sz w:val="24"/>
           <w:szCs w:val="24"/>
         </w:rPr>
-        <w:t>le niveau d'urg</w:t>
-      </w:r>
-      <w:r>
-        <w:rPr>
-          <w:rFonts w:ascii="Times New Roman" w:hAnsi="Times New Roman" w:cs="Times New Roman"/>
-          <w:color w:val="000000"/>
-          <w:kern w:val="0"/>
-          <w:sz w:val="24"/>
-          <w:szCs w:val="24"/>
-        </w:rPr>
-        <w:t xml:space="preserve">ence à traiter ce commentaire. </w:t>
-      </w:r>
-      <w:r>
-        <w:rPr>
-          <w:rFonts w:ascii="Times New Roman" w:hAnsi="Times New Roman" w:cs="Times New Roman"/>
-          <w:color w:val="000000"/>
-          <w:kern w:val="0"/>
-          <w:sz w:val="24"/>
-          <w:szCs w:val="24"/>
-        </w:rPr>
-        <w:t>Valeurs autorisées : "faible", "moyenne", "élevée".</w:t>
+        <w:t>le niveau d'urgence à traiter ce commentaire. Valeurs autorisées : "faible", "moyenne", "élevée".</w:t>
       </w:r>
     </w:p>
     <w:p>
@@ -5218,10 +5178,12 @@
         <w:rPr>
           <w:rFonts w:ascii="Times New Roman" w:hAnsi="Times New Roman" w:cs="Times New Roman"/>
           <w:b/>
-          <w:color w:val="000000"/>
-          <w:kern w:val="0"/>
-          <w:sz w:val="24"/>
-          <w:szCs w:val="24"/>
+          <w:noProof/>
+          <w:color w:val="000000"/>
+          <w:kern w:val="0"/>
+          <w:sz w:val="24"/>
+          <w:szCs w:val="24"/>
+          <w:lang w:eastAsia="fr-FR"/>
         </w:rPr>
         <w:drawing>
           <wp:inline distT="0" distB="0" distL="0" distR="0" wp14:anchorId="6F092AB9" wp14:editId="5A8F9D07">
@@ -5324,27 +5286,7 @@
           <w:sz w:val="24"/>
           <w:szCs w:val="24"/>
         </w:rPr>
-        <w:t xml:space="preserve">aucune propriété supplémentaire ; sentiment vaut positif, negatif </w:t>
-      </w:r>
-      <w:r>
-        <w:rPr>
-          <w:rFonts w:ascii="Times New Roman" w:hAnsi="Times New Roman" w:cs="Times New Roman"/>
-          <w:color w:val="000000"/>
-          <w:kern w:val="0"/>
-          <w:sz w:val="24"/>
-          <w:szCs w:val="24"/>
-        </w:rPr>
-        <w:t xml:space="preserve">ou </w:t>
-      </w:r>
-      <w:r>
-        <w:rPr>
-          <w:rFonts w:ascii="Times New Roman" w:hAnsi="Times New Roman" w:cs="Times New Roman"/>
-          <w:color w:val="000000"/>
-          <w:kern w:val="0"/>
-          <w:sz w:val="24"/>
-          <w:szCs w:val="24"/>
-        </w:rPr>
-        <w:t>neutre ; confiance est</w:t>
+        <w:t>aucune propriété supplémentaire ; sentiment vaut positif, negatif ou neutre ; confiance est</w:t>
       </w:r>
       <w:r>
         <w:rPr>
@@ -5962,8 +5904,10 @@
           <w:rFonts w:ascii="Times New Roman" w:hAnsi="Times New Roman" w:cs="Times New Roman"/>
           <w:b/>
           <w:bCs/>
+          <w:noProof/>
           <w:sz w:val="24"/>
           <w:szCs w:val="28"/>
+          <w:lang w:eastAsia="fr-FR"/>
         </w:rPr>
         <w:lastRenderedPageBreak/>
         <w:drawing>
@@ -6578,7 +6522,9 @@
       <w:r>
         <w:rPr>
           <w:rFonts w:ascii="Times New Roman" w:hAnsi="Times New Roman" w:cs="Times New Roman"/>
-          <w:szCs w:val="24"/>
+          <w:noProof/>
+          <w:szCs w:val="24"/>
+          <w:lang w:eastAsia="fr-FR"/>
         </w:rPr>
         <w:drawing>
           <wp:inline distT="0" distB="0" distL="0" distR="0" wp14:anchorId="62ECFA7B" wp14:editId="72B932B9">
@@ -6629,7 +6575,9 @@
       <w:r>
         <w:rPr>
           <w:rFonts w:ascii="Times New Roman" w:hAnsi="Times New Roman" w:cs="Times New Roman"/>
-          <w:szCs w:val="24"/>
+          <w:noProof/>
+          <w:szCs w:val="24"/>
+          <w:lang w:eastAsia="fr-FR"/>
         </w:rPr>
         <w:lastRenderedPageBreak/>
         <w:drawing>
@@ -7068,8 +7016,10 @@
       <w:r>
         <w:rPr>
           <w:rFonts w:ascii="Times New Roman" w:hAnsi="Times New Roman" w:cs="Times New Roman"/>
-          <w:sz w:val="24"/>
-          <w:szCs w:val="24"/>
+          <w:noProof/>
+          <w:sz w:val="24"/>
+          <w:szCs w:val="24"/>
+          <w:lang w:eastAsia="fr-FR"/>
         </w:rPr>
         <w:drawing>
           <wp:inline distT="0" distB="0" distL="0" distR="0" wp14:anchorId="41008AFD" wp14:editId="2378CC93">
@@ -7121,8 +7071,10 @@
       <w:r>
         <w:rPr>
           <w:rFonts w:ascii="Times New Roman" w:hAnsi="Times New Roman" w:cs="Times New Roman"/>
-          <w:sz w:val="24"/>
-          <w:szCs w:val="24"/>
+          <w:noProof/>
+          <w:sz w:val="24"/>
+          <w:szCs w:val="24"/>
+          <w:lang w:eastAsia="fr-FR"/>
         </w:rPr>
         <w:lastRenderedPageBreak/>
         <w:drawing>
@@ -7537,16 +7489,7 @@
           <w:sz w:val="24"/>
           <w:szCs w:val="24"/>
         </w:rPr>
-        <w:t>Titre : Erreur au démarrage de</w:t>
-      </w:r>
-      <w:r>
-        <w:rPr>
-          <w:rFonts w:ascii="Times New Roman" w:hAnsi="Times New Roman" w:cs="Times New Roman"/>
-          <w:b/>
-          <w:sz w:val="24"/>
-          <w:szCs w:val="24"/>
-        </w:rPr>
-        <w:t xml:space="preserve"> l'application de facturation</w:t>
+        <w:t>Titre : Erreur au démarrage de l'application de facturation</w:t>
       </w:r>
     </w:p>
     <w:p>
@@ -7663,15 +7606,7 @@
           <w:b/>
           <w:sz w:val="24"/>
         </w:rPr>
-        <w:t>Ticket 3</w:t>
-      </w:r>
-      <w:r>
-        <w:rPr>
-          <w:rFonts w:ascii="Times New Roman" w:hAnsi="Times New Roman" w:cs="Times New Roman"/>
-          <w:b/>
-          <w:sz w:val="24"/>
-        </w:rPr>
-        <w:t> :</w:t>
+        <w:t>Ticket 3 :</w:t>
       </w:r>
       <w:r>
         <w:rPr>
@@ -7687,16 +7622,7 @@
           <w:sz w:val="24"/>
           <w:szCs w:val="24"/>
         </w:rPr>
-        <w:t>Titre : Impossible d'accéder au</w:t>
-      </w:r>
-      <w:r>
-        <w:rPr>
-          <w:rFonts w:ascii="Times New Roman" w:hAnsi="Times New Roman" w:cs="Times New Roman"/>
-          <w:b/>
-          <w:sz w:val="24"/>
-          <w:szCs w:val="24"/>
-        </w:rPr>
-        <w:t xml:space="preserve"> dossier partagé "Projets 2026"</w:t>
+        <w:t>Titre : Impossible d'accéder au dossier partagé "Projets 2026"</w:t>
       </w:r>
     </w:p>
     <w:p>
@@ -8154,6 +8080,10 @@
         <w:t xml:space="preserve"> </w:t>
       </w:r>
       <w:r>
+        <w:rPr>
+          <w:noProof/>
+          <w:lang w:eastAsia="fr-FR"/>
+        </w:rPr>
         <w:drawing>
           <wp:inline distT="0" distB="0" distL="0" distR="0" wp14:anchorId="0A082BB5" wp14:editId="4E368031">
             <wp:extent cx="5760720" cy="4460240"/>
@@ -8839,16 +8769,7 @@
           <w:sz w:val="24"/>
           <w:szCs w:val="24"/>
         </w:rPr>
-        <w:t>- Le champ "date" doit être a</w:t>
-      </w:r>
-      <w:r>
-        <w:rPr>
-          <w:rFonts w:ascii="Times New Roman" w:hAnsi="Times New Roman" w:cs="Times New Roman"/>
-          <w:bCs/>
-          <w:sz w:val="24"/>
-          <w:szCs w:val="24"/>
-        </w:rPr>
-        <w:t>u format AAAA-MM-JJ.</w:t>
+        <w:t>- Le champ "date" doit être au format AAAA-MM-JJ.</w:t>
       </w:r>
     </w:p>
     <w:p>
@@ -9212,8 +9133,10 @@
           <w:rFonts w:ascii="Times New Roman" w:hAnsi="Times New Roman" w:cs="Times New Roman"/>
           <w:b/>
           <w:bCs/>
-          <w:sz w:val="24"/>
-          <w:szCs w:val="24"/>
+          <w:noProof/>
+          <w:sz w:val="24"/>
+          <w:szCs w:val="24"/>
+          <w:lang w:eastAsia="fr-FR"/>
         </w:rPr>
         <w:drawing>
           <wp:inline distT="0" distB="0" distL="0" distR="0" wp14:anchorId="3D3C9225" wp14:editId="203D8E21">
@@ -9772,16 +9695,7 @@
           <w:sz w:val="24"/>
           <w:szCs w:val="24"/>
         </w:rPr>
-        <w:t xml:space="preserve">- Proposer une solution </w:t>
-      </w:r>
-      <w:r>
-        <w:rPr>
-          <w:rFonts w:ascii="Times New Roman" w:hAnsi="Times New Roman" w:cs="Times New Roman"/>
-          <w:bCs/>
-          <w:sz w:val="24"/>
-          <w:szCs w:val="24"/>
-        </w:rPr>
-        <w:t>ou un geste commercial concret.</w:t>
+        <w:t>- Proposer une solution ou un geste commercial concret.</w:t>
       </w:r>
     </w:p>
     <w:p>
@@ -9885,16 +9799,7 @@
           <w:sz w:val="24"/>
           <w:szCs w:val="24"/>
         </w:rPr>
-        <w:t>ne seraien</w:t>
-      </w:r>
-      <w:r>
-        <w:rPr>
-          <w:rFonts w:ascii="Times New Roman" w:hAnsi="Times New Roman" w:cs="Times New Roman"/>
-          <w:bCs/>
-          <w:sz w:val="24"/>
-          <w:szCs w:val="24"/>
-        </w:rPr>
-        <w:t>t pas fournis dans le contexte.</w:t>
+        <w:t>ne seraient pas fournis dans le contexte.</w:t>
       </w:r>
     </w:p>
     <w:p>
@@ -9969,15 +9874,15 @@
         <w:lastRenderedPageBreak/>
         <w:t>Réponse de Claude</w:t>
       </w:r>
-      <w:bookmarkStart w:id="0" w:name="_GoBack"/>
-      <w:bookmarkEnd w:id="0"/>
-      <w:r>
-        <w:rPr>
-          <w:rFonts w:ascii="Times New Roman" w:hAnsi="Times New Roman" w:cs="Times New Roman"/>
-          <w:b/>
-          <w:bCs/>
-          <w:sz w:val="24"/>
-          <w:szCs w:val="24"/>
+      <w:r>
+        <w:rPr>
+          <w:rFonts w:ascii="Times New Roman" w:hAnsi="Times New Roman" w:cs="Times New Roman"/>
+          <w:b/>
+          <w:bCs/>
+          <w:noProof/>
+          <w:sz w:val="24"/>
+          <w:szCs w:val="24"/>
+          <w:lang w:eastAsia="fr-FR"/>
         </w:rPr>
         <w:drawing>
           <wp:inline distT="0" distB="0" distL="0" distR="0" wp14:anchorId="34001F1F" wp14:editId="289EEB20">
@@ -10016,6 +9921,2280 @@
         </w:drawing>
       </w:r>
     </w:p>
+    <w:p>
+      <w:pPr>
+        <w:pStyle w:val="ListParagraph"/>
+        <w:spacing w:line="360" w:lineRule="auto"/>
+        <w:rPr>
+          <w:rFonts w:ascii="Times New Roman" w:hAnsi="Times New Roman" w:cs="Times New Roman"/>
+          <w:b/>
+          <w:bCs/>
+          <w:sz w:val="24"/>
+          <w:szCs w:val="24"/>
+        </w:rPr>
+      </w:pPr>
+    </w:p>
+    <w:p>
+      <w:pPr>
+        <w:autoSpaceDE w:val="0"/>
+        <w:autoSpaceDN w:val="0"/>
+        <w:adjustRightInd w:val="0"/>
+        <w:spacing w:after="0" w:line="240" w:lineRule="auto"/>
+        <w:rPr>
+          <w:rFonts w:ascii="Times New Roman" w:hAnsi="Times New Roman" w:cs="Times New Roman"/>
+          <w:b/>
+          <w:kern w:val="0"/>
+          <w:sz w:val="28"/>
+          <w:szCs w:val="24"/>
+          <w:lang w:val="en-US"/>
+        </w:rPr>
+      </w:pPr>
+      <w:proofErr w:type="spellStart"/>
+      <w:r>
+        <w:rPr>
+          <w:rFonts w:ascii="Times New Roman" w:hAnsi="Times New Roman" w:cs="Times New Roman"/>
+          <w:b/>
+          <w:kern w:val="0"/>
+          <w:sz w:val="28"/>
+          <w:szCs w:val="24"/>
+          <w:lang w:val="en-US"/>
+        </w:rPr>
+        <w:t>Partie</w:t>
+      </w:r>
+      <w:proofErr w:type="spellEnd"/>
+      <w:r>
+        <w:rPr>
+          <w:rFonts w:ascii="Times New Roman" w:hAnsi="Times New Roman" w:cs="Times New Roman"/>
+          <w:b/>
+          <w:kern w:val="0"/>
+          <w:sz w:val="28"/>
+          <w:szCs w:val="24"/>
+          <w:lang w:val="en-US"/>
+        </w:rPr>
+        <w:t xml:space="preserve"> 6 – Prompt Engineering pour le Machine Learning</w:t>
+      </w:r>
+    </w:p>
+    <w:p>
+      <w:pPr>
+        <w:autoSpaceDE w:val="0"/>
+        <w:autoSpaceDN w:val="0"/>
+        <w:adjustRightInd w:val="0"/>
+        <w:spacing w:after="0" w:line="240" w:lineRule="auto"/>
+        <w:rPr>
+          <w:rFonts w:ascii="Times New Roman" w:hAnsi="Times New Roman" w:cs="Times New Roman"/>
+          <w:color w:val="2E74B6"/>
+          <w:kern w:val="0"/>
+          <w:sz w:val="24"/>
+          <w:szCs w:val="24"/>
+          <w:lang w:val="en-US"/>
+        </w:rPr>
+      </w:pPr>
+    </w:p>
+    <w:p>
+      <w:pPr>
+        <w:pStyle w:val="ListParagraph"/>
+        <w:numPr>
+          <w:ilvl w:val="0"/>
+          <w:numId w:val="14"/>
+        </w:numPr>
+        <w:autoSpaceDE w:val="0"/>
+        <w:autoSpaceDN w:val="0"/>
+        <w:adjustRightInd w:val="0"/>
+        <w:spacing w:after="0" w:line="360" w:lineRule="auto"/>
+        <w:jc w:val="both"/>
+        <w:rPr>
+          <w:rFonts w:ascii="Times New Roman" w:hAnsi="Times New Roman" w:cs="Times New Roman"/>
+          <w:color w:val="000000"/>
+          <w:kern w:val="0"/>
+          <w:sz w:val="24"/>
+          <w:szCs w:val="24"/>
+        </w:rPr>
+      </w:pPr>
+      <w:r>
+        <w:rPr>
+          <w:rFonts w:ascii="Times New Roman" w:hAnsi="Times New Roman" w:cs="Times New Roman"/>
+          <w:color w:val="000000"/>
+          <w:kern w:val="0"/>
+          <w:sz w:val="24"/>
+          <w:szCs w:val="24"/>
+        </w:rPr>
+        <w:t xml:space="preserve">Créer un prompt permettant, à partir du </w:t>
+      </w:r>
+      <w:proofErr w:type="spellStart"/>
+      <w:r>
+        <w:rPr>
+          <w:rFonts w:ascii="Times New Roman" w:hAnsi="Times New Roman" w:cs="Times New Roman"/>
+          <w:color w:val="000000"/>
+          <w:kern w:val="0"/>
+          <w:sz w:val="24"/>
+          <w:szCs w:val="24"/>
+        </w:rPr>
+        <w:t>dataset</w:t>
+      </w:r>
+      <w:proofErr w:type="spellEnd"/>
+      <w:r>
+        <w:rPr>
+          <w:rFonts w:ascii="Times New Roman" w:hAnsi="Times New Roman" w:cs="Times New Roman"/>
+          <w:color w:val="000000"/>
+          <w:kern w:val="0"/>
+          <w:sz w:val="24"/>
+          <w:szCs w:val="24"/>
+        </w:rPr>
+        <w:t xml:space="preserve"> des capteurs, de proposer des stratégies</w:t>
+      </w:r>
+      <w:r>
+        <w:rPr>
+          <w:rFonts w:ascii="Times New Roman" w:hAnsi="Times New Roman" w:cs="Times New Roman"/>
+          <w:color w:val="000000"/>
+          <w:kern w:val="0"/>
+          <w:sz w:val="24"/>
+          <w:szCs w:val="24"/>
+        </w:rPr>
+        <w:t xml:space="preserve"> </w:t>
+      </w:r>
+      <w:r>
+        <w:rPr>
+          <w:rFonts w:ascii="Times New Roman" w:hAnsi="Times New Roman" w:cs="Times New Roman"/>
+          <w:color w:val="000000"/>
+          <w:kern w:val="0"/>
+          <w:sz w:val="24"/>
+          <w:szCs w:val="24"/>
+        </w:rPr>
+        <w:t>(détection, traitement, risques associés) de traitement des valeurs manquantes, des</w:t>
+      </w:r>
+      <w:r>
+        <w:rPr>
+          <w:rFonts w:ascii="Times New Roman" w:hAnsi="Times New Roman" w:cs="Times New Roman"/>
+          <w:color w:val="000000"/>
+          <w:kern w:val="0"/>
+          <w:sz w:val="24"/>
+          <w:szCs w:val="24"/>
+        </w:rPr>
+        <w:t xml:space="preserve"> </w:t>
+      </w:r>
+      <w:r>
+        <w:rPr>
+          <w:rFonts w:ascii="Times New Roman" w:hAnsi="Times New Roman" w:cs="Times New Roman"/>
+          <w:color w:val="000000"/>
+          <w:kern w:val="0"/>
+          <w:sz w:val="24"/>
+          <w:szCs w:val="24"/>
+        </w:rPr>
+        <w:t>doublons, des valeurs aberrantes, des variables catégorielles</w:t>
+      </w:r>
+    </w:p>
+    <w:p>
+      <w:pPr>
+        <w:pStyle w:val="ListParagraph"/>
+        <w:numPr>
+          <w:ilvl w:val="0"/>
+          <w:numId w:val="10"/>
+        </w:numPr>
+        <w:autoSpaceDE w:val="0"/>
+        <w:autoSpaceDN w:val="0"/>
+        <w:adjustRightInd w:val="0"/>
+        <w:spacing w:after="0" w:line="360" w:lineRule="auto"/>
+        <w:jc w:val="center"/>
+        <w:rPr>
+          <w:rFonts w:ascii="Times New Roman" w:hAnsi="Times New Roman" w:cs="Times New Roman"/>
+          <w:color w:val="000000"/>
+          <w:kern w:val="0"/>
+          <w:sz w:val="24"/>
+          <w:szCs w:val="24"/>
+        </w:rPr>
+      </w:pPr>
+      <w:r>
+        <w:rPr>
+          <w:rFonts w:ascii="Times New Roman" w:hAnsi="Times New Roman" w:cs="Times New Roman"/>
+          <w:b/>
+          <w:color w:val="000000"/>
+          <w:kern w:val="0"/>
+          <w:sz w:val="24"/>
+          <w:szCs w:val="24"/>
+        </w:rPr>
+        <w:t>Prompt proposé</w:t>
+      </w:r>
+    </w:p>
+    <w:p>
+      <w:pPr>
+        <w:autoSpaceDE w:val="0"/>
+        <w:autoSpaceDN w:val="0"/>
+        <w:adjustRightInd w:val="0"/>
+        <w:spacing w:after="0" w:line="360" w:lineRule="auto"/>
+        <w:jc w:val="both"/>
+        <w:rPr>
+          <w:rFonts w:ascii="Times New Roman" w:hAnsi="Times New Roman" w:cs="Times New Roman"/>
+          <w:b/>
+          <w:color w:val="000000"/>
+          <w:kern w:val="0"/>
+          <w:sz w:val="24"/>
+          <w:szCs w:val="24"/>
+        </w:rPr>
+      </w:pPr>
+      <w:r>
+        <w:rPr>
+          <w:rFonts w:ascii="Times New Roman" w:hAnsi="Times New Roman" w:cs="Times New Roman"/>
+          <w:b/>
+          <w:color w:val="000000"/>
+          <w:kern w:val="0"/>
+          <w:sz w:val="24"/>
+          <w:szCs w:val="24"/>
+        </w:rPr>
+        <w:t>Rôle :</w:t>
+      </w:r>
+    </w:p>
+    <w:p>
+      <w:pPr>
+        <w:autoSpaceDE w:val="0"/>
+        <w:autoSpaceDN w:val="0"/>
+        <w:adjustRightInd w:val="0"/>
+        <w:spacing w:after="0" w:line="360" w:lineRule="auto"/>
+        <w:jc w:val="both"/>
+        <w:rPr>
+          <w:rFonts w:ascii="Times New Roman" w:hAnsi="Times New Roman" w:cs="Times New Roman"/>
+          <w:color w:val="000000"/>
+          <w:kern w:val="0"/>
+          <w:sz w:val="24"/>
+          <w:szCs w:val="24"/>
+        </w:rPr>
+      </w:pPr>
+      <w:r>
+        <w:rPr>
+          <w:rFonts w:ascii="Times New Roman" w:hAnsi="Times New Roman" w:cs="Times New Roman"/>
+          <w:color w:val="000000"/>
+          <w:kern w:val="0"/>
+          <w:sz w:val="24"/>
+          <w:szCs w:val="24"/>
+        </w:rPr>
+        <w:t xml:space="preserve">Tu es un data </w:t>
+      </w:r>
+      <w:proofErr w:type="spellStart"/>
+      <w:r>
+        <w:rPr>
+          <w:rFonts w:ascii="Times New Roman" w:hAnsi="Times New Roman" w:cs="Times New Roman"/>
+          <w:color w:val="000000"/>
+          <w:kern w:val="0"/>
+          <w:sz w:val="24"/>
+          <w:szCs w:val="24"/>
+        </w:rPr>
+        <w:t>scientist</w:t>
+      </w:r>
+      <w:proofErr w:type="spellEnd"/>
+      <w:r>
+        <w:rPr>
+          <w:rFonts w:ascii="Times New Roman" w:hAnsi="Times New Roman" w:cs="Times New Roman"/>
+          <w:color w:val="000000"/>
+          <w:kern w:val="0"/>
+          <w:sz w:val="24"/>
+          <w:szCs w:val="24"/>
+        </w:rPr>
+        <w:t xml:space="preserve"> spécialisé en préparation de données pour d</w:t>
+      </w:r>
+      <w:r>
+        <w:rPr>
+          <w:rFonts w:ascii="Times New Roman" w:hAnsi="Times New Roman" w:cs="Times New Roman"/>
+          <w:color w:val="000000"/>
+          <w:kern w:val="0"/>
+          <w:sz w:val="24"/>
+          <w:szCs w:val="24"/>
+        </w:rPr>
+        <w:t>es projets de Machine Learning.</w:t>
+      </w:r>
+    </w:p>
+    <w:p>
+      <w:pPr>
+        <w:autoSpaceDE w:val="0"/>
+        <w:autoSpaceDN w:val="0"/>
+        <w:adjustRightInd w:val="0"/>
+        <w:spacing w:after="0" w:line="360" w:lineRule="auto"/>
+        <w:jc w:val="both"/>
+        <w:rPr>
+          <w:rFonts w:ascii="Times New Roman" w:hAnsi="Times New Roman" w:cs="Times New Roman"/>
+          <w:b/>
+          <w:color w:val="000000"/>
+          <w:kern w:val="0"/>
+          <w:sz w:val="24"/>
+          <w:szCs w:val="24"/>
+        </w:rPr>
+      </w:pPr>
+      <w:r>
+        <w:rPr>
+          <w:rFonts w:ascii="Times New Roman" w:hAnsi="Times New Roman" w:cs="Times New Roman"/>
+          <w:b/>
+          <w:color w:val="000000"/>
+          <w:kern w:val="0"/>
+          <w:sz w:val="24"/>
+          <w:szCs w:val="24"/>
+        </w:rPr>
+        <w:t>Contexte :</w:t>
+      </w:r>
+    </w:p>
+    <w:p>
+      <w:pPr>
+        <w:autoSpaceDE w:val="0"/>
+        <w:autoSpaceDN w:val="0"/>
+        <w:adjustRightInd w:val="0"/>
+        <w:spacing w:after="0" w:line="360" w:lineRule="auto"/>
+        <w:jc w:val="both"/>
+        <w:rPr>
+          <w:rFonts w:ascii="Times New Roman" w:hAnsi="Times New Roman" w:cs="Times New Roman"/>
+          <w:color w:val="000000"/>
+          <w:kern w:val="0"/>
+          <w:sz w:val="24"/>
+          <w:szCs w:val="24"/>
+        </w:rPr>
+      </w:pPr>
+      <w:r>
+        <w:rPr>
+          <w:rFonts w:ascii="Times New Roman" w:hAnsi="Times New Roman" w:cs="Times New Roman"/>
+          <w:color w:val="000000"/>
+          <w:kern w:val="0"/>
+          <w:sz w:val="24"/>
+          <w:szCs w:val="24"/>
+        </w:rPr>
+        <w:t xml:space="preserve">Je dispose d'un </w:t>
+      </w:r>
+      <w:proofErr w:type="spellStart"/>
+      <w:r>
+        <w:rPr>
+          <w:rFonts w:ascii="Times New Roman" w:hAnsi="Times New Roman" w:cs="Times New Roman"/>
+          <w:color w:val="000000"/>
+          <w:kern w:val="0"/>
+          <w:sz w:val="24"/>
+          <w:szCs w:val="24"/>
+        </w:rPr>
+        <w:t>dataset</w:t>
+      </w:r>
+      <w:proofErr w:type="spellEnd"/>
+      <w:r>
+        <w:rPr>
+          <w:rFonts w:ascii="Times New Roman" w:hAnsi="Times New Roman" w:cs="Times New Roman"/>
+          <w:color w:val="000000"/>
+          <w:kern w:val="0"/>
+          <w:sz w:val="24"/>
+          <w:szCs w:val="24"/>
+        </w:rPr>
+        <w:t xml:space="preserve"> de mesures de capteurs insta</w:t>
+      </w:r>
+      <w:r>
+        <w:rPr>
+          <w:rFonts w:ascii="Times New Roman" w:hAnsi="Times New Roman" w:cs="Times New Roman"/>
+          <w:color w:val="000000"/>
+          <w:kern w:val="0"/>
+          <w:sz w:val="24"/>
+          <w:szCs w:val="24"/>
+        </w:rPr>
+        <w:t xml:space="preserve">llés dans plusieurs bâtiments, </w:t>
+      </w:r>
+      <w:r>
+        <w:rPr>
+          <w:rFonts w:ascii="Times New Roman" w:hAnsi="Times New Roman" w:cs="Times New Roman"/>
+          <w:color w:val="000000"/>
+          <w:kern w:val="0"/>
+          <w:sz w:val="24"/>
+          <w:szCs w:val="24"/>
+        </w:rPr>
+        <w:t>avec les colonnes suivantes :</w:t>
+      </w:r>
+    </w:p>
+    <w:p>
+      <w:pPr>
+        <w:autoSpaceDE w:val="0"/>
+        <w:autoSpaceDN w:val="0"/>
+        <w:adjustRightInd w:val="0"/>
+        <w:spacing w:after="0" w:line="360" w:lineRule="auto"/>
+        <w:jc w:val="both"/>
+        <w:rPr>
+          <w:rFonts w:ascii="Times New Roman" w:hAnsi="Times New Roman" w:cs="Times New Roman"/>
+          <w:color w:val="000000"/>
+          <w:kern w:val="0"/>
+          <w:sz w:val="24"/>
+          <w:szCs w:val="24"/>
+        </w:rPr>
+      </w:pPr>
+      <w:r>
+        <w:rPr>
+          <w:rFonts w:ascii="Times New Roman" w:hAnsi="Times New Roman" w:cs="Times New Roman"/>
+          <w:color w:val="000000"/>
+          <w:kern w:val="0"/>
+          <w:sz w:val="24"/>
+          <w:szCs w:val="24"/>
+        </w:rPr>
+        <w:t xml:space="preserve">- </w:t>
+      </w:r>
+      <w:proofErr w:type="spellStart"/>
+      <w:r>
+        <w:rPr>
+          <w:rFonts w:ascii="Times New Roman" w:hAnsi="Times New Roman" w:cs="Times New Roman"/>
+          <w:color w:val="000000"/>
+          <w:kern w:val="0"/>
+          <w:sz w:val="24"/>
+          <w:szCs w:val="24"/>
+        </w:rPr>
+        <w:t>id_mesure</w:t>
+      </w:r>
+      <w:proofErr w:type="spellEnd"/>
+      <w:r>
+        <w:rPr>
+          <w:rFonts w:ascii="Times New Roman" w:hAnsi="Times New Roman" w:cs="Times New Roman"/>
+          <w:color w:val="000000"/>
+          <w:kern w:val="0"/>
+          <w:sz w:val="24"/>
+          <w:szCs w:val="24"/>
+        </w:rPr>
+        <w:t xml:space="preserve"> (identifiant unique de la mesure)</w:t>
+      </w:r>
+    </w:p>
+    <w:p>
+      <w:pPr>
+        <w:autoSpaceDE w:val="0"/>
+        <w:autoSpaceDN w:val="0"/>
+        <w:adjustRightInd w:val="0"/>
+        <w:spacing w:after="0" w:line="360" w:lineRule="auto"/>
+        <w:jc w:val="both"/>
+        <w:rPr>
+          <w:rFonts w:ascii="Times New Roman" w:hAnsi="Times New Roman" w:cs="Times New Roman"/>
+          <w:color w:val="000000"/>
+          <w:kern w:val="0"/>
+          <w:sz w:val="24"/>
+          <w:szCs w:val="24"/>
+        </w:rPr>
+      </w:pPr>
+      <w:r>
+        <w:rPr>
+          <w:rFonts w:ascii="Times New Roman" w:hAnsi="Times New Roman" w:cs="Times New Roman"/>
+          <w:color w:val="000000"/>
+          <w:kern w:val="0"/>
+          <w:sz w:val="24"/>
+          <w:szCs w:val="24"/>
+        </w:rPr>
+        <w:t xml:space="preserve">- </w:t>
+      </w:r>
+      <w:proofErr w:type="spellStart"/>
+      <w:r>
+        <w:rPr>
+          <w:rFonts w:ascii="Times New Roman" w:hAnsi="Times New Roman" w:cs="Times New Roman"/>
+          <w:color w:val="000000"/>
+          <w:kern w:val="0"/>
+          <w:sz w:val="24"/>
+          <w:szCs w:val="24"/>
+        </w:rPr>
+        <w:t>date_heure</w:t>
+      </w:r>
+      <w:proofErr w:type="spellEnd"/>
+      <w:r>
+        <w:rPr>
+          <w:rFonts w:ascii="Times New Roman" w:hAnsi="Times New Roman" w:cs="Times New Roman"/>
+          <w:color w:val="000000"/>
+          <w:kern w:val="0"/>
+          <w:sz w:val="24"/>
+          <w:szCs w:val="24"/>
+        </w:rPr>
+        <w:t xml:space="preserve"> (horodatage de la mesure)</w:t>
+      </w:r>
+    </w:p>
+    <w:p>
+      <w:pPr>
+        <w:autoSpaceDE w:val="0"/>
+        <w:autoSpaceDN w:val="0"/>
+        <w:adjustRightInd w:val="0"/>
+        <w:spacing w:after="0" w:line="360" w:lineRule="auto"/>
+        <w:jc w:val="both"/>
+        <w:rPr>
+          <w:rFonts w:ascii="Times New Roman" w:hAnsi="Times New Roman" w:cs="Times New Roman"/>
+          <w:color w:val="000000"/>
+          <w:kern w:val="0"/>
+          <w:sz w:val="24"/>
+          <w:szCs w:val="24"/>
+        </w:rPr>
+      </w:pPr>
+      <w:r>
+        <w:rPr>
+          <w:rFonts w:ascii="Times New Roman" w:hAnsi="Times New Roman" w:cs="Times New Roman"/>
+          <w:color w:val="000000"/>
+          <w:kern w:val="0"/>
+          <w:sz w:val="24"/>
+          <w:szCs w:val="24"/>
+        </w:rPr>
+        <w:t xml:space="preserve">- </w:t>
+      </w:r>
+      <w:proofErr w:type="spellStart"/>
+      <w:r>
+        <w:rPr>
+          <w:rFonts w:ascii="Times New Roman" w:hAnsi="Times New Roman" w:cs="Times New Roman"/>
+          <w:color w:val="000000"/>
+          <w:kern w:val="0"/>
+          <w:sz w:val="24"/>
+          <w:szCs w:val="24"/>
+        </w:rPr>
+        <w:t>id_capteur</w:t>
+      </w:r>
+      <w:proofErr w:type="spellEnd"/>
+      <w:r>
+        <w:rPr>
+          <w:rFonts w:ascii="Times New Roman" w:hAnsi="Times New Roman" w:cs="Times New Roman"/>
+          <w:color w:val="000000"/>
+          <w:kern w:val="0"/>
+          <w:sz w:val="24"/>
+          <w:szCs w:val="24"/>
+        </w:rPr>
+        <w:t xml:space="preserve"> (12 capteurs différents, ex : C001 à C012)</w:t>
+      </w:r>
+    </w:p>
+    <w:p>
+      <w:pPr>
+        <w:autoSpaceDE w:val="0"/>
+        <w:autoSpaceDN w:val="0"/>
+        <w:adjustRightInd w:val="0"/>
+        <w:spacing w:after="0" w:line="360" w:lineRule="auto"/>
+        <w:jc w:val="both"/>
+        <w:rPr>
+          <w:rFonts w:ascii="Times New Roman" w:hAnsi="Times New Roman" w:cs="Times New Roman"/>
+          <w:color w:val="000000"/>
+          <w:kern w:val="0"/>
+          <w:sz w:val="24"/>
+          <w:szCs w:val="24"/>
+        </w:rPr>
+      </w:pPr>
+      <w:r>
+        <w:rPr>
+          <w:rFonts w:ascii="Times New Roman" w:hAnsi="Times New Roman" w:cs="Times New Roman"/>
+          <w:color w:val="000000"/>
+          <w:kern w:val="0"/>
+          <w:sz w:val="24"/>
+          <w:szCs w:val="24"/>
+        </w:rPr>
+        <w:t xml:space="preserve">- </w:t>
+      </w:r>
+      <w:proofErr w:type="spellStart"/>
+      <w:r>
+        <w:rPr>
+          <w:rFonts w:ascii="Times New Roman" w:hAnsi="Times New Roman" w:cs="Times New Roman"/>
+          <w:color w:val="000000"/>
+          <w:kern w:val="0"/>
+          <w:sz w:val="24"/>
+          <w:szCs w:val="24"/>
+        </w:rPr>
+        <w:t>batiment</w:t>
+      </w:r>
+      <w:proofErr w:type="spellEnd"/>
+      <w:r>
+        <w:rPr>
+          <w:rFonts w:ascii="Times New Roman" w:hAnsi="Times New Roman" w:cs="Times New Roman"/>
+          <w:color w:val="000000"/>
+          <w:kern w:val="0"/>
+          <w:sz w:val="24"/>
+          <w:szCs w:val="24"/>
+        </w:rPr>
+        <w:t xml:space="preserve"> (4 bâtiments, ex : B001 à B004)</w:t>
+      </w:r>
+    </w:p>
+    <w:p>
+      <w:pPr>
+        <w:autoSpaceDE w:val="0"/>
+        <w:autoSpaceDN w:val="0"/>
+        <w:adjustRightInd w:val="0"/>
+        <w:spacing w:after="0" w:line="360" w:lineRule="auto"/>
+        <w:jc w:val="both"/>
+        <w:rPr>
+          <w:rFonts w:ascii="Times New Roman" w:hAnsi="Times New Roman" w:cs="Times New Roman"/>
+          <w:color w:val="000000"/>
+          <w:kern w:val="0"/>
+          <w:sz w:val="24"/>
+          <w:szCs w:val="24"/>
+        </w:rPr>
+      </w:pPr>
+      <w:r>
+        <w:rPr>
+          <w:rFonts w:ascii="Times New Roman" w:hAnsi="Times New Roman" w:cs="Times New Roman"/>
+          <w:color w:val="000000"/>
+          <w:kern w:val="0"/>
+          <w:sz w:val="24"/>
+          <w:szCs w:val="24"/>
+        </w:rPr>
+        <w:t xml:space="preserve">- </w:t>
+      </w:r>
+      <w:proofErr w:type="spellStart"/>
+      <w:r>
+        <w:rPr>
+          <w:rFonts w:ascii="Times New Roman" w:hAnsi="Times New Roman" w:cs="Times New Roman"/>
+          <w:color w:val="000000"/>
+          <w:kern w:val="0"/>
+          <w:sz w:val="24"/>
+          <w:szCs w:val="24"/>
+        </w:rPr>
+        <w:t>temperature</w:t>
+      </w:r>
+      <w:proofErr w:type="spellEnd"/>
+      <w:r>
+        <w:rPr>
+          <w:rFonts w:ascii="Times New Roman" w:hAnsi="Times New Roman" w:cs="Times New Roman"/>
+          <w:color w:val="000000"/>
+          <w:kern w:val="0"/>
+          <w:sz w:val="24"/>
+          <w:szCs w:val="24"/>
+        </w:rPr>
+        <w:t xml:space="preserve"> (en °C, valeurs observées entre -18.5 et 58.7)</w:t>
+      </w:r>
+    </w:p>
+    <w:p>
+      <w:pPr>
+        <w:autoSpaceDE w:val="0"/>
+        <w:autoSpaceDN w:val="0"/>
+        <w:adjustRightInd w:val="0"/>
+        <w:spacing w:after="0" w:line="360" w:lineRule="auto"/>
+        <w:jc w:val="both"/>
+        <w:rPr>
+          <w:rFonts w:ascii="Times New Roman" w:hAnsi="Times New Roman" w:cs="Times New Roman"/>
+          <w:color w:val="000000"/>
+          <w:kern w:val="0"/>
+          <w:sz w:val="24"/>
+          <w:szCs w:val="24"/>
+        </w:rPr>
+      </w:pPr>
+      <w:r>
+        <w:rPr>
+          <w:rFonts w:ascii="Times New Roman" w:hAnsi="Times New Roman" w:cs="Times New Roman"/>
+          <w:color w:val="000000"/>
+          <w:kern w:val="0"/>
+          <w:sz w:val="24"/>
+          <w:szCs w:val="24"/>
+        </w:rPr>
+        <w:lastRenderedPageBreak/>
+        <w:t xml:space="preserve">- </w:t>
+      </w:r>
+      <w:proofErr w:type="spellStart"/>
+      <w:r>
+        <w:rPr>
+          <w:rFonts w:ascii="Times New Roman" w:hAnsi="Times New Roman" w:cs="Times New Roman"/>
+          <w:color w:val="000000"/>
+          <w:kern w:val="0"/>
+          <w:sz w:val="24"/>
+          <w:szCs w:val="24"/>
+        </w:rPr>
+        <w:t>humidite</w:t>
+      </w:r>
+      <w:proofErr w:type="spellEnd"/>
+      <w:r>
+        <w:rPr>
+          <w:rFonts w:ascii="Times New Roman" w:hAnsi="Times New Roman" w:cs="Times New Roman"/>
+          <w:color w:val="000000"/>
+          <w:kern w:val="0"/>
+          <w:sz w:val="24"/>
+          <w:szCs w:val="24"/>
+        </w:rPr>
+        <w:t xml:space="preserve"> (en %, valeurs observées jusqu'à 145)</w:t>
+      </w:r>
+    </w:p>
+    <w:p>
+      <w:pPr>
+        <w:autoSpaceDE w:val="0"/>
+        <w:autoSpaceDN w:val="0"/>
+        <w:adjustRightInd w:val="0"/>
+        <w:spacing w:after="0" w:line="360" w:lineRule="auto"/>
+        <w:jc w:val="both"/>
+        <w:rPr>
+          <w:rFonts w:ascii="Times New Roman" w:hAnsi="Times New Roman" w:cs="Times New Roman"/>
+          <w:color w:val="000000"/>
+          <w:kern w:val="0"/>
+          <w:sz w:val="24"/>
+          <w:szCs w:val="24"/>
+        </w:rPr>
+      </w:pPr>
+      <w:r>
+        <w:rPr>
+          <w:rFonts w:ascii="Times New Roman" w:hAnsi="Times New Roman" w:cs="Times New Roman"/>
+          <w:color w:val="000000"/>
+          <w:kern w:val="0"/>
+          <w:sz w:val="24"/>
+          <w:szCs w:val="24"/>
+        </w:rPr>
+        <w:t xml:space="preserve">- pression (en </w:t>
+      </w:r>
+      <w:proofErr w:type="spellStart"/>
+      <w:r>
+        <w:rPr>
+          <w:rFonts w:ascii="Times New Roman" w:hAnsi="Times New Roman" w:cs="Times New Roman"/>
+          <w:color w:val="000000"/>
+          <w:kern w:val="0"/>
+          <w:sz w:val="24"/>
+          <w:szCs w:val="24"/>
+        </w:rPr>
+        <w:t>hPa</w:t>
+      </w:r>
+      <w:proofErr w:type="spellEnd"/>
+      <w:r>
+        <w:rPr>
+          <w:rFonts w:ascii="Times New Roman" w:hAnsi="Times New Roman" w:cs="Times New Roman"/>
+          <w:color w:val="000000"/>
+          <w:kern w:val="0"/>
+          <w:sz w:val="24"/>
+          <w:szCs w:val="24"/>
+        </w:rPr>
+        <w:t>)</w:t>
+      </w:r>
+    </w:p>
+    <w:p>
+      <w:pPr>
+        <w:autoSpaceDE w:val="0"/>
+        <w:autoSpaceDN w:val="0"/>
+        <w:adjustRightInd w:val="0"/>
+        <w:spacing w:after="0" w:line="360" w:lineRule="auto"/>
+        <w:jc w:val="both"/>
+        <w:rPr>
+          <w:rFonts w:ascii="Times New Roman" w:hAnsi="Times New Roman" w:cs="Times New Roman"/>
+          <w:color w:val="000000"/>
+          <w:kern w:val="0"/>
+          <w:sz w:val="24"/>
+          <w:szCs w:val="24"/>
+        </w:rPr>
+      </w:pPr>
+      <w:r>
+        <w:rPr>
+          <w:rFonts w:ascii="Times New Roman" w:hAnsi="Times New Roman" w:cs="Times New Roman"/>
+          <w:color w:val="000000"/>
+          <w:kern w:val="0"/>
+          <w:sz w:val="24"/>
+          <w:szCs w:val="24"/>
+        </w:rPr>
+        <w:t>- consommation (en kWh, valeurs observées entre 18 et 875, moyenne autour de 208)</w:t>
+      </w:r>
+    </w:p>
+    <w:p>
+      <w:pPr>
+        <w:autoSpaceDE w:val="0"/>
+        <w:autoSpaceDN w:val="0"/>
+        <w:adjustRightInd w:val="0"/>
+        <w:spacing w:after="0" w:line="360" w:lineRule="auto"/>
+        <w:jc w:val="both"/>
+        <w:rPr>
+          <w:rFonts w:ascii="Times New Roman" w:hAnsi="Times New Roman" w:cs="Times New Roman"/>
+          <w:color w:val="000000"/>
+          <w:kern w:val="0"/>
+          <w:sz w:val="24"/>
+          <w:szCs w:val="24"/>
+        </w:rPr>
+      </w:pPr>
+      <w:r>
+        <w:rPr>
+          <w:rFonts w:ascii="Times New Roman" w:hAnsi="Times New Roman" w:cs="Times New Roman"/>
+          <w:color w:val="000000"/>
+          <w:kern w:val="0"/>
+          <w:sz w:val="24"/>
+          <w:szCs w:val="24"/>
+        </w:rPr>
+        <w:t xml:space="preserve">- </w:t>
+      </w:r>
+      <w:proofErr w:type="spellStart"/>
+      <w:r>
+        <w:rPr>
+          <w:rFonts w:ascii="Times New Roman" w:hAnsi="Times New Roman" w:cs="Times New Roman"/>
+          <w:color w:val="000000"/>
+          <w:kern w:val="0"/>
+          <w:sz w:val="24"/>
+          <w:szCs w:val="24"/>
+        </w:rPr>
+        <w:t>etat</w:t>
+      </w:r>
+      <w:proofErr w:type="spellEnd"/>
+      <w:r>
+        <w:rPr>
+          <w:rFonts w:ascii="Times New Roman" w:hAnsi="Times New Roman" w:cs="Times New Roman"/>
+          <w:color w:val="000000"/>
+          <w:kern w:val="0"/>
+          <w:sz w:val="24"/>
+          <w:szCs w:val="24"/>
+        </w:rPr>
+        <w:t xml:space="preserve"> (variable catégorielle : O</w:t>
+      </w:r>
+      <w:r>
+        <w:rPr>
+          <w:rFonts w:ascii="Times New Roman" w:hAnsi="Times New Roman" w:cs="Times New Roman"/>
+          <w:color w:val="000000"/>
+          <w:kern w:val="0"/>
+          <w:sz w:val="24"/>
+          <w:szCs w:val="24"/>
+        </w:rPr>
+        <w:t>K, ALERTE, ERREUR)</w:t>
+      </w:r>
+    </w:p>
+    <w:p>
+      <w:pPr>
+        <w:autoSpaceDE w:val="0"/>
+        <w:autoSpaceDN w:val="0"/>
+        <w:adjustRightInd w:val="0"/>
+        <w:spacing w:after="0" w:line="360" w:lineRule="auto"/>
+        <w:jc w:val="both"/>
+        <w:rPr>
+          <w:rFonts w:ascii="Times New Roman" w:hAnsi="Times New Roman" w:cs="Times New Roman"/>
+          <w:color w:val="000000"/>
+          <w:kern w:val="0"/>
+          <w:sz w:val="24"/>
+          <w:szCs w:val="24"/>
+        </w:rPr>
+      </w:pPr>
+      <w:r>
+        <w:rPr>
+          <w:rFonts w:ascii="Times New Roman" w:hAnsi="Times New Roman" w:cs="Times New Roman"/>
+          <w:color w:val="000000"/>
+          <w:kern w:val="0"/>
+          <w:sz w:val="24"/>
+          <w:szCs w:val="24"/>
+        </w:rPr>
+        <w:t xml:space="preserve">Le </w:t>
+      </w:r>
+      <w:proofErr w:type="spellStart"/>
+      <w:r>
+        <w:rPr>
+          <w:rFonts w:ascii="Times New Roman" w:hAnsi="Times New Roman" w:cs="Times New Roman"/>
+          <w:color w:val="000000"/>
+          <w:kern w:val="0"/>
+          <w:sz w:val="24"/>
+          <w:szCs w:val="24"/>
+        </w:rPr>
+        <w:t>dataset</w:t>
+      </w:r>
+      <w:proofErr w:type="spellEnd"/>
+      <w:r>
+        <w:rPr>
+          <w:rFonts w:ascii="Times New Roman" w:hAnsi="Times New Roman" w:cs="Times New Roman"/>
+          <w:color w:val="000000"/>
+          <w:kern w:val="0"/>
+          <w:sz w:val="24"/>
+          <w:szCs w:val="24"/>
+        </w:rPr>
+        <w:t xml:space="preserve"> contient 605 lignes. Une première exploration a révélé :</w:t>
+      </w:r>
+    </w:p>
+    <w:p>
+      <w:pPr>
+        <w:autoSpaceDE w:val="0"/>
+        <w:autoSpaceDN w:val="0"/>
+        <w:adjustRightInd w:val="0"/>
+        <w:spacing w:after="0" w:line="360" w:lineRule="auto"/>
+        <w:jc w:val="both"/>
+        <w:rPr>
+          <w:rFonts w:ascii="Times New Roman" w:hAnsi="Times New Roman" w:cs="Times New Roman"/>
+          <w:color w:val="000000"/>
+          <w:kern w:val="0"/>
+          <w:sz w:val="24"/>
+          <w:szCs w:val="24"/>
+        </w:rPr>
+      </w:pPr>
+      <w:r>
+        <w:rPr>
+          <w:rFonts w:ascii="Times New Roman" w:hAnsi="Times New Roman" w:cs="Times New Roman"/>
+          <w:color w:val="000000"/>
+          <w:kern w:val="0"/>
+          <w:sz w:val="24"/>
+          <w:szCs w:val="24"/>
+        </w:rPr>
+        <w:t xml:space="preserve">- des valeurs manquantes sur </w:t>
+      </w:r>
+      <w:proofErr w:type="spellStart"/>
+      <w:r>
+        <w:rPr>
+          <w:rFonts w:ascii="Times New Roman" w:hAnsi="Times New Roman" w:cs="Times New Roman"/>
+          <w:color w:val="000000"/>
+          <w:kern w:val="0"/>
+          <w:sz w:val="24"/>
+          <w:szCs w:val="24"/>
+        </w:rPr>
+        <w:t>temperature</w:t>
+      </w:r>
+      <w:proofErr w:type="spellEnd"/>
+      <w:r>
+        <w:rPr>
+          <w:rFonts w:ascii="Times New Roman" w:hAnsi="Times New Roman" w:cs="Times New Roman"/>
+          <w:color w:val="000000"/>
+          <w:kern w:val="0"/>
+          <w:sz w:val="24"/>
+          <w:szCs w:val="24"/>
+        </w:rPr>
+        <w:t xml:space="preserve">, </w:t>
+      </w:r>
+      <w:proofErr w:type="spellStart"/>
+      <w:r>
+        <w:rPr>
+          <w:rFonts w:ascii="Times New Roman" w:hAnsi="Times New Roman" w:cs="Times New Roman"/>
+          <w:color w:val="000000"/>
+          <w:kern w:val="0"/>
+          <w:sz w:val="24"/>
+          <w:szCs w:val="24"/>
+        </w:rPr>
+        <w:t>humidite</w:t>
+      </w:r>
+      <w:proofErr w:type="spellEnd"/>
+      <w:r>
+        <w:rPr>
+          <w:rFonts w:ascii="Times New Roman" w:hAnsi="Times New Roman" w:cs="Times New Roman"/>
+          <w:color w:val="000000"/>
+          <w:kern w:val="0"/>
+          <w:sz w:val="24"/>
+          <w:szCs w:val="24"/>
+        </w:rPr>
+        <w:t xml:space="preserve">, pression, consommation et </w:t>
+      </w:r>
+      <w:proofErr w:type="spellStart"/>
+      <w:r>
+        <w:rPr>
+          <w:rFonts w:ascii="Times New Roman" w:hAnsi="Times New Roman" w:cs="Times New Roman"/>
+          <w:color w:val="000000"/>
+          <w:kern w:val="0"/>
+          <w:sz w:val="24"/>
+          <w:szCs w:val="24"/>
+        </w:rPr>
+        <w:t>etat</w:t>
+      </w:r>
+      <w:proofErr w:type="spellEnd"/>
+      <w:r>
+        <w:rPr>
+          <w:rFonts w:ascii="Times New Roman" w:hAnsi="Times New Roman" w:cs="Times New Roman"/>
+          <w:color w:val="000000"/>
+          <w:kern w:val="0"/>
+          <w:sz w:val="24"/>
+          <w:szCs w:val="24"/>
+        </w:rPr>
+        <w:t xml:space="preserve"> </w:t>
+      </w:r>
+    </w:p>
+    <w:p>
+      <w:pPr>
+        <w:autoSpaceDE w:val="0"/>
+        <w:autoSpaceDN w:val="0"/>
+        <w:adjustRightInd w:val="0"/>
+        <w:spacing w:after="0" w:line="360" w:lineRule="auto"/>
+        <w:jc w:val="both"/>
+        <w:rPr>
+          <w:rFonts w:ascii="Times New Roman" w:hAnsi="Times New Roman" w:cs="Times New Roman"/>
+          <w:color w:val="000000"/>
+          <w:kern w:val="0"/>
+          <w:sz w:val="24"/>
+          <w:szCs w:val="24"/>
+        </w:rPr>
+      </w:pPr>
+      <w:r>
+        <w:rPr>
+          <w:rFonts w:ascii="Times New Roman" w:hAnsi="Times New Roman" w:cs="Times New Roman"/>
+          <w:color w:val="000000"/>
+          <w:kern w:val="0"/>
+          <w:sz w:val="24"/>
+          <w:szCs w:val="24"/>
+        </w:rPr>
+        <w:t xml:space="preserve">  (entre 4 et 6 valeurs manquantes par colonne)</w:t>
+      </w:r>
+    </w:p>
+    <w:p>
+      <w:pPr>
+        <w:autoSpaceDE w:val="0"/>
+        <w:autoSpaceDN w:val="0"/>
+        <w:adjustRightInd w:val="0"/>
+        <w:spacing w:after="0" w:line="360" w:lineRule="auto"/>
+        <w:jc w:val="both"/>
+        <w:rPr>
+          <w:rFonts w:ascii="Times New Roman" w:hAnsi="Times New Roman" w:cs="Times New Roman"/>
+          <w:color w:val="000000"/>
+          <w:kern w:val="0"/>
+          <w:sz w:val="24"/>
+          <w:szCs w:val="24"/>
+        </w:rPr>
+      </w:pPr>
+      <w:r>
+        <w:rPr>
+          <w:rFonts w:ascii="Times New Roman" w:hAnsi="Times New Roman" w:cs="Times New Roman"/>
+          <w:color w:val="000000"/>
+          <w:kern w:val="0"/>
+          <w:sz w:val="24"/>
+          <w:szCs w:val="24"/>
+        </w:rPr>
+        <w:t>- 5 lignes dupliquées</w:t>
+      </w:r>
+    </w:p>
+    <w:p>
+      <w:pPr>
+        <w:autoSpaceDE w:val="0"/>
+        <w:autoSpaceDN w:val="0"/>
+        <w:adjustRightInd w:val="0"/>
+        <w:spacing w:after="0" w:line="360" w:lineRule="auto"/>
+        <w:jc w:val="both"/>
+        <w:rPr>
+          <w:rFonts w:ascii="Times New Roman" w:hAnsi="Times New Roman" w:cs="Times New Roman"/>
+          <w:color w:val="000000"/>
+          <w:kern w:val="0"/>
+          <w:sz w:val="24"/>
+          <w:szCs w:val="24"/>
+        </w:rPr>
+      </w:pPr>
+      <w:r>
+        <w:rPr>
+          <w:rFonts w:ascii="Times New Roman" w:hAnsi="Times New Roman" w:cs="Times New Roman"/>
+          <w:color w:val="000000"/>
+          <w:kern w:val="0"/>
+          <w:sz w:val="24"/>
+          <w:szCs w:val="24"/>
+        </w:rPr>
+        <w:t>- des valeurs d'humidité supérieures à 100%, ce qui est physiquement impossible</w:t>
+      </w:r>
+    </w:p>
+    <w:p>
+      <w:pPr>
+        <w:autoSpaceDE w:val="0"/>
+        <w:autoSpaceDN w:val="0"/>
+        <w:adjustRightInd w:val="0"/>
+        <w:spacing w:after="0" w:line="360" w:lineRule="auto"/>
+        <w:jc w:val="both"/>
+        <w:rPr>
+          <w:rFonts w:ascii="Times New Roman" w:hAnsi="Times New Roman" w:cs="Times New Roman"/>
+          <w:color w:val="000000"/>
+          <w:kern w:val="0"/>
+          <w:sz w:val="24"/>
+          <w:szCs w:val="24"/>
+        </w:rPr>
+      </w:pPr>
+      <w:r>
+        <w:rPr>
+          <w:rFonts w:ascii="Times New Roman" w:hAnsi="Times New Roman" w:cs="Times New Roman"/>
+          <w:color w:val="000000"/>
+          <w:kern w:val="0"/>
+          <w:sz w:val="24"/>
+          <w:szCs w:val="24"/>
+        </w:rPr>
+        <w:t>- des températures extrêmes (-18.5°C et 58.7°C) q</w:t>
+      </w:r>
+      <w:r>
+        <w:rPr>
+          <w:rFonts w:ascii="Times New Roman" w:hAnsi="Times New Roman" w:cs="Times New Roman"/>
+          <w:color w:val="000000"/>
+          <w:kern w:val="0"/>
+          <w:sz w:val="24"/>
+          <w:szCs w:val="24"/>
+        </w:rPr>
+        <w:t>ui semblent suspectes pour des</w:t>
+      </w:r>
+      <w:r>
+        <w:rPr>
+          <w:rFonts w:ascii="Times New Roman" w:hAnsi="Times New Roman" w:cs="Times New Roman"/>
+          <w:color w:val="000000"/>
+          <w:kern w:val="0"/>
+          <w:sz w:val="24"/>
+          <w:szCs w:val="24"/>
+        </w:rPr>
+        <w:t xml:space="preserve"> capteurs intérieurs</w:t>
+      </w:r>
+    </w:p>
+    <w:p>
+      <w:pPr>
+        <w:autoSpaceDE w:val="0"/>
+        <w:autoSpaceDN w:val="0"/>
+        <w:adjustRightInd w:val="0"/>
+        <w:spacing w:after="0" w:line="360" w:lineRule="auto"/>
+        <w:jc w:val="both"/>
+        <w:rPr>
+          <w:rFonts w:ascii="Times New Roman" w:hAnsi="Times New Roman" w:cs="Times New Roman"/>
+          <w:b/>
+          <w:color w:val="000000"/>
+          <w:kern w:val="0"/>
+          <w:sz w:val="24"/>
+          <w:szCs w:val="24"/>
+        </w:rPr>
+      </w:pPr>
+      <w:r>
+        <w:rPr>
+          <w:rFonts w:ascii="Times New Roman" w:hAnsi="Times New Roman" w:cs="Times New Roman"/>
+          <w:b/>
+          <w:color w:val="000000"/>
+          <w:kern w:val="0"/>
+          <w:sz w:val="24"/>
+          <w:szCs w:val="24"/>
+        </w:rPr>
+        <w:t>Tâche :</w:t>
+      </w:r>
+    </w:p>
+    <w:p>
+      <w:pPr>
+        <w:autoSpaceDE w:val="0"/>
+        <w:autoSpaceDN w:val="0"/>
+        <w:adjustRightInd w:val="0"/>
+        <w:spacing w:after="0" w:line="360" w:lineRule="auto"/>
+        <w:jc w:val="both"/>
+        <w:rPr>
+          <w:rFonts w:ascii="Times New Roman" w:hAnsi="Times New Roman" w:cs="Times New Roman"/>
+          <w:color w:val="000000"/>
+          <w:kern w:val="0"/>
+          <w:sz w:val="24"/>
+          <w:szCs w:val="24"/>
+        </w:rPr>
+      </w:pPr>
+      <w:r>
+        <w:rPr>
+          <w:rFonts w:ascii="Times New Roman" w:hAnsi="Times New Roman" w:cs="Times New Roman"/>
+          <w:color w:val="000000"/>
+          <w:kern w:val="0"/>
+          <w:sz w:val="24"/>
+          <w:szCs w:val="24"/>
+        </w:rPr>
+        <w:t>Propose une stratégie de traitement pour cha</w:t>
+      </w:r>
+      <w:r>
+        <w:rPr>
+          <w:rFonts w:ascii="Times New Roman" w:hAnsi="Times New Roman" w:cs="Times New Roman"/>
+          <w:color w:val="000000"/>
+          <w:kern w:val="0"/>
+          <w:sz w:val="24"/>
+          <w:szCs w:val="24"/>
+        </w:rPr>
+        <w:t xml:space="preserve">cun des problèmes suivants, en </w:t>
+      </w:r>
+      <w:r>
+        <w:rPr>
+          <w:rFonts w:ascii="Times New Roman" w:hAnsi="Times New Roman" w:cs="Times New Roman"/>
+          <w:color w:val="000000"/>
+          <w:kern w:val="0"/>
+          <w:sz w:val="24"/>
+          <w:szCs w:val="24"/>
+        </w:rPr>
+        <w:t>structurant ta réponse par type de problème :</w:t>
+      </w:r>
+    </w:p>
+    <w:p>
+      <w:pPr>
+        <w:autoSpaceDE w:val="0"/>
+        <w:autoSpaceDN w:val="0"/>
+        <w:adjustRightInd w:val="0"/>
+        <w:spacing w:after="0" w:line="360" w:lineRule="auto"/>
+        <w:jc w:val="both"/>
+        <w:rPr>
+          <w:rFonts w:ascii="Times New Roman" w:hAnsi="Times New Roman" w:cs="Times New Roman"/>
+          <w:color w:val="000000"/>
+          <w:kern w:val="0"/>
+          <w:sz w:val="24"/>
+          <w:szCs w:val="24"/>
+        </w:rPr>
+      </w:pPr>
+      <w:r>
+        <w:rPr>
+          <w:rFonts w:ascii="Times New Roman" w:hAnsi="Times New Roman" w:cs="Times New Roman"/>
+          <w:color w:val="000000"/>
+          <w:kern w:val="0"/>
+          <w:sz w:val="24"/>
+          <w:szCs w:val="24"/>
+        </w:rPr>
+        <w:t>1. Valeurs manquantes</w:t>
+      </w:r>
+    </w:p>
+    <w:p>
+      <w:pPr>
+        <w:autoSpaceDE w:val="0"/>
+        <w:autoSpaceDN w:val="0"/>
+        <w:adjustRightInd w:val="0"/>
+        <w:spacing w:after="0" w:line="360" w:lineRule="auto"/>
+        <w:jc w:val="both"/>
+        <w:rPr>
+          <w:rFonts w:ascii="Times New Roman" w:hAnsi="Times New Roman" w:cs="Times New Roman"/>
+          <w:color w:val="000000"/>
+          <w:kern w:val="0"/>
+          <w:sz w:val="24"/>
+          <w:szCs w:val="24"/>
+        </w:rPr>
+      </w:pPr>
+      <w:r>
+        <w:rPr>
+          <w:rFonts w:ascii="Times New Roman" w:hAnsi="Times New Roman" w:cs="Times New Roman"/>
+          <w:color w:val="000000"/>
+          <w:kern w:val="0"/>
+          <w:sz w:val="24"/>
+          <w:szCs w:val="24"/>
+        </w:rPr>
+        <w:t>2. Doublons</w:t>
+      </w:r>
+    </w:p>
+    <w:p>
+      <w:pPr>
+        <w:autoSpaceDE w:val="0"/>
+        <w:autoSpaceDN w:val="0"/>
+        <w:adjustRightInd w:val="0"/>
+        <w:spacing w:after="0" w:line="360" w:lineRule="auto"/>
+        <w:jc w:val="both"/>
+        <w:rPr>
+          <w:rFonts w:ascii="Times New Roman" w:hAnsi="Times New Roman" w:cs="Times New Roman"/>
+          <w:color w:val="000000"/>
+          <w:kern w:val="0"/>
+          <w:sz w:val="24"/>
+          <w:szCs w:val="24"/>
+        </w:rPr>
+      </w:pPr>
+      <w:r>
+        <w:rPr>
+          <w:rFonts w:ascii="Times New Roman" w:hAnsi="Times New Roman" w:cs="Times New Roman"/>
+          <w:color w:val="000000"/>
+          <w:kern w:val="0"/>
+          <w:sz w:val="24"/>
+          <w:szCs w:val="24"/>
+        </w:rPr>
+        <w:t>3. Valeurs aberrantes (notamment l'humidité &gt; 100% et les températures extrêmes)</w:t>
+      </w:r>
+    </w:p>
+    <w:p>
+      <w:pPr>
+        <w:autoSpaceDE w:val="0"/>
+        <w:autoSpaceDN w:val="0"/>
+        <w:adjustRightInd w:val="0"/>
+        <w:spacing w:after="0" w:line="360" w:lineRule="auto"/>
+        <w:jc w:val="both"/>
+        <w:rPr>
+          <w:rFonts w:ascii="Times New Roman" w:hAnsi="Times New Roman" w:cs="Times New Roman"/>
+          <w:color w:val="000000"/>
+          <w:kern w:val="0"/>
+          <w:sz w:val="24"/>
+          <w:szCs w:val="24"/>
+        </w:rPr>
+      </w:pPr>
+      <w:r>
+        <w:rPr>
+          <w:rFonts w:ascii="Times New Roman" w:hAnsi="Times New Roman" w:cs="Times New Roman"/>
+          <w:color w:val="000000"/>
+          <w:kern w:val="0"/>
+          <w:sz w:val="24"/>
+          <w:szCs w:val="24"/>
+        </w:rPr>
+        <w:t>4. Variables catégoriell</w:t>
+      </w:r>
+      <w:r>
+        <w:rPr>
+          <w:rFonts w:ascii="Times New Roman" w:hAnsi="Times New Roman" w:cs="Times New Roman"/>
+          <w:color w:val="000000"/>
+          <w:kern w:val="0"/>
+          <w:sz w:val="24"/>
+          <w:szCs w:val="24"/>
+        </w:rPr>
+        <w:t>es (</w:t>
+      </w:r>
+      <w:proofErr w:type="spellStart"/>
+      <w:r>
+        <w:rPr>
+          <w:rFonts w:ascii="Times New Roman" w:hAnsi="Times New Roman" w:cs="Times New Roman"/>
+          <w:color w:val="000000"/>
+          <w:kern w:val="0"/>
+          <w:sz w:val="24"/>
+          <w:szCs w:val="24"/>
+        </w:rPr>
+        <w:t>id_capteur</w:t>
+      </w:r>
+      <w:proofErr w:type="spellEnd"/>
+      <w:r>
+        <w:rPr>
+          <w:rFonts w:ascii="Times New Roman" w:hAnsi="Times New Roman" w:cs="Times New Roman"/>
+          <w:color w:val="000000"/>
+          <w:kern w:val="0"/>
+          <w:sz w:val="24"/>
+          <w:szCs w:val="24"/>
+        </w:rPr>
+        <w:t xml:space="preserve">, </w:t>
+      </w:r>
+      <w:proofErr w:type="spellStart"/>
+      <w:r>
+        <w:rPr>
+          <w:rFonts w:ascii="Times New Roman" w:hAnsi="Times New Roman" w:cs="Times New Roman"/>
+          <w:color w:val="000000"/>
+          <w:kern w:val="0"/>
+          <w:sz w:val="24"/>
+          <w:szCs w:val="24"/>
+        </w:rPr>
+        <w:t>batiment</w:t>
+      </w:r>
+      <w:proofErr w:type="spellEnd"/>
+      <w:r>
+        <w:rPr>
+          <w:rFonts w:ascii="Times New Roman" w:hAnsi="Times New Roman" w:cs="Times New Roman"/>
+          <w:color w:val="000000"/>
+          <w:kern w:val="0"/>
+          <w:sz w:val="24"/>
+          <w:szCs w:val="24"/>
+        </w:rPr>
+        <w:t xml:space="preserve">, </w:t>
+      </w:r>
+      <w:proofErr w:type="spellStart"/>
+      <w:r>
+        <w:rPr>
+          <w:rFonts w:ascii="Times New Roman" w:hAnsi="Times New Roman" w:cs="Times New Roman"/>
+          <w:color w:val="000000"/>
+          <w:kern w:val="0"/>
+          <w:sz w:val="24"/>
+          <w:szCs w:val="24"/>
+        </w:rPr>
+        <w:t>etat</w:t>
+      </w:r>
+      <w:proofErr w:type="spellEnd"/>
+      <w:r>
+        <w:rPr>
+          <w:rFonts w:ascii="Times New Roman" w:hAnsi="Times New Roman" w:cs="Times New Roman"/>
+          <w:color w:val="000000"/>
+          <w:kern w:val="0"/>
+          <w:sz w:val="24"/>
+          <w:szCs w:val="24"/>
+        </w:rPr>
+        <w:t>)</w:t>
+      </w:r>
+    </w:p>
+    <w:p>
+      <w:pPr>
+        <w:autoSpaceDE w:val="0"/>
+        <w:autoSpaceDN w:val="0"/>
+        <w:adjustRightInd w:val="0"/>
+        <w:spacing w:after="0" w:line="360" w:lineRule="auto"/>
+        <w:jc w:val="both"/>
+        <w:rPr>
+          <w:rFonts w:ascii="Times New Roman" w:hAnsi="Times New Roman" w:cs="Times New Roman"/>
+          <w:color w:val="000000"/>
+          <w:kern w:val="0"/>
+          <w:sz w:val="24"/>
+          <w:szCs w:val="24"/>
+        </w:rPr>
+      </w:pPr>
+      <w:r>
+        <w:rPr>
+          <w:rFonts w:ascii="Times New Roman" w:hAnsi="Times New Roman" w:cs="Times New Roman"/>
+          <w:color w:val="000000"/>
+          <w:kern w:val="0"/>
+          <w:sz w:val="24"/>
+          <w:szCs w:val="24"/>
+        </w:rPr>
+        <w:t>Pour chaque point, indique :</w:t>
+      </w:r>
+    </w:p>
+    <w:p>
+      <w:pPr>
+        <w:autoSpaceDE w:val="0"/>
+        <w:autoSpaceDN w:val="0"/>
+        <w:adjustRightInd w:val="0"/>
+        <w:spacing w:after="0" w:line="360" w:lineRule="auto"/>
+        <w:jc w:val="both"/>
+        <w:rPr>
+          <w:rFonts w:ascii="Times New Roman" w:hAnsi="Times New Roman" w:cs="Times New Roman"/>
+          <w:color w:val="000000"/>
+          <w:kern w:val="0"/>
+          <w:sz w:val="24"/>
+          <w:szCs w:val="24"/>
+        </w:rPr>
+      </w:pPr>
+      <w:r>
+        <w:rPr>
+          <w:rFonts w:ascii="Times New Roman" w:hAnsi="Times New Roman" w:cs="Times New Roman"/>
+          <w:color w:val="000000"/>
+          <w:kern w:val="0"/>
+          <w:sz w:val="24"/>
+          <w:szCs w:val="24"/>
+        </w:rPr>
+        <w:t>- La méthode de détection recommandée</w:t>
+      </w:r>
+    </w:p>
+    <w:p>
+      <w:pPr>
+        <w:autoSpaceDE w:val="0"/>
+        <w:autoSpaceDN w:val="0"/>
+        <w:adjustRightInd w:val="0"/>
+        <w:spacing w:after="0" w:line="360" w:lineRule="auto"/>
+        <w:jc w:val="both"/>
+        <w:rPr>
+          <w:rFonts w:ascii="Times New Roman" w:hAnsi="Times New Roman" w:cs="Times New Roman"/>
+          <w:color w:val="000000"/>
+          <w:kern w:val="0"/>
+          <w:sz w:val="24"/>
+          <w:szCs w:val="24"/>
+        </w:rPr>
+      </w:pPr>
+      <w:r>
+        <w:rPr>
+          <w:rFonts w:ascii="Times New Roman" w:hAnsi="Times New Roman" w:cs="Times New Roman"/>
+          <w:color w:val="000000"/>
+          <w:kern w:val="0"/>
+          <w:sz w:val="24"/>
+          <w:szCs w:val="24"/>
+        </w:rPr>
+        <w:t>- La ou les méthodes de traitement possibles (avec leurs avantages/inconvénients)</w:t>
+      </w:r>
+    </w:p>
+    <w:p>
+      <w:pPr>
+        <w:autoSpaceDE w:val="0"/>
+        <w:autoSpaceDN w:val="0"/>
+        <w:adjustRightInd w:val="0"/>
+        <w:spacing w:after="0" w:line="360" w:lineRule="auto"/>
+        <w:jc w:val="both"/>
+        <w:rPr>
+          <w:rFonts w:ascii="Times New Roman" w:hAnsi="Times New Roman" w:cs="Times New Roman"/>
+          <w:color w:val="000000"/>
+          <w:kern w:val="0"/>
+          <w:sz w:val="24"/>
+          <w:szCs w:val="24"/>
+        </w:rPr>
+      </w:pPr>
+      <w:r>
+        <w:rPr>
+          <w:rFonts w:ascii="Times New Roman" w:hAnsi="Times New Roman" w:cs="Times New Roman"/>
+          <w:color w:val="000000"/>
+          <w:kern w:val="0"/>
+          <w:sz w:val="24"/>
+          <w:szCs w:val="24"/>
+        </w:rPr>
+        <w:t>- Les risques associés à un mauvais traitement d</w:t>
+      </w:r>
+      <w:r>
+        <w:rPr>
+          <w:rFonts w:ascii="Times New Roman" w:hAnsi="Times New Roman" w:cs="Times New Roman"/>
+          <w:color w:val="000000"/>
+          <w:kern w:val="0"/>
+          <w:sz w:val="24"/>
+          <w:szCs w:val="24"/>
+        </w:rPr>
+        <w:t>e ce problème dans le contexte</w:t>
+      </w:r>
+      <w:r>
+        <w:rPr>
+          <w:rFonts w:ascii="Times New Roman" w:hAnsi="Times New Roman" w:cs="Times New Roman"/>
+          <w:color w:val="000000"/>
+          <w:kern w:val="0"/>
+          <w:sz w:val="24"/>
+          <w:szCs w:val="24"/>
+        </w:rPr>
+        <w:t xml:space="preserve"> spécifique de la prédict</w:t>
+      </w:r>
+      <w:r>
+        <w:rPr>
+          <w:rFonts w:ascii="Times New Roman" w:hAnsi="Times New Roman" w:cs="Times New Roman"/>
+          <w:color w:val="000000"/>
+          <w:kern w:val="0"/>
+          <w:sz w:val="24"/>
+          <w:szCs w:val="24"/>
+        </w:rPr>
+        <w:t>ion de consommation énergétique</w:t>
+      </w:r>
+    </w:p>
+    <w:p>
+      <w:pPr>
+        <w:autoSpaceDE w:val="0"/>
+        <w:autoSpaceDN w:val="0"/>
+        <w:adjustRightInd w:val="0"/>
+        <w:spacing w:after="0" w:line="360" w:lineRule="auto"/>
+        <w:jc w:val="both"/>
+        <w:rPr>
+          <w:rFonts w:ascii="Times New Roman" w:hAnsi="Times New Roman" w:cs="Times New Roman"/>
+          <w:b/>
+          <w:color w:val="000000"/>
+          <w:kern w:val="0"/>
+          <w:sz w:val="24"/>
+          <w:szCs w:val="24"/>
+        </w:rPr>
+      </w:pPr>
+      <w:r>
+        <w:rPr>
+          <w:rFonts w:ascii="Times New Roman" w:hAnsi="Times New Roman" w:cs="Times New Roman"/>
+          <w:b/>
+          <w:color w:val="000000"/>
+          <w:kern w:val="0"/>
+          <w:sz w:val="24"/>
+          <w:szCs w:val="24"/>
+        </w:rPr>
+        <w:t>Format de sortie :</w:t>
+      </w:r>
+    </w:p>
+    <w:p>
+      <w:pPr>
+        <w:autoSpaceDE w:val="0"/>
+        <w:autoSpaceDN w:val="0"/>
+        <w:adjustRightInd w:val="0"/>
+        <w:spacing w:after="0" w:line="360" w:lineRule="auto"/>
+        <w:jc w:val="both"/>
+        <w:rPr>
+          <w:rFonts w:ascii="Times New Roman" w:hAnsi="Times New Roman" w:cs="Times New Roman"/>
+          <w:color w:val="000000"/>
+          <w:kern w:val="0"/>
+          <w:sz w:val="24"/>
+          <w:szCs w:val="24"/>
+        </w:rPr>
+      </w:pPr>
+      <w:r>
+        <w:rPr>
+          <w:rFonts w:ascii="Times New Roman" w:hAnsi="Times New Roman" w:cs="Times New Roman"/>
+          <w:color w:val="000000"/>
+          <w:kern w:val="0"/>
+          <w:sz w:val="24"/>
+          <w:szCs w:val="24"/>
+        </w:rPr>
+        <w:t>Un tableau ou une liste structurée par type de problème.</w:t>
+      </w:r>
+    </w:p>
+    <w:p>
+      <w:pPr>
+        <w:pStyle w:val="ListParagraph"/>
+        <w:numPr>
+          <w:ilvl w:val="0"/>
+          <w:numId w:val="10"/>
+        </w:numPr>
+        <w:autoSpaceDE w:val="0"/>
+        <w:autoSpaceDN w:val="0"/>
+        <w:adjustRightInd w:val="0"/>
+        <w:spacing w:after="0" w:line="360" w:lineRule="auto"/>
+        <w:jc w:val="center"/>
+        <w:rPr>
+          <w:rFonts w:ascii="Times New Roman" w:hAnsi="Times New Roman" w:cs="Times New Roman"/>
+          <w:color w:val="000000"/>
+          <w:kern w:val="0"/>
+          <w:sz w:val="24"/>
+          <w:szCs w:val="24"/>
+        </w:rPr>
+      </w:pPr>
+      <w:r>
+        <w:rPr>
+          <w:rFonts w:ascii="Times New Roman" w:hAnsi="Times New Roman" w:cs="Times New Roman"/>
+          <w:b/>
+          <w:color w:val="000000"/>
+          <w:kern w:val="0"/>
+          <w:sz w:val="24"/>
+          <w:szCs w:val="24"/>
+        </w:rPr>
+        <w:lastRenderedPageBreak/>
+        <w:t>Réponse de Claude</w:t>
+      </w:r>
+      <w:r>
+        <w:rPr>
+          <w:rFonts w:ascii="Times New Roman" w:hAnsi="Times New Roman" w:cs="Times New Roman"/>
+          <w:color w:val="000000"/>
+          <w:kern w:val="0"/>
+          <w:sz w:val="24"/>
+          <w:szCs w:val="24"/>
+        </w:rPr>
+        <w:drawing>
+          <wp:inline distT="0" distB="0" distL="0" distR="0" wp14:anchorId="7EEAEB97" wp14:editId="24DE9E99">
+            <wp:extent cx="5760720" cy="2285365"/>
+            <wp:effectExtent l="0" t="0" r="0" b="635"/>
+            <wp:docPr id="10" name="Picture 10"/>
+            <wp:cNvGraphicFramePr>
+              <a:graphicFrameLocks xmlns:a="http://schemas.openxmlformats.org/drawingml/2006/main" noChangeAspect="1"/>
+            </wp:cNvGraphicFramePr>
+            <a:graphic xmlns:a="http://schemas.openxmlformats.org/drawingml/2006/main">
+              <a:graphicData uri="http://schemas.openxmlformats.org/drawingml/2006/picture">
+                <pic:pic xmlns:pic="http://schemas.openxmlformats.org/drawingml/2006/picture">
+                  <pic:nvPicPr>
+                    <pic:cNvPr id="1" name=""/>
+                    <pic:cNvPicPr/>
+                  </pic:nvPicPr>
+                  <pic:blipFill>
+                    <a:blip r:embed="rId23"/>
+                    <a:stretch>
+                      <a:fillRect/>
+                    </a:stretch>
+                  </pic:blipFill>
+                  <pic:spPr>
+                    <a:xfrm>
+                      <a:off x="0" y="0"/>
+                      <a:ext cx="5760720" cy="2285365"/>
+                    </a:xfrm>
+                    <a:prstGeom prst="rect">
+                      <a:avLst/>
+                    </a:prstGeom>
+                  </pic:spPr>
+                </pic:pic>
+              </a:graphicData>
+            </a:graphic>
+          </wp:inline>
+        </w:drawing>
+      </w:r>
+    </w:p>
+    <w:p>
+      <w:pPr>
+        <w:autoSpaceDE w:val="0"/>
+        <w:autoSpaceDN w:val="0"/>
+        <w:adjustRightInd w:val="0"/>
+        <w:spacing w:after="0" w:line="360" w:lineRule="auto"/>
+        <w:ind w:left="360"/>
+        <w:jc w:val="center"/>
+        <w:rPr>
+          <w:rFonts w:ascii="Times New Roman" w:hAnsi="Times New Roman" w:cs="Times New Roman"/>
+          <w:color w:val="000000"/>
+          <w:kern w:val="0"/>
+          <w:sz w:val="24"/>
+          <w:szCs w:val="24"/>
+        </w:rPr>
+      </w:pPr>
+      <w:r>
+        <w:rPr>
+          <w:rFonts w:ascii="Times New Roman" w:hAnsi="Times New Roman" w:cs="Times New Roman"/>
+          <w:color w:val="000000"/>
+          <w:kern w:val="0"/>
+          <w:sz w:val="24"/>
+          <w:szCs w:val="24"/>
+        </w:rPr>
+        <w:drawing>
+          <wp:inline distT="0" distB="0" distL="0" distR="0" wp14:anchorId="7201EEF6" wp14:editId="7B1C866C">
+            <wp:extent cx="5760720" cy="4550410"/>
+            <wp:effectExtent l="0" t="0" r="0" b="2540"/>
+            <wp:docPr id="11" name="Picture 11"/>
+            <wp:cNvGraphicFramePr>
+              <a:graphicFrameLocks xmlns:a="http://schemas.openxmlformats.org/drawingml/2006/main" noChangeAspect="1"/>
+            </wp:cNvGraphicFramePr>
+            <a:graphic xmlns:a="http://schemas.openxmlformats.org/drawingml/2006/main">
+              <a:graphicData uri="http://schemas.openxmlformats.org/drawingml/2006/picture">
+                <pic:pic xmlns:pic="http://schemas.openxmlformats.org/drawingml/2006/picture">
+                  <pic:nvPicPr>
+                    <pic:cNvPr id="1" name=""/>
+                    <pic:cNvPicPr/>
+                  </pic:nvPicPr>
+                  <pic:blipFill>
+                    <a:blip r:embed="rId24"/>
+                    <a:stretch>
+                      <a:fillRect/>
+                    </a:stretch>
+                  </pic:blipFill>
+                  <pic:spPr>
+                    <a:xfrm>
+                      <a:off x="0" y="0"/>
+                      <a:ext cx="5760720" cy="4550410"/>
+                    </a:xfrm>
+                    <a:prstGeom prst="rect">
+                      <a:avLst/>
+                    </a:prstGeom>
+                  </pic:spPr>
+                </pic:pic>
+              </a:graphicData>
+            </a:graphic>
+          </wp:inline>
+        </w:drawing>
+      </w:r>
+    </w:p>
+    <w:p>
+      <w:pPr>
+        <w:autoSpaceDE w:val="0"/>
+        <w:autoSpaceDN w:val="0"/>
+        <w:adjustRightInd w:val="0"/>
+        <w:spacing w:after="0" w:line="360" w:lineRule="auto"/>
+        <w:ind w:left="360"/>
+        <w:jc w:val="center"/>
+        <w:rPr>
+          <w:rFonts w:ascii="Times New Roman" w:hAnsi="Times New Roman" w:cs="Times New Roman"/>
+          <w:color w:val="000000"/>
+          <w:kern w:val="0"/>
+          <w:sz w:val="24"/>
+          <w:szCs w:val="24"/>
+        </w:rPr>
+      </w:pPr>
+      <w:r>
+        <w:rPr>
+          <w:rFonts w:ascii="Times New Roman" w:hAnsi="Times New Roman" w:cs="Times New Roman"/>
+          <w:color w:val="000000"/>
+          <w:kern w:val="0"/>
+          <w:sz w:val="24"/>
+          <w:szCs w:val="24"/>
+        </w:rPr>
+        <w:lastRenderedPageBreak/>
+        <w:drawing>
+          <wp:inline distT="0" distB="0" distL="0" distR="0" wp14:anchorId="25166946" wp14:editId="2DF92122">
+            <wp:extent cx="5760720" cy="3794760"/>
+            <wp:effectExtent l="0" t="0" r="0" b="0"/>
+            <wp:docPr id="12" name="Picture 12"/>
+            <wp:cNvGraphicFramePr>
+              <a:graphicFrameLocks xmlns:a="http://schemas.openxmlformats.org/drawingml/2006/main" noChangeAspect="1"/>
+            </wp:cNvGraphicFramePr>
+            <a:graphic xmlns:a="http://schemas.openxmlformats.org/drawingml/2006/main">
+              <a:graphicData uri="http://schemas.openxmlformats.org/drawingml/2006/picture">
+                <pic:pic xmlns:pic="http://schemas.openxmlformats.org/drawingml/2006/picture">
+                  <pic:nvPicPr>
+                    <pic:cNvPr id="1" name=""/>
+                    <pic:cNvPicPr/>
+                  </pic:nvPicPr>
+                  <pic:blipFill>
+                    <a:blip r:embed="rId25"/>
+                    <a:stretch>
+                      <a:fillRect/>
+                    </a:stretch>
+                  </pic:blipFill>
+                  <pic:spPr>
+                    <a:xfrm>
+                      <a:off x="0" y="0"/>
+                      <a:ext cx="5760720" cy="3794760"/>
+                    </a:xfrm>
+                    <a:prstGeom prst="rect">
+                      <a:avLst/>
+                    </a:prstGeom>
+                  </pic:spPr>
+                </pic:pic>
+              </a:graphicData>
+            </a:graphic>
+          </wp:inline>
+        </w:drawing>
+      </w:r>
+    </w:p>
+    <w:p>
+      <w:pPr>
+        <w:autoSpaceDE w:val="0"/>
+        <w:autoSpaceDN w:val="0"/>
+        <w:adjustRightInd w:val="0"/>
+        <w:spacing w:after="0" w:line="360" w:lineRule="auto"/>
+        <w:ind w:left="360"/>
+        <w:jc w:val="center"/>
+        <w:rPr>
+          <w:rFonts w:ascii="Times New Roman" w:hAnsi="Times New Roman" w:cs="Times New Roman"/>
+          <w:color w:val="000000"/>
+          <w:kern w:val="0"/>
+          <w:sz w:val="24"/>
+          <w:szCs w:val="24"/>
+        </w:rPr>
+      </w:pPr>
+      <w:r>
+        <w:rPr>
+          <w:rFonts w:ascii="Times New Roman" w:hAnsi="Times New Roman" w:cs="Times New Roman"/>
+          <w:color w:val="000000"/>
+          <w:kern w:val="0"/>
+          <w:sz w:val="24"/>
+          <w:szCs w:val="24"/>
+        </w:rPr>
+        <w:drawing>
+          <wp:inline distT="0" distB="0" distL="0" distR="0" wp14:anchorId="6984C04B" wp14:editId="7D5370ED">
+            <wp:extent cx="5760720" cy="1804670"/>
+            <wp:effectExtent l="0" t="0" r="0" b="5080"/>
+            <wp:docPr id="13" name="Picture 13"/>
+            <wp:cNvGraphicFramePr>
+              <a:graphicFrameLocks xmlns:a="http://schemas.openxmlformats.org/drawingml/2006/main" noChangeAspect="1"/>
+            </wp:cNvGraphicFramePr>
+            <a:graphic xmlns:a="http://schemas.openxmlformats.org/drawingml/2006/main">
+              <a:graphicData uri="http://schemas.openxmlformats.org/drawingml/2006/picture">
+                <pic:pic xmlns:pic="http://schemas.openxmlformats.org/drawingml/2006/picture">
+                  <pic:nvPicPr>
+                    <pic:cNvPr id="1" name=""/>
+                    <pic:cNvPicPr/>
+                  </pic:nvPicPr>
+                  <pic:blipFill>
+                    <a:blip r:embed="rId26"/>
+                    <a:stretch>
+                      <a:fillRect/>
+                    </a:stretch>
+                  </pic:blipFill>
+                  <pic:spPr>
+                    <a:xfrm>
+                      <a:off x="0" y="0"/>
+                      <a:ext cx="5760720" cy="1804670"/>
+                    </a:xfrm>
+                    <a:prstGeom prst="rect">
+                      <a:avLst/>
+                    </a:prstGeom>
+                  </pic:spPr>
+                </pic:pic>
+              </a:graphicData>
+            </a:graphic>
+          </wp:inline>
+        </w:drawing>
+      </w:r>
+    </w:p>
+    <w:p>
+      <w:pPr>
+        <w:autoSpaceDE w:val="0"/>
+        <w:autoSpaceDN w:val="0"/>
+        <w:adjustRightInd w:val="0"/>
+        <w:spacing w:after="0" w:line="360" w:lineRule="auto"/>
+        <w:ind w:left="360"/>
+        <w:jc w:val="center"/>
+        <w:rPr>
+          <w:rFonts w:ascii="Times New Roman" w:hAnsi="Times New Roman" w:cs="Times New Roman"/>
+          <w:color w:val="000000"/>
+          <w:kern w:val="0"/>
+          <w:sz w:val="24"/>
+          <w:szCs w:val="24"/>
+        </w:rPr>
+      </w:pPr>
+      <w:r>
+        <w:rPr>
+          <w:rFonts w:ascii="Times New Roman" w:hAnsi="Times New Roman" w:cs="Times New Roman"/>
+          <w:color w:val="000000"/>
+          <w:kern w:val="0"/>
+          <w:sz w:val="24"/>
+          <w:szCs w:val="24"/>
+        </w:rPr>
+        <w:lastRenderedPageBreak/>
+        <w:drawing>
+          <wp:inline distT="0" distB="0" distL="0" distR="0" wp14:anchorId="6B230D5D" wp14:editId="66876686">
+            <wp:extent cx="5760720" cy="3818255"/>
+            <wp:effectExtent l="0" t="0" r="0" b="0"/>
+            <wp:docPr id="14" name="Picture 14"/>
+            <wp:cNvGraphicFramePr>
+              <a:graphicFrameLocks xmlns:a="http://schemas.openxmlformats.org/drawingml/2006/main" noChangeAspect="1"/>
+            </wp:cNvGraphicFramePr>
+            <a:graphic xmlns:a="http://schemas.openxmlformats.org/drawingml/2006/main">
+              <a:graphicData uri="http://schemas.openxmlformats.org/drawingml/2006/picture">
+                <pic:pic xmlns:pic="http://schemas.openxmlformats.org/drawingml/2006/picture">
+                  <pic:nvPicPr>
+                    <pic:cNvPr id="1" name=""/>
+                    <pic:cNvPicPr/>
+                  </pic:nvPicPr>
+                  <pic:blipFill>
+                    <a:blip r:embed="rId27"/>
+                    <a:stretch>
+                      <a:fillRect/>
+                    </a:stretch>
+                  </pic:blipFill>
+                  <pic:spPr>
+                    <a:xfrm>
+                      <a:off x="0" y="0"/>
+                      <a:ext cx="5760720" cy="3818255"/>
+                    </a:xfrm>
+                    <a:prstGeom prst="rect">
+                      <a:avLst/>
+                    </a:prstGeom>
+                  </pic:spPr>
+                </pic:pic>
+              </a:graphicData>
+            </a:graphic>
+          </wp:inline>
+        </w:drawing>
+      </w:r>
+    </w:p>
+    <w:p>
+      <w:pPr>
+        <w:autoSpaceDE w:val="0"/>
+        <w:autoSpaceDN w:val="0"/>
+        <w:adjustRightInd w:val="0"/>
+        <w:spacing w:after="0" w:line="360" w:lineRule="auto"/>
+        <w:ind w:left="360"/>
+        <w:jc w:val="center"/>
+        <w:rPr>
+          <w:rFonts w:ascii="Times New Roman" w:hAnsi="Times New Roman" w:cs="Times New Roman"/>
+          <w:color w:val="000000"/>
+          <w:kern w:val="0"/>
+          <w:sz w:val="24"/>
+          <w:szCs w:val="24"/>
+        </w:rPr>
+      </w:pPr>
+      <w:r>
+        <w:rPr>
+          <w:rFonts w:ascii="Times New Roman" w:hAnsi="Times New Roman" w:cs="Times New Roman"/>
+          <w:color w:val="000000"/>
+          <w:kern w:val="0"/>
+          <w:sz w:val="24"/>
+          <w:szCs w:val="24"/>
+        </w:rPr>
+        <w:drawing>
+          <wp:inline distT="0" distB="0" distL="0" distR="0" wp14:anchorId="44B89432" wp14:editId="007353B7">
+            <wp:extent cx="5760720" cy="3677920"/>
+            <wp:effectExtent l="0" t="0" r="0" b="0"/>
+            <wp:docPr id="15" name="Picture 15"/>
+            <wp:cNvGraphicFramePr>
+              <a:graphicFrameLocks xmlns:a="http://schemas.openxmlformats.org/drawingml/2006/main" noChangeAspect="1"/>
+            </wp:cNvGraphicFramePr>
+            <a:graphic xmlns:a="http://schemas.openxmlformats.org/drawingml/2006/main">
+              <a:graphicData uri="http://schemas.openxmlformats.org/drawingml/2006/picture">
+                <pic:pic xmlns:pic="http://schemas.openxmlformats.org/drawingml/2006/picture">
+                  <pic:nvPicPr>
+                    <pic:cNvPr id="1" name=""/>
+                    <pic:cNvPicPr/>
+                  </pic:nvPicPr>
+                  <pic:blipFill>
+                    <a:blip r:embed="rId28"/>
+                    <a:stretch>
+                      <a:fillRect/>
+                    </a:stretch>
+                  </pic:blipFill>
+                  <pic:spPr>
+                    <a:xfrm>
+                      <a:off x="0" y="0"/>
+                      <a:ext cx="5760720" cy="3677920"/>
+                    </a:xfrm>
+                    <a:prstGeom prst="rect">
+                      <a:avLst/>
+                    </a:prstGeom>
+                  </pic:spPr>
+                </pic:pic>
+              </a:graphicData>
+            </a:graphic>
+          </wp:inline>
+        </w:drawing>
+      </w:r>
+    </w:p>
+    <w:p>
+      <w:pPr>
+        <w:autoSpaceDE w:val="0"/>
+        <w:autoSpaceDN w:val="0"/>
+        <w:adjustRightInd w:val="0"/>
+        <w:spacing w:after="0" w:line="360" w:lineRule="auto"/>
+        <w:ind w:left="360"/>
+        <w:jc w:val="center"/>
+        <w:rPr>
+          <w:rFonts w:ascii="Times New Roman" w:hAnsi="Times New Roman" w:cs="Times New Roman"/>
+          <w:color w:val="000000"/>
+          <w:kern w:val="0"/>
+          <w:sz w:val="24"/>
+          <w:szCs w:val="24"/>
+        </w:rPr>
+      </w:pPr>
+      <w:r>
+        <w:rPr>
+          <w:rFonts w:ascii="Times New Roman" w:hAnsi="Times New Roman" w:cs="Times New Roman"/>
+          <w:color w:val="000000"/>
+          <w:kern w:val="0"/>
+          <w:sz w:val="24"/>
+          <w:szCs w:val="24"/>
+        </w:rPr>
+        <w:lastRenderedPageBreak/>
+        <w:drawing>
+          <wp:inline distT="0" distB="0" distL="0" distR="0" wp14:anchorId="0C920AE5" wp14:editId="30297C9C">
+            <wp:extent cx="5760720" cy="3871595"/>
+            <wp:effectExtent l="0" t="0" r="0" b="0"/>
+            <wp:docPr id="16" name="Picture 16"/>
+            <wp:cNvGraphicFramePr>
+              <a:graphicFrameLocks xmlns:a="http://schemas.openxmlformats.org/drawingml/2006/main" noChangeAspect="1"/>
+            </wp:cNvGraphicFramePr>
+            <a:graphic xmlns:a="http://schemas.openxmlformats.org/drawingml/2006/main">
+              <a:graphicData uri="http://schemas.openxmlformats.org/drawingml/2006/picture">
+                <pic:pic xmlns:pic="http://schemas.openxmlformats.org/drawingml/2006/picture">
+                  <pic:nvPicPr>
+                    <pic:cNvPr id="1" name=""/>
+                    <pic:cNvPicPr/>
+                  </pic:nvPicPr>
+                  <pic:blipFill>
+                    <a:blip r:embed="rId29"/>
+                    <a:stretch>
+                      <a:fillRect/>
+                    </a:stretch>
+                  </pic:blipFill>
+                  <pic:spPr>
+                    <a:xfrm>
+                      <a:off x="0" y="0"/>
+                      <a:ext cx="5760720" cy="3871595"/>
+                    </a:xfrm>
+                    <a:prstGeom prst="rect">
+                      <a:avLst/>
+                    </a:prstGeom>
+                  </pic:spPr>
+                </pic:pic>
+              </a:graphicData>
+            </a:graphic>
+          </wp:inline>
+        </w:drawing>
+      </w:r>
+    </w:p>
+    <w:p>
+      <w:pPr>
+        <w:autoSpaceDE w:val="0"/>
+        <w:autoSpaceDN w:val="0"/>
+        <w:adjustRightInd w:val="0"/>
+        <w:spacing w:after="0" w:line="360" w:lineRule="auto"/>
+        <w:ind w:left="360"/>
+        <w:jc w:val="center"/>
+        <w:rPr>
+          <w:rFonts w:ascii="Times New Roman" w:hAnsi="Times New Roman" w:cs="Times New Roman"/>
+          <w:color w:val="000000"/>
+          <w:kern w:val="0"/>
+          <w:sz w:val="24"/>
+          <w:szCs w:val="24"/>
+        </w:rPr>
+      </w:pPr>
+      <w:r>
+        <w:rPr>
+          <w:rFonts w:ascii="Times New Roman" w:hAnsi="Times New Roman" w:cs="Times New Roman"/>
+          <w:color w:val="000000"/>
+          <w:kern w:val="0"/>
+          <w:sz w:val="24"/>
+          <w:szCs w:val="24"/>
+        </w:rPr>
+        <w:drawing>
+          <wp:inline distT="0" distB="0" distL="0" distR="0" wp14:anchorId="5F29FA76" wp14:editId="276047F0">
+            <wp:extent cx="5760720" cy="3896360"/>
+            <wp:effectExtent l="0" t="0" r="0" b="8890"/>
+            <wp:docPr id="17" name="Picture 17"/>
+            <wp:cNvGraphicFramePr>
+              <a:graphicFrameLocks xmlns:a="http://schemas.openxmlformats.org/drawingml/2006/main" noChangeAspect="1"/>
+            </wp:cNvGraphicFramePr>
+            <a:graphic xmlns:a="http://schemas.openxmlformats.org/drawingml/2006/main">
+              <a:graphicData uri="http://schemas.openxmlformats.org/drawingml/2006/picture">
+                <pic:pic xmlns:pic="http://schemas.openxmlformats.org/drawingml/2006/picture">
+                  <pic:nvPicPr>
+                    <pic:cNvPr id="1" name=""/>
+                    <pic:cNvPicPr/>
+                  </pic:nvPicPr>
+                  <pic:blipFill>
+                    <a:blip r:embed="rId30"/>
+                    <a:stretch>
+                      <a:fillRect/>
+                    </a:stretch>
+                  </pic:blipFill>
+                  <pic:spPr>
+                    <a:xfrm>
+                      <a:off x="0" y="0"/>
+                      <a:ext cx="5760720" cy="3896360"/>
+                    </a:xfrm>
+                    <a:prstGeom prst="rect">
+                      <a:avLst/>
+                    </a:prstGeom>
+                  </pic:spPr>
+                </pic:pic>
+              </a:graphicData>
+            </a:graphic>
+          </wp:inline>
+        </w:drawing>
+      </w:r>
+    </w:p>
+    <w:p>
+      <w:pPr>
+        <w:autoSpaceDE w:val="0"/>
+        <w:autoSpaceDN w:val="0"/>
+        <w:adjustRightInd w:val="0"/>
+        <w:spacing w:after="0" w:line="360" w:lineRule="auto"/>
+        <w:ind w:left="360"/>
+        <w:jc w:val="center"/>
+        <w:rPr>
+          <w:rFonts w:ascii="Times New Roman" w:hAnsi="Times New Roman" w:cs="Times New Roman"/>
+          <w:color w:val="000000"/>
+          <w:kern w:val="0"/>
+          <w:sz w:val="24"/>
+          <w:szCs w:val="24"/>
+        </w:rPr>
+      </w:pPr>
+      <w:r>
+        <w:rPr>
+          <w:rFonts w:ascii="Times New Roman" w:hAnsi="Times New Roman" w:cs="Times New Roman"/>
+          <w:color w:val="000000"/>
+          <w:kern w:val="0"/>
+          <w:sz w:val="24"/>
+          <w:szCs w:val="24"/>
+        </w:rPr>
+        <w:lastRenderedPageBreak/>
+        <w:drawing>
+          <wp:inline distT="0" distB="0" distL="0" distR="0" wp14:anchorId="3792385E" wp14:editId="2C375307">
+            <wp:extent cx="5760720" cy="2038985"/>
+            <wp:effectExtent l="0" t="0" r="0" b="0"/>
+            <wp:docPr id="18" name="Picture 18"/>
+            <wp:cNvGraphicFramePr>
+              <a:graphicFrameLocks xmlns:a="http://schemas.openxmlformats.org/drawingml/2006/main" noChangeAspect="1"/>
+            </wp:cNvGraphicFramePr>
+            <a:graphic xmlns:a="http://schemas.openxmlformats.org/drawingml/2006/main">
+              <a:graphicData uri="http://schemas.openxmlformats.org/drawingml/2006/picture">
+                <pic:pic xmlns:pic="http://schemas.openxmlformats.org/drawingml/2006/picture">
+                  <pic:nvPicPr>
+                    <pic:cNvPr id="1" name=""/>
+                    <pic:cNvPicPr/>
+                  </pic:nvPicPr>
+                  <pic:blipFill>
+                    <a:blip r:embed="rId31"/>
+                    <a:stretch>
+                      <a:fillRect/>
+                    </a:stretch>
+                  </pic:blipFill>
+                  <pic:spPr>
+                    <a:xfrm>
+                      <a:off x="0" y="0"/>
+                      <a:ext cx="5760720" cy="2038985"/>
+                    </a:xfrm>
+                    <a:prstGeom prst="rect">
+                      <a:avLst/>
+                    </a:prstGeom>
+                  </pic:spPr>
+                </pic:pic>
+              </a:graphicData>
+            </a:graphic>
+          </wp:inline>
+        </w:drawing>
+      </w:r>
+    </w:p>
+    <w:p>
+      <w:pPr>
+        <w:autoSpaceDE w:val="0"/>
+        <w:autoSpaceDN w:val="0"/>
+        <w:adjustRightInd w:val="0"/>
+        <w:spacing w:after="0" w:line="360" w:lineRule="auto"/>
+        <w:ind w:left="360"/>
+        <w:jc w:val="center"/>
+        <w:rPr>
+          <w:rFonts w:ascii="Times New Roman" w:hAnsi="Times New Roman" w:cs="Times New Roman"/>
+          <w:color w:val="000000"/>
+          <w:kern w:val="0"/>
+          <w:sz w:val="24"/>
+          <w:szCs w:val="24"/>
+        </w:rPr>
+      </w:pPr>
+      <w:r>
+        <w:rPr>
+          <w:rFonts w:ascii="Times New Roman" w:hAnsi="Times New Roman" w:cs="Times New Roman"/>
+          <w:color w:val="000000"/>
+          <w:kern w:val="0"/>
+          <w:sz w:val="24"/>
+          <w:szCs w:val="24"/>
+        </w:rPr>
+        <w:drawing>
+          <wp:inline distT="0" distB="0" distL="0" distR="0" wp14:anchorId="3188AC37" wp14:editId="025DE416">
+            <wp:extent cx="5760720" cy="3870325"/>
+            <wp:effectExtent l="0" t="0" r="0" b="0"/>
+            <wp:docPr id="19" name="Picture 19"/>
+            <wp:cNvGraphicFramePr>
+              <a:graphicFrameLocks xmlns:a="http://schemas.openxmlformats.org/drawingml/2006/main" noChangeAspect="1"/>
+            </wp:cNvGraphicFramePr>
+            <a:graphic xmlns:a="http://schemas.openxmlformats.org/drawingml/2006/main">
+              <a:graphicData uri="http://schemas.openxmlformats.org/drawingml/2006/picture">
+                <pic:pic xmlns:pic="http://schemas.openxmlformats.org/drawingml/2006/picture">
+                  <pic:nvPicPr>
+                    <pic:cNvPr id="1" name=""/>
+                    <pic:cNvPicPr/>
+                  </pic:nvPicPr>
+                  <pic:blipFill>
+                    <a:blip r:embed="rId32"/>
+                    <a:stretch>
+                      <a:fillRect/>
+                    </a:stretch>
+                  </pic:blipFill>
+                  <pic:spPr>
+                    <a:xfrm>
+                      <a:off x="0" y="0"/>
+                      <a:ext cx="5760720" cy="3870325"/>
+                    </a:xfrm>
+                    <a:prstGeom prst="rect">
+                      <a:avLst/>
+                    </a:prstGeom>
+                  </pic:spPr>
+                </pic:pic>
+              </a:graphicData>
+            </a:graphic>
+          </wp:inline>
+        </w:drawing>
+      </w:r>
+    </w:p>
+    <w:p>
+      <w:pPr>
+        <w:autoSpaceDE w:val="0"/>
+        <w:autoSpaceDN w:val="0"/>
+        <w:adjustRightInd w:val="0"/>
+        <w:spacing w:after="0" w:line="360" w:lineRule="auto"/>
+        <w:ind w:left="360"/>
+        <w:jc w:val="center"/>
+        <w:rPr>
+          <w:rFonts w:ascii="Times New Roman" w:hAnsi="Times New Roman" w:cs="Times New Roman"/>
+          <w:color w:val="000000"/>
+          <w:kern w:val="0"/>
+          <w:sz w:val="24"/>
+          <w:szCs w:val="24"/>
+        </w:rPr>
+      </w:pPr>
+      <w:r>
+        <w:rPr>
+          <w:rFonts w:ascii="Times New Roman" w:hAnsi="Times New Roman" w:cs="Times New Roman"/>
+          <w:color w:val="000000"/>
+          <w:kern w:val="0"/>
+          <w:sz w:val="24"/>
+          <w:szCs w:val="24"/>
+        </w:rPr>
+        <w:lastRenderedPageBreak/>
+        <w:drawing>
+          <wp:inline distT="0" distB="0" distL="0" distR="0" wp14:anchorId="7E5564BA" wp14:editId="2590B320">
+            <wp:extent cx="5760720" cy="3131820"/>
+            <wp:effectExtent l="0" t="0" r="0" b="0"/>
+            <wp:docPr id="20" name="Picture 20"/>
+            <wp:cNvGraphicFramePr>
+              <a:graphicFrameLocks xmlns:a="http://schemas.openxmlformats.org/drawingml/2006/main" noChangeAspect="1"/>
+            </wp:cNvGraphicFramePr>
+            <a:graphic xmlns:a="http://schemas.openxmlformats.org/drawingml/2006/main">
+              <a:graphicData uri="http://schemas.openxmlformats.org/drawingml/2006/picture">
+                <pic:pic xmlns:pic="http://schemas.openxmlformats.org/drawingml/2006/picture">
+                  <pic:nvPicPr>
+                    <pic:cNvPr id="1" name=""/>
+                    <pic:cNvPicPr/>
+                  </pic:nvPicPr>
+                  <pic:blipFill>
+                    <a:blip r:embed="rId33"/>
+                    <a:stretch>
+                      <a:fillRect/>
+                    </a:stretch>
+                  </pic:blipFill>
+                  <pic:spPr>
+                    <a:xfrm>
+                      <a:off x="0" y="0"/>
+                      <a:ext cx="5760720" cy="3131820"/>
+                    </a:xfrm>
+                    <a:prstGeom prst="rect">
+                      <a:avLst/>
+                    </a:prstGeom>
+                  </pic:spPr>
+                </pic:pic>
+              </a:graphicData>
+            </a:graphic>
+          </wp:inline>
+        </w:drawing>
+      </w:r>
+    </w:p>
+    <w:p>
+      <w:pPr>
+        <w:autoSpaceDE w:val="0"/>
+        <w:autoSpaceDN w:val="0"/>
+        <w:adjustRightInd w:val="0"/>
+        <w:spacing w:after="0" w:line="360" w:lineRule="auto"/>
+        <w:ind w:left="360"/>
+        <w:jc w:val="center"/>
+        <w:rPr>
+          <w:rFonts w:ascii="Times New Roman" w:hAnsi="Times New Roman" w:cs="Times New Roman"/>
+          <w:color w:val="000000"/>
+          <w:kern w:val="0"/>
+          <w:sz w:val="24"/>
+          <w:szCs w:val="24"/>
+        </w:rPr>
+      </w:pPr>
+      <w:r>
+        <w:rPr>
+          <w:rFonts w:ascii="Times New Roman" w:hAnsi="Times New Roman" w:cs="Times New Roman"/>
+          <w:color w:val="000000"/>
+          <w:kern w:val="0"/>
+          <w:sz w:val="24"/>
+          <w:szCs w:val="24"/>
+        </w:rPr>
+        <w:drawing>
+          <wp:inline distT="0" distB="0" distL="0" distR="0" wp14:anchorId="6BCFE34C" wp14:editId="04CA76CD">
+            <wp:extent cx="5760720" cy="1732280"/>
+            <wp:effectExtent l="0" t="0" r="0" b="1270"/>
+            <wp:docPr id="21" name="Picture 21"/>
+            <wp:cNvGraphicFramePr>
+              <a:graphicFrameLocks xmlns:a="http://schemas.openxmlformats.org/drawingml/2006/main" noChangeAspect="1"/>
+            </wp:cNvGraphicFramePr>
+            <a:graphic xmlns:a="http://schemas.openxmlformats.org/drawingml/2006/main">
+              <a:graphicData uri="http://schemas.openxmlformats.org/drawingml/2006/picture">
+                <pic:pic xmlns:pic="http://schemas.openxmlformats.org/drawingml/2006/picture">
+                  <pic:nvPicPr>
+                    <pic:cNvPr id="1" name=""/>
+                    <pic:cNvPicPr/>
+                  </pic:nvPicPr>
+                  <pic:blipFill>
+                    <a:blip r:embed="rId34"/>
+                    <a:stretch>
+                      <a:fillRect/>
+                    </a:stretch>
+                  </pic:blipFill>
+                  <pic:spPr>
+                    <a:xfrm>
+                      <a:off x="0" y="0"/>
+                      <a:ext cx="5760720" cy="1732280"/>
+                    </a:xfrm>
+                    <a:prstGeom prst="rect">
+                      <a:avLst/>
+                    </a:prstGeom>
+                  </pic:spPr>
+                </pic:pic>
+              </a:graphicData>
+            </a:graphic>
+          </wp:inline>
+        </w:drawing>
+      </w:r>
+      <w:bookmarkStart w:id="0" w:name="_GoBack"/>
+      <w:bookmarkEnd w:id="0"/>
+    </w:p>
+    <w:p>
+      <w:pPr>
+        <w:autoSpaceDE w:val="0"/>
+        <w:autoSpaceDN w:val="0"/>
+        <w:adjustRightInd w:val="0"/>
+        <w:spacing w:after="0" w:line="360" w:lineRule="auto"/>
+        <w:jc w:val="both"/>
+        <w:rPr>
+          <w:rFonts w:ascii="Times New Roman" w:hAnsi="Times New Roman" w:cs="Times New Roman"/>
+          <w:color w:val="000000"/>
+          <w:kern w:val="0"/>
+          <w:sz w:val="24"/>
+          <w:szCs w:val="24"/>
+        </w:rPr>
+      </w:pPr>
+    </w:p>
     <w:sectPr>
       <w:pgSz w:w="11906" w:h="16838"/>
       <w:pgMar w:top="1417" w:right="1417" w:bottom="1417" w:left="1417" w:header="708" w:footer="708" w:gutter="0"/>
@@ -10321,7 +12500,7 @@
   <w:abstractNum w:abstractNumId="3">
     <w:nsid w:val="40234EF3"/>
     <w:multiLevelType w:val="hybridMultilevel"/>
-    <w:tmpl w:val="6650A6AA"/>
+    <w:tmpl w:val="3A4A7E8E"/>
     <w:lvl w:ilvl="0" w:tplc="040C0009">
       <w:start w:val="1"/>
       <w:numFmt w:val="bullet"/>
@@ -10656,181 +12835,9 @@
     </w:lvl>
   </w:abstractNum>
   <w:abstractNum w:abstractNumId="6">
-    <w:nsid w:val="5D3211AD"/>
+    <w:nsid w:val="56316CEF"/>
     <w:multiLevelType w:val="hybridMultilevel"/>
-    <w:tmpl w:val="8DBABEC8"/>
-    <w:lvl w:ilvl="0" w:tplc="040C000F">
-      <w:start w:val="1"/>
-      <w:numFmt w:val="decimal"/>
-      <w:lvlText w:val="%1."/>
-      <w:lvlJc w:val="left"/>
-      <w:pPr>
-        <w:ind w:left="720" w:hanging="360"/>
-      </w:pPr>
-    </w:lvl>
-    <w:lvl w:ilvl="1" w:tplc="040C0019" w:tentative="1">
-      <w:start w:val="1"/>
-      <w:numFmt w:val="lowerLetter"/>
-      <w:lvlText w:val="%2."/>
-      <w:lvlJc w:val="left"/>
-      <w:pPr>
-        <w:ind w:left="1440" w:hanging="360"/>
-      </w:pPr>
-    </w:lvl>
-    <w:lvl w:ilvl="2" w:tplc="040C001B" w:tentative="1">
-      <w:start w:val="1"/>
-      <w:numFmt w:val="lowerRoman"/>
-      <w:lvlText w:val="%3."/>
-      <w:lvlJc w:val="right"/>
-      <w:pPr>
-        <w:ind w:left="2160" w:hanging="180"/>
-      </w:pPr>
-    </w:lvl>
-    <w:lvl w:ilvl="3" w:tplc="040C000F" w:tentative="1">
-      <w:start w:val="1"/>
-      <w:numFmt w:val="decimal"/>
-      <w:lvlText w:val="%4."/>
-      <w:lvlJc w:val="left"/>
-      <w:pPr>
-        <w:ind w:left="2880" w:hanging="360"/>
-      </w:pPr>
-    </w:lvl>
-    <w:lvl w:ilvl="4" w:tplc="040C0019" w:tentative="1">
-      <w:start w:val="1"/>
-      <w:numFmt w:val="lowerLetter"/>
-      <w:lvlText w:val="%5."/>
-      <w:lvlJc w:val="left"/>
-      <w:pPr>
-        <w:ind w:left="3600" w:hanging="360"/>
-      </w:pPr>
-    </w:lvl>
-    <w:lvl w:ilvl="5" w:tplc="040C001B" w:tentative="1">
-      <w:start w:val="1"/>
-      <w:numFmt w:val="lowerRoman"/>
-      <w:lvlText w:val="%6."/>
-      <w:lvlJc w:val="right"/>
-      <w:pPr>
-        <w:ind w:left="4320" w:hanging="180"/>
-      </w:pPr>
-    </w:lvl>
-    <w:lvl w:ilvl="6" w:tplc="040C000F" w:tentative="1">
-      <w:start w:val="1"/>
-      <w:numFmt w:val="decimal"/>
-      <w:lvlText w:val="%7."/>
-      <w:lvlJc w:val="left"/>
-      <w:pPr>
-        <w:ind w:left="5040" w:hanging="360"/>
-      </w:pPr>
-    </w:lvl>
-    <w:lvl w:ilvl="7" w:tplc="040C0019" w:tentative="1">
-      <w:start w:val="1"/>
-      <w:numFmt w:val="lowerLetter"/>
-      <w:lvlText w:val="%8."/>
-      <w:lvlJc w:val="left"/>
-      <w:pPr>
-        <w:ind w:left="5760" w:hanging="360"/>
-      </w:pPr>
-    </w:lvl>
-    <w:lvl w:ilvl="8" w:tplc="040C001B" w:tentative="1">
-      <w:start w:val="1"/>
-      <w:numFmt w:val="lowerRoman"/>
-      <w:lvlText w:val="%9."/>
-      <w:lvlJc w:val="right"/>
-      <w:pPr>
-        <w:ind w:left="6480" w:hanging="180"/>
-      </w:pPr>
-    </w:lvl>
-  </w:abstractNum>
-  <w:abstractNum w:abstractNumId="7">
-    <w:nsid w:val="6C944ACB"/>
-    <w:multiLevelType w:val="hybridMultilevel"/>
-    <w:tmpl w:val="3E026470"/>
-    <w:lvl w:ilvl="0" w:tplc="040C000F">
-      <w:start w:val="1"/>
-      <w:numFmt w:val="decimal"/>
-      <w:lvlText w:val="%1."/>
-      <w:lvlJc w:val="left"/>
-      <w:pPr>
-        <w:ind w:left="720" w:hanging="360"/>
-      </w:pPr>
-    </w:lvl>
-    <w:lvl w:ilvl="1" w:tplc="040C0019" w:tentative="1">
-      <w:start w:val="1"/>
-      <w:numFmt w:val="lowerLetter"/>
-      <w:lvlText w:val="%2."/>
-      <w:lvlJc w:val="left"/>
-      <w:pPr>
-        <w:ind w:left="1440" w:hanging="360"/>
-      </w:pPr>
-    </w:lvl>
-    <w:lvl w:ilvl="2" w:tplc="040C001B" w:tentative="1">
-      <w:start w:val="1"/>
-      <w:numFmt w:val="lowerRoman"/>
-      <w:lvlText w:val="%3."/>
-      <w:lvlJc w:val="right"/>
-      <w:pPr>
-        <w:ind w:left="2160" w:hanging="180"/>
-      </w:pPr>
-    </w:lvl>
-    <w:lvl w:ilvl="3" w:tplc="040C000F" w:tentative="1">
-      <w:start w:val="1"/>
-      <w:numFmt w:val="decimal"/>
-      <w:lvlText w:val="%4."/>
-      <w:lvlJc w:val="left"/>
-      <w:pPr>
-        <w:ind w:left="2880" w:hanging="360"/>
-      </w:pPr>
-    </w:lvl>
-    <w:lvl w:ilvl="4" w:tplc="040C0019" w:tentative="1">
-      <w:start w:val="1"/>
-      <w:numFmt w:val="lowerLetter"/>
-      <w:lvlText w:val="%5."/>
-      <w:lvlJc w:val="left"/>
-      <w:pPr>
-        <w:ind w:left="3600" w:hanging="360"/>
-      </w:pPr>
-    </w:lvl>
-    <w:lvl w:ilvl="5" w:tplc="040C001B" w:tentative="1">
-      <w:start w:val="1"/>
-      <w:numFmt w:val="lowerRoman"/>
-      <w:lvlText w:val="%6."/>
-      <w:lvlJc w:val="right"/>
-      <w:pPr>
-        <w:ind w:left="4320" w:hanging="180"/>
-      </w:pPr>
-    </w:lvl>
-    <w:lvl w:ilvl="6" w:tplc="040C000F" w:tentative="1">
-      <w:start w:val="1"/>
-      <w:numFmt w:val="decimal"/>
-      <w:lvlText w:val="%7."/>
-      <w:lvlJc w:val="left"/>
-      <w:pPr>
-        <w:ind w:left="5040" w:hanging="360"/>
-      </w:pPr>
-    </w:lvl>
-    <w:lvl w:ilvl="7" w:tplc="040C0019" w:tentative="1">
-      <w:start w:val="1"/>
-      <w:numFmt w:val="lowerLetter"/>
-      <w:lvlText w:val="%8."/>
-      <w:lvlJc w:val="left"/>
-      <w:pPr>
-        <w:ind w:left="5760" w:hanging="360"/>
-      </w:pPr>
-    </w:lvl>
-    <w:lvl w:ilvl="8" w:tplc="040C001B" w:tentative="1">
-      <w:start w:val="1"/>
-      <w:numFmt w:val="lowerRoman"/>
-      <w:lvlText w:val="%9."/>
-      <w:lvlJc w:val="right"/>
-      <w:pPr>
-        <w:ind w:left="6480" w:hanging="180"/>
-      </w:pPr>
-    </w:lvl>
-  </w:abstractNum>
-  <w:abstractNum w:abstractNumId="8">
-    <w:nsid w:val="707328F1"/>
-    <w:multiLevelType w:val="hybridMultilevel"/>
-    <w:tmpl w:val="41D04420"/>
+    <w:tmpl w:val="B29A51E6"/>
     <w:lvl w:ilvl="0" w:tplc="040C000F">
       <w:start w:val="1"/>
       <w:numFmt w:val="decimal"/>
@@ -10916,7 +12923,268 @@
       </w:pPr>
     </w:lvl>
   </w:abstractNum>
+  <w:abstractNum w:abstractNumId="7">
+    <w:nsid w:val="5D3211AD"/>
+    <w:multiLevelType w:val="hybridMultilevel"/>
+    <w:tmpl w:val="8DBABEC8"/>
+    <w:lvl w:ilvl="0" w:tplc="040C000F">
+      <w:start w:val="1"/>
+      <w:numFmt w:val="decimal"/>
+      <w:lvlText w:val="%1."/>
+      <w:lvlJc w:val="left"/>
+      <w:pPr>
+        <w:ind w:left="720" w:hanging="360"/>
+      </w:pPr>
+    </w:lvl>
+    <w:lvl w:ilvl="1" w:tplc="040C0019" w:tentative="1">
+      <w:start w:val="1"/>
+      <w:numFmt w:val="lowerLetter"/>
+      <w:lvlText w:val="%2."/>
+      <w:lvlJc w:val="left"/>
+      <w:pPr>
+        <w:ind w:left="1440" w:hanging="360"/>
+      </w:pPr>
+    </w:lvl>
+    <w:lvl w:ilvl="2" w:tplc="040C001B" w:tentative="1">
+      <w:start w:val="1"/>
+      <w:numFmt w:val="lowerRoman"/>
+      <w:lvlText w:val="%3."/>
+      <w:lvlJc w:val="right"/>
+      <w:pPr>
+        <w:ind w:left="2160" w:hanging="180"/>
+      </w:pPr>
+    </w:lvl>
+    <w:lvl w:ilvl="3" w:tplc="040C000F" w:tentative="1">
+      <w:start w:val="1"/>
+      <w:numFmt w:val="decimal"/>
+      <w:lvlText w:val="%4."/>
+      <w:lvlJc w:val="left"/>
+      <w:pPr>
+        <w:ind w:left="2880" w:hanging="360"/>
+      </w:pPr>
+    </w:lvl>
+    <w:lvl w:ilvl="4" w:tplc="040C0019" w:tentative="1">
+      <w:start w:val="1"/>
+      <w:numFmt w:val="lowerLetter"/>
+      <w:lvlText w:val="%5."/>
+      <w:lvlJc w:val="left"/>
+      <w:pPr>
+        <w:ind w:left="3600" w:hanging="360"/>
+      </w:pPr>
+    </w:lvl>
+    <w:lvl w:ilvl="5" w:tplc="040C001B" w:tentative="1">
+      <w:start w:val="1"/>
+      <w:numFmt w:val="lowerRoman"/>
+      <w:lvlText w:val="%6."/>
+      <w:lvlJc w:val="right"/>
+      <w:pPr>
+        <w:ind w:left="4320" w:hanging="180"/>
+      </w:pPr>
+    </w:lvl>
+    <w:lvl w:ilvl="6" w:tplc="040C000F" w:tentative="1">
+      <w:start w:val="1"/>
+      <w:numFmt w:val="decimal"/>
+      <w:lvlText w:val="%7."/>
+      <w:lvlJc w:val="left"/>
+      <w:pPr>
+        <w:ind w:left="5040" w:hanging="360"/>
+      </w:pPr>
+    </w:lvl>
+    <w:lvl w:ilvl="7" w:tplc="040C0019" w:tentative="1">
+      <w:start w:val="1"/>
+      <w:numFmt w:val="lowerLetter"/>
+      <w:lvlText w:val="%8."/>
+      <w:lvlJc w:val="left"/>
+      <w:pPr>
+        <w:ind w:left="5760" w:hanging="360"/>
+      </w:pPr>
+    </w:lvl>
+    <w:lvl w:ilvl="8" w:tplc="040C001B" w:tentative="1">
+      <w:start w:val="1"/>
+      <w:numFmt w:val="lowerRoman"/>
+      <w:lvlText w:val="%9."/>
+      <w:lvlJc w:val="right"/>
+      <w:pPr>
+        <w:ind w:left="6480" w:hanging="180"/>
+      </w:pPr>
+    </w:lvl>
+  </w:abstractNum>
+  <w:abstractNum w:abstractNumId="8">
+    <w:nsid w:val="6C944ACB"/>
+    <w:multiLevelType w:val="hybridMultilevel"/>
+    <w:tmpl w:val="3E026470"/>
+    <w:lvl w:ilvl="0" w:tplc="040C000F">
+      <w:start w:val="1"/>
+      <w:numFmt w:val="decimal"/>
+      <w:lvlText w:val="%1."/>
+      <w:lvlJc w:val="left"/>
+      <w:pPr>
+        <w:ind w:left="720" w:hanging="360"/>
+      </w:pPr>
+    </w:lvl>
+    <w:lvl w:ilvl="1" w:tplc="040C0019" w:tentative="1">
+      <w:start w:val="1"/>
+      <w:numFmt w:val="lowerLetter"/>
+      <w:lvlText w:val="%2."/>
+      <w:lvlJc w:val="left"/>
+      <w:pPr>
+        <w:ind w:left="1440" w:hanging="360"/>
+      </w:pPr>
+    </w:lvl>
+    <w:lvl w:ilvl="2" w:tplc="040C001B" w:tentative="1">
+      <w:start w:val="1"/>
+      <w:numFmt w:val="lowerRoman"/>
+      <w:lvlText w:val="%3."/>
+      <w:lvlJc w:val="right"/>
+      <w:pPr>
+        <w:ind w:left="2160" w:hanging="180"/>
+      </w:pPr>
+    </w:lvl>
+    <w:lvl w:ilvl="3" w:tplc="040C000F" w:tentative="1">
+      <w:start w:val="1"/>
+      <w:numFmt w:val="decimal"/>
+      <w:lvlText w:val="%4."/>
+      <w:lvlJc w:val="left"/>
+      <w:pPr>
+        <w:ind w:left="2880" w:hanging="360"/>
+      </w:pPr>
+    </w:lvl>
+    <w:lvl w:ilvl="4" w:tplc="040C0019" w:tentative="1">
+      <w:start w:val="1"/>
+      <w:numFmt w:val="lowerLetter"/>
+      <w:lvlText w:val="%5."/>
+      <w:lvlJc w:val="left"/>
+      <w:pPr>
+        <w:ind w:left="3600" w:hanging="360"/>
+      </w:pPr>
+    </w:lvl>
+    <w:lvl w:ilvl="5" w:tplc="040C001B" w:tentative="1">
+      <w:start w:val="1"/>
+      <w:numFmt w:val="lowerRoman"/>
+      <w:lvlText w:val="%6."/>
+      <w:lvlJc w:val="right"/>
+      <w:pPr>
+        <w:ind w:left="4320" w:hanging="180"/>
+      </w:pPr>
+    </w:lvl>
+    <w:lvl w:ilvl="6" w:tplc="040C000F" w:tentative="1">
+      <w:start w:val="1"/>
+      <w:numFmt w:val="decimal"/>
+      <w:lvlText w:val="%7."/>
+      <w:lvlJc w:val="left"/>
+      <w:pPr>
+        <w:ind w:left="5040" w:hanging="360"/>
+      </w:pPr>
+    </w:lvl>
+    <w:lvl w:ilvl="7" w:tplc="040C0019" w:tentative="1">
+      <w:start w:val="1"/>
+      <w:numFmt w:val="lowerLetter"/>
+      <w:lvlText w:val="%8."/>
+      <w:lvlJc w:val="left"/>
+      <w:pPr>
+        <w:ind w:left="5760" w:hanging="360"/>
+      </w:pPr>
+    </w:lvl>
+    <w:lvl w:ilvl="8" w:tplc="040C001B" w:tentative="1">
+      <w:start w:val="1"/>
+      <w:numFmt w:val="lowerRoman"/>
+      <w:lvlText w:val="%9."/>
+      <w:lvlJc w:val="right"/>
+      <w:pPr>
+        <w:ind w:left="6480" w:hanging="180"/>
+      </w:pPr>
+    </w:lvl>
+  </w:abstractNum>
   <w:abstractNum w:abstractNumId="9">
+    <w:nsid w:val="707328F1"/>
+    <w:multiLevelType w:val="hybridMultilevel"/>
+    <w:tmpl w:val="41D04420"/>
+    <w:lvl w:ilvl="0" w:tplc="040C000F">
+      <w:start w:val="1"/>
+      <w:numFmt w:val="decimal"/>
+      <w:lvlText w:val="%1."/>
+      <w:lvlJc w:val="left"/>
+      <w:pPr>
+        <w:ind w:left="720" w:hanging="360"/>
+      </w:pPr>
+      <w:rPr>
+        <w:rFonts w:hint="default"/>
+      </w:rPr>
+    </w:lvl>
+    <w:lvl w:ilvl="1" w:tplc="040C0019" w:tentative="1">
+      <w:start w:val="1"/>
+      <w:numFmt w:val="lowerLetter"/>
+      <w:lvlText w:val="%2."/>
+      <w:lvlJc w:val="left"/>
+      <w:pPr>
+        <w:ind w:left="1440" w:hanging="360"/>
+      </w:pPr>
+    </w:lvl>
+    <w:lvl w:ilvl="2" w:tplc="040C001B" w:tentative="1">
+      <w:start w:val="1"/>
+      <w:numFmt w:val="lowerRoman"/>
+      <w:lvlText w:val="%3."/>
+      <w:lvlJc w:val="right"/>
+      <w:pPr>
+        <w:ind w:left="2160" w:hanging="180"/>
+      </w:pPr>
+    </w:lvl>
+    <w:lvl w:ilvl="3" w:tplc="040C000F" w:tentative="1">
+      <w:start w:val="1"/>
+      <w:numFmt w:val="decimal"/>
+      <w:lvlText w:val="%4."/>
+      <w:lvlJc w:val="left"/>
+      <w:pPr>
+        <w:ind w:left="2880" w:hanging="360"/>
+      </w:pPr>
+    </w:lvl>
+    <w:lvl w:ilvl="4" w:tplc="040C0019" w:tentative="1">
+      <w:start w:val="1"/>
+      <w:numFmt w:val="lowerLetter"/>
+      <w:lvlText w:val="%5."/>
+      <w:lvlJc w:val="left"/>
+      <w:pPr>
+        <w:ind w:left="3600" w:hanging="360"/>
+      </w:pPr>
+    </w:lvl>
+    <w:lvl w:ilvl="5" w:tplc="040C001B" w:tentative="1">
+      <w:start w:val="1"/>
+      <w:numFmt w:val="lowerRoman"/>
+      <w:lvlText w:val="%6."/>
+      <w:lvlJc w:val="right"/>
+      <w:pPr>
+        <w:ind w:left="4320" w:hanging="180"/>
+      </w:pPr>
+    </w:lvl>
+    <w:lvl w:ilvl="6" w:tplc="040C000F" w:tentative="1">
+      <w:start w:val="1"/>
+      <w:numFmt w:val="decimal"/>
+      <w:lvlText w:val="%7."/>
+      <w:lvlJc w:val="left"/>
+      <w:pPr>
+        <w:ind w:left="5040" w:hanging="360"/>
+      </w:pPr>
+    </w:lvl>
+    <w:lvl w:ilvl="7" w:tplc="040C0019" w:tentative="1">
+      <w:start w:val="1"/>
+      <w:numFmt w:val="lowerLetter"/>
+      <w:lvlText w:val="%8."/>
+      <w:lvlJc w:val="left"/>
+      <w:pPr>
+        <w:ind w:left="5760" w:hanging="360"/>
+      </w:pPr>
+    </w:lvl>
+    <w:lvl w:ilvl="8" w:tplc="040C001B" w:tentative="1">
+      <w:start w:val="1"/>
+      <w:numFmt w:val="lowerRoman"/>
+      <w:lvlText w:val="%9."/>
+      <w:lvlJc w:val="right"/>
+      <w:pPr>
+        <w:ind w:left="6480" w:hanging="180"/>
+      </w:pPr>
+    </w:lvl>
+  </w:abstractNum>
+  <w:abstractNum w:abstractNumId="10">
     <w:nsid w:val="73583B76"/>
     <w:multiLevelType w:val="hybridMultilevel"/>
     <w:tmpl w:val="783C0D26"/>
@@ -11008,7 +13276,7 @@
       </w:pPr>
     </w:lvl>
   </w:abstractNum>
-  <w:abstractNum w:abstractNumId="10">
+  <w:abstractNum w:abstractNumId="11">
     <w:nsid w:val="73BE1235"/>
     <w:multiLevelType w:val="hybridMultilevel"/>
     <w:tmpl w:val="708ADF02"/>
@@ -11121,7 +13389,7 @@
       </w:rPr>
     </w:lvl>
   </w:abstractNum>
-  <w:abstractNum w:abstractNumId="11">
+  <w:abstractNum w:abstractNumId="12">
     <w:nsid w:val="7D1021B1"/>
     <w:multiLevelType w:val="hybridMultilevel"/>
     <w:tmpl w:val="B7B664D6"/>
@@ -11233,7 +13501,7 @@
       </w:rPr>
     </w:lvl>
   </w:abstractNum>
-  <w:abstractNum w:abstractNumId="12">
+  <w:abstractNum w:abstractNumId="13">
     <w:nsid w:val="7F3447D5"/>
     <w:multiLevelType w:val="hybridMultilevel"/>
     <w:tmpl w:val="2B027B6C"/>
@@ -11323,22 +13591,22 @@
     </w:lvl>
   </w:abstractNum>
   <w:num w:numId="1">
-    <w:abstractNumId w:val="10"/>
+    <w:abstractNumId w:val="11"/>
   </w:num>
   <w:num w:numId="2">
-    <w:abstractNumId w:val="11"/>
+    <w:abstractNumId w:val="12"/>
   </w:num>
   <w:num w:numId="3">
     <w:abstractNumId w:val="5"/>
   </w:num>
   <w:num w:numId="4">
-    <w:abstractNumId w:val="7"/>
+    <w:abstractNumId w:val="8"/>
   </w:num>
   <w:num w:numId="5">
-    <w:abstractNumId w:val="9"/>
+    <w:abstractNumId w:val="10"/>
   </w:num>
   <w:num w:numId="6">
-    <w:abstractNumId w:val="6"/>
+    <w:abstractNumId w:val="7"/>
   </w:num>
   <w:num w:numId="7">
     <w:abstractNumId w:val="0"/>
@@ -11353,13 +13621,16 @@
     <w:abstractNumId w:val="3"/>
   </w:num>
   <w:num w:numId="11">
-    <w:abstractNumId w:val="8"/>
+    <w:abstractNumId w:val="9"/>
   </w:num>
   <w:num w:numId="12">
-    <w:abstractNumId w:val="12"/>
+    <w:abstractNumId w:val="13"/>
   </w:num>
   <w:num w:numId="13">
     <w:abstractNumId w:val="2"/>
+  </w:num>
+  <w:num w:numId="14">
+    <w:abstractNumId w:val="6"/>
   </w:num>
 </w:numbering>
 </file>
@@ -11961,6 +14232,7 @@
   <w:style w:type="character" w:default="1" w:styleId="DefaultParagraphFont">
     <w:name w:val="Default Paragraph Font"/>
     <w:uiPriority w:val="1"/>
+    <w:semiHidden/>
     <w:unhideWhenUsed/>
   </w:style>
   <w:style w:type="table" w:default="1" w:styleId="TableNormal">

</xml_diff>

<commit_message>
Partie 6 – Prompt Engineering pour le Machine Learning:Prompt pour proposer les visualisations de données les plus pertinentes
</commit_message>
<xml_diff>
--- a/ai-business_assistant/correction_atelier_prompt-engineering.docx
+++ b/ai-business_assistant/correction_atelier_prompt-engineering.docx
@@ -11459,10 +11459,12 @@
       <w:r>
         <w:rPr>
           <w:rFonts w:ascii="Times New Roman" w:hAnsi="Times New Roman" w:cs="Times New Roman"/>
-          <w:color w:val="000000"/>
-          <w:kern w:val="0"/>
-          <w:sz w:val="24"/>
-          <w:szCs w:val="24"/>
+          <w:noProof/>
+          <w:color w:val="000000"/>
+          <w:kern w:val="0"/>
+          <w:sz w:val="24"/>
+          <w:szCs w:val="24"/>
+          <w:lang w:eastAsia="fr-FR"/>
         </w:rPr>
         <w:drawing>
           <wp:inline distT="0" distB="0" distL="0" distR="0" wp14:anchorId="7EEAEB97" wp14:editId="24DE9E99">
@@ -11520,10 +11522,12 @@
       <w:r>
         <w:rPr>
           <w:rFonts w:ascii="Times New Roman" w:hAnsi="Times New Roman" w:cs="Times New Roman"/>
-          <w:color w:val="000000"/>
-          <w:kern w:val="0"/>
-          <w:sz w:val="24"/>
-          <w:szCs w:val="24"/>
+          <w:noProof/>
+          <w:color w:val="000000"/>
+          <w:kern w:val="0"/>
+          <w:sz w:val="24"/>
+          <w:szCs w:val="24"/>
+          <w:lang w:eastAsia="fr-FR"/>
         </w:rPr>
         <w:drawing>
           <wp:inline distT="0" distB="0" distL="0" distR="0" wp14:anchorId="7201EEF6" wp14:editId="7B1C866C">
@@ -11581,10 +11585,12 @@
       <w:r>
         <w:rPr>
           <w:rFonts w:ascii="Times New Roman" w:hAnsi="Times New Roman" w:cs="Times New Roman"/>
-          <w:color w:val="000000"/>
-          <w:kern w:val="0"/>
-          <w:sz w:val="24"/>
-          <w:szCs w:val="24"/>
+          <w:noProof/>
+          <w:color w:val="000000"/>
+          <w:kern w:val="0"/>
+          <w:sz w:val="24"/>
+          <w:szCs w:val="24"/>
+          <w:lang w:eastAsia="fr-FR"/>
         </w:rPr>
         <w:lastRenderedPageBreak/>
         <w:drawing>
@@ -11643,10 +11649,12 @@
       <w:r>
         <w:rPr>
           <w:rFonts w:ascii="Times New Roman" w:hAnsi="Times New Roman" w:cs="Times New Roman"/>
-          <w:color w:val="000000"/>
-          <w:kern w:val="0"/>
-          <w:sz w:val="24"/>
-          <w:szCs w:val="24"/>
+          <w:noProof/>
+          <w:color w:val="000000"/>
+          <w:kern w:val="0"/>
+          <w:sz w:val="24"/>
+          <w:szCs w:val="24"/>
+          <w:lang w:eastAsia="fr-FR"/>
         </w:rPr>
         <w:drawing>
           <wp:inline distT="0" distB="0" distL="0" distR="0" wp14:anchorId="6984C04B" wp14:editId="7D5370ED">
@@ -11704,10 +11712,12 @@
       <w:r>
         <w:rPr>
           <w:rFonts w:ascii="Times New Roman" w:hAnsi="Times New Roman" w:cs="Times New Roman"/>
-          <w:color w:val="000000"/>
-          <w:kern w:val="0"/>
-          <w:sz w:val="24"/>
-          <w:szCs w:val="24"/>
+          <w:noProof/>
+          <w:color w:val="000000"/>
+          <w:kern w:val="0"/>
+          <w:sz w:val="24"/>
+          <w:szCs w:val="24"/>
+          <w:lang w:eastAsia="fr-FR"/>
         </w:rPr>
         <w:lastRenderedPageBreak/>
         <w:drawing>
@@ -11766,10 +11776,12 @@
       <w:r>
         <w:rPr>
           <w:rFonts w:ascii="Times New Roman" w:hAnsi="Times New Roman" w:cs="Times New Roman"/>
-          <w:color w:val="000000"/>
-          <w:kern w:val="0"/>
-          <w:sz w:val="24"/>
-          <w:szCs w:val="24"/>
+          <w:noProof/>
+          <w:color w:val="000000"/>
+          <w:kern w:val="0"/>
+          <w:sz w:val="24"/>
+          <w:szCs w:val="24"/>
+          <w:lang w:eastAsia="fr-FR"/>
         </w:rPr>
         <w:drawing>
           <wp:inline distT="0" distB="0" distL="0" distR="0" wp14:anchorId="44B89432" wp14:editId="007353B7">
@@ -11827,10 +11839,12 @@
       <w:r>
         <w:rPr>
           <w:rFonts w:ascii="Times New Roman" w:hAnsi="Times New Roman" w:cs="Times New Roman"/>
-          <w:color w:val="000000"/>
-          <w:kern w:val="0"/>
-          <w:sz w:val="24"/>
-          <w:szCs w:val="24"/>
+          <w:noProof/>
+          <w:color w:val="000000"/>
+          <w:kern w:val="0"/>
+          <w:sz w:val="24"/>
+          <w:szCs w:val="24"/>
+          <w:lang w:eastAsia="fr-FR"/>
         </w:rPr>
         <w:lastRenderedPageBreak/>
         <w:drawing>
@@ -11889,10 +11903,12 @@
       <w:r>
         <w:rPr>
           <w:rFonts w:ascii="Times New Roman" w:hAnsi="Times New Roman" w:cs="Times New Roman"/>
-          <w:color w:val="000000"/>
-          <w:kern w:val="0"/>
-          <w:sz w:val="24"/>
-          <w:szCs w:val="24"/>
+          <w:noProof/>
+          <w:color w:val="000000"/>
+          <w:kern w:val="0"/>
+          <w:sz w:val="24"/>
+          <w:szCs w:val="24"/>
+          <w:lang w:eastAsia="fr-FR"/>
         </w:rPr>
         <w:drawing>
           <wp:inline distT="0" distB="0" distL="0" distR="0" wp14:anchorId="5F29FA76" wp14:editId="276047F0">
@@ -11950,10 +11966,12 @@
       <w:r>
         <w:rPr>
           <w:rFonts w:ascii="Times New Roman" w:hAnsi="Times New Roman" w:cs="Times New Roman"/>
-          <w:color w:val="000000"/>
-          <w:kern w:val="0"/>
-          <w:sz w:val="24"/>
-          <w:szCs w:val="24"/>
+          <w:noProof/>
+          <w:color w:val="000000"/>
+          <w:kern w:val="0"/>
+          <w:sz w:val="24"/>
+          <w:szCs w:val="24"/>
+          <w:lang w:eastAsia="fr-FR"/>
         </w:rPr>
         <w:lastRenderedPageBreak/>
         <w:drawing>
@@ -12012,10 +12030,12 @@
       <w:r>
         <w:rPr>
           <w:rFonts w:ascii="Times New Roman" w:hAnsi="Times New Roman" w:cs="Times New Roman"/>
-          <w:color w:val="000000"/>
-          <w:kern w:val="0"/>
-          <w:sz w:val="24"/>
-          <w:szCs w:val="24"/>
+          <w:noProof/>
+          <w:color w:val="000000"/>
+          <w:kern w:val="0"/>
+          <w:sz w:val="24"/>
+          <w:szCs w:val="24"/>
+          <w:lang w:eastAsia="fr-FR"/>
         </w:rPr>
         <w:drawing>
           <wp:inline distT="0" distB="0" distL="0" distR="0" wp14:anchorId="3188AC37" wp14:editId="025DE416">
@@ -12073,10 +12093,12 @@
       <w:r>
         <w:rPr>
           <w:rFonts w:ascii="Times New Roman" w:hAnsi="Times New Roman" w:cs="Times New Roman"/>
-          <w:color w:val="000000"/>
-          <w:kern w:val="0"/>
-          <w:sz w:val="24"/>
-          <w:szCs w:val="24"/>
+          <w:noProof/>
+          <w:color w:val="000000"/>
+          <w:kern w:val="0"/>
+          <w:sz w:val="24"/>
+          <w:szCs w:val="24"/>
+          <w:lang w:eastAsia="fr-FR"/>
         </w:rPr>
         <w:lastRenderedPageBreak/>
         <w:drawing>
@@ -12135,10 +12157,12 @@
       <w:r>
         <w:rPr>
           <w:rFonts w:ascii="Times New Roman" w:hAnsi="Times New Roman" w:cs="Times New Roman"/>
-          <w:color w:val="000000"/>
-          <w:kern w:val="0"/>
-          <w:sz w:val="24"/>
-          <w:szCs w:val="24"/>
+          <w:noProof/>
+          <w:color w:val="000000"/>
+          <w:kern w:val="0"/>
+          <w:sz w:val="24"/>
+          <w:szCs w:val="24"/>
+          <w:lang w:eastAsia="fr-FR"/>
         </w:rPr>
         <w:drawing>
           <wp:inline distT="0" distB="0" distL="0" distR="0" wp14:anchorId="6BCFE34C" wp14:editId="04CA76CD">
@@ -12176,8 +12200,6 @@
           </wp:inline>
         </w:drawing>
       </w:r>
-      <w:bookmarkStart w:id="0" w:name="_GoBack"/>
-      <w:bookmarkEnd w:id="0"/>
     </w:p>
     <w:p>
       <w:pPr>
@@ -12185,15 +12207,1712 @@
         <w:autoSpaceDN w:val="0"/>
         <w:adjustRightInd w:val="0"/>
         <w:spacing w:after="0" w:line="360" w:lineRule="auto"/>
-        <w:jc w:val="both"/>
-        <w:rPr>
-          <w:rFonts w:ascii="Times New Roman" w:hAnsi="Times New Roman" w:cs="Times New Roman"/>
-          <w:color w:val="000000"/>
-          <w:kern w:val="0"/>
-          <w:sz w:val="24"/>
-          <w:szCs w:val="24"/>
-        </w:rPr>
-      </w:pPr>
+        <w:ind w:left="360"/>
+        <w:jc w:val="center"/>
+        <w:rPr>
+          <w:rFonts w:ascii="Times New Roman" w:hAnsi="Times New Roman" w:cs="Times New Roman"/>
+          <w:color w:val="000000"/>
+          <w:kern w:val="0"/>
+          <w:sz w:val="24"/>
+          <w:szCs w:val="24"/>
+        </w:rPr>
+      </w:pPr>
+    </w:p>
+    <w:p>
+      <w:pPr>
+        <w:pStyle w:val="ListParagraph"/>
+        <w:numPr>
+          <w:ilvl w:val="0"/>
+          <w:numId w:val="14"/>
+        </w:numPr>
+        <w:autoSpaceDE w:val="0"/>
+        <w:autoSpaceDN w:val="0"/>
+        <w:adjustRightInd w:val="0"/>
+        <w:spacing w:after="0" w:line="360" w:lineRule="auto"/>
+        <w:jc w:val="both"/>
+        <w:rPr>
+          <w:rFonts w:ascii="Times New Roman" w:hAnsi="Times New Roman" w:cs="Times New Roman"/>
+          <w:kern w:val="0"/>
+          <w:sz w:val="24"/>
+          <w:szCs w:val="24"/>
+        </w:rPr>
+      </w:pPr>
+      <w:r>
+        <w:rPr>
+          <w:rFonts w:ascii="Times New Roman" w:hAnsi="Times New Roman" w:cs="Times New Roman"/>
+          <w:kern w:val="0"/>
+          <w:sz w:val="24"/>
+          <w:szCs w:val="24"/>
+        </w:rPr>
+        <w:t xml:space="preserve">Créer un prompt permettant, à partir du </w:t>
+      </w:r>
+      <w:proofErr w:type="spellStart"/>
+      <w:r>
+        <w:rPr>
+          <w:rFonts w:ascii="Times New Roman" w:hAnsi="Times New Roman" w:cs="Times New Roman"/>
+          <w:kern w:val="0"/>
+          <w:sz w:val="24"/>
+          <w:szCs w:val="24"/>
+        </w:rPr>
+        <w:t>dataset</w:t>
+      </w:r>
+      <w:proofErr w:type="spellEnd"/>
+      <w:r>
+        <w:rPr>
+          <w:rFonts w:ascii="Times New Roman" w:hAnsi="Times New Roman" w:cs="Times New Roman"/>
+          <w:kern w:val="0"/>
+          <w:sz w:val="24"/>
+          <w:szCs w:val="24"/>
+        </w:rPr>
+        <w:t xml:space="preserve"> des capteurs, de proposer les visualisations</w:t>
+      </w:r>
+      <w:r>
+        <w:rPr>
+          <w:rFonts w:ascii="Times New Roman" w:hAnsi="Times New Roman" w:cs="Times New Roman"/>
+          <w:kern w:val="0"/>
+          <w:sz w:val="24"/>
+          <w:szCs w:val="24"/>
+        </w:rPr>
+        <w:t xml:space="preserve"> </w:t>
+      </w:r>
+      <w:r>
+        <w:rPr>
+          <w:rFonts w:ascii="Times New Roman" w:hAnsi="Times New Roman" w:cs="Times New Roman"/>
+          <w:kern w:val="0"/>
+          <w:sz w:val="24"/>
+          <w:szCs w:val="24"/>
+        </w:rPr>
+        <w:t>les plus pertinentes pour comprendre la consommation éne</w:t>
+      </w:r>
+      <w:r>
+        <w:rPr>
+          <w:rFonts w:ascii="Times New Roman" w:hAnsi="Times New Roman" w:cs="Times New Roman"/>
+          <w:kern w:val="0"/>
+          <w:sz w:val="24"/>
+          <w:szCs w:val="24"/>
+        </w:rPr>
+        <w:t xml:space="preserve">rgétique d'un bâtiment. Et pour chaque </w:t>
+      </w:r>
+      <w:r>
+        <w:rPr>
+          <w:rFonts w:ascii="Times New Roman" w:hAnsi="Times New Roman" w:cs="Times New Roman"/>
+          <w:kern w:val="0"/>
+          <w:sz w:val="24"/>
+          <w:szCs w:val="24"/>
+        </w:rPr>
+        <w:t>visualisation indiquer le type de graphique, les var</w:t>
+      </w:r>
+      <w:r>
+        <w:rPr>
+          <w:rFonts w:ascii="Times New Roman" w:hAnsi="Times New Roman" w:cs="Times New Roman"/>
+          <w:kern w:val="0"/>
+          <w:sz w:val="24"/>
+          <w:szCs w:val="24"/>
+        </w:rPr>
+        <w:t xml:space="preserve">iables utilisées, l’objectif et </w:t>
+      </w:r>
+      <w:r>
+        <w:rPr>
+          <w:rFonts w:ascii="Times New Roman" w:hAnsi="Times New Roman" w:cs="Times New Roman"/>
+          <w:kern w:val="0"/>
+          <w:sz w:val="24"/>
+          <w:szCs w:val="24"/>
+        </w:rPr>
+        <w:t>l’interprétation attendue.</w:t>
+      </w:r>
+    </w:p>
+    <w:p>
+      <w:pPr>
+        <w:pStyle w:val="ListParagraph"/>
+        <w:numPr>
+          <w:ilvl w:val="0"/>
+          <w:numId w:val="15"/>
+        </w:numPr>
+        <w:autoSpaceDE w:val="0"/>
+        <w:autoSpaceDN w:val="0"/>
+        <w:adjustRightInd w:val="0"/>
+        <w:spacing w:after="0" w:line="360" w:lineRule="auto"/>
+        <w:jc w:val="center"/>
+        <w:rPr>
+          <w:rFonts w:ascii="Times New Roman" w:hAnsi="Times New Roman" w:cs="Times New Roman"/>
+          <w:kern w:val="0"/>
+          <w:sz w:val="24"/>
+          <w:szCs w:val="24"/>
+        </w:rPr>
+      </w:pPr>
+      <w:r>
+        <w:rPr>
+          <w:rFonts w:ascii="Times New Roman" w:hAnsi="Times New Roman" w:cs="Times New Roman"/>
+          <w:b/>
+          <w:kern w:val="0"/>
+          <w:sz w:val="24"/>
+          <w:szCs w:val="24"/>
+        </w:rPr>
+        <w:t>Prompt proposé</w:t>
+      </w:r>
+    </w:p>
+    <w:p>
+      <w:pPr>
+        <w:autoSpaceDE w:val="0"/>
+        <w:autoSpaceDN w:val="0"/>
+        <w:adjustRightInd w:val="0"/>
+        <w:spacing w:after="0" w:line="360" w:lineRule="auto"/>
+        <w:jc w:val="both"/>
+        <w:rPr>
+          <w:rFonts w:ascii="Times New Roman" w:hAnsi="Times New Roman" w:cs="Times New Roman"/>
+          <w:b/>
+          <w:color w:val="000000"/>
+          <w:kern w:val="0"/>
+          <w:sz w:val="24"/>
+          <w:szCs w:val="24"/>
+        </w:rPr>
+      </w:pPr>
+      <w:r>
+        <w:rPr>
+          <w:rFonts w:ascii="Times New Roman" w:hAnsi="Times New Roman" w:cs="Times New Roman"/>
+          <w:b/>
+          <w:color w:val="000000"/>
+          <w:kern w:val="0"/>
+          <w:sz w:val="24"/>
+          <w:szCs w:val="24"/>
+        </w:rPr>
+        <w:t>Rôle :</w:t>
+      </w:r>
+    </w:p>
+    <w:p>
+      <w:pPr>
+        <w:autoSpaceDE w:val="0"/>
+        <w:autoSpaceDN w:val="0"/>
+        <w:adjustRightInd w:val="0"/>
+        <w:spacing w:after="0" w:line="360" w:lineRule="auto"/>
+        <w:jc w:val="both"/>
+        <w:rPr>
+          <w:rFonts w:ascii="Times New Roman" w:hAnsi="Times New Roman" w:cs="Times New Roman"/>
+          <w:color w:val="000000"/>
+          <w:kern w:val="0"/>
+          <w:sz w:val="24"/>
+          <w:szCs w:val="24"/>
+        </w:rPr>
+      </w:pPr>
+      <w:r>
+        <w:rPr>
+          <w:rFonts w:ascii="Times New Roman" w:hAnsi="Times New Roman" w:cs="Times New Roman"/>
+          <w:color w:val="000000"/>
+          <w:kern w:val="0"/>
+          <w:sz w:val="24"/>
+          <w:szCs w:val="24"/>
+        </w:rPr>
+        <w:t xml:space="preserve">Tu es un data </w:t>
+      </w:r>
+      <w:proofErr w:type="spellStart"/>
+      <w:r>
+        <w:rPr>
+          <w:rFonts w:ascii="Times New Roman" w:hAnsi="Times New Roman" w:cs="Times New Roman"/>
+          <w:color w:val="000000"/>
+          <w:kern w:val="0"/>
+          <w:sz w:val="24"/>
+          <w:szCs w:val="24"/>
+        </w:rPr>
+        <w:t>analyst</w:t>
+      </w:r>
+      <w:proofErr w:type="spellEnd"/>
+      <w:r>
+        <w:rPr>
+          <w:rFonts w:ascii="Times New Roman" w:hAnsi="Times New Roman" w:cs="Times New Roman"/>
+          <w:color w:val="000000"/>
+          <w:kern w:val="0"/>
+          <w:sz w:val="24"/>
+          <w:szCs w:val="24"/>
+        </w:rPr>
+        <w:t xml:space="preserve"> spécialisé en visualisation de données pour l'an</w:t>
+      </w:r>
+      <w:r>
+        <w:rPr>
+          <w:rFonts w:ascii="Times New Roman" w:hAnsi="Times New Roman" w:cs="Times New Roman"/>
+          <w:color w:val="000000"/>
+          <w:kern w:val="0"/>
+          <w:sz w:val="24"/>
+          <w:szCs w:val="24"/>
+        </w:rPr>
+        <w:t xml:space="preserve">alyse </w:t>
+      </w:r>
+      <w:r>
+        <w:rPr>
+          <w:rFonts w:ascii="Times New Roman" w:hAnsi="Times New Roman" w:cs="Times New Roman"/>
+          <w:color w:val="000000"/>
+          <w:kern w:val="0"/>
+          <w:sz w:val="24"/>
+          <w:szCs w:val="24"/>
+        </w:rPr>
+        <w:t xml:space="preserve">de la consommation </w:t>
+      </w:r>
+      <w:r>
+        <w:rPr>
+          <w:rFonts w:ascii="Times New Roman" w:hAnsi="Times New Roman" w:cs="Times New Roman"/>
+          <w:color w:val="000000"/>
+          <w:kern w:val="0"/>
+          <w:sz w:val="24"/>
+          <w:szCs w:val="24"/>
+        </w:rPr>
+        <w:t>énergétique de bâtiments.</w:t>
+      </w:r>
+    </w:p>
+    <w:p>
+      <w:pPr>
+        <w:autoSpaceDE w:val="0"/>
+        <w:autoSpaceDN w:val="0"/>
+        <w:adjustRightInd w:val="0"/>
+        <w:spacing w:after="0" w:line="360" w:lineRule="auto"/>
+        <w:jc w:val="both"/>
+        <w:rPr>
+          <w:rFonts w:ascii="Times New Roman" w:hAnsi="Times New Roman" w:cs="Times New Roman"/>
+          <w:b/>
+          <w:color w:val="000000"/>
+          <w:kern w:val="0"/>
+          <w:sz w:val="24"/>
+          <w:szCs w:val="24"/>
+        </w:rPr>
+      </w:pPr>
+      <w:r>
+        <w:rPr>
+          <w:rFonts w:ascii="Times New Roman" w:hAnsi="Times New Roman" w:cs="Times New Roman"/>
+          <w:b/>
+          <w:color w:val="000000"/>
+          <w:kern w:val="0"/>
+          <w:sz w:val="24"/>
+          <w:szCs w:val="24"/>
+        </w:rPr>
+        <w:t>Contexte :</w:t>
+      </w:r>
+    </w:p>
+    <w:p>
+      <w:pPr>
+        <w:autoSpaceDE w:val="0"/>
+        <w:autoSpaceDN w:val="0"/>
+        <w:adjustRightInd w:val="0"/>
+        <w:spacing w:after="0" w:line="360" w:lineRule="auto"/>
+        <w:jc w:val="both"/>
+        <w:rPr>
+          <w:rFonts w:ascii="Times New Roman" w:hAnsi="Times New Roman" w:cs="Times New Roman"/>
+          <w:color w:val="000000"/>
+          <w:kern w:val="0"/>
+          <w:sz w:val="24"/>
+          <w:szCs w:val="24"/>
+        </w:rPr>
+      </w:pPr>
+      <w:r>
+        <w:rPr>
+          <w:rFonts w:ascii="Times New Roman" w:hAnsi="Times New Roman" w:cs="Times New Roman"/>
+          <w:color w:val="000000"/>
+          <w:kern w:val="0"/>
+          <w:sz w:val="24"/>
+          <w:szCs w:val="24"/>
+        </w:rPr>
+        <w:t xml:space="preserve">Je dispose d'un </w:t>
+      </w:r>
+      <w:proofErr w:type="spellStart"/>
+      <w:r>
+        <w:rPr>
+          <w:rFonts w:ascii="Times New Roman" w:hAnsi="Times New Roman" w:cs="Times New Roman"/>
+          <w:color w:val="000000"/>
+          <w:kern w:val="0"/>
+          <w:sz w:val="24"/>
+          <w:szCs w:val="24"/>
+        </w:rPr>
+        <w:t>dataset</w:t>
+      </w:r>
+      <w:proofErr w:type="spellEnd"/>
+      <w:r>
+        <w:rPr>
+          <w:rFonts w:ascii="Times New Roman" w:hAnsi="Times New Roman" w:cs="Times New Roman"/>
+          <w:color w:val="000000"/>
+          <w:kern w:val="0"/>
+          <w:sz w:val="24"/>
+          <w:szCs w:val="24"/>
+        </w:rPr>
+        <w:t xml:space="preserve"> de mesures de capteurs insta</w:t>
+      </w:r>
+      <w:r>
+        <w:rPr>
+          <w:rFonts w:ascii="Times New Roman" w:hAnsi="Times New Roman" w:cs="Times New Roman"/>
+          <w:color w:val="000000"/>
+          <w:kern w:val="0"/>
+          <w:sz w:val="24"/>
+          <w:szCs w:val="24"/>
+        </w:rPr>
+        <w:t xml:space="preserve">llés dans plusieurs bâtiments, </w:t>
+      </w:r>
+      <w:r>
+        <w:rPr>
+          <w:rFonts w:ascii="Times New Roman" w:hAnsi="Times New Roman" w:cs="Times New Roman"/>
+          <w:color w:val="000000"/>
+          <w:kern w:val="0"/>
+          <w:sz w:val="24"/>
+          <w:szCs w:val="24"/>
+        </w:rPr>
+        <w:t>avec les colonnes suivantes :</w:t>
+      </w:r>
+    </w:p>
+    <w:p>
+      <w:pPr>
+        <w:autoSpaceDE w:val="0"/>
+        <w:autoSpaceDN w:val="0"/>
+        <w:adjustRightInd w:val="0"/>
+        <w:spacing w:after="0" w:line="360" w:lineRule="auto"/>
+        <w:jc w:val="both"/>
+        <w:rPr>
+          <w:rFonts w:ascii="Times New Roman" w:hAnsi="Times New Roman" w:cs="Times New Roman"/>
+          <w:color w:val="000000"/>
+          <w:kern w:val="0"/>
+          <w:sz w:val="24"/>
+          <w:szCs w:val="24"/>
+        </w:rPr>
+      </w:pPr>
+      <w:r>
+        <w:rPr>
+          <w:rFonts w:ascii="Times New Roman" w:hAnsi="Times New Roman" w:cs="Times New Roman"/>
+          <w:color w:val="000000"/>
+          <w:kern w:val="0"/>
+          <w:sz w:val="24"/>
+          <w:szCs w:val="24"/>
+        </w:rPr>
+        <w:t xml:space="preserve">- </w:t>
+      </w:r>
+      <w:proofErr w:type="spellStart"/>
+      <w:r>
+        <w:rPr>
+          <w:rFonts w:ascii="Times New Roman" w:hAnsi="Times New Roman" w:cs="Times New Roman"/>
+          <w:color w:val="000000"/>
+          <w:kern w:val="0"/>
+          <w:sz w:val="24"/>
+          <w:szCs w:val="24"/>
+        </w:rPr>
+        <w:t>id_mesure</w:t>
+      </w:r>
+      <w:proofErr w:type="spellEnd"/>
+      <w:r>
+        <w:rPr>
+          <w:rFonts w:ascii="Times New Roman" w:hAnsi="Times New Roman" w:cs="Times New Roman"/>
+          <w:color w:val="000000"/>
+          <w:kern w:val="0"/>
+          <w:sz w:val="24"/>
+          <w:szCs w:val="24"/>
+        </w:rPr>
+        <w:t xml:space="preserve"> (identifiant unique de la mesure)</w:t>
+      </w:r>
+    </w:p>
+    <w:p>
+      <w:pPr>
+        <w:autoSpaceDE w:val="0"/>
+        <w:autoSpaceDN w:val="0"/>
+        <w:adjustRightInd w:val="0"/>
+        <w:spacing w:after="0" w:line="360" w:lineRule="auto"/>
+        <w:jc w:val="both"/>
+        <w:rPr>
+          <w:rFonts w:ascii="Times New Roman" w:hAnsi="Times New Roman" w:cs="Times New Roman"/>
+          <w:color w:val="000000"/>
+          <w:kern w:val="0"/>
+          <w:sz w:val="24"/>
+          <w:szCs w:val="24"/>
+        </w:rPr>
+      </w:pPr>
+      <w:r>
+        <w:rPr>
+          <w:rFonts w:ascii="Times New Roman" w:hAnsi="Times New Roman" w:cs="Times New Roman"/>
+          <w:color w:val="000000"/>
+          <w:kern w:val="0"/>
+          <w:sz w:val="24"/>
+          <w:szCs w:val="24"/>
+        </w:rPr>
+        <w:t xml:space="preserve">- </w:t>
+      </w:r>
+      <w:proofErr w:type="spellStart"/>
+      <w:r>
+        <w:rPr>
+          <w:rFonts w:ascii="Times New Roman" w:hAnsi="Times New Roman" w:cs="Times New Roman"/>
+          <w:color w:val="000000"/>
+          <w:kern w:val="0"/>
+          <w:sz w:val="24"/>
+          <w:szCs w:val="24"/>
+        </w:rPr>
+        <w:t>date_heure</w:t>
+      </w:r>
+      <w:proofErr w:type="spellEnd"/>
+      <w:r>
+        <w:rPr>
+          <w:rFonts w:ascii="Times New Roman" w:hAnsi="Times New Roman" w:cs="Times New Roman"/>
+          <w:color w:val="000000"/>
+          <w:kern w:val="0"/>
+          <w:sz w:val="24"/>
+          <w:szCs w:val="24"/>
+        </w:rPr>
+        <w:t xml:space="preserve"> (horodatage de la mesure)</w:t>
+      </w:r>
+    </w:p>
+    <w:p>
+      <w:pPr>
+        <w:autoSpaceDE w:val="0"/>
+        <w:autoSpaceDN w:val="0"/>
+        <w:adjustRightInd w:val="0"/>
+        <w:spacing w:after="0" w:line="360" w:lineRule="auto"/>
+        <w:jc w:val="both"/>
+        <w:rPr>
+          <w:rFonts w:ascii="Times New Roman" w:hAnsi="Times New Roman" w:cs="Times New Roman"/>
+          <w:color w:val="000000"/>
+          <w:kern w:val="0"/>
+          <w:sz w:val="24"/>
+          <w:szCs w:val="24"/>
+        </w:rPr>
+      </w:pPr>
+      <w:r>
+        <w:rPr>
+          <w:rFonts w:ascii="Times New Roman" w:hAnsi="Times New Roman" w:cs="Times New Roman"/>
+          <w:color w:val="000000"/>
+          <w:kern w:val="0"/>
+          <w:sz w:val="24"/>
+          <w:szCs w:val="24"/>
+        </w:rPr>
+        <w:lastRenderedPageBreak/>
+        <w:t xml:space="preserve">- </w:t>
+      </w:r>
+      <w:proofErr w:type="spellStart"/>
+      <w:r>
+        <w:rPr>
+          <w:rFonts w:ascii="Times New Roman" w:hAnsi="Times New Roman" w:cs="Times New Roman"/>
+          <w:color w:val="000000"/>
+          <w:kern w:val="0"/>
+          <w:sz w:val="24"/>
+          <w:szCs w:val="24"/>
+        </w:rPr>
+        <w:t>id_capteur</w:t>
+      </w:r>
+      <w:proofErr w:type="spellEnd"/>
+      <w:r>
+        <w:rPr>
+          <w:rFonts w:ascii="Times New Roman" w:hAnsi="Times New Roman" w:cs="Times New Roman"/>
+          <w:color w:val="000000"/>
+          <w:kern w:val="0"/>
+          <w:sz w:val="24"/>
+          <w:szCs w:val="24"/>
+        </w:rPr>
+        <w:t xml:space="preserve"> (12 capteurs différents, ex : C001 à C012)</w:t>
+      </w:r>
+    </w:p>
+    <w:p>
+      <w:pPr>
+        <w:autoSpaceDE w:val="0"/>
+        <w:autoSpaceDN w:val="0"/>
+        <w:adjustRightInd w:val="0"/>
+        <w:spacing w:after="0" w:line="360" w:lineRule="auto"/>
+        <w:jc w:val="both"/>
+        <w:rPr>
+          <w:rFonts w:ascii="Times New Roman" w:hAnsi="Times New Roman" w:cs="Times New Roman"/>
+          <w:color w:val="000000"/>
+          <w:kern w:val="0"/>
+          <w:sz w:val="24"/>
+          <w:szCs w:val="24"/>
+        </w:rPr>
+      </w:pPr>
+      <w:r>
+        <w:rPr>
+          <w:rFonts w:ascii="Times New Roman" w:hAnsi="Times New Roman" w:cs="Times New Roman"/>
+          <w:color w:val="000000"/>
+          <w:kern w:val="0"/>
+          <w:sz w:val="24"/>
+          <w:szCs w:val="24"/>
+        </w:rPr>
+        <w:t xml:space="preserve">- </w:t>
+      </w:r>
+      <w:proofErr w:type="spellStart"/>
+      <w:r>
+        <w:rPr>
+          <w:rFonts w:ascii="Times New Roman" w:hAnsi="Times New Roman" w:cs="Times New Roman"/>
+          <w:color w:val="000000"/>
+          <w:kern w:val="0"/>
+          <w:sz w:val="24"/>
+          <w:szCs w:val="24"/>
+        </w:rPr>
+        <w:t>batiment</w:t>
+      </w:r>
+      <w:proofErr w:type="spellEnd"/>
+      <w:r>
+        <w:rPr>
+          <w:rFonts w:ascii="Times New Roman" w:hAnsi="Times New Roman" w:cs="Times New Roman"/>
+          <w:color w:val="000000"/>
+          <w:kern w:val="0"/>
+          <w:sz w:val="24"/>
+          <w:szCs w:val="24"/>
+        </w:rPr>
+        <w:t xml:space="preserve"> (4 bâtiments, ex : B001 à B004)</w:t>
+      </w:r>
+    </w:p>
+    <w:p>
+      <w:pPr>
+        <w:autoSpaceDE w:val="0"/>
+        <w:autoSpaceDN w:val="0"/>
+        <w:adjustRightInd w:val="0"/>
+        <w:spacing w:after="0" w:line="360" w:lineRule="auto"/>
+        <w:jc w:val="both"/>
+        <w:rPr>
+          <w:rFonts w:ascii="Times New Roman" w:hAnsi="Times New Roman" w:cs="Times New Roman"/>
+          <w:color w:val="000000"/>
+          <w:kern w:val="0"/>
+          <w:sz w:val="24"/>
+          <w:szCs w:val="24"/>
+        </w:rPr>
+      </w:pPr>
+      <w:r>
+        <w:rPr>
+          <w:rFonts w:ascii="Times New Roman" w:hAnsi="Times New Roman" w:cs="Times New Roman"/>
+          <w:color w:val="000000"/>
+          <w:kern w:val="0"/>
+          <w:sz w:val="24"/>
+          <w:szCs w:val="24"/>
+        </w:rPr>
+        <w:t xml:space="preserve">- </w:t>
+      </w:r>
+      <w:proofErr w:type="spellStart"/>
+      <w:r>
+        <w:rPr>
+          <w:rFonts w:ascii="Times New Roman" w:hAnsi="Times New Roman" w:cs="Times New Roman"/>
+          <w:color w:val="000000"/>
+          <w:kern w:val="0"/>
+          <w:sz w:val="24"/>
+          <w:szCs w:val="24"/>
+        </w:rPr>
+        <w:t>temperature</w:t>
+      </w:r>
+      <w:proofErr w:type="spellEnd"/>
+      <w:r>
+        <w:rPr>
+          <w:rFonts w:ascii="Times New Roman" w:hAnsi="Times New Roman" w:cs="Times New Roman"/>
+          <w:color w:val="000000"/>
+          <w:kern w:val="0"/>
+          <w:sz w:val="24"/>
+          <w:szCs w:val="24"/>
+        </w:rPr>
+        <w:t xml:space="preserve"> (en °C, valeurs observées entre -18.5 et 58.7)</w:t>
+      </w:r>
+    </w:p>
+    <w:p>
+      <w:pPr>
+        <w:autoSpaceDE w:val="0"/>
+        <w:autoSpaceDN w:val="0"/>
+        <w:adjustRightInd w:val="0"/>
+        <w:spacing w:after="0" w:line="360" w:lineRule="auto"/>
+        <w:jc w:val="both"/>
+        <w:rPr>
+          <w:rFonts w:ascii="Times New Roman" w:hAnsi="Times New Roman" w:cs="Times New Roman"/>
+          <w:color w:val="000000"/>
+          <w:kern w:val="0"/>
+          <w:sz w:val="24"/>
+          <w:szCs w:val="24"/>
+        </w:rPr>
+      </w:pPr>
+      <w:r>
+        <w:rPr>
+          <w:rFonts w:ascii="Times New Roman" w:hAnsi="Times New Roman" w:cs="Times New Roman"/>
+          <w:color w:val="000000"/>
+          <w:kern w:val="0"/>
+          <w:sz w:val="24"/>
+          <w:szCs w:val="24"/>
+        </w:rPr>
+        <w:t xml:space="preserve">- </w:t>
+      </w:r>
+      <w:proofErr w:type="spellStart"/>
+      <w:r>
+        <w:rPr>
+          <w:rFonts w:ascii="Times New Roman" w:hAnsi="Times New Roman" w:cs="Times New Roman"/>
+          <w:color w:val="000000"/>
+          <w:kern w:val="0"/>
+          <w:sz w:val="24"/>
+          <w:szCs w:val="24"/>
+        </w:rPr>
+        <w:t>humidite</w:t>
+      </w:r>
+      <w:proofErr w:type="spellEnd"/>
+      <w:r>
+        <w:rPr>
+          <w:rFonts w:ascii="Times New Roman" w:hAnsi="Times New Roman" w:cs="Times New Roman"/>
+          <w:color w:val="000000"/>
+          <w:kern w:val="0"/>
+          <w:sz w:val="24"/>
+          <w:szCs w:val="24"/>
+        </w:rPr>
+        <w:t xml:space="preserve"> (en %, valeurs observées jusqu'à 145)</w:t>
+      </w:r>
+    </w:p>
+    <w:p>
+      <w:pPr>
+        <w:autoSpaceDE w:val="0"/>
+        <w:autoSpaceDN w:val="0"/>
+        <w:adjustRightInd w:val="0"/>
+        <w:spacing w:after="0" w:line="360" w:lineRule="auto"/>
+        <w:jc w:val="both"/>
+        <w:rPr>
+          <w:rFonts w:ascii="Times New Roman" w:hAnsi="Times New Roman" w:cs="Times New Roman"/>
+          <w:color w:val="000000"/>
+          <w:kern w:val="0"/>
+          <w:sz w:val="24"/>
+          <w:szCs w:val="24"/>
+        </w:rPr>
+      </w:pPr>
+      <w:r>
+        <w:rPr>
+          <w:rFonts w:ascii="Times New Roman" w:hAnsi="Times New Roman" w:cs="Times New Roman"/>
+          <w:color w:val="000000"/>
+          <w:kern w:val="0"/>
+          <w:sz w:val="24"/>
+          <w:szCs w:val="24"/>
+        </w:rPr>
+        <w:t xml:space="preserve">- pression (en </w:t>
+      </w:r>
+      <w:proofErr w:type="spellStart"/>
+      <w:r>
+        <w:rPr>
+          <w:rFonts w:ascii="Times New Roman" w:hAnsi="Times New Roman" w:cs="Times New Roman"/>
+          <w:color w:val="000000"/>
+          <w:kern w:val="0"/>
+          <w:sz w:val="24"/>
+          <w:szCs w:val="24"/>
+        </w:rPr>
+        <w:t>hPa</w:t>
+      </w:r>
+      <w:proofErr w:type="spellEnd"/>
+      <w:r>
+        <w:rPr>
+          <w:rFonts w:ascii="Times New Roman" w:hAnsi="Times New Roman" w:cs="Times New Roman"/>
+          <w:color w:val="000000"/>
+          <w:kern w:val="0"/>
+          <w:sz w:val="24"/>
+          <w:szCs w:val="24"/>
+        </w:rPr>
+        <w:t>)</w:t>
+      </w:r>
+    </w:p>
+    <w:p>
+      <w:pPr>
+        <w:autoSpaceDE w:val="0"/>
+        <w:autoSpaceDN w:val="0"/>
+        <w:adjustRightInd w:val="0"/>
+        <w:spacing w:after="0" w:line="360" w:lineRule="auto"/>
+        <w:jc w:val="both"/>
+        <w:rPr>
+          <w:rFonts w:ascii="Times New Roman" w:hAnsi="Times New Roman" w:cs="Times New Roman"/>
+          <w:color w:val="000000"/>
+          <w:kern w:val="0"/>
+          <w:sz w:val="24"/>
+          <w:szCs w:val="24"/>
+        </w:rPr>
+      </w:pPr>
+      <w:r>
+        <w:rPr>
+          <w:rFonts w:ascii="Times New Roman" w:hAnsi="Times New Roman" w:cs="Times New Roman"/>
+          <w:color w:val="000000"/>
+          <w:kern w:val="0"/>
+          <w:sz w:val="24"/>
+          <w:szCs w:val="24"/>
+        </w:rPr>
+        <w:t>- consommation (en kWh, valeurs observées entre 18 et 875, moyenne autour de 208)</w:t>
+      </w:r>
+    </w:p>
+    <w:p>
+      <w:pPr>
+        <w:autoSpaceDE w:val="0"/>
+        <w:autoSpaceDN w:val="0"/>
+        <w:adjustRightInd w:val="0"/>
+        <w:spacing w:after="0" w:line="360" w:lineRule="auto"/>
+        <w:jc w:val="both"/>
+        <w:rPr>
+          <w:rFonts w:ascii="Times New Roman" w:hAnsi="Times New Roman" w:cs="Times New Roman"/>
+          <w:color w:val="000000"/>
+          <w:kern w:val="0"/>
+          <w:sz w:val="24"/>
+          <w:szCs w:val="24"/>
+        </w:rPr>
+      </w:pPr>
+      <w:r>
+        <w:rPr>
+          <w:rFonts w:ascii="Times New Roman" w:hAnsi="Times New Roman" w:cs="Times New Roman"/>
+          <w:color w:val="000000"/>
+          <w:kern w:val="0"/>
+          <w:sz w:val="24"/>
+          <w:szCs w:val="24"/>
+        </w:rPr>
+        <w:t xml:space="preserve">- </w:t>
+      </w:r>
+      <w:proofErr w:type="spellStart"/>
+      <w:r>
+        <w:rPr>
+          <w:rFonts w:ascii="Times New Roman" w:hAnsi="Times New Roman" w:cs="Times New Roman"/>
+          <w:color w:val="000000"/>
+          <w:kern w:val="0"/>
+          <w:sz w:val="24"/>
+          <w:szCs w:val="24"/>
+        </w:rPr>
+        <w:t>etat</w:t>
+      </w:r>
+      <w:proofErr w:type="spellEnd"/>
+      <w:r>
+        <w:rPr>
+          <w:rFonts w:ascii="Times New Roman" w:hAnsi="Times New Roman" w:cs="Times New Roman"/>
+          <w:color w:val="000000"/>
+          <w:kern w:val="0"/>
+          <w:sz w:val="24"/>
+          <w:szCs w:val="24"/>
+        </w:rPr>
+        <w:t xml:space="preserve"> (variable catégorielle : O</w:t>
+      </w:r>
+      <w:r>
+        <w:rPr>
+          <w:rFonts w:ascii="Times New Roman" w:hAnsi="Times New Roman" w:cs="Times New Roman"/>
+          <w:color w:val="000000"/>
+          <w:kern w:val="0"/>
+          <w:sz w:val="24"/>
+          <w:szCs w:val="24"/>
+        </w:rPr>
+        <w:t>K, ALERTE, ERREUR)</w:t>
+      </w:r>
+    </w:p>
+    <w:p>
+      <w:pPr>
+        <w:autoSpaceDE w:val="0"/>
+        <w:autoSpaceDN w:val="0"/>
+        <w:adjustRightInd w:val="0"/>
+        <w:spacing w:after="0" w:line="360" w:lineRule="auto"/>
+        <w:jc w:val="both"/>
+        <w:rPr>
+          <w:rFonts w:ascii="Times New Roman" w:hAnsi="Times New Roman" w:cs="Times New Roman"/>
+          <w:color w:val="000000"/>
+          <w:kern w:val="0"/>
+          <w:sz w:val="24"/>
+          <w:szCs w:val="24"/>
+        </w:rPr>
+      </w:pPr>
+      <w:r>
+        <w:rPr>
+          <w:rFonts w:ascii="Times New Roman" w:hAnsi="Times New Roman" w:cs="Times New Roman"/>
+          <w:color w:val="000000"/>
+          <w:kern w:val="0"/>
+          <w:sz w:val="24"/>
+          <w:szCs w:val="24"/>
+        </w:rPr>
+        <w:t xml:space="preserve">Le </w:t>
+      </w:r>
+      <w:proofErr w:type="spellStart"/>
+      <w:r>
+        <w:rPr>
+          <w:rFonts w:ascii="Times New Roman" w:hAnsi="Times New Roman" w:cs="Times New Roman"/>
+          <w:color w:val="000000"/>
+          <w:kern w:val="0"/>
+          <w:sz w:val="24"/>
+          <w:szCs w:val="24"/>
+        </w:rPr>
+        <w:t>dataset</w:t>
+      </w:r>
+      <w:proofErr w:type="spellEnd"/>
+      <w:r>
+        <w:rPr>
+          <w:rFonts w:ascii="Times New Roman" w:hAnsi="Times New Roman" w:cs="Times New Roman"/>
+          <w:color w:val="000000"/>
+          <w:kern w:val="0"/>
+          <w:sz w:val="24"/>
+          <w:szCs w:val="24"/>
+        </w:rPr>
+        <w:t xml:space="preserve"> contient 605 lignes. Une première exploration a révélé :</w:t>
+      </w:r>
+    </w:p>
+    <w:p>
+      <w:pPr>
+        <w:autoSpaceDE w:val="0"/>
+        <w:autoSpaceDN w:val="0"/>
+        <w:adjustRightInd w:val="0"/>
+        <w:spacing w:after="0" w:line="360" w:lineRule="auto"/>
+        <w:jc w:val="both"/>
+        <w:rPr>
+          <w:rFonts w:ascii="Times New Roman" w:hAnsi="Times New Roman" w:cs="Times New Roman"/>
+          <w:color w:val="000000"/>
+          <w:kern w:val="0"/>
+          <w:sz w:val="24"/>
+          <w:szCs w:val="24"/>
+        </w:rPr>
+      </w:pPr>
+      <w:r>
+        <w:rPr>
+          <w:rFonts w:ascii="Times New Roman" w:hAnsi="Times New Roman" w:cs="Times New Roman"/>
+          <w:color w:val="000000"/>
+          <w:kern w:val="0"/>
+          <w:sz w:val="24"/>
+          <w:szCs w:val="24"/>
+        </w:rPr>
+        <w:t xml:space="preserve">- des valeurs manquantes sur </w:t>
+      </w:r>
+      <w:proofErr w:type="spellStart"/>
+      <w:r>
+        <w:rPr>
+          <w:rFonts w:ascii="Times New Roman" w:hAnsi="Times New Roman" w:cs="Times New Roman"/>
+          <w:color w:val="000000"/>
+          <w:kern w:val="0"/>
+          <w:sz w:val="24"/>
+          <w:szCs w:val="24"/>
+        </w:rPr>
+        <w:t>temperature</w:t>
+      </w:r>
+      <w:proofErr w:type="spellEnd"/>
+      <w:r>
+        <w:rPr>
+          <w:rFonts w:ascii="Times New Roman" w:hAnsi="Times New Roman" w:cs="Times New Roman"/>
+          <w:color w:val="000000"/>
+          <w:kern w:val="0"/>
+          <w:sz w:val="24"/>
+          <w:szCs w:val="24"/>
+        </w:rPr>
+        <w:t xml:space="preserve">, </w:t>
+      </w:r>
+      <w:proofErr w:type="spellStart"/>
+      <w:r>
+        <w:rPr>
+          <w:rFonts w:ascii="Times New Roman" w:hAnsi="Times New Roman" w:cs="Times New Roman"/>
+          <w:color w:val="000000"/>
+          <w:kern w:val="0"/>
+          <w:sz w:val="24"/>
+          <w:szCs w:val="24"/>
+        </w:rPr>
+        <w:t>humidite</w:t>
+      </w:r>
+      <w:proofErr w:type="spellEnd"/>
+      <w:r>
+        <w:rPr>
+          <w:rFonts w:ascii="Times New Roman" w:hAnsi="Times New Roman" w:cs="Times New Roman"/>
+          <w:color w:val="000000"/>
+          <w:kern w:val="0"/>
+          <w:sz w:val="24"/>
+          <w:szCs w:val="24"/>
+        </w:rPr>
+        <w:t xml:space="preserve">, pression, consommation et </w:t>
+      </w:r>
+      <w:proofErr w:type="spellStart"/>
+      <w:r>
+        <w:rPr>
+          <w:rFonts w:ascii="Times New Roman" w:hAnsi="Times New Roman" w:cs="Times New Roman"/>
+          <w:color w:val="000000"/>
+          <w:kern w:val="0"/>
+          <w:sz w:val="24"/>
+          <w:szCs w:val="24"/>
+        </w:rPr>
+        <w:t>etat</w:t>
+      </w:r>
+      <w:proofErr w:type="spellEnd"/>
+      <w:r>
+        <w:rPr>
+          <w:rFonts w:ascii="Times New Roman" w:hAnsi="Times New Roman" w:cs="Times New Roman"/>
+          <w:color w:val="000000"/>
+          <w:kern w:val="0"/>
+          <w:sz w:val="24"/>
+          <w:szCs w:val="24"/>
+        </w:rPr>
+        <w:t xml:space="preserve"> (entre 4 et 6 valeurs manquantes par colonne)</w:t>
+      </w:r>
+    </w:p>
+    <w:p>
+      <w:pPr>
+        <w:autoSpaceDE w:val="0"/>
+        <w:autoSpaceDN w:val="0"/>
+        <w:adjustRightInd w:val="0"/>
+        <w:spacing w:after="0" w:line="360" w:lineRule="auto"/>
+        <w:jc w:val="both"/>
+        <w:rPr>
+          <w:rFonts w:ascii="Times New Roman" w:hAnsi="Times New Roman" w:cs="Times New Roman"/>
+          <w:color w:val="000000"/>
+          <w:kern w:val="0"/>
+          <w:sz w:val="24"/>
+          <w:szCs w:val="24"/>
+        </w:rPr>
+      </w:pPr>
+      <w:r>
+        <w:rPr>
+          <w:rFonts w:ascii="Times New Roman" w:hAnsi="Times New Roman" w:cs="Times New Roman"/>
+          <w:color w:val="000000"/>
+          <w:kern w:val="0"/>
+          <w:sz w:val="24"/>
+          <w:szCs w:val="24"/>
+        </w:rPr>
+        <w:t>- 5 lignes dupliquées</w:t>
+      </w:r>
+    </w:p>
+    <w:p>
+      <w:pPr>
+        <w:autoSpaceDE w:val="0"/>
+        <w:autoSpaceDN w:val="0"/>
+        <w:adjustRightInd w:val="0"/>
+        <w:spacing w:after="0" w:line="360" w:lineRule="auto"/>
+        <w:jc w:val="both"/>
+        <w:rPr>
+          <w:rFonts w:ascii="Times New Roman" w:hAnsi="Times New Roman" w:cs="Times New Roman"/>
+          <w:color w:val="000000"/>
+          <w:kern w:val="0"/>
+          <w:sz w:val="24"/>
+          <w:szCs w:val="24"/>
+        </w:rPr>
+      </w:pPr>
+      <w:r>
+        <w:rPr>
+          <w:rFonts w:ascii="Times New Roman" w:hAnsi="Times New Roman" w:cs="Times New Roman"/>
+          <w:color w:val="000000"/>
+          <w:kern w:val="0"/>
+          <w:sz w:val="24"/>
+          <w:szCs w:val="24"/>
+        </w:rPr>
+        <w:t>- des valeurs d'humidité supérieures à 100%, ce qui est physiquement impossible</w:t>
+      </w:r>
+    </w:p>
+    <w:p>
+      <w:pPr>
+        <w:autoSpaceDE w:val="0"/>
+        <w:autoSpaceDN w:val="0"/>
+        <w:adjustRightInd w:val="0"/>
+        <w:spacing w:after="0" w:line="360" w:lineRule="auto"/>
+        <w:jc w:val="both"/>
+        <w:rPr>
+          <w:rFonts w:ascii="Times New Roman" w:hAnsi="Times New Roman" w:cs="Times New Roman"/>
+          <w:color w:val="000000"/>
+          <w:kern w:val="0"/>
+          <w:sz w:val="24"/>
+          <w:szCs w:val="24"/>
+        </w:rPr>
+      </w:pPr>
+      <w:r>
+        <w:rPr>
+          <w:rFonts w:ascii="Times New Roman" w:hAnsi="Times New Roman" w:cs="Times New Roman"/>
+          <w:color w:val="000000"/>
+          <w:kern w:val="0"/>
+          <w:sz w:val="24"/>
+          <w:szCs w:val="24"/>
+        </w:rPr>
+        <w:t>- des températures extrêmes (-18.5°C et 58.7°C) q</w:t>
+      </w:r>
+      <w:r>
+        <w:rPr>
+          <w:rFonts w:ascii="Times New Roman" w:hAnsi="Times New Roman" w:cs="Times New Roman"/>
+          <w:color w:val="000000"/>
+          <w:kern w:val="0"/>
+          <w:sz w:val="24"/>
+          <w:szCs w:val="24"/>
+        </w:rPr>
+        <w:t>ui semblent suspectes pour des capteurs intérieurs</w:t>
+      </w:r>
+    </w:p>
+    <w:p>
+      <w:pPr>
+        <w:autoSpaceDE w:val="0"/>
+        <w:autoSpaceDN w:val="0"/>
+        <w:adjustRightInd w:val="0"/>
+        <w:spacing w:after="0" w:line="360" w:lineRule="auto"/>
+        <w:jc w:val="both"/>
+        <w:rPr>
+          <w:rFonts w:ascii="Times New Roman" w:hAnsi="Times New Roman" w:cs="Times New Roman"/>
+          <w:color w:val="000000"/>
+          <w:kern w:val="0"/>
+          <w:sz w:val="24"/>
+          <w:szCs w:val="24"/>
+        </w:rPr>
+      </w:pPr>
+      <w:r>
+        <w:rPr>
+          <w:rFonts w:ascii="Times New Roman" w:hAnsi="Times New Roman" w:cs="Times New Roman"/>
+          <w:b/>
+          <w:color w:val="000000"/>
+          <w:kern w:val="0"/>
+          <w:sz w:val="24"/>
+          <w:szCs w:val="24"/>
+        </w:rPr>
+        <w:t>Objectif métier :</w:t>
+      </w:r>
+      <w:r>
+        <w:rPr>
+          <w:rFonts w:ascii="Times New Roman" w:hAnsi="Times New Roman" w:cs="Times New Roman"/>
+          <w:color w:val="000000"/>
+          <w:kern w:val="0"/>
+          <w:sz w:val="24"/>
+          <w:szCs w:val="24"/>
+        </w:rPr>
+        <w:t xml:space="preserve"> comprendre les facteurs q</w:t>
+      </w:r>
+      <w:r>
+        <w:rPr>
+          <w:rFonts w:ascii="Times New Roman" w:hAnsi="Times New Roman" w:cs="Times New Roman"/>
+          <w:color w:val="000000"/>
+          <w:kern w:val="0"/>
+          <w:sz w:val="24"/>
+          <w:szCs w:val="24"/>
+        </w:rPr>
+        <w:t xml:space="preserve">ui influencent la consommation </w:t>
+      </w:r>
+      <w:r>
+        <w:rPr>
+          <w:rFonts w:ascii="Times New Roman" w:hAnsi="Times New Roman" w:cs="Times New Roman"/>
+          <w:color w:val="000000"/>
+          <w:kern w:val="0"/>
+          <w:sz w:val="24"/>
+          <w:szCs w:val="24"/>
+        </w:rPr>
+        <w:t>énergétique (colonne "consommation") de 4 bâ</w:t>
+      </w:r>
+      <w:r>
+        <w:rPr>
+          <w:rFonts w:ascii="Times New Roman" w:hAnsi="Times New Roman" w:cs="Times New Roman"/>
+          <w:color w:val="000000"/>
+          <w:kern w:val="0"/>
+          <w:sz w:val="24"/>
+          <w:szCs w:val="24"/>
+        </w:rPr>
+        <w:t xml:space="preserve">timents équipés de 12 capteurs </w:t>
+      </w:r>
+      <w:r>
+        <w:rPr>
+          <w:rFonts w:ascii="Times New Roman" w:hAnsi="Times New Roman" w:cs="Times New Roman"/>
+          <w:color w:val="000000"/>
+          <w:kern w:val="0"/>
+          <w:sz w:val="24"/>
+          <w:szCs w:val="24"/>
+        </w:rPr>
+        <w:t>mesurant tem</w:t>
+      </w:r>
+      <w:r>
+        <w:rPr>
+          <w:rFonts w:ascii="Times New Roman" w:hAnsi="Times New Roman" w:cs="Times New Roman"/>
+          <w:color w:val="000000"/>
+          <w:kern w:val="0"/>
+          <w:sz w:val="24"/>
+          <w:szCs w:val="24"/>
+        </w:rPr>
+        <w:t>pérature, humidité et pression.</w:t>
+      </w:r>
+    </w:p>
+    <w:p>
+      <w:pPr>
+        <w:autoSpaceDE w:val="0"/>
+        <w:autoSpaceDN w:val="0"/>
+        <w:adjustRightInd w:val="0"/>
+        <w:spacing w:after="0" w:line="360" w:lineRule="auto"/>
+        <w:jc w:val="both"/>
+        <w:rPr>
+          <w:rFonts w:ascii="Times New Roman" w:hAnsi="Times New Roman" w:cs="Times New Roman"/>
+          <w:b/>
+          <w:color w:val="000000"/>
+          <w:kern w:val="0"/>
+          <w:sz w:val="24"/>
+          <w:szCs w:val="24"/>
+        </w:rPr>
+      </w:pPr>
+      <w:r>
+        <w:rPr>
+          <w:rFonts w:ascii="Times New Roman" w:hAnsi="Times New Roman" w:cs="Times New Roman"/>
+          <w:b/>
+          <w:color w:val="000000"/>
+          <w:kern w:val="0"/>
+          <w:sz w:val="24"/>
+          <w:szCs w:val="24"/>
+        </w:rPr>
+        <w:t>Tâche :</w:t>
+      </w:r>
+    </w:p>
+    <w:p>
+      <w:pPr>
+        <w:autoSpaceDE w:val="0"/>
+        <w:autoSpaceDN w:val="0"/>
+        <w:adjustRightInd w:val="0"/>
+        <w:spacing w:after="0" w:line="360" w:lineRule="auto"/>
+        <w:jc w:val="both"/>
+        <w:rPr>
+          <w:rFonts w:ascii="Times New Roman" w:hAnsi="Times New Roman" w:cs="Times New Roman"/>
+          <w:color w:val="000000"/>
+          <w:kern w:val="0"/>
+          <w:sz w:val="24"/>
+          <w:szCs w:val="24"/>
+        </w:rPr>
+      </w:pPr>
+      <w:r>
+        <w:rPr>
+          <w:rFonts w:ascii="Times New Roman" w:hAnsi="Times New Roman" w:cs="Times New Roman"/>
+          <w:color w:val="000000"/>
+          <w:kern w:val="0"/>
+          <w:sz w:val="24"/>
+          <w:szCs w:val="24"/>
+        </w:rPr>
+        <w:t>Propose les visualisations les plus pertinent</w:t>
+      </w:r>
+      <w:r>
+        <w:rPr>
+          <w:rFonts w:ascii="Times New Roman" w:hAnsi="Times New Roman" w:cs="Times New Roman"/>
+          <w:color w:val="000000"/>
+          <w:kern w:val="0"/>
+          <w:sz w:val="24"/>
+          <w:szCs w:val="24"/>
+        </w:rPr>
+        <w:t xml:space="preserve">es pour explorer ce </w:t>
+      </w:r>
+      <w:proofErr w:type="spellStart"/>
+      <w:r>
+        <w:rPr>
+          <w:rFonts w:ascii="Times New Roman" w:hAnsi="Times New Roman" w:cs="Times New Roman"/>
+          <w:color w:val="000000"/>
+          <w:kern w:val="0"/>
+          <w:sz w:val="24"/>
+          <w:szCs w:val="24"/>
+        </w:rPr>
+        <w:t>dataset</w:t>
+      </w:r>
+      <w:proofErr w:type="spellEnd"/>
+      <w:r>
+        <w:rPr>
+          <w:rFonts w:ascii="Times New Roman" w:hAnsi="Times New Roman" w:cs="Times New Roman"/>
+          <w:color w:val="000000"/>
+          <w:kern w:val="0"/>
+          <w:sz w:val="24"/>
+          <w:szCs w:val="24"/>
+        </w:rPr>
+        <w:t xml:space="preserve"> et </w:t>
+      </w:r>
+      <w:r>
+        <w:rPr>
+          <w:rFonts w:ascii="Times New Roman" w:hAnsi="Times New Roman" w:cs="Times New Roman"/>
+          <w:color w:val="000000"/>
+          <w:kern w:val="0"/>
+          <w:sz w:val="24"/>
+          <w:szCs w:val="24"/>
+        </w:rPr>
+        <w:t>comprendre la consommation énergétique. Pour chaque visualisation, précise :</w:t>
+      </w:r>
+    </w:p>
+    <w:p>
+      <w:pPr>
+        <w:autoSpaceDE w:val="0"/>
+        <w:autoSpaceDN w:val="0"/>
+        <w:adjustRightInd w:val="0"/>
+        <w:spacing w:after="0" w:line="360" w:lineRule="auto"/>
+        <w:jc w:val="both"/>
+        <w:rPr>
+          <w:rFonts w:ascii="Times New Roman" w:hAnsi="Times New Roman" w:cs="Times New Roman"/>
+          <w:color w:val="000000"/>
+          <w:kern w:val="0"/>
+          <w:sz w:val="24"/>
+          <w:szCs w:val="24"/>
+        </w:rPr>
+      </w:pPr>
+      <w:r>
+        <w:rPr>
+          <w:rFonts w:ascii="Times New Roman" w:hAnsi="Times New Roman" w:cs="Times New Roman"/>
+          <w:color w:val="000000"/>
+          <w:kern w:val="0"/>
+          <w:sz w:val="24"/>
+          <w:szCs w:val="24"/>
+        </w:rPr>
+        <w:t>- Le type de graphique (ex : nuage de points, boîte à moustaches, série temporelle...)</w:t>
+      </w:r>
+    </w:p>
+    <w:p>
+      <w:pPr>
+        <w:autoSpaceDE w:val="0"/>
+        <w:autoSpaceDN w:val="0"/>
+        <w:adjustRightInd w:val="0"/>
+        <w:spacing w:after="0" w:line="360" w:lineRule="auto"/>
+        <w:jc w:val="both"/>
+        <w:rPr>
+          <w:rFonts w:ascii="Times New Roman" w:hAnsi="Times New Roman" w:cs="Times New Roman"/>
+          <w:color w:val="000000"/>
+          <w:kern w:val="0"/>
+          <w:sz w:val="24"/>
+          <w:szCs w:val="24"/>
+        </w:rPr>
+      </w:pPr>
+      <w:r>
+        <w:rPr>
+          <w:rFonts w:ascii="Times New Roman" w:hAnsi="Times New Roman" w:cs="Times New Roman"/>
+          <w:color w:val="000000"/>
+          <w:kern w:val="0"/>
+          <w:sz w:val="24"/>
+          <w:szCs w:val="24"/>
+        </w:rPr>
+        <w:t>- Les variables utilisées (axes, couleur, taille...)</w:t>
+      </w:r>
+    </w:p>
+    <w:p>
+      <w:pPr>
+        <w:autoSpaceDE w:val="0"/>
+        <w:autoSpaceDN w:val="0"/>
+        <w:adjustRightInd w:val="0"/>
+        <w:spacing w:after="0" w:line="360" w:lineRule="auto"/>
+        <w:jc w:val="both"/>
+        <w:rPr>
+          <w:rFonts w:ascii="Times New Roman" w:hAnsi="Times New Roman" w:cs="Times New Roman"/>
+          <w:color w:val="000000"/>
+          <w:kern w:val="0"/>
+          <w:sz w:val="24"/>
+          <w:szCs w:val="24"/>
+        </w:rPr>
+      </w:pPr>
+      <w:r>
+        <w:rPr>
+          <w:rFonts w:ascii="Times New Roman" w:hAnsi="Times New Roman" w:cs="Times New Roman"/>
+          <w:color w:val="000000"/>
+          <w:kern w:val="0"/>
+          <w:sz w:val="24"/>
+          <w:szCs w:val="24"/>
+        </w:rPr>
+        <w:t>- L'objectif de cette visualisation (quelle question elle permet de répondre)</w:t>
+      </w:r>
+    </w:p>
+    <w:p>
+      <w:pPr>
+        <w:autoSpaceDE w:val="0"/>
+        <w:autoSpaceDN w:val="0"/>
+        <w:adjustRightInd w:val="0"/>
+        <w:spacing w:after="0" w:line="360" w:lineRule="auto"/>
+        <w:jc w:val="both"/>
+        <w:rPr>
+          <w:rFonts w:ascii="Times New Roman" w:hAnsi="Times New Roman" w:cs="Times New Roman"/>
+          <w:color w:val="000000"/>
+          <w:kern w:val="0"/>
+          <w:sz w:val="24"/>
+          <w:szCs w:val="24"/>
+        </w:rPr>
+      </w:pPr>
+      <w:r>
+        <w:rPr>
+          <w:rFonts w:ascii="Times New Roman" w:hAnsi="Times New Roman" w:cs="Times New Roman"/>
+          <w:color w:val="000000"/>
+          <w:kern w:val="0"/>
+          <w:sz w:val="24"/>
+          <w:szCs w:val="24"/>
+        </w:rPr>
+        <w:t>- L'interprétation attendue (ce qu'on devrai</w:t>
+      </w:r>
+      <w:r>
+        <w:rPr>
+          <w:rFonts w:ascii="Times New Roman" w:hAnsi="Times New Roman" w:cs="Times New Roman"/>
+          <w:color w:val="000000"/>
+          <w:kern w:val="0"/>
+          <w:sz w:val="24"/>
+          <w:szCs w:val="24"/>
+        </w:rPr>
+        <w:t>t pouvoir observer ou conclure)</w:t>
+      </w:r>
+    </w:p>
+    <w:p>
+      <w:pPr>
+        <w:autoSpaceDE w:val="0"/>
+        <w:autoSpaceDN w:val="0"/>
+        <w:adjustRightInd w:val="0"/>
+        <w:spacing w:after="0" w:line="360" w:lineRule="auto"/>
+        <w:jc w:val="both"/>
+        <w:rPr>
+          <w:rFonts w:ascii="Times New Roman" w:hAnsi="Times New Roman" w:cs="Times New Roman"/>
+          <w:b/>
+          <w:color w:val="000000"/>
+          <w:kern w:val="0"/>
+          <w:sz w:val="24"/>
+          <w:szCs w:val="24"/>
+        </w:rPr>
+      </w:pPr>
+      <w:r>
+        <w:rPr>
+          <w:rFonts w:ascii="Times New Roman" w:hAnsi="Times New Roman" w:cs="Times New Roman"/>
+          <w:b/>
+          <w:color w:val="000000"/>
+          <w:kern w:val="0"/>
+          <w:sz w:val="24"/>
+          <w:szCs w:val="24"/>
+        </w:rPr>
+        <w:t>Contraintes :</w:t>
+      </w:r>
+    </w:p>
+    <w:p>
+      <w:pPr>
+        <w:autoSpaceDE w:val="0"/>
+        <w:autoSpaceDN w:val="0"/>
+        <w:adjustRightInd w:val="0"/>
+        <w:spacing w:after="0" w:line="360" w:lineRule="auto"/>
+        <w:jc w:val="both"/>
+        <w:rPr>
+          <w:rFonts w:ascii="Times New Roman" w:hAnsi="Times New Roman" w:cs="Times New Roman"/>
+          <w:color w:val="000000"/>
+          <w:kern w:val="0"/>
+          <w:sz w:val="24"/>
+          <w:szCs w:val="24"/>
+        </w:rPr>
+      </w:pPr>
+      <w:r>
+        <w:rPr>
+          <w:rFonts w:ascii="Times New Roman" w:hAnsi="Times New Roman" w:cs="Times New Roman"/>
+          <w:color w:val="000000"/>
+          <w:kern w:val="0"/>
+          <w:sz w:val="24"/>
+          <w:szCs w:val="24"/>
+        </w:rPr>
+        <w:t>- Propose entre 4 et 6 visualisations, non redondantes entre elles.</w:t>
+      </w:r>
+    </w:p>
+    <w:p>
+      <w:pPr>
+        <w:autoSpaceDE w:val="0"/>
+        <w:autoSpaceDN w:val="0"/>
+        <w:adjustRightInd w:val="0"/>
+        <w:spacing w:after="0" w:line="360" w:lineRule="auto"/>
+        <w:jc w:val="both"/>
+        <w:rPr>
+          <w:rFonts w:ascii="Times New Roman" w:hAnsi="Times New Roman" w:cs="Times New Roman"/>
+          <w:color w:val="000000"/>
+          <w:kern w:val="0"/>
+          <w:sz w:val="24"/>
+          <w:szCs w:val="24"/>
+        </w:rPr>
+      </w:pPr>
+      <w:r>
+        <w:rPr>
+          <w:rFonts w:ascii="Times New Roman" w:hAnsi="Times New Roman" w:cs="Times New Roman"/>
+          <w:color w:val="000000"/>
+          <w:kern w:val="0"/>
+          <w:sz w:val="24"/>
+          <w:szCs w:val="24"/>
+        </w:rPr>
+        <w:t xml:space="preserve">- Priorise les visualisations qui aident à détecter des </w:t>
+      </w:r>
+      <w:r>
+        <w:rPr>
+          <w:rFonts w:ascii="Times New Roman" w:hAnsi="Times New Roman" w:cs="Times New Roman"/>
+          <w:color w:val="000000"/>
+          <w:kern w:val="0"/>
+          <w:sz w:val="24"/>
+          <w:szCs w:val="24"/>
+        </w:rPr>
+        <w:t>relations avec la consommation.</w:t>
+      </w:r>
+    </w:p>
+    <w:p>
+      <w:pPr>
+        <w:autoSpaceDE w:val="0"/>
+        <w:autoSpaceDN w:val="0"/>
+        <w:adjustRightInd w:val="0"/>
+        <w:spacing w:after="0" w:line="360" w:lineRule="auto"/>
+        <w:jc w:val="both"/>
+        <w:rPr>
+          <w:rFonts w:ascii="Times New Roman" w:hAnsi="Times New Roman" w:cs="Times New Roman"/>
+          <w:b/>
+          <w:color w:val="000000"/>
+          <w:kern w:val="0"/>
+          <w:sz w:val="24"/>
+          <w:szCs w:val="24"/>
+        </w:rPr>
+      </w:pPr>
+      <w:r>
+        <w:rPr>
+          <w:rFonts w:ascii="Times New Roman" w:hAnsi="Times New Roman" w:cs="Times New Roman"/>
+          <w:b/>
+          <w:color w:val="000000"/>
+          <w:kern w:val="0"/>
+          <w:sz w:val="24"/>
+          <w:szCs w:val="24"/>
+        </w:rPr>
+        <w:t>Format de sortie :</w:t>
+      </w:r>
+    </w:p>
+    <w:p>
+      <w:pPr>
+        <w:autoSpaceDE w:val="0"/>
+        <w:autoSpaceDN w:val="0"/>
+        <w:adjustRightInd w:val="0"/>
+        <w:spacing w:after="0" w:line="360" w:lineRule="auto"/>
+        <w:jc w:val="both"/>
+        <w:rPr>
+          <w:rFonts w:ascii="Times New Roman" w:hAnsi="Times New Roman" w:cs="Times New Roman"/>
+          <w:color w:val="000000"/>
+          <w:kern w:val="0"/>
+          <w:sz w:val="24"/>
+          <w:szCs w:val="24"/>
+        </w:rPr>
+      </w:pPr>
+      <w:r>
+        <w:rPr>
+          <w:rFonts w:ascii="Times New Roman" w:hAnsi="Times New Roman" w:cs="Times New Roman"/>
+          <w:color w:val="000000"/>
+          <w:kern w:val="0"/>
+          <w:sz w:val="24"/>
+          <w:szCs w:val="24"/>
+        </w:rPr>
+        <w:t>Un tableau avec les</w:t>
+      </w:r>
+      <w:r>
+        <w:rPr>
+          <w:rFonts w:ascii="Times New Roman" w:hAnsi="Times New Roman" w:cs="Times New Roman"/>
+          <w:color w:val="000000"/>
+          <w:kern w:val="0"/>
+          <w:sz w:val="24"/>
+          <w:szCs w:val="24"/>
+        </w:rPr>
+        <w:t xml:space="preserve"> colonnes : Type de graphique Variables Objectif </w:t>
+      </w:r>
+      <w:r>
+        <w:rPr>
+          <w:rFonts w:ascii="Times New Roman" w:hAnsi="Times New Roman" w:cs="Times New Roman"/>
+          <w:color w:val="000000"/>
+          <w:kern w:val="0"/>
+          <w:sz w:val="24"/>
+          <w:szCs w:val="24"/>
+        </w:rPr>
+        <w:t>Interprétation attendue</w:t>
+      </w:r>
+    </w:p>
+    <w:p>
+      <w:pPr>
+        <w:pStyle w:val="ListParagraph"/>
+        <w:numPr>
+          <w:ilvl w:val="0"/>
+          <w:numId w:val="15"/>
+        </w:numPr>
+        <w:autoSpaceDE w:val="0"/>
+        <w:autoSpaceDN w:val="0"/>
+        <w:adjustRightInd w:val="0"/>
+        <w:spacing w:after="0" w:line="360" w:lineRule="auto"/>
+        <w:jc w:val="center"/>
+        <w:rPr>
+          <w:rFonts w:ascii="Times New Roman" w:hAnsi="Times New Roman" w:cs="Times New Roman"/>
+          <w:b/>
+          <w:color w:val="000000"/>
+          <w:kern w:val="0"/>
+          <w:sz w:val="24"/>
+          <w:szCs w:val="24"/>
+        </w:rPr>
+      </w:pPr>
+      <w:r>
+        <w:rPr>
+          <w:rFonts w:ascii="Times New Roman" w:hAnsi="Times New Roman" w:cs="Times New Roman"/>
+          <w:b/>
+          <w:color w:val="000000"/>
+          <w:kern w:val="0"/>
+          <w:sz w:val="24"/>
+          <w:szCs w:val="24"/>
+        </w:rPr>
+        <w:lastRenderedPageBreak/>
+        <w:t>Réponse de Claude</w:t>
+      </w:r>
+      <w:r>
+        <w:rPr>
+          <w:rFonts w:ascii="Times New Roman" w:hAnsi="Times New Roman" w:cs="Times New Roman"/>
+          <w:b/>
+          <w:color w:val="000000"/>
+          <w:kern w:val="0"/>
+          <w:sz w:val="24"/>
+          <w:szCs w:val="24"/>
+        </w:rPr>
+        <w:drawing>
+          <wp:inline distT="0" distB="0" distL="0" distR="0" wp14:anchorId="437F78BC" wp14:editId="34DC05CE">
+            <wp:extent cx="5760720" cy="3773170"/>
+            <wp:effectExtent l="0" t="0" r="0" b="0"/>
+            <wp:docPr id="22" name="Picture 22"/>
+            <wp:cNvGraphicFramePr>
+              <a:graphicFrameLocks xmlns:a="http://schemas.openxmlformats.org/drawingml/2006/main" noChangeAspect="1"/>
+            </wp:cNvGraphicFramePr>
+            <a:graphic xmlns:a="http://schemas.openxmlformats.org/drawingml/2006/main">
+              <a:graphicData uri="http://schemas.openxmlformats.org/drawingml/2006/picture">
+                <pic:pic xmlns:pic="http://schemas.openxmlformats.org/drawingml/2006/picture">
+                  <pic:nvPicPr>
+                    <pic:cNvPr id="1" name=""/>
+                    <pic:cNvPicPr/>
+                  </pic:nvPicPr>
+                  <pic:blipFill>
+                    <a:blip r:embed="rId35"/>
+                    <a:stretch>
+                      <a:fillRect/>
+                    </a:stretch>
+                  </pic:blipFill>
+                  <pic:spPr>
+                    <a:xfrm>
+                      <a:off x="0" y="0"/>
+                      <a:ext cx="5760720" cy="3773170"/>
+                    </a:xfrm>
+                    <a:prstGeom prst="rect">
+                      <a:avLst/>
+                    </a:prstGeom>
+                  </pic:spPr>
+                </pic:pic>
+              </a:graphicData>
+            </a:graphic>
+          </wp:inline>
+        </w:drawing>
+      </w:r>
+    </w:p>
+    <w:p>
+      <w:pPr>
+        <w:pStyle w:val="ListParagraph"/>
+        <w:autoSpaceDE w:val="0"/>
+        <w:autoSpaceDN w:val="0"/>
+        <w:adjustRightInd w:val="0"/>
+        <w:spacing w:after="0" w:line="360" w:lineRule="auto"/>
+        <w:rPr>
+          <w:rFonts w:ascii="Times New Roman" w:hAnsi="Times New Roman" w:cs="Times New Roman"/>
+          <w:b/>
+          <w:color w:val="000000"/>
+          <w:kern w:val="0"/>
+          <w:sz w:val="24"/>
+          <w:szCs w:val="24"/>
+        </w:rPr>
+      </w:pPr>
+      <w:r>
+        <w:rPr>
+          <w:rFonts w:ascii="Times New Roman" w:hAnsi="Times New Roman" w:cs="Times New Roman"/>
+          <w:b/>
+          <w:color w:val="000000"/>
+          <w:kern w:val="0"/>
+          <w:sz w:val="24"/>
+          <w:szCs w:val="24"/>
+        </w:rPr>
+        <w:drawing>
+          <wp:inline distT="0" distB="0" distL="0" distR="0" wp14:anchorId="63F86204" wp14:editId="6F9B6982">
+            <wp:extent cx="5760720" cy="2834640"/>
+            <wp:effectExtent l="0" t="0" r="0" b="3810"/>
+            <wp:docPr id="23" name="Picture 23"/>
+            <wp:cNvGraphicFramePr>
+              <a:graphicFrameLocks xmlns:a="http://schemas.openxmlformats.org/drawingml/2006/main" noChangeAspect="1"/>
+            </wp:cNvGraphicFramePr>
+            <a:graphic xmlns:a="http://schemas.openxmlformats.org/drawingml/2006/main">
+              <a:graphicData uri="http://schemas.openxmlformats.org/drawingml/2006/picture">
+                <pic:pic xmlns:pic="http://schemas.openxmlformats.org/drawingml/2006/picture">
+                  <pic:nvPicPr>
+                    <pic:cNvPr id="1" name=""/>
+                    <pic:cNvPicPr/>
+                  </pic:nvPicPr>
+                  <pic:blipFill>
+                    <a:blip r:embed="rId36"/>
+                    <a:stretch>
+                      <a:fillRect/>
+                    </a:stretch>
+                  </pic:blipFill>
+                  <pic:spPr>
+                    <a:xfrm>
+                      <a:off x="0" y="0"/>
+                      <a:ext cx="5760720" cy="2834640"/>
+                    </a:xfrm>
+                    <a:prstGeom prst="rect">
+                      <a:avLst/>
+                    </a:prstGeom>
+                  </pic:spPr>
+                </pic:pic>
+              </a:graphicData>
+            </a:graphic>
+          </wp:inline>
+        </w:drawing>
+      </w:r>
+    </w:p>
+    <w:p>
+      <w:pPr>
+        <w:pStyle w:val="ListParagraph"/>
+        <w:autoSpaceDE w:val="0"/>
+        <w:autoSpaceDN w:val="0"/>
+        <w:adjustRightInd w:val="0"/>
+        <w:spacing w:after="0" w:line="360" w:lineRule="auto"/>
+        <w:rPr>
+          <w:rFonts w:ascii="Times New Roman" w:hAnsi="Times New Roman" w:cs="Times New Roman"/>
+          <w:b/>
+          <w:color w:val="000000"/>
+          <w:kern w:val="0"/>
+          <w:sz w:val="24"/>
+          <w:szCs w:val="24"/>
+        </w:rPr>
+      </w:pPr>
+      <w:r>
+        <w:rPr>
+          <w:rFonts w:ascii="Times New Roman" w:hAnsi="Times New Roman" w:cs="Times New Roman"/>
+          <w:b/>
+          <w:color w:val="000000"/>
+          <w:kern w:val="0"/>
+          <w:sz w:val="24"/>
+          <w:szCs w:val="24"/>
+        </w:rPr>
+        <w:lastRenderedPageBreak/>
+        <w:drawing>
+          <wp:inline distT="0" distB="0" distL="0" distR="0" wp14:anchorId="253B4B32" wp14:editId="571745EB">
+            <wp:extent cx="5760720" cy="3285490"/>
+            <wp:effectExtent l="0" t="0" r="0" b="0"/>
+            <wp:docPr id="24" name="Picture 24"/>
+            <wp:cNvGraphicFramePr>
+              <a:graphicFrameLocks xmlns:a="http://schemas.openxmlformats.org/drawingml/2006/main" noChangeAspect="1"/>
+            </wp:cNvGraphicFramePr>
+            <a:graphic xmlns:a="http://schemas.openxmlformats.org/drawingml/2006/main">
+              <a:graphicData uri="http://schemas.openxmlformats.org/drawingml/2006/picture">
+                <pic:pic xmlns:pic="http://schemas.openxmlformats.org/drawingml/2006/picture">
+                  <pic:nvPicPr>
+                    <pic:cNvPr id="1" name=""/>
+                    <pic:cNvPicPr/>
+                  </pic:nvPicPr>
+                  <pic:blipFill>
+                    <a:blip r:embed="rId37"/>
+                    <a:stretch>
+                      <a:fillRect/>
+                    </a:stretch>
+                  </pic:blipFill>
+                  <pic:spPr>
+                    <a:xfrm>
+                      <a:off x="0" y="0"/>
+                      <a:ext cx="5760720" cy="3285490"/>
+                    </a:xfrm>
+                    <a:prstGeom prst="rect">
+                      <a:avLst/>
+                    </a:prstGeom>
+                  </pic:spPr>
+                </pic:pic>
+              </a:graphicData>
+            </a:graphic>
+          </wp:inline>
+        </w:drawing>
+      </w:r>
+      <w:bookmarkStart w:id="0" w:name="_GoBack"/>
+      <w:bookmarkEnd w:id="0"/>
+      <w:r>
+        <w:rPr>
+          <w:rFonts w:ascii="Times New Roman" w:hAnsi="Times New Roman" w:cs="Times New Roman"/>
+          <w:b/>
+          <w:color w:val="000000"/>
+          <w:kern w:val="0"/>
+          <w:sz w:val="24"/>
+          <w:szCs w:val="24"/>
+        </w:rPr>
+        <w:drawing>
+          <wp:inline distT="0" distB="0" distL="0" distR="0" wp14:anchorId="0067F21D" wp14:editId="6DD00CEB">
+            <wp:extent cx="5760720" cy="2639695"/>
+            <wp:effectExtent l="0" t="0" r="0" b="8255"/>
+            <wp:docPr id="25" name="Picture 25"/>
+            <wp:cNvGraphicFramePr>
+              <a:graphicFrameLocks xmlns:a="http://schemas.openxmlformats.org/drawingml/2006/main" noChangeAspect="1"/>
+            </wp:cNvGraphicFramePr>
+            <a:graphic xmlns:a="http://schemas.openxmlformats.org/drawingml/2006/main">
+              <a:graphicData uri="http://schemas.openxmlformats.org/drawingml/2006/picture">
+                <pic:pic xmlns:pic="http://schemas.openxmlformats.org/drawingml/2006/picture">
+                  <pic:nvPicPr>
+                    <pic:cNvPr id="1" name=""/>
+                    <pic:cNvPicPr/>
+                  </pic:nvPicPr>
+                  <pic:blipFill>
+                    <a:blip r:embed="rId38"/>
+                    <a:stretch>
+                      <a:fillRect/>
+                    </a:stretch>
+                  </pic:blipFill>
+                  <pic:spPr>
+                    <a:xfrm>
+                      <a:off x="0" y="0"/>
+                      <a:ext cx="5760720" cy="2639695"/>
+                    </a:xfrm>
+                    <a:prstGeom prst="rect">
+                      <a:avLst/>
+                    </a:prstGeom>
+                  </pic:spPr>
+                </pic:pic>
+              </a:graphicData>
+            </a:graphic>
+          </wp:inline>
+        </w:drawing>
+      </w:r>
     </w:p>
     <w:sectPr>
       <w:pgSz w:w="11906" w:h="16838"/>
@@ -12611,6 +14330,119 @@
     </w:lvl>
   </w:abstractNum>
   <w:abstractNum w:abstractNumId="4">
+    <w:nsid w:val="46F61BC3"/>
+    <w:multiLevelType w:val="hybridMultilevel"/>
+    <w:tmpl w:val="D49C06F2"/>
+    <w:lvl w:ilvl="0" w:tplc="040C0009">
+      <w:start w:val="1"/>
+      <w:numFmt w:val="bullet"/>
+      <w:lvlText w:val=""/>
+      <w:lvlJc w:val="left"/>
+      <w:pPr>
+        <w:ind w:left="720" w:hanging="360"/>
+      </w:pPr>
+      <w:rPr>
+        <w:rFonts w:ascii="Wingdings" w:hAnsi="Wingdings" w:hint="default"/>
+      </w:rPr>
+    </w:lvl>
+    <w:lvl w:ilvl="1" w:tplc="040C0003" w:tentative="1">
+      <w:start w:val="1"/>
+      <w:numFmt w:val="bullet"/>
+      <w:lvlText w:val="o"/>
+      <w:lvlJc w:val="left"/>
+      <w:pPr>
+        <w:ind w:left="1440" w:hanging="360"/>
+      </w:pPr>
+      <w:rPr>
+        <w:rFonts w:ascii="Courier New" w:hAnsi="Courier New" w:cs="Courier New" w:hint="default"/>
+      </w:rPr>
+    </w:lvl>
+    <w:lvl w:ilvl="2" w:tplc="040C0005" w:tentative="1">
+      <w:start w:val="1"/>
+      <w:numFmt w:val="bullet"/>
+      <w:lvlText w:val=""/>
+      <w:lvlJc w:val="left"/>
+      <w:pPr>
+        <w:ind w:left="2160" w:hanging="360"/>
+      </w:pPr>
+      <w:rPr>
+        <w:rFonts w:ascii="Wingdings" w:hAnsi="Wingdings" w:hint="default"/>
+      </w:rPr>
+    </w:lvl>
+    <w:lvl w:ilvl="3" w:tplc="040C0001" w:tentative="1">
+      <w:start w:val="1"/>
+      <w:numFmt w:val="bullet"/>
+      <w:lvlText w:val=""/>
+      <w:lvlJc w:val="left"/>
+      <w:pPr>
+        <w:ind w:left="2880" w:hanging="360"/>
+      </w:pPr>
+      <w:rPr>
+        <w:rFonts w:ascii="Symbol" w:hAnsi="Symbol" w:hint="default"/>
+      </w:rPr>
+    </w:lvl>
+    <w:lvl w:ilvl="4" w:tplc="040C0003" w:tentative="1">
+      <w:start w:val="1"/>
+      <w:numFmt w:val="bullet"/>
+      <w:lvlText w:val="o"/>
+      <w:lvlJc w:val="left"/>
+      <w:pPr>
+        <w:ind w:left="3600" w:hanging="360"/>
+      </w:pPr>
+      <w:rPr>
+        <w:rFonts w:ascii="Courier New" w:hAnsi="Courier New" w:cs="Courier New" w:hint="default"/>
+      </w:rPr>
+    </w:lvl>
+    <w:lvl w:ilvl="5" w:tplc="040C0005" w:tentative="1">
+      <w:start w:val="1"/>
+      <w:numFmt w:val="bullet"/>
+      <w:lvlText w:val=""/>
+      <w:lvlJc w:val="left"/>
+      <w:pPr>
+        <w:ind w:left="4320" w:hanging="360"/>
+      </w:pPr>
+      <w:rPr>
+        <w:rFonts w:ascii="Wingdings" w:hAnsi="Wingdings" w:hint="default"/>
+      </w:rPr>
+    </w:lvl>
+    <w:lvl w:ilvl="6" w:tplc="040C0001" w:tentative="1">
+      <w:start w:val="1"/>
+      <w:numFmt w:val="bullet"/>
+      <w:lvlText w:val=""/>
+      <w:lvlJc w:val="left"/>
+      <w:pPr>
+        <w:ind w:left="5040" w:hanging="360"/>
+      </w:pPr>
+      <w:rPr>
+        <w:rFonts w:ascii="Symbol" w:hAnsi="Symbol" w:hint="default"/>
+      </w:rPr>
+    </w:lvl>
+    <w:lvl w:ilvl="7" w:tplc="040C0003" w:tentative="1">
+      <w:start w:val="1"/>
+      <w:numFmt w:val="bullet"/>
+      <w:lvlText w:val="o"/>
+      <w:lvlJc w:val="left"/>
+      <w:pPr>
+        <w:ind w:left="5760" w:hanging="360"/>
+      </w:pPr>
+      <w:rPr>
+        <w:rFonts w:ascii="Courier New" w:hAnsi="Courier New" w:cs="Courier New" w:hint="default"/>
+      </w:rPr>
+    </w:lvl>
+    <w:lvl w:ilvl="8" w:tplc="040C0005" w:tentative="1">
+      <w:start w:val="1"/>
+      <w:numFmt w:val="bullet"/>
+      <w:lvlText w:val=""/>
+      <w:lvlJc w:val="left"/>
+      <w:pPr>
+        <w:ind w:left="6480" w:hanging="360"/>
+      </w:pPr>
+      <w:rPr>
+        <w:rFonts w:ascii="Wingdings" w:hAnsi="Wingdings" w:hint="default"/>
+      </w:rPr>
+    </w:lvl>
+  </w:abstractNum>
+  <w:abstractNum w:abstractNumId="5">
     <w:nsid w:val="4E6D6647"/>
     <w:multiLevelType w:val="hybridMultilevel"/>
     <w:tmpl w:val="0BC2673C"/>
@@ -12722,7 +14554,7 @@
       </w:rPr>
     </w:lvl>
   </w:abstractNum>
-  <w:abstractNum w:abstractNumId="5">
+  <w:abstractNum w:abstractNumId="6">
     <w:nsid w:val="52344C8A"/>
     <w:multiLevelType w:val="hybridMultilevel"/>
     <w:tmpl w:val="159A3A58"/>
@@ -12834,7 +14666,7 @@
       </w:rPr>
     </w:lvl>
   </w:abstractNum>
-  <w:abstractNum w:abstractNumId="6">
+  <w:abstractNum w:abstractNumId="7">
     <w:nsid w:val="56316CEF"/>
     <w:multiLevelType w:val="hybridMultilevel"/>
     <w:tmpl w:val="B29A51E6"/>
@@ -12923,7 +14755,7 @@
       </w:pPr>
     </w:lvl>
   </w:abstractNum>
-  <w:abstractNum w:abstractNumId="7">
+  <w:abstractNum w:abstractNumId="8">
     <w:nsid w:val="5D3211AD"/>
     <w:multiLevelType w:val="hybridMultilevel"/>
     <w:tmpl w:val="8DBABEC8"/>
@@ -13009,7 +14841,7 @@
       </w:pPr>
     </w:lvl>
   </w:abstractNum>
-  <w:abstractNum w:abstractNumId="8">
+  <w:abstractNum w:abstractNumId="9">
     <w:nsid w:val="6C944ACB"/>
     <w:multiLevelType w:val="hybridMultilevel"/>
     <w:tmpl w:val="3E026470"/>
@@ -13095,7 +14927,7 @@
       </w:pPr>
     </w:lvl>
   </w:abstractNum>
-  <w:abstractNum w:abstractNumId="9">
+  <w:abstractNum w:abstractNumId="10">
     <w:nsid w:val="707328F1"/>
     <w:multiLevelType w:val="hybridMultilevel"/>
     <w:tmpl w:val="41D04420"/>
@@ -13184,7 +15016,7 @@
       </w:pPr>
     </w:lvl>
   </w:abstractNum>
-  <w:abstractNum w:abstractNumId="10">
+  <w:abstractNum w:abstractNumId="11">
     <w:nsid w:val="73583B76"/>
     <w:multiLevelType w:val="hybridMultilevel"/>
     <w:tmpl w:val="783C0D26"/>
@@ -13276,7 +15108,7 @@
       </w:pPr>
     </w:lvl>
   </w:abstractNum>
-  <w:abstractNum w:abstractNumId="11">
+  <w:abstractNum w:abstractNumId="12">
     <w:nsid w:val="73BE1235"/>
     <w:multiLevelType w:val="hybridMultilevel"/>
     <w:tmpl w:val="708ADF02"/>
@@ -13389,7 +15221,7 @@
       </w:rPr>
     </w:lvl>
   </w:abstractNum>
-  <w:abstractNum w:abstractNumId="12">
+  <w:abstractNum w:abstractNumId="13">
     <w:nsid w:val="7D1021B1"/>
     <w:multiLevelType w:val="hybridMultilevel"/>
     <w:tmpl w:val="B7B664D6"/>
@@ -13501,7 +15333,7 @@
       </w:rPr>
     </w:lvl>
   </w:abstractNum>
-  <w:abstractNum w:abstractNumId="13">
+  <w:abstractNum w:abstractNumId="14">
     <w:nsid w:val="7F3447D5"/>
     <w:multiLevelType w:val="hybridMultilevel"/>
     <w:tmpl w:val="2B027B6C"/>
@@ -13591,22 +15423,22 @@
     </w:lvl>
   </w:abstractNum>
   <w:num w:numId="1">
+    <w:abstractNumId w:val="12"/>
+  </w:num>
+  <w:num w:numId="2">
+    <w:abstractNumId w:val="13"/>
+  </w:num>
+  <w:num w:numId="3">
+    <w:abstractNumId w:val="6"/>
+  </w:num>
+  <w:num w:numId="4">
+    <w:abstractNumId w:val="9"/>
+  </w:num>
+  <w:num w:numId="5">
     <w:abstractNumId w:val="11"/>
   </w:num>
-  <w:num w:numId="2">
-    <w:abstractNumId w:val="12"/>
-  </w:num>
-  <w:num w:numId="3">
-    <w:abstractNumId w:val="5"/>
-  </w:num>
-  <w:num w:numId="4">
+  <w:num w:numId="6">
     <w:abstractNumId w:val="8"/>
-  </w:num>
-  <w:num w:numId="5">
-    <w:abstractNumId w:val="10"/>
-  </w:num>
-  <w:num w:numId="6">
-    <w:abstractNumId w:val="7"/>
   </w:num>
   <w:num w:numId="7">
     <w:abstractNumId w:val="0"/>
@@ -13615,22 +15447,25 @@
     <w:abstractNumId w:val="1"/>
   </w:num>
   <w:num w:numId="9">
-    <w:abstractNumId w:val="4"/>
+    <w:abstractNumId w:val="5"/>
   </w:num>
   <w:num w:numId="10">
     <w:abstractNumId w:val="3"/>
   </w:num>
   <w:num w:numId="11">
-    <w:abstractNumId w:val="9"/>
+    <w:abstractNumId w:val="10"/>
   </w:num>
   <w:num w:numId="12">
-    <w:abstractNumId w:val="13"/>
+    <w:abstractNumId w:val="14"/>
   </w:num>
   <w:num w:numId="13">
     <w:abstractNumId w:val="2"/>
   </w:num>
   <w:num w:numId="14">
-    <w:abstractNumId w:val="6"/>
+    <w:abstractNumId w:val="7"/>
+  </w:num>
+  <w:num w:numId="15">
+    <w:abstractNumId w:val="4"/>
   </w:num>
 </w:numbering>
 </file>
@@ -14030,6 +15865,7 @@
   <w:style w:type="paragraph" w:default="1" w:styleId="Normal">
     <w:name w:val="Normal"/>
     <w:qFormat/>
+    <w:rsid w:val="007F1B46"/>
   </w:style>
   <w:style w:type="paragraph" w:styleId="Heading1">
     <w:name w:val="heading 1"/>

</xml_diff>

<commit_message>
Partie 6 – Prompt Engineering pour le Machine Learning:Prompt pour le Choix de modèles de prédiction
</commit_message>
<xml_diff>
--- a/ai-business_assistant/correction_atelier_prompt-engineering.docx
+++ b/ai-business_assistant/correction_atelier_prompt-engineering.docx
@@ -13866,8 +13866,6 @@
           </wp:inline>
         </w:drawing>
       </w:r>
-      <w:bookmarkStart w:id="0" w:name="_GoBack"/>
-      <w:bookmarkEnd w:id="0"/>
       <w:r>
         <w:rPr>
           <w:rFonts w:ascii="Times New Roman" w:hAnsi="Times New Roman" w:cs="Times New Roman"/>
@@ -13914,6 +13912,2097 @@
         </w:drawing>
       </w:r>
     </w:p>
+    <w:p>
+      <w:pPr>
+        <w:autoSpaceDE w:val="0"/>
+        <w:autoSpaceDN w:val="0"/>
+        <w:adjustRightInd w:val="0"/>
+        <w:spacing w:after="0" w:line="360" w:lineRule="auto"/>
+        <w:rPr>
+          <w:rFonts w:ascii="Times New Roman" w:hAnsi="Times New Roman" w:cs="Times New Roman"/>
+          <w:b/>
+          <w:color w:val="000000"/>
+          <w:kern w:val="0"/>
+          <w:sz w:val="24"/>
+          <w:szCs w:val="24"/>
+        </w:rPr>
+      </w:pPr>
+    </w:p>
+    <w:p>
+      <w:pPr>
+        <w:pStyle w:val="ListParagraph"/>
+        <w:numPr>
+          <w:ilvl w:val="0"/>
+          <w:numId w:val="14"/>
+        </w:numPr>
+        <w:autoSpaceDE w:val="0"/>
+        <w:autoSpaceDN w:val="0"/>
+        <w:adjustRightInd w:val="0"/>
+        <w:spacing w:after="0" w:line="360" w:lineRule="auto"/>
+        <w:rPr>
+          <w:rFonts w:ascii="Times New Roman" w:hAnsi="Times New Roman" w:cs="Times New Roman"/>
+          <w:color w:val="000000"/>
+          <w:kern w:val="0"/>
+          <w:sz w:val="24"/>
+          <w:szCs w:val="24"/>
+        </w:rPr>
+      </w:pPr>
+      <w:r>
+        <w:rPr>
+          <w:rFonts w:ascii="Times New Roman" w:hAnsi="Times New Roman" w:cs="Times New Roman"/>
+          <w:color w:val="000000"/>
+          <w:kern w:val="0"/>
+          <w:sz w:val="24"/>
+          <w:szCs w:val="24"/>
+        </w:rPr>
+        <w:t xml:space="preserve">Créer un prompt permettant, à partir du </w:t>
+      </w:r>
+      <w:proofErr w:type="spellStart"/>
+      <w:r>
+        <w:rPr>
+          <w:rFonts w:ascii="Times New Roman" w:hAnsi="Times New Roman" w:cs="Times New Roman"/>
+          <w:color w:val="000000"/>
+          <w:kern w:val="0"/>
+          <w:sz w:val="24"/>
+          <w:szCs w:val="24"/>
+        </w:rPr>
+        <w:t>dataset</w:t>
+      </w:r>
+      <w:proofErr w:type="spellEnd"/>
+      <w:r>
+        <w:rPr>
+          <w:rFonts w:ascii="Times New Roman" w:hAnsi="Times New Roman" w:cs="Times New Roman"/>
+          <w:color w:val="000000"/>
+          <w:kern w:val="0"/>
+          <w:sz w:val="24"/>
+          <w:szCs w:val="24"/>
+        </w:rPr>
+        <w:t xml:space="preserve"> des capteurs, de proposer plusieurs</w:t>
+      </w:r>
+      <w:r>
+        <w:rPr>
+          <w:rFonts w:ascii="Times New Roman" w:hAnsi="Times New Roman" w:cs="Times New Roman"/>
+          <w:color w:val="000000"/>
+          <w:kern w:val="0"/>
+          <w:sz w:val="24"/>
+          <w:szCs w:val="24"/>
+        </w:rPr>
+        <w:t xml:space="preserve"> </w:t>
+      </w:r>
+      <w:r>
+        <w:rPr>
+          <w:rFonts w:ascii="Times New Roman" w:hAnsi="Times New Roman" w:cs="Times New Roman"/>
+          <w:color w:val="000000"/>
+          <w:kern w:val="0"/>
+          <w:sz w:val="24"/>
+          <w:szCs w:val="24"/>
+        </w:rPr>
+        <w:t>modèles adaptés à la prédiction de la consommation énergétique d'un bâtiment. Pour</w:t>
+      </w:r>
+      <w:r>
+        <w:rPr>
+          <w:rFonts w:ascii="Times New Roman" w:hAnsi="Times New Roman" w:cs="Times New Roman"/>
+          <w:color w:val="000000"/>
+          <w:kern w:val="0"/>
+          <w:sz w:val="24"/>
+          <w:szCs w:val="24"/>
+        </w:rPr>
+        <w:t xml:space="preserve"> </w:t>
+      </w:r>
+      <w:r>
+        <w:rPr>
+          <w:rFonts w:ascii="Times New Roman" w:hAnsi="Times New Roman" w:cs="Times New Roman"/>
+          <w:color w:val="000000"/>
+          <w:kern w:val="0"/>
+          <w:sz w:val="24"/>
+          <w:szCs w:val="24"/>
+        </w:rPr>
+        <w:t>chaque modèle, le LLM doit indiquer le principe, les avantages, les limites, le type de</w:t>
+      </w:r>
+      <w:r>
+        <w:rPr>
+          <w:rFonts w:ascii="Times New Roman" w:hAnsi="Times New Roman" w:cs="Times New Roman"/>
+          <w:color w:val="000000"/>
+          <w:kern w:val="0"/>
+          <w:sz w:val="24"/>
+          <w:szCs w:val="24"/>
+        </w:rPr>
+        <w:t xml:space="preserve"> </w:t>
+      </w:r>
+      <w:r>
+        <w:rPr>
+          <w:rFonts w:ascii="Times New Roman" w:hAnsi="Times New Roman" w:cs="Times New Roman"/>
+          <w:color w:val="000000"/>
+          <w:kern w:val="0"/>
+          <w:sz w:val="24"/>
+          <w:szCs w:val="24"/>
+        </w:rPr>
+        <w:t>problème et les métriques pertinentes.</w:t>
+      </w:r>
+    </w:p>
+    <w:p>
+      <w:pPr>
+        <w:pStyle w:val="ListParagraph"/>
+        <w:numPr>
+          <w:ilvl w:val="0"/>
+          <w:numId w:val="15"/>
+        </w:numPr>
+        <w:autoSpaceDE w:val="0"/>
+        <w:autoSpaceDN w:val="0"/>
+        <w:adjustRightInd w:val="0"/>
+        <w:spacing w:after="0" w:line="360" w:lineRule="auto"/>
+        <w:jc w:val="center"/>
+        <w:rPr>
+          <w:rFonts w:ascii="Times New Roman" w:hAnsi="Times New Roman" w:cs="Times New Roman"/>
+          <w:color w:val="000000"/>
+          <w:kern w:val="0"/>
+          <w:sz w:val="24"/>
+          <w:szCs w:val="24"/>
+        </w:rPr>
+      </w:pPr>
+      <w:r>
+        <w:rPr>
+          <w:rFonts w:ascii="Times New Roman" w:hAnsi="Times New Roman" w:cs="Times New Roman"/>
+          <w:b/>
+          <w:color w:val="000000"/>
+          <w:kern w:val="0"/>
+          <w:sz w:val="24"/>
+          <w:szCs w:val="24"/>
+        </w:rPr>
+        <w:t>Prompt proposé</w:t>
+      </w:r>
+    </w:p>
+    <w:p>
+      <w:pPr>
+        <w:autoSpaceDE w:val="0"/>
+        <w:autoSpaceDN w:val="0"/>
+        <w:adjustRightInd w:val="0"/>
+        <w:spacing w:after="0" w:line="360" w:lineRule="auto"/>
+        <w:rPr>
+          <w:rFonts w:ascii="Times New Roman" w:hAnsi="Times New Roman" w:cs="Times New Roman"/>
+          <w:b/>
+          <w:color w:val="000000"/>
+          <w:kern w:val="0"/>
+          <w:sz w:val="24"/>
+          <w:szCs w:val="24"/>
+        </w:rPr>
+      </w:pPr>
+      <w:r>
+        <w:rPr>
+          <w:rFonts w:ascii="Times New Roman" w:hAnsi="Times New Roman" w:cs="Times New Roman"/>
+          <w:b/>
+          <w:color w:val="000000"/>
+          <w:kern w:val="0"/>
+          <w:sz w:val="24"/>
+          <w:szCs w:val="24"/>
+        </w:rPr>
+        <w:t>Rôle :</w:t>
+      </w:r>
+    </w:p>
+    <w:p>
+      <w:pPr>
+        <w:autoSpaceDE w:val="0"/>
+        <w:autoSpaceDN w:val="0"/>
+        <w:adjustRightInd w:val="0"/>
+        <w:spacing w:after="0" w:line="360" w:lineRule="auto"/>
+        <w:rPr>
+          <w:rFonts w:ascii="Times New Roman" w:hAnsi="Times New Roman" w:cs="Times New Roman"/>
+          <w:color w:val="000000"/>
+          <w:kern w:val="0"/>
+          <w:sz w:val="24"/>
+          <w:szCs w:val="24"/>
+        </w:rPr>
+      </w:pPr>
+      <w:r>
+        <w:rPr>
+          <w:rFonts w:ascii="Times New Roman" w:hAnsi="Times New Roman" w:cs="Times New Roman"/>
+          <w:color w:val="000000"/>
+          <w:kern w:val="0"/>
+          <w:sz w:val="24"/>
+          <w:szCs w:val="24"/>
+        </w:rPr>
+        <w:t xml:space="preserve">Tu es un data </w:t>
+      </w:r>
+      <w:proofErr w:type="spellStart"/>
+      <w:r>
+        <w:rPr>
+          <w:rFonts w:ascii="Times New Roman" w:hAnsi="Times New Roman" w:cs="Times New Roman"/>
+          <w:color w:val="000000"/>
+          <w:kern w:val="0"/>
+          <w:sz w:val="24"/>
+          <w:szCs w:val="24"/>
+        </w:rPr>
+        <w:t>scientist</w:t>
+      </w:r>
+      <w:proofErr w:type="spellEnd"/>
+      <w:r>
+        <w:rPr>
+          <w:rFonts w:ascii="Times New Roman" w:hAnsi="Times New Roman" w:cs="Times New Roman"/>
+          <w:color w:val="000000"/>
+          <w:kern w:val="0"/>
+          <w:sz w:val="24"/>
+          <w:szCs w:val="24"/>
+        </w:rPr>
+        <w:t xml:space="preserve"> spécial</w:t>
+      </w:r>
+      <w:r>
+        <w:rPr>
+          <w:rFonts w:ascii="Times New Roman" w:hAnsi="Times New Roman" w:cs="Times New Roman"/>
+          <w:color w:val="000000"/>
+          <w:kern w:val="0"/>
+          <w:sz w:val="24"/>
+          <w:szCs w:val="24"/>
+        </w:rPr>
+        <w:t>isé en modélisation prédictive.</w:t>
+      </w:r>
+    </w:p>
+    <w:p>
+      <w:pPr>
+        <w:autoSpaceDE w:val="0"/>
+        <w:autoSpaceDN w:val="0"/>
+        <w:adjustRightInd w:val="0"/>
+        <w:spacing w:after="0" w:line="360" w:lineRule="auto"/>
+        <w:rPr>
+          <w:rFonts w:ascii="Times New Roman" w:hAnsi="Times New Roman" w:cs="Times New Roman"/>
+          <w:b/>
+          <w:color w:val="000000"/>
+          <w:kern w:val="0"/>
+          <w:sz w:val="24"/>
+          <w:szCs w:val="24"/>
+        </w:rPr>
+      </w:pPr>
+      <w:r>
+        <w:rPr>
+          <w:rFonts w:ascii="Times New Roman" w:hAnsi="Times New Roman" w:cs="Times New Roman"/>
+          <w:b/>
+          <w:color w:val="000000"/>
+          <w:kern w:val="0"/>
+          <w:sz w:val="24"/>
+          <w:szCs w:val="24"/>
+        </w:rPr>
+        <w:t>Contexte :</w:t>
+      </w:r>
+    </w:p>
+    <w:p>
+      <w:pPr>
+        <w:autoSpaceDE w:val="0"/>
+        <w:autoSpaceDN w:val="0"/>
+        <w:adjustRightInd w:val="0"/>
+        <w:spacing w:after="0" w:line="360" w:lineRule="auto"/>
+        <w:jc w:val="both"/>
+        <w:rPr>
+          <w:rFonts w:ascii="Times New Roman" w:hAnsi="Times New Roman" w:cs="Times New Roman"/>
+          <w:color w:val="000000"/>
+          <w:kern w:val="0"/>
+          <w:sz w:val="24"/>
+          <w:szCs w:val="24"/>
+        </w:rPr>
+      </w:pPr>
+      <w:r>
+        <w:rPr>
+          <w:rFonts w:ascii="Times New Roman" w:hAnsi="Times New Roman" w:cs="Times New Roman"/>
+          <w:color w:val="000000"/>
+          <w:kern w:val="0"/>
+          <w:sz w:val="24"/>
+          <w:szCs w:val="24"/>
+        </w:rPr>
+        <w:lastRenderedPageBreak/>
+        <w:t xml:space="preserve">Je dispose d'un </w:t>
+      </w:r>
+      <w:proofErr w:type="spellStart"/>
+      <w:r>
+        <w:rPr>
+          <w:rFonts w:ascii="Times New Roman" w:hAnsi="Times New Roman" w:cs="Times New Roman"/>
+          <w:color w:val="000000"/>
+          <w:kern w:val="0"/>
+          <w:sz w:val="24"/>
+          <w:szCs w:val="24"/>
+        </w:rPr>
+        <w:t>dataset</w:t>
+      </w:r>
+      <w:proofErr w:type="spellEnd"/>
+      <w:r>
+        <w:rPr>
+          <w:rFonts w:ascii="Times New Roman" w:hAnsi="Times New Roman" w:cs="Times New Roman"/>
+          <w:color w:val="000000"/>
+          <w:kern w:val="0"/>
+          <w:sz w:val="24"/>
+          <w:szCs w:val="24"/>
+        </w:rPr>
+        <w:t xml:space="preserve"> de mesures de capteurs insta</w:t>
+      </w:r>
+      <w:r>
+        <w:rPr>
+          <w:rFonts w:ascii="Times New Roman" w:hAnsi="Times New Roman" w:cs="Times New Roman"/>
+          <w:color w:val="000000"/>
+          <w:kern w:val="0"/>
+          <w:sz w:val="24"/>
+          <w:szCs w:val="24"/>
+        </w:rPr>
+        <w:t xml:space="preserve">llés dans plusieurs bâtiments, </w:t>
+      </w:r>
+      <w:r>
+        <w:rPr>
+          <w:rFonts w:ascii="Times New Roman" w:hAnsi="Times New Roman" w:cs="Times New Roman"/>
+          <w:color w:val="000000"/>
+          <w:kern w:val="0"/>
+          <w:sz w:val="24"/>
+          <w:szCs w:val="24"/>
+        </w:rPr>
+        <w:t>avec les colonnes suivantes :</w:t>
+      </w:r>
+    </w:p>
+    <w:p>
+      <w:pPr>
+        <w:autoSpaceDE w:val="0"/>
+        <w:autoSpaceDN w:val="0"/>
+        <w:adjustRightInd w:val="0"/>
+        <w:spacing w:after="0" w:line="360" w:lineRule="auto"/>
+        <w:jc w:val="both"/>
+        <w:rPr>
+          <w:rFonts w:ascii="Times New Roman" w:hAnsi="Times New Roman" w:cs="Times New Roman"/>
+          <w:color w:val="000000"/>
+          <w:kern w:val="0"/>
+          <w:sz w:val="24"/>
+          <w:szCs w:val="24"/>
+        </w:rPr>
+      </w:pPr>
+      <w:r>
+        <w:rPr>
+          <w:rFonts w:ascii="Times New Roman" w:hAnsi="Times New Roman" w:cs="Times New Roman"/>
+          <w:color w:val="000000"/>
+          <w:kern w:val="0"/>
+          <w:sz w:val="24"/>
+          <w:szCs w:val="24"/>
+        </w:rPr>
+        <w:t xml:space="preserve">- </w:t>
+      </w:r>
+      <w:proofErr w:type="spellStart"/>
+      <w:r>
+        <w:rPr>
+          <w:rFonts w:ascii="Times New Roman" w:hAnsi="Times New Roman" w:cs="Times New Roman"/>
+          <w:color w:val="000000"/>
+          <w:kern w:val="0"/>
+          <w:sz w:val="24"/>
+          <w:szCs w:val="24"/>
+        </w:rPr>
+        <w:t>id_mesure</w:t>
+      </w:r>
+      <w:proofErr w:type="spellEnd"/>
+      <w:r>
+        <w:rPr>
+          <w:rFonts w:ascii="Times New Roman" w:hAnsi="Times New Roman" w:cs="Times New Roman"/>
+          <w:color w:val="000000"/>
+          <w:kern w:val="0"/>
+          <w:sz w:val="24"/>
+          <w:szCs w:val="24"/>
+        </w:rPr>
+        <w:t xml:space="preserve"> (identifiant unique de la mesure)</w:t>
+      </w:r>
+    </w:p>
+    <w:p>
+      <w:pPr>
+        <w:autoSpaceDE w:val="0"/>
+        <w:autoSpaceDN w:val="0"/>
+        <w:adjustRightInd w:val="0"/>
+        <w:spacing w:after="0" w:line="360" w:lineRule="auto"/>
+        <w:jc w:val="both"/>
+        <w:rPr>
+          <w:rFonts w:ascii="Times New Roman" w:hAnsi="Times New Roman" w:cs="Times New Roman"/>
+          <w:color w:val="000000"/>
+          <w:kern w:val="0"/>
+          <w:sz w:val="24"/>
+          <w:szCs w:val="24"/>
+        </w:rPr>
+      </w:pPr>
+      <w:r>
+        <w:rPr>
+          <w:rFonts w:ascii="Times New Roman" w:hAnsi="Times New Roman" w:cs="Times New Roman"/>
+          <w:color w:val="000000"/>
+          <w:kern w:val="0"/>
+          <w:sz w:val="24"/>
+          <w:szCs w:val="24"/>
+        </w:rPr>
+        <w:t xml:space="preserve">- </w:t>
+      </w:r>
+      <w:proofErr w:type="spellStart"/>
+      <w:r>
+        <w:rPr>
+          <w:rFonts w:ascii="Times New Roman" w:hAnsi="Times New Roman" w:cs="Times New Roman"/>
+          <w:color w:val="000000"/>
+          <w:kern w:val="0"/>
+          <w:sz w:val="24"/>
+          <w:szCs w:val="24"/>
+        </w:rPr>
+        <w:t>date_heure</w:t>
+      </w:r>
+      <w:proofErr w:type="spellEnd"/>
+      <w:r>
+        <w:rPr>
+          <w:rFonts w:ascii="Times New Roman" w:hAnsi="Times New Roman" w:cs="Times New Roman"/>
+          <w:color w:val="000000"/>
+          <w:kern w:val="0"/>
+          <w:sz w:val="24"/>
+          <w:szCs w:val="24"/>
+        </w:rPr>
+        <w:t xml:space="preserve"> (horodatage de la mesure)</w:t>
+      </w:r>
+    </w:p>
+    <w:p>
+      <w:pPr>
+        <w:autoSpaceDE w:val="0"/>
+        <w:autoSpaceDN w:val="0"/>
+        <w:adjustRightInd w:val="0"/>
+        <w:spacing w:after="0" w:line="360" w:lineRule="auto"/>
+        <w:jc w:val="both"/>
+        <w:rPr>
+          <w:rFonts w:ascii="Times New Roman" w:hAnsi="Times New Roman" w:cs="Times New Roman"/>
+          <w:color w:val="000000"/>
+          <w:kern w:val="0"/>
+          <w:sz w:val="24"/>
+          <w:szCs w:val="24"/>
+        </w:rPr>
+      </w:pPr>
+      <w:r>
+        <w:rPr>
+          <w:rFonts w:ascii="Times New Roman" w:hAnsi="Times New Roman" w:cs="Times New Roman"/>
+          <w:color w:val="000000"/>
+          <w:kern w:val="0"/>
+          <w:sz w:val="24"/>
+          <w:szCs w:val="24"/>
+        </w:rPr>
+        <w:t xml:space="preserve">- </w:t>
+      </w:r>
+      <w:proofErr w:type="spellStart"/>
+      <w:r>
+        <w:rPr>
+          <w:rFonts w:ascii="Times New Roman" w:hAnsi="Times New Roman" w:cs="Times New Roman"/>
+          <w:color w:val="000000"/>
+          <w:kern w:val="0"/>
+          <w:sz w:val="24"/>
+          <w:szCs w:val="24"/>
+        </w:rPr>
+        <w:t>id_capteur</w:t>
+      </w:r>
+      <w:proofErr w:type="spellEnd"/>
+      <w:r>
+        <w:rPr>
+          <w:rFonts w:ascii="Times New Roman" w:hAnsi="Times New Roman" w:cs="Times New Roman"/>
+          <w:color w:val="000000"/>
+          <w:kern w:val="0"/>
+          <w:sz w:val="24"/>
+          <w:szCs w:val="24"/>
+        </w:rPr>
+        <w:t xml:space="preserve"> (12 capteurs différents, ex : C001 à C012)</w:t>
+      </w:r>
+    </w:p>
+    <w:p>
+      <w:pPr>
+        <w:autoSpaceDE w:val="0"/>
+        <w:autoSpaceDN w:val="0"/>
+        <w:adjustRightInd w:val="0"/>
+        <w:spacing w:after="0" w:line="360" w:lineRule="auto"/>
+        <w:jc w:val="both"/>
+        <w:rPr>
+          <w:rFonts w:ascii="Times New Roman" w:hAnsi="Times New Roman" w:cs="Times New Roman"/>
+          <w:color w:val="000000"/>
+          <w:kern w:val="0"/>
+          <w:sz w:val="24"/>
+          <w:szCs w:val="24"/>
+        </w:rPr>
+      </w:pPr>
+      <w:r>
+        <w:rPr>
+          <w:rFonts w:ascii="Times New Roman" w:hAnsi="Times New Roman" w:cs="Times New Roman"/>
+          <w:color w:val="000000"/>
+          <w:kern w:val="0"/>
+          <w:sz w:val="24"/>
+          <w:szCs w:val="24"/>
+        </w:rPr>
+        <w:t xml:space="preserve">- </w:t>
+      </w:r>
+      <w:proofErr w:type="spellStart"/>
+      <w:r>
+        <w:rPr>
+          <w:rFonts w:ascii="Times New Roman" w:hAnsi="Times New Roman" w:cs="Times New Roman"/>
+          <w:color w:val="000000"/>
+          <w:kern w:val="0"/>
+          <w:sz w:val="24"/>
+          <w:szCs w:val="24"/>
+        </w:rPr>
+        <w:t>batiment</w:t>
+      </w:r>
+      <w:proofErr w:type="spellEnd"/>
+      <w:r>
+        <w:rPr>
+          <w:rFonts w:ascii="Times New Roman" w:hAnsi="Times New Roman" w:cs="Times New Roman"/>
+          <w:color w:val="000000"/>
+          <w:kern w:val="0"/>
+          <w:sz w:val="24"/>
+          <w:szCs w:val="24"/>
+        </w:rPr>
+        <w:t xml:space="preserve"> (4 bâtiments, ex : B001 à B004)</w:t>
+      </w:r>
+    </w:p>
+    <w:p>
+      <w:pPr>
+        <w:autoSpaceDE w:val="0"/>
+        <w:autoSpaceDN w:val="0"/>
+        <w:adjustRightInd w:val="0"/>
+        <w:spacing w:after="0" w:line="360" w:lineRule="auto"/>
+        <w:jc w:val="both"/>
+        <w:rPr>
+          <w:rFonts w:ascii="Times New Roman" w:hAnsi="Times New Roman" w:cs="Times New Roman"/>
+          <w:color w:val="000000"/>
+          <w:kern w:val="0"/>
+          <w:sz w:val="24"/>
+          <w:szCs w:val="24"/>
+        </w:rPr>
+      </w:pPr>
+      <w:r>
+        <w:rPr>
+          <w:rFonts w:ascii="Times New Roman" w:hAnsi="Times New Roman" w:cs="Times New Roman"/>
+          <w:color w:val="000000"/>
+          <w:kern w:val="0"/>
+          <w:sz w:val="24"/>
+          <w:szCs w:val="24"/>
+        </w:rPr>
+        <w:t xml:space="preserve">- </w:t>
+      </w:r>
+      <w:proofErr w:type="spellStart"/>
+      <w:r>
+        <w:rPr>
+          <w:rFonts w:ascii="Times New Roman" w:hAnsi="Times New Roman" w:cs="Times New Roman"/>
+          <w:color w:val="000000"/>
+          <w:kern w:val="0"/>
+          <w:sz w:val="24"/>
+          <w:szCs w:val="24"/>
+        </w:rPr>
+        <w:t>temperature</w:t>
+      </w:r>
+      <w:proofErr w:type="spellEnd"/>
+      <w:r>
+        <w:rPr>
+          <w:rFonts w:ascii="Times New Roman" w:hAnsi="Times New Roman" w:cs="Times New Roman"/>
+          <w:color w:val="000000"/>
+          <w:kern w:val="0"/>
+          <w:sz w:val="24"/>
+          <w:szCs w:val="24"/>
+        </w:rPr>
+        <w:t xml:space="preserve"> (en °C, valeurs observées entre -18.5 et 58.7)</w:t>
+      </w:r>
+    </w:p>
+    <w:p>
+      <w:pPr>
+        <w:autoSpaceDE w:val="0"/>
+        <w:autoSpaceDN w:val="0"/>
+        <w:adjustRightInd w:val="0"/>
+        <w:spacing w:after="0" w:line="360" w:lineRule="auto"/>
+        <w:jc w:val="both"/>
+        <w:rPr>
+          <w:rFonts w:ascii="Times New Roman" w:hAnsi="Times New Roman" w:cs="Times New Roman"/>
+          <w:color w:val="000000"/>
+          <w:kern w:val="0"/>
+          <w:sz w:val="24"/>
+          <w:szCs w:val="24"/>
+        </w:rPr>
+      </w:pPr>
+      <w:r>
+        <w:rPr>
+          <w:rFonts w:ascii="Times New Roman" w:hAnsi="Times New Roman" w:cs="Times New Roman"/>
+          <w:color w:val="000000"/>
+          <w:kern w:val="0"/>
+          <w:sz w:val="24"/>
+          <w:szCs w:val="24"/>
+        </w:rPr>
+        <w:t xml:space="preserve">- </w:t>
+      </w:r>
+      <w:proofErr w:type="spellStart"/>
+      <w:r>
+        <w:rPr>
+          <w:rFonts w:ascii="Times New Roman" w:hAnsi="Times New Roman" w:cs="Times New Roman"/>
+          <w:color w:val="000000"/>
+          <w:kern w:val="0"/>
+          <w:sz w:val="24"/>
+          <w:szCs w:val="24"/>
+        </w:rPr>
+        <w:t>humidite</w:t>
+      </w:r>
+      <w:proofErr w:type="spellEnd"/>
+      <w:r>
+        <w:rPr>
+          <w:rFonts w:ascii="Times New Roman" w:hAnsi="Times New Roman" w:cs="Times New Roman"/>
+          <w:color w:val="000000"/>
+          <w:kern w:val="0"/>
+          <w:sz w:val="24"/>
+          <w:szCs w:val="24"/>
+        </w:rPr>
+        <w:t xml:space="preserve"> (en %, valeurs observées jusqu'à 145)</w:t>
+      </w:r>
+    </w:p>
+    <w:p>
+      <w:pPr>
+        <w:autoSpaceDE w:val="0"/>
+        <w:autoSpaceDN w:val="0"/>
+        <w:adjustRightInd w:val="0"/>
+        <w:spacing w:after="0" w:line="360" w:lineRule="auto"/>
+        <w:jc w:val="both"/>
+        <w:rPr>
+          <w:rFonts w:ascii="Times New Roman" w:hAnsi="Times New Roman" w:cs="Times New Roman"/>
+          <w:color w:val="000000"/>
+          <w:kern w:val="0"/>
+          <w:sz w:val="24"/>
+          <w:szCs w:val="24"/>
+        </w:rPr>
+      </w:pPr>
+      <w:r>
+        <w:rPr>
+          <w:rFonts w:ascii="Times New Roman" w:hAnsi="Times New Roman" w:cs="Times New Roman"/>
+          <w:color w:val="000000"/>
+          <w:kern w:val="0"/>
+          <w:sz w:val="24"/>
+          <w:szCs w:val="24"/>
+        </w:rPr>
+        <w:t xml:space="preserve">- pression (en </w:t>
+      </w:r>
+      <w:proofErr w:type="spellStart"/>
+      <w:r>
+        <w:rPr>
+          <w:rFonts w:ascii="Times New Roman" w:hAnsi="Times New Roman" w:cs="Times New Roman"/>
+          <w:color w:val="000000"/>
+          <w:kern w:val="0"/>
+          <w:sz w:val="24"/>
+          <w:szCs w:val="24"/>
+        </w:rPr>
+        <w:t>hPa</w:t>
+      </w:r>
+      <w:proofErr w:type="spellEnd"/>
+      <w:r>
+        <w:rPr>
+          <w:rFonts w:ascii="Times New Roman" w:hAnsi="Times New Roman" w:cs="Times New Roman"/>
+          <w:color w:val="000000"/>
+          <w:kern w:val="0"/>
+          <w:sz w:val="24"/>
+          <w:szCs w:val="24"/>
+        </w:rPr>
+        <w:t>)</w:t>
+      </w:r>
+    </w:p>
+    <w:p>
+      <w:pPr>
+        <w:autoSpaceDE w:val="0"/>
+        <w:autoSpaceDN w:val="0"/>
+        <w:adjustRightInd w:val="0"/>
+        <w:spacing w:after="0" w:line="360" w:lineRule="auto"/>
+        <w:jc w:val="both"/>
+        <w:rPr>
+          <w:rFonts w:ascii="Times New Roman" w:hAnsi="Times New Roman" w:cs="Times New Roman"/>
+          <w:color w:val="000000"/>
+          <w:kern w:val="0"/>
+          <w:sz w:val="24"/>
+          <w:szCs w:val="24"/>
+        </w:rPr>
+      </w:pPr>
+      <w:r>
+        <w:rPr>
+          <w:rFonts w:ascii="Times New Roman" w:hAnsi="Times New Roman" w:cs="Times New Roman"/>
+          <w:color w:val="000000"/>
+          <w:kern w:val="0"/>
+          <w:sz w:val="24"/>
+          <w:szCs w:val="24"/>
+        </w:rPr>
+        <w:t>- consommation (en kWh, valeurs observées entre 18 et 875, moyenne autour de 208)</w:t>
+      </w:r>
+    </w:p>
+    <w:p>
+      <w:pPr>
+        <w:autoSpaceDE w:val="0"/>
+        <w:autoSpaceDN w:val="0"/>
+        <w:adjustRightInd w:val="0"/>
+        <w:spacing w:after="0" w:line="360" w:lineRule="auto"/>
+        <w:jc w:val="both"/>
+        <w:rPr>
+          <w:rFonts w:ascii="Times New Roman" w:hAnsi="Times New Roman" w:cs="Times New Roman"/>
+          <w:color w:val="000000"/>
+          <w:kern w:val="0"/>
+          <w:sz w:val="24"/>
+          <w:szCs w:val="24"/>
+        </w:rPr>
+      </w:pPr>
+      <w:r>
+        <w:rPr>
+          <w:rFonts w:ascii="Times New Roman" w:hAnsi="Times New Roman" w:cs="Times New Roman"/>
+          <w:color w:val="000000"/>
+          <w:kern w:val="0"/>
+          <w:sz w:val="24"/>
+          <w:szCs w:val="24"/>
+        </w:rPr>
+        <w:t xml:space="preserve">- </w:t>
+      </w:r>
+      <w:proofErr w:type="spellStart"/>
+      <w:r>
+        <w:rPr>
+          <w:rFonts w:ascii="Times New Roman" w:hAnsi="Times New Roman" w:cs="Times New Roman"/>
+          <w:color w:val="000000"/>
+          <w:kern w:val="0"/>
+          <w:sz w:val="24"/>
+          <w:szCs w:val="24"/>
+        </w:rPr>
+        <w:t>etat</w:t>
+      </w:r>
+      <w:proofErr w:type="spellEnd"/>
+      <w:r>
+        <w:rPr>
+          <w:rFonts w:ascii="Times New Roman" w:hAnsi="Times New Roman" w:cs="Times New Roman"/>
+          <w:color w:val="000000"/>
+          <w:kern w:val="0"/>
+          <w:sz w:val="24"/>
+          <w:szCs w:val="24"/>
+        </w:rPr>
+        <w:t xml:space="preserve"> (variable catégorielle : O</w:t>
+      </w:r>
+      <w:r>
+        <w:rPr>
+          <w:rFonts w:ascii="Times New Roman" w:hAnsi="Times New Roman" w:cs="Times New Roman"/>
+          <w:color w:val="000000"/>
+          <w:kern w:val="0"/>
+          <w:sz w:val="24"/>
+          <w:szCs w:val="24"/>
+        </w:rPr>
+        <w:t>K, ALERTE, ERREUR)</w:t>
+      </w:r>
+    </w:p>
+    <w:p>
+      <w:pPr>
+        <w:autoSpaceDE w:val="0"/>
+        <w:autoSpaceDN w:val="0"/>
+        <w:adjustRightInd w:val="0"/>
+        <w:spacing w:after="0" w:line="360" w:lineRule="auto"/>
+        <w:jc w:val="both"/>
+        <w:rPr>
+          <w:rFonts w:ascii="Times New Roman" w:hAnsi="Times New Roman" w:cs="Times New Roman"/>
+          <w:color w:val="000000"/>
+          <w:kern w:val="0"/>
+          <w:sz w:val="24"/>
+          <w:szCs w:val="24"/>
+        </w:rPr>
+      </w:pPr>
+      <w:r>
+        <w:rPr>
+          <w:rFonts w:ascii="Times New Roman" w:hAnsi="Times New Roman" w:cs="Times New Roman"/>
+          <w:color w:val="000000"/>
+          <w:kern w:val="0"/>
+          <w:sz w:val="24"/>
+          <w:szCs w:val="24"/>
+        </w:rPr>
+        <w:t xml:space="preserve">Le </w:t>
+      </w:r>
+      <w:proofErr w:type="spellStart"/>
+      <w:r>
+        <w:rPr>
+          <w:rFonts w:ascii="Times New Roman" w:hAnsi="Times New Roman" w:cs="Times New Roman"/>
+          <w:color w:val="000000"/>
+          <w:kern w:val="0"/>
+          <w:sz w:val="24"/>
+          <w:szCs w:val="24"/>
+        </w:rPr>
+        <w:t>dataset</w:t>
+      </w:r>
+      <w:proofErr w:type="spellEnd"/>
+      <w:r>
+        <w:rPr>
+          <w:rFonts w:ascii="Times New Roman" w:hAnsi="Times New Roman" w:cs="Times New Roman"/>
+          <w:color w:val="000000"/>
+          <w:kern w:val="0"/>
+          <w:sz w:val="24"/>
+          <w:szCs w:val="24"/>
+        </w:rPr>
+        <w:t xml:space="preserve"> contient 605 lignes. Une première exploration a révélé :</w:t>
+      </w:r>
+    </w:p>
+    <w:p>
+      <w:pPr>
+        <w:autoSpaceDE w:val="0"/>
+        <w:autoSpaceDN w:val="0"/>
+        <w:adjustRightInd w:val="0"/>
+        <w:spacing w:after="0" w:line="360" w:lineRule="auto"/>
+        <w:jc w:val="both"/>
+        <w:rPr>
+          <w:rFonts w:ascii="Times New Roman" w:hAnsi="Times New Roman" w:cs="Times New Roman"/>
+          <w:color w:val="000000"/>
+          <w:kern w:val="0"/>
+          <w:sz w:val="24"/>
+          <w:szCs w:val="24"/>
+        </w:rPr>
+      </w:pPr>
+      <w:r>
+        <w:rPr>
+          <w:rFonts w:ascii="Times New Roman" w:hAnsi="Times New Roman" w:cs="Times New Roman"/>
+          <w:color w:val="000000"/>
+          <w:kern w:val="0"/>
+          <w:sz w:val="24"/>
+          <w:szCs w:val="24"/>
+        </w:rPr>
+        <w:t xml:space="preserve">- des valeurs manquantes sur </w:t>
+      </w:r>
+      <w:proofErr w:type="spellStart"/>
+      <w:r>
+        <w:rPr>
+          <w:rFonts w:ascii="Times New Roman" w:hAnsi="Times New Roman" w:cs="Times New Roman"/>
+          <w:color w:val="000000"/>
+          <w:kern w:val="0"/>
+          <w:sz w:val="24"/>
+          <w:szCs w:val="24"/>
+        </w:rPr>
+        <w:t>temperature</w:t>
+      </w:r>
+      <w:proofErr w:type="spellEnd"/>
+      <w:r>
+        <w:rPr>
+          <w:rFonts w:ascii="Times New Roman" w:hAnsi="Times New Roman" w:cs="Times New Roman"/>
+          <w:color w:val="000000"/>
+          <w:kern w:val="0"/>
+          <w:sz w:val="24"/>
+          <w:szCs w:val="24"/>
+        </w:rPr>
+        <w:t xml:space="preserve">, </w:t>
+      </w:r>
+      <w:proofErr w:type="spellStart"/>
+      <w:r>
+        <w:rPr>
+          <w:rFonts w:ascii="Times New Roman" w:hAnsi="Times New Roman" w:cs="Times New Roman"/>
+          <w:color w:val="000000"/>
+          <w:kern w:val="0"/>
+          <w:sz w:val="24"/>
+          <w:szCs w:val="24"/>
+        </w:rPr>
+        <w:t>humidite</w:t>
+      </w:r>
+      <w:proofErr w:type="spellEnd"/>
+      <w:r>
+        <w:rPr>
+          <w:rFonts w:ascii="Times New Roman" w:hAnsi="Times New Roman" w:cs="Times New Roman"/>
+          <w:color w:val="000000"/>
+          <w:kern w:val="0"/>
+          <w:sz w:val="24"/>
+          <w:szCs w:val="24"/>
+        </w:rPr>
+        <w:t xml:space="preserve">, pression, consommation et </w:t>
+      </w:r>
+      <w:proofErr w:type="spellStart"/>
+      <w:r>
+        <w:rPr>
+          <w:rFonts w:ascii="Times New Roman" w:hAnsi="Times New Roman" w:cs="Times New Roman"/>
+          <w:color w:val="000000"/>
+          <w:kern w:val="0"/>
+          <w:sz w:val="24"/>
+          <w:szCs w:val="24"/>
+        </w:rPr>
+        <w:t>etat</w:t>
+      </w:r>
+      <w:proofErr w:type="spellEnd"/>
+      <w:r>
+        <w:rPr>
+          <w:rFonts w:ascii="Times New Roman" w:hAnsi="Times New Roman" w:cs="Times New Roman"/>
+          <w:color w:val="000000"/>
+          <w:kern w:val="0"/>
+          <w:sz w:val="24"/>
+          <w:szCs w:val="24"/>
+        </w:rPr>
+        <w:t xml:space="preserve"> </w:t>
+      </w:r>
+      <w:r>
+        <w:rPr>
+          <w:rFonts w:ascii="Times New Roman" w:hAnsi="Times New Roman" w:cs="Times New Roman"/>
+          <w:color w:val="000000"/>
+          <w:kern w:val="0"/>
+          <w:sz w:val="24"/>
+          <w:szCs w:val="24"/>
+        </w:rPr>
+        <w:t xml:space="preserve">(entre 4 et </w:t>
+      </w:r>
+      <w:r>
+        <w:rPr>
+          <w:rFonts w:ascii="Times New Roman" w:hAnsi="Times New Roman" w:cs="Times New Roman"/>
+          <w:color w:val="000000"/>
+          <w:kern w:val="0"/>
+          <w:sz w:val="24"/>
+          <w:szCs w:val="24"/>
+        </w:rPr>
+        <w:t>6 valeurs manquantes par colonne)</w:t>
+      </w:r>
+    </w:p>
+    <w:p>
+      <w:pPr>
+        <w:autoSpaceDE w:val="0"/>
+        <w:autoSpaceDN w:val="0"/>
+        <w:adjustRightInd w:val="0"/>
+        <w:spacing w:after="0" w:line="360" w:lineRule="auto"/>
+        <w:jc w:val="both"/>
+        <w:rPr>
+          <w:rFonts w:ascii="Times New Roman" w:hAnsi="Times New Roman" w:cs="Times New Roman"/>
+          <w:color w:val="000000"/>
+          <w:kern w:val="0"/>
+          <w:sz w:val="24"/>
+          <w:szCs w:val="24"/>
+        </w:rPr>
+      </w:pPr>
+      <w:r>
+        <w:rPr>
+          <w:rFonts w:ascii="Times New Roman" w:hAnsi="Times New Roman" w:cs="Times New Roman"/>
+          <w:color w:val="000000"/>
+          <w:kern w:val="0"/>
+          <w:sz w:val="24"/>
+          <w:szCs w:val="24"/>
+        </w:rPr>
+        <w:t>- 5 lignes dupliquées</w:t>
+      </w:r>
+    </w:p>
+    <w:p>
+      <w:pPr>
+        <w:autoSpaceDE w:val="0"/>
+        <w:autoSpaceDN w:val="0"/>
+        <w:adjustRightInd w:val="0"/>
+        <w:spacing w:after="0" w:line="360" w:lineRule="auto"/>
+        <w:jc w:val="both"/>
+        <w:rPr>
+          <w:rFonts w:ascii="Times New Roman" w:hAnsi="Times New Roman" w:cs="Times New Roman"/>
+          <w:color w:val="000000"/>
+          <w:kern w:val="0"/>
+          <w:sz w:val="24"/>
+          <w:szCs w:val="24"/>
+        </w:rPr>
+      </w:pPr>
+      <w:r>
+        <w:rPr>
+          <w:rFonts w:ascii="Times New Roman" w:hAnsi="Times New Roman" w:cs="Times New Roman"/>
+          <w:color w:val="000000"/>
+          <w:kern w:val="0"/>
+          <w:sz w:val="24"/>
+          <w:szCs w:val="24"/>
+        </w:rPr>
+        <w:t>- des valeurs d'humidité supérieures à 100%, ce qui est physiquement impossible</w:t>
+      </w:r>
+    </w:p>
+    <w:p>
+      <w:pPr>
+        <w:autoSpaceDE w:val="0"/>
+        <w:autoSpaceDN w:val="0"/>
+        <w:adjustRightInd w:val="0"/>
+        <w:spacing w:after="0" w:line="360" w:lineRule="auto"/>
+        <w:jc w:val="both"/>
+        <w:rPr>
+          <w:rFonts w:ascii="Times New Roman" w:hAnsi="Times New Roman" w:cs="Times New Roman"/>
+          <w:color w:val="000000"/>
+          <w:kern w:val="0"/>
+          <w:sz w:val="24"/>
+          <w:szCs w:val="24"/>
+        </w:rPr>
+      </w:pPr>
+      <w:r>
+        <w:rPr>
+          <w:rFonts w:ascii="Times New Roman" w:hAnsi="Times New Roman" w:cs="Times New Roman"/>
+          <w:color w:val="000000"/>
+          <w:kern w:val="0"/>
+          <w:sz w:val="24"/>
+          <w:szCs w:val="24"/>
+        </w:rPr>
+        <w:t>- des températures extrêmes (-18.5°C et 58.7°C) q</w:t>
+      </w:r>
+      <w:r>
+        <w:rPr>
+          <w:rFonts w:ascii="Times New Roman" w:hAnsi="Times New Roman" w:cs="Times New Roman"/>
+          <w:color w:val="000000"/>
+          <w:kern w:val="0"/>
+          <w:sz w:val="24"/>
+          <w:szCs w:val="24"/>
+        </w:rPr>
+        <w:t>ui semblent suspectes pour des capteurs intérieurs</w:t>
+      </w:r>
+    </w:p>
+    <w:p>
+      <w:pPr>
+        <w:autoSpaceDE w:val="0"/>
+        <w:autoSpaceDN w:val="0"/>
+        <w:adjustRightInd w:val="0"/>
+        <w:spacing w:after="0" w:line="360" w:lineRule="auto"/>
+        <w:rPr>
+          <w:rFonts w:ascii="Times New Roman" w:hAnsi="Times New Roman" w:cs="Times New Roman"/>
+          <w:color w:val="000000"/>
+          <w:kern w:val="0"/>
+          <w:sz w:val="24"/>
+          <w:szCs w:val="24"/>
+        </w:rPr>
+      </w:pPr>
+      <w:r>
+        <w:rPr>
+          <w:rFonts w:ascii="Times New Roman" w:hAnsi="Times New Roman" w:cs="Times New Roman"/>
+          <w:b/>
+          <w:color w:val="000000"/>
+          <w:kern w:val="0"/>
+          <w:sz w:val="24"/>
+          <w:szCs w:val="24"/>
+        </w:rPr>
+        <w:t>Objectif métier :</w:t>
+      </w:r>
+      <w:r>
+        <w:rPr>
+          <w:rFonts w:ascii="Times New Roman" w:hAnsi="Times New Roman" w:cs="Times New Roman"/>
+          <w:color w:val="000000"/>
+          <w:kern w:val="0"/>
+          <w:sz w:val="24"/>
+          <w:szCs w:val="24"/>
+        </w:rPr>
+        <w:t xml:space="preserve"> prédire la consommation énergétiq</w:t>
+      </w:r>
+      <w:r>
+        <w:rPr>
+          <w:rFonts w:ascii="Times New Roman" w:hAnsi="Times New Roman" w:cs="Times New Roman"/>
+          <w:color w:val="000000"/>
+          <w:kern w:val="0"/>
+          <w:sz w:val="24"/>
+          <w:szCs w:val="24"/>
+        </w:rPr>
+        <w:t xml:space="preserve">ue (variable continue, en kWh) </w:t>
+      </w:r>
+      <w:r>
+        <w:rPr>
+          <w:rFonts w:ascii="Times New Roman" w:hAnsi="Times New Roman" w:cs="Times New Roman"/>
+          <w:color w:val="000000"/>
+          <w:kern w:val="0"/>
+          <w:sz w:val="24"/>
+          <w:szCs w:val="24"/>
+        </w:rPr>
+        <w:t>d'un bâtiment à partir des variables disponibles (te</w:t>
+      </w:r>
+      <w:r>
+        <w:rPr>
+          <w:rFonts w:ascii="Times New Roman" w:hAnsi="Times New Roman" w:cs="Times New Roman"/>
+          <w:color w:val="000000"/>
+          <w:kern w:val="0"/>
+          <w:sz w:val="24"/>
+          <w:szCs w:val="24"/>
+        </w:rPr>
+        <w:t xml:space="preserve">mpérature, humidité, pression, </w:t>
+      </w:r>
+      <w:r>
+        <w:rPr>
+          <w:rFonts w:ascii="Times New Roman" w:hAnsi="Times New Roman" w:cs="Times New Roman"/>
+          <w:color w:val="000000"/>
+          <w:kern w:val="0"/>
+          <w:sz w:val="24"/>
+          <w:szCs w:val="24"/>
+        </w:rPr>
+        <w:t>identifiant du capteur, identi</w:t>
+      </w:r>
+      <w:r>
+        <w:rPr>
+          <w:rFonts w:ascii="Times New Roman" w:hAnsi="Times New Roman" w:cs="Times New Roman"/>
+          <w:color w:val="000000"/>
+          <w:kern w:val="0"/>
+          <w:sz w:val="24"/>
+          <w:szCs w:val="24"/>
+        </w:rPr>
+        <w:t>fiant du bâtiment, horodatage).</w:t>
+      </w:r>
+    </w:p>
+    <w:p>
+      <w:pPr>
+        <w:autoSpaceDE w:val="0"/>
+        <w:autoSpaceDN w:val="0"/>
+        <w:adjustRightInd w:val="0"/>
+        <w:spacing w:after="0" w:line="360" w:lineRule="auto"/>
+        <w:rPr>
+          <w:rFonts w:ascii="Times New Roman" w:hAnsi="Times New Roman" w:cs="Times New Roman"/>
+          <w:b/>
+          <w:color w:val="000000"/>
+          <w:kern w:val="0"/>
+          <w:sz w:val="24"/>
+          <w:szCs w:val="24"/>
+        </w:rPr>
+      </w:pPr>
+      <w:r>
+        <w:rPr>
+          <w:rFonts w:ascii="Times New Roman" w:hAnsi="Times New Roman" w:cs="Times New Roman"/>
+          <w:b/>
+          <w:color w:val="000000"/>
+          <w:kern w:val="0"/>
+          <w:sz w:val="24"/>
+          <w:szCs w:val="24"/>
+        </w:rPr>
+        <w:t>Tâche :</w:t>
+      </w:r>
+    </w:p>
+    <w:p>
+      <w:pPr>
+        <w:autoSpaceDE w:val="0"/>
+        <w:autoSpaceDN w:val="0"/>
+        <w:adjustRightInd w:val="0"/>
+        <w:spacing w:after="0" w:line="360" w:lineRule="auto"/>
+        <w:rPr>
+          <w:rFonts w:ascii="Times New Roman" w:hAnsi="Times New Roman" w:cs="Times New Roman"/>
+          <w:color w:val="000000"/>
+          <w:kern w:val="0"/>
+          <w:sz w:val="24"/>
+          <w:szCs w:val="24"/>
+        </w:rPr>
+      </w:pPr>
+      <w:r>
+        <w:rPr>
+          <w:rFonts w:ascii="Times New Roman" w:hAnsi="Times New Roman" w:cs="Times New Roman"/>
+          <w:color w:val="000000"/>
+          <w:kern w:val="0"/>
+          <w:sz w:val="24"/>
+          <w:szCs w:val="24"/>
+        </w:rPr>
+        <w:t xml:space="preserve">Propose 3 à 4 modèles de Machine Learning adaptés à ce problème de prédiction. </w:t>
+      </w:r>
+    </w:p>
+    <w:p>
+      <w:pPr>
+        <w:autoSpaceDE w:val="0"/>
+        <w:autoSpaceDN w:val="0"/>
+        <w:adjustRightInd w:val="0"/>
+        <w:spacing w:after="0" w:line="360" w:lineRule="auto"/>
+        <w:rPr>
+          <w:rFonts w:ascii="Times New Roman" w:hAnsi="Times New Roman" w:cs="Times New Roman"/>
+          <w:color w:val="000000"/>
+          <w:kern w:val="0"/>
+          <w:sz w:val="24"/>
+          <w:szCs w:val="24"/>
+        </w:rPr>
+      </w:pPr>
+      <w:r>
+        <w:rPr>
+          <w:rFonts w:ascii="Times New Roman" w:hAnsi="Times New Roman" w:cs="Times New Roman"/>
+          <w:color w:val="000000"/>
+          <w:kern w:val="0"/>
+          <w:sz w:val="24"/>
+          <w:szCs w:val="24"/>
+        </w:rPr>
+        <w:t>Pour chaque modèle, indique :</w:t>
+      </w:r>
+    </w:p>
+    <w:p>
+      <w:pPr>
+        <w:autoSpaceDE w:val="0"/>
+        <w:autoSpaceDN w:val="0"/>
+        <w:adjustRightInd w:val="0"/>
+        <w:spacing w:after="0" w:line="360" w:lineRule="auto"/>
+        <w:rPr>
+          <w:rFonts w:ascii="Times New Roman" w:hAnsi="Times New Roman" w:cs="Times New Roman"/>
+          <w:color w:val="000000"/>
+          <w:kern w:val="0"/>
+          <w:sz w:val="24"/>
+          <w:szCs w:val="24"/>
+        </w:rPr>
+      </w:pPr>
+      <w:r>
+        <w:rPr>
+          <w:rFonts w:ascii="Times New Roman" w:hAnsi="Times New Roman" w:cs="Times New Roman"/>
+          <w:color w:val="000000"/>
+          <w:kern w:val="0"/>
+          <w:sz w:val="24"/>
+          <w:szCs w:val="24"/>
+        </w:rPr>
+        <w:t>- Le principe de fonctionnement (en quelques phrases, sans formalisme mathématique excessif)</w:t>
+      </w:r>
+    </w:p>
+    <w:p>
+      <w:pPr>
+        <w:autoSpaceDE w:val="0"/>
+        <w:autoSpaceDN w:val="0"/>
+        <w:adjustRightInd w:val="0"/>
+        <w:spacing w:after="0" w:line="360" w:lineRule="auto"/>
+        <w:rPr>
+          <w:rFonts w:ascii="Times New Roman" w:hAnsi="Times New Roman" w:cs="Times New Roman"/>
+          <w:color w:val="000000"/>
+          <w:kern w:val="0"/>
+          <w:sz w:val="24"/>
+          <w:szCs w:val="24"/>
+        </w:rPr>
+      </w:pPr>
+      <w:r>
+        <w:rPr>
+          <w:rFonts w:ascii="Times New Roman" w:hAnsi="Times New Roman" w:cs="Times New Roman"/>
+          <w:color w:val="000000"/>
+          <w:kern w:val="0"/>
+          <w:sz w:val="24"/>
+          <w:szCs w:val="24"/>
+        </w:rPr>
+        <w:t>- Les avantages dans ce contexte précis</w:t>
+      </w:r>
+    </w:p>
+    <w:p>
+      <w:pPr>
+        <w:autoSpaceDE w:val="0"/>
+        <w:autoSpaceDN w:val="0"/>
+        <w:adjustRightInd w:val="0"/>
+        <w:spacing w:after="0" w:line="360" w:lineRule="auto"/>
+        <w:rPr>
+          <w:rFonts w:ascii="Times New Roman" w:hAnsi="Times New Roman" w:cs="Times New Roman"/>
+          <w:color w:val="000000"/>
+          <w:kern w:val="0"/>
+          <w:sz w:val="24"/>
+          <w:szCs w:val="24"/>
+        </w:rPr>
+      </w:pPr>
+      <w:r>
+        <w:rPr>
+          <w:rFonts w:ascii="Times New Roman" w:hAnsi="Times New Roman" w:cs="Times New Roman"/>
+          <w:color w:val="000000"/>
+          <w:kern w:val="0"/>
+          <w:sz w:val="24"/>
+          <w:szCs w:val="24"/>
+        </w:rPr>
+        <w:t>- Les limites ou précautions à prendre</w:t>
+      </w:r>
+    </w:p>
+    <w:p>
+      <w:pPr>
+        <w:autoSpaceDE w:val="0"/>
+        <w:autoSpaceDN w:val="0"/>
+        <w:adjustRightInd w:val="0"/>
+        <w:spacing w:after="0" w:line="360" w:lineRule="auto"/>
+        <w:rPr>
+          <w:rFonts w:ascii="Times New Roman" w:hAnsi="Times New Roman" w:cs="Times New Roman"/>
+          <w:color w:val="000000"/>
+          <w:kern w:val="0"/>
+          <w:sz w:val="24"/>
+          <w:szCs w:val="24"/>
+        </w:rPr>
+      </w:pPr>
+      <w:r>
+        <w:rPr>
+          <w:rFonts w:ascii="Times New Roman" w:hAnsi="Times New Roman" w:cs="Times New Roman"/>
+          <w:color w:val="000000"/>
+          <w:kern w:val="0"/>
+          <w:sz w:val="24"/>
+          <w:szCs w:val="24"/>
+        </w:rPr>
+        <w:t>- Le type de problème concerné (régression, dans ce cas précis)</w:t>
+      </w:r>
+    </w:p>
+    <w:p>
+      <w:pPr>
+        <w:autoSpaceDE w:val="0"/>
+        <w:autoSpaceDN w:val="0"/>
+        <w:adjustRightInd w:val="0"/>
+        <w:spacing w:after="0" w:line="360" w:lineRule="auto"/>
+        <w:rPr>
+          <w:rFonts w:ascii="Times New Roman" w:hAnsi="Times New Roman" w:cs="Times New Roman"/>
+          <w:color w:val="000000"/>
+          <w:kern w:val="0"/>
+          <w:sz w:val="24"/>
+          <w:szCs w:val="24"/>
+        </w:rPr>
+      </w:pPr>
+      <w:r>
+        <w:rPr>
+          <w:rFonts w:ascii="Times New Roman" w:hAnsi="Times New Roman" w:cs="Times New Roman"/>
+          <w:color w:val="000000"/>
+          <w:kern w:val="0"/>
+          <w:sz w:val="24"/>
+          <w:szCs w:val="24"/>
+        </w:rPr>
+        <w:t>- Les métriques les plus pertinentes pour év</w:t>
+      </w:r>
+      <w:r>
+        <w:rPr>
+          <w:rFonts w:ascii="Times New Roman" w:hAnsi="Times New Roman" w:cs="Times New Roman"/>
+          <w:color w:val="000000"/>
+          <w:kern w:val="0"/>
+          <w:sz w:val="24"/>
+          <w:szCs w:val="24"/>
+        </w:rPr>
+        <w:t>aluer ce modèle sur cette tâche</w:t>
+      </w:r>
+    </w:p>
+    <w:p>
+      <w:pPr>
+        <w:autoSpaceDE w:val="0"/>
+        <w:autoSpaceDN w:val="0"/>
+        <w:adjustRightInd w:val="0"/>
+        <w:spacing w:after="0" w:line="360" w:lineRule="auto"/>
+        <w:rPr>
+          <w:rFonts w:ascii="Times New Roman" w:hAnsi="Times New Roman" w:cs="Times New Roman"/>
+          <w:b/>
+          <w:color w:val="000000"/>
+          <w:kern w:val="0"/>
+          <w:sz w:val="24"/>
+          <w:szCs w:val="24"/>
+        </w:rPr>
+      </w:pPr>
+      <w:r>
+        <w:rPr>
+          <w:rFonts w:ascii="Times New Roman" w:hAnsi="Times New Roman" w:cs="Times New Roman"/>
+          <w:b/>
+          <w:color w:val="000000"/>
+          <w:kern w:val="0"/>
+          <w:sz w:val="24"/>
+          <w:szCs w:val="24"/>
+        </w:rPr>
+        <w:t>Contraintes :</w:t>
+      </w:r>
+    </w:p>
+    <w:p>
+      <w:pPr>
+        <w:autoSpaceDE w:val="0"/>
+        <w:autoSpaceDN w:val="0"/>
+        <w:adjustRightInd w:val="0"/>
+        <w:spacing w:after="0" w:line="360" w:lineRule="auto"/>
+        <w:rPr>
+          <w:rFonts w:ascii="Times New Roman" w:hAnsi="Times New Roman" w:cs="Times New Roman"/>
+          <w:color w:val="000000"/>
+          <w:kern w:val="0"/>
+          <w:sz w:val="24"/>
+          <w:szCs w:val="24"/>
+        </w:rPr>
+      </w:pPr>
+      <w:r>
+        <w:rPr>
+          <w:rFonts w:ascii="Times New Roman" w:hAnsi="Times New Roman" w:cs="Times New Roman"/>
+          <w:color w:val="000000"/>
+          <w:kern w:val="0"/>
+          <w:sz w:val="24"/>
+          <w:szCs w:val="24"/>
+        </w:rPr>
+        <w:t>- Inclus au moins un modèle simple/interprétable et un modèle plus complexe.</w:t>
+      </w:r>
+    </w:p>
+    <w:p>
+      <w:pPr>
+        <w:autoSpaceDE w:val="0"/>
+        <w:autoSpaceDN w:val="0"/>
+        <w:adjustRightInd w:val="0"/>
+        <w:spacing w:after="0" w:line="360" w:lineRule="auto"/>
+        <w:rPr>
+          <w:rFonts w:ascii="Times New Roman" w:hAnsi="Times New Roman" w:cs="Times New Roman"/>
+          <w:color w:val="000000"/>
+          <w:kern w:val="0"/>
+          <w:sz w:val="24"/>
+          <w:szCs w:val="24"/>
+        </w:rPr>
+      </w:pPr>
+      <w:r>
+        <w:rPr>
+          <w:rFonts w:ascii="Times New Roman" w:hAnsi="Times New Roman" w:cs="Times New Roman"/>
+          <w:color w:val="000000"/>
+          <w:kern w:val="0"/>
+          <w:sz w:val="24"/>
+          <w:szCs w:val="24"/>
+        </w:rPr>
+        <w:t xml:space="preserve">- Tiens compte du fait que le </w:t>
+      </w:r>
+      <w:proofErr w:type="spellStart"/>
+      <w:r>
+        <w:rPr>
+          <w:rFonts w:ascii="Times New Roman" w:hAnsi="Times New Roman" w:cs="Times New Roman"/>
+          <w:color w:val="000000"/>
+          <w:kern w:val="0"/>
+          <w:sz w:val="24"/>
+          <w:szCs w:val="24"/>
+        </w:rPr>
+        <w:t>dataset</w:t>
+      </w:r>
+      <w:proofErr w:type="spellEnd"/>
+      <w:r>
+        <w:rPr>
+          <w:rFonts w:ascii="Times New Roman" w:hAnsi="Times New Roman" w:cs="Times New Roman"/>
+          <w:color w:val="000000"/>
+          <w:kern w:val="0"/>
+          <w:sz w:val="24"/>
+          <w:szCs w:val="24"/>
+        </w:rPr>
+        <w:t xml:space="preserve"> cont</w:t>
+      </w:r>
+      <w:r>
+        <w:rPr>
+          <w:rFonts w:ascii="Times New Roman" w:hAnsi="Times New Roman" w:cs="Times New Roman"/>
+          <w:color w:val="000000"/>
+          <w:kern w:val="0"/>
+          <w:sz w:val="24"/>
+          <w:szCs w:val="24"/>
+        </w:rPr>
+        <w:t xml:space="preserve">ient une composante temporelle </w:t>
+      </w:r>
+      <w:r>
+        <w:rPr>
+          <w:rFonts w:ascii="Times New Roman" w:hAnsi="Times New Roman" w:cs="Times New Roman"/>
+          <w:color w:val="000000"/>
+          <w:kern w:val="0"/>
+          <w:sz w:val="24"/>
+          <w:szCs w:val="24"/>
+        </w:rPr>
+        <w:t>(</w:t>
+      </w:r>
+      <w:proofErr w:type="spellStart"/>
+      <w:r>
+        <w:rPr>
+          <w:rFonts w:ascii="Times New Roman" w:hAnsi="Times New Roman" w:cs="Times New Roman"/>
+          <w:color w:val="000000"/>
+          <w:kern w:val="0"/>
+          <w:sz w:val="24"/>
+          <w:szCs w:val="24"/>
+        </w:rPr>
+        <w:t>date_heure</w:t>
+      </w:r>
+      <w:proofErr w:type="spellEnd"/>
+      <w:r>
+        <w:rPr>
+          <w:rFonts w:ascii="Times New Roman" w:hAnsi="Times New Roman" w:cs="Times New Roman"/>
+          <w:color w:val="000000"/>
+          <w:kern w:val="0"/>
+          <w:sz w:val="24"/>
+          <w:szCs w:val="24"/>
+        </w:rPr>
+        <w:t>), qui pourra</w:t>
+      </w:r>
+      <w:r>
+        <w:rPr>
+          <w:rFonts w:ascii="Times New Roman" w:hAnsi="Times New Roman" w:cs="Times New Roman"/>
+          <w:color w:val="000000"/>
+          <w:kern w:val="0"/>
+          <w:sz w:val="24"/>
+          <w:szCs w:val="24"/>
+        </w:rPr>
+        <w:t>it être pertinente à exploiter.</w:t>
+      </w:r>
+    </w:p>
+    <w:p>
+      <w:pPr>
+        <w:autoSpaceDE w:val="0"/>
+        <w:autoSpaceDN w:val="0"/>
+        <w:adjustRightInd w:val="0"/>
+        <w:spacing w:after="0" w:line="360" w:lineRule="auto"/>
+        <w:rPr>
+          <w:rFonts w:ascii="Times New Roman" w:hAnsi="Times New Roman" w:cs="Times New Roman"/>
+          <w:b/>
+          <w:color w:val="000000"/>
+          <w:kern w:val="0"/>
+          <w:sz w:val="24"/>
+          <w:szCs w:val="24"/>
+        </w:rPr>
+      </w:pPr>
+      <w:r>
+        <w:rPr>
+          <w:rFonts w:ascii="Times New Roman" w:hAnsi="Times New Roman" w:cs="Times New Roman"/>
+          <w:b/>
+          <w:color w:val="000000"/>
+          <w:kern w:val="0"/>
+          <w:sz w:val="24"/>
+          <w:szCs w:val="24"/>
+        </w:rPr>
+        <w:lastRenderedPageBreak/>
+        <w:t>Format de sortie :</w:t>
+      </w:r>
+    </w:p>
+    <w:p>
+      <w:pPr>
+        <w:autoSpaceDE w:val="0"/>
+        <w:autoSpaceDN w:val="0"/>
+        <w:adjustRightInd w:val="0"/>
+        <w:spacing w:after="0" w:line="360" w:lineRule="auto"/>
+        <w:rPr>
+          <w:rFonts w:ascii="Times New Roman" w:hAnsi="Times New Roman" w:cs="Times New Roman"/>
+          <w:color w:val="000000"/>
+          <w:kern w:val="0"/>
+          <w:sz w:val="24"/>
+          <w:szCs w:val="24"/>
+        </w:rPr>
+      </w:pPr>
+      <w:r>
+        <w:rPr>
+          <w:rFonts w:ascii="Times New Roman" w:hAnsi="Times New Roman" w:cs="Times New Roman"/>
+          <w:color w:val="000000"/>
+          <w:kern w:val="0"/>
+          <w:sz w:val="24"/>
+          <w:szCs w:val="24"/>
+        </w:rPr>
+        <w:t xml:space="preserve">Un tableau comparatif avec </w:t>
+      </w:r>
+      <w:r>
+        <w:rPr>
+          <w:rFonts w:ascii="Times New Roman" w:hAnsi="Times New Roman" w:cs="Times New Roman"/>
+          <w:color w:val="000000"/>
+          <w:kern w:val="0"/>
+          <w:sz w:val="24"/>
+          <w:szCs w:val="24"/>
+        </w:rPr>
+        <w:t xml:space="preserve">les colonnes : Modèle Principe Avantages Limites Métriques </w:t>
+      </w:r>
+      <w:r>
+        <w:rPr>
+          <w:rFonts w:ascii="Times New Roman" w:hAnsi="Times New Roman" w:cs="Times New Roman"/>
+          <w:color w:val="000000"/>
+          <w:kern w:val="0"/>
+          <w:sz w:val="24"/>
+          <w:szCs w:val="24"/>
+        </w:rPr>
+        <w:t>recommandées</w:t>
+      </w:r>
+    </w:p>
+    <w:p>
+      <w:pPr>
+        <w:pStyle w:val="ListParagraph"/>
+        <w:numPr>
+          <w:ilvl w:val="0"/>
+          <w:numId w:val="15"/>
+        </w:numPr>
+        <w:autoSpaceDE w:val="0"/>
+        <w:autoSpaceDN w:val="0"/>
+        <w:adjustRightInd w:val="0"/>
+        <w:spacing w:after="0" w:line="360" w:lineRule="auto"/>
+        <w:jc w:val="center"/>
+        <w:rPr>
+          <w:rFonts w:ascii="Times New Roman" w:hAnsi="Times New Roman" w:cs="Times New Roman"/>
+          <w:color w:val="000000"/>
+          <w:kern w:val="0"/>
+          <w:sz w:val="24"/>
+          <w:szCs w:val="24"/>
+        </w:rPr>
+      </w:pPr>
+      <w:r>
+        <w:rPr>
+          <w:rFonts w:ascii="Times New Roman" w:hAnsi="Times New Roman" w:cs="Times New Roman"/>
+          <w:b/>
+          <w:color w:val="000000"/>
+          <w:kern w:val="0"/>
+          <w:sz w:val="24"/>
+          <w:szCs w:val="24"/>
+        </w:rPr>
+        <w:t>Réponse de Claude</w:t>
+      </w:r>
+      <w:r>
+        <w:rPr>
+          <w:rFonts w:ascii="Times New Roman" w:hAnsi="Times New Roman" w:cs="Times New Roman"/>
+          <w:color w:val="000000"/>
+          <w:kern w:val="0"/>
+          <w:sz w:val="24"/>
+          <w:szCs w:val="24"/>
+        </w:rPr>
+        <w:drawing>
+          <wp:inline distT="0" distB="0" distL="0" distR="0" wp14:anchorId="06792A5E" wp14:editId="5578A6DE">
+            <wp:extent cx="5760720" cy="1734185"/>
+            <wp:effectExtent l="0" t="0" r="0" b="0"/>
+            <wp:docPr id="26" name="Picture 26"/>
+            <wp:cNvGraphicFramePr>
+              <a:graphicFrameLocks xmlns:a="http://schemas.openxmlformats.org/drawingml/2006/main" noChangeAspect="1"/>
+            </wp:cNvGraphicFramePr>
+            <a:graphic xmlns:a="http://schemas.openxmlformats.org/drawingml/2006/main">
+              <a:graphicData uri="http://schemas.openxmlformats.org/drawingml/2006/picture">
+                <pic:pic xmlns:pic="http://schemas.openxmlformats.org/drawingml/2006/picture">
+                  <pic:nvPicPr>
+                    <pic:cNvPr id="1" name=""/>
+                    <pic:cNvPicPr/>
+                  </pic:nvPicPr>
+                  <pic:blipFill>
+                    <a:blip r:embed="rId39"/>
+                    <a:stretch>
+                      <a:fillRect/>
+                    </a:stretch>
+                  </pic:blipFill>
+                  <pic:spPr>
+                    <a:xfrm>
+                      <a:off x="0" y="0"/>
+                      <a:ext cx="5760720" cy="1734185"/>
+                    </a:xfrm>
+                    <a:prstGeom prst="rect">
+                      <a:avLst/>
+                    </a:prstGeom>
+                  </pic:spPr>
+                </pic:pic>
+              </a:graphicData>
+            </a:graphic>
+          </wp:inline>
+        </w:drawing>
+      </w:r>
+    </w:p>
+    <w:p>
+      <w:pPr>
+        <w:pStyle w:val="ListParagraph"/>
+        <w:autoSpaceDE w:val="0"/>
+        <w:autoSpaceDN w:val="0"/>
+        <w:adjustRightInd w:val="0"/>
+        <w:spacing w:after="0" w:line="360" w:lineRule="auto"/>
+        <w:rPr>
+          <w:rFonts w:ascii="Times New Roman" w:hAnsi="Times New Roman" w:cs="Times New Roman"/>
+          <w:color w:val="000000"/>
+          <w:kern w:val="0"/>
+          <w:sz w:val="24"/>
+          <w:szCs w:val="24"/>
+        </w:rPr>
+      </w:pPr>
+      <w:r>
+        <w:rPr>
+          <w:rFonts w:ascii="Times New Roman" w:hAnsi="Times New Roman" w:cs="Times New Roman"/>
+          <w:color w:val="000000"/>
+          <w:kern w:val="0"/>
+          <w:sz w:val="24"/>
+          <w:szCs w:val="24"/>
+        </w:rPr>
+        <w:drawing>
+          <wp:inline distT="0" distB="0" distL="0" distR="0" wp14:anchorId="0A417CF1" wp14:editId="112037D2">
+            <wp:extent cx="5760720" cy="3809365"/>
+            <wp:effectExtent l="0" t="0" r="0" b="635"/>
+            <wp:docPr id="27" name="Picture 27"/>
+            <wp:cNvGraphicFramePr>
+              <a:graphicFrameLocks xmlns:a="http://schemas.openxmlformats.org/drawingml/2006/main" noChangeAspect="1"/>
+            </wp:cNvGraphicFramePr>
+            <a:graphic xmlns:a="http://schemas.openxmlformats.org/drawingml/2006/main">
+              <a:graphicData uri="http://schemas.openxmlformats.org/drawingml/2006/picture">
+                <pic:pic xmlns:pic="http://schemas.openxmlformats.org/drawingml/2006/picture">
+                  <pic:nvPicPr>
+                    <pic:cNvPr id="1" name=""/>
+                    <pic:cNvPicPr/>
+                  </pic:nvPicPr>
+                  <pic:blipFill>
+                    <a:blip r:embed="rId40"/>
+                    <a:stretch>
+                      <a:fillRect/>
+                    </a:stretch>
+                  </pic:blipFill>
+                  <pic:spPr>
+                    <a:xfrm>
+                      <a:off x="0" y="0"/>
+                      <a:ext cx="5760720" cy="3809365"/>
+                    </a:xfrm>
+                    <a:prstGeom prst="rect">
+                      <a:avLst/>
+                    </a:prstGeom>
+                  </pic:spPr>
+                </pic:pic>
+              </a:graphicData>
+            </a:graphic>
+          </wp:inline>
+        </w:drawing>
+      </w:r>
+    </w:p>
+    <w:p>
+      <w:pPr>
+        <w:pStyle w:val="ListParagraph"/>
+        <w:autoSpaceDE w:val="0"/>
+        <w:autoSpaceDN w:val="0"/>
+        <w:adjustRightInd w:val="0"/>
+        <w:spacing w:after="0" w:line="360" w:lineRule="auto"/>
+        <w:rPr>
+          <w:rFonts w:ascii="Times New Roman" w:hAnsi="Times New Roman" w:cs="Times New Roman"/>
+          <w:color w:val="000000"/>
+          <w:kern w:val="0"/>
+          <w:sz w:val="24"/>
+          <w:szCs w:val="24"/>
+        </w:rPr>
+      </w:pPr>
+      <w:r>
+        <w:rPr>
+          <w:rFonts w:ascii="Times New Roman" w:hAnsi="Times New Roman" w:cs="Times New Roman"/>
+          <w:color w:val="000000"/>
+          <w:kern w:val="0"/>
+          <w:sz w:val="24"/>
+          <w:szCs w:val="24"/>
+        </w:rPr>
+        <w:lastRenderedPageBreak/>
+        <w:drawing>
+          <wp:inline distT="0" distB="0" distL="0" distR="0" wp14:anchorId="27583A4A" wp14:editId="1B098A78">
+            <wp:extent cx="5760720" cy="3398520"/>
+            <wp:effectExtent l="0" t="0" r="0" b="0"/>
+            <wp:docPr id="28" name="Picture 28"/>
+            <wp:cNvGraphicFramePr>
+              <a:graphicFrameLocks xmlns:a="http://schemas.openxmlformats.org/drawingml/2006/main" noChangeAspect="1"/>
+            </wp:cNvGraphicFramePr>
+            <a:graphic xmlns:a="http://schemas.openxmlformats.org/drawingml/2006/main">
+              <a:graphicData uri="http://schemas.openxmlformats.org/drawingml/2006/picture">
+                <pic:pic xmlns:pic="http://schemas.openxmlformats.org/drawingml/2006/picture">
+                  <pic:nvPicPr>
+                    <pic:cNvPr id="1" name=""/>
+                    <pic:cNvPicPr/>
+                  </pic:nvPicPr>
+                  <pic:blipFill>
+                    <a:blip r:embed="rId41"/>
+                    <a:stretch>
+                      <a:fillRect/>
+                    </a:stretch>
+                  </pic:blipFill>
+                  <pic:spPr>
+                    <a:xfrm>
+                      <a:off x="0" y="0"/>
+                      <a:ext cx="5760720" cy="3398520"/>
+                    </a:xfrm>
+                    <a:prstGeom prst="rect">
+                      <a:avLst/>
+                    </a:prstGeom>
+                  </pic:spPr>
+                </pic:pic>
+              </a:graphicData>
+            </a:graphic>
+          </wp:inline>
+        </w:drawing>
+      </w:r>
+    </w:p>
+    <w:p>
+      <w:pPr>
+        <w:pStyle w:val="ListParagraph"/>
+        <w:autoSpaceDE w:val="0"/>
+        <w:autoSpaceDN w:val="0"/>
+        <w:adjustRightInd w:val="0"/>
+        <w:spacing w:after="0" w:line="360" w:lineRule="auto"/>
+        <w:rPr>
+          <w:rFonts w:ascii="Times New Roman" w:hAnsi="Times New Roman" w:cs="Times New Roman"/>
+          <w:color w:val="000000"/>
+          <w:kern w:val="0"/>
+          <w:sz w:val="24"/>
+          <w:szCs w:val="24"/>
+        </w:rPr>
+      </w:pPr>
+      <w:r>
+        <w:rPr>
+          <w:rFonts w:ascii="Times New Roman" w:hAnsi="Times New Roman" w:cs="Times New Roman"/>
+          <w:color w:val="000000"/>
+          <w:kern w:val="0"/>
+          <w:sz w:val="24"/>
+          <w:szCs w:val="24"/>
+        </w:rPr>
+        <w:drawing>
+          <wp:inline distT="0" distB="0" distL="0" distR="0" wp14:anchorId="4CED812E" wp14:editId="2CFB49AB">
+            <wp:extent cx="5760720" cy="3378835"/>
+            <wp:effectExtent l="0" t="0" r="0" b="0"/>
+            <wp:docPr id="29" name="Picture 29"/>
+            <wp:cNvGraphicFramePr>
+              <a:graphicFrameLocks xmlns:a="http://schemas.openxmlformats.org/drawingml/2006/main" noChangeAspect="1"/>
+            </wp:cNvGraphicFramePr>
+            <a:graphic xmlns:a="http://schemas.openxmlformats.org/drawingml/2006/main">
+              <a:graphicData uri="http://schemas.openxmlformats.org/drawingml/2006/picture">
+                <pic:pic xmlns:pic="http://schemas.openxmlformats.org/drawingml/2006/picture">
+                  <pic:nvPicPr>
+                    <pic:cNvPr id="1" name=""/>
+                    <pic:cNvPicPr/>
+                  </pic:nvPicPr>
+                  <pic:blipFill>
+                    <a:blip r:embed="rId42"/>
+                    <a:stretch>
+                      <a:fillRect/>
+                    </a:stretch>
+                  </pic:blipFill>
+                  <pic:spPr>
+                    <a:xfrm>
+                      <a:off x="0" y="0"/>
+                      <a:ext cx="5760720" cy="3378835"/>
+                    </a:xfrm>
+                    <a:prstGeom prst="rect">
+                      <a:avLst/>
+                    </a:prstGeom>
+                  </pic:spPr>
+                </pic:pic>
+              </a:graphicData>
+            </a:graphic>
+          </wp:inline>
+        </w:drawing>
+      </w:r>
+    </w:p>
+    <w:p>
+      <w:pPr>
+        <w:pStyle w:val="ListParagraph"/>
+        <w:autoSpaceDE w:val="0"/>
+        <w:autoSpaceDN w:val="0"/>
+        <w:adjustRightInd w:val="0"/>
+        <w:spacing w:after="0" w:line="360" w:lineRule="auto"/>
+        <w:rPr>
+          <w:rFonts w:ascii="Times New Roman" w:hAnsi="Times New Roman" w:cs="Times New Roman"/>
+          <w:color w:val="000000"/>
+          <w:kern w:val="0"/>
+          <w:sz w:val="24"/>
+          <w:szCs w:val="24"/>
+        </w:rPr>
+      </w:pPr>
+      <w:r>
+        <w:rPr>
+          <w:rFonts w:ascii="Times New Roman" w:hAnsi="Times New Roman" w:cs="Times New Roman"/>
+          <w:color w:val="000000"/>
+          <w:kern w:val="0"/>
+          <w:sz w:val="24"/>
+          <w:szCs w:val="24"/>
+        </w:rPr>
+        <w:lastRenderedPageBreak/>
+        <w:drawing>
+          <wp:inline distT="0" distB="0" distL="0" distR="0" wp14:anchorId="5B56464C" wp14:editId="055DBF78">
+            <wp:extent cx="5760720" cy="4048125"/>
+            <wp:effectExtent l="0" t="0" r="0" b="9525"/>
+            <wp:docPr id="30" name="Picture 30"/>
+            <wp:cNvGraphicFramePr>
+              <a:graphicFrameLocks xmlns:a="http://schemas.openxmlformats.org/drawingml/2006/main" noChangeAspect="1"/>
+            </wp:cNvGraphicFramePr>
+            <a:graphic xmlns:a="http://schemas.openxmlformats.org/drawingml/2006/main">
+              <a:graphicData uri="http://schemas.openxmlformats.org/drawingml/2006/picture">
+                <pic:pic xmlns:pic="http://schemas.openxmlformats.org/drawingml/2006/picture">
+                  <pic:nvPicPr>
+                    <pic:cNvPr id="1" name=""/>
+                    <pic:cNvPicPr/>
+                  </pic:nvPicPr>
+                  <pic:blipFill>
+                    <a:blip r:embed="rId43"/>
+                    <a:stretch>
+                      <a:fillRect/>
+                    </a:stretch>
+                  </pic:blipFill>
+                  <pic:spPr>
+                    <a:xfrm>
+                      <a:off x="0" y="0"/>
+                      <a:ext cx="5760720" cy="4048125"/>
+                    </a:xfrm>
+                    <a:prstGeom prst="rect">
+                      <a:avLst/>
+                    </a:prstGeom>
+                  </pic:spPr>
+                </pic:pic>
+              </a:graphicData>
+            </a:graphic>
+          </wp:inline>
+        </w:drawing>
+      </w:r>
+    </w:p>
+    <w:p>
+      <w:pPr>
+        <w:pStyle w:val="ListParagraph"/>
+        <w:autoSpaceDE w:val="0"/>
+        <w:autoSpaceDN w:val="0"/>
+        <w:adjustRightInd w:val="0"/>
+        <w:spacing w:after="0" w:line="360" w:lineRule="auto"/>
+        <w:rPr>
+          <w:rFonts w:ascii="Times New Roman" w:hAnsi="Times New Roman" w:cs="Times New Roman"/>
+          <w:color w:val="000000"/>
+          <w:kern w:val="0"/>
+          <w:sz w:val="24"/>
+          <w:szCs w:val="24"/>
+        </w:rPr>
+      </w:pPr>
+      <w:r>
+        <w:rPr>
+          <w:rFonts w:ascii="Times New Roman" w:hAnsi="Times New Roman" w:cs="Times New Roman"/>
+          <w:color w:val="000000"/>
+          <w:kern w:val="0"/>
+          <w:sz w:val="24"/>
+          <w:szCs w:val="24"/>
+        </w:rPr>
+        <w:drawing>
+          <wp:inline distT="0" distB="0" distL="0" distR="0" wp14:anchorId="32E5A769" wp14:editId="3F1AB4CD">
+            <wp:extent cx="5760720" cy="1950085"/>
+            <wp:effectExtent l="0" t="0" r="0" b="0"/>
+            <wp:docPr id="31" name="Picture 31"/>
+            <wp:cNvGraphicFramePr>
+              <a:graphicFrameLocks xmlns:a="http://schemas.openxmlformats.org/drawingml/2006/main" noChangeAspect="1"/>
+            </wp:cNvGraphicFramePr>
+            <a:graphic xmlns:a="http://schemas.openxmlformats.org/drawingml/2006/main">
+              <a:graphicData uri="http://schemas.openxmlformats.org/drawingml/2006/picture">
+                <pic:pic xmlns:pic="http://schemas.openxmlformats.org/drawingml/2006/picture">
+                  <pic:nvPicPr>
+                    <pic:cNvPr id="1" name=""/>
+                    <pic:cNvPicPr/>
+                  </pic:nvPicPr>
+                  <pic:blipFill>
+                    <a:blip r:embed="rId44"/>
+                    <a:stretch>
+                      <a:fillRect/>
+                    </a:stretch>
+                  </pic:blipFill>
+                  <pic:spPr>
+                    <a:xfrm>
+                      <a:off x="0" y="0"/>
+                      <a:ext cx="5760720" cy="1950085"/>
+                    </a:xfrm>
+                    <a:prstGeom prst="rect">
+                      <a:avLst/>
+                    </a:prstGeom>
+                  </pic:spPr>
+                </pic:pic>
+              </a:graphicData>
+            </a:graphic>
+          </wp:inline>
+        </w:drawing>
+      </w:r>
+    </w:p>
+    <w:p>
+      <w:pPr>
+        <w:pStyle w:val="ListParagraph"/>
+        <w:autoSpaceDE w:val="0"/>
+        <w:autoSpaceDN w:val="0"/>
+        <w:adjustRightInd w:val="0"/>
+        <w:spacing w:after="0" w:line="360" w:lineRule="auto"/>
+        <w:rPr>
+          <w:rFonts w:ascii="Times New Roman" w:hAnsi="Times New Roman" w:cs="Times New Roman"/>
+          <w:color w:val="000000"/>
+          <w:kern w:val="0"/>
+          <w:sz w:val="24"/>
+          <w:szCs w:val="24"/>
+        </w:rPr>
+      </w:pPr>
+      <w:r>
+        <w:rPr>
+          <w:rFonts w:ascii="Times New Roman" w:hAnsi="Times New Roman" w:cs="Times New Roman"/>
+          <w:color w:val="000000"/>
+          <w:kern w:val="0"/>
+          <w:sz w:val="24"/>
+          <w:szCs w:val="24"/>
+        </w:rPr>
+        <w:lastRenderedPageBreak/>
+        <w:drawing>
+          <wp:inline distT="0" distB="0" distL="0" distR="0" wp14:anchorId="6E1D7BAC" wp14:editId="12F97A61">
+            <wp:extent cx="5760720" cy="3361690"/>
+            <wp:effectExtent l="0" t="0" r="0" b="0"/>
+            <wp:docPr id="32" name="Picture 32"/>
+            <wp:cNvGraphicFramePr>
+              <a:graphicFrameLocks xmlns:a="http://schemas.openxmlformats.org/drawingml/2006/main" noChangeAspect="1"/>
+            </wp:cNvGraphicFramePr>
+            <a:graphic xmlns:a="http://schemas.openxmlformats.org/drawingml/2006/main">
+              <a:graphicData uri="http://schemas.openxmlformats.org/drawingml/2006/picture">
+                <pic:pic xmlns:pic="http://schemas.openxmlformats.org/drawingml/2006/picture">
+                  <pic:nvPicPr>
+                    <pic:cNvPr id="1" name=""/>
+                    <pic:cNvPicPr/>
+                  </pic:nvPicPr>
+                  <pic:blipFill>
+                    <a:blip r:embed="rId45"/>
+                    <a:stretch>
+                      <a:fillRect/>
+                    </a:stretch>
+                  </pic:blipFill>
+                  <pic:spPr>
+                    <a:xfrm>
+                      <a:off x="0" y="0"/>
+                      <a:ext cx="5760720" cy="3361690"/>
+                    </a:xfrm>
+                    <a:prstGeom prst="rect">
+                      <a:avLst/>
+                    </a:prstGeom>
+                  </pic:spPr>
+                </pic:pic>
+              </a:graphicData>
+            </a:graphic>
+          </wp:inline>
+        </w:drawing>
+      </w:r>
+    </w:p>
+    <w:p>
+      <w:pPr>
+        <w:pStyle w:val="ListParagraph"/>
+        <w:autoSpaceDE w:val="0"/>
+        <w:autoSpaceDN w:val="0"/>
+        <w:adjustRightInd w:val="0"/>
+        <w:spacing w:after="0" w:line="360" w:lineRule="auto"/>
+        <w:rPr>
+          <w:rFonts w:ascii="Times New Roman" w:hAnsi="Times New Roman" w:cs="Times New Roman"/>
+          <w:color w:val="000000"/>
+          <w:kern w:val="0"/>
+          <w:sz w:val="24"/>
+          <w:szCs w:val="24"/>
+        </w:rPr>
+      </w:pPr>
+      <w:r>
+        <w:rPr>
+          <w:rFonts w:ascii="Times New Roman" w:hAnsi="Times New Roman" w:cs="Times New Roman"/>
+          <w:color w:val="000000"/>
+          <w:kern w:val="0"/>
+          <w:sz w:val="24"/>
+          <w:szCs w:val="24"/>
+        </w:rPr>
+        <w:drawing>
+          <wp:inline distT="0" distB="0" distL="0" distR="0" wp14:anchorId="45150C9A" wp14:editId="0BDF8C66">
+            <wp:extent cx="5760720" cy="3256280"/>
+            <wp:effectExtent l="0" t="0" r="0" b="1270"/>
+            <wp:docPr id="33" name="Picture 33"/>
+            <wp:cNvGraphicFramePr>
+              <a:graphicFrameLocks xmlns:a="http://schemas.openxmlformats.org/drawingml/2006/main" noChangeAspect="1"/>
+            </wp:cNvGraphicFramePr>
+            <a:graphic xmlns:a="http://schemas.openxmlformats.org/drawingml/2006/main">
+              <a:graphicData uri="http://schemas.openxmlformats.org/drawingml/2006/picture">
+                <pic:pic xmlns:pic="http://schemas.openxmlformats.org/drawingml/2006/picture">
+                  <pic:nvPicPr>
+                    <pic:cNvPr id="1" name=""/>
+                    <pic:cNvPicPr/>
+                  </pic:nvPicPr>
+                  <pic:blipFill>
+                    <a:blip r:embed="rId46"/>
+                    <a:stretch>
+                      <a:fillRect/>
+                    </a:stretch>
+                  </pic:blipFill>
+                  <pic:spPr>
+                    <a:xfrm>
+                      <a:off x="0" y="0"/>
+                      <a:ext cx="5760720" cy="3256280"/>
+                    </a:xfrm>
+                    <a:prstGeom prst="rect">
+                      <a:avLst/>
+                    </a:prstGeom>
+                  </pic:spPr>
+                </pic:pic>
+              </a:graphicData>
+            </a:graphic>
+          </wp:inline>
+        </w:drawing>
+      </w:r>
+    </w:p>
+    <w:p>
+      <w:pPr>
+        <w:pStyle w:val="ListParagraph"/>
+        <w:autoSpaceDE w:val="0"/>
+        <w:autoSpaceDN w:val="0"/>
+        <w:adjustRightInd w:val="0"/>
+        <w:spacing w:after="0" w:line="360" w:lineRule="auto"/>
+        <w:rPr>
+          <w:rFonts w:ascii="Times New Roman" w:hAnsi="Times New Roman" w:cs="Times New Roman"/>
+          <w:color w:val="000000"/>
+          <w:kern w:val="0"/>
+          <w:sz w:val="24"/>
+          <w:szCs w:val="24"/>
+        </w:rPr>
+      </w:pPr>
+      <w:r>
+        <w:rPr>
+          <w:rFonts w:ascii="Times New Roman" w:hAnsi="Times New Roman" w:cs="Times New Roman"/>
+          <w:color w:val="000000"/>
+          <w:kern w:val="0"/>
+          <w:sz w:val="24"/>
+          <w:szCs w:val="24"/>
+        </w:rPr>
+        <w:drawing>
+          <wp:inline distT="0" distB="0" distL="0" distR="0" wp14:anchorId="1B69B515" wp14:editId="78ED961B">
+            <wp:extent cx="5760720" cy="1713865"/>
+            <wp:effectExtent l="0" t="0" r="0" b="635"/>
+            <wp:docPr id="34" name="Picture 34"/>
+            <wp:cNvGraphicFramePr>
+              <a:graphicFrameLocks xmlns:a="http://schemas.openxmlformats.org/drawingml/2006/main" noChangeAspect="1"/>
+            </wp:cNvGraphicFramePr>
+            <a:graphic xmlns:a="http://schemas.openxmlformats.org/drawingml/2006/main">
+              <a:graphicData uri="http://schemas.openxmlformats.org/drawingml/2006/picture">
+                <pic:pic xmlns:pic="http://schemas.openxmlformats.org/drawingml/2006/picture">
+                  <pic:nvPicPr>
+                    <pic:cNvPr id="1" name=""/>
+                    <pic:cNvPicPr/>
+                  </pic:nvPicPr>
+                  <pic:blipFill>
+                    <a:blip r:embed="rId47"/>
+                    <a:stretch>
+                      <a:fillRect/>
+                    </a:stretch>
+                  </pic:blipFill>
+                  <pic:spPr>
+                    <a:xfrm>
+                      <a:off x="0" y="0"/>
+                      <a:ext cx="5760720" cy="1713865"/>
+                    </a:xfrm>
+                    <a:prstGeom prst="rect">
+                      <a:avLst/>
+                    </a:prstGeom>
+                  </pic:spPr>
+                </pic:pic>
+              </a:graphicData>
+            </a:graphic>
+          </wp:inline>
+        </w:drawing>
+      </w:r>
+      <w:bookmarkStart w:id="0" w:name="_GoBack"/>
+      <w:bookmarkEnd w:id="0"/>
+    </w:p>
     <w:sectPr>
       <w:pgSz w:w="11906" w:h="16838"/>
       <w:pgMar w:top="1417" w:right="1417" w:bottom="1417" w:left="1417" w:header="708" w:footer="708" w:gutter="0"/>
@@ -14332,7 +16421,7 @@
   <w:abstractNum w:abstractNumId="4">
     <w:nsid w:val="46F61BC3"/>
     <w:multiLevelType w:val="hybridMultilevel"/>
-    <w:tmpl w:val="D49C06F2"/>
+    <w:tmpl w:val="3632853C"/>
     <w:lvl w:ilvl="0" w:tplc="040C0009">
       <w:start w:val="1"/>
       <w:numFmt w:val="bullet"/>
@@ -15865,7 +17954,7 @@
   <w:style w:type="paragraph" w:default="1" w:styleId="Normal">
     <w:name w:val="Normal"/>
     <w:qFormat/>
-    <w:rsid w:val="007F1B46"/>
+    <w:rsid w:val="00907356"/>
   </w:style>
   <w:style w:type="paragraph" w:styleId="Heading1">
     <w:name w:val="heading 1"/>

</xml_diff>